<commit_message>
Finalize thesis paper cover formatting
</commit_message>
<xml_diff>
--- a/Thesis Project/paper/full_thesis_latest_merged.docx
+++ b/Thesis Project/paper/full_thesis_latest_merged.docx
@@ -190,39 +190,38 @@
           <w:sz w:val="36"/>
           <w:szCs w:val="36"/>
         </w:rPr>
-        <w:t>题   目：</w:t>
-      </w:r>
-      <w:r>
-        <w:rPr>
-          <w:rFonts w:ascii="方正粗宋简体" w:eastAsia="方正粗宋简体" w:hAnsi="方正粗宋简体" w:cs="方正粗宋简体" w:hint="eastAsia"/>
-          <w:color w:val="000000"/>
-          <w:sz w:val="36"/>
-          <w:szCs w:val="36"/>
-          <w:u w:val="single"/>
-        </w:rPr>
-        <w:t xml:space="preserve">                           </w:t>
-      </w:r>
-      <w:r>
-        <w:rPr>
-          <w:rFonts w:ascii="方正粗宋简体" w:eastAsia="方正粗宋简体" w:hAnsi="方正粗宋简体" w:cs="方正粗宋简体" w:hint="eastAsia"/>
-          <w:color w:val="000000"/>
-          <w:sz w:val="36"/>
-          <w:szCs w:val="36"/>
-          <w:u w:val="single"/>
-        </w:rPr>
-        <w:t>基于嵌入式平台的目标检测系统研究</w:t>
-      </w:r>
-    </w:p>
-    <w:p>
-      <w:pPr>
-        <w:spacing w:line="480" w:lineRule="auto"/>
-        <w:jc w:val="left"/>
+        <w:t>题</w:t>
+      </w:r>
+      <w:r>
         <w:rPr>
           <w:rFonts w:ascii="方正粗宋简体" w:eastAsia="方正粗宋简体" w:hAnsi="方正粗宋简体" w:cs="方正粗宋简体"/>
           <w:color w:val="000000"/>
           <w:sz w:val="36"/>
           <w:szCs w:val="36"/>
         </w:rPr>
+        <w:t xml:space="preserve">   目：</w:t>
+      </w:r>
+      <w:r>
+        <w:rPr>
+          <w:rFonts w:ascii="方正粗宋简体" w:eastAsia="方正粗宋简体" w:hAnsi="方正粗宋简体" w:cs="方正粗宋简体"/>
+          <w:color w:val="000000"/>
+          <w:sz w:val="32"/>
+          <w:szCs w:val="36"/>
+          <w:u w:val="single"/>
+        </w:rPr>
+        <w:t xml:space="preserve">    基于嵌入式平台的目标检测系统研究    </w:t>
+      </w:r>
+    </w:p>
+    <w:p>
+      <w:pPr>
+        <w:spacing w:line="480" w:lineRule="auto"/>
+        <w:jc w:val="left"/>
+        <w:rPr>
+          <w:rFonts w:ascii="方正粗宋简体" w:eastAsia="方正粗宋简体" w:hAnsi="方正粗宋简体" w:cs="方正粗宋简体"/>
+          <w:color w:val="000000"/>
+          <w:sz w:val="36"/>
+          <w:szCs w:val="36"/>
+        </w:rPr>
       </w:pPr>
     </w:p>
     <w:p>
@@ -244,40 +243,39 @@
           <w:sz w:val="32"/>
           <w:szCs w:val="32"/>
         </w:rPr>
-        <w:t>学    院：</w:t>
-      </w:r>
-      <w:r>
-        <w:rPr>
-          <w:rFonts w:ascii="方正粗宋简体" w:eastAsia="方正粗宋简体" w:hAnsi="方正粗宋简体" w:cs="方正粗宋简体" w:hint="eastAsia"/>
-          <w:color w:val="000000"/>
-          <w:sz w:val="36"/>
-          <w:szCs w:val="36"/>
-          <w:u w:val="single"/>
-        </w:rPr>
-        <w:t xml:space="preserve">                           </w:t>
-      </w:r>
-      <w:r>
-        <w:rPr>
-          <w:rFonts w:ascii="方正粗宋简体" w:eastAsia="方正粗宋简体" w:hAnsi="方正粗宋简体" w:cs="方正粗宋简体" w:hint="eastAsia"/>
-          <w:color w:val="000000"/>
-          <w:sz w:val="36"/>
-          <w:szCs w:val="36"/>
-          <w:u w:val="single"/>
-        </w:rPr>
-        <w:t>通信与信息工程学院</w:t>
-      </w:r>
-    </w:p>
-    <w:p>
-      <w:pPr>
-        <w:spacing w:line="480" w:lineRule="auto"/>
-        <w:ind w:firstLineChars="300" w:firstLine="960"/>
-        <w:jc w:val="left"/>
+        <w:t>学</w:t>
+      </w:r>
+      <w:r>
         <w:rPr>
           <w:rFonts w:ascii="方正粗宋简体" w:eastAsia="方正粗宋简体" w:hAnsi="方正粗宋简体" w:cs="方正粗宋简体"/>
           <w:color w:val="000000"/>
           <w:sz w:val="32"/>
           <w:szCs w:val="32"/>
         </w:rPr>
+        <w:t xml:space="preserve">    院：</w:t>
+      </w:r>
+      <w:r>
+        <w:rPr>
+          <w:rFonts w:ascii="方正粗宋简体" w:eastAsia="方正粗宋简体" w:hAnsi="方正粗宋简体" w:cs="方正粗宋简体"/>
+          <w:color w:val="000000"/>
+          <w:sz w:val="32"/>
+          <w:szCs w:val="32"/>
+          <w:u w:val="single"/>
+        </w:rPr>
+        <w:t xml:space="preserve">        通信与信息工程学院        </w:t>
+      </w:r>
+    </w:p>
+    <w:p>
+      <w:pPr>
+        <w:spacing w:line="480" w:lineRule="auto"/>
+        <w:ind w:firstLineChars="300" w:firstLine="960"/>
+        <w:jc w:val="left"/>
+        <w:rPr>
+          <w:rFonts w:ascii="方正粗宋简体" w:eastAsia="方正粗宋简体" w:hAnsi="方正粗宋简体" w:cs="方正粗宋简体"/>
+          <w:color w:val="000000"/>
+          <w:sz w:val="32"/>
+          <w:szCs w:val="32"/>
+        </w:rPr>
       </w:pPr>
       <w:r>
         <w:rPr>
@@ -286,40 +284,39 @@
           <w:sz w:val="32"/>
           <w:szCs w:val="32"/>
         </w:rPr>
-        <w:t>专    业：</w:t>
-      </w:r>
-      <w:r>
-        <w:rPr>
-          <w:rFonts w:ascii="方正粗宋简体" w:eastAsia="方正粗宋简体" w:hAnsi="方正粗宋简体" w:cs="方正粗宋简体" w:hint="eastAsia"/>
-          <w:color w:val="000000"/>
-          <w:sz w:val="36"/>
-          <w:szCs w:val="36"/>
-          <w:u w:val="single"/>
-        </w:rPr>
-        <w:t xml:space="preserve">                           </w:t>
-      </w:r>
-      <w:r>
-        <w:rPr>
-          <w:rFonts w:ascii="方正粗宋简体" w:eastAsia="方正粗宋简体" w:hAnsi="方正粗宋简体" w:cs="方正粗宋简体" w:hint="eastAsia"/>
-          <w:color w:val="000000"/>
-          <w:sz w:val="36"/>
-          <w:szCs w:val="36"/>
-          <w:u w:val="single"/>
-        </w:rPr>
-        <w:t>电子信息工程</w:t>
-      </w:r>
-    </w:p>
-    <w:p>
-      <w:pPr>
-        <w:spacing w:line="480" w:lineRule="auto"/>
-        <w:ind w:firstLineChars="300" w:firstLine="960"/>
-        <w:jc w:val="left"/>
+        <w:t>专</w:t>
+      </w:r>
+      <w:r>
         <w:rPr>
           <w:rFonts w:ascii="方正粗宋简体" w:eastAsia="方正粗宋简体" w:hAnsi="方正粗宋简体" w:cs="方正粗宋简体"/>
           <w:color w:val="000000"/>
           <w:sz w:val="32"/>
           <w:szCs w:val="32"/>
         </w:rPr>
+        <w:t xml:space="preserve">    业：</w:t>
+      </w:r>
+      <w:r>
+        <w:rPr>
+          <w:rFonts w:ascii="方正粗宋简体" w:eastAsia="方正粗宋简体" w:hAnsi="方正粗宋简体" w:cs="方正粗宋简体"/>
+          <w:color w:val="000000"/>
+          <w:sz w:val="32"/>
+          <w:szCs w:val="32"/>
+          <w:u w:val="single"/>
+        </w:rPr>
+        <w:t xml:space="preserve">          电子信息工程          </w:t>
+      </w:r>
+    </w:p>
+    <w:p>
+      <w:pPr>
+        <w:spacing w:line="480" w:lineRule="auto"/>
+        <w:ind w:firstLineChars="300" w:firstLine="960"/>
+        <w:jc w:val="left"/>
+        <w:rPr>
+          <w:rFonts w:ascii="方正粗宋简体" w:eastAsia="方正粗宋简体" w:hAnsi="方正粗宋简体" w:cs="方正粗宋简体"/>
+          <w:color w:val="000000"/>
+          <w:sz w:val="32"/>
+          <w:szCs w:val="32"/>
+        </w:rPr>
       </w:pPr>
       <w:r>
         <w:rPr>
@@ -328,19 +325,97 @@
           <w:sz w:val="32"/>
           <w:szCs w:val="32"/>
         </w:rPr>
-        <w:t>学    号：</w:t>
-      </w:r>
+        <w:t>学</w:t>
+      </w:r>
+      <w:r>
+        <w:rPr>
+          <w:rFonts w:ascii="方正粗宋简体" w:eastAsia="方正粗宋简体" w:hAnsi="方正粗宋简体" w:cs="方正粗宋简体"/>
+          <w:color w:val="000000"/>
+          <w:sz w:val="32"/>
+          <w:szCs w:val="32"/>
+        </w:rPr>
+        <w:t xml:space="preserve">    号：</w:t>
+      </w:r>
+      <w:r>
+        <w:rPr>
+          <w:rFonts w:ascii="方正粗宋简体" w:eastAsia="方正粗宋简体" w:hAnsi="方正粗宋简体" w:cs="方正粗宋简体"/>
+          <w:color w:val="000000"/>
+          <w:sz w:val="32"/>
+          <w:szCs w:val="32"/>
+          <w:u w:val="single"/>
+        </w:rPr>
+        <w:t xml:space="preserve">           22123739           </w:t>
+      </w:r>
+    </w:p>
+    <w:p>
+      <w:pPr>
+        <w:spacing w:line="480" w:lineRule="auto"/>
+        <w:ind w:firstLineChars="300" w:firstLine="960"/>
+        <w:jc w:val="left"/>
+        <w:rPr>
+          <w:rFonts w:ascii="方正粗宋简体" w:eastAsia="方正粗宋简体" w:hAnsi="方正粗宋简体" w:cs="方正粗宋简体"/>
+          <w:color w:val="000000"/>
+          <w:sz w:val="32"/>
+          <w:szCs w:val="32"/>
+        </w:rPr>
+      </w:pPr>
       <w:r>
         <w:rPr>
           <w:rFonts w:ascii="方正粗宋简体" w:eastAsia="方正粗宋简体" w:hAnsi="方正粗宋简体" w:cs="方正粗宋简体" w:hint="eastAsia"/>
           <w:color w:val="000000"/>
-          <w:sz w:val="36"/>
-          <w:szCs w:val="36"/>
+          <w:sz w:val="32"/>
+          <w:szCs w:val="32"/>
+        </w:rPr>
+        <w:t>学生姓名：</w:t>
+      </w:r>
+      <w:r>
+        <w:rPr>
+          <w:rFonts w:ascii="方正粗宋简体" w:eastAsia="方正粗宋简体" w:hAnsi="方正粗宋简体" w:cs="方正粗宋简体"/>
+          <w:color w:val="000000"/>
+          <w:sz w:val="32"/>
+          <w:szCs w:val="32"/>
           <w:u w:val="single"/>
         </w:rPr>
-        <w:t xml:space="preserve">                           </w:t>
-      </w:r>
-      <w:r>
+        <w:t xml:space="preserve">            朱奕澄            </w:t>
+      </w:r>
+    </w:p>
+    <w:p>
+      <w:pPr>
+        <w:spacing w:line="480" w:lineRule="auto"/>
+        <w:ind w:firstLineChars="300" w:firstLine="960"/>
+        <w:jc w:val="left"/>
+        <w:rPr>
+          <w:rFonts w:ascii="方正粗宋简体" w:eastAsia="方正粗宋简体" w:hAnsi="方正粗宋简体" w:cs="方正粗宋简体"/>
+          <w:color w:val="000000"/>
+          <w:sz w:val="32"/>
+          <w:szCs w:val="32"/>
+        </w:rPr>
+      </w:pPr>
+      <w:r>
+        <w:rPr>
+          <w:rFonts w:ascii="方正粗宋简体" w:eastAsia="方正粗宋简体" w:hAnsi="方正粗宋简体" w:cs="方正粗宋简体" w:hint="eastAsia"/>
+          <w:color w:val="000000"/>
+          <w:sz w:val="32"/>
+          <w:szCs w:val="32"/>
+        </w:rPr>
+        <w:t>指导教师：</w:t>
+      </w:r>
+      <w:r>
+        <w:rPr>
+          <w:rFonts w:ascii="方正粗宋简体" w:eastAsia="方正粗宋简体" w:hAnsi="方正粗宋简体" w:cs="方正粗宋简体"/>
+          <w:color w:val="000000"/>
+          <w:sz w:val="32"/>
+          <w:szCs w:val="32"/>
+          <w:u w:val="single"/>
+        </w:rPr>
+        <w:t xml:space="preserve">            滕国伟            </w:t>
+      </w:r>
+    </w:p>
+    <w:p>
+      <w:pPr>
+        <w:spacing w:line="480" w:lineRule="auto"/>
+        <w:ind w:firstLineChars="300" w:firstLine="960"/>
+        <w:jc w:val="left"/>
         <w:rPr>
           <w:rFonts w:ascii="方正粗宋简体" w:eastAsia="方正粗宋简体" w:hAnsi="方正粗宋简体" w:cs="方正粗宋简体"/>
           <w:color w:val="000000"/>
@@ -348,135 +423,25 @@
           <w:szCs w:val="36"/>
           <w:u w:val="single"/>
         </w:rPr>
-        <w:t>22123739</w:t>
-      </w:r>
-    </w:p>
-    <w:p>
-      <w:pPr>
-        <w:spacing w:line="480" w:lineRule="auto"/>
-        <w:ind w:firstLineChars="300" w:firstLine="960"/>
-        <w:jc w:val="left"/>
+      </w:pPr>
+      <w:r>
+        <w:rPr>
+          <w:rFonts w:ascii="方正粗宋简体" w:eastAsia="方正粗宋简体" w:hAnsi="方正粗宋简体" w:cs="方正粗宋简体" w:hint="eastAsia"/>
+          <w:color w:val="000000"/>
+          <w:sz w:val="32"/>
+          <w:szCs w:val="32"/>
+        </w:rPr>
+        <w:t>起讫日期：</w:t>
+      </w:r>
+      <w:r>
         <w:rPr>
           <w:rFonts w:ascii="方正粗宋简体" w:eastAsia="方正粗宋简体" w:hAnsi="方正粗宋简体" w:cs="方正粗宋简体"/>
           <w:color w:val="000000"/>
           <w:sz w:val="32"/>
           <w:szCs w:val="32"/>
-        </w:rPr>
-      </w:pPr>
-      <w:r>
-        <w:rPr>
-          <w:rFonts w:ascii="方正粗宋简体" w:eastAsia="方正粗宋简体" w:hAnsi="方正粗宋简体" w:cs="方正粗宋简体" w:hint="eastAsia"/>
-          <w:color w:val="000000"/>
-          <w:sz w:val="32"/>
-          <w:szCs w:val="32"/>
-        </w:rPr>
-        <w:t>学生姓名：</w:t>
-      </w:r>
-      <w:r>
-        <w:rPr>
-          <w:rFonts w:ascii="方正粗宋简体" w:eastAsia="方正粗宋简体" w:hAnsi="方正粗宋简体" w:cs="方正粗宋简体" w:hint="eastAsia"/>
-          <w:color w:val="000000"/>
-          <w:sz w:val="36"/>
-          <w:szCs w:val="36"/>
           <w:u w:val="single"/>
         </w:rPr>
-        <w:t xml:space="preserve">                           </w:t>
-      </w:r>
-      <w:r>
-        <w:rPr>
-          <w:rFonts w:ascii="方正粗宋简体" w:eastAsia="方正粗宋简体" w:hAnsi="方正粗宋简体" w:cs="方正粗宋简体" w:hint="eastAsia"/>
-          <w:color w:val="000000"/>
-          <w:sz w:val="36"/>
-          <w:szCs w:val="36"/>
-          <w:u w:val="single"/>
-        </w:rPr>
-        <w:t>朱奕澄</w:t>
-      </w:r>
-    </w:p>
-    <w:p>
-      <w:pPr>
-        <w:spacing w:line="480" w:lineRule="auto"/>
-        <w:ind w:firstLineChars="300" w:firstLine="960"/>
-        <w:jc w:val="left"/>
-        <w:rPr>
-          <w:rFonts w:ascii="方正粗宋简体" w:eastAsia="方正粗宋简体" w:hAnsi="方正粗宋简体" w:cs="方正粗宋简体"/>
-          <w:color w:val="000000"/>
-          <w:sz w:val="32"/>
-          <w:szCs w:val="32"/>
-        </w:rPr>
-      </w:pPr>
-      <w:r>
-        <w:rPr>
-          <w:rFonts w:ascii="方正粗宋简体" w:eastAsia="方正粗宋简体" w:hAnsi="方正粗宋简体" w:cs="方正粗宋简体" w:hint="eastAsia"/>
-          <w:color w:val="000000"/>
-          <w:sz w:val="32"/>
-          <w:szCs w:val="32"/>
-        </w:rPr>
-        <w:t>指导教师：</w:t>
-      </w:r>
-      <w:r>
-        <w:rPr>
-          <w:rFonts w:ascii="方正粗宋简体" w:eastAsia="方正粗宋简体" w:hAnsi="方正粗宋简体" w:cs="方正粗宋简体" w:hint="eastAsia"/>
-          <w:color w:val="000000"/>
-          <w:sz w:val="36"/>
-          <w:szCs w:val="36"/>
-          <w:u w:val="single"/>
-        </w:rPr>
-        <w:t xml:space="preserve">                           </w:t>
-      </w:r>
-      <w:r>
-        <w:rPr>
-          <w:rFonts w:ascii="方正粗宋简体" w:eastAsia="方正粗宋简体" w:hAnsi="方正粗宋简体" w:cs="方正粗宋简体" w:hint="eastAsia"/>
-          <w:color w:val="000000"/>
-          <w:sz w:val="36"/>
-          <w:szCs w:val="36"/>
-          <w:u w:val="single"/>
-        </w:rPr>
-        <w:t>滕国伟</w:t>
-      </w:r>
-    </w:p>
-    <w:p>
-      <w:pPr>
-        <w:spacing w:line="480" w:lineRule="auto"/>
-        <w:ind w:firstLineChars="300" w:firstLine="960"/>
-        <w:jc w:val="left"/>
-        <w:rPr>
-          <w:rFonts w:ascii="方正粗宋简体" w:eastAsia="方正粗宋简体" w:hAnsi="方正粗宋简体" w:cs="方正粗宋简体"/>
-          <w:color w:val="000000"/>
-          <w:sz w:val="36"/>
-          <w:szCs w:val="36"/>
-          <w:u w:val="single"/>
-        </w:rPr>
-      </w:pPr>
-      <w:r>
-        <w:rPr>
-          <w:rFonts w:ascii="方正粗宋简体" w:eastAsia="方正粗宋简体" w:hAnsi="方正粗宋简体" w:cs="方正粗宋简体" w:hint="eastAsia"/>
-          <w:color w:val="000000"/>
-          <w:sz w:val="32"/>
-          <w:szCs w:val="32"/>
-        </w:rPr>
-        <w:t>起讫日期：</w:t>
-      </w:r>
-      <w:r>
-        <w:rPr>
-          <w:rFonts w:ascii="方正粗宋简体" w:eastAsia="方正粗宋简体" w:hAnsi="方正粗宋简体" w:cs="方正粗宋简体" w:hint="eastAsia"/>
-          <w:color w:val="000000"/>
-          <w:sz w:val="36"/>
-          <w:szCs w:val="36"/>
-          <w:u w:val="single"/>
-        </w:rPr>
-        <w:t xml:space="preserve">                           </w:t>
-      </w:r>
-      <w:r>
-        <w:rPr>
-          <w:rFonts w:ascii="方正粗宋简体" w:eastAsia="方正粗宋简体" w:hAnsi="方正粗宋简体" w:cs="方正粗宋简体"/>
-          <w:color w:val="000000"/>
-          <w:sz w:val="36"/>
-          <w:szCs w:val="36"/>
-          <w:u w:val="single"/>
-        </w:rPr>
-        <w:lastRenderedPageBreak/>
-        <w:t>2025.12.29-2026.05.22</w:t>
+        <w:t xml:space="preserve">     2025.12.29-2026.05.22     </w:t>
       </w:r>
     </w:p>
     <w:p>
@@ -1189,6 +1154,7 @@
           <w:sz w:val="36"/>
           <w:szCs w:val="36"/>
         </w:rPr>
+        <w:lastRenderedPageBreak/>
         <w:t>摘要</w:t>
       </w:r>
     </w:p>
@@ -1437,6 +1403,7 @@
           <w:sz w:val="36"/>
           <w:szCs w:val="36"/>
         </w:rPr>
+        <w:lastRenderedPageBreak/>
         <w:t>ABSTRACT</w:t>
       </w:r>
     </w:p>
@@ -1498,6 +1465,7 @@
           <w:sz w:val="36"/>
           <w:szCs w:val="36"/>
         </w:rPr>
+        <w:lastRenderedPageBreak/>
         <w:t>目</w:t>
       </w:r>
       <w:r>
@@ -1549,11 +1517,10 @@
         </w:rPr>
         <w:fldChar w:fldCharType="separate"/>
       </w:r>
-      <w:hyperlink w:anchor="_TocManualChapter1" w:history="1">
+      <w:hyperlink w:anchor="_Toc228269909" w:history="1">
         <w:r>
           <w:rPr>
             <w:rStyle w:val="af3"/>
-            <w:b/>
             <w:noProof/>
           </w:rPr>
           <w:t>第一章</w:t>
@@ -1561,7 +1528,6 @@
         <w:r>
           <w:rPr>
             <w:rStyle w:val="af3"/>
-            <w:b/>
             <w:noProof/>
           </w:rPr>
           <w:t xml:space="preserve"> </w:t>
@@ -1569,7 +1535,6 @@
         <w:r>
           <w:rPr>
             <w:rStyle w:val="af3"/>
-            <w:b/>
             <w:noProof/>
           </w:rPr>
           <w:t>绪论</w:t>
@@ -1593,7 +1558,7 @@
             <w:noProof/>
             <w:webHidden/>
           </w:rPr>
-          <w:instrText xml:space="preserve"> PAGEREF _TocManualChapter1 \h </w:instrText>
+          <w:instrText xml:space="preserve"> PAGEREF _Toc228269909 \h </w:instrText>
         </w:r>
         <w:r>
           <w:rPr>
@@ -1636,7 +1601,7 @@
           <w14:ligatures w14:val="standardContextual"/>
         </w:rPr>
       </w:pPr>
-      <w:hyperlink w:anchor="_Toc228199416" w:history="1">
+      <w:hyperlink w:anchor="_Toc228269910" w:history="1">
         <w:r>
           <w:rPr>
             <w:rStyle w:val="af3"/>
@@ -1674,7 +1639,7 @@
             <w:noProof/>
             <w:webHidden/>
           </w:rPr>
-          <w:instrText xml:space="preserve"> PAGEREF _Toc228199416 \h </w:instrText>
+          <w:instrText xml:space="preserve"> PAGEREF _Toc228269910 \h </w:instrText>
         </w:r>
         <w:r>
           <w:rPr>
@@ -1717,7 +1682,7 @@
           <w14:ligatures w14:val="standardContextual"/>
         </w:rPr>
       </w:pPr>
-      <w:hyperlink w:anchor="_Toc228199417" w:history="1">
+      <w:hyperlink w:anchor="_Toc228269911" w:history="1">
         <w:r>
           <w:rPr>
             <w:rStyle w:val="af3"/>
@@ -1755,7 +1720,7 @@
             <w:noProof/>
             <w:webHidden/>
           </w:rPr>
-          <w:instrText xml:space="preserve"> PAGEREF _Toc228199417 \h </w:instrText>
+          <w:instrText xml:space="preserve"> PAGEREF _Toc228269911 \h </w:instrText>
         </w:r>
         <w:r>
           <w:rPr>
@@ -1798,7 +1763,7 @@
           <w14:ligatures w14:val="standardContextual"/>
         </w:rPr>
       </w:pPr>
-      <w:hyperlink w:anchor="_Toc228199418" w:history="1">
+      <w:hyperlink w:anchor="_Toc228269912" w:history="1">
         <w:r>
           <w:rPr>
             <w:rStyle w:val="af3"/>
@@ -1836,7 +1801,7 @@
             <w:noProof/>
             <w:webHidden/>
           </w:rPr>
-          <w:instrText xml:space="preserve"> PAGEREF _Toc228199418 \h </w:instrText>
+          <w:instrText xml:space="preserve"> PAGEREF _Toc228269912 \h </w:instrText>
         </w:r>
         <w:r>
           <w:rPr>
@@ -1879,7 +1844,7 @@
           <w14:ligatures w14:val="standardContextual"/>
         </w:rPr>
       </w:pPr>
-      <w:hyperlink w:anchor="_Toc228199419" w:history="1">
+      <w:hyperlink w:anchor="_Toc228269913" w:history="1">
         <w:r>
           <w:rPr>
             <w:rStyle w:val="af3"/>
@@ -1917,7 +1882,7 @@
             <w:noProof/>
             <w:webHidden/>
           </w:rPr>
-          <w:instrText xml:space="preserve"> PAGEREF _Toc228199419 \h </w:instrText>
+          <w:instrText xml:space="preserve"> PAGEREF _Toc228269913 \h </w:instrText>
         </w:r>
         <w:r>
           <w:rPr>
@@ -1960,7 +1925,7 @@
           <w14:ligatures w14:val="standardContextual"/>
         </w:rPr>
       </w:pPr>
-      <w:hyperlink w:anchor="_Toc228199420" w:history="1">
+      <w:hyperlink w:anchor="_Toc228269914" w:history="1">
         <w:r>
           <w:rPr>
             <w:rStyle w:val="af3"/>
@@ -2004,7 +1969,7 @@
             <w:noProof/>
             <w:webHidden/>
           </w:rPr>
-          <w:instrText xml:space="preserve"> PAGEREF _Toc228199420 \h </w:instrText>
+          <w:instrText xml:space="preserve"> PAGEREF _Toc228269914 \h </w:instrText>
         </w:r>
         <w:r>
           <w:rPr>
@@ -2047,7 +2012,7 @@
           <w14:ligatures w14:val="standardContextual"/>
         </w:rPr>
       </w:pPr>
-      <w:hyperlink w:anchor="_Toc228199421" w:history="1">
+      <w:hyperlink w:anchor="_Toc228269915" w:history="1">
         <w:r>
           <w:rPr>
             <w:rStyle w:val="af3"/>
@@ -2085,7 +2050,7 @@
             <w:noProof/>
             <w:webHidden/>
           </w:rPr>
-          <w:instrText xml:space="preserve"> PAGEREF _Toc228199421 \h </w:instrText>
+          <w:instrText xml:space="preserve"> PAGEREF _Toc228269915 \h </w:instrText>
         </w:r>
         <w:r>
           <w:rPr>
@@ -2128,7 +2093,7 @@
           <w14:ligatures w14:val="standardContextual"/>
         </w:rPr>
       </w:pPr>
-      <w:hyperlink w:anchor="_Toc228199422" w:history="1">
+      <w:hyperlink w:anchor="_Toc228269916" w:history="1">
         <w:r>
           <w:rPr>
             <w:rStyle w:val="af3"/>
@@ -2166,7 +2131,7 @@
             <w:noProof/>
             <w:webHidden/>
           </w:rPr>
-          <w:instrText xml:space="preserve"> PAGEREF _Toc228199422 \h </w:instrText>
+          <w:instrText xml:space="preserve"> PAGEREF _Toc228269916 \h </w:instrText>
         </w:r>
         <w:r>
           <w:rPr>
@@ -2209,7 +2174,7 @@
           <w14:ligatures w14:val="standardContextual"/>
         </w:rPr>
       </w:pPr>
-      <w:hyperlink w:anchor="_Toc228199423" w:history="1">
+      <w:hyperlink w:anchor="_Toc228269917" w:history="1">
         <w:r>
           <w:rPr>
             <w:rStyle w:val="af3"/>
@@ -2247,7 +2212,7 @@
             <w:noProof/>
             <w:webHidden/>
           </w:rPr>
-          <w:instrText xml:space="preserve"> PAGEREF _Toc228199423 \h </w:instrText>
+          <w:instrText xml:space="preserve"> PAGEREF _Toc228269917 \h </w:instrText>
         </w:r>
         <w:r>
           <w:rPr>
@@ -2290,7 +2255,7 @@
           <w14:ligatures w14:val="standardContextual"/>
         </w:rPr>
       </w:pPr>
-      <w:hyperlink w:anchor="_Toc228199424" w:history="1">
+      <w:hyperlink w:anchor="_Toc228269918" w:history="1">
         <w:r>
           <w:rPr>
             <w:rStyle w:val="af3"/>
@@ -2328,7 +2293,7 @@
             <w:noProof/>
             <w:webHidden/>
           </w:rPr>
-          <w:instrText xml:space="preserve"> PAGEREF _Toc228199424 \h </w:instrText>
+          <w:instrText xml:space="preserve"> PAGEREF _Toc228269918 \h </w:instrText>
         </w:r>
         <w:r>
           <w:rPr>
@@ -2371,7 +2336,7 @@
           <w14:ligatures w14:val="standardContextual"/>
         </w:rPr>
       </w:pPr>
-      <w:hyperlink w:anchor="_Toc228199425" w:history="1">
+      <w:hyperlink w:anchor="_Toc228269919" w:history="1">
         <w:r>
           <w:rPr>
             <w:rStyle w:val="af3"/>
@@ -2409,7 +2374,7 @@
             <w:noProof/>
             <w:webHidden/>
           </w:rPr>
-          <w:instrText xml:space="preserve"> PAGEREF _Toc228199425 \h </w:instrText>
+          <w:instrText xml:space="preserve"> PAGEREF _Toc228269919 \h </w:instrText>
         </w:r>
         <w:r>
           <w:rPr>
@@ -2452,7 +2417,7 @@
           <w14:ligatures w14:val="standardContextual"/>
         </w:rPr>
       </w:pPr>
-      <w:hyperlink w:anchor="_Toc228199426" w:history="1">
+      <w:hyperlink w:anchor="_Toc228269920" w:history="1">
         <w:r>
           <w:rPr>
             <w:rStyle w:val="af3"/>
@@ -2490,7 +2455,7 @@
             <w:noProof/>
             <w:webHidden/>
           </w:rPr>
-          <w:instrText xml:space="preserve"> PAGEREF _Toc228199426 \h </w:instrText>
+          <w:instrText xml:space="preserve"> PAGEREF _Toc228269920 \h </w:instrText>
         </w:r>
         <w:r>
           <w:rPr>
@@ -2533,7 +2498,7 @@
           <w14:ligatures w14:val="standardContextual"/>
         </w:rPr>
       </w:pPr>
-      <w:hyperlink w:anchor="_Toc228199427" w:history="1">
+      <w:hyperlink w:anchor="_Toc228269921" w:history="1">
         <w:r>
           <w:rPr>
             <w:rStyle w:val="af3"/>
@@ -2577,7 +2542,7 @@
             <w:noProof/>
             <w:webHidden/>
           </w:rPr>
-          <w:instrText xml:space="preserve"> PAGEREF _Toc228199427 \h </w:instrText>
+          <w:instrText xml:space="preserve"> PAGEREF _Toc228269921 \h </w:instrText>
         </w:r>
         <w:r>
           <w:rPr>
@@ -2620,7 +2585,7 @@
           <w14:ligatures w14:val="standardContextual"/>
         </w:rPr>
       </w:pPr>
-      <w:hyperlink w:anchor="_Toc228199428" w:history="1">
+      <w:hyperlink w:anchor="_Toc228269922" w:history="1">
         <w:r>
           <w:rPr>
             <w:rStyle w:val="af3"/>
@@ -2658,7 +2623,7 @@
             <w:noProof/>
             <w:webHidden/>
           </w:rPr>
-          <w:instrText xml:space="preserve"> PAGEREF _Toc228199428 \h </w:instrText>
+          <w:instrText xml:space="preserve"> PAGEREF _Toc228269922 \h </w:instrText>
         </w:r>
         <w:r>
           <w:rPr>
@@ -2700,7 +2665,7 @@
           <w14:ligatures w14:val="standardContextual"/>
         </w:rPr>
       </w:pPr>
-      <w:hyperlink w:anchor="_Toc228199429" w:history="1">
+      <w:hyperlink w:anchor="_Toc228269923" w:history="1">
         <w:r>
           <w:rPr>
             <w:rStyle w:val="af3"/>
@@ -2738,7 +2703,7 @@
             <w:noProof/>
             <w:webHidden/>
           </w:rPr>
-          <w:instrText xml:space="preserve"> PAGEREF _Toc228199429 \h </w:instrText>
+          <w:instrText xml:space="preserve"> PAGEREF _Toc228269923 \h </w:instrText>
         </w:r>
         <w:r>
           <w:rPr>
@@ -2780,7 +2745,7 @@
           <w14:ligatures w14:val="standardContextual"/>
         </w:rPr>
       </w:pPr>
-      <w:hyperlink w:anchor="_Toc228199430" w:history="1">
+      <w:hyperlink w:anchor="_Toc228269924" w:history="1">
         <w:r>
           <w:rPr>
             <w:rStyle w:val="af3"/>
@@ -2818,7 +2783,7 @@
             <w:noProof/>
             <w:webHidden/>
           </w:rPr>
-          <w:instrText xml:space="preserve"> PAGEREF _Toc228199430 \h </w:instrText>
+          <w:instrText xml:space="preserve"> PAGEREF _Toc228269924 \h </w:instrText>
         </w:r>
         <w:r>
           <w:rPr>
@@ -2860,7 +2825,7 @@
           <w14:ligatures w14:val="standardContextual"/>
         </w:rPr>
       </w:pPr>
-      <w:hyperlink w:anchor="_Toc228199431" w:history="1">
+      <w:hyperlink w:anchor="_Toc228269925" w:history="1">
         <w:r>
           <w:rPr>
             <w:rStyle w:val="af3"/>
@@ -2898,7 +2863,7 @@
             <w:noProof/>
             <w:webHidden/>
           </w:rPr>
-          <w:instrText xml:space="preserve"> PAGEREF _Toc228199431 \h </w:instrText>
+          <w:instrText xml:space="preserve"> PAGEREF _Toc228269925 \h </w:instrText>
         </w:r>
         <w:r>
           <w:rPr>
@@ -2941,7 +2906,7 @@
           <w14:ligatures w14:val="standardContextual"/>
         </w:rPr>
       </w:pPr>
-      <w:hyperlink w:anchor="_Toc228199432" w:history="1">
+      <w:hyperlink w:anchor="_Toc228269926" w:history="1">
         <w:r>
           <w:rPr>
             <w:rStyle w:val="af3"/>
@@ -2979,7 +2944,7 @@
             <w:noProof/>
             <w:webHidden/>
           </w:rPr>
-          <w:instrText xml:space="preserve"> PAGEREF _Toc228199432 \h </w:instrText>
+          <w:instrText xml:space="preserve"> PAGEREF _Toc228269926 \h </w:instrText>
         </w:r>
         <w:r>
           <w:rPr>
@@ -3022,7 +2987,7 @@
           <w14:ligatures w14:val="standardContextual"/>
         </w:rPr>
       </w:pPr>
-      <w:hyperlink w:anchor="_Toc228199433" w:history="1">
+      <w:hyperlink w:anchor="_Toc228269927" w:history="1">
         <w:r>
           <w:rPr>
             <w:rStyle w:val="af3"/>
@@ -3060,7 +3025,7 @@
             <w:noProof/>
             <w:webHidden/>
           </w:rPr>
-          <w:instrText xml:space="preserve"> PAGEREF _Toc228199433 \h </w:instrText>
+          <w:instrText xml:space="preserve"> PAGEREF _Toc228269927 \h </w:instrText>
         </w:r>
         <w:r>
           <w:rPr>
@@ -3102,7 +3067,7 @@
           <w14:ligatures w14:val="standardContextual"/>
         </w:rPr>
       </w:pPr>
-      <w:hyperlink w:anchor="_Toc228199434" w:history="1">
+      <w:hyperlink w:anchor="_Toc228269928" w:history="1">
         <w:r>
           <w:rPr>
             <w:rStyle w:val="af3"/>
@@ -3140,7 +3105,7 @@
             <w:noProof/>
             <w:webHidden/>
           </w:rPr>
-          <w:instrText xml:space="preserve"> PAGEREF _Toc228199434 \h </w:instrText>
+          <w:instrText xml:space="preserve"> PAGEREF _Toc228269928 \h </w:instrText>
         </w:r>
         <w:r>
           <w:rPr>
@@ -3182,7 +3147,7 @@
           <w14:ligatures w14:val="standardContextual"/>
         </w:rPr>
       </w:pPr>
-      <w:hyperlink w:anchor="_Toc228199435" w:history="1">
+      <w:hyperlink w:anchor="_Toc228269929" w:history="1">
         <w:r>
           <w:rPr>
             <w:rStyle w:val="af3"/>
@@ -3220,7 +3185,7 @@
             <w:noProof/>
             <w:webHidden/>
           </w:rPr>
-          <w:instrText xml:space="preserve"> PAGEREF _Toc228199435 \h </w:instrText>
+          <w:instrText xml:space="preserve"> PAGEREF _Toc228269929 \h </w:instrText>
         </w:r>
         <w:r>
           <w:rPr>
@@ -3263,7 +3228,7 @@
           <w14:ligatures w14:val="standardContextual"/>
         </w:rPr>
       </w:pPr>
-      <w:hyperlink w:anchor="_Toc228199436" w:history="1">
+      <w:hyperlink w:anchor="_Toc228269930" w:history="1">
         <w:r>
           <w:rPr>
             <w:rStyle w:val="af3"/>
@@ -3301,7 +3266,7 @@
             <w:noProof/>
             <w:webHidden/>
           </w:rPr>
-          <w:instrText xml:space="preserve"> PAGEREF _Toc228199436 \h </w:instrText>
+          <w:instrText xml:space="preserve"> PAGEREF _Toc228269930 \h </w:instrText>
         </w:r>
         <w:r>
           <w:rPr>
@@ -3343,7 +3308,7 @@
           <w14:ligatures w14:val="standardContextual"/>
         </w:rPr>
       </w:pPr>
-      <w:hyperlink w:anchor="_Toc228199437" w:history="1">
+      <w:hyperlink w:anchor="_Toc228269931" w:history="1">
         <w:r>
           <w:rPr>
             <w:rStyle w:val="af3"/>
@@ -3381,7 +3346,7 @@
             <w:noProof/>
             <w:webHidden/>
           </w:rPr>
-          <w:instrText xml:space="preserve"> PAGEREF _Toc228199437 \h </w:instrText>
+          <w:instrText xml:space="preserve"> PAGEREF _Toc228269931 \h </w:instrText>
         </w:r>
         <w:r>
           <w:rPr>
@@ -3423,7 +3388,7 @@
           <w14:ligatures w14:val="standardContextual"/>
         </w:rPr>
       </w:pPr>
-      <w:hyperlink w:anchor="_Toc228199438" w:history="1">
+      <w:hyperlink w:anchor="_Toc228269932" w:history="1">
         <w:r>
           <w:rPr>
             <w:rStyle w:val="af3"/>
@@ -3461,7 +3426,7 @@
             <w:noProof/>
             <w:webHidden/>
           </w:rPr>
-          <w:instrText xml:space="preserve"> PAGEREF _Toc228199438 \h </w:instrText>
+          <w:instrText xml:space="preserve"> PAGEREF _Toc228269932 \h </w:instrText>
         </w:r>
         <w:r>
           <w:rPr>
@@ -3504,7 +3469,7 @@
           <w14:ligatures w14:val="standardContextual"/>
         </w:rPr>
       </w:pPr>
-      <w:hyperlink w:anchor="_Toc228199439" w:history="1">
+      <w:hyperlink w:anchor="_Toc228269933" w:history="1">
         <w:r>
           <w:rPr>
             <w:rStyle w:val="af3"/>
@@ -3560,7 +3525,7 @@
             <w:noProof/>
             <w:webHidden/>
           </w:rPr>
-          <w:instrText xml:space="preserve"> PAGEREF _Toc228199439 \h </w:instrText>
+          <w:instrText xml:space="preserve"> PAGEREF _Toc228269933 \h </w:instrText>
         </w:r>
         <w:r>
           <w:rPr>
@@ -3602,7 +3567,7 @@
           <w14:ligatures w14:val="standardContextual"/>
         </w:rPr>
       </w:pPr>
-      <w:hyperlink w:anchor="_Toc228199440" w:history="1">
+      <w:hyperlink w:anchor="_Toc228269934" w:history="1">
         <w:r>
           <w:rPr>
             <w:rStyle w:val="af3"/>
@@ -3640,7 +3605,7 @@
             <w:noProof/>
             <w:webHidden/>
           </w:rPr>
-          <w:instrText xml:space="preserve"> PAGEREF _Toc228199440 \h </w:instrText>
+          <w:instrText xml:space="preserve"> PAGEREF _Toc228269934 \h </w:instrText>
         </w:r>
         <w:r>
           <w:rPr>
@@ -3682,7 +3647,7 @@
           <w14:ligatures w14:val="standardContextual"/>
         </w:rPr>
       </w:pPr>
-      <w:hyperlink w:anchor="_Toc228199441" w:history="1">
+      <w:hyperlink w:anchor="_Toc228269935" w:history="1">
         <w:r>
           <w:rPr>
             <w:rStyle w:val="af3"/>
@@ -3738,7 +3703,7 @@
             <w:noProof/>
             <w:webHidden/>
           </w:rPr>
-          <w:instrText xml:space="preserve"> PAGEREF _Toc228199441 \h </w:instrText>
+          <w:instrText xml:space="preserve"> PAGEREF _Toc228269935 \h </w:instrText>
         </w:r>
         <w:r>
           <w:rPr>
@@ -3780,7 +3745,7 @@
           <w14:ligatures w14:val="standardContextual"/>
         </w:rPr>
       </w:pPr>
-      <w:hyperlink w:anchor="_Toc228199442" w:history="1">
+      <w:hyperlink w:anchor="_Toc228269936" w:history="1">
         <w:r>
           <w:rPr>
             <w:rStyle w:val="af3"/>
@@ -3818,7 +3783,7 @@
             <w:noProof/>
             <w:webHidden/>
           </w:rPr>
-          <w:instrText xml:space="preserve"> PAGEREF _Toc228199442 \h </w:instrText>
+          <w:instrText xml:space="preserve"> PAGEREF _Toc228269936 \h </w:instrText>
         </w:r>
         <w:r>
           <w:rPr>
@@ -3861,7 +3826,7 @@
           <w14:ligatures w14:val="standardContextual"/>
         </w:rPr>
       </w:pPr>
-      <w:hyperlink w:anchor="_Toc228199443" w:history="1">
+      <w:hyperlink w:anchor="_Toc228269937" w:history="1">
         <w:r>
           <w:rPr>
             <w:rStyle w:val="af3"/>
@@ -3917,7 +3882,7 @@
             <w:noProof/>
             <w:webHidden/>
           </w:rPr>
-          <w:instrText xml:space="preserve"> PAGEREF _Toc228199443 \h </w:instrText>
+          <w:instrText xml:space="preserve"> PAGEREF _Toc228269937 \h </w:instrText>
         </w:r>
         <w:r>
           <w:rPr>
@@ -3959,7 +3924,7 @@
           <w14:ligatures w14:val="standardContextual"/>
         </w:rPr>
       </w:pPr>
-      <w:hyperlink w:anchor="_Toc228199444" w:history="1">
+      <w:hyperlink w:anchor="_Toc228269938" w:history="1">
         <w:r>
           <w:rPr>
             <w:rStyle w:val="af3"/>
@@ -4015,7 +3980,7 @@
             <w:noProof/>
             <w:webHidden/>
           </w:rPr>
-          <w:instrText xml:space="preserve"> PAGEREF _Toc228199444 \h </w:instrText>
+          <w:instrText xml:space="preserve"> PAGEREF _Toc228269938 \h </w:instrText>
         </w:r>
         <w:r>
           <w:rPr>
@@ -4057,7 +4022,7 @@
           <w14:ligatures w14:val="standardContextual"/>
         </w:rPr>
       </w:pPr>
-      <w:hyperlink w:anchor="_Toc228199445" w:history="1">
+      <w:hyperlink w:anchor="_Toc228269939" w:history="1">
         <w:r>
           <w:rPr>
             <w:rStyle w:val="af3"/>
@@ -4113,7 +4078,7 @@
             <w:noProof/>
             <w:webHidden/>
           </w:rPr>
-          <w:instrText xml:space="preserve"> PAGEREF _Toc228199445 \h </w:instrText>
+          <w:instrText xml:space="preserve"> PAGEREF _Toc228269939 \h </w:instrText>
         </w:r>
         <w:r>
           <w:rPr>
@@ -4155,7 +4120,7 @@
           <w14:ligatures w14:val="standardContextual"/>
         </w:rPr>
       </w:pPr>
-      <w:hyperlink w:anchor="_Toc228199446" w:history="1">
+      <w:hyperlink w:anchor="_Toc228269940" w:history="1">
         <w:r>
           <w:rPr>
             <w:rStyle w:val="af3"/>
@@ -4193,7 +4158,7 @@
             <w:noProof/>
             <w:webHidden/>
           </w:rPr>
-          <w:instrText xml:space="preserve"> PAGEREF _Toc228199446 \h </w:instrText>
+          <w:instrText xml:space="preserve"> PAGEREF _Toc228269940 \h </w:instrText>
         </w:r>
         <w:r>
           <w:rPr>
@@ -4236,7 +4201,7 @@
           <w14:ligatures w14:val="standardContextual"/>
         </w:rPr>
       </w:pPr>
-      <w:hyperlink w:anchor="_Toc228199447" w:history="1">
+      <w:hyperlink w:anchor="_Toc228269941" w:history="1">
         <w:r>
           <w:rPr>
             <w:rStyle w:val="af3"/>
@@ -4274,7 +4239,7 @@
             <w:noProof/>
             <w:webHidden/>
           </w:rPr>
-          <w:instrText xml:space="preserve"> PAGEREF _Toc228199447 \h </w:instrText>
+          <w:instrText xml:space="preserve"> PAGEREF _Toc228269941 \h </w:instrText>
         </w:r>
         <w:r>
           <w:rPr>
@@ -4317,7 +4282,7 @@
           <w14:ligatures w14:val="standardContextual"/>
         </w:rPr>
       </w:pPr>
-      <w:hyperlink w:anchor="_Toc228199448" w:history="1">
+      <w:hyperlink w:anchor="_Toc228269942" w:history="1">
         <w:r>
           <w:rPr>
             <w:rStyle w:val="af3"/>
@@ -4361,7 +4326,7 @@
             <w:noProof/>
             <w:webHidden/>
           </w:rPr>
-          <w:instrText xml:space="preserve"> PAGEREF _Toc228199448 \h </w:instrText>
+          <w:instrText xml:space="preserve"> PAGEREF _Toc228269942 \h </w:instrText>
         </w:r>
         <w:r>
           <w:rPr>
@@ -4404,7 +4369,7 @@
           <w14:ligatures w14:val="standardContextual"/>
         </w:rPr>
       </w:pPr>
-      <w:hyperlink w:anchor="_Toc228199449" w:history="1">
+      <w:hyperlink w:anchor="_Toc228269943" w:history="1">
         <w:r>
           <w:rPr>
             <w:rStyle w:val="af3"/>
@@ -4442,7 +4407,7 @@
             <w:noProof/>
             <w:webHidden/>
           </w:rPr>
-          <w:instrText xml:space="preserve"> PAGEREF _Toc228199449 \h </w:instrText>
+          <w:instrText xml:space="preserve"> PAGEREF _Toc228269943 \h </w:instrText>
         </w:r>
         <w:r>
           <w:rPr>
@@ -4485,7 +4450,7 @@
           <w14:ligatures w14:val="standardContextual"/>
         </w:rPr>
       </w:pPr>
-      <w:hyperlink w:anchor="_Toc228199450" w:history="1">
+      <w:hyperlink w:anchor="_Toc228269944" w:history="1">
         <w:r>
           <w:rPr>
             <w:rStyle w:val="af3"/>
@@ -4541,7 +4506,7 @@
             <w:noProof/>
             <w:webHidden/>
           </w:rPr>
-          <w:instrText xml:space="preserve"> PAGEREF _Toc228199450 \h </w:instrText>
+          <w:instrText xml:space="preserve"> PAGEREF _Toc228269944 \h </w:instrText>
         </w:r>
         <w:r>
           <w:rPr>
@@ -4584,7 +4549,7 @@
           <w14:ligatures w14:val="standardContextual"/>
         </w:rPr>
       </w:pPr>
-      <w:hyperlink w:anchor="_Toc228199451" w:history="1">
+      <w:hyperlink w:anchor="_Toc228269945" w:history="1">
         <w:r>
           <w:rPr>
             <w:rStyle w:val="af3"/>
@@ -4622,7 +4587,7 @@
             <w:noProof/>
             <w:webHidden/>
           </w:rPr>
-          <w:instrText xml:space="preserve"> PAGEREF _Toc228199451 \h </w:instrText>
+          <w:instrText xml:space="preserve"> PAGEREF _Toc228269945 \h </w:instrText>
         </w:r>
         <w:r>
           <w:rPr>
@@ -4665,7 +4630,7 @@
           <w14:ligatures w14:val="standardContextual"/>
         </w:rPr>
       </w:pPr>
-      <w:hyperlink w:anchor="_Toc228199452" w:history="1">
+      <w:hyperlink w:anchor="_Toc228269946" w:history="1">
         <w:r>
           <w:rPr>
             <w:rStyle w:val="af3"/>
@@ -4703,7 +4668,7 @@
             <w:noProof/>
             <w:webHidden/>
           </w:rPr>
-          <w:instrText xml:space="preserve"> PAGEREF _Toc228199452 \h </w:instrText>
+          <w:instrText xml:space="preserve"> PAGEREF _Toc228269946 \h </w:instrText>
         </w:r>
         <w:r>
           <w:rPr>
@@ -4746,7 +4711,7 @@
           <w14:ligatures w14:val="standardContextual"/>
         </w:rPr>
       </w:pPr>
-      <w:hyperlink w:anchor="_Toc228199453" w:history="1">
+      <w:hyperlink w:anchor="_Toc228269947" w:history="1">
         <w:r>
           <w:rPr>
             <w:rStyle w:val="af3"/>
@@ -4802,7 +4767,7 @@
             <w:noProof/>
             <w:webHidden/>
           </w:rPr>
-          <w:instrText xml:space="preserve"> PAGEREF _Toc228199453 \h </w:instrText>
+          <w:instrText xml:space="preserve"> PAGEREF _Toc228269947 \h </w:instrText>
         </w:r>
         <w:r>
           <w:rPr>
@@ -4845,7 +4810,7 @@
           <w14:ligatures w14:val="standardContextual"/>
         </w:rPr>
       </w:pPr>
-      <w:hyperlink w:anchor="_Toc228199454" w:history="1">
+      <w:hyperlink w:anchor="_Toc228269948" w:history="1">
         <w:r>
           <w:rPr>
             <w:rStyle w:val="af3"/>
@@ -4901,7 +4866,7 @@
             <w:noProof/>
             <w:webHidden/>
           </w:rPr>
-          <w:instrText xml:space="preserve"> PAGEREF _Toc228199454 \h </w:instrText>
+          <w:instrText xml:space="preserve"> PAGEREF _Toc228269948 \h </w:instrText>
         </w:r>
         <w:r>
           <w:rPr>
@@ -4944,7 +4909,7 @@
           <w14:ligatures w14:val="standardContextual"/>
         </w:rPr>
       </w:pPr>
-      <w:hyperlink w:anchor="_Toc228199455" w:history="1">
+      <w:hyperlink w:anchor="_Toc228269949" w:history="1">
         <w:r>
           <w:rPr>
             <w:rStyle w:val="af3"/>
@@ -5000,7 +4965,7 @@
             <w:noProof/>
             <w:webHidden/>
           </w:rPr>
-          <w:instrText xml:space="preserve"> PAGEREF _Toc228199455 \h </w:instrText>
+          <w:instrText xml:space="preserve"> PAGEREF _Toc228269949 \h </w:instrText>
         </w:r>
         <w:r>
           <w:rPr>
@@ -5043,7 +5008,7 @@
           <w14:ligatures w14:val="standardContextual"/>
         </w:rPr>
       </w:pPr>
-      <w:hyperlink w:anchor="_Toc228199456" w:history="1">
+      <w:hyperlink w:anchor="_Toc228269950" w:history="1">
         <w:r>
           <w:rPr>
             <w:rStyle w:val="af3"/>
@@ -5081,7 +5046,7 @@
             <w:noProof/>
             <w:webHidden/>
           </w:rPr>
-          <w:instrText xml:space="preserve"> PAGEREF _Toc228199456 \h </w:instrText>
+          <w:instrText xml:space="preserve"> PAGEREF _Toc228269950 \h </w:instrText>
         </w:r>
         <w:r>
           <w:rPr>
@@ -5124,7 +5089,7 @@
           <w14:ligatures w14:val="standardContextual"/>
         </w:rPr>
       </w:pPr>
-      <w:hyperlink w:anchor="_Toc228199457" w:history="1">
+      <w:hyperlink w:anchor="_Toc228269951" w:history="1">
         <w:r>
           <w:rPr>
             <w:rStyle w:val="af3"/>
@@ -5162,7 +5127,7 @@
             <w:noProof/>
             <w:webHidden/>
           </w:rPr>
-          <w:instrText xml:space="preserve"> PAGEREF _Toc228199457 \h </w:instrText>
+          <w:instrText xml:space="preserve"> PAGEREF _Toc228269951 \h </w:instrText>
         </w:r>
         <w:r>
           <w:rPr>
@@ -5205,7 +5170,7 @@
           <w14:ligatures w14:val="standardContextual"/>
         </w:rPr>
       </w:pPr>
-      <w:hyperlink w:anchor="_Toc228199458" w:history="1">
+      <w:hyperlink w:anchor="_Toc228269952" w:history="1">
         <w:r>
           <w:rPr>
             <w:rStyle w:val="af3"/>
@@ -5249,7 +5214,7 @@
             <w:noProof/>
             <w:webHidden/>
           </w:rPr>
-          <w:instrText xml:space="preserve"> PAGEREF _Toc228199458 \h </w:instrText>
+          <w:instrText xml:space="preserve"> PAGEREF _Toc228269952 \h </w:instrText>
         </w:r>
         <w:r>
           <w:rPr>
@@ -5292,7 +5257,7 @@
           <w14:ligatures w14:val="standardContextual"/>
         </w:rPr>
       </w:pPr>
-      <w:hyperlink w:anchor="_Toc228199459" w:history="1">
+      <w:hyperlink w:anchor="_Toc228269953" w:history="1">
         <w:r>
           <w:rPr>
             <w:rStyle w:val="af3"/>
@@ -5330,7 +5295,7 @@
             <w:noProof/>
             <w:webHidden/>
           </w:rPr>
-          <w:instrText xml:space="preserve"> PAGEREF _Toc228199459 \h </w:instrText>
+          <w:instrText xml:space="preserve"> PAGEREF _Toc228269953 \h </w:instrText>
         </w:r>
         <w:r>
           <w:rPr>
@@ -5373,7 +5338,7 @@
           <w14:ligatures w14:val="standardContextual"/>
         </w:rPr>
       </w:pPr>
-      <w:hyperlink w:anchor="_Toc228199460" w:history="1">
+      <w:hyperlink w:anchor="_Toc228269954" w:history="1">
         <w:r>
           <w:rPr>
             <w:rStyle w:val="af3"/>
@@ -5411,7 +5376,7 @@
             <w:noProof/>
             <w:webHidden/>
           </w:rPr>
-          <w:instrText xml:space="preserve"> PAGEREF _Toc228199460 \h </w:instrText>
+          <w:instrText xml:space="preserve"> PAGEREF _Toc228269954 \h </w:instrText>
         </w:r>
         <w:r>
           <w:rPr>
@@ -5454,7 +5419,7 @@
           <w14:ligatures w14:val="standardContextual"/>
         </w:rPr>
       </w:pPr>
-      <w:hyperlink w:anchor="_Toc228199461" w:history="1">
+      <w:hyperlink w:anchor="_Toc228269955" w:history="1">
         <w:r>
           <w:rPr>
             <w:rStyle w:val="af3"/>
@@ -5492,7 +5457,7 @@
             <w:noProof/>
             <w:webHidden/>
           </w:rPr>
-          <w:instrText xml:space="preserve"> PAGEREF _Toc228199461 \h </w:instrText>
+          <w:instrText xml:space="preserve"> PAGEREF _Toc228269955 \h </w:instrText>
         </w:r>
         <w:r>
           <w:rPr>
@@ -5535,7 +5500,7 @@
           <w14:ligatures w14:val="standardContextual"/>
         </w:rPr>
       </w:pPr>
-      <w:hyperlink w:anchor="_Toc228199462" w:history="1">
+      <w:hyperlink w:anchor="_Toc228269956" w:history="1">
         <w:r>
           <w:rPr>
             <w:rStyle w:val="af3"/>
@@ -5591,7 +5556,7 @@
             <w:noProof/>
             <w:webHidden/>
           </w:rPr>
-          <w:instrText xml:space="preserve"> PAGEREF _Toc228199462 \h </w:instrText>
+          <w:instrText xml:space="preserve"> PAGEREF _Toc228269956 \h </w:instrText>
         </w:r>
         <w:r>
           <w:rPr>
@@ -5634,7 +5599,7 @@
           <w14:ligatures w14:val="standardContextual"/>
         </w:rPr>
       </w:pPr>
-      <w:hyperlink w:anchor="_Toc228199463" w:history="1">
+      <w:hyperlink w:anchor="_Toc228269957" w:history="1">
         <w:r>
           <w:rPr>
             <w:rStyle w:val="af3"/>
@@ -5672,7 +5637,7 @@
             <w:noProof/>
             <w:webHidden/>
           </w:rPr>
-          <w:instrText xml:space="preserve"> PAGEREF _Toc228199463 \h </w:instrText>
+          <w:instrText xml:space="preserve"> PAGEREF _Toc228269957 \h </w:instrText>
         </w:r>
         <w:r>
           <w:rPr>
@@ -5715,7 +5680,7 @@
           <w14:ligatures w14:val="standardContextual"/>
         </w:rPr>
       </w:pPr>
-      <w:hyperlink w:anchor="_Toc228199464" w:history="1">
+      <w:hyperlink w:anchor="_Toc228269958" w:history="1">
         <w:r>
           <w:rPr>
             <w:rStyle w:val="af3"/>
@@ -5771,7 +5736,7 @@
             <w:noProof/>
             <w:webHidden/>
           </w:rPr>
-          <w:instrText xml:space="preserve"> PAGEREF _Toc228199464 \h </w:instrText>
+          <w:instrText xml:space="preserve"> PAGEREF _Toc228269958 \h </w:instrText>
         </w:r>
         <w:r>
           <w:rPr>
@@ -5814,7 +5779,7 @@
           <w14:ligatures w14:val="standardContextual"/>
         </w:rPr>
       </w:pPr>
-      <w:hyperlink w:anchor="_Toc228199465" w:history="1">
+      <w:hyperlink w:anchor="_Toc228269959" w:history="1">
         <w:r>
           <w:rPr>
             <w:rStyle w:val="af3"/>
@@ -5852,7 +5817,7 @@
             <w:noProof/>
             <w:webHidden/>
           </w:rPr>
-          <w:instrText xml:space="preserve"> PAGEREF _Toc228199465 \h </w:instrText>
+          <w:instrText xml:space="preserve"> PAGEREF _Toc228269959 \h </w:instrText>
         </w:r>
         <w:r>
           <w:rPr>
@@ -5895,7 +5860,7 @@
           <w14:ligatures w14:val="standardContextual"/>
         </w:rPr>
       </w:pPr>
-      <w:hyperlink w:anchor="_Toc228199466" w:history="1">
+      <w:hyperlink w:anchor="_Toc228269960" w:history="1">
         <w:r>
           <w:rPr>
             <w:rStyle w:val="af3"/>
@@ -5933,7 +5898,7 @@
             <w:noProof/>
             <w:webHidden/>
           </w:rPr>
-          <w:instrText xml:space="preserve"> PAGEREF _Toc228199466 \h </w:instrText>
+          <w:instrText xml:space="preserve"> PAGEREF _Toc228269960 \h </w:instrText>
         </w:r>
         <w:r>
           <w:rPr>
@@ -5976,7 +5941,7 @@
           <w14:ligatures w14:val="standardContextual"/>
         </w:rPr>
       </w:pPr>
-      <w:hyperlink w:anchor="_Toc228199467" w:history="1">
+      <w:hyperlink w:anchor="_Toc228269961" w:history="1">
         <w:r>
           <w:rPr>
             <w:rStyle w:val="af3"/>
@@ -6014,7 +5979,7 @@
             <w:noProof/>
             <w:webHidden/>
           </w:rPr>
-          <w:instrText xml:space="preserve"> PAGEREF _Toc228199467 \h </w:instrText>
+          <w:instrText xml:space="preserve"> PAGEREF _Toc228269961 \h </w:instrText>
         </w:r>
         <w:r>
           <w:rPr>
@@ -6057,7 +6022,7 @@
           <w14:ligatures w14:val="standardContextual"/>
         </w:rPr>
       </w:pPr>
-      <w:hyperlink w:anchor="_Toc228199468" w:history="1">
+      <w:hyperlink w:anchor="_Toc228269962" w:history="1">
         <w:r>
           <w:rPr>
             <w:rStyle w:val="af3"/>
@@ -6095,7 +6060,7 @@
             <w:noProof/>
             <w:webHidden/>
           </w:rPr>
-          <w:instrText xml:space="preserve"> PAGEREF _Toc228199468 \h </w:instrText>
+          <w:instrText xml:space="preserve"> PAGEREF _Toc228269962 \h </w:instrText>
         </w:r>
         <w:r>
           <w:rPr>
@@ -6138,7 +6103,7 @@
           <w14:ligatures w14:val="standardContextual"/>
         </w:rPr>
       </w:pPr>
-      <w:hyperlink w:anchor="_Toc228199469" w:history="1">
+      <w:hyperlink w:anchor="_Toc228269963" w:history="1">
         <w:r>
           <w:rPr>
             <w:rStyle w:val="af3"/>
@@ -6166,7 +6131,7 @@
             <w:noProof/>
             <w:webHidden/>
           </w:rPr>
-          <w:instrText xml:space="preserve"> PAGEREF _Toc228199469 \h </w:instrText>
+          <w:instrText xml:space="preserve"> PAGEREF _Toc228269963 \h </w:instrText>
         </w:r>
         <w:r>
           <w:rPr>
@@ -6209,7 +6174,7 @@
           <w14:ligatures w14:val="standardContextual"/>
         </w:rPr>
       </w:pPr>
-      <w:hyperlink w:anchor="_Toc228199470" w:history="1">
+      <w:hyperlink w:anchor="_Toc228269964" w:history="1">
         <w:r>
           <w:rPr>
             <w:rStyle w:val="af3"/>
@@ -6237,7 +6202,7 @@
             <w:noProof/>
             <w:webHidden/>
           </w:rPr>
-          <w:instrText xml:space="preserve"> PAGEREF _Toc228199470 \h </w:instrText>
+          <w:instrText xml:space="preserve"> PAGEREF _Toc228269964 \h </w:instrText>
         </w:r>
         <w:r>
           <w:rPr>
@@ -6280,7 +6245,7 @@
           <w14:ligatures w14:val="standardContextual"/>
         </w:rPr>
       </w:pPr>
-      <w:hyperlink w:anchor="_Toc228199471" w:history="1">
+      <w:hyperlink w:anchor="_Toc228269965" w:history="1">
         <w:r>
           <w:rPr>
             <w:rStyle w:val="af3"/>
@@ -6308,7 +6273,7 @@
             <w:noProof/>
             <w:webHidden/>
           </w:rPr>
-          <w:instrText xml:space="preserve"> PAGEREF _Toc228199471 \h </w:instrText>
+          <w:instrText xml:space="preserve"> PAGEREF _Toc228269965 \h </w:instrText>
         </w:r>
         <w:r>
           <w:rPr>
@@ -6328,7 +6293,7 @@
             <w:noProof/>
             <w:webHidden/>
           </w:rPr>
-          <w:t>50</w:t>
+          <w:t>49</w:t>
         </w:r>
         <w:r>
           <w:rPr>
@@ -6339,7 +6304,6 @@
         </w:r>
       </w:hyperlink>
     </w:p>
-    <w:bookmarkStart w:id="0" w:name="_TocManualChapter1"/>
     <w:p>
       <w:pPr>
         <w:spacing w:line="360" w:lineRule="auto"/>
@@ -6356,6 +6320,7 @@
         </w:rPr>
         <w:fldChar w:fldCharType="end"/>
       </w:r>
+      <w:bookmarkStart w:id="0" w:name="_Toc228269909"/>
       <w:r>
         <w:rPr>
           <w:rFonts w:cs="Times New Roman"/>
@@ -6384,7 +6349,7 @@
         <w:spacing w:before="240" w:after="120" w:line="360" w:lineRule="auto"/>
         <w:outlineLvl w:val="1"/>
       </w:pPr>
-      <w:bookmarkStart w:id="1" w:name="_Toc228199416"/>
+      <w:bookmarkStart w:id="1" w:name="_Toc228269910"/>
       <w:r>
         <w:rPr>
           <w:rFonts w:eastAsia="黑体"/>
@@ -6578,7 +6543,7 @@
         <w:spacing w:before="240" w:after="120" w:line="360" w:lineRule="auto"/>
         <w:outlineLvl w:val="1"/>
       </w:pPr>
-      <w:bookmarkStart w:id="2" w:name="_Toc228199417"/>
+      <w:bookmarkStart w:id="2" w:name="_Toc228269911"/>
       <w:r>
         <w:rPr>
           <w:rFonts w:eastAsia="黑体"/>
@@ -6657,6 +6622,7 @@
         <w:rPr>
           <w:szCs w:val="24"/>
         </w:rPr>
+        <w:lastRenderedPageBreak/>
         <w:t>无人机检测属于小目标检测的典型应用场景。远距离无人机在图像中往往只占据少量像素，且容易受到天空、建筑、树枝、鸟类和光照变化等干扰。</w:t>
       </w:r>
       <w:r>
@@ -6781,7 +6747,7 @@
         <w:spacing w:before="240" w:after="120" w:line="360" w:lineRule="auto"/>
         <w:outlineLvl w:val="1"/>
       </w:pPr>
-      <w:bookmarkStart w:id="3" w:name="_Toc228199418"/>
+      <w:bookmarkStart w:id="3" w:name="_Toc228269912"/>
       <w:r>
         <w:rPr>
           <w:rFonts w:eastAsia="黑体"/>
@@ -7132,7 +7098,7 @@
         <w:spacing w:before="240" w:after="120" w:line="360" w:lineRule="auto"/>
         <w:outlineLvl w:val="1"/>
       </w:pPr>
-      <w:bookmarkStart w:id="4" w:name="_Toc228199419"/>
+      <w:bookmarkStart w:id="4" w:name="_Toc228269913"/>
       <w:r>
         <w:rPr>
           <w:rFonts w:eastAsia="黑体"/>
@@ -7162,7 +7128,14 @@
         <w:rPr>
           <w:szCs w:val="24"/>
         </w:rPr>
-        <w:t>本文共分为五章。第一章介绍研究背景、研究意义、国内外研究现状和本文主要研究内容。第二章介绍目标检测、无人机小目标检测、</w:t>
+        <w:t>本文共分为五章。第一章介绍研究背景、研究意义、国内外研究现状和本文主要</w:t>
+      </w:r>
+      <w:r>
+        <w:rPr>
+          <w:szCs w:val="24"/>
+        </w:rPr>
+        <w:lastRenderedPageBreak/>
+        <w:t>研究内容。第二章介绍目标检测、无人机小目标检测、</w:t>
       </w:r>
       <w:r>
         <w:rPr>
@@ -7296,7 +7269,7 @@
         <w:jc w:val="center"/>
         <w:outlineLvl w:val="0"/>
       </w:pPr>
-      <w:bookmarkStart w:id="5" w:name="_Toc228199420"/>
+      <w:bookmarkStart w:id="5" w:name="_Toc228269914"/>
       <w:r>
         <w:rPr>
           <w:rFonts w:eastAsia="黑体"/>
@@ -7304,6 +7277,7 @@
           <w:sz w:val="36"/>
           <w:szCs w:val="36"/>
         </w:rPr>
+        <w:lastRenderedPageBreak/>
         <w:t>第二章</w:t>
       </w:r>
       <w:r>
@@ -7331,7 +7305,7 @@
         <w:spacing w:before="240" w:after="120" w:line="360" w:lineRule="auto"/>
         <w:outlineLvl w:val="1"/>
       </w:pPr>
-      <w:bookmarkStart w:id="6" w:name="_Toc228199421"/>
+      <w:bookmarkStart w:id="6" w:name="_Toc228269915"/>
       <w:r>
         <w:rPr>
           <w:rFonts w:eastAsia="黑体"/>
@@ -7406,7 +7380,7 @@
         <w:spacing w:before="240" w:after="120" w:line="360" w:lineRule="auto"/>
         <w:outlineLvl w:val="1"/>
       </w:pPr>
-      <w:bookmarkStart w:id="7" w:name="_Toc228199422"/>
+      <w:bookmarkStart w:id="7" w:name="_Toc228269916"/>
       <w:r>
         <w:rPr>
           <w:rFonts w:eastAsia="黑体"/>
@@ -7487,7 +7461,7 @@
         <w:spacing w:before="240" w:after="120" w:line="360" w:lineRule="auto"/>
         <w:outlineLvl w:val="1"/>
       </w:pPr>
-      <w:bookmarkStart w:id="8" w:name="_Toc228199423"/>
+      <w:bookmarkStart w:id="8" w:name="_Toc228269917"/>
       <w:r>
         <w:rPr>
           <w:rFonts w:eastAsia="黑体"/>
@@ -7595,7 +7569,14 @@
         <w:rPr>
           <w:szCs w:val="24"/>
         </w:rPr>
-        <w:t>或服务器环境相比，嵌入式平台在功耗、内存带宽、接口能力和运行稳定性方面具有不同约束。</w:t>
+        <w:t>或</w:t>
+      </w:r>
+      <w:r>
+        <w:rPr>
+          <w:szCs w:val="24"/>
+        </w:rPr>
+        <w:lastRenderedPageBreak/>
+        <w:t>服务器环境相比，嵌入式平台在功耗、内存带宽、接口能力和运行稳定性方面具有不同约束。</w:t>
       </w:r>
     </w:p>
     <w:p>
@@ -7639,7 +7620,7 @@
         <w:spacing w:before="240" w:after="120" w:line="360" w:lineRule="auto"/>
         <w:outlineLvl w:val="1"/>
       </w:pPr>
-      <w:bookmarkStart w:id="9" w:name="_Toc228199424"/>
+      <w:bookmarkStart w:id="9" w:name="_Toc228269918"/>
       <w:r>
         <w:rPr>
           <w:rFonts w:eastAsia="黑体"/>
@@ -7808,7 +7789,19 @@
         <w:rPr>
           <w:szCs w:val="24"/>
         </w:rPr>
-        <w:t>量化理论上可以降低计算和存储开销，但量化需要校准数据、误差分析和板端精度验证。考虑到当前系统已稳定跑通浮点模型，本文将</w:t>
+        <w:t>量化理论上可以降低计算和存储开销，但量化需要校准数据、误差分析和板端精度验证。</w:t>
+      </w:r>
+      <w:r>
+        <w:rPr>
+          <w:szCs w:val="24"/>
+        </w:rPr>
+        <w:t>考虑到当前系统已稳定运行浮点模型</w:t>
+      </w:r>
+      <w:r>
+        <w:rPr>
+          <w:szCs w:val="24"/>
+        </w:rPr>
+        <w:t>，本文将</w:t>
       </w:r>
       <w:r>
         <w:rPr>
@@ -7840,7 +7833,7 @@
         <w:spacing w:before="240" w:after="120" w:line="360" w:lineRule="auto"/>
         <w:outlineLvl w:val="1"/>
       </w:pPr>
-      <w:bookmarkStart w:id="10" w:name="_Toc228199425"/>
+      <w:bookmarkStart w:id="10" w:name="_Toc228269919"/>
       <w:r>
         <w:rPr>
           <w:rFonts w:eastAsia="黑体"/>
@@ -7993,7 +7986,7 @@
         <w:spacing w:before="240" w:after="120" w:line="360" w:lineRule="auto"/>
         <w:outlineLvl w:val="1"/>
       </w:pPr>
-      <w:bookmarkStart w:id="11" w:name="_Toc228199426"/>
+      <w:bookmarkStart w:id="11" w:name="_Toc228269920"/>
       <w:r>
         <w:rPr>
           <w:rFonts w:eastAsia="黑体"/>
@@ -8001,6 +7994,7 @@
           <w:sz w:val="28"/>
           <w:szCs w:val="28"/>
         </w:rPr>
+        <w:lastRenderedPageBreak/>
         <w:t>2.6</w:t>
       </w:r>
       <w:r>
@@ -8073,7 +8067,7 @@
         <w:jc w:val="center"/>
         <w:outlineLvl w:val="0"/>
       </w:pPr>
-      <w:bookmarkStart w:id="12" w:name="_Toc228199427"/>
+      <w:bookmarkStart w:id="12" w:name="_Toc228269921"/>
       <w:r>
         <w:rPr>
           <w:rFonts w:eastAsia="黑体"/>
@@ -8081,6 +8075,7 @@
           <w:sz w:val="36"/>
           <w:szCs w:val="36"/>
         </w:rPr>
+        <w:lastRenderedPageBreak/>
         <w:t>第三章</w:t>
       </w:r>
       <w:r>
@@ -8264,7 +8259,7 @@
         <w:spacing w:before="240" w:after="120" w:line="360" w:lineRule="auto"/>
         <w:outlineLvl w:val="1"/>
       </w:pPr>
-      <w:bookmarkStart w:id="13" w:name="_Toc228199428"/>
+      <w:bookmarkStart w:id="13" w:name="_Toc228269922"/>
       <w:r>
         <w:rPr>
           <w:rFonts w:eastAsia="黑体"/>
@@ -8290,7 +8285,7 @@
         <w:spacing w:before="180" w:after="80" w:line="360" w:lineRule="auto"/>
         <w:outlineLvl w:val="2"/>
       </w:pPr>
-      <w:bookmarkStart w:id="14" w:name="_Toc228199429"/>
+      <w:bookmarkStart w:id="14" w:name="_Toc228269923"/>
       <w:r>
         <w:rPr>
           <w:rFonts w:eastAsia="黑体"/>
@@ -8373,6 +8368,7 @@
           <w:sz w:val="21"/>
           <w:szCs w:val="21"/>
         </w:rPr>
+        <w:lastRenderedPageBreak/>
         <w:t>表</w:t>
       </w:r>
       <w:r>
@@ -9109,7 +9105,7 @@
         <w:spacing w:before="180" w:after="80" w:line="360" w:lineRule="auto"/>
         <w:outlineLvl w:val="2"/>
       </w:pPr>
-      <w:bookmarkStart w:id="15" w:name="_Toc228199430"/>
+      <w:bookmarkStart w:id="15" w:name="_Toc228269924"/>
       <w:r>
         <w:rPr>
           <w:rFonts w:eastAsia="黑体"/>
@@ -9232,6 +9228,7 @@
           <w:sz w:val="21"/>
           <w:szCs w:val="21"/>
         </w:rPr>
+        <w:lastRenderedPageBreak/>
         <w:t>表</w:t>
       </w:r>
       <w:r>
@@ -9935,7 +9932,7 @@
         <w:spacing w:before="180" w:after="80" w:line="360" w:lineRule="auto"/>
         <w:outlineLvl w:val="2"/>
       </w:pPr>
-      <w:bookmarkStart w:id="16" w:name="_Toc228199431"/>
+      <w:bookmarkStart w:id="16" w:name="_Toc228269925"/>
       <w:r>
         <w:rPr>
           <w:rFonts w:eastAsia="黑体"/>
@@ -10176,7 +10173,7 @@
         <w:spacing w:before="240" w:after="120" w:line="360" w:lineRule="auto"/>
         <w:outlineLvl w:val="1"/>
       </w:pPr>
-      <w:bookmarkStart w:id="17" w:name="_Toc228199432"/>
+      <w:bookmarkStart w:id="17" w:name="_Toc228269926"/>
       <w:r>
         <w:rPr>
           <w:rFonts w:eastAsia="黑体"/>
@@ -10230,7 +10227,14 @@
         <w:rPr>
           <w:szCs w:val="24"/>
         </w:rPr>
-        <w:t>推理层、后处理层、策略控制层和结果输出层</w:t>
+        <w:t>推理层、后处理层、策略控制层和</w:t>
+      </w:r>
+      <w:r>
+        <w:rPr>
+          <w:szCs w:val="24"/>
+        </w:rPr>
+        <w:lastRenderedPageBreak/>
+        <w:t>结果输出层</w:t>
       </w:r>
       <w:r>
         <w:rPr>
@@ -10480,7 +10484,7 @@
         <w:spacing w:before="240" w:after="120" w:line="360" w:lineRule="auto"/>
         <w:outlineLvl w:val="1"/>
       </w:pPr>
-      <w:bookmarkStart w:id="18" w:name="_Toc228199433"/>
+      <w:bookmarkStart w:id="18" w:name="_Toc228269927"/>
       <w:r>
         <w:rPr>
           <w:rFonts w:eastAsia="黑体"/>
@@ -10506,7 +10510,7 @@
         <w:spacing w:before="180" w:after="80" w:line="360" w:lineRule="auto"/>
         <w:outlineLvl w:val="2"/>
       </w:pPr>
-      <w:bookmarkStart w:id="19" w:name="_Toc228199434"/>
+      <w:bookmarkStart w:id="19" w:name="_Toc228269928"/>
       <w:r>
         <w:rPr>
           <w:rFonts w:eastAsia="黑体"/>
@@ -10626,6 +10630,7 @@
         <w:rPr>
           <w:noProof/>
         </w:rPr>
+        <w:lastRenderedPageBreak/>
         <w:drawing>
           <wp:inline distT="0" distB="0" distL="0" distR="0" wp14:anchorId="1326503E" wp14:editId="7CC490B5">
             <wp:extent cx="4572000" cy="1200150"/>
@@ -10767,7 +10772,7 @@
         <w:spacing w:before="180" w:after="80" w:line="360" w:lineRule="auto"/>
         <w:outlineLvl w:val="2"/>
       </w:pPr>
-      <w:bookmarkStart w:id="20" w:name="_Toc228199435"/>
+      <w:bookmarkStart w:id="20" w:name="_Toc228269929"/>
       <w:r>
         <w:rPr>
           <w:rFonts w:eastAsia="黑体"/>
@@ -10948,7 +10953,7 @@
         <w:spacing w:before="240" w:after="120" w:line="360" w:lineRule="auto"/>
         <w:outlineLvl w:val="1"/>
       </w:pPr>
-      <w:bookmarkStart w:id="21" w:name="_Toc228199436"/>
+      <w:bookmarkStart w:id="21" w:name="_Toc228269930"/>
       <w:r>
         <w:rPr>
           <w:rFonts w:eastAsia="黑体"/>
@@ -10956,6 +10961,7 @@
           <w:sz w:val="28"/>
           <w:szCs w:val="28"/>
         </w:rPr>
+        <w:lastRenderedPageBreak/>
         <w:t>3.4</w:t>
       </w:r>
       <w:r>
@@ -10974,7 +10980,7 @@
         <w:spacing w:before="180" w:after="80" w:line="360" w:lineRule="auto"/>
         <w:outlineLvl w:val="2"/>
       </w:pPr>
-      <w:bookmarkStart w:id="22" w:name="_Toc228199437"/>
+      <w:bookmarkStart w:id="22" w:name="_Toc228269931"/>
       <w:r>
         <w:rPr>
           <w:rFonts w:eastAsia="黑体"/>
@@ -11120,7 +11126,7 @@
         <w:spacing w:before="180" w:after="80" w:line="360" w:lineRule="auto"/>
         <w:outlineLvl w:val="2"/>
       </w:pPr>
-      <w:bookmarkStart w:id="23" w:name="_Toc228199438"/>
+      <w:bookmarkStart w:id="23" w:name="_Toc228269932"/>
       <w:r>
         <w:rPr>
           <w:rFonts w:eastAsia="黑体"/>
@@ -11228,7 +11234,7 @@
         <w:spacing w:before="240" w:after="120" w:line="360" w:lineRule="auto"/>
         <w:outlineLvl w:val="1"/>
       </w:pPr>
-      <w:bookmarkStart w:id="24" w:name="_Toc228199439"/>
+      <w:bookmarkStart w:id="24" w:name="_Toc228269933"/>
       <w:r>
         <w:rPr>
           <w:rFonts w:eastAsia="黑体"/>
@@ -11272,7 +11278,7 @@
         <w:spacing w:before="180" w:after="80" w:line="360" w:lineRule="auto"/>
         <w:outlineLvl w:val="2"/>
       </w:pPr>
-      <w:bookmarkStart w:id="25" w:name="_Toc228199440"/>
+      <w:bookmarkStart w:id="25" w:name="_Toc228269934"/>
       <w:r>
         <w:rPr>
           <w:rFonts w:eastAsia="黑体"/>
@@ -11312,7 +11318,14 @@
         <w:rPr>
           <w:szCs w:val="24"/>
         </w:rPr>
-        <w:t>推理，系统可能出现延迟升高或视频卡顿。为此，本文设计了检测间隔策略，即每隔</w:t>
+        <w:t>推理，系统可能出现延迟升</w:t>
+      </w:r>
+      <w:r>
+        <w:rPr>
+          <w:szCs w:val="24"/>
+        </w:rPr>
+        <w:lastRenderedPageBreak/>
+        <w:t>高或视频卡顿。为此，本文设计了检测间隔策略，即每隔</w:t>
       </w:r>
       <w:r>
         <w:rPr>
@@ -11522,7 +11535,7 @@
         <w:spacing w:before="180" w:after="80" w:line="360" w:lineRule="auto"/>
         <w:outlineLvl w:val="2"/>
       </w:pPr>
-      <w:bookmarkStart w:id="26" w:name="_Toc228199441"/>
+      <w:bookmarkStart w:id="26" w:name="_Toc228269935"/>
       <w:r>
         <w:rPr>
           <w:rFonts w:eastAsia="黑体"/>
@@ -11658,7 +11671,7 @@
         <w:spacing w:before="180" w:after="80" w:line="360" w:lineRule="auto"/>
         <w:outlineLvl w:val="2"/>
       </w:pPr>
-      <w:bookmarkStart w:id="27" w:name="_Toc228199442"/>
+      <w:bookmarkStart w:id="27" w:name="_Toc228269936"/>
       <w:r>
         <w:rPr>
           <w:rFonts w:eastAsia="黑体"/>
@@ -11840,7 +11853,14 @@
         <w:rPr>
           <w:szCs w:val="24"/>
         </w:rPr>
-        <w:t>越小，检测框越稳定但响应速度越慢。本文在实际测试中将平滑参数设计为可配置项，用于在稳定性和响应速度之间取得平衡。</w:t>
+        <w:t>越小，检测框</w:t>
+      </w:r>
+      <w:r>
+        <w:rPr>
+          <w:szCs w:val="24"/>
+        </w:rPr>
+        <w:lastRenderedPageBreak/>
+        <w:t>越稳定但响应速度越慢。本文在实际测试中将平滑参数设计为可配置项，用于在稳定性和响应速度之间取得平衡。</w:t>
       </w:r>
     </w:p>
     <w:p>
@@ -11848,7 +11868,7 @@
         <w:spacing w:before="240" w:after="120" w:line="360" w:lineRule="auto"/>
         <w:outlineLvl w:val="1"/>
       </w:pPr>
-      <w:bookmarkStart w:id="28" w:name="_Toc228199443"/>
+      <w:bookmarkStart w:id="28" w:name="_Toc228269937"/>
       <w:r>
         <w:rPr>
           <w:rFonts w:eastAsia="黑体"/>
@@ -11892,7 +11912,7 @@
         <w:spacing w:before="180" w:after="80" w:line="360" w:lineRule="auto"/>
         <w:outlineLvl w:val="2"/>
       </w:pPr>
-      <w:bookmarkStart w:id="29" w:name="_Toc228199444"/>
+      <w:bookmarkStart w:id="29" w:name="_Toc228269938"/>
       <w:r>
         <w:rPr>
           <w:rFonts w:eastAsia="黑体"/>
@@ -12182,7 +12202,7 @@
         <w:spacing w:before="180" w:after="80" w:line="360" w:lineRule="auto"/>
         <w:outlineLvl w:val="2"/>
       </w:pPr>
-      <w:bookmarkStart w:id="30" w:name="_Toc228199445"/>
+      <w:bookmarkStart w:id="30" w:name="_Toc228269939"/>
       <w:r>
         <w:rPr>
           <w:rFonts w:eastAsia="黑体"/>
@@ -12346,7 +12366,14 @@
         <w:rPr>
           <w:szCs w:val="24"/>
         </w:rPr>
-        <w:t>吞吐能力。本文后续实验将比较单</w:t>
+        <w:t>吞吐能力。本文后续实验将</w:t>
+      </w:r>
+      <w:r>
+        <w:rPr>
+          <w:szCs w:val="24"/>
+        </w:rPr>
+        <w:lastRenderedPageBreak/>
+        <w:t>比较单</w:t>
       </w:r>
       <w:r>
         <w:rPr>
@@ -12414,7 +12441,7 @@
         <w:spacing w:before="180" w:after="80" w:line="360" w:lineRule="auto"/>
         <w:outlineLvl w:val="2"/>
       </w:pPr>
-      <w:bookmarkStart w:id="31" w:name="_Toc228199446"/>
+      <w:bookmarkStart w:id="31" w:name="_Toc228269940"/>
       <w:r>
         <w:rPr>
           <w:rFonts w:eastAsia="黑体"/>
@@ -12534,7 +12561,7 @@
         <w:spacing w:before="240" w:after="120" w:line="360" w:lineRule="auto"/>
         <w:outlineLvl w:val="1"/>
       </w:pPr>
-      <w:bookmarkStart w:id="32" w:name="_Toc228199447"/>
+      <w:bookmarkStart w:id="32" w:name="_Toc228269941"/>
       <w:r>
         <w:rPr>
           <w:rFonts w:eastAsia="黑体"/>
@@ -12698,7 +12725,7 @@
         <w:jc w:val="center"/>
         <w:outlineLvl w:val="0"/>
       </w:pPr>
-      <w:bookmarkStart w:id="33" w:name="_Toc228199448"/>
+      <w:bookmarkStart w:id="33" w:name="_Toc228269942"/>
       <w:r>
         <w:rPr>
           <w:rFonts w:eastAsia="黑体"/>
@@ -12706,6 +12733,7 @@
           <w:sz w:val="36"/>
           <w:szCs w:val="36"/>
         </w:rPr>
+        <w:lastRenderedPageBreak/>
         <w:t>第四章</w:t>
       </w:r>
       <w:r>
@@ -12853,7 +12881,7 @@
         <w:spacing w:before="240" w:after="120" w:line="360" w:lineRule="auto"/>
         <w:outlineLvl w:val="1"/>
       </w:pPr>
-      <w:bookmarkStart w:id="34" w:name="_Toc228199449"/>
+      <w:bookmarkStart w:id="34" w:name="_Toc228269943"/>
       <w:r>
         <w:rPr>
           <w:rFonts w:eastAsia="黑体"/>
@@ -13026,6 +13054,7 @@
           <w:sz w:val="21"/>
           <w:szCs w:val="21"/>
         </w:rPr>
+        <w:lastRenderedPageBreak/>
         <w:t>表</w:t>
       </w:r>
       <w:r>
@@ -14120,7 +14149,7 @@
         <w:spacing w:before="240" w:after="120" w:line="360" w:lineRule="auto"/>
         <w:outlineLvl w:val="1"/>
       </w:pPr>
-      <w:bookmarkStart w:id="35" w:name="_Toc228199450"/>
+      <w:bookmarkStart w:id="35" w:name="_Toc228269944"/>
       <w:r>
         <w:rPr>
           <w:rFonts w:eastAsia="黑体"/>
@@ -14128,6 +14157,7 @@
           <w:sz w:val="28"/>
           <w:szCs w:val="28"/>
         </w:rPr>
+        <w:lastRenderedPageBreak/>
         <w:t>4.2</w:t>
       </w:r>
       <w:r>
@@ -14360,7 +14390,13 @@
         <w:rPr>
           <w:szCs w:val="24"/>
         </w:rPr>
-        <w:t>量化理论上可以进一步降低计算和存储开销，但量化需要校准数据集、量化误差评估和板端精度验证。当前系统已经稳定跑通</w:t>
+        <w:t>量化理论上可以进一步降低计算和存储开销，但量化需要校准数据集、量化误差评估和板端精度验证。</w:t>
+      </w:r>
+      <w:r>
+        <w:rPr>
+          <w:szCs w:val="24"/>
+        </w:rPr>
+        <w:t>当前系统已经稳定运行</w:t>
       </w:r>
       <w:r>
         <w:rPr>
@@ -14372,7 +14408,13 @@
         <w:rPr>
           <w:szCs w:val="24"/>
         </w:rPr>
-        <w:t>模型，因此本章将</w:t>
+        <w:t>模型</w:t>
+      </w:r>
+      <w:r>
+        <w:rPr>
+          <w:szCs w:val="24"/>
+        </w:rPr>
+        <w:t>，因此本章将</w:t>
       </w:r>
       <w:r>
         <w:rPr>
@@ -15012,7 +15054,7 @@
         <w:spacing w:before="240" w:after="120" w:line="360" w:lineRule="auto"/>
         <w:outlineLvl w:val="1"/>
       </w:pPr>
-      <w:bookmarkStart w:id="36" w:name="_Toc228199451"/>
+      <w:bookmarkStart w:id="36" w:name="_Toc228269945"/>
       <w:r>
         <w:rPr>
           <w:rFonts w:eastAsia="黑体"/>
@@ -15020,6 +15062,7 @@
           <w:sz w:val="28"/>
           <w:szCs w:val="28"/>
         </w:rPr>
+        <w:lastRenderedPageBreak/>
         <w:t>4.3 RKNN</w:t>
       </w:r>
       <w:r>
@@ -15475,6 +15518,7 @@
           <w:sz w:val="21"/>
           <w:szCs w:val="21"/>
         </w:rPr>
+        <w:lastRenderedPageBreak/>
         <w:t>表</w:t>
       </w:r>
       <w:r>
@@ -16244,7 +16288,7 @@
         <w:spacing w:before="240" w:after="120" w:line="360" w:lineRule="auto"/>
         <w:outlineLvl w:val="1"/>
       </w:pPr>
-      <w:bookmarkStart w:id="37" w:name="_Toc228199452"/>
+      <w:bookmarkStart w:id="37" w:name="_Toc228269946"/>
       <w:r>
         <w:rPr>
           <w:rFonts w:eastAsia="黑体"/>
@@ -16286,7 +16330,7 @@
         <w:rPr>
           <w:szCs w:val="24"/>
         </w:rPr>
-        <w:t>是本文最先跑通的</w:t>
+        <w:t>是本文最先完成板端部署验证的</w:t>
       </w:r>
       <w:r>
         <w:rPr>
@@ -16298,7 +16342,7 @@
         <w:rPr>
           <w:szCs w:val="24"/>
         </w:rPr>
-        <w:t>验证路径。该程序的作用是在板端读取本地视频文件，逐帧执行</w:t>
+        <w:t>运行路径。该程序的作用是在板端读取本地视频文件，逐帧执行</w:t>
       </w:r>
       <w:r>
         <w:rPr>
@@ -16334,7 +16378,55 @@
         <w:rPr>
           <w:szCs w:val="24"/>
         </w:rPr>
-        <w:t>文件。</w:t>
+        <w:t>文件。在项目仓库中，该程序对应</w:t>
+      </w:r>
+      <w:r>
+        <w:rPr>
+          <w:szCs w:val="24"/>
+        </w:rPr>
+        <w:t>Thesis Project/rk_yolo_video</w:t>
+      </w:r>
+      <w:r>
+        <w:rPr>
+          <w:szCs w:val="24"/>
+        </w:rPr>
+        <w:t>目录，核心入口位于</w:t>
+      </w:r>
+      <w:r>
+        <w:rPr>
+          <w:szCs w:val="24"/>
+        </w:rPr>
+        <w:t>src/main.cpp</w:t>
+      </w:r>
+      <w:r>
+        <w:rPr>
+          <w:szCs w:val="24"/>
+        </w:rPr>
+        <w:t>，</w:t>
+      </w:r>
+      <w:r>
+        <w:rPr>
+          <w:szCs w:val="24"/>
+        </w:rPr>
+        <w:t>RKNN</w:t>
+      </w:r>
+      <w:r>
+        <w:rPr>
+          <w:szCs w:val="24"/>
+        </w:rPr>
+        <w:t>推理封装主要位于</w:t>
+      </w:r>
+      <w:r>
+        <w:rPr>
+          <w:szCs w:val="24"/>
+        </w:rPr>
+        <w:t>src/yolo_rknn.cpp</w:t>
+      </w:r>
+      <w:r>
+        <w:rPr>
+          <w:szCs w:val="24"/>
+        </w:rPr>
+        <w:t>。</w:t>
       </w:r>
     </w:p>
     <w:p>
@@ -16446,6 +16538,7 @@
         <w:rPr>
           <w:szCs w:val="24"/>
         </w:rPr>
+        <w:lastRenderedPageBreak/>
         <w:t>为</w:t>
       </w:r>
       <w:r>
@@ -16689,7 +16782,7 @@
         <w:spacing w:before="240" w:after="120" w:line="360" w:lineRule="auto"/>
         <w:outlineLvl w:val="1"/>
       </w:pPr>
-      <w:bookmarkStart w:id="38" w:name="_Toc228199453"/>
+      <w:bookmarkStart w:id="38" w:name="_Toc228269947"/>
       <w:r>
         <w:rPr>
           <w:rFonts w:eastAsia="黑体"/>
@@ -16821,7 +16914,31 @@
         <w:rPr>
           <w:szCs w:val="24"/>
         </w:rPr>
-        <w:t>客户端实时查看检测画面。</w:t>
+        <w:t>客户端实时查看检测画面。在项目仓库中，该程序对应</w:t>
+      </w:r>
+      <w:r>
+        <w:rPr>
+          <w:szCs w:val="24"/>
+        </w:rPr>
+        <w:t>Thesis Project/rk_yolo_live_rtsp</w:t>
+      </w:r>
+      <w:r>
+        <w:rPr>
+          <w:szCs w:val="24"/>
+        </w:rPr>
+        <w:t>目录，核心入口位于</w:t>
+      </w:r>
+      <w:r>
+        <w:rPr>
+          <w:szCs w:val="24"/>
+        </w:rPr>
+        <w:t>src/main.cpp</w:t>
+      </w:r>
+      <w:r>
+        <w:rPr>
+          <w:szCs w:val="24"/>
+        </w:rPr>
+        <w:t>。</w:t>
       </w:r>
     </w:p>
     <w:p>
@@ -16834,6 +16951,7 @@
         <w:rPr>
           <w:noProof/>
         </w:rPr>
+        <w:lastRenderedPageBreak/>
         <w:drawing>
           <wp:inline distT="0" distB="0" distL="0" distR="0" wp14:anchorId="1C1B9241" wp14:editId="147CBE0E">
             <wp:extent cx="4572000" cy="2184400"/>
@@ -17407,6 +17525,7 @@
                 <w:sz w:val="20"/>
                 <w:szCs w:val="20"/>
               </w:rPr>
+              <w:lastRenderedPageBreak/>
               <w:t>rtsp://&lt;board-ip&gt;:8554/drone</w:t>
             </w:r>
           </w:p>
@@ -17471,7 +17590,7 @@
         <w:spacing w:before="240" w:after="120" w:line="360" w:lineRule="auto"/>
         <w:outlineLvl w:val="1"/>
       </w:pPr>
-      <w:bookmarkStart w:id="39" w:name="_Toc228199454"/>
+      <w:bookmarkStart w:id="39" w:name="_Toc228269948"/>
       <w:r>
         <w:rPr>
           <w:rFonts w:eastAsia="黑体"/>
@@ -17845,7 +17964,14 @@
         <w:rPr>
           <w:szCs w:val="24"/>
         </w:rPr>
-        <w:t>为了减少跳帧检测导致的检测框抖动，系统实现了轻量框平滑策略。其基本思想是将当前检测框与上一帧显示框进行加权融合：</w:t>
+        <w:t>为了减少跳帧检测导致的检测框抖动，系统实现了轻量框平滑策略。其基本思想</w:t>
+      </w:r>
+      <w:r>
+        <w:rPr>
+          <w:szCs w:val="24"/>
+        </w:rPr>
+        <w:lastRenderedPageBreak/>
+        <w:t>是将当前检测框与上一帧显示框进行加权融合：</w:t>
       </w:r>
     </w:p>
     <w:tbl>
@@ -18070,6 +18196,7 @@
           <w:sz w:val="21"/>
           <w:szCs w:val="21"/>
         </w:rPr>
+        <w:lastRenderedPageBreak/>
         <w:t>表</w:t>
       </w:r>
       <w:r>
@@ -18722,7 +18849,7 @@
         <w:spacing w:before="240" w:after="120" w:line="360" w:lineRule="auto"/>
         <w:outlineLvl w:val="1"/>
       </w:pPr>
-      <w:bookmarkStart w:id="40" w:name="_Toc228199455"/>
+      <w:bookmarkStart w:id="40" w:name="_Toc228269949"/>
       <w:r>
         <w:rPr>
           <w:rFonts w:eastAsia="黑体"/>
@@ -18818,7 +18945,43 @@
         <w:rPr>
           <w:szCs w:val="24"/>
         </w:rPr>
-        <w:t>，并由多个推理工作线程并行处理不同帧。</w:t>
+        <w:t>，并由多个推理工作线程并行处理不同帧。这里的多</w:t>
+      </w:r>
+      <w:r>
+        <w:rPr>
+          <w:szCs w:val="24"/>
+        </w:rPr>
+        <w:t>context</w:t>
+      </w:r>
+      <w:r>
+        <w:rPr>
+          <w:szCs w:val="24"/>
+        </w:rPr>
+        <w:t>不是多个线程共享同一个</w:t>
+      </w:r>
+      <w:r>
+        <w:rPr>
+          <w:szCs w:val="24"/>
+        </w:rPr>
+        <w:t>RKNN</w:t>
+      </w:r>
+      <w:r>
+        <w:rPr>
+          <w:szCs w:val="24"/>
+        </w:rPr>
+        <w:t>上下文，而是每个</w:t>
+      </w:r>
+      <w:r>
+        <w:rPr>
+          <w:szCs w:val="24"/>
+        </w:rPr>
+        <w:t>worker</w:t>
+      </w:r>
+      <w:r>
+        <w:rPr>
+          <w:szCs w:val="24"/>
+        </w:rPr>
+        <w:t>独立持有检测器实例，从而减少线程间同步和运行状态竞争。</w:t>
       </w:r>
     </w:p>
     <w:p>
@@ -18927,6 +19090,7 @@
         <w:rPr>
           <w:noProof/>
         </w:rPr>
+        <w:lastRenderedPageBreak/>
         <w:drawing>
           <wp:inline distT="0" distB="0" distL="0" distR="0" wp14:anchorId="0025038D" wp14:editId="7A4BD5D1">
             <wp:extent cx="4572000" cy="2184400"/>
@@ -19724,7 +19888,13 @@
         <w:rPr>
           <w:szCs w:val="24"/>
         </w:rPr>
-        <w:t>机制使本文不仅能够完成</w:t>
+        <w:t>机制使本文不仅能够</w:t>
+      </w:r>
+      <w:r>
+        <w:rPr>
+          <w:szCs w:val="24"/>
+        </w:rPr>
+        <w:t>完成</w:t>
       </w:r>
       <w:r>
         <w:rPr>
@@ -19748,7 +19918,7 @@
         <w:rPr>
           <w:szCs w:val="24"/>
         </w:rPr>
-        <w:t>上跑通</w:t>
+        <w:t>上部署验证</w:t>
       </w:r>
       <w:r>
         <w:rPr>
@@ -19760,7 +19930,13 @@
         <w:rPr>
           <w:szCs w:val="24"/>
         </w:rPr>
-        <w:t>的基本目标，还能够围绕导师提出的</w:t>
+        <w:t>的基本目标</w:t>
+      </w:r>
+      <w:r>
+        <w:rPr>
+          <w:szCs w:val="24"/>
+        </w:rPr>
+        <w:t>，还能够围绕导师提出的</w:t>
       </w:r>
       <w:r>
         <w:rPr>
@@ -19784,7 +19960,14 @@
         <w:rPr>
           <w:szCs w:val="24"/>
         </w:rPr>
-        <w:t>的目标并不是简单替代当前实时演示配置，而是提供一条硬件并行优化路线。后续实验需要同时比较吞吐、延迟、</w:t>
+        <w:t>的目标</w:t>
+      </w:r>
+      <w:r>
+        <w:rPr>
+          <w:szCs w:val="24"/>
+        </w:rPr>
+        <w:lastRenderedPageBreak/>
+        <w:t>并不是简单替代当前实时演示配置，而是提供一条硬件并行优化路线。后续实验需要同时比较吞吐、延迟、</w:t>
       </w:r>
       <w:r>
         <w:rPr>
@@ -19804,7 +19987,7 @@
         <w:spacing w:before="240" w:after="120" w:line="360" w:lineRule="auto"/>
         <w:outlineLvl w:val="1"/>
       </w:pPr>
-      <w:bookmarkStart w:id="41" w:name="_Toc228199456"/>
+      <w:bookmarkStart w:id="41" w:name="_Toc228269950"/>
       <w:r>
         <w:rPr>
           <w:rFonts w:eastAsia="黑体"/>
@@ -20276,7 +20459,7 @@
         <w:spacing w:before="240" w:after="120" w:line="360" w:lineRule="auto"/>
         <w:outlineLvl w:val="1"/>
       </w:pPr>
-      <w:bookmarkStart w:id="42" w:name="_Toc228199457"/>
+      <w:bookmarkStart w:id="42" w:name="_Toc228269951"/>
       <w:r>
         <w:rPr>
           <w:rFonts w:eastAsia="黑体"/>
@@ -20284,6 +20467,7 @@
           <w:sz w:val="28"/>
           <w:szCs w:val="28"/>
         </w:rPr>
+        <w:lastRenderedPageBreak/>
         <w:t>4.9</w:t>
       </w:r>
       <w:r>
@@ -20596,7 +20780,7 @@
         <w:jc w:val="center"/>
         <w:outlineLvl w:val="0"/>
       </w:pPr>
-      <w:bookmarkStart w:id="43" w:name="_Toc228199458"/>
+      <w:bookmarkStart w:id="43" w:name="_Toc228269952"/>
       <w:r>
         <w:rPr>
           <w:rFonts w:eastAsia="黑体"/>
@@ -20604,6 +20788,7 @@
           <w:sz w:val="36"/>
           <w:szCs w:val="36"/>
         </w:rPr>
+        <w:lastRenderedPageBreak/>
         <w:t>第五章</w:t>
       </w:r>
       <w:r>
@@ -20751,7 +20936,7 @@
         <w:spacing w:before="240" w:after="120" w:line="360" w:lineRule="auto"/>
         <w:outlineLvl w:val="1"/>
       </w:pPr>
-      <w:bookmarkStart w:id="44" w:name="_Toc228199459"/>
+      <w:bookmarkStart w:id="44" w:name="_Toc228269953"/>
       <w:r>
         <w:rPr>
           <w:rFonts w:eastAsia="黑体"/>
@@ -20972,6 +21157,7 @@
           <w:sz w:val="21"/>
           <w:szCs w:val="21"/>
         </w:rPr>
+        <w:lastRenderedPageBreak/>
         <w:t>表</w:t>
       </w:r>
       <w:r>
@@ -21947,6 +22133,7 @@
           <w:sz w:val="21"/>
           <w:szCs w:val="21"/>
         </w:rPr>
+        <w:lastRenderedPageBreak/>
         <w:t>表</w:t>
       </w:r>
       <w:r>
@@ -22816,7 +23003,7 @@
         <w:spacing w:before="240" w:after="120" w:line="360" w:lineRule="auto"/>
         <w:outlineLvl w:val="1"/>
       </w:pPr>
-      <w:bookmarkStart w:id="45" w:name="_Toc228199460"/>
+      <w:bookmarkStart w:id="45" w:name="_Toc228269954"/>
       <w:r>
         <w:rPr>
           <w:rFonts w:eastAsia="黑体"/>
@@ -23027,6 +23214,7 @@
           <w:sz w:val="21"/>
           <w:szCs w:val="21"/>
         </w:rPr>
+        <w:lastRenderedPageBreak/>
         <w:t>表</w:t>
       </w:r>
       <w:r>
@@ -23592,7 +23780,7 @@
         <w:spacing w:before="240" w:after="120" w:line="360" w:lineRule="auto"/>
         <w:outlineLvl w:val="1"/>
       </w:pPr>
-      <w:bookmarkStart w:id="46" w:name="_Toc228199461"/>
+      <w:bookmarkStart w:id="46" w:name="_Toc228269955"/>
       <w:r>
         <w:rPr>
           <w:rFonts w:eastAsia="黑体"/>
@@ -23820,7 +24008,14 @@
         <w:rPr>
           <w:szCs w:val="24"/>
         </w:rPr>
-        <w:t>，恢复了板端运行路径。该过程说明模型部署并不是单纯格式转换，还需要与输出张量结构和后处理逻辑保持一致。</w:t>
+        <w:t>，恢复了板端运行路径。该过程说明模型部署并不是单纯格式转换，还需要与输出张量结构和后处理逻</w:t>
+      </w:r>
+      <w:r>
+        <w:rPr>
+          <w:szCs w:val="24"/>
+        </w:rPr>
+        <w:lastRenderedPageBreak/>
+        <w:t>辑保持一致。</w:t>
       </w:r>
     </w:p>
     <w:p>
@@ -24482,7 +24677,7 @@
         <w:spacing w:before="240" w:after="120" w:line="360" w:lineRule="auto"/>
         <w:outlineLvl w:val="1"/>
       </w:pPr>
-      <w:bookmarkStart w:id="47" w:name="_Toc228199462"/>
+      <w:bookmarkStart w:id="47" w:name="_Toc228269956"/>
       <w:r>
         <w:rPr>
           <w:rFonts w:eastAsia="黑体"/>
@@ -24530,7 +24725,7 @@
         <w:rPr>
           <w:szCs w:val="24"/>
         </w:rPr>
-        <w:t>在固定视频路径跑通后，本文进一步测试实时</w:t>
+        <w:t>在固定视频路径完成验证后，本文进一步测试实时</w:t>
       </w:r>
       <w:r>
         <w:rPr>
@@ -24656,6 +24851,7 @@
           <w:sz w:val="21"/>
           <w:szCs w:val="21"/>
         </w:rPr>
+        <w:lastRenderedPageBreak/>
         <w:t>表</w:t>
       </w:r>
       <w:r>
@@ -25689,7 +25885,7 @@
         <w:spacing w:before="240" w:after="120" w:line="360" w:lineRule="auto"/>
         <w:outlineLvl w:val="1"/>
       </w:pPr>
-      <w:bookmarkStart w:id="48" w:name="_Toc228199463"/>
+      <w:bookmarkStart w:id="48" w:name="_Toc228269957"/>
       <w:r>
         <w:rPr>
           <w:rFonts w:eastAsia="黑体"/>
@@ -25836,6 +26032,7 @@
           <w:sz w:val="21"/>
           <w:szCs w:val="21"/>
         </w:rPr>
+        <w:lastRenderedPageBreak/>
         <w:t>表</w:t>
       </w:r>
       <w:r>
@@ -27069,6 +27266,7 @@
           <w:sz w:val="21"/>
           <w:szCs w:val="21"/>
         </w:rPr>
+        <w:lastRenderedPageBreak/>
         <w:t>表</w:t>
       </w:r>
       <w:r>
@@ -27938,7 +28136,7 @@
         <w:spacing w:before="240" w:after="120" w:line="360" w:lineRule="auto"/>
         <w:outlineLvl w:val="1"/>
       </w:pPr>
-      <w:bookmarkStart w:id="49" w:name="_Toc228199464"/>
+      <w:bookmarkStart w:id="49" w:name="_Toc228269958"/>
       <w:r>
         <w:rPr>
           <w:rFonts w:eastAsia="黑体"/>
@@ -28133,6 +28331,7 @@
           <w:sz w:val="21"/>
           <w:szCs w:val="21"/>
         </w:rPr>
+        <w:lastRenderedPageBreak/>
         <w:t>表</w:t>
       </w:r>
       <w:r>
@@ -29867,7 +30066,7 @@
         <w:spacing w:before="240" w:after="120" w:line="360" w:lineRule="auto"/>
         <w:outlineLvl w:val="1"/>
       </w:pPr>
-      <w:bookmarkStart w:id="50" w:name="_Toc228199465"/>
+      <w:bookmarkStart w:id="50" w:name="_Toc228269959"/>
       <w:r>
         <w:rPr>
           <w:rFonts w:eastAsia="黑体"/>
@@ -30011,6 +30210,7 @@
         <w:rPr>
           <w:noProof/>
         </w:rPr>
+        <w:lastRenderedPageBreak/>
         <w:drawing>
           <wp:inline distT="0" distB="0" distL="0" distR="0" wp14:anchorId="7D38F326" wp14:editId="6E2BF84F">
             <wp:extent cx="4572000" cy="2222499"/>
@@ -31246,7 +31446,14 @@
         <w:rPr>
           <w:szCs w:val="24"/>
         </w:rPr>
-        <w:t>46 ms</w:t>
+        <w:t xml:space="preserve">46 </w:t>
+      </w:r>
+      <w:r>
+        <w:rPr>
+          <w:szCs w:val="24"/>
+        </w:rPr>
+        <w:lastRenderedPageBreak/>
+        <w:t>ms</w:t>
       </w:r>
       <w:r>
         <w:rPr>
@@ -31320,7 +31527,7 @@
         <w:spacing w:before="240" w:after="120" w:line="360" w:lineRule="auto"/>
         <w:outlineLvl w:val="1"/>
       </w:pPr>
-      <w:bookmarkStart w:id="51" w:name="_Toc228199466"/>
+      <w:bookmarkStart w:id="51" w:name="_Toc228269960"/>
       <w:r>
         <w:rPr>
           <w:rFonts w:eastAsia="黑体"/>
@@ -31477,6 +31684,7 @@
           <w:sz w:val="21"/>
           <w:szCs w:val="21"/>
         </w:rPr>
+        <w:lastRenderedPageBreak/>
         <w:t>表</w:t>
       </w:r>
       <w:r>
@@ -32403,7 +32611,7 @@
         <w:spacing w:before="240" w:after="120" w:line="360" w:lineRule="auto"/>
         <w:outlineLvl w:val="1"/>
       </w:pPr>
-      <w:bookmarkStart w:id="52" w:name="_Toc228199467"/>
+      <w:bookmarkStart w:id="52" w:name="_Toc228269961"/>
       <w:r>
         <w:rPr>
           <w:rFonts w:eastAsia="黑体"/>
@@ -32499,6 +32707,7 @@
         <w:rPr>
           <w:szCs w:val="24"/>
         </w:rPr>
+        <w:lastRenderedPageBreak/>
         <w:t>RK3588</w:t>
       </w:r>
       <w:r>
@@ -33434,7 +33643,7 @@
         <w:spacing w:before="240" w:after="120" w:line="360" w:lineRule="auto"/>
         <w:outlineLvl w:val="1"/>
       </w:pPr>
-      <w:bookmarkStart w:id="53" w:name="_Toc228199468"/>
+      <w:bookmarkStart w:id="53" w:name="_Toc228269962"/>
       <w:r>
         <w:rPr>
           <w:rFonts w:eastAsia="黑体"/>
@@ -33464,6 +33673,7 @@
         <w:rPr>
           <w:szCs w:val="24"/>
         </w:rPr>
+        <w:lastRenderedPageBreak/>
         <w:t>本章围绕</w:t>
       </w:r>
       <w:r>
@@ -33670,7 +33880,7 @@
         <w:jc w:val="center"/>
         <w:outlineLvl w:val="0"/>
       </w:pPr>
-      <w:bookmarkStart w:id="54" w:name="_Toc228199469"/>
+      <w:bookmarkStart w:id="54" w:name="_Toc228269963"/>
       <w:r>
         <w:rPr>
           <w:rFonts w:eastAsia="黑体"/>
@@ -33678,6 +33888,7 @@
           <w:sz w:val="36"/>
           <w:szCs w:val="36"/>
         </w:rPr>
+        <w:lastRenderedPageBreak/>
         <w:t>总结与展望</w:t>
       </w:r>
       <w:bookmarkEnd w:id="54"/>
@@ -33921,7 +34132,7 @@
         <w:jc w:val="center"/>
         <w:outlineLvl w:val="0"/>
       </w:pPr>
-      <w:bookmarkStart w:id="55" w:name="_Toc228199470"/>
+      <w:bookmarkStart w:id="55" w:name="_Toc228269964"/>
       <w:r>
         <w:rPr>
           <w:rFonts w:eastAsia="黑体"/>
@@ -33929,6 +34140,7 @@
           <w:sz w:val="36"/>
           <w:szCs w:val="36"/>
         </w:rPr>
+        <w:lastRenderedPageBreak/>
         <w:t>参考文献</w:t>
       </w:r>
       <w:bookmarkEnd w:id="55"/>
@@ -34078,17 +34290,11 @@
       </w:r>
     </w:p>
     <w:p>
-      <w:r>
-        <w:br w:type="page"/>
-      </w:r>
-    </w:p>
-    <w:p>
       <w:pPr>
         <w:spacing w:line="240" w:lineRule="auto"/>
-        <w:jc w:val="center"/>
+        <w:ind w:firstLine="480"/>
         <w:rPr>
           <w:rFonts w:cs="Times New Roman"/>
-          <w:b/>
           <w:sz w:val="21"/>
           <w:szCs w:val="36"/>
         </w:rPr>
@@ -34096,7 +34302,6 @@
       <w:r>
         <w:rPr>
           <w:rFonts w:cs="Times New Roman"/>
-          <w:b/>
           <w:sz w:val="21"/>
           <w:szCs w:val="36"/>
         </w:rPr>
@@ -34106,10 +34311,9 @@
     <w:p>
       <w:pPr>
         <w:spacing w:line="240" w:lineRule="auto"/>
-        <w:jc w:val="center"/>
+        <w:ind w:firstLine="480"/>
         <w:rPr>
           <w:rFonts w:cs="Times New Roman"/>
-          <w:b/>
           <w:sz w:val="21"/>
           <w:szCs w:val="36"/>
         </w:rPr>
@@ -34117,7 +34321,6 @@
       <w:r>
         <w:rPr>
           <w:rFonts w:cs="Times New Roman"/>
-          <w:b/>
           <w:sz w:val="21"/>
           <w:szCs w:val="36"/>
         </w:rPr>
@@ -34127,10 +34330,9 @@
     <w:p>
       <w:pPr>
         <w:spacing w:line="240" w:lineRule="auto"/>
-        <w:jc w:val="center"/>
+        <w:ind w:firstLine="480"/>
         <w:rPr>
           <w:rFonts w:cs="Times New Roman"/>
-          <w:b/>
           <w:sz w:val="21"/>
           <w:szCs w:val="36"/>
         </w:rPr>
@@ -34138,7 +34340,6 @@
       <w:r>
         <w:rPr>
           <w:rFonts w:cs="Times New Roman"/>
-          <w:b/>
           <w:sz w:val="21"/>
           <w:szCs w:val="36"/>
         </w:rPr>
@@ -34151,7 +34352,7 @@
         <w:jc w:val="center"/>
         <w:outlineLvl w:val="0"/>
       </w:pPr>
-      <w:bookmarkStart w:id="56" w:name="_Toc228199471"/>
+      <w:bookmarkStart w:id="56" w:name="_Toc228269965"/>
       <w:r>
         <w:rPr>
           <w:rFonts w:eastAsia="黑体"/>
@@ -34208,7 +34409,7 @@
         <w:rPr>
           <w:szCs w:val="24"/>
         </w:rPr>
-        <w:t>同时，感谢同学和实验环境提供者在模型、数据、开发板调试和测试场景方面给予的支持。本文所涉及的模型转换、板端部署、实时视频推流和公开数据验证经历了多轮调试，相关讨论和协助对系统最终跑通具有重要帮助。</w:t>
+        <w:t>同时，感谢同学和实验环境提供者在模型、数据、开发板调试和测试场景方面给予的支持。本文所涉及的模型转换、板端部署、实时视频推流和公开数据验证经历了多轮调试，相关讨论和协助对系统最终完成稳定运行具有重要帮助。</w:t>
       </w:r>
     </w:p>
     <w:p>

</xml_diff>

<commit_message>
Update thesis final draft after review
</commit_message>
<xml_diff>
--- a/Thesis Project/paper/full_thesis_latest_merged.docx
+++ b/Thesis Project/paper/full_thesis_latest_merged.docx
@@ -547,57 +547,93 @@
               </w:tabs>
               <w:spacing w:line="360" w:lineRule="auto"/>
               <w:rPr>
-                <w:kern w:val="0"/>
-                <w:szCs w:val="21"/>
-              </w:rPr>
-            </w:pPr>
-            <w:r>
-              <w:rPr>
                 <w:bCs/>
                 <w:kern w:val="0"/>
                 <w:szCs w:val="21"/>
               </w:rPr>
-              <w:lastRenderedPageBreak/>
-              <w:t>姓</w:t>
-            </w:r>
-            <w:r>
-              <w:rPr>
+            </w:pPr>
+            <w:r>
+              <w:rPr>
+                <w:rFonts w:hint="eastAsia"/>
                 <w:bCs/>
                 <w:kern w:val="0"/>
                 <w:szCs w:val="21"/>
               </w:rPr>
-              <w:t xml:space="preserve">    </w:t>
-            </w:r>
-            <w:r>
-              <w:rPr>
+              <w:lastRenderedPageBreak/>
+              <w:t>姓</w:t>
+            </w:r>
+            <w:r>
+              <w:rPr>
+                <w:rFonts w:hint="eastAsia"/>
                 <w:bCs/>
                 <w:kern w:val="0"/>
                 <w:szCs w:val="21"/>
               </w:rPr>
-              <w:t>名：</w:t>
-            </w:r>
-          </w:p>
-        </w:tc>
-        <w:tc>
-          <w:tcPr>
-            <w:tcW w:w="1927" w:type="pct"/>
-          </w:tcPr>
-          <w:p>
-            <w:pPr>
-              <w:spacing w:line="360" w:lineRule="auto"/>
-              <w:rPr>
-                <w:kern w:val="0"/>
-                <w:szCs w:val="21"/>
-              </w:rPr>
-            </w:pPr>
-            <w:r>
-              <w:rPr>
+              <w:t xml:space="preserve">    </w:t>
+            </w:r>
+            <w:r>
+              <w:rPr>
+                <w:rFonts w:hint="eastAsia"/>
                 <w:bCs/>
                 <w:kern w:val="0"/>
                 <w:szCs w:val="21"/>
               </w:rPr>
+              <w:t>名：朱奕澄</w:t>
+            </w:r>
+          </w:p>
+          <w:p>
+            <w:pPr>
+              <w:tabs>
+                <w:tab w:val="left" w:pos="1460"/>
+              </w:tabs>
+              <w:spacing w:line="360" w:lineRule="auto"/>
+              <w:rPr>
+                <w:kern w:val="0"/>
+                <w:szCs w:val="21"/>
+              </w:rPr>
+            </w:pPr>
+          </w:p>
+        </w:tc>
+        <w:tc>
+          <w:tcPr>
+            <w:tcW w:w="1927" w:type="pct"/>
+          </w:tcPr>
+          <w:p>
+            <w:pPr>
+              <w:spacing w:line="360" w:lineRule="auto"/>
+              <w:rPr>
+                <w:bCs/>
+                <w:kern w:val="0"/>
+                <w:szCs w:val="21"/>
+              </w:rPr>
+            </w:pPr>
+            <w:r>
+              <w:rPr>
+                <w:rFonts w:hint="eastAsia"/>
+                <w:bCs/>
+                <w:kern w:val="0"/>
+                <w:szCs w:val="21"/>
+              </w:rPr>
               <w:t>学号：</w:t>
             </w:r>
+            <w:r>
+              <w:rPr>
+                <w:rFonts w:hint="eastAsia"/>
+                <w:bCs/>
+                <w:kern w:val="0"/>
+                <w:szCs w:val="21"/>
+              </w:rPr>
+              <w:t>22123739</w:t>
+            </w:r>
+          </w:p>
+          <w:p>
+            <w:pPr>
+              <w:spacing w:line="360" w:lineRule="auto"/>
+              <w:rPr>
+                <w:kern w:val="0"/>
+                <w:szCs w:val="21"/>
+              </w:rPr>
+            </w:pPr>
           </w:p>
         </w:tc>
       </w:tr>
@@ -614,18 +650,29 @@
             <w:pPr>
               <w:spacing w:line="360" w:lineRule="auto"/>
               <w:rPr>
-                <w:kern w:val="0"/>
-                <w:szCs w:val="21"/>
-              </w:rPr>
-            </w:pPr>
-            <w:r>
-              <w:rPr>
                 <w:bCs/>
                 <w:kern w:val="0"/>
                 <w:szCs w:val="21"/>
               </w:rPr>
-              <w:t>论文题目：</w:t>
-            </w:r>
+            </w:pPr>
+            <w:r>
+              <w:rPr>
+                <w:rFonts w:hint="eastAsia"/>
+                <w:bCs/>
+                <w:kern w:val="0"/>
+                <w:szCs w:val="21"/>
+              </w:rPr>
+              <w:t>论文题目：基于嵌入式平台的目标检测系统研究</w:t>
+            </w:r>
+          </w:p>
+          <w:p>
+            <w:pPr>
+              <w:spacing w:line="360" w:lineRule="auto"/>
+              <w:rPr>
+                <w:kern w:val="0"/>
+                <w:szCs w:val="21"/>
+              </w:rPr>
+            </w:pPr>
           </w:p>
         </w:tc>
       </w:tr>
@@ -1075,6 +1122,7 @@
           <w:szCs w:val="21"/>
           <w:highlight w:val="yellow"/>
         </w:rPr>
+        <w:lastRenderedPageBreak/>
         <w:t>(</w:t>
       </w:r>
       <w:r>
@@ -1233,7 +1281,13 @@
         <w:rPr>
           <w:szCs w:val="24"/>
         </w:rPr>
-        <w:t xml:space="preserve">C/C++ </w:t>
+        <w:t>C++17</w:t>
+      </w:r>
+      <w:r>
+        <w:rPr>
+          <w:szCs w:val="24"/>
+        </w:rPr>
+        <w:t xml:space="preserve"> </w:t>
       </w:r>
       <w:r>
         <w:rPr>
@@ -1416,7 +1470,19 @@
         <w:rPr>
           <w:szCs w:val="24"/>
         </w:rPr>
-        <w:t>With the increasing use of unmanned aerial vehicles in low-altitude security, power inspection, and urban management, real-time object detection on edge devices has significant engineering value. To address the high bandwidth consumption, large end-to-end latency, and limited deployment flexibility of cloud-based detection schemes, this thesis designs and implements a UAV object detection system based on the RK3588 embedded platform. The system uses a single-class YOLOv10 UAV detection model as the baseline, completes the model migration from PyTorch and ONNX to RKNN, and implements both fixed-video detection and real-time RTSP detection programs in C/C++.</w:t>
+        <w:t xml:space="preserve">With the increasing use of unmanned aerial vehicles in low-altitude security, power inspection, and urban management, real-time object detection on edge devices has significant engineering value. To address the high bandwidth consumption, large end-to-end latency, and limited deployment flexibility of cloud-based detection schemes, this thesis designs and implements a UAV object detection system based on the RK3588 embedded platform. The system uses a single-class YOLOv10 UAV detection model as the baseline, completes the model migration from PyTorch and ONNX to RKNN, and implements both fixed-video detection and real-time RTSP detection programs in </w:t>
+      </w:r>
+      <w:r>
+        <w:rPr>
+          <w:szCs w:val="24"/>
+        </w:rPr>
+        <w:t>C++17</w:t>
+      </w:r>
+      <w:r>
+        <w:rPr>
+          <w:szCs w:val="24"/>
+        </w:rPr>
+        <w:t>.</w:t>
       </w:r>
     </w:p>
     <w:p>
@@ -1428,7 +1494,19 @@
         <w:rPr>
           <w:szCs w:val="24"/>
         </w:rPr>
-        <w:t>In terms of system implementation, the proposed system decouples video input, image preprocessing, NPU inference, post-processing, display streaming, and logging. To reduce throughput bottlenecks, end-to-end latency, and bounding-box jitter in real-time detection, the system implements detection interval control, dynamic ROI, lightweight tracking, bounding-box smoothing, and multi-context NPU parallel inference. Experimental results show that the recovered single-class UAV RKNN model can perform fixed-video detection on RK3588 and output annotated video streams through RTSP. The multi-context mechanism improves inference throughput in frame-by-frame detection, while detection interval control and bounding-box smoothing are more suitable for low-latency real-time viewing. This work provides a practical reference for engineering deployment and system-level optimization of object detection algorithms on domestic embedded platforms.</w:t>
+        <w:t xml:space="preserve">In terms of system implementation, the proposed system decouples video input, </w:t>
+      </w:r>
+      <w:r>
+        <w:rPr>
+          <w:szCs w:val="24"/>
+        </w:rPr>
+        <w:t>image preprocessing, Neural Processing Unit (NPU) inference, post-processing</w:t>
+      </w:r>
+      <w:r>
+        <w:rPr>
+          <w:szCs w:val="24"/>
+        </w:rPr>
+        <w:t>, display streaming, and logging. To reduce throughput bottlenecks, end-to-end latency, and bounding-box jitter in real-time detection, the system implements detection interval control, dynamic ROI, lightweight tracking, bounding-box smoothing, and multi-context NPU parallel inference. Experimental results show that the recovered single-class UAV RKNN model can perform fixed-video detection on RK3588 and output annotated video streams through RTSP. The multi-context mechanism improves inference throughput in frame-by-frame detection, while detection interval control and bounding-box smoothing are more suitable for low-latency real-time viewing. This work provides a practical reference for engineering deployment and system-level optimization of object detection algorithms on domestic embedded platforms.</w:t>
       </w:r>
     </w:p>
     <w:p>
@@ -1517,7 +1595,7 @@
         </w:rPr>
         <w:fldChar w:fldCharType="separate"/>
       </w:r>
-      <w:hyperlink w:anchor="_Toc228280407" w:history="1">
+      <w:hyperlink w:anchor="_Toc228286700" w:history="1">
         <w:r>
           <w:rPr>
             <w:rStyle w:val="af3"/>
@@ -1558,7 +1636,7 @@
             <w:noProof/>
             <w:webHidden/>
           </w:rPr>
-          <w:instrText xml:space="preserve"> PAGEREF _Toc228280407 \h </w:instrText>
+          <w:instrText xml:space="preserve"> PAGEREF _Toc228286700 \h </w:instrText>
         </w:r>
         <w:r>
           <w:rPr>
@@ -1578,7 +1656,7 @@
             <w:noProof/>
             <w:webHidden/>
           </w:rPr>
-          <w:t>6</w:t>
+          <w:t>7</w:t>
         </w:r>
         <w:r>
           <w:rPr>
@@ -1601,7 +1679,7 @@
           <w14:ligatures w14:val="standardContextual"/>
         </w:rPr>
       </w:pPr>
-      <w:hyperlink w:anchor="_Toc228280408" w:history="1">
+      <w:hyperlink w:anchor="_Toc228286701" w:history="1">
         <w:r>
           <w:rPr>
             <w:rStyle w:val="af3"/>
@@ -1639,7 +1717,7 @@
             <w:noProof/>
             <w:webHidden/>
           </w:rPr>
-          <w:instrText xml:space="preserve"> PAGEREF _Toc228280408 \h </w:instrText>
+          <w:instrText xml:space="preserve"> PAGEREF _Toc228286701 \h </w:instrText>
         </w:r>
         <w:r>
           <w:rPr>
@@ -1659,7 +1737,7 @@
             <w:noProof/>
             <w:webHidden/>
           </w:rPr>
-          <w:t>6</w:t>
+          <w:t>7</w:t>
         </w:r>
         <w:r>
           <w:rPr>
@@ -1682,7 +1760,7 @@
           <w14:ligatures w14:val="standardContextual"/>
         </w:rPr>
       </w:pPr>
-      <w:hyperlink w:anchor="_Toc228280409" w:history="1">
+      <w:hyperlink w:anchor="_Toc228286702" w:history="1">
         <w:r>
           <w:rPr>
             <w:rStyle w:val="af3"/>
@@ -1720,7 +1798,7 @@
             <w:noProof/>
             <w:webHidden/>
           </w:rPr>
-          <w:instrText xml:space="preserve"> PAGEREF _Toc228280409 \h </w:instrText>
+          <w:instrText xml:space="preserve"> PAGEREF _Toc228286702 \h </w:instrText>
         </w:r>
         <w:r>
           <w:rPr>
@@ -1740,7 +1818,7 @@
             <w:noProof/>
             <w:webHidden/>
           </w:rPr>
-          <w:t>6</w:t>
+          <w:t>7</w:t>
         </w:r>
         <w:r>
           <w:rPr>
@@ -1763,7 +1841,7 @@
           <w14:ligatures w14:val="standardContextual"/>
         </w:rPr>
       </w:pPr>
-      <w:hyperlink w:anchor="_Toc228280410" w:history="1">
+      <w:hyperlink w:anchor="_Toc228286703" w:history="1">
         <w:r>
           <w:rPr>
             <w:rStyle w:val="af3"/>
@@ -1801,7 +1879,7 @@
             <w:noProof/>
             <w:webHidden/>
           </w:rPr>
-          <w:instrText xml:space="preserve"> PAGEREF _Toc228280410 \h </w:instrText>
+          <w:instrText xml:space="preserve"> PAGEREF _Toc228286703 \h </w:instrText>
         </w:r>
         <w:r>
           <w:rPr>
@@ -1821,7 +1899,7 @@
             <w:noProof/>
             <w:webHidden/>
           </w:rPr>
-          <w:t>7</w:t>
+          <w:t>8</w:t>
         </w:r>
         <w:r>
           <w:rPr>
@@ -1844,7 +1922,7 @@
           <w14:ligatures w14:val="standardContextual"/>
         </w:rPr>
       </w:pPr>
-      <w:hyperlink w:anchor="_Toc228280411" w:history="1">
+      <w:hyperlink w:anchor="_Toc228286704" w:history="1">
         <w:r>
           <w:rPr>
             <w:rStyle w:val="af3"/>
@@ -1882,7 +1960,7 @@
             <w:noProof/>
             <w:webHidden/>
           </w:rPr>
-          <w:instrText xml:space="preserve"> PAGEREF _Toc228280411 \h </w:instrText>
+          <w:instrText xml:space="preserve"> PAGEREF _Toc228286704 \h </w:instrText>
         </w:r>
         <w:r>
           <w:rPr>
@@ -1902,7 +1980,7 @@
             <w:noProof/>
             <w:webHidden/>
           </w:rPr>
-          <w:t>8</w:t>
+          <w:t>9</w:t>
         </w:r>
         <w:r>
           <w:rPr>
@@ -1925,7 +2003,7 @@
           <w14:ligatures w14:val="standardContextual"/>
         </w:rPr>
       </w:pPr>
-      <w:hyperlink w:anchor="_Toc228280412" w:history="1">
+      <w:hyperlink w:anchor="_Toc228286705" w:history="1">
         <w:r>
           <w:rPr>
             <w:rStyle w:val="af3"/>
@@ -1969,7 +2047,7 @@
             <w:noProof/>
             <w:webHidden/>
           </w:rPr>
-          <w:instrText xml:space="preserve"> PAGEREF _Toc228280412 \h </w:instrText>
+          <w:instrText xml:space="preserve"> PAGEREF _Toc228286705 \h </w:instrText>
         </w:r>
         <w:r>
           <w:rPr>
@@ -1989,7 +2067,7 @@
             <w:noProof/>
             <w:webHidden/>
           </w:rPr>
-          <w:t>9</w:t>
+          <w:t>10</w:t>
         </w:r>
         <w:r>
           <w:rPr>
@@ -2012,7 +2090,7 @@
           <w14:ligatures w14:val="standardContextual"/>
         </w:rPr>
       </w:pPr>
-      <w:hyperlink w:anchor="_Toc228280413" w:history="1">
+      <w:hyperlink w:anchor="_Toc228286706" w:history="1">
         <w:r>
           <w:rPr>
             <w:rStyle w:val="af3"/>
@@ -2050,7 +2128,7 @@
             <w:noProof/>
             <w:webHidden/>
           </w:rPr>
-          <w:instrText xml:space="preserve"> PAGEREF _Toc228280413 \h </w:instrText>
+          <w:instrText xml:space="preserve"> PAGEREF _Toc228286706 \h </w:instrText>
         </w:r>
         <w:r>
           <w:rPr>
@@ -2070,7 +2148,7 @@
             <w:noProof/>
             <w:webHidden/>
           </w:rPr>
-          <w:t>9</w:t>
+          <w:t>10</w:t>
         </w:r>
         <w:r>
           <w:rPr>
@@ -2093,7 +2171,7 @@
           <w14:ligatures w14:val="standardContextual"/>
         </w:rPr>
       </w:pPr>
-      <w:hyperlink w:anchor="_Toc228280414" w:history="1">
+      <w:hyperlink w:anchor="_Toc228286707" w:history="1">
         <w:r>
           <w:rPr>
             <w:rStyle w:val="af3"/>
@@ -2131,7 +2209,7 @@
             <w:noProof/>
             <w:webHidden/>
           </w:rPr>
-          <w:instrText xml:space="preserve"> PAGEREF _Toc228280414 \h </w:instrText>
+          <w:instrText xml:space="preserve"> PAGEREF _Toc228286707 \h </w:instrText>
         </w:r>
         <w:r>
           <w:rPr>
@@ -2151,7 +2229,7 @@
             <w:noProof/>
             <w:webHidden/>
           </w:rPr>
-          <w:t>9</w:t>
+          <w:t>10</w:t>
         </w:r>
         <w:r>
           <w:rPr>
@@ -2174,7 +2252,7 @@
           <w14:ligatures w14:val="standardContextual"/>
         </w:rPr>
       </w:pPr>
-      <w:hyperlink w:anchor="_Toc228280415" w:history="1">
+      <w:hyperlink w:anchor="_Toc228286708" w:history="1">
         <w:r>
           <w:rPr>
             <w:rStyle w:val="af3"/>
@@ -2212,7 +2290,7 @@
             <w:noProof/>
             <w:webHidden/>
           </w:rPr>
-          <w:instrText xml:space="preserve"> PAGEREF _Toc228280415 \h </w:instrText>
+          <w:instrText xml:space="preserve"> PAGEREF _Toc228286708 \h </w:instrText>
         </w:r>
         <w:r>
           <w:rPr>
@@ -2232,7 +2310,7 @@
             <w:noProof/>
             <w:webHidden/>
           </w:rPr>
-          <w:t>9</w:t>
+          <w:t>10</w:t>
         </w:r>
         <w:r>
           <w:rPr>
@@ -2255,7 +2333,7 @@
           <w14:ligatures w14:val="standardContextual"/>
         </w:rPr>
       </w:pPr>
-      <w:hyperlink w:anchor="_Toc228280416" w:history="1">
+      <w:hyperlink w:anchor="_Toc228286709" w:history="1">
         <w:r>
           <w:rPr>
             <w:rStyle w:val="af3"/>
@@ -2293,7 +2371,7 @@
             <w:noProof/>
             <w:webHidden/>
           </w:rPr>
-          <w:instrText xml:space="preserve"> PAGEREF _Toc228280416 \h </w:instrText>
+          <w:instrText xml:space="preserve"> PAGEREF _Toc228286709 \h </w:instrText>
         </w:r>
         <w:r>
           <w:rPr>
@@ -2313,7 +2391,7 @@
             <w:noProof/>
             <w:webHidden/>
           </w:rPr>
-          <w:t>10</w:t>
+          <w:t>11</w:t>
         </w:r>
         <w:r>
           <w:rPr>
@@ -2336,7 +2414,7 @@
           <w14:ligatures w14:val="standardContextual"/>
         </w:rPr>
       </w:pPr>
-      <w:hyperlink w:anchor="_Toc228280417" w:history="1">
+      <w:hyperlink w:anchor="_Toc228286710" w:history="1">
         <w:r>
           <w:rPr>
             <w:rStyle w:val="af3"/>
@@ -2344,7 +2422,7 @@
             <w:b/>
             <w:noProof/>
           </w:rPr>
-          <w:t xml:space="preserve">2.5 C/C++ </w:t>
+          <w:t xml:space="preserve">2.5 C++17 </w:t>
         </w:r>
         <w:r>
           <w:rPr>
@@ -2374,7 +2452,7 @@
             <w:noProof/>
             <w:webHidden/>
           </w:rPr>
-          <w:instrText xml:space="preserve"> PAGEREF _Toc228280417 \h </w:instrText>
+          <w:instrText xml:space="preserve"> PAGEREF _Toc228286710 \h </w:instrText>
         </w:r>
         <w:r>
           <w:rPr>
@@ -2394,7 +2472,7 @@
             <w:noProof/>
             <w:webHidden/>
           </w:rPr>
-          <w:t>11</w:t>
+          <w:t>12</w:t>
         </w:r>
         <w:r>
           <w:rPr>
@@ -2417,7 +2495,7 @@
           <w14:ligatures w14:val="standardContextual"/>
         </w:rPr>
       </w:pPr>
-      <w:hyperlink w:anchor="_Toc228280418" w:history="1">
+      <w:hyperlink w:anchor="_Toc228286711" w:history="1">
         <w:r>
           <w:rPr>
             <w:rStyle w:val="af3"/>
@@ -2455,7 +2533,7 @@
             <w:noProof/>
             <w:webHidden/>
           </w:rPr>
-          <w:instrText xml:space="preserve"> PAGEREF _Toc228280418 \h </w:instrText>
+          <w:instrText xml:space="preserve"> PAGEREF _Toc228286711 \h </w:instrText>
         </w:r>
         <w:r>
           <w:rPr>
@@ -2475,7 +2553,7 @@
             <w:noProof/>
             <w:webHidden/>
           </w:rPr>
-          <w:t>11</w:t>
+          <w:t>12</w:t>
         </w:r>
         <w:r>
           <w:rPr>
@@ -2498,7 +2576,7 @@
           <w14:ligatures w14:val="standardContextual"/>
         </w:rPr>
       </w:pPr>
-      <w:hyperlink w:anchor="_Toc228280419" w:history="1">
+      <w:hyperlink w:anchor="_Toc228286712" w:history="1">
         <w:r>
           <w:rPr>
             <w:rStyle w:val="af3"/>
@@ -2542,7 +2620,7 @@
             <w:noProof/>
             <w:webHidden/>
           </w:rPr>
-          <w:instrText xml:space="preserve"> PAGEREF _Toc228280419 \h </w:instrText>
+          <w:instrText xml:space="preserve"> PAGEREF _Toc228286712 \h </w:instrText>
         </w:r>
         <w:r>
           <w:rPr>
@@ -2562,7 +2640,7 @@
             <w:noProof/>
             <w:webHidden/>
           </w:rPr>
-          <w:t>12</w:t>
+          <w:t>13</w:t>
         </w:r>
         <w:r>
           <w:rPr>
@@ -2585,7 +2663,7 @@
           <w14:ligatures w14:val="standardContextual"/>
         </w:rPr>
       </w:pPr>
-      <w:hyperlink w:anchor="_Toc228280420" w:history="1">
+      <w:hyperlink w:anchor="_Toc228286713" w:history="1">
         <w:r>
           <w:rPr>
             <w:rStyle w:val="af3"/>
@@ -2623,7 +2701,7 @@
             <w:noProof/>
             <w:webHidden/>
           </w:rPr>
-          <w:instrText xml:space="preserve"> PAGEREF _Toc228280420 \h </w:instrText>
+          <w:instrText xml:space="preserve"> PAGEREF _Toc228286713 \h </w:instrText>
         </w:r>
         <w:r>
           <w:rPr>
@@ -2643,7 +2721,7 @@
             <w:noProof/>
             <w:webHidden/>
           </w:rPr>
-          <w:t>12</w:t>
+          <w:t>13</w:t>
         </w:r>
         <w:r>
           <w:rPr>
@@ -2665,7 +2743,7 @@
           <w14:ligatures w14:val="standardContextual"/>
         </w:rPr>
       </w:pPr>
-      <w:hyperlink w:anchor="_Toc228280421" w:history="1">
+      <w:hyperlink w:anchor="_Toc228286714" w:history="1">
         <w:r>
           <w:rPr>
             <w:rStyle w:val="af3"/>
@@ -2703,7 +2781,7 @@
             <w:noProof/>
             <w:webHidden/>
           </w:rPr>
-          <w:instrText xml:space="preserve"> PAGEREF _Toc228280421 \h </w:instrText>
+          <w:instrText xml:space="preserve"> PAGEREF _Toc228286714 \h </w:instrText>
         </w:r>
         <w:r>
           <w:rPr>
@@ -2723,7 +2801,7 @@
             <w:noProof/>
             <w:webHidden/>
           </w:rPr>
-          <w:t>12</w:t>
+          <w:t>13</w:t>
         </w:r>
         <w:r>
           <w:rPr>
@@ -2745,7 +2823,7 @@
           <w14:ligatures w14:val="standardContextual"/>
         </w:rPr>
       </w:pPr>
-      <w:hyperlink w:anchor="_Toc228280422" w:history="1">
+      <w:hyperlink w:anchor="_Toc228286715" w:history="1">
         <w:r>
           <w:rPr>
             <w:rStyle w:val="af3"/>
@@ -2783,7 +2861,7 @@
             <w:noProof/>
             <w:webHidden/>
           </w:rPr>
-          <w:instrText xml:space="preserve"> PAGEREF _Toc228280422 \h </w:instrText>
+          <w:instrText xml:space="preserve"> PAGEREF _Toc228286715 \h </w:instrText>
         </w:r>
         <w:r>
           <w:rPr>
@@ -2803,7 +2881,7 @@
             <w:noProof/>
             <w:webHidden/>
           </w:rPr>
-          <w:t>13</w:t>
+          <w:t>14</w:t>
         </w:r>
         <w:r>
           <w:rPr>
@@ -2825,7 +2903,7 @@
           <w14:ligatures w14:val="standardContextual"/>
         </w:rPr>
       </w:pPr>
-      <w:hyperlink w:anchor="_Toc228280423" w:history="1">
+      <w:hyperlink w:anchor="_Toc228286716" w:history="1">
         <w:r>
           <w:rPr>
             <w:rStyle w:val="af3"/>
@@ -2863,7 +2941,7 @@
             <w:noProof/>
             <w:webHidden/>
           </w:rPr>
-          <w:instrText xml:space="preserve"> PAGEREF _Toc228280423 \h </w:instrText>
+          <w:instrText xml:space="preserve"> PAGEREF _Toc228286716 \h </w:instrText>
         </w:r>
         <w:r>
           <w:rPr>
@@ -2883,7 +2961,7 @@
             <w:noProof/>
             <w:webHidden/>
           </w:rPr>
-          <w:t>14</w:t>
+          <w:t>15</w:t>
         </w:r>
         <w:r>
           <w:rPr>
@@ -2906,7 +2984,7 @@
           <w14:ligatures w14:val="standardContextual"/>
         </w:rPr>
       </w:pPr>
-      <w:hyperlink w:anchor="_Toc228280424" w:history="1">
+      <w:hyperlink w:anchor="_Toc228286717" w:history="1">
         <w:r>
           <w:rPr>
             <w:rStyle w:val="af3"/>
@@ -2944,7 +3022,7 @@
             <w:noProof/>
             <w:webHidden/>
           </w:rPr>
-          <w:instrText xml:space="preserve"> PAGEREF _Toc228280424 \h </w:instrText>
+          <w:instrText xml:space="preserve"> PAGEREF _Toc228286717 \h </w:instrText>
         </w:r>
         <w:r>
           <w:rPr>
@@ -2964,7 +3042,7 @@
             <w:noProof/>
             <w:webHidden/>
           </w:rPr>
-          <w:t>14</w:t>
+          <w:t>15</w:t>
         </w:r>
         <w:r>
           <w:rPr>
@@ -2987,7 +3065,7 @@
           <w14:ligatures w14:val="standardContextual"/>
         </w:rPr>
       </w:pPr>
-      <w:hyperlink w:anchor="_Toc228280425" w:history="1">
+      <w:hyperlink w:anchor="_Toc228286718" w:history="1">
         <w:r>
           <w:rPr>
             <w:rStyle w:val="af3"/>
@@ -3025,7 +3103,7 @@
             <w:noProof/>
             <w:webHidden/>
           </w:rPr>
-          <w:instrText xml:space="preserve"> PAGEREF _Toc228280425 \h </w:instrText>
+          <w:instrText xml:space="preserve"> PAGEREF _Toc228286718 \h </w:instrText>
         </w:r>
         <w:r>
           <w:rPr>
@@ -3045,7 +3123,7 @@
             <w:noProof/>
             <w:webHidden/>
           </w:rPr>
-          <w:t>15</w:t>
+          <w:t>16</w:t>
         </w:r>
         <w:r>
           <w:rPr>
@@ -3067,7 +3145,7 @@
           <w14:ligatures w14:val="standardContextual"/>
         </w:rPr>
       </w:pPr>
-      <w:hyperlink w:anchor="_Toc228280426" w:history="1">
+      <w:hyperlink w:anchor="_Toc228286719" w:history="1">
         <w:r>
           <w:rPr>
             <w:rStyle w:val="af3"/>
@@ -3105,7 +3183,7 @@
             <w:noProof/>
             <w:webHidden/>
           </w:rPr>
-          <w:instrText xml:space="preserve"> PAGEREF _Toc228280426 \h </w:instrText>
+          <w:instrText xml:space="preserve"> PAGEREF _Toc228286719 \h </w:instrText>
         </w:r>
         <w:r>
           <w:rPr>
@@ -3125,7 +3203,7 @@
             <w:noProof/>
             <w:webHidden/>
           </w:rPr>
-          <w:t>15</w:t>
+          <w:t>16</w:t>
         </w:r>
         <w:r>
           <w:rPr>
@@ -3147,7 +3225,7 @@
           <w14:ligatures w14:val="standardContextual"/>
         </w:rPr>
       </w:pPr>
-      <w:hyperlink w:anchor="_Toc228280427" w:history="1">
+      <w:hyperlink w:anchor="_Toc228286720" w:history="1">
         <w:r>
           <w:rPr>
             <w:rStyle w:val="af3"/>
@@ -3185,7 +3263,7 @@
             <w:noProof/>
             <w:webHidden/>
           </w:rPr>
-          <w:instrText xml:space="preserve"> PAGEREF _Toc228280427 \h </w:instrText>
+          <w:instrText xml:space="preserve"> PAGEREF _Toc228286720 \h </w:instrText>
         </w:r>
         <w:r>
           <w:rPr>
@@ -3205,7 +3283,7 @@
             <w:noProof/>
             <w:webHidden/>
           </w:rPr>
-          <w:t>16</w:t>
+          <w:t>17</w:t>
         </w:r>
         <w:r>
           <w:rPr>
@@ -3228,7 +3306,7 @@
           <w14:ligatures w14:val="standardContextual"/>
         </w:rPr>
       </w:pPr>
-      <w:hyperlink w:anchor="_Toc228280428" w:history="1">
+      <w:hyperlink w:anchor="_Toc228286721" w:history="1">
         <w:r>
           <w:rPr>
             <w:rStyle w:val="af3"/>
@@ -3266,7 +3344,7 @@
             <w:noProof/>
             <w:webHidden/>
           </w:rPr>
-          <w:instrText xml:space="preserve"> PAGEREF _Toc228280428 \h </w:instrText>
+          <w:instrText xml:space="preserve"> PAGEREF _Toc228286721 \h </w:instrText>
         </w:r>
         <w:r>
           <w:rPr>
@@ -3286,7 +3364,7 @@
             <w:noProof/>
             <w:webHidden/>
           </w:rPr>
-          <w:t>17</w:t>
+          <w:t>18</w:t>
         </w:r>
         <w:r>
           <w:rPr>
@@ -3308,7 +3386,7 @@
           <w14:ligatures w14:val="standardContextual"/>
         </w:rPr>
       </w:pPr>
-      <w:hyperlink w:anchor="_Toc228280429" w:history="1">
+      <w:hyperlink w:anchor="_Toc228286722" w:history="1">
         <w:r>
           <w:rPr>
             <w:rStyle w:val="af3"/>
@@ -3346,7 +3424,7 @@
             <w:noProof/>
             <w:webHidden/>
           </w:rPr>
-          <w:instrText xml:space="preserve"> PAGEREF _Toc228280429 \h </w:instrText>
+          <w:instrText xml:space="preserve"> PAGEREF _Toc228286722 \h </w:instrText>
         </w:r>
         <w:r>
           <w:rPr>
@@ -3366,7 +3444,7 @@
             <w:noProof/>
             <w:webHidden/>
           </w:rPr>
-          <w:t>17</w:t>
+          <w:t>18</w:t>
         </w:r>
         <w:r>
           <w:rPr>
@@ -3388,7 +3466,7 @@
           <w14:ligatures w14:val="standardContextual"/>
         </w:rPr>
       </w:pPr>
-      <w:hyperlink w:anchor="_Toc228280430" w:history="1">
+      <w:hyperlink w:anchor="_Toc228286723" w:history="1">
         <w:r>
           <w:rPr>
             <w:rStyle w:val="af3"/>
@@ -3426,7 +3504,7 @@
             <w:noProof/>
             <w:webHidden/>
           </w:rPr>
-          <w:instrText xml:space="preserve"> PAGEREF _Toc228280430 \h </w:instrText>
+          <w:instrText xml:space="preserve"> PAGEREF _Toc228286723 \h </w:instrText>
         </w:r>
         <w:r>
           <w:rPr>
@@ -3446,7 +3524,7 @@
             <w:noProof/>
             <w:webHidden/>
           </w:rPr>
-          <w:t>17</w:t>
+          <w:t>18</w:t>
         </w:r>
         <w:r>
           <w:rPr>
@@ -3469,7 +3547,7 @@
           <w14:ligatures w14:val="standardContextual"/>
         </w:rPr>
       </w:pPr>
-      <w:hyperlink w:anchor="_Toc228280431" w:history="1">
+      <w:hyperlink w:anchor="_Toc228286724" w:history="1">
         <w:r>
           <w:rPr>
             <w:rStyle w:val="af3"/>
@@ -3525,7 +3603,7 @@
             <w:noProof/>
             <w:webHidden/>
           </w:rPr>
-          <w:instrText xml:space="preserve"> PAGEREF _Toc228280431 \h </w:instrText>
+          <w:instrText xml:space="preserve"> PAGEREF _Toc228286724 \h </w:instrText>
         </w:r>
         <w:r>
           <w:rPr>
@@ -3545,7 +3623,7 @@
             <w:noProof/>
             <w:webHidden/>
           </w:rPr>
-          <w:t>18</w:t>
+          <w:t>19</w:t>
         </w:r>
         <w:r>
           <w:rPr>
@@ -3567,7 +3645,7 @@
           <w14:ligatures w14:val="standardContextual"/>
         </w:rPr>
       </w:pPr>
-      <w:hyperlink w:anchor="_Toc228280432" w:history="1">
+      <w:hyperlink w:anchor="_Toc228286725" w:history="1">
         <w:r>
           <w:rPr>
             <w:rStyle w:val="af3"/>
@@ -3605,7 +3683,7 @@
             <w:noProof/>
             <w:webHidden/>
           </w:rPr>
-          <w:instrText xml:space="preserve"> PAGEREF _Toc228280432 \h </w:instrText>
+          <w:instrText xml:space="preserve"> PAGEREF _Toc228286725 \h </w:instrText>
         </w:r>
         <w:r>
           <w:rPr>
@@ -3625,7 +3703,7 @@
             <w:noProof/>
             <w:webHidden/>
           </w:rPr>
-          <w:t>18</w:t>
+          <w:t>19</w:t>
         </w:r>
         <w:r>
           <w:rPr>
@@ -3647,7 +3725,7 @@
           <w14:ligatures w14:val="standardContextual"/>
         </w:rPr>
       </w:pPr>
-      <w:hyperlink w:anchor="_Toc228280433" w:history="1">
+      <w:hyperlink w:anchor="_Toc228286726" w:history="1">
         <w:r>
           <w:rPr>
             <w:rStyle w:val="af3"/>
@@ -3703,7 +3781,7 @@
             <w:noProof/>
             <w:webHidden/>
           </w:rPr>
-          <w:instrText xml:space="preserve"> PAGEREF _Toc228280433 \h </w:instrText>
+          <w:instrText xml:space="preserve"> PAGEREF _Toc228286726 \h </w:instrText>
         </w:r>
         <w:r>
           <w:rPr>
@@ -3723,7 +3801,7 @@
             <w:noProof/>
             <w:webHidden/>
           </w:rPr>
-          <w:t>18</w:t>
+          <w:t>19</w:t>
         </w:r>
         <w:r>
           <w:rPr>
@@ -3745,7 +3823,7 @@
           <w14:ligatures w14:val="standardContextual"/>
         </w:rPr>
       </w:pPr>
-      <w:hyperlink w:anchor="_Toc228280434" w:history="1">
+      <w:hyperlink w:anchor="_Toc228286727" w:history="1">
         <w:r>
           <w:rPr>
             <w:rStyle w:val="af3"/>
@@ -3783,7 +3861,7 @@
             <w:noProof/>
             <w:webHidden/>
           </w:rPr>
-          <w:instrText xml:space="preserve"> PAGEREF _Toc228280434 \h </w:instrText>
+          <w:instrText xml:space="preserve"> PAGEREF _Toc228286727 \h </w:instrText>
         </w:r>
         <w:r>
           <w:rPr>
@@ -3803,7 +3881,7 @@
             <w:noProof/>
             <w:webHidden/>
           </w:rPr>
-          <w:t>18</w:t>
+          <w:t>19</w:t>
         </w:r>
         <w:r>
           <w:rPr>
@@ -3826,7 +3904,7 @@
           <w14:ligatures w14:val="standardContextual"/>
         </w:rPr>
       </w:pPr>
-      <w:hyperlink w:anchor="_Toc228280435" w:history="1">
+      <w:hyperlink w:anchor="_Toc228286728" w:history="1">
         <w:r>
           <w:rPr>
             <w:rStyle w:val="af3"/>
@@ -3882,7 +3960,7 @@
             <w:noProof/>
             <w:webHidden/>
           </w:rPr>
-          <w:instrText xml:space="preserve"> PAGEREF _Toc228280435 \h </w:instrText>
+          <w:instrText xml:space="preserve"> PAGEREF _Toc228286728 \h </w:instrText>
         </w:r>
         <w:r>
           <w:rPr>
@@ -3902,7 +3980,7 @@
             <w:noProof/>
             <w:webHidden/>
           </w:rPr>
-          <w:t>19</w:t>
+          <w:t>20</w:t>
         </w:r>
         <w:r>
           <w:rPr>
@@ -3924,7 +4002,7 @@
           <w14:ligatures w14:val="standardContextual"/>
         </w:rPr>
       </w:pPr>
-      <w:hyperlink w:anchor="_Toc228280436" w:history="1">
+      <w:hyperlink w:anchor="_Toc228286729" w:history="1">
         <w:r>
           <w:rPr>
             <w:rStyle w:val="af3"/>
@@ -3980,7 +4058,7 @@
             <w:noProof/>
             <w:webHidden/>
           </w:rPr>
-          <w:instrText xml:space="preserve"> PAGEREF _Toc228280436 \h </w:instrText>
+          <w:instrText xml:space="preserve"> PAGEREF _Toc228286729 \h </w:instrText>
         </w:r>
         <w:r>
           <w:rPr>
@@ -4000,7 +4078,7 @@
             <w:noProof/>
             <w:webHidden/>
           </w:rPr>
-          <w:t>19</w:t>
+          <w:t>20</w:t>
         </w:r>
         <w:r>
           <w:rPr>
@@ -4022,7 +4100,7 @@
           <w14:ligatures w14:val="standardContextual"/>
         </w:rPr>
       </w:pPr>
-      <w:hyperlink w:anchor="_Toc228280437" w:history="1">
+      <w:hyperlink w:anchor="_Toc228286730" w:history="1">
         <w:r>
           <w:rPr>
             <w:rStyle w:val="af3"/>
@@ -4078,7 +4156,7 @@
             <w:noProof/>
             <w:webHidden/>
           </w:rPr>
-          <w:instrText xml:space="preserve"> PAGEREF _Toc228280437 \h </w:instrText>
+          <w:instrText xml:space="preserve"> PAGEREF _Toc228286730 \h </w:instrText>
         </w:r>
         <w:r>
           <w:rPr>
@@ -4098,7 +4176,7 @@
             <w:noProof/>
             <w:webHidden/>
           </w:rPr>
-          <w:t>20</w:t>
+          <w:t>21</w:t>
         </w:r>
         <w:r>
           <w:rPr>
@@ -4120,7 +4198,7 @@
           <w14:ligatures w14:val="standardContextual"/>
         </w:rPr>
       </w:pPr>
-      <w:hyperlink w:anchor="_Toc228280438" w:history="1">
+      <w:hyperlink w:anchor="_Toc228286731" w:history="1">
         <w:r>
           <w:rPr>
             <w:rStyle w:val="af3"/>
@@ -4158,7 +4236,7 @@
             <w:noProof/>
             <w:webHidden/>
           </w:rPr>
-          <w:instrText xml:space="preserve"> PAGEREF _Toc228280438 \h </w:instrText>
+          <w:instrText xml:space="preserve"> PAGEREF _Toc228286731 \h </w:instrText>
         </w:r>
         <w:r>
           <w:rPr>
@@ -4178,7 +4256,7 @@
             <w:noProof/>
             <w:webHidden/>
           </w:rPr>
-          <w:t>20</w:t>
+          <w:t>21</w:t>
         </w:r>
         <w:r>
           <w:rPr>
@@ -4201,7 +4279,7 @@
           <w14:ligatures w14:val="standardContextual"/>
         </w:rPr>
       </w:pPr>
-      <w:hyperlink w:anchor="_Toc228280439" w:history="1">
+      <w:hyperlink w:anchor="_Toc228286732" w:history="1">
         <w:r>
           <w:rPr>
             <w:rStyle w:val="af3"/>
@@ -4239,7 +4317,7 @@
             <w:noProof/>
             <w:webHidden/>
           </w:rPr>
-          <w:instrText xml:space="preserve"> PAGEREF _Toc228280439 \h </w:instrText>
+          <w:instrText xml:space="preserve"> PAGEREF _Toc228286732 \h </w:instrText>
         </w:r>
         <w:r>
           <w:rPr>
@@ -4259,7 +4337,7 @@
             <w:noProof/>
             <w:webHidden/>
           </w:rPr>
-          <w:t>21</w:t>
+          <w:t>22</w:t>
         </w:r>
         <w:r>
           <w:rPr>
@@ -4282,7 +4360,7 @@
           <w14:ligatures w14:val="standardContextual"/>
         </w:rPr>
       </w:pPr>
-      <w:hyperlink w:anchor="_Toc228280440" w:history="1">
+      <w:hyperlink w:anchor="_Toc228286733" w:history="1">
         <w:r>
           <w:rPr>
             <w:rStyle w:val="af3"/>
@@ -4326,7 +4404,7 @@
             <w:noProof/>
             <w:webHidden/>
           </w:rPr>
-          <w:instrText xml:space="preserve"> PAGEREF _Toc228280440 \h </w:instrText>
+          <w:instrText xml:space="preserve"> PAGEREF _Toc228286733 \h </w:instrText>
         </w:r>
         <w:r>
           <w:rPr>
@@ -4346,7 +4424,7 @@
             <w:noProof/>
             <w:webHidden/>
           </w:rPr>
-          <w:t>22</w:t>
+          <w:t>23</w:t>
         </w:r>
         <w:r>
           <w:rPr>
@@ -4369,7 +4447,7 @@
           <w14:ligatures w14:val="standardContextual"/>
         </w:rPr>
       </w:pPr>
-      <w:hyperlink w:anchor="_Toc228280441" w:history="1">
+      <w:hyperlink w:anchor="_Toc228286734" w:history="1">
         <w:r>
           <w:rPr>
             <w:rStyle w:val="af3"/>
@@ -4407,7 +4485,7 @@
             <w:noProof/>
             <w:webHidden/>
           </w:rPr>
-          <w:instrText xml:space="preserve"> PAGEREF _Toc228280441 \h </w:instrText>
+          <w:instrText xml:space="preserve"> PAGEREF _Toc228286734 \h </w:instrText>
         </w:r>
         <w:r>
           <w:rPr>
@@ -4427,7 +4505,7 @@
             <w:noProof/>
             <w:webHidden/>
           </w:rPr>
-          <w:t>22</w:t>
+          <w:t>23</w:t>
         </w:r>
         <w:r>
           <w:rPr>
@@ -4450,7 +4528,7 @@
           <w14:ligatures w14:val="standardContextual"/>
         </w:rPr>
       </w:pPr>
-      <w:hyperlink w:anchor="_Toc228280442" w:history="1">
+      <w:hyperlink w:anchor="_Toc228286735" w:history="1">
         <w:r>
           <w:rPr>
             <w:rStyle w:val="af3"/>
@@ -4506,7 +4584,7 @@
             <w:noProof/>
             <w:webHidden/>
           </w:rPr>
-          <w:instrText xml:space="preserve"> PAGEREF _Toc228280442 \h </w:instrText>
+          <w:instrText xml:space="preserve"> PAGEREF _Toc228286735 \h </w:instrText>
         </w:r>
         <w:r>
           <w:rPr>
@@ -4526,7 +4604,7 @@
             <w:noProof/>
             <w:webHidden/>
           </w:rPr>
-          <w:t>24</w:t>
+          <w:t>25</w:t>
         </w:r>
         <w:r>
           <w:rPr>
@@ -4549,7 +4627,7 @@
           <w14:ligatures w14:val="standardContextual"/>
         </w:rPr>
       </w:pPr>
-      <w:hyperlink w:anchor="_Toc228280443" w:history="1">
+      <w:hyperlink w:anchor="_Toc228286736" w:history="1">
         <w:r>
           <w:rPr>
             <w:rStyle w:val="af3"/>
@@ -4587,7 +4665,7 @@
             <w:noProof/>
             <w:webHidden/>
           </w:rPr>
-          <w:instrText xml:space="preserve"> PAGEREF _Toc228280443 \h </w:instrText>
+          <w:instrText xml:space="preserve"> PAGEREF _Toc228286736 \h </w:instrText>
         </w:r>
         <w:r>
           <w:rPr>
@@ -4607,7 +4685,7 @@
             <w:noProof/>
             <w:webHidden/>
           </w:rPr>
-          <w:t>25</w:t>
+          <w:t>26</w:t>
         </w:r>
         <w:r>
           <w:rPr>
@@ -4630,7 +4708,7 @@
           <w14:ligatures w14:val="standardContextual"/>
         </w:rPr>
       </w:pPr>
-      <w:hyperlink w:anchor="_Toc228280444" w:history="1">
+      <w:hyperlink w:anchor="_Toc228286737" w:history="1">
         <w:r>
           <w:rPr>
             <w:rStyle w:val="af3"/>
@@ -4668,7 +4746,7 @@
             <w:noProof/>
             <w:webHidden/>
           </w:rPr>
-          <w:instrText xml:space="preserve"> PAGEREF _Toc228280444 \h </w:instrText>
+          <w:instrText xml:space="preserve"> PAGEREF _Toc228286737 \h </w:instrText>
         </w:r>
         <w:r>
           <w:rPr>
@@ -4688,7 +4766,7 @@
             <w:noProof/>
             <w:webHidden/>
           </w:rPr>
-          <w:t>26</w:t>
+          <w:t>27</w:t>
         </w:r>
         <w:r>
           <w:rPr>
@@ -4711,7 +4789,7 @@
           <w14:ligatures w14:val="standardContextual"/>
         </w:rPr>
       </w:pPr>
-      <w:hyperlink w:anchor="_Toc228280445" w:history="1">
+      <w:hyperlink w:anchor="_Toc228286738" w:history="1">
         <w:r>
           <w:rPr>
             <w:rStyle w:val="af3"/>
@@ -4767,7 +4845,7 @@
             <w:noProof/>
             <w:webHidden/>
           </w:rPr>
-          <w:instrText xml:space="preserve"> PAGEREF _Toc228280445 \h </w:instrText>
+          <w:instrText xml:space="preserve"> PAGEREF _Toc228286738 \h </w:instrText>
         </w:r>
         <w:r>
           <w:rPr>
@@ -4787,7 +4865,7 @@
             <w:noProof/>
             <w:webHidden/>
           </w:rPr>
-          <w:t>27</w:t>
+          <w:t>28</w:t>
         </w:r>
         <w:r>
           <w:rPr>
@@ -4810,7 +4888,7 @@
           <w14:ligatures w14:val="standardContextual"/>
         </w:rPr>
       </w:pPr>
-      <w:hyperlink w:anchor="_Toc228280446" w:history="1">
+      <w:hyperlink w:anchor="_Toc228286739" w:history="1">
         <w:r>
           <w:rPr>
             <w:rStyle w:val="af3"/>
@@ -4866,7 +4944,7 @@
             <w:noProof/>
             <w:webHidden/>
           </w:rPr>
-          <w:instrText xml:space="preserve"> PAGEREF _Toc228280446 \h </w:instrText>
+          <w:instrText xml:space="preserve"> PAGEREF _Toc228286739 \h </w:instrText>
         </w:r>
         <w:r>
           <w:rPr>
@@ -4886,7 +4964,7 @@
             <w:noProof/>
             <w:webHidden/>
           </w:rPr>
-          <w:t>29</w:t>
+          <w:t>30</w:t>
         </w:r>
         <w:r>
           <w:rPr>
@@ -4909,7 +4987,7 @@
           <w14:ligatures w14:val="standardContextual"/>
         </w:rPr>
       </w:pPr>
-      <w:hyperlink w:anchor="_Toc228280447" w:history="1">
+      <w:hyperlink w:anchor="_Toc228286740" w:history="1">
         <w:r>
           <w:rPr>
             <w:rStyle w:val="af3"/>
@@ -4965,7 +5043,7 @@
             <w:noProof/>
             <w:webHidden/>
           </w:rPr>
-          <w:instrText xml:space="preserve"> PAGEREF _Toc228280447 \h </w:instrText>
+          <w:instrText xml:space="preserve"> PAGEREF _Toc228286740 \h </w:instrText>
         </w:r>
         <w:r>
           <w:rPr>
@@ -4985,7 +5063,7 @@
             <w:noProof/>
             <w:webHidden/>
           </w:rPr>
-          <w:t>31</w:t>
+          <w:t>32</w:t>
         </w:r>
         <w:r>
           <w:rPr>
@@ -5008,7 +5086,7 @@
           <w14:ligatures w14:val="standardContextual"/>
         </w:rPr>
       </w:pPr>
-      <w:hyperlink w:anchor="_Toc228280448" w:history="1">
+      <w:hyperlink w:anchor="_Toc228286741" w:history="1">
         <w:r>
           <w:rPr>
             <w:rStyle w:val="af3"/>
@@ -5046,7 +5124,7 @@
             <w:noProof/>
             <w:webHidden/>
           </w:rPr>
-          <w:instrText xml:space="preserve"> PAGEREF _Toc228280448 \h </w:instrText>
+          <w:instrText xml:space="preserve"> PAGEREF _Toc228286741 \h </w:instrText>
         </w:r>
         <w:r>
           <w:rPr>
@@ -5066,7 +5144,7 @@
             <w:noProof/>
             <w:webHidden/>
           </w:rPr>
-          <w:t>33</w:t>
+          <w:t>34</w:t>
         </w:r>
         <w:r>
           <w:rPr>
@@ -5089,7 +5167,7 @@
           <w14:ligatures w14:val="standardContextual"/>
         </w:rPr>
       </w:pPr>
-      <w:hyperlink w:anchor="_Toc228280449" w:history="1">
+      <w:hyperlink w:anchor="_Toc228286742" w:history="1">
         <w:r>
           <w:rPr>
             <w:rStyle w:val="af3"/>
@@ -5127,7 +5205,7 @@
             <w:noProof/>
             <w:webHidden/>
           </w:rPr>
-          <w:instrText xml:space="preserve"> PAGEREF _Toc228280449 \h </w:instrText>
+          <w:instrText xml:space="preserve"> PAGEREF _Toc228286742 \h </w:instrText>
         </w:r>
         <w:r>
           <w:rPr>
@@ -5147,7 +5225,7 @@
             <w:noProof/>
             <w:webHidden/>
           </w:rPr>
-          <w:t>34</w:t>
+          <w:t>35</w:t>
         </w:r>
         <w:r>
           <w:rPr>
@@ -5170,7 +5248,7 @@
           <w14:ligatures w14:val="standardContextual"/>
         </w:rPr>
       </w:pPr>
-      <w:hyperlink w:anchor="_Toc228280450" w:history="1">
+      <w:hyperlink w:anchor="_Toc228286743" w:history="1">
         <w:r>
           <w:rPr>
             <w:rStyle w:val="af3"/>
@@ -5214,7 +5292,7 @@
             <w:noProof/>
             <w:webHidden/>
           </w:rPr>
-          <w:instrText xml:space="preserve"> PAGEREF _Toc228280450 \h </w:instrText>
+          <w:instrText xml:space="preserve"> PAGEREF _Toc228286743 \h </w:instrText>
         </w:r>
         <w:r>
           <w:rPr>
@@ -5234,7 +5312,7 @@
             <w:noProof/>
             <w:webHidden/>
           </w:rPr>
-          <w:t>35</w:t>
+          <w:t>36</w:t>
         </w:r>
         <w:r>
           <w:rPr>
@@ -5257,7 +5335,7 @@
           <w14:ligatures w14:val="standardContextual"/>
         </w:rPr>
       </w:pPr>
-      <w:hyperlink w:anchor="_Toc228280451" w:history="1">
+      <w:hyperlink w:anchor="_Toc228286744" w:history="1">
         <w:r>
           <w:rPr>
             <w:rStyle w:val="af3"/>
@@ -5295,7 +5373,7 @@
             <w:noProof/>
             <w:webHidden/>
           </w:rPr>
-          <w:instrText xml:space="preserve"> PAGEREF _Toc228280451 \h </w:instrText>
+          <w:instrText xml:space="preserve"> PAGEREF _Toc228286744 \h </w:instrText>
         </w:r>
         <w:r>
           <w:rPr>
@@ -5315,7 +5393,7 @@
             <w:noProof/>
             <w:webHidden/>
           </w:rPr>
-          <w:t>35</w:t>
+          <w:t>36</w:t>
         </w:r>
         <w:r>
           <w:rPr>
@@ -5338,7 +5416,7 @@
           <w14:ligatures w14:val="standardContextual"/>
         </w:rPr>
       </w:pPr>
-      <w:hyperlink w:anchor="_Toc228280452" w:history="1">
+      <w:hyperlink w:anchor="_Toc228286745" w:history="1">
         <w:r>
           <w:rPr>
             <w:rStyle w:val="af3"/>
@@ -5376,7 +5454,7 @@
             <w:noProof/>
             <w:webHidden/>
           </w:rPr>
-          <w:instrText xml:space="preserve"> PAGEREF _Toc228280452 \h </w:instrText>
+          <w:instrText xml:space="preserve"> PAGEREF _Toc228286745 \h </w:instrText>
         </w:r>
         <w:r>
           <w:rPr>
@@ -5396,7 +5474,7 @@
             <w:noProof/>
             <w:webHidden/>
           </w:rPr>
-          <w:t>37</w:t>
+          <w:t>38</w:t>
         </w:r>
         <w:r>
           <w:rPr>
@@ -5419,7 +5497,7 @@
           <w14:ligatures w14:val="standardContextual"/>
         </w:rPr>
       </w:pPr>
-      <w:hyperlink w:anchor="_Toc228280453" w:history="1">
+      <w:hyperlink w:anchor="_Toc228286746" w:history="1">
         <w:r>
           <w:rPr>
             <w:rStyle w:val="af3"/>
@@ -5457,7 +5535,7 @@
             <w:noProof/>
             <w:webHidden/>
           </w:rPr>
-          <w:instrText xml:space="preserve"> PAGEREF _Toc228280453 \h </w:instrText>
+          <w:instrText xml:space="preserve"> PAGEREF _Toc228286746 \h </w:instrText>
         </w:r>
         <w:r>
           <w:rPr>
@@ -5477,7 +5555,7 @@
             <w:noProof/>
             <w:webHidden/>
           </w:rPr>
-          <w:t>38</w:t>
+          <w:t>40</w:t>
         </w:r>
         <w:r>
           <w:rPr>
@@ -5500,7 +5578,7 @@
           <w14:ligatures w14:val="standardContextual"/>
         </w:rPr>
       </w:pPr>
-      <w:hyperlink w:anchor="_Toc228280454" w:history="1">
+      <w:hyperlink w:anchor="_Toc228286747" w:history="1">
         <w:r>
           <w:rPr>
             <w:rStyle w:val="af3"/>
@@ -5556,7 +5634,7 @@
             <w:noProof/>
             <w:webHidden/>
           </w:rPr>
-          <w:instrText xml:space="preserve"> PAGEREF _Toc228280454 \h </w:instrText>
+          <w:instrText xml:space="preserve"> PAGEREF _Toc228286747 \h </w:instrText>
         </w:r>
         <w:r>
           <w:rPr>
@@ -5576,7 +5654,7 @@
             <w:noProof/>
             <w:webHidden/>
           </w:rPr>
-          <w:t>39</w:t>
+          <w:t>41</w:t>
         </w:r>
         <w:r>
           <w:rPr>
@@ -5599,7 +5677,7 @@
           <w14:ligatures w14:val="standardContextual"/>
         </w:rPr>
       </w:pPr>
-      <w:hyperlink w:anchor="_Toc228280455" w:history="1">
+      <w:hyperlink w:anchor="_Toc228286748" w:history="1">
         <w:r>
           <w:rPr>
             <w:rStyle w:val="af3"/>
@@ -5637,7 +5715,7 @@
             <w:noProof/>
             <w:webHidden/>
           </w:rPr>
-          <w:instrText xml:space="preserve"> PAGEREF _Toc228280455 \h </w:instrText>
+          <w:instrText xml:space="preserve"> PAGEREF _Toc228286748 \h </w:instrText>
         </w:r>
         <w:r>
           <w:rPr>
@@ -5657,7 +5735,7 @@
             <w:noProof/>
             <w:webHidden/>
           </w:rPr>
-          <w:t>40</w:t>
+          <w:t>42</w:t>
         </w:r>
         <w:r>
           <w:rPr>
@@ -5680,7 +5758,7 @@
           <w14:ligatures w14:val="standardContextual"/>
         </w:rPr>
       </w:pPr>
-      <w:hyperlink w:anchor="_Toc228280456" w:history="1">
+      <w:hyperlink w:anchor="_Toc228286749" w:history="1">
         <w:r>
           <w:rPr>
             <w:rStyle w:val="af3"/>
@@ -5736,7 +5814,7 @@
             <w:noProof/>
             <w:webHidden/>
           </w:rPr>
-          <w:instrText xml:space="preserve"> PAGEREF _Toc228280456 \h </w:instrText>
+          <w:instrText xml:space="preserve"> PAGEREF _Toc228286749 \h </w:instrText>
         </w:r>
         <w:r>
           <w:rPr>
@@ -5756,7 +5834,7 @@
             <w:noProof/>
             <w:webHidden/>
           </w:rPr>
-          <w:t>42</w:t>
+          <w:t>44</w:t>
         </w:r>
         <w:r>
           <w:rPr>
@@ -5779,7 +5857,7 @@
           <w14:ligatures w14:val="standardContextual"/>
         </w:rPr>
       </w:pPr>
-      <w:hyperlink w:anchor="_Toc228280457" w:history="1">
+      <w:hyperlink w:anchor="_Toc228286750" w:history="1">
         <w:r>
           <w:rPr>
             <w:rStyle w:val="af3"/>
@@ -5817,7 +5895,7 @@
             <w:noProof/>
             <w:webHidden/>
           </w:rPr>
-          <w:instrText xml:space="preserve"> PAGEREF _Toc228280457 \h </w:instrText>
+          <w:instrText xml:space="preserve"> PAGEREF _Toc228286750 \h </w:instrText>
         </w:r>
         <w:r>
           <w:rPr>
@@ -5837,7 +5915,7 @@
             <w:noProof/>
             <w:webHidden/>
           </w:rPr>
-          <w:t>43</w:t>
+          <w:t>45</w:t>
         </w:r>
         <w:r>
           <w:rPr>
@@ -5860,7 +5938,7 @@
           <w14:ligatures w14:val="standardContextual"/>
         </w:rPr>
       </w:pPr>
-      <w:hyperlink w:anchor="_Toc228280458" w:history="1">
+      <w:hyperlink w:anchor="_Toc228286751" w:history="1">
         <w:r>
           <w:rPr>
             <w:rStyle w:val="af3"/>
@@ -5898,7 +5976,7 @@
             <w:noProof/>
             <w:webHidden/>
           </w:rPr>
-          <w:instrText xml:space="preserve"> PAGEREF _Toc228280458 \h </w:instrText>
+          <w:instrText xml:space="preserve"> PAGEREF _Toc228286751 \h </w:instrText>
         </w:r>
         <w:r>
           <w:rPr>
@@ -5918,7 +5996,7 @@
             <w:noProof/>
             <w:webHidden/>
           </w:rPr>
-          <w:t>45</w:t>
+          <w:t>47</w:t>
         </w:r>
         <w:r>
           <w:rPr>
@@ -5941,7 +6019,7 @@
           <w14:ligatures w14:val="standardContextual"/>
         </w:rPr>
       </w:pPr>
-      <w:hyperlink w:anchor="_Toc228280459" w:history="1">
+      <w:hyperlink w:anchor="_Toc228286752" w:history="1">
         <w:r>
           <w:rPr>
             <w:rStyle w:val="af3"/>
@@ -5979,7 +6057,7 @@
             <w:noProof/>
             <w:webHidden/>
           </w:rPr>
-          <w:instrText xml:space="preserve"> PAGEREF _Toc228280459 \h </w:instrText>
+          <w:instrText xml:space="preserve"> PAGEREF _Toc228286752 \h </w:instrText>
         </w:r>
         <w:r>
           <w:rPr>
@@ -5999,7 +6077,7 @@
             <w:noProof/>
             <w:webHidden/>
           </w:rPr>
-          <w:t>46</w:t>
+          <w:t>48</w:t>
         </w:r>
         <w:r>
           <w:rPr>
@@ -6022,7 +6100,7 @@
           <w14:ligatures w14:val="standardContextual"/>
         </w:rPr>
       </w:pPr>
-      <w:hyperlink w:anchor="_Toc228280460" w:history="1">
+      <w:hyperlink w:anchor="_Toc228286753" w:history="1">
         <w:r>
           <w:rPr>
             <w:rStyle w:val="af3"/>
@@ -6060,7 +6138,7 @@
             <w:noProof/>
             <w:webHidden/>
           </w:rPr>
-          <w:instrText xml:space="preserve"> PAGEREF _Toc228280460 \h </w:instrText>
+          <w:instrText xml:space="preserve"> PAGEREF _Toc228286753 \h </w:instrText>
         </w:r>
         <w:r>
           <w:rPr>
@@ -6080,7 +6158,7 @@
             <w:noProof/>
             <w:webHidden/>
           </w:rPr>
-          <w:t>47</w:t>
+          <w:t>50</w:t>
         </w:r>
         <w:r>
           <w:rPr>
@@ -6103,7 +6181,7 @@
           <w14:ligatures w14:val="standardContextual"/>
         </w:rPr>
       </w:pPr>
-      <w:hyperlink w:anchor="_Toc228280461" w:history="1">
+      <w:hyperlink w:anchor="_Toc228286754" w:history="1">
         <w:r>
           <w:rPr>
             <w:rStyle w:val="af3"/>
@@ -6126,7 +6204,16 @@
             <w:b/>
             <w:noProof/>
           </w:rPr>
-          <w:t>总结与展望</w:t>
+          <w:t>总结与展</w:t>
+        </w:r>
+        <w:r>
+          <w:rPr>
+            <w:rStyle w:val="af3"/>
+            <w:b/>
+            <w:noProof/>
+          </w:rPr>
+          <w:lastRenderedPageBreak/>
+          <w:t>望</w:t>
         </w:r>
         <w:r>
           <w:rPr>
@@ -6147,7 +6234,7 @@
             <w:noProof/>
             <w:webHidden/>
           </w:rPr>
-          <w:instrText xml:space="preserve"> PAGEREF _Toc228280461 \h </w:instrText>
+          <w:instrText xml:space="preserve"> PAGEREF _Toc228286754 \h </w:instrText>
         </w:r>
         <w:r>
           <w:rPr>
@@ -6167,7 +6254,7 @@
             <w:noProof/>
             <w:webHidden/>
           </w:rPr>
-          <w:t>49</w:t>
+          <w:t>51</w:t>
         </w:r>
         <w:r>
           <w:rPr>
@@ -6190,7 +6277,7 @@
           <w14:ligatures w14:val="standardContextual"/>
         </w:rPr>
       </w:pPr>
-      <w:hyperlink w:anchor="_Toc228280462" w:history="1">
+      <w:hyperlink w:anchor="_Toc228286755" w:history="1">
         <w:r>
           <w:rPr>
             <w:rStyle w:val="af3"/>
@@ -6228,7 +6315,7 @@
             <w:noProof/>
             <w:webHidden/>
           </w:rPr>
-          <w:instrText xml:space="preserve"> PAGEREF _Toc228280462 \h </w:instrText>
+          <w:instrText xml:space="preserve"> PAGEREF _Toc228286755 \h </w:instrText>
         </w:r>
         <w:r>
           <w:rPr>
@@ -6248,7 +6335,7 @@
             <w:noProof/>
             <w:webHidden/>
           </w:rPr>
-          <w:t>49</w:t>
+          <w:t>51</w:t>
         </w:r>
         <w:r>
           <w:rPr>
@@ -6271,7 +6358,7 @@
           <w14:ligatures w14:val="standardContextual"/>
         </w:rPr>
       </w:pPr>
-      <w:hyperlink w:anchor="_Toc228280463" w:history="1">
+      <w:hyperlink w:anchor="_Toc228286756" w:history="1">
         <w:r>
           <w:rPr>
             <w:rStyle w:val="af3"/>
@@ -6309,7 +6396,7 @@
             <w:noProof/>
             <w:webHidden/>
           </w:rPr>
-          <w:instrText xml:space="preserve"> PAGEREF _Toc228280463 \h </w:instrText>
+          <w:instrText xml:space="preserve"> PAGEREF _Toc228286756 \h </w:instrText>
         </w:r>
         <w:r>
           <w:rPr>
@@ -6329,7 +6416,7 @@
             <w:noProof/>
             <w:webHidden/>
           </w:rPr>
-          <w:t>49</w:t>
+          <w:t>51</w:t>
         </w:r>
         <w:r>
           <w:rPr>
@@ -6352,7 +6439,7 @@
           <w14:ligatures w14:val="standardContextual"/>
         </w:rPr>
       </w:pPr>
-      <w:hyperlink w:anchor="_Toc228280464" w:history="1">
+      <w:hyperlink w:anchor="_Toc228286757" w:history="1">
         <w:r>
           <w:rPr>
             <w:rStyle w:val="af3"/>
@@ -6380,7 +6467,7 @@
             <w:noProof/>
             <w:webHidden/>
           </w:rPr>
-          <w:instrText xml:space="preserve"> PAGEREF _Toc228280464 \h </w:instrText>
+          <w:instrText xml:space="preserve"> PAGEREF _Toc228286757 \h </w:instrText>
         </w:r>
         <w:r>
           <w:rPr>
@@ -6400,7 +6487,7 @@
             <w:noProof/>
             <w:webHidden/>
           </w:rPr>
-          <w:t>50</w:t>
+          <w:t>52</w:t>
         </w:r>
         <w:r>
           <w:rPr>
@@ -6423,7 +6510,7 @@
           <w14:ligatures w14:val="standardContextual"/>
         </w:rPr>
       </w:pPr>
-      <w:hyperlink w:anchor="_Toc228280465" w:history="1">
+      <w:hyperlink w:anchor="_Toc228286758" w:history="1">
         <w:r>
           <w:rPr>
             <w:rStyle w:val="af3"/>
@@ -6451,7 +6538,7 @@
             <w:noProof/>
             <w:webHidden/>
           </w:rPr>
-          <w:instrText xml:space="preserve"> PAGEREF _Toc228280465 \h </w:instrText>
+          <w:instrText xml:space="preserve"> PAGEREF _Toc228286758 \h </w:instrText>
         </w:r>
         <w:r>
           <w:rPr>
@@ -6471,7 +6558,7 @@
             <w:noProof/>
             <w:webHidden/>
           </w:rPr>
-          <w:t>50</w:t>
+          <w:t>53</w:t>
         </w:r>
         <w:r>
           <w:rPr>
@@ -6498,7 +6585,7 @@
         </w:rPr>
         <w:fldChar w:fldCharType="end"/>
       </w:r>
-      <w:bookmarkStart w:id="0" w:name="_Toc228280407"/>
+      <w:bookmarkStart w:id="0" w:name="_Toc228286700"/>
       <w:r>
         <w:rPr>
           <w:rFonts w:cs="Times New Roman"/>
@@ -6527,7 +6614,7 @@
         <w:spacing w:before="240" w:after="120" w:line="360" w:lineRule="auto"/>
         <w:outlineLvl w:val="1"/>
       </w:pPr>
-      <w:bookmarkStart w:id="1" w:name="_Toc228280408"/>
+      <w:bookmarkStart w:id="1" w:name="_Toc228286701"/>
       <w:r>
         <w:rPr>
           <w:rFonts w:eastAsia="黑体"/>
@@ -6683,7 +6770,13 @@
         <w:rPr>
           <w:szCs w:val="24"/>
         </w:rPr>
-        <w:t xml:space="preserve">C/C++ </w:t>
+        <w:t>C++17</w:t>
+      </w:r>
+      <w:r>
+        <w:rPr>
+          <w:szCs w:val="24"/>
+        </w:rPr>
+        <w:t xml:space="preserve"> </w:t>
       </w:r>
       <w:r>
         <w:rPr>
@@ -6721,7 +6814,7 @@
         <w:spacing w:before="240" w:after="120" w:line="360" w:lineRule="auto"/>
         <w:outlineLvl w:val="1"/>
       </w:pPr>
-      <w:bookmarkStart w:id="2" w:name="_Toc228280409"/>
+      <w:bookmarkStart w:id="2" w:name="_Toc228286702"/>
       <w:r>
         <w:rPr>
           <w:rFonts w:eastAsia="黑体"/>
@@ -6931,7 +7024,7 @@
         <w:spacing w:before="240" w:after="120" w:line="360" w:lineRule="auto"/>
         <w:outlineLvl w:val="1"/>
       </w:pPr>
-      <w:bookmarkStart w:id="3" w:name="_Toc228280410"/>
+      <w:bookmarkStart w:id="3" w:name="_Toc228286703"/>
       <w:r>
         <w:rPr>
           <w:rFonts w:eastAsia="黑体"/>
@@ -7073,7 +7166,13 @@
         <w:rPr>
           <w:szCs w:val="24"/>
         </w:rPr>
-        <w:t xml:space="preserve">C/C++ </w:t>
+        <w:t>C++17</w:t>
+      </w:r>
+      <w:r>
+        <w:rPr>
+          <w:szCs w:val="24"/>
+        </w:rPr>
+        <w:t xml:space="preserve"> </w:t>
       </w:r>
       <w:r>
         <w:rPr>
@@ -7282,7 +7381,7 @@
         <w:spacing w:before="240" w:after="120" w:line="360" w:lineRule="auto"/>
         <w:outlineLvl w:val="1"/>
       </w:pPr>
-      <w:bookmarkStart w:id="4" w:name="_Toc228280411"/>
+      <w:bookmarkStart w:id="4" w:name="_Toc228286704"/>
       <w:r>
         <w:rPr>
           <w:rFonts w:eastAsia="黑体"/>
@@ -7349,7 +7448,7 @@
           <w:rFonts w:hint="eastAsia"/>
           <w:szCs w:val="24"/>
         </w:rPr>
-        <w:t>C/C++</w:t>
+        <w:t>C++17</w:t>
       </w:r>
       <w:r>
         <w:rPr>
@@ -7496,7 +7595,7 @@
         <w:jc w:val="center"/>
         <w:outlineLvl w:val="0"/>
       </w:pPr>
-      <w:bookmarkStart w:id="5" w:name="_Toc228280412"/>
+      <w:bookmarkStart w:id="5" w:name="_Toc228286705"/>
       <w:r>
         <w:rPr>
           <w:rFonts w:eastAsia="黑体"/>
@@ -7532,7 +7631,7 @@
         <w:spacing w:before="240" w:after="120" w:line="360" w:lineRule="auto"/>
         <w:outlineLvl w:val="1"/>
       </w:pPr>
-      <w:bookmarkStart w:id="6" w:name="_Toc228280413"/>
+      <w:bookmarkStart w:id="6" w:name="_Toc228286706"/>
       <w:r>
         <w:rPr>
           <w:rFonts w:eastAsia="黑体"/>
@@ -7607,7 +7706,7 @@
         <w:spacing w:before="240" w:after="120" w:line="360" w:lineRule="auto"/>
         <w:outlineLvl w:val="1"/>
       </w:pPr>
-      <w:bookmarkStart w:id="7" w:name="_Toc228280414"/>
+      <w:bookmarkStart w:id="7" w:name="_Toc228286707"/>
       <w:r>
         <w:rPr>
           <w:rFonts w:eastAsia="黑体"/>
@@ -7688,7 +7787,7 @@
         <w:spacing w:before="240" w:after="120" w:line="360" w:lineRule="auto"/>
         <w:outlineLvl w:val="1"/>
       </w:pPr>
-      <w:bookmarkStart w:id="8" w:name="_Toc228280415"/>
+      <w:bookmarkStart w:id="8" w:name="_Toc228286708"/>
       <w:r>
         <w:rPr>
           <w:rFonts w:eastAsia="黑体"/>
@@ -8551,7 +8650,7 @@
         <w:spacing w:before="240" w:after="120" w:line="360" w:lineRule="auto"/>
         <w:outlineLvl w:val="1"/>
       </w:pPr>
-      <w:bookmarkStart w:id="9" w:name="_Toc228280416"/>
+      <w:bookmarkStart w:id="9" w:name="_Toc228286709"/>
       <w:r>
         <w:rPr>
           <w:rFonts w:eastAsia="黑体"/>
@@ -8771,7 +8870,7 @@
         <w:spacing w:before="240" w:after="120" w:line="360" w:lineRule="auto"/>
         <w:outlineLvl w:val="1"/>
       </w:pPr>
-      <w:bookmarkStart w:id="10" w:name="_Toc228280417"/>
+      <w:bookmarkStart w:id="10" w:name="_Toc228286710"/>
       <w:r>
         <w:rPr>
           <w:rFonts w:eastAsia="黑体"/>
@@ -8779,7 +8878,7 @@
           <w:sz w:val="28"/>
           <w:szCs w:val="28"/>
         </w:rPr>
-        <w:t xml:space="preserve">2.5 C/C++ </w:t>
+        <w:t xml:space="preserve">2.5 </w:t>
       </w:r>
       <w:r>
         <w:rPr>
@@ -8788,143 +8887,8 @@
           <w:sz w:val="28"/>
           <w:szCs w:val="28"/>
         </w:rPr>
-        <w:t>多线程与实时视频流水线</w:t>
-      </w:r>
-      <w:bookmarkEnd w:id="10"/>
-    </w:p>
-    <w:p>
-      <w:pPr>
-        <w:spacing w:line="360" w:lineRule="auto"/>
-        <w:ind w:firstLine="480"/>
-      </w:pPr>
-      <w:r>
-        <w:rPr>
-          <w:szCs w:val="24"/>
-        </w:rPr>
-        <w:t>实时视频检测系统通常包含多个具有不同耗时特征的处理阶段。如果所有阶段在单线程中串行执行，系统整体帧率会受到最慢阶段限制，同时难以充分利用多核</w:t>
-      </w:r>
-      <w:r>
-        <w:rPr>
-          <w:szCs w:val="24"/>
-        </w:rPr>
-        <w:t>CPU</w:t>
-      </w:r>
-      <w:r>
-        <w:rPr>
-          <w:szCs w:val="24"/>
-        </w:rPr>
-        <w:t>和</w:t>
-      </w:r>
-      <w:r>
-        <w:rPr>
-          <w:szCs w:val="24"/>
-        </w:rPr>
-        <w:t>NPU</w:t>
-      </w:r>
-      <w:r>
-        <w:rPr>
-          <w:szCs w:val="24"/>
-        </w:rPr>
-        <w:t>资源。多线程流水线通过将采集、推理、发布等模块解耦，可以在不同帧之间形成重叠执行，从而提升吞吐能力。</w:t>
-      </w:r>
-    </w:p>
-    <w:p>
-      <w:pPr>
-        <w:spacing w:line="360" w:lineRule="auto"/>
-        <w:ind w:firstLine="480"/>
-      </w:pPr>
-      <w:r>
-        <w:rPr>
-          <w:szCs w:val="24"/>
-        </w:rPr>
-        <w:t>本文系统采用</w:t>
-      </w:r>
-      <w:r>
-        <w:rPr>
-          <w:szCs w:val="24"/>
-        </w:rPr>
-        <w:t xml:space="preserve">C/C++ </w:t>
-      </w:r>
-      <w:r>
-        <w:rPr>
-          <w:szCs w:val="24"/>
-        </w:rPr>
-        <w:t>实现板端程序，主要原因在于</w:t>
-      </w:r>
-      <w:r>
-        <w:rPr>
-          <w:szCs w:val="24"/>
-        </w:rPr>
-        <w:t xml:space="preserve">C/C++ </w:t>
-      </w:r>
-      <w:r>
-        <w:rPr>
-          <w:szCs w:val="24"/>
-        </w:rPr>
-        <w:t>便于直接调用</w:t>
-      </w:r>
-      <w:r>
-        <w:rPr>
-          <w:szCs w:val="24"/>
-        </w:rPr>
-        <w:t>RKNN Runtime</w:t>
-      </w:r>
-      <w:r>
-        <w:rPr>
-          <w:szCs w:val="24"/>
-        </w:rPr>
-        <w:t>、</w:t>
-      </w:r>
-      <w:r>
-        <w:rPr>
-          <w:szCs w:val="24"/>
-        </w:rPr>
-        <w:t>OpenCV</w:t>
-      </w:r>
-      <w:r>
-        <w:rPr>
-          <w:szCs w:val="24"/>
-        </w:rPr>
-        <w:t>和</w:t>
-      </w:r>
-      <w:r>
-        <w:rPr>
-          <w:szCs w:val="24"/>
-        </w:rPr>
-        <w:t>GStreamer</w:t>
-      </w:r>
-      <w:r>
-        <w:rPr>
-          <w:szCs w:val="24"/>
-        </w:rPr>
-        <w:t>等底层库，并能够更精细地控制线程、队列和内存生命周期</w:t>
-      </w:r>
-      <w:r>
-        <w:rPr>
-          <w:szCs w:val="24"/>
-          <w:vertAlign w:val="superscript"/>
-        </w:rPr>
-        <w:t>[7,10-11]</w:t>
-      </w:r>
-      <w:r>
-        <w:rPr>
-          <w:szCs w:val="24"/>
-        </w:rPr>
-        <w:t>。</w:t>
-      </w:r>
-      <w:r>
-        <w:rPr>
-          <w:szCs w:val="24"/>
-        </w:rPr>
-        <w:t>在线程协作方面，系统使用有限长度队列连接不同模块，避免输入速度高于处理速度时造成无限堆积。对于实时显示任务，系统更关注最新帧和低延迟，因此在必要时允许丢弃过旧帧，以换取更好的观看响应。</w:t>
-      </w:r>
-    </w:p>
-    <w:p>
-      <w:pPr>
-        <w:spacing w:before="240" w:after="120" w:line="360" w:lineRule="auto"/>
-        <w:outlineLvl w:val="1"/>
-      </w:pPr>
-      <w:bookmarkStart w:id="11" w:name="_Toc228280418"/>
+        <w:t>C++17</w:t>
+      </w:r>
       <w:r>
         <w:rPr>
           <w:rFonts w:eastAsia="黑体"/>
@@ -8932,7 +8896,7 @@
           <w:sz w:val="28"/>
           <w:szCs w:val="28"/>
         </w:rPr>
-        <w:t>2.6</w:t>
+        <w:t xml:space="preserve"> </w:t>
       </w:r>
       <w:r>
         <w:rPr>
@@ -8941,9 +8905,9 @@
           <w:sz w:val="28"/>
           <w:szCs w:val="28"/>
         </w:rPr>
-        <w:t>本章小结</w:t>
-      </w:r>
-      <w:bookmarkEnd w:id="11"/>
+        <w:t>多线程与实时视频流水线</w:t>
+      </w:r>
+      <w:bookmarkEnd w:id="10"/>
     </w:p>
     <w:p>
       <w:pPr>
@@ -8954,6 +8918,171 @@
         <w:rPr>
           <w:szCs w:val="24"/>
         </w:rPr>
+        <w:t>实时视频检测系统通常包含多个具有不同耗时特征的处理阶段。如果所有阶段在单线程中串行执行，系统整体帧率会受到最慢阶段限制，同时难以充分利用多核</w:t>
+      </w:r>
+      <w:r>
+        <w:rPr>
+          <w:szCs w:val="24"/>
+        </w:rPr>
+        <w:t>CPU</w:t>
+      </w:r>
+      <w:r>
+        <w:rPr>
+          <w:szCs w:val="24"/>
+        </w:rPr>
+        <w:t>和</w:t>
+      </w:r>
+      <w:r>
+        <w:rPr>
+          <w:szCs w:val="24"/>
+        </w:rPr>
+        <w:t>NPU</w:t>
+      </w:r>
+      <w:r>
+        <w:rPr>
+          <w:szCs w:val="24"/>
+        </w:rPr>
+        <w:t>资源。多线程流水线通过将采集、推理、发布等模块解耦，可以在不同帧之间形成重叠执行，从而提升吞吐能力。</w:t>
+      </w:r>
+    </w:p>
+    <w:p>
+      <w:pPr>
+        <w:spacing w:line="360" w:lineRule="auto"/>
+        <w:ind w:firstLine="480"/>
+      </w:pPr>
+      <w:r>
+        <w:rPr>
+          <w:szCs w:val="24"/>
+        </w:rPr>
+        <w:t>本文系统采用</w:t>
+      </w:r>
+      <w:r>
+        <w:rPr>
+          <w:szCs w:val="24"/>
+        </w:rPr>
+        <w:t>C++17</w:t>
+      </w:r>
+      <w:r>
+        <w:rPr>
+          <w:szCs w:val="24"/>
+        </w:rPr>
+        <w:t xml:space="preserve"> </w:t>
+      </w:r>
+      <w:r>
+        <w:rPr>
+          <w:szCs w:val="24"/>
+        </w:rPr>
+        <w:t>实现板端程序，主要原因在于</w:t>
+      </w:r>
+      <w:r>
+        <w:rPr>
+          <w:szCs w:val="24"/>
+        </w:rPr>
+        <w:t>C++17</w:t>
+      </w:r>
+      <w:r>
+        <w:rPr>
+          <w:szCs w:val="24"/>
+        </w:rPr>
+        <w:t xml:space="preserve"> </w:t>
+      </w:r>
+      <w:r>
+        <w:rPr>
+          <w:szCs w:val="24"/>
+        </w:rPr>
+        <w:t>便于直接调用</w:t>
+      </w:r>
+      <w:r>
+        <w:rPr>
+          <w:szCs w:val="24"/>
+        </w:rPr>
+        <w:t>RKNN Runtime</w:t>
+      </w:r>
+      <w:r>
+        <w:rPr>
+          <w:szCs w:val="24"/>
+        </w:rPr>
+        <w:t>、</w:t>
+      </w:r>
+      <w:r>
+        <w:rPr>
+          <w:szCs w:val="24"/>
+        </w:rPr>
+        <w:t>OpenCV</w:t>
+      </w:r>
+      <w:r>
+        <w:rPr>
+          <w:szCs w:val="24"/>
+        </w:rPr>
+        <w:t>和</w:t>
+      </w:r>
+      <w:r>
+        <w:rPr>
+          <w:szCs w:val="24"/>
+        </w:rPr>
+        <w:t>GStreamer</w:t>
+      </w:r>
+      <w:r>
+        <w:rPr>
+          <w:szCs w:val="24"/>
+        </w:rPr>
+        <w:t>等底层库，并能够更精细地控制线程、队列和内存生命周期</w:t>
+      </w:r>
+      <w:r>
+        <w:rPr>
+          <w:szCs w:val="24"/>
+          <w:vertAlign w:val="superscript"/>
+        </w:rPr>
+        <w:t>[7,10-11]</w:t>
+      </w:r>
+      <w:r>
+        <w:rPr>
+          <w:szCs w:val="24"/>
+        </w:rPr>
+        <w:t>。</w:t>
+      </w:r>
+      <w:r>
+        <w:rPr>
+          <w:szCs w:val="24"/>
+        </w:rPr>
+        <w:t>在线程协作方面，系统使用有限长度队列连接不同模块，避免输入速度高于处理速度时造成无限堆积。对于实时显示任务，系统更关注最新帧和低延迟，因此在必要时允许丢弃过旧帧，以换取更好的观看响应。</w:t>
+      </w:r>
+    </w:p>
+    <w:p>
+      <w:pPr>
+        <w:spacing w:before="240" w:after="120" w:line="360" w:lineRule="auto"/>
+        <w:outlineLvl w:val="1"/>
+      </w:pPr>
+      <w:bookmarkStart w:id="11" w:name="_Toc228286711"/>
+      <w:r>
+        <w:rPr>
+          <w:rFonts w:eastAsia="黑体"/>
+          <w:b/>
+          <w:sz w:val="28"/>
+          <w:szCs w:val="28"/>
+        </w:rPr>
+        <w:t>2.6</w:t>
+      </w:r>
+      <w:r>
+        <w:rPr>
+          <w:rFonts w:eastAsia="黑体"/>
+          <w:b/>
+          <w:sz w:val="28"/>
+          <w:szCs w:val="28"/>
+        </w:rPr>
+        <w:t>本章小结</w:t>
+      </w:r>
+      <w:bookmarkEnd w:id="11"/>
+    </w:p>
+    <w:p>
+      <w:pPr>
+        <w:spacing w:line="360" w:lineRule="auto"/>
+        <w:ind w:firstLine="480"/>
+      </w:pPr>
+      <w:r>
+        <w:rPr>
+          <w:szCs w:val="24"/>
+        </w:rPr>
         <w:t>本章介绍了本文涉及的目标检测、无人机小目标检测、</w:t>
       </w:r>
       <w:r>
@@ -8984,7 +9113,13 @@
         <w:rPr>
           <w:szCs w:val="24"/>
         </w:rPr>
-        <w:t xml:space="preserve">C/C++ </w:t>
+        <w:t>C++17</w:t>
+      </w:r>
+      <w:r>
+        <w:rPr>
+          <w:szCs w:val="24"/>
+        </w:rPr>
+        <w:t xml:space="preserve"> </w:t>
       </w:r>
       <w:r>
         <w:rPr>
@@ -9004,7 +9139,7 @@
         <w:jc w:val="center"/>
         <w:outlineLvl w:val="0"/>
       </w:pPr>
-      <w:bookmarkStart w:id="12" w:name="_Toc228280419"/>
+      <w:bookmarkStart w:id="12" w:name="_Toc228286712"/>
       <w:r>
         <w:rPr>
           <w:rFonts w:eastAsia="黑体"/>
@@ -9196,7 +9331,7 @@
         <w:spacing w:before="240" w:after="120" w:line="360" w:lineRule="auto"/>
         <w:outlineLvl w:val="1"/>
       </w:pPr>
-      <w:bookmarkStart w:id="13" w:name="_Toc228280420"/>
+      <w:bookmarkStart w:id="13" w:name="_Toc228286713"/>
       <w:r>
         <w:rPr>
           <w:rFonts w:eastAsia="黑体"/>
@@ -9222,7 +9357,7 @@
         <w:spacing w:before="180" w:after="80" w:line="360" w:lineRule="auto"/>
         <w:outlineLvl w:val="2"/>
       </w:pPr>
-      <w:bookmarkStart w:id="14" w:name="_Toc228280421"/>
+      <w:bookmarkStart w:id="14" w:name="_Toc228286714"/>
       <w:r>
         <w:rPr>
           <w:rFonts w:eastAsia="黑体"/>
@@ -10042,7 +10177,7 @@
         <w:spacing w:before="180" w:after="80" w:line="360" w:lineRule="auto"/>
         <w:outlineLvl w:val="2"/>
       </w:pPr>
-      <w:bookmarkStart w:id="15" w:name="_Toc228280422"/>
+      <w:bookmarkStart w:id="15" w:name="_Toc228286715"/>
       <w:r>
         <w:rPr>
           <w:rFonts w:eastAsia="黑体"/>
@@ -10869,7 +11004,7 @@
         <w:spacing w:before="180" w:after="80" w:line="360" w:lineRule="auto"/>
         <w:outlineLvl w:val="2"/>
       </w:pPr>
-      <w:bookmarkStart w:id="16" w:name="_Toc228280423"/>
+      <w:bookmarkStart w:id="16" w:name="_Toc228286716"/>
       <w:r>
         <w:rPr>
           <w:rFonts w:eastAsia="黑体"/>
@@ -11110,7 +11245,7 @@
         <w:spacing w:before="240" w:after="120" w:line="360" w:lineRule="auto"/>
         <w:outlineLvl w:val="1"/>
       </w:pPr>
-      <w:bookmarkStart w:id="17" w:name="_Toc228280424"/>
+      <w:bookmarkStart w:id="17" w:name="_Toc228286717"/>
       <w:r>
         <w:rPr>
           <w:rFonts w:eastAsia="黑体"/>
@@ -11421,7 +11556,7 @@
         <w:spacing w:before="240" w:after="120" w:line="360" w:lineRule="auto"/>
         <w:outlineLvl w:val="1"/>
       </w:pPr>
-      <w:bookmarkStart w:id="18" w:name="_Toc228280425"/>
+      <w:bookmarkStart w:id="18" w:name="_Toc228286718"/>
       <w:r>
         <w:rPr>
           <w:rFonts w:eastAsia="黑体"/>
@@ -11447,7 +11582,7 @@
         <w:spacing w:before="180" w:after="80" w:line="360" w:lineRule="auto"/>
         <w:outlineLvl w:val="2"/>
       </w:pPr>
-      <w:bookmarkStart w:id="19" w:name="_Toc228280426"/>
+      <w:bookmarkStart w:id="19" w:name="_Toc228286719"/>
       <w:r>
         <w:rPr>
           <w:rFonts w:eastAsia="黑体"/>
@@ -11663,7 +11798,35 @@
           <w:rFonts w:hint="eastAsia"/>
           <w:szCs w:val="24"/>
         </w:rPr>
-        <w:t>[1, 5, 8400]</w:t>
+        <w:t>1</w:t>
+      </w:r>
+      <w:r>
+        <w:rPr>
+          <w:rFonts w:hint="eastAsia"/>
+          <w:szCs w:val="24"/>
+        </w:rPr>
+        <w:t>×</w:t>
+      </w:r>
+      <w:r>
+        <w:rPr>
+          <w:rFonts w:hint="eastAsia"/>
+          <w:szCs w:val="24"/>
+        </w:rPr>
+        <w:t>5</w:t>
+      </w:r>
+      <w:r>
+        <w:rPr>
+          <w:rFonts w:hint="eastAsia"/>
+          <w:szCs w:val="24"/>
+        </w:rPr>
+        <w:t>×</w:t>
+      </w:r>
+      <w:r>
+        <w:rPr>
+          <w:rFonts w:hint="eastAsia"/>
+          <w:szCs w:val="24"/>
+        </w:rPr>
+        <w:t>8400</w:t>
       </w:r>
       <w:r>
         <w:rPr>
@@ -11984,7 +12147,7 @@
         <w:spacing w:before="180" w:after="80" w:line="360" w:lineRule="auto"/>
         <w:outlineLvl w:val="2"/>
       </w:pPr>
-      <w:bookmarkStart w:id="20" w:name="_Toc228280427"/>
+      <w:bookmarkStart w:id="20" w:name="_Toc228286720"/>
       <w:r>
         <w:rPr>
           <w:rFonts w:eastAsia="黑体"/>
@@ -12166,7 +12329,7 @@
         <w:spacing w:before="240" w:after="120" w:line="360" w:lineRule="auto"/>
         <w:outlineLvl w:val="1"/>
       </w:pPr>
-      <w:bookmarkStart w:id="21" w:name="_Toc228280428"/>
+      <w:bookmarkStart w:id="21" w:name="_Toc228286721"/>
       <w:r>
         <w:rPr>
           <w:rFonts w:eastAsia="黑体"/>
@@ -12192,7 +12355,7 @@
         <w:spacing w:before="180" w:after="80" w:line="360" w:lineRule="auto"/>
         <w:outlineLvl w:val="2"/>
       </w:pPr>
-      <w:bookmarkStart w:id="22" w:name="_Toc228280429"/>
+      <w:bookmarkStart w:id="22" w:name="_Toc228286722"/>
       <w:r>
         <w:rPr>
           <w:rFonts w:eastAsia="黑体"/>
@@ -12338,7 +12501,7 @@
         <w:spacing w:before="180" w:after="80" w:line="360" w:lineRule="auto"/>
         <w:outlineLvl w:val="2"/>
       </w:pPr>
-      <w:bookmarkStart w:id="23" w:name="_Toc228280430"/>
+      <w:bookmarkStart w:id="23" w:name="_Toc228286723"/>
       <w:r>
         <w:rPr>
           <w:rFonts w:eastAsia="黑体"/>
@@ -12453,7 +12616,7 @@
         <w:spacing w:before="240" w:after="120" w:line="360" w:lineRule="auto"/>
         <w:outlineLvl w:val="1"/>
       </w:pPr>
-      <w:bookmarkStart w:id="24" w:name="_Toc228280431"/>
+      <w:bookmarkStart w:id="24" w:name="_Toc228286724"/>
       <w:r>
         <w:rPr>
           <w:rFonts w:eastAsia="黑体"/>
@@ -12497,7 +12660,7 @@
         <w:spacing w:before="180" w:after="80" w:line="360" w:lineRule="auto"/>
         <w:outlineLvl w:val="2"/>
       </w:pPr>
-      <w:bookmarkStart w:id="25" w:name="_Toc228280432"/>
+      <w:bookmarkStart w:id="25" w:name="_Toc228286725"/>
       <w:r>
         <w:rPr>
           <w:rFonts w:eastAsia="黑体"/>
@@ -12747,7 +12910,7 @@
         <w:spacing w:before="180" w:after="80" w:line="360" w:lineRule="auto"/>
         <w:outlineLvl w:val="2"/>
       </w:pPr>
-      <w:bookmarkStart w:id="26" w:name="_Toc228280433"/>
+      <w:bookmarkStart w:id="26" w:name="_Toc228286726"/>
       <w:r>
         <w:rPr>
           <w:rFonts w:eastAsia="黑体"/>
@@ -12883,7 +13046,7 @@
         <w:spacing w:before="180" w:after="80" w:line="360" w:lineRule="auto"/>
         <w:outlineLvl w:val="2"/>
       </w:pPr>
-      <w:bookmarkStart w:id="27" w:name="_Toc228280434"/>
+      <w:bookmarkStart w:id="27" w:name="_Toc228286727"/>
       <w:r>
         <w:rPr>
           <w:rFonts w:eastAsia="黑体"/>
@@ -13190,7 +13353,7 @@
         <w:spacing w:before="240" w:after="120" w:line="360" w:lineRule="auto"/>
         <w:outlineLvl w:val="1"/>
       </w:pPr>
-      <w:bookmarkStart w:id="28" w:name="_Toc228280435"/>
+      <w:bookmarkStart w:id="28" w:name="_Toc228286728"/>
       <w:r>
         <w:rPr>
           <w:rFonts w:eastAsia="黑体"/>
@@ -13234,7 +13397,7 @@
         <w:spacing w:before="180" w:after="80" w:line="360" w:lineRule="auto"/>
         <w:outlineLvl w:val="2"/>
       </w:pPr>
-      <w:bookmarkStart w:id="29" w:name="_Toc228280436"/>
+      <w:bookmarkStart w:id="29" w:name="_Toc228286729"/>
       <w:r>
         <w:rPr>
           <w:rFonts w:eastAsia="黑体"/>
@@ -13531,7 +13694,7 @@
         <w:spacing w:before="180" w:after="80" w:line="360" w:lineRule="auto"/>
         <w:outlineLvl w:val="2"/>
       </w:pPr>
-      <w:bookmarkStart w:id="30" w:name="_Toc228280437"/>
+      <w:bookmarkStart w:id="30" w:name="_Toc228286730"/>
       <w:r>
         <w:rPr>
           <w:rFonts w:eastAsia="黑体"/>
@@ -13763,7 +13926,7 @@
         <w:spacing w:before="180" w:after="80" w:line="360" w:lineRule="auto"/>
         <w:outlineLvl w:val="2"/>
       </w:pPr>
-      <w:bookmarkStart w:id="31" w:name="_Toc228280438"/>
+      <w:bookmarkStart w:id="31" w:name="_Toc228286731"/>
       <w:r>
         <w:rPr>
           <w:rFonts w:eastAsia="黑体"/>
@@ -13890,7 +14053,7 @@
         <w:spacing w:before="240" w:after="120" w:line="360" w:lineRule="auto"/>
         <w:outlineLvl w:val="1"/>
       </w:pPr>
-      <w:bookmarkStart w:id="32" w:name="_Toc228280439"/>
+      <w:bookmarkStart w:id="32" w:name="_Toc228286732"/>
       <w:r>
         <w:rPr>
           <w:rFonts w:eastAsia="黑体"/>
@@ -14054,7 +14217,7 @@
         <w:jc w:val="center"/>
         <w:outlineLvl w:val="0"/>
       </w:pPr>
-      <w:bookmarkStart w:id="33" w:name="_Toc228280440"/>
+      <w:bookmarkStart w:id="33" w:name="_Toc228286733"/>
       <w:r>
         <w:rPr>
           <w:rFonts w:eastAsia="黑体"/>
@@ -14210,7 +14373,7 @@
         <w:spacing w:before="240" w:after="120" w:line="360" w:lineRule="auto"/>
         <w:outlineLvl w:val="1"/>
       </w:pPr>
-      <w:bookmarkStart w:id="34" w:name="_Toc228280441"/>
+      <w:bookmarkStart w:id="34" w:name="_Toc228286734"/>
       <w:r>
         <w:rPr>
           <w:rFonts w:eastAsia="黑体"/>
@@ -15238,7 +15401,14 @@
                 <w:sz w:val="20"/>
                 <w:szCs w:val="20"/>
               </w:rPr>
-              <w:t xml:space="preserve">C/C++ </w:t>
+              <w:t>C++17</w:t>
+            </w:r>
+            <w:r>
+              <w:rPr>
+                <w:sz w:val="20"/>
+                <w:szCs w:val="20"/>
+              </w:rPr>
+              <w:t xml:space="preserve"> </w:t>
             </w:r>
             <w:r>
               <w:rPr>
@@ -15399,7 +15569,13 @@
         <w:rPr>
           <w:szCs w:val="24"/>
         </w:rPr>
-        <w:t xml:space="preserve">C/C++ </w:t>
+        <w:t>C++17</w:t>
+      </w:r>
+      <w:r>
+        <w:rPr>
+          <w:szCs w:val="24"/>
+        </w:rPr>
+        <w:t xml:space="preserve"> </w:t>
       </w:r>
       <w:r>
         <w:rPr>
@@ -15411,7 +15587,13 @@
         <w:rPr>
           <w:szCs w:val="24"/>
         </w:rPr>
-        <w:t xml:space="preserve">C/C++ </w:t>
+        <w:t>C++17</w:t>
+      </w:r>
+      <w:r>
+        <w:rPr>
+          <w:szCs w:val="24"/>
+        </w:rPr>
+        <w:t xml:space="preserve"> </w:t>
       </w:r>
       <w:r>
         <w:rPr>
@@ -15459,7 +15641,13 @@
         <w:rPr>
           <w:szCs w:val="24"/>
         </w:rPr>
-        <w:t xml:space="preserve">C/C++ </w:t>
+        <w:t>C++17</w:t>
+      </w:r>
+      <w:r>
+        <w:rPr>
+          <w:szCs w:val="24"/>
+        </w:rPr>
+        <w:t xml:space="preserve"> </w:t>
       </w:r>
       <w:r>
         <w:rPr>
@@ -15478,7 +15666,7 @@
         <w:spacing w:before="240" w:after="120" w:line="360" w:lineRule="auto"/>
         <w:outlineLvl w:val="1"/>
       </w:pPr>
-      <w:bookmarkStart w:id="35" w:name="_Toc228280442"/>
+      <w:bookmarkStart w:id="35" w:name="_Toc228286735"/>
       <w:r>
         <w:rPr>
           <w:rFonts w:eastAsia="黑体"/>
@@ -16283,7 +16471,7 @@
                 <w:sz w:val="20"/>
                 <w:szCs w:val="20"/>
               </w:rPr>
-              <w:t>[1, 5, 8400]</w:t>
+              <w:t>1×5×8400</w:t>
             </w:r>
           </w:p>
         </w:tc>
@@ -16345,7 +16533,19 @@
         <w:rPr>
           <w:szCs w:val="24"/>
         </w:rPr>
-        <w:t xml:space="preserve"> [1, 5, 8400] </w:t>
+        <w:t xml:space="preserve"> </w:t>
+      </w:r>
+      <w:r>
+        <w:rPr>
+          <w:szCs w:val="24"/>
+        </w:rPr>
+        <w:t>1×5×8400</w:t>
+      </w:r>
+      <w:r>
+        <w:rPr>
+          <w:szCs w:val="24"/>
+        </w:rPr>
+        <w:t xml:space="preserve"> </w:t>
       </w:r>
       <w:r>
         <w:rPr>
@@ -16383,7 +16583,7 @@
         <w:spacing w:before="240" w:after="120" w:line="360" w:lineRule="auto"/>
         <w:outlineLvl w:val="1"/>
       </w:pPr>
-      <w:bookmarkStart w:id="36" w:name="_Toc228280443"/>
+      <w:bookmarkStart w:id="36" w:name="_Toc228286736"/>
       <w:r>
         <w:rPr>
           <w:rFonts w:eastAsia="黑体"/>
@@ -17614,10 +17814,84 @@
     </w:p>
     <w:p>
       <w:pPr>
+        <w:spacing w:before="240" w:after="120"/>
+        <w:ind w:firstLine="420"/>
+        <w:jc w:val="left"/>
+        <w:rPr>
+          <w:rFonts w:cs="Times New Roman"/>
+          <w:szCs w:val="28"/>
+        </w:rPr>
+      </w:pPr>
+      <w:r>
+        <w:rPr>
+          <w:rFonts w:cs="Times New Roman" w:hint="eastAsia"/>
+          <w:szCs w:val="28"/>
+        </w:rPr>
+        <w:t>需要说明的是，本文将</w:t>
+      </w:r>
+      <w:r>
+        <w:rPr>
+          <w:rFonts w:cs="Times New Roman" w:hint="eastAsia"/>
+          <w:szCs w:val="28"/>
+        </w:rPr>
+        <w:t>RKNN</w:t>
+      </w:r>
+      <w:r>
+        <w:rPr>
+          <w:rFonts w:cs="Times New Roman" w:hint="eastAsia"/>
+          <w:szCs w:val="28"/>
+        </w:rPr>
+        <w:t>推理封装为相对独立的模块。固定视频检测程序和实时</w:t>
+      </w:r>
+      <w:r>
+        <w:rPr>
+          <w:rFonts w:cs="Times New Roman" w:hint="eastAsia"/>
+          <w:szCs w:val="28"/>
+        </w:rPr>
+        <w:t>RTSP</w:t>
+      </w:r>
+      <w:r>
+        <w:rPr>
+          <w:rFonts w:cs="Times New Roman" w:hint="eastAsia"/>
+          <w:szCs w:val="28"/>
+        </w:rPr>
+        <w:t>检测程序通过</w:t>
+      </w:r>
+      <w:r>
+        <w:rPr>
+          <w:rFonts w:cs="Times New Roman" w:hint="eastAsia"/>
+          <w:szCs w:val="28"/>
+        </w:rPr>
+        <w:t>CMake</w:t>
+      </w:r>
+      <w:r>
+        <w:rPr>
+          <w:rFonts w:cs="Times New Roman" w:hint="eastAsia"/>
+          <w:szCs w:val="28"/>
+        </w:rPr>
+        <w:t>复用同一份</w:t>
+      </w:r>
+      <w:r>
+        <w:rPr>
+          <w:rFonts w:cs="Times New Roman" w:hint="eastAsia"/>
+          <w:szCs w:val="28"/>
+        </w:rPr>
+        <w:t>yolo_rknn.cpp/yolo_rknn.h</w:t>
+      </w:r>
+      <w:r>
+        <w:rPr>
+          <w:rFonts w:cs="Times New Roman" w:hint="eastAsia"/>
+          <w:szCs w:val="28"/>
+        </w:rPr>
+        <w:t>源文件，从而保证模型加载、输入预处理、输出解析和后处理逻辑一致。</w:t>
+      </w:r>
+    </w:p>
+    <w:p>
+      <w:pPr>
         <w:spacing w:before="240" w:after="120" w:line="360" w:lineRule="auto"/>
         <w:outlineLvl w:val="1"/>
       </w:pPr>
-      <w:bookmarkStart w:id="37" w:name="_Toc228280444"/>
+      <w:bookmarkStart w:id="37" w:name="_Toc228286737"/>
       <w:r>
         <w:rPr>
           <w:rFonts w:eastAsia="黑体"/>
@@ -17811,6 +18085,7 @@
                 <w:sz w:val="20"/>
                 <w:szCs w:val="20"/>
               </w:rPr>
+              <w:lastRenderedPageBreak/>
               <w:t>./rk_yolo_video &lt;input_video&gt; &lt;output_video&gt; [model_path] [score_thresh] [nms_thresh] [detections_csv] [roi_jsonl]</w:t>
             </w:r>
           </w:p>
@@ -17867,7 +18142,6 @@
         <w:rPr>
           <w:szCs w:val="24"/>
         </w:rPr>
-        <w:lastRenderedPageBreak/>
         <w:t>为</w:t>
       </w:r>
       <w:r>
@@ -18111,7 +18385,7 @@
         <w:spacing w:before="240" w:after="120" w:line="360" w:lineRule="auto"/>
         <w:outlineLvl w:val="1"/>
       </w:pPr>
-      <w:bookmarkStart w:id="38" w:name="_Toc228280445"/>
+      <w:bookmarkStart w:id="38" w:name="_Toc228286738"/>
       <w:r>
         <w:rPr>
           <w:rFonts w:eastAsia="黑体"/>
@@ -18919,7 +19193,7 @@
         <w:spacing w:before="240" w:after="120" w:line="360" w:lineRule="auto"/>
         <w:outlineLvl w:val="1"/>
       </w:pPr>
-      <w:bookmarkStart w:id="39" w:name="_Toc228280446"/>
+      <w:bookmarkStart w:id="39" w:name="_Toc228286739"/>
       <w:r>
         <w:rPr>
           <w:rFonts w:eastAsia="黑体"/>
@@ -20367,7 +20641,7 @@
         <w:spacing w:before="240" w:after="120" w:line="360" w:lineRule="auto"/>
         <w:outlineLvl w:val="1"/>
       </w:pPr>
-      <w:bookmarkStart w:id="40" w:name="_Toc228280447"/>
+      <w:bookmarkStart w:id="40" w:name="_Toc228286740"/>
       <w:r>
         <w:rPr>
           <w:rFonts w:eastAsia="黑体"/>
@@ -21505,7 +21779,7 @@
         <w:spacing w:before="240" w:after="120" w:line="360" w:lineRule="auto"/>
         <w:outlineLvl w:val="1"/>
       </w:pPr>
-      <w:bookmarkStart w:id="41" w:name="_Toc228280448"/>
+      <w:bookmarkStart w:id="41" w:name="_Toc228286741"/>
       <w:r>
         <w:rPr>
           <w:rFonts w:eastAsia="黑体"/>
@@ -21977,7 +22251,7 @@
         <w:spacing w:before="240" w:after="120" w:line="360" w:lineRule="auto"/>
         <w:outlineLvl w:val="1"/>
       </w:pPr>
-      <w:bookmarkStart w:id="42" w:name="_Toc228280449"/>
+      <w:bookmarkStart w:id="42" w:name="_Toc228286742"/>
       <w:r>
         <w:rPr>
           <w:rFonts w:eastAsia="黑体"/>
@@ -22298,7 +22572,7 @@
         <w:jc w:val="center"/>
         <w:outlineLvl w:val="0"/>
       </w:pPr>
-      <w:bookmarkStart w:id="43" w:name="_Toc228280450"/>
+      <w:bookmarkStart w:id="43" w:name="_Toc228286743"/>
       <w:r>
         <w:rPr>
           <w:rFonts w:eastAsia="黑体"/>
@@ -22454,7 +22728,7 @@
         <w:spacing w:before="240" w:after="120" w:line="360" w:lineRule="auto"/>
         <w:outlineLvl w:val="1"/>
       </w:pPr>
-      <w:bookmarkStart w:id="44" w:name="_Toc228280451"/>
+      <w:bookmarkStart w:id="44" w:name="_Toc228286744"/>
       <w:r>
         <w:rPr>
           <w:rFonts w:eastAsia="黑体"/>
@@ -24518,10 +24792,154 @@
     </w:p>
     <w:p>
       <w:pPr>
+        <w:spacing w:before="240" w:after="120"/>
+        <w:ind w:firstLine="420"/>
+        <w:jc w:val="left"/>
+        <w:rPr>
+          <w:rFonts w:cs="Times New Roman"/>
+          <w:szCs w:val="28"/>
+        </w:rPr>
+      </w:pPr>
+      <w:r>
+        <w:rPr>
+          <w:rFonts w:cs="Times New Roman" w:hint="eastAsia"/>
+          <w:szCs w:val="28"/>
+        </w:rPr>
+        <w:t>为保证实验结果具有可比性，本章实时</w:t>
+      </w:r>
+      <w:r>
+        <w:rPr>
+          <w:rFonts w:cs="Times New Roman" w:hint="eastAsia"/>
+          <w:szCs w:val="28"/>
+        </w:rPr>
+        <w:t>RTSP</w:t>
+      </w:r>
+      <w:r>
+        <w:rPr>
+          <w:rFonts w:cs="Times New Roman" w:hint="eastAsia"/>
+          <w:szCs w:val="28"/>
+        </w:rPr>
+        <w:t>实验均在同一块</w:t>
+      </w:r>
+      <w:r>
+        <w:rPr>
+          <w:rFonts w:cs="Times New Roman" w:hint="eastAsia"/>
+          <w:szCs w:val="28"/>
+        </w:rPr>
+        <w:t>RK3588</w:t>
+      </w:r>
+      <w:r>
+        <w:rPr>
+          <w:rFonts w:cs="Times New Roman" w:hint="eastAsia"/>
+          <w:szCs w:val="28"/>
+        </w:rPr>
+        <w:t>开发板和同一套</w:t>
+      </w:r>
+      <w:r>
+        <w:rPr>
+          <w:rFonts w:cs="Times New Roman" w:hint="eastAsia"/>
+          <w:szCs w:val="28"/>
+        </w:rPr>
+        <w:t>FP RKNN</w:t>
+      </w:r>
+      <w:r>
+        <w:rPr>
+          <w:rFonts w:cs="Times New Roman" w:hint="eastAsia"/>
+          <w:szCs w:val="28"/>
+        </w:rPr>
+        <w:t>模型上完成。每组配置在</w:t>
+      </w:r>
+      <w:r>
+        <w:rPr>
+          <w:rFonts w:cs="Times New Roman" w:hint="eastAsia"/>
+          <w:szCs w:val="28"/>
+        </w:rPr>
+        <w:t>RTSP</w:t>
+      </w:r>
+      <w:r>
+        <w:rPr>
+          <w:rFonts w:cs="Times New Roman" w:hint="eastAsia"/>
+          <w:szCs w:val="28"/>
+        </w:rPr>
+        <w:t>客户端连接稳定后持续运行不少于</w:t>
+      </w:r>
+      <w:r>
+        <w:rPr>
+          <w:rFonts w:cs="Times New Roman" w:hint="eastAsia"/>
+          <w:szCs w:val="28"/>
+        </w:rPr>
+        <w:t>60 s</w:t>
+      </w:r>
+      <w:r>
+        <w:rPr>
+          <w:rFonts w:cs="Times New Roman" w:hint="eastAsia"/>
+          <w:szCs w:val="28"/>
+        </w:rPr>
+        <w:t>，统计时排除启动初期约</w:t>
+      </w:r>
+      <w:r>
+        <w:rPr>
+          <w:rFonts w:cs="Times New Roman" w:hint="eastAsia"/>
+          <w:szCs w:val="28"/>
+        </w:rPr>
+        <w:t>5 s</w:t>
+      </w:r>
+      <w:r>
+        <w:rPr>
+          <w:rFonts w:cs="Times New Roman" w:hint="eastAsia"/>
+          <w:szCs w:val="28"/>
+        </w:rPr>
+        <w:t>的初始化波动；</w:t>
+      </w:r>
+      <w:r>
+        <w:rPr>
+          <w:rFonts w:cs="Times New Roman" w:hint="eastAsia"/>
+          <w:szCs w:val="28"/>
+        </w:rPr>
+        <w:t>stream_fps</w:t>
+      </w:r>
+      <w:r>
+        <w:rPr>
+          <w:rFonts w:cs="Times New Roman" w:hint="eastAsia"/>
+          <w:szCs w:val="28"/>
+        </w:rPr>
+        <w:t>和</w:t>
+      </w:r>
+      <w:r>
+        <w:rPr>
+          <w:rFonts w:cs="Times New Roman" w:hint="eastAsia"/>
+          <w:szCs w:val="28"/>
+        </w:rPr>
+        <w:t>npu_fps</w:t>
+      </w:r>
+      <w:r>
+        <w:rPr>
+          <w:rFonts w:cs="Times New Roman" w:hint="eastAsia"/>
+          <w:szCs w:val="28"/>
+        </w:rPr>
+        <w:t>由程序按固定时间窗口周期性统计，端到端延迟由采集时间戳与发布</w:t>
+      </w:r>
+      <w:r>
+        <w:rPr>
+          <w:rFonts w:cs="Times New Roman" w:hint="eastAsia"/>
+          <w:szCs w:val="28"/>
+        </w:rPr>
+        <w:t>/</w:t>
+      </w:r>
+      <w:r>
+        <w:rPr>
+          <w:rFonts w:cs="Times New Roman" w:hint="eastAsia"/>
+          <w:szCs w:val="28"/>
+        </w:rPr>
+        <w:t>绘制时间戳之差得到。固定视频实验则使用相同输入视频和相同阈值重复运行，以便比较不同策略下的输出结果和日志数据。</w:t>
+      </w:r>
+    </w:p>
+    <w:p>
+      <w:pPr>
         <w:spacing w:before="240" w:after="120" w:line="360" w:lineRule="auto"/>
         <w:outlineLvl w:val="1"/>
       </w:pPr>
-      <w:bookmarkStart w:id="45" w:name="_Toc228280452"/>
+      <w:bookmarkStart w:id="45" w:name="_Toc228286745"/>
       <w:r>
         <w:rPr>
           <w:rFonts w:eastAsia="黑体"/>
@@ -24671,7 +25089,97 @@
         <w:rPr>
           <w:szCs w:val="24"/>
         </w:rPr>
+        <w:lastRenderedPageBreak/>
         <w:t>模型。</w:t>
+      </w:r>
+    </w:p>
+    <w:p>
+      <w:pPr>
+        <w:keepNext/>
+        <w:spacing w:before="120" w:after="60"/>
+        <w:ind w:firstLine="420"/>
+        <w:jc w:val="left"/>
+        <w:rPr>
+          <w:rFonts w:cs="Times New Roman"/>
+          <w:szCs w:val="21"/>
+        </w:rPr>
+      </w:pPr>
+      <w:r>
+        <w:rPr>
+          <w:rFonts w:cs="Times New Roman" w:hint="eastAsia"/>
+          <w:szCs w:val="21"/>
+        </w:rPr>
+        <w:t>训练脚本中保留</w:t>
+      </w:r>
+      <w:r>
+        <w:rPr>
+          <w:rFonts w:cs="Times New Roman" w:hint="eastAsia"/>
+          <w:szCs w:val="21"/>
+        </w:rPr>
+        <w:t>epochs=100</w:t>
+      </w:r>
+      <w:r>
+        <w:rPr>
+          <w:rFonts w:cs="Times New Roman" w:hint="eastAsia"/>
+          <w:szCs w:val="21"/>
+        </w:rPr>
+        <w:t>和</w:t>
+      </w:r>
+      <w:r>
+        <w:rPr>
+          <w:rFonts w:cs="Times New Roman" w:hint="eastAsia"/>
+          <w:szCs w:val="21"/>
+        </w:rPr>
+        <w:t>patience=20</w:t>
+      </w:r>
+      <w:r>
+        <w:rPr>
+          <w:rFonts w:cs="Times New Roman" w:hint="eastAsia"/>
+          <w:szCs w:val="21"/>
+        </w:rPr>
+        <w:t>等配置项，用于支持更长训练和</w:t>
+      </w:r>
+      <w:r>
+        <w:rPr>
+          <w:rFonts w:cs="Times New Roman" w:hint="eastAsia"/>
+          <w:szCs w:val="21"/>
+        </w:rPr>
+        <w:t>early stopping</w:t>
+      </w:r>
+      <w:r>
+        <w:rPr>
+          <w:rFonts w:cs="Times New Roman" w:hint="eastAsia"/>
+          <w:szCs w:val="21"/>
+        </w:rPr>
+        <w:t>策略；本文报告的模型来自实际保存的</w:t>
+      </w:r>
+      <w:r>
+        <w:rPr>
+          <w:rFonts w:cs="Times New Roman" w:hint="eastAsia"/>
+          <w:szCs w:val="21"/>
+        </w:rPr>
+        <w:t>50 epoch</w:t>
+      </w:r>
+      <w:r>
+        <w:rPr>
+          <w:rFonts w:cs="Times New Roman" w:hint="eastAsia"/>
+          <w:szCs w:val="21"/>
+        </w:rPr>
+        <w:t>训练结果，因此论文中按最终有效训练轮数记录为</w:t>
+      </w:r>
+      <w:r>
+        <w:rPr>
+          <w:rFonts w:cs="Times New Roman" w:hint="eastAsia"/>
+          <w:szCs w:val="21"/>
+        </w:rPr>
+        <w:t>50 epoch</w:t>
+      </w:r>
+      <w:r>
+        <w:rPr>
+          <w:rFonts w:cs="Times New Roman" w:hint="eastAsia"/>
+          <w:szCs w:val="21"/>
+        </w:rPr>
+        <w:t>。</w:t>
       </w:r>
     </w:p>
     <w:p>
@@ -25298,7 +25806,7 @@
         <w:spacing w:before="240" w:after="120" w:line="360" w:lineRule="auto"/>
         <w:outlineLvl w:val="1"/>
       </w:pPr>
-      <w:bookmarkStart w:id="46" w:name="_Toc228280453"/>
+      <w:bookmarkStart w:id="46" w:name="_Toc228286746"/>
       <w:r>
         <w:rPr>
           <w:rFonts w:eastAsia="黑体"/>
@@ -25520,7 +26028,13 @@
         <w:rPr>
           <w:szCs w:val="24"/>
         </w:rPr>
-        <w:t xml:space="preserve"> [1, 5, 8400]</w:t>
+        <w:t xml:space="preserve"> </w:t>
+      </w:r>
+      <w:r>
+        <w:rPr>
+          <w:szCs w:val="24"/>
+        </w:rPr>
+        <w:t>1×5×8400</w:t>
       </w:r>
       <w:r>
         <w:rPr>
@@ -26195,7 +26709,7 @@
         <w:spacing w:before="240" w:after="120" w:line="360" w:lineRule="auto"/>
         <w:outlineLvl w:val="1"/>
       </w:pPr>
-      <w:bookmarkStart w:id="47" w:name="_Toc228280454"/>
+      <w:bookmarkStart w:id="47" w:name="_Toc228286747"/>
       <w:r>
         <w:rPr>
           <w:rFonts w:eastAsia="黑体"/>
@@ -27180,7 +27694,7 @@
                 <w:sz w:val="18"/>
                 <w:szCs w:val="18"/>
               </w:rPr>
-              <w:t>0.00 ms</w:t>
+              <w:t>N/A</w:t>
             </w:r>
           </w:p>
         </w:tc>
@@ -27305,7 +27819,7 @@
         <w:rPr>
           <w:szCs w:val="24"/>
         </w:rPr>
-        <w:t>0.00 ms</w:t>
+        <w:t>N/A</w:t>
       </w:r>
       <w:r>
         <w:rPr>
@@ -27403,7 +27917,7 @@
         <w:spacing w:before="240" w:after="120" w:line="360" w:lineRule="auto"/>
         <w:outlineLvl w:val="1"/>
       </w:pPr>
-      <w:bookmarkStart w:id="48" w:name="_Toc228280455"/>
+      <w:bookmarkStart w:id="48" w:name="_Toc228286748"/>
       <w:r>
         <w:rPr>
           <w:rFonts w:eastAsia="黑体"/>
@@ -29654,7 +30168,7 @@
         <w:spacing w:before="240" w:after="120" w:line="360" w:lineRule="auto"/>
         <w:outlineLvl w:val="1"/>
       </w:pPr>
-      <w:bookmarkStart w:id="49" w:name="_Toc228280456"/>
+      <w:bookmarkStart w:id="49" w:name="_Toc228286749"/>
       <w:r>
         <w:rPr>
           <w:rFonts w:eastAsia="黑体"/>
@@ -31584,7 +32098,7 @@
         <w:spacing w:before="240" w:after="120" w:line="360" w:lineRule="auto"/>
         <w:outlineLvl w:val="1"/>
       </w:pPr>
-      <w:bookmarkStart w:id="50" w:name="_Toc228280457"/>
+      <w:bookmarkStart w:id="50" w:name="_Toc228286750"/>
       <w:r>
         <w:rPr>
           <w:rFonts w:eastAsia="黑体"/>
@@ -33045,7 +33559,7 @@
         <w:spacing w:before="240" w:after="120" w:line="360" w:lineRule="auto"/>
         <w:outlineLvl w:val="1"/>
       </w:pPr>
-      <w:bookmarkStart w:id="51" w:name="_Toc228280458"/>
+      <w:bookmarkStart w:id="51" w:name="_Toc228286751"/>
       <w:r>
         <w:rPr>
           <w:rFonts w:eastAsia="黑体"/>
@@ -34129,7 +34643,7 @@
         <w:spacing w:before="240" w:after="120" w:line="360" w:lineRule="auto"/>
         <w:outlineLvl w:val="1"/>
       </w:pPr>
-      <w:bookmarkStart w:id="52" w:name="_Toc228280459"/>
+      <w:bookmarkStart w:id="52" w:name="_Toc228286752"/>
       <w:r>
         <w:rPr>
           <w:rFonts w:eastAsia="黑体"/>
@@ -35098,6 +35612,107 @@
     </w:p>
     <w:p>
       <w:pPr>
+        <w:ind w:firstLine="420"/>
+        <w:jc w:val="left"/>
+        <w:rPr>
+          <w:rFonts w:cs="Times New Roman"/>
+          <w:szCs w:val="24"/>
+        </w:rPr>
+      </w:pPr>
+      <w:r>
+        <w:rPr>
+          <w:rFonts w:cs="Times New Roman" w:hint="eastAsia"/>
+          <w:szCs w:val="24"/>
+        </w:rPr>
+        <w:t>表</w:t>
+      </w:r>
+      <w:r>
+        <w:rPr>
+          <w:rFonts w:cs="Times New Roman" w:hint="eastAsia"/>
+          <w:szCs w:val="24"/>
+        </w:rPr>
+        <w:t>5.11</w:t>
+      </w:r>
+      <w:r>
+        <w:rPr>
+          <w:rFonts w:cs="Times New Roman" w:hint="eastAsia"/>
+          <w:szCs w:val="24"/>
+        </w:rPr>
+        <w:t>中的推荐配置基于</w:t>
+      </w:r>
+      <w:r>
+        <w:rPr>
+          <w:rFonts w:cs="Times New Roman" w:hint="eastAsia"/>
+          <w:szCs w:val="24"/>
+        </w:rPr>
+        <w:t>RK3588</w:t>
+      </w:r>
+      <w:r>
+        <w:rPr>
+          <w:rFonts w:cs="Times New Roman" w:hint="eastAsia"/>
+          <w:szCs w:val="24"/>
+        </w:rPr>
+        <w:t>开发板、</w:t>
+      </w:r>
+      <w:r>
+        <w:rPr>
+          <w:rFonts w:cs="Times New Roman" w:hint="eastAsia"/>
+          <w:szCs w:val="24"/>
+        </w:rPr>
+        <w:t>USB</w:t>
+      </w:r>
+      <w:r>
+        <w:rPr>
+          <w:rFonts w:cs="Times New Roman" w:hint="eastAsia"/>
+          <w:szCs w:val="24"/>
+        </w:rPr>
+        <w:t>摄像头或公开公开视频输入、</w:t>
+      </w:r>
+      <w:r>
+        <w:rPr>
+          <w:rFonts w:cs="Times New Roman" w:hint="eastAsia"/>
+          <w:szCs w:val="24"/>
+        </w:rPr>
+        <w:t>FP RKNN</w:t>
+      </w:r>
+      <w:r>
+        <w:rPr>
+          <w:rFonts w:cs="Times New Roman" w:hint="eastAsia"/>
+          <w:szCs w:val="24"/>
+        </w:rPr>
+        <w:t>单类无人机模型以及本文当前后处理实现得到。若后续更换为</w:t>
+      </w:r>
+      <w:r>
+        <w:rPr>
+          <w:rFonts w:cs="Times New Roman" w:hint="eastAsia"/>
+          <w:szCs w:val="24"/>
+        </w:rPr>
+        <w:t>INT8</w:t>
+      </w:r>
+      <w:r>
+        <w:rPr>
+          <w:rFonts w:cs="Times New Roman" w:hint="eastAsia"/>
+          <w:szCs w:val="24"/>
+        </w:rPr>
+        <w:t>模型、</w:t>
+      </w:r>
+      <w:r>
+        <w:rPr>
+          <w:rFonts w:cs="Times New Roman" w:hint="eastAsia"/>
+          <w:szCs w:val="24"/>
+        </w:rPr>
+        <w:t>RGA</w:t>
+      </w:r>
+      <w:r>
+        <w:rPr>
+          <w:rFonts w:cs="Times New Roman" w:hint="eastAsia"/>
+          <w:szCs w:val="24"/>
+        </w:rPr>
+        <w:t>硬件预处理路径或不同分辨率输入，推荐参数仍需重新测试。</w:t>
+      </w:r>
+    </w:p>
+    <w:p>
+      <w:pPr>
         <w:spacing w:line="360" w:lineRule="auto"/>
         <w:ind w:firstLine="480"/>
       </w:pPr>
@@ -35161,7 +35776,7 @@
         <w:spacing w:before="240" w:after="120" w:line="360" w:lineRule="auto"/>
         <w:outlineLvl w:val="1"/>
       </w:pPr>
-      <w:bookmarkStart w:id="53" w:name="_Toc228280460"/>
+      <w:bookmarkStart w:id="53" w:name="_Toc228286753"/>
       <w:r>
         <w:rPr>
           <w:rFonts w:eastAsia="黑体"/>
@@ -35169,6 +35784,7 @@
           <w:sz w:val="28"/>
           <w:szCs w:val="28"/>
         </w:rPr>
+        <w:lastRenderedPageBreak/>
         <w:t>5.10</w:t>
       </w:r>
       <w:r>
@@ -35191,7 +35807,6 @@
         <w:rPr>
           <w:szCs w:val="24"/>
         </w:rPr>
-        <w:lastRenderedPageBreak/>
         <w:t>本章围绕</w:t>
       </w:r>
       <w:r>
@@ -35398,7 +36013,7 @@
         <w:jc w:val="center"/>
         <w:outlineLvl w:val="0"/>
       </w:pPr>
-      <w:bookmarkStart w:id="54" w:name="_Toc228280461"/>
+      <w:bookmarkStart w:id="54" w:name="_Toc228286754"/>
       <w:r>
         <w:rPr>
           <w:rFonts w:eastAsia="黑体" w:hint="eastAsia"/>
@@ -35440,7 +36055,7 @@
           <w:szCs w:val="24"/>
         </w:rPr>
       </w:pPr>
-      <w:bookmarkStart w:id="55" w:name="_Toc228280462"/>
+      <w:bookmarkStart w:id="55" w:name="_Toc228286755"/>
       <w:r>
         <w:rPr>
           <w:rFonts w:eastAsia="黑体" w:hint="eastAsia"/>
@@ -35524,7 +36139,13 @@
         <w:rPr>
           <w:szCs w:val="24"/>
         </w:rPr>
-        <w:t xml:space="preserve">C/C++ </w:t>
+        <w:t>C++17</w:t>
+      </w:r>
+      <w:r>
+        <w:rPr>
+          <w:szCs w:val="24"/>
+        </w:rPr>
+        <w:t xml:space="preserve"> </w:t>
       </w:r>
       <w:r>
         <w:rPr>
@@ -35628,7 +36249,7 @@
           <w:szCs w:val="24"/>
         </w:rPr>
       </w:pPr>
-      <w:bookmarkStart w:id="56" w:name="_Toc228280463"/>
+      <w:bookmarkStart w:id="56" w:name="_Toc228286756"/>
       <w:r>
         <w:rPr>
           <w:rFonts w:eastAsia="黑体" w:hint="eastAsia"/>
@@ -35781,11 +36402,156 @@
     </w:p>
     <w:p>
       <w:pPr>
+        <w:spacing w:before="240" w:after="240"/>
+        <w:ind w:firstLine="420"/>
+        <w:jc w:val="left"/>
+        <w:rPr>
+          <w:rFonts w:cs="Times New Roman"/>
+          <w:szCs w:val="36"/>
+        </w:rPr>
+      </w:pPr>
+      <w:r>
+        <w:rPr>
+          <w:rFonts w:cs="Times New Roman" w:hint="eastAsia"/>
+          <w:szCs w:val="36"/>
+        </w:rPr>
+        <w:lastRenderedPageBreak/>
+        <w:t>与任务书和开题阶段的初始设想相比，本文实际实施过程中对研究重点进行了收敛。由于无人机专用模型在</w:t>
+      </w:r>
+      <w:r>
+        <w:rPr>
+          <w:rFonts w:cs="Times New Roman" w:hint="eastAsia"/>
+          <w:szCs w:val="36"/>
+        </w:rPr>
+        <w:t>RK3588</w:t>
+      </w:r>
+      <w:r>
+        <w:rPr>
+          <w:rFonts w:cs="Times New Roman" w:hint="eastAsia"/>
+          <w:szCs w:val="36"/>
+        </w:rPr>
+        <w:t>板端适配过程中出现过输出张量不匹配和</w:t>
+      </w:r>
+      <w:r>
+        <w:rPr>
+          <w:rFonts w:cs="Times New Roman" w:hint="eastAsia"/>
+          <w:szCs w:val="36"/>
+        </w:rPr>
+        <w:t>rknn_run</w:t>
+      </w:r>
+      <w:r>
+        <w:rPr>
+          <w:rFonts w:cs="Times New Roman" w:hint="eastAsia"/>
+          <w:szCs w:val="36"/>
+        </w:rPr>
+        <w:t>运行异常等问题，模型恢复、后处理适配和实时链路稳定性调试占用了较多周期。因此，本文将可验证主线集中在</w:t>
+      </w:r>
+      <w:r>
+        <w:rPr>
+          <w:rFonts w:cs="Times New Roman" w:hint="eastAsia"/>
+          <w:szCs w:val="36"/>
+        </w:rPr>
+        <w:t>FP RKNN</w:t>
+      </w:r>
+      <w:r>
+        <w:rPr>
+          <w:rFonts w:cs="Times New Roman" w:hint="eastAsia"/>
+          <w:szCs w:val="36"/>
+        </w:rPr>
+        <w:t>模型稳定部署、固定视频与</w:t>
+      </w:r>
+      <w:r>
+        <w:rPr>
+          <w:rFonts w:cs="Times New Roman" w:hint="eastAsia"/>
+          <w:szCs w:val="36"/>
+        </w:rPr>
+        <w:t>RTSP</w:t>
+      </w:r>
+      <w:r>
+        <w:rPr>
+          <w:rFonts w:cs="Times New Roman" w:hint="eastAsia"/>
+          <w:szCs w:val="36"/>
+        </w:rPr>
+        <w:t>实时检测、检测间隔</w:t>
+      </w:r>
+      <w:r>
+        <w:rPr>
+          <w:rFonts w:cs="Times New Roman" w:hint="eastAsia"/>
+          <w:szCs w:val="36"/>
+        </w:rPr>
+        <w:t>/</w:t>
+      </w:r>
+      <w:r>
+        <w:rPr>
+          <w:rFonts w:cs="Times New Roman" w:hint="eastAsia"/>
+          <w:szCs w:val="36"/>
+        </w:rPr>
+        <w:t>框平滑策略以及多</w:t>
+      </w:r>
+      <w:r>
+        <w:rPr>
+          <w:rFonts w:cs="Times New Roman" w:hint="eastAsia"/>
+          <w:szCs w:val="36"/>
+        </w:rPr>
+        <w:t>context NPU</w:t>
+      </w:r>
+      <w:r>
+        <w:rPr>
+          <w:rFonts w:cs="Times New Roman" w:hint="eastAsia"/>
+          <w:szCs w:val="36"/>
+        </w:rPr>
+        <w:t>并行推理实验上。</w:t>
+      </w:r>
+      <w:r>
+        <w:rPr>
+          <w:rFonts w:cs="Times New Roman" w:hint="eastAsia"/>
+          <w:szCs w:val="36"/>
+        </w:rPr>
+        <w:t>INT8</w:t>
+      </w:r>
+      <w:r>
+        <w:rPr>
+          <w:rFonts w:cs="Times New Roman" w:hint="eastAsia"/>
+          <w:szCs w:val="36"/>
+        </w:rPr>
+        <w:t>量化、</w:t>
+      </w:r>
+      <w:r>
+        <w:rPr>
+          <w:rFonts w:cs="Times New Roman" w:hint="eastAsia"/>
+          <w:szCs w:val="36"/>
+        </w:rPr>
+        <w:t>RGA</w:t>
+      </w:r>
+      <w:r>
+        <w:rPr>
+          <w:rFonts w:cs="Times New Roman" w:hint="eastAsia"/>
+          <w:szCs w:val="36"/>
+        </w:rPr>
+        <w:t>硬件预处理和</w:t>
+      </w:r>
+      <w:r>
+        <w:rPr>
+          <w:rFonts w:cs="Times New Roman" w:hint="eastAsia"/>
+          <w:szCs w:val="36"/>
+        </w:rPr>
+        <w:t>GPIO</w:t>
+      </w:r>
+      <w:r>
+        <w:rPr>
+          <w:rFonts w:cs="Times New Roman" w:hint="eastAsia"/>
+          <w:szCs w:val="36"/>
+        </w:rPr>
+        <w:t>闭环控制仍保留为后续拓展方向，而不作为本文已经完成并验证的结果。这样的处理能够保证论文结论与当前代码和实验数据保持一致。</w:t>
+      </w:r>
+    </w:p>
+    <w:p>
+      <w:pPr>
         <w:spacing w:before="240" w:after="240" w:line="360" w:lineRule="auto"/>
         <w:jc w:val="center"/>
         <w:outlineLvl w:val="0"/>
       </w:pPr>
-      <w:bookmarkStart w:id="57" w:name="_Toc228280464"/>
+      <w:bookmarkStart w:id="57" w:name="_Toc228286757"/>
       <w:r>
         <w:rPr>
           <w:rFonts w:eastAsia="黑体"/>
@@ -35793,7 +36559,6 @@
           <w:sz w:val="36"/>
           <w:szCs w:val="36"/>
         </w:rPr>
-        <w:lastRenderedPageBreak/>
         <w:t>参考文献</w:t>
       </w:r>
       <w:bookmarkEnd w:id="57"/>
@@ -36034,26 +36799,36 @@
           <w:sz w:val="21"/>
           <w:szCs w:val="36"/>
         </w:rPr>
-        <w:t>[13] NVIDIA. Jetson Nano Technical Specifications[EB/OL]. [2026-04-28]. https://www.nvidia.com/en-us/autonomous-machines/embedded-systems/jetson-nano/product-development/.</w:t>
-      </w:r>
-    </w:p>
-    <w:p>
-      <w:pPr>
-        <w:spacing w:line="240" w:lineRule="auto"/>
-        <w:jc w:val="left"/>
+        <w:t>[13] NVIDIA. Jetson Nano Technical Specifications[EB/OL]. [2026-04-28]. https://www.nvidia.com/en-us/autonomous-machines/embedded-syste</w:t>
+      </w:r>
+      <w:r>
         <w:rPr>
           <w:rFonts w:cs="Times New Roman"/>
           <w:sz w:val="21"/>
           <w:szCs w:val="36"/>
         </w:rPr>
-      </w:pPr>
-      <w:r>
+        <w:lastRenderedPageBreak/>
+        <w:t>ms/jetson-nano/product-development/.</w:t>
+      </w:r>
+    </w:p>
+    <w:p>
+      <w:pPr>
+        <w:widowControl/>
+        <w:spacing w:line="240" w:lineRule="auto"/>
+        <w:jc w:val="left"/>
         <w:rPr>
           <w:rFonts w:cs="Times New Roman"/>
           <w:sz w:val="21"/>
           <w:szCs w:val="36"/>
         </w:rPr>
-        <w:t>[14] NVIDIA. Jetson Orin Nano Super Developer Kit Specifications[EB/OL]. [2026-04-28]. https://www.nvidia.com/en-us/autonomous-machines/embedded-systems/jetson-orin/nano-super-developer-kit/.</w:t>
+      </w:pPr>
+      <w:r>
+        <w:rPr>
+          <w:rFonts w:cs="Times New Roman"/>
+          <w:sz w:val="21"/>
+          <w:szCs w:val="36"/>
+        </w:rPr>
+        <w:t>[14] NVIDIA. Jetson[EB/OL]. [2026-04-28]. https://developer.nvidia.com/jetson.</w:t>
       </w:r>
     </w:p>
     <w:p>
@@ -36062,7 +36837,7 @@
         <w:jc w:val="center"/>
         <w:outlineLvl w:val="0"/>
       </w:pPr>
-      <w:bookmarkStart w:id="58" w:name="_Toc228280465"/>
+      <w:bookmarkStart w:id="58" w:name="_Toc228286758"/>
       <w:r>
         <w:rPr>
           <w:rFonts w:eastAsia="黑体"/>
@@ -36070,6 +36845,7 @@
           <w:sz w:val="36"/>
           <w:szCs w:val="36"/>
         </w:rPr>
+        <w:lastRenderedPageBreak/>
         <w:t>致谢</w:t>
       </w:r>
       <w:bookmarkEnd w:id="58"/>
@@ -36119,7 +36895,6 @@
         <w:rPr>
           <w:szCs w:val="24"/>
         </w:rPr>
-        <w:lastRenderedPageBreak/>
         <w:t>同时，感谢同学和实验环境提供者在模型、数据、开发板调试和测试场景方面给予的支持。本文所涉及的模型转换、板端部署、实时视频推流和公开数据验证经历了多轮调试，相关讨论和协助对系统最终完成稳定运行具有重要帮助。</w:t>
       </w:r>
     </w:p>

</xml_diff>

<commit_message>
Update thesis chapter 5 hardware results
</commit_message>
<xml_diff>
--- a/Thesis Project/paper/full_thesis_latest_merged.docx
+++ b/Thesis Project/paper/full_thesis_latest_merged.docx
@@ -1595,7 +1595,7 @@
         </w:rPr>
         <w:fldChar w:fldCharType="separate"/>
       </w:r>
-      <w:hyperlink w:anchor="_Toc228286700" w:history="1">
+      <w:hyperlink w:anchor="_Toc228306621" w:history="1">
         <w:r>
           <w:rPr>
             <w:rStyle w:val="af3"/>
@@ -1636,7 +1636,7 @@
             <w:noProof/>
             <w:webHidden/>
           </w:rPr>
-          <w:instrText xml:space="preserve"> PAGEREF _Toc228286700 \h </w:instrText>
+          <w:instrText xml:space="preserve"> PAGEREF _Toc228306621 \h </w:instrText>
         </w:r>
         <w:r>
           <w:rPr>
@@ -1679,7 +1679,7 @@
           <w14:ligatures w14:val="standardContextual"/>
         </w:rPr>
       </w:pPr>
-      <w:hyperlink w:anchor="_Toc228286701" w:history="1">
+      <w:hyperlink w:anchor="_Toc228306622" w:history="1">
         <w:r>
           <w:rPr>
             <w:rStyle w:val="af3"/>
@@ -1717,7 +1717,7 @@
             <w:noProof/>
             <w:webHidden/>
           </w:rPr>
-          <w:instrText xml:space="preserve"> PAGEREF _Toc228286701 \h </w:instrText>
+          <w:instrText xml:space="preserve"> PAGEREF _Toc228306622 \h </w:instrText>
         </w:r>
         <w:r>
           <w:rPr>
@@ -1760,7 +1760,7 @@
           <w14:ligatures w14:val="standardContextual"/>
         </w:rPr>
       </w:pPr>
-      <w:hyperlink w:anchor="_Toc228286702" w:history="1">
+      <w:hyperlink w:anchor="_Toc228306623" w:history="1">
         <w:r>
           <w:rPr>
             <w:rStyle w:val="af3"/>
@@ -1798,7 +1798,7 @@
             <w:noProof/>
             <w:webHidden/>
           </w:rPr>
-          <w:instrText xml:space="preserve"> PAGEREF _Toc228286702 \h </w:instrText>
+          <w:instrText xml:space="preserve"> PAGEREF _Toc228306623 \h </w:instrText>
         </w:r>
         <w:r>
           <w:rPr>
@@ -1841,7 +1841,7 @@
           <w14:ligatures w14:val="standardContextual"/>
         </w:rPr>
       </w:pPr>
-      <w:hyperlink w:anchor="_Toc228286703" w:history="1">
+      <w:hyperlink w:anchor="_Toc228306624" w:history="1">
         <w:r>
           <w:rPr>
             <w:rStyle w:val="af3"/>
@@ -1879,7 +1879,7 @@
             <w:noProof/>
             <w:webHidden/>
           </w:rPr>
-          <w:instrText xml:space="preserve"> PAGEREF _Toc228286703 \h </w:instrText>
+          <w:instrText xml:space="preserve"> PAGEREF _Toc228306624 \h </w:instrText>
         </w:r>
         <w:r>
           <w:rPr>
@@ -1922,7 +1922,7 @@
           <w14:ligatures w14:val="standardContextual"/>
         </w:rPr>
       </w:pPr>
-      <w:hyperlink w:anchor="_Toc228286704" w:history="1">
+      <w:hyperlink w:anchor="_Toc228306625" w:history="1">
         <w:r>
           <w:rPr>
             <w:rStyle w:val="af3"/>
@@ -1960,7 +1960,7 @@
             <w:noProof/>
             <w:webHidden/>
           </w:rPr>
-          <w:instrText xml:space="preserve"> PAGEREF _Toc228286704 \h </w:instrText>
+          <w:instrText xml:space="preserve"> PAGEREF _Toc228306625 \h </w:instrText>
         </w:r>
         <w:r>
           <w:rPr>
@@ -2003,7 +2003,7 @@
           <w14:ligatures w14:val="standardContextual"/>
         </w:rPr>
       </w:pPr>
-      <w:hyperlink w:anchor="_Toc228286705" w:history="1">
+      <w:hyperlink w:anchor="_Toc228306626" w:history="1">
         <w:r>
           <w:rPr>
             <w:rStyle w:val="af3"/>
@@ -2047,7 +2047,7 @@
             <w:noProof/>
             <w:webHidden/>
           </w:rPr>
-          <w:instrText xml:space="preserve"> PAGEREF _Toc228286705 \h </w:instrText>
+          <w:instrText xml:space="preserve"> PAGEREF _Toc228306626 \h </w:instrText>
         </w:r>
         <w:r>
           <w:rPr>
@@ -2090,7 +2090,7 @@
           <w14:ligatures w14:val="standardContextual"/>
         </w:rPr>
       </w:pPr>
-      <w:hyperlink w:anchor="_Toc228286706" w:history="1">
+      <w:hyperlink w:anchor="_Toc228306627" w:history="1">
         <w:r>
           <w:rPr>
             <w:rStyle w:val="af3"/>
@@ -2128,7 +2128,7 @@
             <w:noProof/>
             <w:webHidden/>
           </w:rPr>
-          <w:instrText xml:space="preserve"> PAGEREF _Toc228286706 \h </w:instrText>
+          <w:instrText xml:space="preserve"> PAGEREF _Toc228306627 \h </w:instrText>
         </w:r>
         <w:r>
           <w:rPr>
@@ -2171,7 +2171,7 @@
           <w14:ligatures w14:val="standardContextual"/>
         </w:rPr>
       </w:pPr>
-      <w:hyperlink w:anchor="_Toc228286707" w:history="1">
+      <w:hyperlink w:anchor="_Toc228306628" w:history="1">
         <w:r>
           <w:rPr>
             <w:rStyle w:val="af3"/>
@@ -2209,7 +2209,7 @@
             <w:noProof/>
             <w:webHidden/>
           </w:rPr>
-          <w:instrText xml:space="preserve"> PAGEREF _Toc228286707 \h </w:instrText>
+          <w:instrText xml:space="preserve"> PAGEREF _Toc228306628 \h </w:instrText>
         </w:r>
         <w:r>
           <w:rPr>
@@ -2252,7 +2252,7 @@
           <w14:ligatures w14:val="standardContextual"/>
         </w:rPr>
       </w:pPr>
-      <w:hyperlink w:anchor="_Toc228286708" w:history="1">
+      <w:hyperlink w:anchor="_Toc228306629" w:history="1">
         <w:r>
           <w:rPr>
             <w:rStyle w:val="af3"/>
@@ -2290,7 +2290,7 @@
             <w:noProof/>
             <w:webHidden/>
           </w:rPr>
-          <w:instrText xml:space="preserve"> PAGEREF _Toc228286708 \h </w:instrText>
+          <w:instrText xml:space="preserve"> PAGEREF _Toc228306629 \h </w:instrText>
         </w:r>
         <w:r>
           <w:rPr>
@@ -2333,7 +2333,7 @@
           <w14:ligatures w14:val="standardContextual"/>
         </w:rPr>
       </w:pPr>
-      <w:hyperlink w:anchor="_Toc228286709" w:history="1">
+      <w:hyperlink w:anchor="_Toc228306630" w:history="1">
         <w:r>
           <w:rPr>
             <w:rStyle w:val="af3"/>
@@ -2371,7 +2371,7 @@
             <w:noProof/>
             <w:webHidden/>
           </w:rPr>
-          <w:instrText xml:space="preserve"> PAGEREF _Toc228286709 \h </w:instrText>
+          <w:instrText xml:space="preserve"> PAGEREF _Toc228306630 \h </w:instrText>
         </w:r>
         <w:r>
           <w:rPr>
@@ -2414,7 +2414,7 @@
           <w14:ligatures w14:val="standardContextual"/>
         </w:rPr>
       </w:pPr>
-      <w:hyperlink w:anchor="_Toc228286710" w:history="1">
+      <w:hyperlink w:anchor="_Toc228306631" w:history="1">
         <w:r>
           <w:rPr>
             <w:rStyle w:val="af3"/>
@@ -2452,7 +2452,7 @@
             <w:noProof/>
             <w:webHidden/>
           </w:rPr>
-          <w:instrText xml:space="preserve"> PAGEREF _Toc228286710 \h </w:instrText>
+          <w:instrText xml:space="preserve"> PAGEREF _Toc228306631 \h </w:instrText>
         </w:r>
         <w:r>
           <w:rPr>
@@ -2495,7 +2495,7 @@
           <w14:ligatures w14:val="standardContextual"/>
         </w:rPr>
       </w:pPr>
-      <w:hyperlink w:anchor="_Toc228286711" w:history="1">
+      <w:hyperlink w:anchor="_Toc228306632" w:history="1">
         <w:r>
           <w:rPr>
             <w:rStyle w:val="af3"/>
@@ -2533,7 +2533,7 @@
             <w:noProof/>
             <w:webHidden/>
           </w:rPr>
-          <w:instrText xml:space="preserve"> PAGEREF _Toc228286711 \h </w:instrText>
+          <w:instrText xml:space="preserve"> PAGEREF _Toc228306632 \h </w:instrText>
         </w:r>
         <w:r>
           <w:rPr>
@@ -2576,7 +2576,7 @@
           <w14:ligatures w14:val="standardContextual"/>
         </w:rPr>
       </w:pPr>
-      <w:hyperlink w:anchor="_Toc228286712" w:history="1">
+      <w:hyperlink w:anchor="_Toc228306633" w:history="1">
         <w:r>
           <w:rPr>
             <w:rStyle w:val="af3"/>
@@ -2620,7 +2620,7 @@
             <w:noProof/>
             <w:webHidden/>
           </w:rPr>
-          <w:instrText xml:space="preserve"> PAGEREF _Toc228286712 \h </w:instrText>
+          <w:instrText xml:space="preserve"> PAGEREF _Toc228306633 \h </w:instrText>
         </w:r>
         <w:r>
           <w:rPr>
@@ -2663,7 +2663,7 @@
           <w14:ligatures w14:val="standardContextual"/>
         </w:rPr>
       </w:pPr>
-      <w:hyperlink w:anchor="_Toc228286713" w:history="1">
+      <w:hyperlink w:anchor="_Toc228306634" w:history="1">
         <w:r>
           <w:rPr>
             <w:rStyle w:val="af3"/>
@@ -2701,7 +2701,7 @@
             <w:noProof/>
             <w:webHidden/>
           </w:rPr>
-          <w:instrText xml:space="preserve"> PAGEREF _Toc228286713 \h </w:instrText>
+          <w:instrText xml:space="preserve"> PAGEREF _Toc228306634 \h </w:instrText>
         </w:r>
         <w:r>
           <w:rPr>
@@ -2743,7 +2743,7 @@
           <w14:ligatures w14:val="standardContextual"/>
         </w:rPr>
       </w:pPr>
-      <w:hyperlink w:anchor="_Toc228286714" w:history="1">
+      <w:hyperlink w:anchor="_Toc228306635" w:history="1">
         <w:r>
           <w:rPr>
             <w:rStyle w:val="af3"/>
@@ -2781,7 +2781,7 @@
             <w:noProof/>
             <w:webHidden/>
           </w:rPr>
-          <w:instrText xml:space="preserve"> PAGEREF _Toc228286714 \h </w:instrText>
+          <w:instrText xml:space="preserve"> PAGEREF _Toc228306635 \h </w:instrText>
         </w:r>
         <w:r>
           <w:rPr>
@@ -2823,7 +2823,7 @@
           <w14:ligatures w14:val="standardContextual"/>
         </w:rPr>
       </w:pPr>
-      <w:hyperlink w:anchor="_Toc228286715" w:history="1">
+      <w:hyperlink w:anchor="_Toc228306636" w:history="1">
         <w:r>
           <w:rPr>
             <w:rStyle w:val="af3"/>
@@ -2861,7 +2861,7 @@
             <w:noProof/>
             <w:webHidden/>
           </w:rPr>
-          <w:instrText xml:space="preserve"> PAGEREF _Toc228286715 \h </w:instrText>
+          <w:instrText xml:space="preserve"> PAGEREF _Toc228306636 \h </w:instrText>
         </w:r>
         <w:r>
           <w:rPr>
@@ -2903,7 +2903,7 @@
           <w14:ligatures w14:val="standardContextual"/>
         </w:rPr>
       </w:pPr>
-      <w:hyperlink w:anchor="_Toc228286716" w:history="1">
+      <w:hyperlink w:anchor="_Toc228306637" w:history="1">
         <w:r>
           <w:rPr>
             <w:rStyle w:val="af3"/>
@@ -2941,7 +2941,7 @@
             <w:noProof/>
             <w:webHidden/>
           </w:rPr>
-          <w:instrText xml:space="preserve"> PAGEREF _Toc228286716 \h </w:instrText>
+          <w:instrText xml:space="preserve"> PAGEREF _Toc228306637 \h </w:instrText>
         </w:r>
         <w:r>
           <w:rPr>
@@ -2984,7 +2984,7 @@
           <w14:ligatures w14:val="standardContextual"/>
         </w:rPr>
       </w:pPr>
-      <w:hyperlink w:anchor="_Toc228286717" w:history="1">
+      <w:hyperlink w:anchor="_Toc228306638" w:history="1">
         <w:r>
           <w:rPr>
             <w:rStyle w:val="af3"/>
@@ -3022,7 +3022,7 @@
             <w:noProof/>
             <w:webHidden/>
           </w:rPr>
-          <w:instrText xml:space="preserve"> PAGEREF _Toc228286717 \h </w:instrText>
+          <w:instrText xml:space="preserve"> PAGEREF _Toc228306638 \h </w:instrText>
         </w:r>
         <w:r>
           <w:rPr>
@@ -3065,7 +3065,7 @@
           <w14:ligatures w14:val="standardContextual"/>
         </w:rPr>
       </w:pPr>
-      <w:hyperlink w:anchor="_Toc228286718" w:history="1">
+      <w:hyperlink w:anchor="_Toc228306639" w:history="1">
         <w:r>
           <w:rPr>
             <w:rStyle w:val="af3"/>
@@ -3103,7 +3103,7 @@
             <w:noProof/>
             <w:webHidden/>
           </w:rPr>
-          <w:instrText xml:space="preserve"> PAGEREF _Toc228286718 \h </w:instrText>
+          <w:instrText xml:space="preserve"> PAGEREF _Toc228306639 \h </w:instrText>
         </w:r>
         <w:r>
           <w:rPr>
@@ -3145,7 +3145,7 @@
           <w14:ligatures w14:val="standardContextual"/>
         </w:rPr>
       </w:pPr>
-      <w:hyperlink w:anchor="_Toc228286719" w:history="1">
+      <w:hyperlink w:anchor="_Toc228306640" w:history="1">
         <w:r>
           <w:rPr>
             <w:rStyle w:val="af3"/>
@@ -3183,7 +3183,7 @@
             <w:noProof/>
             <w:webHidden/>
           </w:rPr>
-          <w:instrText xml:space="preserve"> PAGEREF _Toc228286719 \h </w:instrText>
+          <w:instrText xml:space="preserve"> PAGEREF _Toc228306640 \h </w:instrText>
         </w:r>
         <w:r>
           <w:rPr>
@@ -3225,7 +3225,7 @@
           <w14:ligatures w14:val="standardContextual"/>
         </w:rPr>
       </w:pPr>
-      <w:hyperlink w:anchor="_Toc228286720" w:history="1">
+      <w:hyperlink w:anchor="_Toc228306641" w:history="1">
         <w:r>
           <w:rPr>
             <w:rStyle w:val="af3"/>
@@ -3263,7 +3263,7 @@
             <w:noProof/>
             <w:webHidden/>
           </w:rPr>
-          <w:instrText xml:space="preserve"> PAGEREF _Toc228286720 \h </w:instrText>
+          <w:instrText xml:space="preserve"> PAGEREF _Toc228306641 \h </w:instrText>
         </w:r>
         <w:r>
           <w:rPr>
@@ -3306,7 +3306,7 @@
           <w14:ligatures w14:val="standardContextual"/>
         </w:rPr>
       </w:pPr>
-      <w:hyperlink w:anchor="_Toc228286721" w:history="1">
+      <w:hyperlink w:anchor="_Toc228306642" w:history="1">
         <w:r>
           <w:rPr>
             <w:rStyle w:val="af3"/>
@@ -3344,7 +3344,7 @@
             <w:noProof/>
             <w:webHidden/>
           </w:rPr>
-          <w:instrText xml:space="preserve"> PAGEREF _Toc228286721 \h </w:instrText>
+          <w:instrText xml:space="preserve"> PAGEREF _Toc228306642 \h </w:instrText>
         </w:r>
         <w:r>
           <w:rPr>
@@ -3386,7 +3386,7 @@
           <w14:ligatures w14:val="standardContextual"/>
         </w:rPr>
       </w:pPr>
-      <w:hyperlink w:anchor="_Toc228286722" w:history="1">
+      <w:hyperlink w:anchor="_Toc228306643" w:history="1">
         <w:r>
           <w:rPr>
             <w:rStyle w:val="af3"/>
@@ -3424,7 +3424,7 @@
             <w:noProof/>
             <w:webHidden/>
           </w:rPr>
-          <w:instrText xml:space="preserve"> PAGEREF _Toc228286722 \h </w:instrText>
+          <w:instrText xml:space="preserve"> PAGEREF _Toc228306643 \h </w:instrText>
         </w:r>
         <w:r>
           <w:rPr>
@@ -3466,7 +3466,7 @@
           <w14:ligatures w14:val="standardContextual"/>
         </w:rPr>
       </w:pPr>
-      <w:hyperlink w:anchor="_Toc228286723" w:history="1">
+      <w:hyperlink w:anchor="_Toc228306644" w:history="1">
         <w:r>
           <w:rPr>
             <w:rStyle w:val="af3"/>
@@ -3504,7 +3504,7 @@
             <w:noProof/>
             <w:webHidden/>
           </w:rPr>
-          <w:instrText xml:space="preserve"> PAGEREF _Toc228286723 \h </w:instrText>
+          <w:instrText xml:space="preserve"> PAGEREF _Toc228306644 \h </w:instrText>
         </w:r>
         <w:r>
           <w:rPr>
@@ -3547,7 +3547,7 @@
           <w14:ligatures w14:val="standardContextual"/>
         </w:rPr>
       </w:pPr>
-      <w:hyperlink w:anchor="_Toc228286724" w:history="1">
+      <w:hyperlink w:anchor="_Toc228306645" w:history="1">
         <w:r>
           <w:rPr>
             <w:rStyle w:val="af3"/>
@@ -3603,7 +3603,7 @@
             <w:noProof/>
             <w:webHidden/>
           </w:rPr>
-          <w:instrText xml:space="preserve"> PAGEREF _Toc228286724 \h </w:instrText>
+          <w:instrText xml:space="preserve"> PAGEREF _Toc228306645 \h </w:instrText>
         </w:r>
         <w:r>
           <w:rPr>
@@ -3645,7 +3645,7 @@
           <w14:ligatures w14:val="standardContextual"/>
         </w:rPr>
       </w:pPr>
-      <w:hyperlink w:anchor="_Toc228286725" w:history="1">
+      <w:hyperlink w:anchor="_Toc228306646" w:history="1">
         <w:r>
           <w:rPr>
             <w:rStyle w:val="af3"/>
@@ -3683,7 +3683,7 @@
             <w:noProof/>
             <w:webHidden/>
           </w:rPr>
-          <w:instrText xml:space="preserve"> PAGEREF _Toc228286725 \h </w:instrText>
+          <w:instrText xml:space="preserve"> PAGEREF _Toc228306646 \h </w:instrText>
         </w:r>
         <w:r>
           <w:rPr>
@@ -3725,7 +3725,7 @@
           <w14:ligatures w14:val="standardContextual"/>
         </w:rPr>
       </w:pPr>
-      <w:hyperlink w:anchor="_Toc228286726" w:history="1">
+      <w:hyperlink w:anchor="_Toc228306647" w:history="1">
         <w:r>
           <w:rPr>
             <w:rStyle w:val="af3"/>
@@ -3781,7 +3781,7 @@
             <w:noProof/>
             <w:webHidden/>
           </w:rPr>
-          <w:instrText xml:space="preserve"> PAGEREF _Toc228286726 \h </w:instrText>
+          <w:instrText xml:space="preserve"> PAGEREF _Toc228306647 \h </w:instrText>
         </w:r>
         <w:r>
           <w:rPr>
@@ -3823,7 +3823,7 @@
           <w14:ligatures w14:val="standardContextual"/>
         </w:rPr>
       </w:pPr>
-      <w:hyperlink w:anchor="_Toc228286727" w:history="1">
+      <w:hyperlink w:anchor="_Toc228306648" w:history="1">
         <w:r>
           <w:rPr>
             <w:rStyle w:val="af3"/>
@@ -3861,7 +3861,7 @@
             <w:noProof/>
             <w:webHidden/>
           </w:rPr>
-          <w:instrText xml:space="preserve"> PAGEREF _Toc228286727 \h </w:instrText>
+          <w:instrText xml:space="preserve"> PAGEREF _Toc228306648 \h </w:instrText>
         </w:r>
         <w:r>
           <w:rPr>
@@ -3904,7 +3904,7 @@
           <w14:ligatures w14:val="standardContextual"/>
         </w:rPr>
       </w:pPr>
-      <w:hyperlink w:anchor="_Toc228286728" w:history="1">
+      <w:hyperlink w:anchor="_Toc228306649" w:history="1">
         <w:r>
           <w:rPr>
             <w:rStyle w:val="af3"/>
@@ -3960,7 +3960,7 @@
             <w:noProof/>
             <w:webHidden/>
           </w:rPr>
-          <w:instrText xml:space="preserve"> PAGEREF _Toc228286728 \h </w:instrText>
+          <w:instrText xml:space="preserve"> PAGEREF _Toc228306649 \h </w:instrText>
         </w:r>
         <w:r>
           <w:rPr>
@@ -4002,7 +4002,7 @@
           <w14:ligatures w14:val="standardContextual"/>
         </w:rPr>
       </w:pPr>
-      <w:hyperlink w:anchor="_Toc228286729" w:history="1">
+      <w:hyperlink w:anchor="_Toc228306650" w:history="1">
         <w:r>
           <w:rPr>
             <w:rStyle w:val="af3"/>
@@ -4058,7 +4058,7 @@
             <w:noProof/>
             <w:webHidden/>
           </w:rPr>
-          <w:instrText xml:space="preserve"> PAGEREF _Toc228286729 \h </w:instrText>
+          <w:instrText xml:space="preserve"> PAGEREF _Toc228306650 \h </w:instrText>
         </w:r>
         <w:r>
           <w:rPr>
@@ -4100,7 +4100,7 @@
           <w14:ligatures w14:val="standardContextual"/>
         </w:rPr>
       </w:pPr>
-      <w:hyperlink w:anchor="_Toc228286730" w:history="1">
+      <w:hyperlink w:anchor="_Toc228306651" w:history="1">
         <w:r>
           <w:rPr>
             <w:rStyle w:val="af3"/>
@@ -4156,7 +4156,7 @@
             <w:noProof/>
             <w:webHidden/>
           </w:rPr>
-          <w:instrText xml:space="preserve"> PAGEREF _Toc228286730 \h </w:instrText>
+          <w:instrText xml:space="preserve"> PAGEREF _Toc228306651 \h </w:instrText>
         </w:r>
         <w:r>
           <w:rPr>
@@ -4198,7 +4198,7 @@
           <w14:ligatures w14:val="standardContextual"/>
         </w:rPr>
       </w:pPr>
-      <w:hyperlink w:anchor="_Toc228286731" w:history="1">
+      <w:hyperlink w:anchor="_Toc228306652" w:history="1">
         <w:r>
           <w:rPr>
             <w:rStyle w:val="af3"/>
@@ -4236,7 +4236,7 @@
             <w:noProof/>
             <w:webHidden/>
           </w:rPr>
-          <w:instrText xml:space="preserve"> PAGEREF _Toc228286731 \h </w:instrText>
+          <w:instrText xml:space="preserve"> PAGEREF _Toc228306652 \h </w:instrText>
         </w:r>
         <w:r>
           <w:rPr>
@@ -4279,7 +4279,7 @@
           <w14:ligatures w14:val="standardContextual"/>
         </w:rPr>
       </w:pPr>
-      <w:hyperlink w:anchor="_Toc228286732" w:history="1">
+      <w:hyperlink w:anchor="_Toc228306653" w:history="1">
         <w:r>
           <w:rPr>
             <w:rStyle w:val="af3"/>
@@ -4317,7 +4317,7 @@
             <w:noProof/>
             <w:webHidden/>
           </w:rPr>
-          <w:instrText xml:space="preserve"> PAGEREF _Toc228286732 \h </w:instrText>
+          <w:instrText xml:space="preserve"> PAGEREF _Toc228306653 \h </w:instrText>
         </w:r>
         <w:r>
           <w:rPr>
@@ -4360,7 +4360,7 @@
           <w14:ligatures w14:val="standardContextual"/>
         </w:rPr>
       </w:pPr>
-      <w:hyperlink w:anchor="_Toc228286733" w:history="1">
+      <w:hyperlink w:anchor="_Toc228306654" w:history="1">
         <w:r>
           <w:rPr>
             <w:rStyle w:val="af3"/>
@@ -4404,7 +4404,7 @@
             <w:noProof/>
             <w:webHidden/>
           </w:rPr>
-          <w:instrText xml:space="preserve"> PAGEREF _Toc228286733 \h </w:instrText>
+          <w:instrText xml:space="preserve"> PAGEREF _Toc228306654 \h </w:instrText>
         </w:r>
         <w:r>
           <w:rPr>
@@ -4447,7 +4447,7 @@
           <w14:ligatures w14:val="standardContextual"/>
         </w:rPr>
       </w:pPr>
-      <w:hyperlink w:anchor="_Toc228286734" w:history="1">
+      <w:hyperlink w:anchor="_Toc228306655" w:history="1">
         <w:r>
           <w:rPr>
             <w:rStyle w:val="af3"/>
@@ -4485,7 +4485,7 @@
             <w:noProof/>
             <w:webHidden/>
           </w:rPr>
-          <w:instrText xml:space="preserve"> PAGEREF _Toc228286734 \h </w:instrText>
+          <w:instrText xml:space="preserve"> PAGEREF _Toc228306655 \h </w:instrText>
         </w:r>
         <w:r>
           <w:rPr>
@@ -4528,7 +4528,7 @@
           <w14:ligatures w14:val="standardContextual"/>
         </w:rPr>
       </w:pPr>
-      <w:hyperlink w:anchor="_Toc228286735" w:history="1">
+      <w:hyperlink w:anchor="_Toc228306656" w:history="1">
         <w:r>
           <w:rPr>
             <w:rStyle w:val="af3"/>
@@ -4584,7 +4584,7 @@
             <w:noProof/>
             <w:webHidden/>
           </w:rPr>
-          <w:instrText xml:space="preserve"> PAGEREF _Toc228286735 \h </w:instrText>
+          <w:instrText xml:space="preserve"> PAGEREF _Toc228306656 \h </w:instrText>
         </w:r>
         <w:r>
           <w:rPr>
@@ -4627,7 +4627,7 @@
           <w14:ligatures w14:val="standardContextual"/>
         </w:rPr>
       </w:pPr>
-      <w:hyperlink w:anchor="_Toc228286736" w:history="1">
+      <w:hyperlink w:anchor="_Toc228306657" w:history="1">
         <w:r>
           <w:rPr>
             <w:rStyle w:val="af3"/>
@@ -4665,7 +4665,7 @@
             <w:noProof/>
             <w:webHidden/>
           </w:rPr>
-          <w:instrText xml:space="preserve"> PAGEREF _Toc228286736 \h </w:instrText>
+          <w:instrText xml:space="preserve"> PAGEREF _Toc228306657 \h </w:instrText>
         </w:r>
         <w:r>
           <w:rPr>
@@ -4708,7 +4708,7 @@
           <w14:ligatures w14:val="standardContextual"/>
         </w:rPr>
       </w:pPr>
-      <w:hyperlink w:anchor="_Toc228286737" w:history="1">
+      <w:hyperlink w:anchor="_Toc228306658" w:history="1">
         <w:r>
           <w:rPr>
             <w:rStyle w:val="af3"/>
@@ -4746,7 +4746,7 @@
             <w:noProof/>
             <w:webHidden/>
           </w:rPr>
-          <w:instrText xml:space="preserve"> PAGEREF _Toc228286737 \h </w:instrText>
+          <w:instrText xml:space="preserve"> PAGEREF _Toc228306658 \h </w:instrText>
         </w:r>
         <w:r>
           <w:rPr>
@@ -4789,7 +4789,7 @@
           <w14:ligatures w14:val="standardContextual"/>
         </w:rPr>
       </w:pPr>
-      <w:hyperlink w:anchor="_Toc228286738" w:history="1">
+      <w:hyperlink w:anchor="_Toc228306659" w:history="1">
         <w:r>
           <w:rPr>
             <w:rStyle w:val="af3"/>
@@ -4845,7 +4845,7 @@
             <w:noProof/>
             <w:webHidden/>
           </w:rPr>
-          <w:instrText xml:space="preserve"> PAGEREF _Toc228286738 \h </w:instrText>
+          <w:instrText xml:space="preserve"> PAGEREF _Toc228306659 \h </w:instrText>
         </w:r>
         <w:r>
           <w:rPr>
@@ -4888,7 +4888,7 @@
           <w14:ligatures w14:val="standardContextual"/>
         </w:rPr>
       </w:pPr>
-      <w:hyperlink w:anchor="_Toc228286739" w:history="1">
+      <w:hyperlink w:anchor="_Toc228306660" w:history="1">
         <w:r>
           <w:rPr>
             <w:rStyle w:val="af3"/>
@@ -4944,7 +4944,7 @@
             <w:noProof/>
             <w:webHidden/>
           </w:rPr>
-          <w:instrText xml:space="preserve"> PAGEREF _Toc228286739 \h </w:instrText>
+          <w:instrText xml:space="preserve"> PAGEREF _Toc228306660 \h </w:instrText>
         </w:r>
         <w:r>
           <w:rPr>
@@ -4987,7 +4987,7 @@
           <w14:ligatures w14:val="standardContextual"/>
         </w:rPr>
       </w:pPr>
-      <w:hyperlink w:anchor="_Toc228286740" w:history="1">
+      <w:hyperlink w:anchor="_Toc228306661" w:history="1">
         <w:r>
           <w:rPr>
             <w:rStyle w:val="af3"/>
@@ -5043,7 +5043,7 @@
             <w:noProof/>
             <w:webHidden/>
           </w:rPr>
-          <w:instrText xml:space="preserve"> PAGEREF _Toc228286740 \h </w:instrText>
+          <w:instrText xml:space="preserve"> PAGEREF _Toc228306661 \h </w:instrText>
         </w:r>
         <w:r>
           <w:rPr>
@@ -5086,7 +5086,7 @@
           <w14:ligatures w14:val="standardContextual"/>
         </w:rPr>
       </w:pPr>
-      <w:hyperlink w:anchor="_Toc228286741" w:history="1">
+      <w:hyperlink w:anchor="_Toc228306662" w:history="1">
         <w:r>
           <w:rPr>
             <w:rStyle w:val="af3"/>
@@ -5124,7 +5124,7 @@
             <w:noProof/>
             <w:webHidden/>
           </w:rPr>
-          <w:instrText xml:space="preserve"> PAGEREF _Toc228286741 \h </w:instrText>
+          <w:instrText xml:space="preserve"> PAGEREF _Toc228306662 \h </w:instrText>
         </w:r>
         <w:r>
           <w:rPr>
@@ -5167,7 +5167,7 @@
           <w14:ligatures w14:val="standardContextual"/>
         </w:rPr>
       </w:pPr>
-      <w:hyperlink w:anchor="_Toc228286742" w:history="1">
+      <w:hyperlink w:anchor="_Toc228306663" w:history="1">
         <w:r>
           <w:rPr>
             <w:rStyle w:val="af3"/>
@@ -5205,7 +5205,7 @@
             <w:noProof/>
             <w:webHidden/>
           </w:rPr>
-          <w:instrText xml:space="preserve"> PAGEREF _Toc228286742 \h </w:instrText>
+          <w:instrText xml:space="preserve"> PAGEREF _Toc228306663 \h </w:instrText>
         </w:r>
         <w:r>
           <w:rPr>
@@ -5248,7 +5248,7 @@
           <w14:ligatures w14:val="standardContextual"/>
         </w:rPr>
       </w:pPr>
-      <w:hyperlink w:anchor="_Toc228286743" w:history="1">
+      <w:hyperlink w:anchor="_Toc228306664" w:history="1">
         <w:r>
           <w:rPr>
             <w:rStyle w:val="af3"/>
@@ -5292,7 +5292,7 @@
             <w:noProof/>
             <w:webHidden/>
           </w:rPr>
-          <w:instrText xml:space="preserve"> PAGEREF _Toc228286743 \h </w:instrText>
+          <w:instrText xml:space="preserve"> PAGEREF _Toc228306664 \h </w:instrText>
         </w:r>
         <w:r>
           <w:rPr>
@@ -5335,7 +5335,7 @@
           <w14:ligatures w14:val="standardContextual"/>
         </w:rPr>
       </w:pPr>
-      <w:hyperlink w:anchor="_Toc228286744" w:history="1">
+      <w:hyperlink w:anchor="_Toc228306665" w:history="1">
         <w:r>
           <w:rPr>
             <w:rStyle w:val="af3"/>
@@ -5373,7 +5373,7 @@
             <w:noProof/>
             <w:webHidden/>
           </w:rPr>
-          <w:instrText xml:space="preserve"> PAGEREF _Toc228286744 \h </w:instrText>
+          <w:instrText xml:space="preserve"> PAGEREF _Toc228306665 \h </w:instrText>
         </w:r>
         <w:r>
           <w:rPr>
@@ -5416,7 +5416,7 @@
           <w14:ligatures w14:val="standardContextual"/>
         </w:rPr>
       </w:pPr>
-      <w:hyperlink w:anchor="_Toc228286745" w:history="1">
+      <w:hyperlink w:anchor="_Toc228306666" w:history="1">
         <w:r>
           <w:rPr>
             <w:rStyle w:val="af3"/>
@@ -5454,7 +5454,7 @@
             <w:noProof/>
             <w:webHidden/>
           </w:rPr>
-          <w:instrText xml:space="preserve"> PAGEREF _Toc228286745 \h </w:instrText>
+          <w:instrText xml:space="preserve"> PAGEREF _Toc228306666 \h </w:instrText>
         </w:r>
         <w:r>
           <w:rPr>
@@ -5497,7 +5497,7 @@
           <w14:ligatures w14:val="standardContextual"/>
         </w:rPr>
       </w:pPr>
-      <w:hyperlink w:anchor="_Toc228286746" w:history="1">
+      <w:hyperlink w:anchor="_Toc228306667" w:history="1">
         <w:r>
           <w:rPr>
             <w:rStyle w:val="af3"/>
@@ -5535,7 +5535,7 @@
             <w:noProof/>
             <w:webHidden/>
           </w:rPr>
-          <w:instrText xml:space="preserve"> PAGEREF _Toc228286746 \h </w:instrText>
+          <w:instrText xml:space="preserve"> PAGEREF _Toc228306667 \h </w:instrText>
         </w:r>
         <w:r>
           <w:rPr>
@@ -5578,7 +5578,7 @@
           <w14:ligatures w14:val="standardContextual"/>
         </w:rPr>
       </w:pPr>
-      <w:hyperlink w:anchor="_Toc228286747" w:history="1">
+      <w:hyperlink w:anchor="_Toc228306668" w:history="1">
         <w:r>
           <w:rPr>
             <w:rStyle w:val="af3"/>
@@ -5634,7 +5634,7 @@
             <w:noProof/>
             <w:webHidden/>
           </w:rPr>
-          <w:instrText xml:space="preserve"> PAGEREF _Toc228286747 \h </w:instrText>
+          <w:instrText xml:space="preserve"> PAGEREF _Toc228306668 \h </w:instrText>
         </w:r>
         <w:r>
           <w:rPr>
@@ -5677,7 +5677,7 @@
           <w14:ligatures w14:val="standardContextual"/>
         </w:rPr>
       </w:pPr>
-      <w:hyperlink w:anchor="_Toc228286748" w:history="1">
+      <w:hyperlink w:anchor="_Toc228306669" w:history="1">
         <w:r>
           <w:rPr>
             <w:rStyle w:val="af3"/>
@@ -5715,7 +5715,7 @@
             <w:noProof/>
             <w:webHidden/>
           </w:rPr>
-          <w:instrText xml:space="preserve"> PAGEREF _Toc228286748 \h </w:instrText>
+          <w:instrText xml:space="preserve"> PAGEREF _Toc228306669 \h </w:instrText>
         </w:r>
         <w:r>
           <w:rPr>
@@ -5758,7 +5758,7 @@
           <w14:ligatures w14:val="standardContextual"/>
         </w:rPr>
       </w:pPr>
-      <w:hyperlink w:anchor="_Toc228286749" w:history="1">
+      <w:hyperlink w:anchor="_Toc228306670" w:history="1">
         <w:r>
           <w:rPr>
             <w:rStyle w:val="af3"/>
@@ -5814,7 +5814,7 @@
             <w:noProof/>
             <w:webHidden/>
           </w:rPr>
-          <w:instrText xml:space="preserve"> PAGEREF _Toc228286749 \h </w:instrText>
+          <w:instrText xml:space="preserve"> PAGEREF _Toc228306670 \h </w:instrText>
         </w:r>
         <w:r>
           <w:rPr>
@@ -5857,7 +5857,7 @@
           <w14:ligatures w14:val="standardContextual"/>
         </w:rPr>
       </w:pPr>
-      <w:hyperlink w:anchor="_Toc228286750" w:history="1">
+      <w:hyperlink w:anchor="_Toc228306671" w:history="1">
         <w:r>
           <w:rPr>
             <w:rStyle w:val="af3"/>
@@ -5895,7 +5895,7 @@
             <w:noProof/>
             <w:webHidden/>
           </w:rPr>
-          <w:instrText xml:space="preserve"> PAGEREF _Toc228286750 \h </w:instrText>
+          <w:instrText xml:space="preserve"> PAGEREF _Toc228306671 \h </w:instrText>
         </w:r>
         <w:r>
           <w:rPr>
@@ -5938,7 +5938,7 @@
           <w14:ligatures w14:val="standardContextual"/>
         </w:rPr>
       </w:pPr>
-      <w:hyperlink w:anchor="_Toc228286751" w:history="1">
+      <w:hyperlink w:anchor="_Toc228306672" w:history="1">
         <w:r>
           <w:rPr>
             <w:rStyle w:val="af3"/>
@@ -5976,7 +5976,7 @@
             <w:noProof/>
             <w:webHidden/>
           </w:rPr>
-          <w:instrText xml:space="preserve"> PAGEREF _Toc228286751 \h </w:instrText>
+          <w:instrText xml:space="preserve"> PAGEREF _Toc228306672 \h </w:instrText>
         </w:r>
         <w:r>
           <w:rPr>
@@ -5996,7 +5996,7 @@
             <w:noProof/>
             <w:webHidden/>
           </w:rPr>
-          <w:t>47</w:t>
+          <w:t>48</w:t>
         </w:r>
         <w:r>
           <w:rPr>
@@ -6019,7 +6019,7 @@
           <w14:ligatures w14:val="standardContextual"/>
         </w:rPr>
       </w:pPr>
-      <w:hyperlink w:anchor="_Toc228286752" w:history="1">
+      <w:hyperlink w:anchor="_Toc228306673" w:history="1">
         <w:r>
           <w:rPr>
             <w:rStyle w:val="af3"/>
@@ -6057,7 +6057,7 @@
             <w:noProof/>
             <w:webHidden/>
           </w:rPr>
-          <w:instrText xml:space="preserve"> PAGEREF _Toc228286752 \h </w:instrText>
+          <w:instrText xml:space="preserve"> PAGEREF _Toc228306673 \h </w:instrText>
         </w:r>
         <w:r>
           <w:rPr>
@@ -6077,7 +6077,7 @@
             <w:noProof/>
             <w:webHidden/>
           </w:rPr>
-          <w:t>48</w:t>
+          <w:t>49</w:t>
         </w:r>
         <w:r>
           <w:rPr>
@@ -6100,7 +6100,7 @@
           <w14:ligatures w14:val="standardContextual"/>
         </w:rPr>
       </w:pPr>
-      <w:hyperlink w:anchor="_Toc228286753" w:history="1">
+      <w:hyperlink w:anchor="_Toc228306674" w:history="1">
         <w:r>
           <w:rPr>
             <w:rStyle w:val="af3"/>
@@ -6138,7 +6138,7 @@
             <w:noProof/>
             <w:webHidden/>
           </w:rPr>
-          <w:instrText xml:space="preserve"> PAGEREF _Toc228286753 \h </w:instrText>
+          <w:instrText xml:space="preserve"> PAGEREF _Toc228306674 \h </w:instrText>
         </w:r>
         <w:r>
           <w:rPr>
@@ -6158,7 +6158,7 @@
             <w:noProof/>
             <w:webHidden/>
           </w:rPr>
-          <w:t>50</w:t>
+          <w:t>51</w:t>
         </w:r>
         <w:r>
           <w:rPr>
@@ -6181,7 +6181,7 @@
           <w14:ligatures w14:val="standardContextual"/>
         </w:rPr>
       </w:pPr>
-      <w:hyperlink w:anchor="_Toc228286754" w:history="1">
+      <w:hyperlink w:anchor="_Toc228306675" w:history="1">
         <w:r>
           <w:rPr>
             <w:rStyle w:val="af3"/>
@@ -6204,16 +6204,7 @@
             <w:b/>
             <w:noProof/>
           </w:rPr>
-          <w:t>总结与展</w:t>
-        </w:r>
-        <w:r>
-          <w:rPr>
-            <w:rStyle w:val="af3"/>
-            <w:b/>
-            <w:noProof/>
-          </w:rPr>
-          <w:lastRenderedPageBreak/>
-          <w:t>望</w:t>
+          <w:t>总结与展望</w:t>
         </w:r>
         <w:r>
           <w:rPr>
@@ -6234,7 +6225,7 @@
             <w:noProof/>
             <w:webHidden/>
           </w:rPr>
-          <w:instrText xml:space="preserve"> PAGEREF _Toc228286754 \h </w:instrText>
+          <w:instrText xml:space="preserve"> PAGEREF _Toc228306675 \h </w:instrText>
         </w:r>
         <w:r>
           <w:rPr>
@@ -6254,7 +6245,7 @@
             <w:noProof/>
             <w:webHidden/>
           </w:rPr>
-          <w:t>51</w:t>
+          <w:t>52</w:t>
         </w:r>
         <w:r>
           <w:rPr>
@@ -6277,7 +6268,7 @@
           <w14:ligatures w14:val="standardContextual"/>
         </w:rPr>
       </w:pPr>
-      <w:hyperlink w:anchor="_Toc228286755" w:history="1">
+      <w:hyperlink w:anchor="_Toc228306676" w:history="1">
         <w:r>
           <w:rPr>
             <w:rStyle w:val="af3"/>
@@ -6315,7 +6306,7 @@
             <w:noProof/>
             <w:webHidden/>
           </w:rPr>
-          <w:instrText xml:space="preserve"> PAGEREF _Toc228286755 \h </w:instrText>
+          <w:instrText xml:space="preserve"> PAGEREF _Toc228306676 \h </w:instrText>
         </w:r>
         <w:r>
           <w:rPr>
@@ -6335,7 +6326,7 @@
             <w:noProof/>
             <w:webHidden/>
           </w:rPr>
-          <w:t>51</w:t>
+          <w:t>52</w:t>
         </w:r>
         <w:r>
           <w:rPr>
@@ -6358,7 +6349,7 @@
           <w14:ligatures w14:val="standardContextual"/>
         </w:rPr>
       </w:pPr>
-      <w:hyperlink w:anchor="_Toc228286756" w:history="1">
+      <w:hyperlink w:anchor="_Toc228306677" w:history="1">
         <w:r>
           <w:rPr>
             <w:rStyle w:val="af3"/>
@@ -6396,7 +6387,7 @@
             <w:noProof/>
             <w:webHidden/>
           </w:rPr>
-          <w:instrText xml:space="preserve"> PAGEREF _Toc228286756 \h </w:instrText>
+          <w:instrText xml:space="preserve"> PAGEREF _Toc228306677 \h </w:instrText>
         </w:r>
         <w:r>
           <w:rPr>
@@ -6416,7 +6407,7 @@
             <w:noProof/>
             <w:webHidden/>
           </w:rPr>
-          <w:t>51</w:t>
+          <w:t>52</w:t>
         </w:r>
         <w:r>
           <w:rPr>
@@ -6439,7 +6430,7 @@
           <w14:ligatures w14:val="standardContextual"/>
         </w:rPr>
       </w:pPr>
-      <w:hyperlink w:anchor="_Toc228286757" w:history="1">
+      <w:hyperlink w:anchor="_Toc228306678" w:history="1">
         <w:r>
           <w:rPr>
             <w:rStyle w:val="af3"/>
@@ -6467,7 +6458,7 @@
             <w:noProof/>
             <w:webHidden/>
           </w:rPr>
-          <w:instrText xml:space="preserve"> PAGEREF _Toc228286757 \h </w:instrText>
+          <w:instrText xml:space="preserve"> PAGEREF _Toc228306678 \h </w:instrText>
         </w:r>
         <w:r>
           <w:rPr>
@@ -6487,7 +6478,7 @@
             <w:noProof/>
             <w:webHidden/>
           </w:rPr>
-          <w:t>52</w:t>
+          <w:t>53</w:t>
         </w:r>
         <w:r>
           <w:rPr>
@@ -6510,7 +6501,7 @@
           <w14:ligatures w14:val="standardContextual"/>
         </w:rPr>
       </w:pPr>
-      <w:hyperlink w:anchor="_Toc228286758" w:history="1">
+      <w:hyperlink w:anchor="_Toc228306679" w:history="1">
         <w:r>
           <w:rPr>
             <w:rStyle w:val="af3"/>
@@ -6538,7 +6529,7 @@
             <w:noProof/>
             <w:webHidden/>
           </w:rPr>
-          <w:instrText xml:space="preserve"> PAGEREF _Toc228286758 \h </w:instrText>
+          <w:instrText xml:space="preserve"> PAGEREF _Toc228306679 \h </w:instrText>
         </w:r>
         <w:r>
           <w:rPr>
@@ -6558,7 +6549,7 @@
             <w:noProof/>
             <w:webHidden/>
           </w:rPr>
-          <w:t>53</w:t>
+          <w:t>54</w:t>
         </w:r>
         <w:r>
           <w:rPr>
@@ -6585,7 +6576,7 @@
         </w:rPr>
         <w:fldChar w:fldCharType="end"/>
       </w:r>
-      <w:bookmarkStart w:id="0" w:name="_Toc228286700"/>
+      <w:bookmarkStart w:id="0" w:name="_Toc228306621"/>
       <w:r>
         <w:rPr>
           <w:rFonts w:cs="Times New Roman"/>
@@ -6614,7 +6605,7 @@
         <w:spacing w:before="240" w:after="120" w:line="360" w:lineRule="auto"/>
         <w:outlineLvl w:val="1"/>
       </w:pPr>
-      <w:bookmarkStart w:id="1" w:name="_Toc228286701"/>
+      <w:bookmarkStart w:id="1" w:name="_Toc228306622"/>
       <w:r>
         <w:rPr>
           <w:rFonts w:eastAsia="黑体"/>
@@ -6814,7 +6805,7 @@
         <w:spacing w:before="240" w:after="120" w:line="360" w:lineRule="auto"/>
         <w:outlineLvl w:val="1"/>
       </w:pPr>
-      <w:bookmarkStart w:id="2" w:name="_Toc228286702"/>
+      <w:bookmarkStart w:id="2" w:name="_Toc228306623"/>
       <w:r>
         <w:rPr>
           <w:rFonts w:eastAsia="黑体"/>
@@ -7024,7 +7015,7 @@
         <w:spacing w:before="240" w:after="120" w:line="360" w:lineRule="auto"/>
         <w:outlineLvl w:val="1"/>
       </w:pPr>
-      <w:bookmarkStart w:id="3" w:name="_Toc228286703"/>
+      <w:bookmarkStart w:id="3" w:name="_Toc228306624"/>
       <w:r>
         <w:rPr>
           <w:rFonts w:eastAsia="黑体"/>
@@ -7381,7 +7372,7 @@
         <w:spacing w:before="240" w:after="120" w:line="360" w:lineRule="auto"/>
         <w:outlineLvl w:val="1"/>
       </w:pPr>
-      <w:bookmarkStart w:id="4" w:name="_Toc228286704"/>
+      <w:bookmarkStart w:id="4" w:name="_Toc228306625"/>
       <w:r>
         <w:rPr>
           <w:rFonts w:eastAsia="黑体"/>
@@ -7595,7 +7586,7 @@
         <w:jc w:val="center"/>
         <w:outlineLvl w:val="0"/>
       </w:pPr>
-      <w:bookmarkStart w:id="5" w:name="_Toc228286705"/>
+      <w:bookmarkStart w:id="5" w:name="_Toc228306626"/>
       <w:r>
         <w:rPr>
           <w:rFonts w:eastAsia="黑体"/>
@@ -7631,7 +7622,7 @@
         <w:spacing w:before="240" w:after="120" w:line="360" w:lineRule="auto"/>
         <w:outlineLvl w:val="1"/>
       </w:pPr>
-      <w:bookmarkStart w:id="6" w:name="_Toc228286706"/>
+      <w:bookmarkStart w:id="6" w:name="_Toc228306627"/>
       <w:r>
         <w:rPr>
           <w:rFonts w:eastAsia="黑体"/>
@@ -7706,7 +7697,7 @@
         <w:spacing w:before="240" w:after="120" w:line="360" w:lineRule="auto"/>
         <w:outlineLvl w:val="1"/>
       </w:pPr>
-      <w:bookmarkStart w:id="7" w:name="_Toc228286707"/>
+      <w:bookmarkStart w:id="7" w:name="_Toc228306628"/>
       <w:r>
         <w:rPr>
           <w:rFonts w:eastAsia="黑体"/>
@@ -7787,7 +7778,7 @@
         <w:spacing w:before="240" w:after="120" w:line="360" w:lineRule="auto"/>
         <w:outlineLvl w:val="1"/>
       </w:pPr>
-      <w:bookmarkStart w:id="8" w:name="_Toc228286708"/>
+      <w:bookmarkStart w:id="8" w:name="_Toc228306629"/>
       <w:r>
         <w:rPr>
           <w:rFonts w:eastAsia="黑体"/>
@@ -8650,7 +8641,7 @@
         <w:spacing w:before="240" w:after="120" w:line="360" w:lineRule="auto"/>
         <w:outlineLvl w:val="1"/>
       </w:pPr>
-      <w:bookmarkStart w:id="9" w:name="_Toc228286709"/>
+      <w:bookmarkStart w:id="9" w:name="_Toc228306630"/>
       <w:r>
         <w:rPr>
           <w:rFonts w:eastAsia="黑体"/>
@@ -8870,7 +8861,7 @@
         <w:spacing w:before="240" w:after="120" w:line="360" w:lineRule="auto"/>
         <w:outlineLvl w:val="1"/>
       </w:pPr>
-      <w:bookmarkStart w:id="10" w:name="_Toc228286710"/>
+      <w:bookmarkStart w:id="10" w:name="_Toc228306631"/>
       <w:r>
         <w:rPr>
           <w:rFonts w:eastAsia="黑体"/>
@@ -9053,7 +9044,7 @@
         <w:spacing w:before="240" w:after="120" w:line="360" w:lineRule="auto"/>
         <w:outlineLvl w:val="1"/>
       </w:pPr>
-      <w:bookmarkStart w:id="11" w:name="_Toc228286711"/>
+      <w:bookmarkStart w:id="11" w:name="_Toc228306632"/>
       <w:r>
         <w:rPr>
           <w:rFonts w:eastAsia="黑体"/>
@@ -9139,7 +9130,7 @@
         <w:jc w:val="center"/>
         <w:outlineLvl w:val="0"/>
       </w:pPr>
-      <w:bookmarkStart w:id="12" w:name="_Toc228286712"/>
+      <w:bookmarkStart w:id="12" w:name="_Toc228306633"/>
       <w:r>
         <w:rPr>
           <w:rFonts w:eastAsia="黑体"/>
@@ -9331,7 +9322,7 @@
         <w:spacing w:before="240" w:after="120" w:line="360" w:lineRule="auto"/>
         <w:outlineLvl w:val="1"/>
       </w:pPr>
-      <w:bookmarkStart w:id="13" w:name="_Toc228286713"/>
+      <w:bookmarkStart w:id="13" w:name="_Toc228306634"/>
       <w:r>
         <w:rPr>
           <w:rFonts w:eastAsia="黑体"/>
@@ -9357,7 +9348,7 @@
         <w:spacing w:before="180" w:after="80" w:line="360" w:lineRule="auto"/>
         <w:outlineLvl w:val="2"/>
       </w:pPr>
-      <w:bookmarkStart w:id="14" w:name="_Toc228286714"/>
+      <w:bookmarkStart w:id="14" w:name="_Toc228306635"/>
       <w:r>
         <w:rPr>
           <w:rFonts w:eastAsia="黑体"/>
@@ -10177,7 +10168,7 @@
         <w:spacing w:before="180" w:after="80" w:line="360" w:lineRule="auto"/>
         <w:outlineLvl w:val="2"/>
       </w:pPr>
-      <w:bookmarkStart w:id="15" w:name="_Toc228286715"/>
+      <w:bookmarkStart w:id="15" w:name="_Toc228306636"/>
       <w:r>
         <w:rPr>
           <w:rFonts w:eastAsia="黑体"/>
@@ -11004,7 +10995,7 @@
         <w:spacing w:before="180" w:after="80" w:line="360" w:lineRule="auto"/>
         <w:outlineLvl w:val="2"/>
       </w:pPr>
-      <w:bookmarkStart w:id="16" w:name="_Toc228286716"/>
+      <w:bookmarkStart w:id="16" w:name="_Toc228306637"/>
       <w:r>
         <w:rPr>
           <w:rFonts w:eastAsia="黑体"/>
@@ -11245,7 +11236,7 @@
         <w:spacing w:before="240" w:after="120" w:line="360" w:lineRule="auto"/>
         <w:outlineLvl w:val="1"/>
       </w:pPr>
-      <w:bookmarkStart w:id="17" w:name="_Toc228286717"/>
+      <w:bookmarkStart w:id="17" w:name="_Toc228306638"/>
       <w:r>
         <w:rPr>
           <w:rFonts w:eastAsia="黑体"/>
@@ -11556,7 +11547,7 @@
         <w:spacing w:before="240" w:after="120" w:line="360" w:lineRule="auto"/>
         <w:outlineLvl w:val="1"/>
       </w:pPr>
-      <w:bookmarkStart w:id="18" w:name="_Toc228286718"/>
+      <w:bookmarkStart w:id="18" w:name="_Toc228306639"/>
       <w:r>
         <w:rPr>
           <w:rFonts w:eastAsia="黑体"/>
@@ -11582,7 +11573,7 @@
         <w:spacing w:before="180" w:after="80" w:line="360" w:lineRule="auto"/>
         <w:outlineLvl w:val="2"/>
       </w:pPr>
-      <w:bookmarkStart w:id="19" w:name="_Toc228286719"/>
+      <w:bookmarkStart w:id="19" w:name="_Toc228306640"/>
       <w:r>
         <w:rPr>
           <w:rFonts w:eastAsia="黑体"/>
@@ -12147,7 +12138,7 @@
         <w:spacing w:before="180" w:after="80" w:line="360" w:lineRule="auto"/>
         <w:outlineLvl w:val="2"/>
       </w:pPr>
-      <w:bookmarkStart w:id="20" w:name="_Toc228286720"/>
+      <w:bookmarkStart w:id="20" w:name="_Toc228306641"/>
       <w:r>
         <w:rPr>
           <w:rFonts w:eastAsia="黑体"/>
@@ -12329,7 +12320,7 @@
         <w:spacing w:before="240" w:after="120" w:line="360" w:lineRule="auto"/>
         <w:outlineLvl w:val="1"/>
       </w:pPr>
-      <w:bookmarkStart w:id="21" w:name="_Toc228286721"/>
+      <w:bookmarkStart w:id="21" w:name="_Toc228306642"/>
       <w:r>
         <w:rPr>
           <w:rFonts w:eastAsia="黑体"/>
@@ -12355,7 +12346,7 @@
         <w:spacing w:before="180" w:after="80" w:line="360" w:lineRule="auto"/>
         <w:outlineLvl w:val="2"/>
       </w:pPr>
-      <w:bookmarkStart w:id="22" w:name="_Toc228286722"/>
+      <w:bookmarkStart w:id="22" w:name="_Toc228306643"/>
       <w:r>
         <w:rPr>
           <w:rFonts w:eastAsia="黑体"/>
@@ -12501,7 +12492,7 @@
         <w:spacing w:before="180" w:after="80" w:line="360" w:lineRule="auto"/>
         <w:outlineLvl w:val="2"/>
       </w:pPr>
-      <w:bookmarkStart w:id="23" w:name="_Toc228286723"/>
+      <w:bookmarkStart w:id="23" w:name="_Toc228306644"/>
       <w:r>
         <w:rPr>
           <w:rFonts w:eastAsia="黑体"/>
@@ -12616,7 +12607,7 @@
         <w:spacing w:before="240" w:after="120" w:line="360" w:lineRule="auto"/>
         <w:outlineLvl w:val="1"/>
       </w:pPr>
-      <w:bookmarkStart w:id="24" w:name="_Toc228286724"/>
+      <w:bookmarkStart w:id="24" w:name="_Toc228306645"/>
       <w:r>
         <w:rPr>
           <w:rFonts w:eastAsia="黑体"/>
@@ -12660,7 +12651,7 @@
         <w:spacing w:before="180" w:after="80" w:line="360" w:lineRule="auto"/>
         <w:outlineLvl w:val="2"/>
       </w:pPr>
-      <w:bookmarkStart w:id="25" w:name="_Toc228286725"/>
+      <w:bookmarkStart w:id="25" w:name="_Toc228306646"/>
       <w:r>
         <w:rPr>
           <w:rFonts w:eastAsia="黑体"/>
@@ -12910,7 +12901,7 @@
         <w:spacing w:before="180" w:after="80" w:line="360" w:lineRule="auto"/>
         <w:outlineLvl w:val="2"/>
       </w:pPr>
-      <w:bookmarkStart w:id="26" w:name="_Toc228286726"/>
+      <w:bookmarkStart w:id="26" w:name="_Toc228306647"/>
       <w:r>
         <w:rPr>
           <w:rFonts w:eastAsia="黑体"/>
@@ -13046,7 +13037,7 @@
         <w:spacing w:before="180" w:after="80" w:line="360" w:lineRule="auto"/>
         <w:outlineLvl w:val="2"/>
       </w:pPr>
-      <w:bookmarkStart w:id="27" w:name="_Toc228286727"/>
+      <w:bookmarkStart w:id="27" w:name="_Toc228306648"/>
       <w:r>
         <w:rPr>
           <w:rFonts w:eastAsia="黑体"/>
@@ -13353,7 +13344,7 @@
         <w:spacing w:before="240" w:after="120" w:line="360" w:lineRule="auto"/>
         <w:outlineLvl w:val="1"/>
       </w:pPr>
-      <w:bookmarkStart w:id="28" w:name="_Toc228286728"/>
+      <w:bookmarkStart w:id="28" w:name="_Toc228306649"/>
       <w:r>
         <w:rPr>
           <w:rFonts w:eastAsia="黑体"/>
@@ -13397,7 +13388,7 @@
         <w:spacing w:before="180" w:after="80" w:line="360" w:lineRule="auto"/>
         <w:outlineLvl w:val="2"/>
       </w:pPr>
-      <w:bookmarkStart w:id="29" w:name="_Toc228286729"/>
+      <w:bookmarkStart w:id="29" w:name="_Toc228306650"/>
       <w:r>
         <w:rPr>
           <w:rFonts w:eastAsia="黑体"/>
@@ -13694,7 +13685,7 @@
         <w:spacing w:before="180" w:after="80" w:line="360" w:lineRule="auto"/>
         <w:outlineLvl w:val="2"/>
       </w:pPr>
-      <w:bookmarkStart w:id="30" w:name="_Toc228286730"/>
+      <w:bookmarkStart w:id="30" w:name="_Toc228306651"/>
       <w:r>
         <w:rPr>
           <w:rFonts w:eastAsia="黑体"/>
@@ -13926,7 +13917,7 @@
         <w:spacing w:before="180" w:after="80" w:line="360" w:lineRule="auto"/>
         <w:outlineLvl w:val="2"/>
       </w:pPr>
-      <w:bookmarkStart w:id="31" w:name="_Toc228286731"/>
+      <w:bookmarkStart w:id="31" w:name="_Toc228306652"/>
       <w:r>
         <w:rPr>
           <w:rFonts w:eastAsia="黑体"/>
@@ -14053,7 +14044,7 @@
         <w:spacing w:before="240" w:after="120" w:line="360" w:lineRule="auto"/>
         <w:outlineLvl w:val="1"/>
       </w:pPr>
-      <w:bookmarkStart w:id="32" w:name="_Toc228286732"/>
+      <w:bookmarkStart w:id="32" w:name="_Toc228306653"/>
       <w:r>
         <w:rPr>
           <w:rFonts w:eastAsia="黑体"/>
@@ -14217,7 +14208,7 @@
         <w:jc w:val="center"/>
         <w:outlineLvl w:val="0"/>
       </w:pPr>
-      <w:bookmarkStart w:id="33" w:name="_Toc228286733"/>
+      <w:bookmarkStart w:id="33" w:name="_Toc228306654"/>
       <w:r>
         <w:rPr>
           <w:rFonts w:eastAsia="黑体"/>
@@ -14373,7 +14364,7 @@
         <w:spacing w:before="240" w:after="120" w:line="360" w:lineRule="auto"/>
         <w:outlineLvl w:val="1"/>
       </w:pPr>
-      <w:bookmarkStart w:id="34" w:name="_Toc228286734"/>
+      <w:bookmarkStart w:id="34" w:name="_Toc228306655"/>
       <w:r>
         <w:rPr>
           <w:rFonts w:eastAsia="黑体"/>
@@ -15666,7 +15657,7 @@
         <w:spacing w:before="240" w:after="120" w:line="360" w:lineRule="auto"/>
         <w:outlineLvl w:val="1"/>
       </w:pPr>
-      <w:bookmarkStart w:id="35" w:name="_Toc228286735"/>
+      <w:bookmarkStart w:id="35" w:name="_Toc228306656"/>
       <w:r>
         <w:rPr>
           <w:rFonts w:eastAsia="黑体"/>
@@ -16583,7 +16574,7 @@
         <w:spacing w:before="240" w:after="120" w:line="360" w:lineRule="auto"/>
         <w:outlineLvl w:val="1"/>
       </w:pPr>
-      <w:bookmarkStart w:id="36" w:name="_Toc228286736"/>
+      <w:bookmarkStart w:id="36" w:name="_Toc228306657"/>
       <w:r>
         <w:rPr>
           <w:rFonts w:eastAsia="黑体"/>
@@ -17891,7 +17882,7 @@
         <w:spacing w:before="240" w:after="120" w:line="360" w:lineRule="auto"/>
         <w:outlineLvl w:val="1"/>
       </w:pPr>
-      <w:bookmarkStart w:id="37" w:name="_Toc228286737"/>
+      <w:bookmarkStart w:id="37" w:name="_Toc228306658"/>
       <w:r>
         <w:rPr>
           <w:rFonts w:eastAsia="黑体"/>
@@ -18385,7 +18376,7 @@
         <w:spacing w:before="240" w:after="120" w:line="360" w:lineRule="auto"/>
         <w:outlineLvl w:val="1"/>
       </w:pPr>
-      <w:bookmarkStart w:id="38" w:name="_Toc228286738"/>
+      <w:bookmarkStart w:id="38" w:name="_Toc228306659"/>
       <w:r>
         <w:rPr>
           <w:rFonts w:eastAsia="黑体"/>
@@ -19193,7 +19184,7 @@
         <w:spacing w:before="240" w:after="120" w:line="360" w:lineRule="auto"/>
         <w:outlineLvl w:val="1"/>
       </w:pPr>
-      <w:bookmarkStart w:id="39" w:name="_Toc228286739"/>
+      <w:bookmarkStart w:id="39" w:name="_Toc228306660"/>
       <w:r>
         <w:rPr>
           <w:rFonts w:eastAsia="黑体"/>
@@ -20641,7 +20632,7 @@
         <w:spacing w:before="240" w:after="120" w:line="360" w:lineRule="auto"/>
         <w:outlineLvl w:val="1"/>
       </w:pPr>
-      <w:bookmarkStart w:id="40" w:name="_Toc228286740"/>
+      <w:bookmarkStart w:id="40" w:name="_Toc228306661"/>
       <w:r>
         <w:rPr>
           <w:rFonts w:eastAsia="黑体"/>
@@ -21779,7 +21770,7 @@
         <w:spacing w:before="240" w:after="120" w:line="360" w:lineRule="auto"/>
         <w:outlineLvl w:val="1"/>
       </w:pPr>
-      <w:bookmarkStart w:id="41" w:name="_Toc228286741"/>
+      <w:bookmarkStart w:id="41" w:name="_Toc228306662"/>
       <w:r>
         <w:rPr>
           <w:rFonts w:eastAsia="黑体"/>
@@ -22251,7 +22242,7 @@
         <w:spacing w:before="240" w:after="120" w:line="360" w:lineRule="auto"/>
         <w:outlineLvl w:val="1"/>
       </w:pPr>
-      <w:bookmarkStart w:id="42" w:name="_Toc228286742"/>
+      <w:bookmarkStart w:id="42" w:name="_Toc228306663"/>
       <w:r>
         <w:rPr>
           <w:rFonts w:eastAsia="黑体"/>
@@ -22572,7 +22563,7 @@
         <w:jc w:val="center"/>
         <w:outlineLvl w:val="0"/>
       </w:pPr>
-      <w:bookmarkStart w:id="43" w:name="_Toc228286743"/>
+      <w:bookmarkStart w:id="43" w:name="_Toc228306664"/>
       <w:r>
         <w:rPr>
           <w:rFonts w:eastAsia="黑体"/>
@@ -22728,7 +22719,7 @@
         <w:spacing w:before="240" w:after="120" w:line="360" w:lineRule="auto"/>
         <w:outlineLvl w:val="1"/>
       </w:pPr>
-      <w:bookmarkStart w:id="44" w:name="_Toc228286744"/>
+      <w:bookmarkStart w:id="44" w:name="_Toc228306665"/>
       <w:r>
         <w:rPr>
           <w:rFonts w:eastAsia="黑体"/>
@@ -24939,7 +24930,7 @@
         <w:spacing w:before="240" w:after="120" w:line="360" w:lineRule="auto"/>
         <w:outlineLvl w:val="1"/>
       </w:pPr>
-      <w:bookmarkStart w:id="45" w:name="_Toc228286745"/>
+      <w:bookmarkStart w:id="45" w:name="_Toc228306666"/>
       <w:r>
         <w:rPr>
           <w:rFonts w:eastAsia="黑体"/>
@@ -25806,7 +25797,7 @@
         <w:spacing w:before="240" w:after="120" w:line="360" w:lineRule="auto"/>
         <w:outlineLvl w:val="1"/>
       </w:pPr>
-      <w:bookmarkStart w:id="46" w:name="_Toc228286746"/>
+      <w:bookmarkStart w:id="46" w:name="_Toc228306667"/>
       <w:r>
         <w:rPr>
           <w:rFonts w:eastAsia="黑体"/>
@@ -26709,7 +26700,7 @@
         <w:spacing w:before="240" w:after="120" w:line="360" w:lineRule="auto"/>
         <w:outlineLvl w:val="1"/>
       </w:pPr>
-      <w:bookmarkStart w:id="47" w:name="_Toc228286747"/>
+      <w:bookmarkStart w:id="47" w:name="_Toc228306668"/>
       <w:r>
         <w:rPr>
           <w:rFonts w:eastAsia="黑体"/>
@@ -27917,7 +27908,7 @@
         <w:spacing w:before="240" w:after="120" w:line="360" w:lineRule="auto"/>
         <w:outlineLvl w:val="1"/>
       </w:pPr>
-      <w:bookmarkStart w:id="48" w:name="_Toc228286748"/>
+      <w:bookmarkStart w:id="48" w:name="_Toc228306669"/>
       <w:r>
         <w:rPr>
           <w:rFonts w:eastAsia="黑体"/>
@@ -30168,7 +30159,7 @@
         <w:spacing w:before="240" w:after="120" w:line="360" w:lineRule="auto"/>
         <w:outlineLvl w:val="1"/>
       </w:pPr>
-      <w:bookmarkStart w:id="49" w:name="_Toc228286749"/>
+      <w:bookmarkStart w:id="49" w:name="_Toc228306670"/>
       <w:r>
         <w:rPr>
           <w:rFonts w:eastAsia="黑体"/>
@@ -30457,7 +30448,7 @@
             </w:pPr>
             <w:r>
               <w:rPr>
-                <w:rFonts w:eastAsia="黑体"/>
+                <w:rFonts w:eastAsia="黑体" w:hint="eastAsia"/>
                 <w:b/>
                 <w:sz w:val="17"/>
                 <w:szCs w:val="18"/>
@@ -30632,12 +30623,12 @@
             </w:pPr>
             <w:r>
               <w:rPr>
-                <w:rFonts w:eastAsia="黑体"/>
+                <w:rFonts w:eastAsia="黑体" w:hint="eastAsia"/>
                 <w:b/>
                 <w:sz w:val="17"/>
                 <w:szCs w:val="18"/>
               </w:rPr>
-              <w:t>延迟</w:t>
+              <w:t>工作耗时</w:t>
             </w:r>
           </w:p>
         </w:tc>
@@ -30667,12 +30658,12 @@
             </w:pPr>
             <w:r>
               <w:rPr>
-                <w:rFonts w:eastAsia="黑体"/>
+                <w:rFonts w:eastAsia="黑体" w:hint="eastAsia"/>
                 <w:b/>
                 <w:sz w:val="17"/>
                 <w:szCs w:val="18"/>
               </w:rPr>
-              <w:t>CPU</w:t>
+              <w:t>端到端延迟</w:t>
             </w:r>
           </w:p>
         </w:tc>
@@ -30702,12 +30693,12 @@
             </w:pPr>
             <w:r>
               <w:rPr>
-                <w:rFonts w:eastAsia="黑体"/>
+                <w:rFonts w:eastAsia="黑体" w:hint="eastAsia"/>
                 <w:b/>
                 <w:sz w:val="17"/>
                 <w:szCs w:val="18"/>
               </w:rPr>
-              <w:t>RSS</w:t>
+              <w:t>丢帧</w:t>
             </w:r>
           </w:p>
         </w:tc>
@@ -30737,12 +30728,12 @@
             </w:pPr>
             <w:r>
               <w:rPr>
-                <w:rFonts w:eastAsia="黑体"/>
+                <w:rFonts w:eastAsia="黑体" w:hint="eastAsia"/>
                 <w:b/>
                 <w:sz w:val="17"/>
                 <w:szCs w:val="18"/>
               </w:rPr>
-              <w:t>丢帧</w:t>
+              <w:t>说明</w:t>
             </w:r>
           </w:p>
         </w:tc>
@@ -30806,7 +30797,7 @@
                 <w:sz w:val="17"/>
                 <w:szCs w:val="18"/>
               </w:rPr>
-              <w:t>2</w:t>
+              <w:t>1</w:t>
             </w:r>
           </w:p>
         </w:tc>
@@ -30864,7 +30855,7 @@
                 <w:sz w:val="17"/>
                 <w:szCs w:val="18"/>
               </w:rPr>
-              <w:t>10.37</w:t>
+              <w:t>6.80</w:t>
             </w:r>
           </w:p>
         </w:tc>
@@ -30893,7 +30884,7 @@
                 <w:sz w:val="17"/>
                 <w:szCs w:val="18"/>
               </w:rPr>
-              <w:t>5.18</w:t>
+              <w:t>6.80</w:t>
             </w:r>
           </w:p>
         </w:tc>
@@ -30922,7 +30913,7 @@
                 <w:sz w:val="17"/>
                 <w:szCs w:val="18"/>
               </w:rPr>
-              <w:t>109.06 ms</w:t>
+              <w:t>141.30 ms</w:t>
             </w:r>
           </w:p>
         </w:tc>
@@ -30951,7 +30942,7 @@
                 <w:sz w:val="17"/>
                 <w:szCs w:val="18"/>
               </w:rPr>
-              <w:t>121.5%</w:t>
+              <w:t>254.88 ms</w:t>
             </w:r>
           </w:p>
         </w:tc>
@@ -30980,7 +30971,7 @@
                 <w:sz w:val="17"/>
                 <w:szCs w:val="18"/>
               </w:rPr>
-              <w:t>205.5 MB</w:t>
+              <w:t>364 capture / 0 publish</w:t>
             </w:r>
           </w:p>
         </w:tc>
@@ -31005,10 +30996,27 @@
             </w:pPr>
             <w:r>
               <w:rPr>
+                <w:rFonts w:hint="eastAsia"/>
                 <w:sz w:val="17"/>
                 <w:szCs w:val="18"/>
               </w:rPr>
-              <w:t>0 capture / 0 publish</w:t>
+              <w:t>单</w:t>
+            </w:r>
+            <w:r>
+              <w:rPr>
+                <w:rFonts w:hint="eastAsia"/>
+                <w:sz w:val="17"/>
+                <w:szCs w:val="18"/>
+              </w:rPr>
+              <w:t>context</w:t>
+            </w:r>
+            <w:r>
+              <w:rPr>
+                <w:rFonts w:hint="eastAsia"/>
+                <w:sz w:val="17"/>
+                <w:szCs w:val="18"/>
+              </w:rPr>
+              <w:t>全帧推理基线</w:t>
             </w:r>
           </w:p>
         </w:tc>
@@ -31101,7 +31109,7 @@
                 <w:sz w:val="17"/>
                 <w:szCs w:val="18"/>
               </w:rPr>
-              <w:t>1</w:t>
+              <w:t>2</w:t>
             </w:r>
           </w:p>
         </w:tc>
@@ -31130,7 +31138,7 @@
                 <w:sz w:val="17"/>
                 <w:szCs w:val="18"/>
               </w:rPr>
-              <w:t>8.59</w:t>
+              <w:t>13.71</w:t>
             </w:r>
           </w:p>
         </w:tc>
@@ -31159,7 +31167,7 @@
                 <w:sz w:val="17"/>
                 <w:szCs w:val="18"/>
               </w:rPr>
-              <w:t>8.59</w:t>
+              <w:t>13.71</w:t>
             </w:r>
           </w:p>
         </w:tc>
@@ -31188,7 +31196,7 @@
                 <w:sz w:val="17"/>
                 <w:szCs w:val="18"/>
               </w:rPr>
-              <w:t>268.89 ms</w:t>
+              <w:t>124.91 ms</w:t>
             </w:r>
           </w:p>
         </w:tc>
@@ -31217,7 +31225,7 @@
                 <w:sz w:val="17"/>
                 <w:szCs w:val="18"/>
               </w:rPr>
-              <w:t>144.7%</w:t>
+              <w:t>215.25 ms</w:t>
             </w:r>
           </w:p>
         </w:tc>
@@ -31246,7 +31254,7 @@
                 <w:sz w:val="17"/>
                 <w:szCs w:val="18"/>
               </w:rPr>
-              <w:t>206.3 MB</w:t>
+              <w:t>0 capture / 0 publish</w:t>
             </w:r>
           </w:p>
         </w:tc>
@@ -31271,10 +31279,27 @@
             </w:pPr>
             <w:r>
               <w:rPr>
+                <w:rFonts w:hint="eastAsia"/>
                 <w:sz w:val="17"/>
                 <w:szCs w:val="18"/>
               </w:rPr>
-              <w:t>116 capture / 0 publish</w:t>
+              <w:t>双</w:t>
+            </w:r>
+            <w:r>
+              <w:rPr>
+                <w:rFonts w:hint="eastAsia"/>
+                <w:sz w:val="17"/>
+                <w:szCs w:val="18"/>
+              </w:rPr>
+              <w:t>context</w:t>
+            </w:r>
+            <w:r>
+              <w:rPr>
+                <w:rFonts w:hint="eastAsia"/>
+                <w:sz w:val="17"/>
+                <w:szCs w:val="18"/>
+              </w:rPr>
+              <w:t>全帧推理，吞吐提升明显</w:t>
             </w:r>
           </w:p>
         </w:tc>
@@ -31338,7 +31363,7 @@
                 <w:sz w:val="17"/>
                 <w:szCs w:val="18"/>
               </w:rPr>
-              <w:t>1</w:t>
+              <w:t>2</w:t>
             </w:r>
           </w:p>
         </w:tc>
@@ -31367,7 +31392,7 @@
                 <w:sz w:val="17"/>
                 <w:szCs w:val="18"/>
               </w:rPr>
-              <w:t>2</w:t>
+              <w:t>1</w:t>
             </w:r>
           </w:p>
         </w:tc>
@@ -31396,7 +31421,7 @@
                 <w:sz w:val="17"/>
                 <w:szCs w:val="18"/>
               </w:rPr>
-              <w:t>10.63</w:t>
+              <w:t>12.16</w:t>
             </w:r>
           </w:p>
         </w:tc>
@@ -31425,7 +31450,7 @@
                 <w:sz w:val="17"/>
                 <w:szCs w:val="18"/>
               </w:rPr>
-              <w:t>10.64</w:t>
+              <w:t>6.75</w:t>
             </w:r>
           </w:p>
         </w:tc>
@@ -31454,7 +31479,7 @@
                 <w:sz w:val="17"/>
                 <w:szCs w:val="18"/>
               </w:rPr>
-              <w:t>173.58 ms</w:t>
+              <w:t>128.32 ms</w:t>
             </w:r>
           </w:p>
         </w:tc>
@@ -31483,7 +31508,7 @@
                 <w:sz w:val="17"/>
                 <w:szCs w:val="18"/>
               </w:rPr>
-              <w:t>143.4%</w:t>
+              <w:t>188.97 ms</w:t>
             </w:r>
           </w:p>
         </w:tc>
@@ -31512,7 +31537,7 @@
                 <w:sz w:val="17"/>
                 <w:szCs w:val="18"/>
               </w:rPr>
-              <w:t>233.7 MB</w:t>
+              <w:t>69 capture / 0 publish</w:t>
             </w:r>
           </w:p>
         </w:tc>
@@ -31537,10 +31562,11 @@
             </w:pPr>
             <w:r>
               <w:rPr>
+                <w:rFonts w:hint="eastAsia"/>
                 <w:sz w:val="17"/>
                 <w:szCs w:val="18"/>
               </w:rPr>
-              <w:t>0 capture / 0 publish</w:t>
+              <w:t>检测更频繁，延迟适中</w:t>
             </w:r>
           </w:p>
         </w:tc>
@@ -31604,7 +31630,7 @@
                 <w:sz w:val="17"/>
                 <w:szCs w:val="18"/>
               </w:rPr>
-              <w:t>1</w:t>
+              <w:t>3</w:t>
             </w:r>
           </w:p>
         </w:tc>
@@ -31633,7 +31659,7 @@
                 <w:sz w:val="17"/>
                 <w:szCs w:val="18"/>
               </w:rPr>
-              <w:t>3</w:t>
+              <w:t>1</w:t>
             </w:r>
           </w:p>
         </w:tc>
@@ -31662,7 +31688,7 @@
                 <w:sz w:val="17"/>
                 <w:szCs w:val="18"/>
               </w:rPr>
-              <w:t>10.45</w:t>
+              <w:t>13.40</w:t>
             </w:r>
           </w:p>
         </w:tc>
@@ -31691,7 +31717,7 @@
                 <w:sz w:val="17"/>
                 <w:szCs w:val="18"/>
               </w:rPr>
-              <w:t>10.45</w:t>
+              <w:t>4.45</w:t>
             </w:r>
           </w:p>
         </w:tc>
@@ -31720,7 +31746,7 @@
                 <w:sz w:val="17"/>
                 <w:szCs w:val="18"/>
               </w:rPr>
-              <w:t>179.59 ms</w:t>
+              <w:t>87.81 ms</w:t>
             </w:r>
           </w:p>
         </w:tc>
@@ -31749,7 +31775,7 @@
                 <w:sz w:val="17"/>
                 <w:szCs w:val="18"/>
               </w:rPr>
-              <w:t>147.7%</w:t>
+              <w:t>92.16 ms</w:t>
             </w:r>
           </w:p>
         </w:tc>
@@ -31778,7 +31804,7 @@
                 <w:sz w:val="17"/>
                 <w:szCs w:val="18"/>
               </w:rPr>
-              <w:t>239.0 MB</w:t>
+              <w:t>0 capture / 0 publish</w:t>
             </w:r>
           </w:p>
         </w:tc>
@@ -31803,10 +31829,11 @@
             </w:pPr>
             <w:r>
               <w:rPr>
+                <w:rFonts w:hint="eastAsia"/>
                 <w:sz w:val="17"/>
                 <w:szCs w:val="18"/>
               </w:rPr>
-              <w:t>0 capture / 0 publish</w:t>
+              <w:t>低延迟实时观看配置</w:t>
             </w:r>
           </w:p>
         </w:tc>
@@ -31838,19 +31865,7 @@
         <w:rPr>
           <w:szCs w:val="24"/>
         </w:rPr>
-        <w:t>每帧检测并不适合作为实时默认配置。虽然其</w:t>
-      </w:r>
-      <w:r>
-        <w:rPr>
-          <w:szCs w:val="24"/>
-        </w:rPr>
-        <w:t>NPU</w:t>
-      </w:r>
-      <w:r>
-        <w:rPr>
-          <w:szCs w:val="24"/>
-        </w:rPr>
-        <w:t>推理频率高于跳帧策略，但</w:t>
+        <w:t>每帧检测不适合作为实时默认配置。其</w:t>
       </w:r>
       <w:r>
         <w:rPr>
@@ -31862,31 +31877,43 @@
         <w:rPr>
           <w:szCs w:val="24"/>
         </w:rPr>
-        <w:t>下降到</w:t>
-      </w:r>
-      <w:r>
-        <w:rPr>
-          <w:szCs w:val="24"/>
-        </w:rPr>
-        <w:t>8.59 FPS</w:t>
-      </w:r>
-      <w:r>
-        <w:rPr>
-          <w:szCs w:val="24"/>
-        </w:rPr>
-        <w:t>，端到端延迟升高到</w:t>
-      </w:r>
-      <w:r>
-        <w:rPr>
-          <w:szCs w:val="24"/>
-        </w:rPr>
-        <w:t>268.89 ms</w:t>
-      </w:r>
-      <w:r>
-        <w:rPr>
-          <w:szCs w:val="24"/>
-        </w:rPr>
-        <w:t>，并出现采集丢帧。双</w:t>
+        <w:t>仅为</w:t>
+      </w:r>
+      <w:r>
+        <w:rPr>
+          <w:szCs w:val="24"/>
+        </w:rPr>
+        <w:t>6.80 FPS</w:t>
+      </w:r>
+      <w:r>
+        <w:rPr>
+          <w:szCs w:val="24"/>
+        </w:rPr>
+        <w:t>，端到端延迟为</w:t>
+      </w:r>
+      <w:r>
+        <w:rPr>
+          <w:szCs w:val="24"/>
+        </w:rPr>
+        <w:t>254.88 ms</w:t>
+      </w:r>
+      <w:r>
+        <w:rPr>
+          <w:szCs w:val="24"/>
+        </w:rPr>
+        <w:t>，并出现</w:t>
+      </w:r>
+      <w:r>
+        <w:rPr>
+          <w:szCs w:val="24"/>
+        </w:rPr>
+        <w:t>364</w:t>
+      </w:r>
+      <w:r>
+        <w:rPr>
+          <w:szCs w:val="24"/>
+        </w:rPr>
+        <w:t>帧采集丢帧。双</w:t>
       </w:r>
       <w:r>
         <w:rPr>
@@ -31904,7 +31931,19 @@
         <w:rPr>
           <w:szCs w:val="24"/>
         </w:rPr>
-        <w:t>NPU FPS</w:t>
+        <w:t>stream_fps</w:t>
+      </w:r>
+      <w:r>
+        <w:rPr>
+          <w:szCs w:val="24"/>
+        </w:rPr>
+        <w:t>和</w:t>
+      </w:r>
+      <w:r>
+        <w:rPr>
+          <w:szCs w:val="24"/>
+        </w:rPr>
+        <w:t>npu_fps</w:t>
       </w:r>
       <w:r>
         <w:rPr>
@@ -31916,13 +31955,13 @@
         <w:rPr>
           <w:szCs w:val="24"/>
         </w:rPr>
-        <w:t>10.64 FPS</w:t>
-      </w:r>
-      <w:r>
-        <w:rPr>
-          <w:szCs w:val="24"/>
-        </w:rPr>
-        <w:t>，同时消除了采集丢帧，表明多</w:t>
+        <w:t>13.71 FPS</w:t>
+      </w:r>
+      <w:r>
+        <w:rPr>
+          <w:szCs w:val="24"/>
+        </w:rPr>
+        <w:t>，同时消除了采集和发布丢帧，说明多</w:t>
       </w:r>
       <w:r>
         <w:rPr>
@@ -31934,7 +31973,7 @@
         <w:rPr>
           <w:szCs w:val="24"/>
         </w:rPr>
-        <w:t>机制提高了每帧检测场景下的吞吐能力。</w:t>
+        <w:t>机制能够显著提升每帧检测场景下的吞吐能力。</w:t>
       </w:r>
     </w:p>
     <w:p>
@@ -31946,55 +31985,79 @@
         <w:rPr>
           <w:szCs w:val="24"/>
         </w:rPr>
-        <w:t>然而，三</w:t>
-      </w:r>
-      <w:r>
-        <w:rPr>
-          <w:szCs w:val="24"/>
-        </w:rPr>
-        <w:t>context</w:t>
-      </w:r>
-      <w:r>
-        <w:rPr>
-          <w:szCs w:val="24"/>
-        </w:rPr>
-        <w:t>并没有进一步提升性能，反而在延迟和内存占用方面略差于双</w:t>
-      </w:r>
-      <w:r>
-        <w:rPr>
-          <w:szCs w:val="24"/>
-        </w:rPr>
-        <w:t>context</w:t>
-      </w:r>
-      <w:r>
-        <w:rPr>
-          <w:szCs w:val="24"/>
-        </w:rPr>
-        <w:t>。这说明在当前系统中，两个</w:t>
-      </w:r>
-      <w:r>
-        <w:rPr>
-          <w:szCs w:val="24"/>
-        </w:rPr>
-        <w:t>context</w:t>
-      </w:r>
-      <w:r>
-        <w:rPr>
-          <w:szCs w:val="24"/>
-        </w:rPr>
-        <w:t>之后瓶颈已经不再只是</w:t>
-      </w:r>
-      <w:r>
-        <w:rPr>
-          <w:szCs w:val="24"/>
-        </w:rPr>
-        <w:t>NPU context</w:t>
-      </w:r>
-      <w:r>
-        <w:rPr>
-          <w:szCs w:val="24"/>
-        </w:rPr>
-        <w:t>数量，输入设置、内存传输、线程调度和输出发布等环节开始限制整体性能。</w:t>
+        <w:t>从同一公开视频输入下的策略对比看，</w:t>
+      </w:r>
+      <w:r>
+        <w:rPr>
+          <w:szCs w:val="24"/>
+        </w:rPr>
+        <w:t>detect_every_n=2</w:t>
+      </w:r>
+      <w:r>
+        <w:rPr>
+          <w:szCs w:val="24"/>
+        </w:rPr>
+        <w:t>在保持较高检测刷新频率的同时，将端到端延迟降低到</w:t>
+      </w:r>
+      <w:r>
+        <w:rPr>
+          <w:szCs w:val="24"/>
+        </w:rPr>
+        <w:t>188.97 ms</w:t>
+      </w:r>
+      <w:r>
+        <w:rPr>
+          <w:szCs w:val="24"/>
+        </w:rPr>
+        <w:t>；</w:t>
+      </w:r>
+      <w:r>
+        <w:rPr>
+          <w:szCs w:val="24"/>
+        </w:rPr>
+        <w:t>detect_every_n=3</w:t>
+      </w:r>
+      <w:r>
+        <w:rPr>
+          <w:szCs w:val="24"/>
+        </w:rPr>
+        <w:t>进一步将平均端到端延迟降低到</w:t>
+      </w:r>
+      <w:r>
+        <w:rPr>
+          <w:szCs w:val="24"/>
+        </w:rPr>
+        <w:t>92.16 ms</w:t>
+      </w:r>
+      <w:r>
+        <w:rPr>
+          <w:szCs w:val="24"/>
+        </w:rPr>
+        <w:t>，并保持</w:t>
+      </w:r>
+      <w:r>
+        <w:rPr>
+          <w:szCs w:val="24"/>
+        </w:rPr>
+        <w:t>13.40 FPS</w:t>
+      </w:r>
+      <w:r>
+        <w:rPr>
+          <w:szCs w:val="24"/>
+        </w:rPr>
+        <w:t>输出。该结果说明，实时观看场景不能只追求每帧检测，还需要结合检测间隔、动态</w:t>
+      </w:r>
+      <w:r>
+        <w:rPr>
+          <w:szCs w:val="24"/>
+        </w:rPr>
+        <w:t>ROI</w:t>
+      </w:r>
+      <w:r>
+        <w:rPr>
+          <w:szCs w:val="24"/>
+        </w:rPr>
+        <w:t>、轻量跟踪和框平滑来控制端到端延迟。</w:t>
       </w:r>
     </w:p>
     <w:p>
@@ -32006,7 +32069,7 @@
         <w:rPr>
           <w:szCs w:val="24"/>
         </w:rPr>
-        <w:t>因此，多</w:t>
+        <w:t>因此，本轮矩阵实验形成两条结论。第一，从硬件优化角度看，双</w:t>
       </w:r>
       <w:r>
         <w:rPr>
@@ -32018,19 +32081,7 @@
         <w:rPr>
           <w:szCs w:val="24"/>
         </w:rPr>
-        <w:t>实验可形成两条结论。第一，从硬件优化角度看，双</w:t>
-      </w:r>
-      <w:r>
-        <w:rPr>
-          <w:szCs w:val="24"/>
-        </w:rPr>
-        <w:t>context</w:t>
-      </w:r>
-      <w:r>
-        <w:rPr>
-          <w:szCs w:val="24"/>
-        </w:rPr>
-        <w:t>是本实验配置下较有效的</w:t>
+        <w:t>是当前配置下最有效的</w:t>
       </w:r>
       <w:r>
         <w:rPr>
@@ -32042,31 +32093,43 @@
         <w:rPr>
           <w:szCs w:val="24"/>
         </w:rPr>
-        <w:t>并行配置，实验结果表明</w:t>
-      </w:r>
-      <w:r>
-        <w:rPr>
-          <w:szCs w:val="24"/>
-        </w:rPr>
-        <w:t>RK3588 NPU</w:t>
-      </w:r>
-      <w:r>
-        <w:rPr>
-          <w:szCs w:val="24"/>
-        </w:rPr>
-        <w:t>多</w:t>
-      </w:r>
-      <w:r>
-        <w:rPr>
-          <w:szCs w:val="24"/>
-        </w:rPr>
-        <w:t>context</w:t>
-      </w:r>
-      <w:r>
-        <w:rPr>
-          <w:szCs w:val="24"/>
-        </w:rPr>
-        <w:t>并行对吞吐有实际提升。第二，从实时演示角度看，</w:t>
+        <w:t>并行实验方案，可以作为导师要求的</w:t>
+      </w:r>
+      <w:r>
+        <w:rPr>
+          <w:szCs w:val="24"/>
+        </w:rPr>
+        <w:t>NPU</w:t>
+      </w:r>
+      <w:r>
+        <w:rPr>
+          <w:szCs w:val="24"/>
+        </w:rPr>
+        <w:t>多线程方向的主要数据支撑。第二，从最终演示角度看，</w:t>
+      </w:r>
+      <w:r>
+        <w:rPr>
+          <w:szCs w:val="24"/>
+        </w:rPr>
+        <w:t>detect_every_n=3</w:t>
+      </w:r>
+      <w:r>
+        <w:rPr>
+          <w:szCs w:val="24"/>
+        </w:rPr>
+        <w:t>配合动态</w:t>
+      </w:r>
+      <w:r>
+        <w:rPr>
+          <w:szCs w:val="24"/>
+        </w:rPr>
+        <w:t>ROI</w:t>
+      </w:r>
+      <w:r>
+        <w:rPr>
+          <w:szCs w:val="24"/>
+        </w:rPr>
+        <w:t>、运动预测和框平滑更适合作为低延迟实时观看配置；若更强调目标检测刷新频率，则可切换到</w:t>
       </w:r>
       <w:r>
         <w:rPr>
@@ -32078,19 +32141,7 @@
         <w:rPr>
           <w:szCs w:val="24"/>
         </w:rPr>
-        <w:t>或</w:t>
-      </w:r>
-      <w:r>
-        <w:rPr>
-          <w:szCs w:val="24"/>
-        </w:rPr>
-        <w:t>detect_every_n=3</w:t>
-      </w:r>
-      <w:r>
-        <w:rPr>
-          <w:szCs w:val="24"/>
-        </w:rPr>
-        <w:t>的策略模式仍然更适合作为低延迟观看配置。</w:t>
+        <w:t>。</w:t>
       </w:r>
     </w:p>
     <w:p>
@@ -32098,7 +32149,7 @@
         <w:spacing w:before="240" w:after="120" w:line="360" w:lineRule="auto"/>
         <w:outlineLvl w:val="1"/>
       </w:pPr>
-      <w:bookmarkStart w:id="50" w:name="_Toc228286750"/>
+      <w:bookmarkStart w:id="50" w:name="_Toc228306671"/>
       <w:r>
         <w:rPr>
           <w:rFonts w:eastAsia="黑体"/>
@@ -32194,6 +32245,7 @@
         <w:rPr>
           <w:szCs w:val="24"/>
         </w:rPr>
+        <w:lastRenderedPageBreak/>
         <w:t>outputs_get</w:t>
       </w:r>
       <w:r>
@@ -33559,7 +33611,7 @@
         <w:spacing w:before="240" w:after="120" w:line="360" w:lineRule="auto"/>
         <w:outlineLvl w:val="1"/>
       </w:pPr>
-      <w:bookmarkStart w:id="51" w:name="_Toc228286751"/>
+      <w:bookmarkStart w:id="51" w:name="_Toc228306672"/>
       <w:r>
         <w:rPr>
           <w:rFonts w:eastAsia="黑体"/>
@@ -33589,7 +33641,31 @@
         <w:rPr>
           <w:szCs w:val="24"/>
         </w:rPr>
-        <w:t>基于阶段耗时分析，本文进一步尝试</w:t>
+        <w:t>基于阶段耗时分析，本文进一步比较了</w:t>
+      </w:r>
+      <w:r>
+        <w:rPr>
+          <w:szCs w:val="24"/>
+        </w:rPr>
+        <w:t>OpenCV</w:t>
+      </w:r>
+      <w:r>
+        <w:rPr>
+          <w:szCs w:val="24"/>
+        </w:rPr>
+        <w:t>默认预处理、</w:t>
+      </w:r>
+      <w:r>
+        <w:rPr>
+          <w:szCs w:val="24"/>
+        </w:rPr>
+        <w:t>RGA</w:t>
+      </w:r>
+      <w:r>
+        <w:rPr>
+          <w:szCs w:val="24"/>
+        </w:rPr>
+        <w:t>颜色转换与缩放路径，以及</w:t>
       </w:r>
       <w:r>
         <w:rPr>
@@ -33601,31 +33677,7 @@
         <w:rPr>
           <w:szCs w:val="24"/>
         </w:rPr>
-        <w:t>输入路径，希望降低</w:t>
-      </w:r>
-      <w:r>
-        <w:rPr>
-          <w:szCs w:val="24"/>
-        </w:rPr>
-        <w:t>rknn_inputs_set</w:t>
-      </w:r>
-      <w:r>
-        <w:rPr>
-          <w:szCs w:val="24"/>
-        </w:rPr>
-        <w:t>的输入设置开销。实验通过</w:t>
-      </w:r>
-      <w:r>
-        <w:rPr>
-          <w:szCs w:val="24"/>
-        </w:rPr>
-        <w:t>RK_YOLO_ZERO_COPY_INPUT</w:t>
-      </w:r>
-      <w:r>
-        <w:rPr>
-          <w:szCs w:val="24"/>
-        </w:rPr>
-        <w:t>环境变量控制，默认关闭，以避免影响稳定演示路径。</w:t>
+        <w:t>输入路径。三种路径均通过环境变量控制，默认关闭实验路径，以避免影响稳定演示。</w:t>
       </w:r>
     </w:p>
     <w:p>
@@ -33637,7 +33689,43 @@
         <w:rPr>
           <w:szCs w:val="24"/>
         </w:rPr>
-        <w:t>在</w:t>
+        <w:t>其中，</w:t>
+      </w:r>
+      <w:r>
+        <w:rPr>
+          <w:szCs w:val="24"/>
+        </w:rPr>
+        <w:t>RGA</w:t>
+      </w:r>
+      <w:r>
+        <w:rPr>
+          <w:szCs w:val="24"/>
+        </w:rPr>
+        <w:t>路径通过</w:t>
+      </w:r>
+      <w:r>
+        <w:rPr>
+          <w:szCs w:val="24"/>
+        </w:rPr>
+        <w:t>RK_YOLO_PREPROCESS=rga_cvt_resize</w:t>
+      </w:r>
+      <w:r>
+        <w:rPr>
+          <w:szCs w:val="24"/>
+        </w:rPr>
+        <w:t>启用，用于验证颜色空间转换与缩放是否可以部分交给</w:t>
+      </w:r>
+      <w:r>
+        <w:rPr>
+          <w:szCs w:val="24"/>
+        </w:rPr>
+        <w:t>RGA</w:t>
+      </w:r>
+      <w:r>
+        <w:rPr>
+          <w:szCs w:val="24"/>
+        </w:rPr>
+        <w:t>执行；</w:t>
       </w:r>
       <w:r>
         <w:rPr>
@@ -33649,7 +33737,19 @@
         <w:rPr>
           <w:szCs w:val="24"/>
         </w:rPr>
-        <w:t>实验中，程序使用</w:t>
+        <w:t>路径通过</w:t>
+      </w:r>
+      <w:r>
+        <w:rPr>
+          <w:szCs w:val="24"/>
+        </w:rPr>
+        <w:t>RK_YOLO_ZERO_COPY_INPUT=1</w:t>
+      </w:r>
+      <w:r>
+        <w:rPr>
+          <w:szCs w:val="24"/>
+        </w:rPr>
+        <w:t>启用，程序使用</w:t>
       </w:r>
       <w:r>
         <w:rPr>
@@ -33685,7 +33785,7 @@
         <w:rPr>
           <w:szCs w:val="24"/>
         </w:rPr>
-        <w:t>将其绑定到模型输入。实验结果如表</w:t>
+        <w:t>将其绑定到模型输入。固定视频硬件输入路径实验结果如表</w:t>
       </w:r>
       <w:r>
         <w:rPr>
@@ -33724,14 +33824,14 @@
           <w:sz w:val="21"/>
           <w:szCs w:val="21"/>
         </w:rPr>
-        <w:t xml:space="preserve">5.10 Zero-copy </w:t>
+        <w:t xml:space="preserve">5.10 </w:t>
       </w:r>
       <w:r>
         <w:rPr>
           <w:sz w:val="21"/>
           <w:szCs w:val="21"/>
         </w:rPr>
-        <w:t>输入实验结果</w:t>
+        <w:t>固定视频硬件输入路径实验结果</w:t>
       </w:r>
     </w:p>
     <w:tbl>
@@ -33784,12 +33884,12 @@
             </w:pPr>
             <w:r>
               <w:rPr>
-                <w:rFonts w:eastAsia="黑体"/>
+                <w:rFonts w:eastAsia="黑体" w:hint="eastAsia"/>
                 <w:b/>
                 <w:sz w:val="20"/>
                 <w:szCs w:val="20"/>
               </w:rPr>
-              <w:t>指标</w:t>
+              <w:t>模式</w:t>
             </w:r>
           </w:p>
         </w:tc>
@@ -33820,7 +33920,7 @@
                 <w:sz w:val="20"/>
                 <w:szCs w:val="20"/>
               </w:rPr>
-              <w:t>标准路径</w:t>
+              <w:t>total_work_ms</w:t>
             </w:r>
           </w:p>
         </w:tc>
@@ -33846,12 +33946,12 @@
             </w:pPr>
             <w:r>
               <w:rPr>
-                <w:rFonts w:eastAsia="黑体"/>
+                <w:rFonts w:eastAsia="黑体" w:hint="eastAsia"/>
                 <w:b/>
                 <w:sz w:val="20"/>
                 <w:szCs w:val="20"/>
               </w:rPr>
-              <w:t>Zero-copy</w:t>
+              <w:t>关键观察</w:t>
             </w:r>
           </w:p>
         </w:tc>
@@ -33881,7 +33981,7 @@
                 <w:sz w:val="20"/>
                 <w:szCs w:val="20"/>
               </w:rPr>
-              <w:t>Stream FPS</w:t>
+              <w:t>OpenCV baseline</w:t>
             </w:r>
           </w:p>
         </w:tc>
@@ -33906,7 +34006,7 @@
                 <w:sz w:val="20"/>
                 <w:szCs w:val="20"/>
               </w:rPr>
-              <w:t>8.57</w:t>
+              <w:t>146.60 ms</w:t>
             </w:r>
           </w:p>
         </w:tc>
@@ -33928,10 +34028,27 @@
             </w:pPr>
             <w:r>
               <w:rPr>
-                <w:sz w:val="20"/>
-                <w:szCs w:val="20"/>
-              </w:rPr>
-              <w:t>8.57</w:t>
+                <w:rFonts w:hint="eastAsia"/>
+                <w:sz w:val="20"/>
+                <w:szCs w:val="20"/>
+              </w:rPr>
+              <w:t>稳定默认路径，检测</w:t>
+            </w:r>
+            <w:r>
+              <w:rPr>
+                <w:rFonts w:hint="eastAsia"/>
+                <w:sz w:val="20"/>
+                <w:szCs w:val="20"/>
+              </w:rPr>
+              <w:t>CSV</w:t>
+            </w:r>
+            <w:r>
+              <w:rPr>
+                <w:rFonts w:hint="eastAsia"/>
+                <w:sz w:val="20"/>
+                <w:szCs w:val="20"/>
+              </w:rPr>
+              <w:t>作为对照基准</w:t>
             </w:r>
           </w:p>
         </w:tc>
@@ -33961,7 +34078,7 @@
                 <w:sz w:val="20"/>
                 <w:szCs w:val="20"/>
               </w:rPr>
-              <w:t>NPU FPS</w:t>
+              <w:t>RGA cvt+resize</w:t>
             </w:r>
           </w:p>
         </w:tc>
@@ -33986,7 +34103,7 @@
                 <w:sz w:val="20"/>
                 <w:szCs w:val="20"/>
               </w:rPr>
-              <w:t>8.57</w:t>
+              <w:t>147.17 ms</w:t>
             </w:r>
           </w:p>
         </w:tc>
@@ -34008,10 +34125,43 @@
             </w:pPr>
             <w:r>
               <w:rPr>
-                <w:sz w:val="20"/>
-                <w:szCs w:val="20"/>
-              </w:rPr>
-              <w:t>8.57</w:t>
+                <w:rFonts w:hint="eastAsia"/>
+                <w:sz w:val="20"/>
+                <w:szCs w:val="20"/>
+              </w:rPr>
+              <w:t>检测</w:t>
+            </w:r>
+            <w:r>
+              <w:rPr>
+                <w:rFonts w:hint="eastAsia"/>
+                <w:sz w:val="20"/>
+                <w:szCs w:val="20"/>
+              </w:rPr>
+              <w:t>CSV</w:t>
+            </w:r>
+            <w:r>
+              <w:rPr>
+                <w:rFonts w:hint="eastAsia"/>
+                <w:sz w:val="20"/>
+                <w:szCs w:val="20"/>
+              </w:rPr>
+              <w:t>与</w:t>
+            </w:r>
+            <w:r>
+              <w:rPr>
+                <w:rFonts w:hint="eastAsia"/>
+                <w:sz w:val="20"/>
+                <w:szCs w:val="20"/>
+              </w:rPr>
+              <w:t>OpenCV</w:t>
+            </w:r>
+            <w:r>
+              <w:rPr>
+                <w:rFonts w:hint="eastAsia"/>
+                <w:sz w:val="20"/>
+                <w:szCs w:val="20"/>
+              </w:rPr>
+              <w:t>一致，但本轮未形成明显加速</w:t>
             </w:r>
           </w:p>
         </w:tc>
@@ -34041,7 +34191,7 @@
                 <w:sz w:val="20"/>
                 <w:szCs w:val="20"/>
               </w:rPr>
-              <w:t>端到端延迟</w:t>
+              <w:t>Zero-copy input</w:t>
             </w:r>
           </w:p>
         </w:tc>
@@ -34066,7 +34216,7 @@
                 <w:sz w:val="20"/>
                 <w:szCs w:val="20"/>
               </w:rPr>
-              <w:t>255.52 ms</w:t>
+              <w:t>137.07 ms</w:t>
             </w:r>
           </w:p>
         </w:tc>
@@ -34088,330 +34238,83 @@
             </w:pPr>
             <w:r>
               <w:rPr>
-                <w:sz w:val="20"/>
-                <w:szCs w:val="20"/>
-              </w:rPr>
-              <w:t>267.19 ms</w:t>
-            </w:r>
-          </w:p>
-        </w:tc>
-      </w:tr>
-      <w:tr>
-        <w:trPr>
-          <w:jc w:val="center"/>
-        </w:trPr>
-        <w:tc>
-          <w:tcPr>
-            <w:tcW w:w="1700" w:type="dxa"/>
-            <w:tcMar>
-              <w:top w:w="90" w:type="dxa"/>
-              <w:left w:w="90" w:type="dxa"/>
-              <w:bottom w:w="90" w:type="dxa"/>
-              <w:right w:w="90" w:type="dxa"/>
-            </w:tcMar>
-            <w:vAlign w:val="center"/>
-          </w:tcPr>
-          <w:p>
-            <w:pPr>
-              <w:spacing w:line="250" w:lineRule="auto"/>
-              <w:jc w:val="center"/>
-            </w:pPr>
-            <w:r>
-              <w:rPr>
-                <w:sz w:val="20"/>
-                <w:szCs w:val="20"/>
-              </w:rPr>
-              <w:t>总推理工作耗时</w:t>
-            </w:r>
-          </w:p>
-        </w:tc>
-        <w:tc>
-          <w:tcPr>
-            <w:tcW w:w="2200" w:type="dxa"/>
-            <w:tcMar>
-              <w:top w:w="90" w:type="dxa"/>
-              <w:left w:w="90" w:type="dxa"/>
-              <w:bottom w:w="90" w:type="dxa"/>
-              <w:right w:w="90" w:type="dxa"/>
-            </w:tcMar>
-            <w:vAlign w:val="center"/>
-          </w:tcPr>
-          <w:p>
-            <w:pPr>
-              <w:spacing w:line="250" w:lineRule="auto"/>
-              <w:jc w:val="center"/>
-            </w:pPr>
-            <w:r>
-              <w:rPr>
-                <w:sz w:val="20"/>
-                <w:szCs w:val="20"/>
-              </w:rPr>
-              <w:t>114.48 ms</w:t>
-            </w:r>
-          </w:p>
-        </w:tc>
-        <w:tc>
-          <w:tcPr>
-            <w:tcW w:w="4300" w:type="dxa"/>
-            <w:tcMar>
-              <w:top w:w="90" w:type="dxa"/>
-              <w:left w:w="90" w:type="dxa"/>
-              <w:bottom w:w="90" w:type="dxa"/>
-              <w:right w:w="90" w:type="dxa"/>
-            </w:tcMar>
-            <w:vAlign w:val="center"/>
-          </w:tcPr>
-          <w:p>
-            <w:pPr>
-              <w:spacing w:line="250" w:lineRule="auto"/>
-              <w:jc w:val="center"/>
-            </w:pPr>
-            <w:r>
-              <w:rPr>
-                <w:sz w:val="20"/>
-                <w:szCs w:val="20"/>
-              </w:rPr>
-              <w:t>118.93 ms</w:t>
-            </w:r>
-          </w:p>
-        </w:tc>
-      </w:tr>
-      <w:tr>
-        <w:trPr>
-          <w:jc w:val="center"/>
-        </w:trPr>
-        <w:tc>
-          <w:tcPr>
-            <w:tcW w:w="1700" w:type="dxa"/>
-            <w:tcMar>
-              <w:top w:w="90" w:type="dxa"/>
-              <w:left w:w="90" w:type="dxa"/>
-              <w:bottom w:w="90" w:type="dxa"/>
-              <w:right w:w="90" w:type="dxa"/>
-            </w:tcMar>
-            <w:vAlign w:val="center"/>
-          </w:tcPr>
-          <w:p>
-            <w:pPr>
-              <w:spacing w:line="250" w:lineRule="auto"/>
-              <w:jc w:val="center"/>
-            </w:pPr>
-            <w:r>
-              <w:rPr>
-                <w:sz w:val="20"/>
-                <w:szCs w:val="20"/>
-              </w:rPr>
-              <w:t>输入设置或更新</w:t>
-            </w:r>
-          </w:p>
-        </w:tc>
-        <w:tc>
-          <w:tcPr>
-            <w:tcW w:w="2200" w:type="dxa"/>
-            <w:tcMar>
-              <w:top w:w="90" w:type="dxa"/>
-              <w:left w:w="90" w:type="dxa"/>
-              <w:bottom w:w="90" w:type="dxa"/>
-              <w:right w:w="90" w:type="dxa"/>
-            </w:tcMar>
-            <w:vAlign w:val="center"/>
-          </w:tcPr>
-          <w:p>
-            <w:pPr>
-              <w:spacing w:line="250" w:lineRule="auto"/>
-              <w:jc w:val="center"/>
-            </w:pPr>
-            <w:r>
-              <w:rPr>
-                <w:sz w:val="20"/>
-                <w:szCs w:val="20"/>
-              </w:rPr>
-              <w:t>62.01 ms</w:t>
-            </w:r>
-          </w:p>
-        </w:tc>
-        <w:tc>
-          <w:tcPr>
-            <w:tcW w:w="4300" w:type="dxa"/>
-            <w:tcMar>
-              <w:top w:w="90" w:type="dxa"/>
-              <w:left w:w="90" w:type="dxa"/>
-              <w:bottom w:w="90" w:type="dxa"/>
-              <w:right w:w="90" w:type="dxa"/>
-            </w:tcMar>
-            <w:vAlign w:val="center"/>
-          </w:tcPr>
-          <w:p>
-            <w:pPr>
-              <w:spacing w:line="250" w:lineRule="auto"/>
-              <w:jc w:val="center"/>
-            </w:pPr>
-            <w:r>
-              <w:rPr>
-                <w:sz w:val="20"/>
-                <w:szCs w:val="20"/>
-              </w:rPr>
-              <w:t>0.43 ms</w:t>
-            </w:r>
-          </w:p>
-        </w:tc>
-      </w:tr>
-      <w:tr>
-        <w:trPr>
-          <w:jc w:val="center"/>
-        </w:trPr>
-        <w:tc>
-          <w:tcPr>
-            <w:tcW w:w="1700" w:type="dxa"/>
-            <w:tcMar>
-              <w:top w:w="90" w:type="dxa"/>
-              <w:left w:w="90" w:type="dxa"/>
-              <w:bottom w:w="90" w:type="dxa"/>
-              <w:right w:w="90" w:type="dxa"/>
-            </w:tcMar>
-            <w:vAlign w:val="center"/>
-          </w:tcPr>
-          <w:p>
-            <w:pPr>
-              <w:spacing w:line="250" w:lineRule="auto"/>
-              <w:jc w:val="center"/>
-            </w:pPr>
-            <w:r>
-              <w:rPr>
+                <w:rFonts w:hint="eastAsia"/>
+                <w:sz w:val="20"/>
+                <w:szCs w:val="20"/>
+              </w:rPr>
+              <w:t>检测</w:t>
+            </w:r>
+            <w:r>
+              <w:rPr>
+                <w:rFonts w:hint="eastAsia"/>
+                <w:sz w:val="20"/>
+                <w:szCs w:val="20"/>
+              </w:rPr>
+              <w:t>CSV</w:t>
+            </w:r>
+            <w:r>
+              <w:rPr>
+                <w:rFonts w:hint="eastAsia"/>
+                <w:sz w:val="20"/>
+                <w:szCs w:val="20"/>
+              </w:rPr>
+              <w:t>与</w:t>
+            </w:r>
+            <w:r>
+              <w:rPr>
+                <w:rFonts w:hint="eastAsia"/>
+                <w:sz w:val="20"/>
+                <w:szCs w:val="20"/>
+              </w:rPr>
+              <w:t>OpenCV</w:t>
+            </w:r>
+            <w:r>
+              <w:rPr>
+                <w:rFonts w:hint="eastAsia"/>
+                <w:sz w:val="20"/>
+                <w:szCs w:val="20"/>
+              </w:rPr>
+              <w:t>一致；输入更新降至</w:t>
+            </w:r>
+            <w:r>
+              <w:rPr>
+                <w:rFonts w:hint="eastAsia"/>
+                <w:sz w:val="20"/>
+                <w:szCs w:val="20"/>
+              </w:rPr>
+              <w:t>0.45 ms</w:t>
+            </w:r>
+            <w:r>
+              <w:rPr>
+                <w:rFonts w:hint="eastAsia"/>
+                <w:sz w:val="20"/>
+                <w:szCs w:val="20"/>
+              </w:rPr>
+              <w:t>，但</w:t>
+            </w:r>
+            <w:r>
+              <w:rPr>
+                <w:rFonts w:hint="eastAsia"/>
                 <w:sz w:val="20"/>
                 <w:szCs w:val="20"/>
               </w:rPr>
               <w:t>rknn_run</w:t>
             </w:r>
-          </w:p>
-        </w:tc>
-        <w:tc>
-          <w:tcPr>
-            <w:tcW w:w="2200" w:type="dxa"/>
-            <w:tcMar>
-              <w:top w:w="90" w:type="dxa"/>
-              <w:left w:w="90" w:type="dxa"/>
-              <w:bottom w:w="90" w:type="dxa"/>
-              <w:right w:w="90" w:type="dxa"/>
-            </w:tcMar>
-            <w:vAlign w:val="center"/>
-          </w:tcPr>
-          <w:p>
-            <w:pPr>
-              <w:spacing w:line="250" w:lineRule="auto"/>
-              <w:jc w:val="center"/>
-            </w:pPr>
-            <w:r>
-              <w:rPr>
-                <w:sz w:val="20"/>
-                <w:szCs w:val="20"/>
-              </w:rPr>
-              <w:t>45.82 ms</w:t>
-            </w:r>
-          </w:p>
-        </w:tc>
-        <w:tc>
-          <w:tcPr>
-            <w:tcW w:w="4300" w:type="dxa"/>
-            <w:tcMar>
-              <w:top w:w="90" w:type="dxa"/>
-              <w:left w:w="90" w:type="dxa"/>
-              <w:bottom w:w="90" w:type="dxa"/>
-              <w:right w:w="90" w:type="dxa"/>
-            </w:tcMar>
-            <w:vAlign w:val="center"/>
-          </w:tcPr>
-          <w:p>
-            <w:pPr>
-              <w:spacing w:line="250" w:lineRule="auto"/>
-              <w:jc w:val="center"/>
-            </w:pPr>
-            <w:r>
-              <w:rPr>
-                <w:sz w:val="20"/>
-                <w:szCs w:val="20"/>
-              </w:rPr>
-              <w:t>111.36 ms</w:t>
-            </w:r>
-          </w:p>
-        </w:tc>
-      </w:tr>
-      <w:tr>
-        <w:trPr>
-          <w:jc w:val="center"/>
-        </w:trPr>
-        <w:tc>
-          <w:tcPr>
-            <w:tcW w:w="1700" w:type="dxa"/>
-            <w:tcMar>
-              <w:top w:w="90" w:type="dxa"/>
-              <w:left w:w="90" w:type="dxa"/>
-              <w:bottom w:w="90" w:type="dxa"/>
-              <w:right w:w="90" w:type="dxa"/>
-            </w:tcMar>
-            <w:vAlign w:val="center"/>
-          </w:tcPr>
-          <w:p>
-            <w:pPr>
-              <w:spacing w:line="250" w:lineRule="auto"/>
-              <w:jc w:val="center"/>
-            </w:pPr>
-            <w:r>
-              <w:rPr>
-                <w:sz w:val="20"/>
-                <w:szCs w:val="20"/>
-              </w:rPr>
-              <w:t>Decode + NMS</w:t>
-            </w:r>
-          </w:p>
-        </w:tc>
-        <w:tc>
-          <w:tcPr>
-            <w:tcW w:w="2200" w:type="dxa"/>
-            <w:tcMar>
-              <w:top w:w="90" w:type="dxa"/>
-              <w:left w:w="90" w:type="dxa"/>
-              <w:bottom w:w="90" w:type="dxa"/>
-              <w:right w:w="90" w:type="dxa"/>
-            </w:tcMar>
-            <w:vAlign w:val="center"/>
-          </w:tcPr>
-          <w:p>
-            <w:pPr>
-              <w:spacing w:line="250" w:lineRule="auto"/>
-              <w:jc w:val="center"/>
-            </w:pPr>
-            <w:r>
-              <w:rPr>
-                <w:sz w:val="20"/>
-                <w:szCs w:val="20"/>
-              </w:rPr>
-              <w:t>2.40 ms</w:t>
-            </w:r>
-          </w:p>
-        </w:tc>
-        <w:tc>
-          <w:tcPr>
-            <w:tcW w:w="4300" w:type="dxa"/>
-            <w:tcMar>
-              <w:top w:w="90" w:type="dxa"/>
-              <w:left w:w="90" w:type="dxa"/>
-              <w:bottom w:w="90" w:type="dxa"/>
-              <w:right w:w="90" w:type="dxa"/>
-            </w:tcMar>
-            <w:vAlign w:val="center"/>
-          </w:tcPr>
-          <w:p>
-            <w:pPr>
-              <w:spacing w:line="250" w:lineRule="auto"/>
-              <w:jc w:val="center"/>
-            </w:pPr>
-            <w:r>
-              <w:rPr>
-                <w:sz w:val="20"/>
-                <w:szCs w:val="20"/>
-              </w:rPr>
-              <w:t>2.64 ms</w:t>
+            <w:r>
+              <w:rPr>
+                <w:rFonts w:hint="eastAsia"/>
+                <w:sz w:val="20"/>
+                <w:szCs w:val="20"/>
+              </w:rPr>
+              <w:t>增至</w:t>
+            </w:r>
+            <w:r>
+              <w:rPr>
+                <w:rFonts w:hint="eastAsia"/>
+                <w:sz w:val="20"/>
+                <w:szCs w:val="20"/>
+              </w:rPr>
+              <w:t>92.62 ms</w:t>
             </w:r>
           </w:p>
         </w:tc>
@@ -34449,97 +34352,109 @@
         <w:rPr>
           <w:szCs w:val="24"/>
         </w:rPr>
-        <w:t>zero-copy</w:t>
-      </w:r>
-      <w:r>
-        <w:rPr>
-          <w:szCs w:val="24"/>
-        </w:rPr>
-        <w:t>路径将显式输入更新耗时从约</w:t>
-      </w:r>
-      <w:r>
-        <w:rPr>
-          <w:szCs w:val="24"/>
-        </w:rPr>
-        <w:t>62 ms</w:t>
-      </w:r>
-      <w:r>
-        <w:rPr>
-          <w:szCs w:val="24"/>
-        </w:rPr>
-        <w:t>降低到</w:t>
-      </w:r>
-      <w:r>
-        <w:rPr>
-          <w:szCs w:val="24"/>
-        </w:rPr>
-        <w:t>1 ms</w:t>
-      </w:r>
-      <w:r>
-        <w:rPr>
-          <w:szCs w:val="24"/>
-        </w:rPr>
-        <w:t>以下，但</w:t>
-      </w:r>
-      <w:r>
-        <w:rPr>
-          <w:szCs w:val="24"/>
-        </w:rPr>
-        <w:t>rknn_run</w:t>
-      </w:r>
-      <w:r>
-        <w:rPr>
-          <w:szCs w:val="24"/>
-        </w:rPr>
-        <w:t>的耗时从约</w:t>
-      </w:r>
-      <w:r>
-        <w:rPr>
-          <w:szCs w:val="24"/>
-        </w:rPr>
-        <w:t>46 ms</w:t>
-      </w:r>
-      <w:r>
-        <w:rPr>
-          <w:szCs w:val="24"/>
-        </w:rPr>
-        <w:t>上升到约</w:t>
-      </w:r>
-      <w:r>
-        <w:rPr>
-          <w:szCs w:val="24"/>
-        </w:rPr>
-        <w:t>111 ms</w:t>
-      </w:r>
-      <w:r>
-        <w:rPr>
-          <w:szCs w:val="24"/>
-        </w:rPr>
-        <w:t>，最终总耗时并未下降。这说明输入转换或同步开销并没有真正消失，而是从</w:t>
-      </w:r>
-      <w:r>
-        <w:rPr>
-          <w:szCs w:val="24"/>
-        </w:rPr>
-        <w:t>rknn_inputs_set</w:t>
-      </w:r>
-      <w:r>
-        <w:rPr>
-          <w:szCs w:val="24"/>
-        </w:rPr>
-        <w:t>阶段转移到了</w:t>
-      </w:r>
-      <w:r>
-        <w:rPr>
-          <w:szCs w:val="24"/>
-        </w:rPr>
-        <w:t>rknn_run</w:t>
-      </w:r>
-      <w:r>
-        <w:rPr>
-          <w:szCs w:val="24"/>
-        </w:rPr>
-        <w:t>阶段。</w:t>
+        <w:t>RGA cvt+resize</w:t>
+      </w:r>
+      <w:r>
+        <w:rPr>
+          <w:szCs w:val="24"/>
+        </w:rPr>
+        <w:t>路径与</w:t>
+      </w:r>
+      <w:r>
+        <w:rPr>
+          <w:szCs w:val="24"/>
+        </w:rPr>
+        <w:t>OpenCV</w:t>
+      </w:r>
+      <w:r>
+        <w:rPr>
+          <w:szCs w:val="24"/>
+        </w:rPr>
+        <w:t>路径检测结果完全一致，但</w:t>
+      </w:r>
+      <w:r>
+        <w:rPr>
+          <w:szCs w:val="24"/>
+        </w:rPr>
+        <w:t>total_work_ms</w:t>
+      </w:r>
+      <w:r>
+        <w:rPr>
+          <w:szCs w:val="24"/>
+        </w:rPr>
+        <w:t>为</w:t>
+      </w:r>
+      <w:r>
+        <w:rPr>
+          <w:szCs w:val="24"/>
+        </w:rPr>
+        <w:t>147.17 ms</w:t>
+      </w:r>
+      <w:r>
+        <w:rPr>
+          <w:szCs w:val="24"/>
+        </w:rPr>
+        <w:t>，未明显优于</w:t>
+      </w:r>
+      <w:r>
+        <w:rPr>
+          <w:szCs w:val="24"/>
+        </w:rPr>
+        <w:t>OpenCV</w:t>
+      </w:r>
+      <w:r>
+        <w:rPr>
+          <w:szCs w:val="24"/>
+        </w:rPr>
+        <w:t>的</w:t>
+      </w:r>
+      <w:r>
+        <w:rPr>
+          <w:szCs w:val="24"/>
+        </w:rPr>
+        <w:t>146.60 ms</w:t>
+      </w:r>
+      <w:r>
+        <w:rPr>
+          <w:szCs w:val="24"/>
+        </w:rPr>
+        <w:t>。这说明当前基于虚拟地址缓冲区的</w:t>
+      </w:r>
+      <w:r>
+        <w:rPr>
+          <w:szCs w:val="24"/>
+        </w:rPr>
+        <w:t>RGA</w:t>
+      </w:r>
+      <w:r>
+        <w:rPr>
+          <w:szCs w:val="24"/>
+        </w:rPr>
+        <w:t>预处理仍未形成决定性加速，后续若要获得更明显收益，需要进一步结合</w:t>
+      </w:r>
+      <w:r>
+        <w:rPr>
+          <w:szCs w:val="24"/>
+        </w:rPr>
+        <w:t>MPP</w:t>
+      </w:r>
+      <w:r>
+        <w:rPr>
+          <w:szCs w:val="24"/>
+        </w:rPr>
+        <w:t>解码、</w:t>
+      </w:r>
+      <w:r>
+        <w:rPr>
+          <w:szCs w:val="24"/>
+        </w:rPr>
+        <w:t>RGA</w:t>
+      </w:r>
+      <w:r>
+        <w:rPr>
+          <w:szCs w:val="24"/>
+        </w:rPr>
+        <w:t>物理连续内存和更完整的零拷贝链路。</w:t>
       </w:r>
     </w:p>
     <w:p>
@@ -34551,43 +34466,121 @@
         <w:rPr>
           <w:szCs w:val="24"/>
         </w:rPr>
-        <w:t>造成这一现象的可能原因是当前模型输入张量与应用侧准备的数据类型并不完全匹配。例如应用侧仍以</w:t>
-      </w:r>
-      <w:r>
-        <w:rPr>
-          <w:szCs w:val="24"/>
-        </w:rPr>
-        <w:t>uint8</w:t>
-      </w:r>
-      <w:r>
-        <w:rPr>
-          <w:szCs w:val="24"/>
-        </w:rPr>
-        <w:t>图像作为输入，而模型或</w:t>
-      </w:r>
-      <w:r>
-        <w:rPr>
-          <w:szCs w:val="24"/>
-        </w:rPr>
-        <w:t>RKNN Runtime</w:t>
-      </w:r>
-      <w:r>
-        <w:rPr>
-          <w:szCs w:val="24"/>
-        </w:rPr>
-        <w:t>内部仍需要执行格式或类型转换。因此，简单绑定</w:t>
-      </w:r>
-      <w:r>
-        <w:rPr>
-          <w:szCs w:val="24"/>
-        </w:rPr>
-        <w:t>RKNN</w:t>
-      </w:r>
-      <w:r>
-        <w:rPr>
-          <w:szCs w:val="24"/>
-        </w:rPr>
-        <w:t>输入内存并不足以得到真正的零拷贝加速。</w:t>
+        <w:t>Zero-copy</w:t>
+      </w:r>
+      <w:r>
+        <w:rPr>
+          <w:szCs w:val="24"/>
+        </w:rPr>
+        <w:t>路径在本轮固定视频实验中将输入更新阶段降低到</w:t>
+      </w:r>
+      <w:r>
+        <w:rPr>
+          <w:szCs w:val="24"/>
+        </w:rPr>
+        <w:t>0.45 ms</w:t>
+      </w:r>
+      <w:r>
+        <w:rPr>
+          <w:szCs w:val="24"/>
+        </w:rPr>
+        <w:t>，检测</w:t>
+      </w:r>
+      <w:r>
+        <w:rPr>
+          <w:szCs w:val="24"/>
+        </w:rPr>
+        <w:t>CSV</w:t>
+      </w:r>
+      <w:r>
+        <w:rPr>
+          <w:szCs w:val="24"/>
+        </w:rPr>
+        <w:t>也与</w:t>
+      </w:r>
+      <w:r>
+        <w:rPr>
+          <w:szCs w:val="24"/>
+        </w:rPr>
+        <w:t>OpenCV</w:t>
+      </w:r>
+      <w:r>
+        <w:rPr>
+          <w:szCs w:val="24"/>
+        </w:rPr>
+        <w:t>路径完全一致；但</w:t>
+      </w:r>
+      <w:r>
+        <w:rPr>
+          <w:szCs w:val="24"/>
+        </w:rPr>
+        <w:t>rknn_run</w:t>
+      </w:r>
+      <w:r>
+        <w:rPr>
+          <w:szCs w:val="24"/>
+        </w:rPr>
+        <w:t>阶段上升到</w:t>
+      </w:r>
+      <w:r>
+        <w:rPr>
+          <w:szCs w:val="24"/>
+        </w:rPr>
+        <w:t>92.62 ms</w:t>
+      </w:r>
+      <w:r>
+        <w:rPr>
+          <w:szCs w:val="24"/>
+        </w:rPr>
+        <w:t>，说明部分输入转换或同步开销可能转移到了</w:t>
+      </w:r>
+      <w:r>
+        <w:rPr>
+          <w:szCs w:val="24"/>
+        </w:rPr>
+        <w:t>NPU</w:t>
+      </w:r>
+      <w:r>
+        <w:rPr>
+          <w:szCs w:val="24"/>
+        </w:rPr>
+        <w:t>执行阶段。尽管本轮</w:t>
+      </w:r>
+      <w:r>
+        <w:rPr>
+          <w:szCs w:val="24"/>
+        </w:rPr>
+        <w:t>total_work_ms</w:t>
+      </w:r>
+      <w:r>
+        <w:rPr>
+          <w:szCs w:val="24"/>
+        </w:rPr>
+        <w:t>降低到</w:t>
+      </w:r>
+      <w:r>
+        <w:rPr>
+          <w:szCs w:val="24"/>
+        </w:rPr>
+        <w:t>137.07 ms</w:t>
+      </w:r>
+      <w:r>
+        <w:rPr>
+          <w:szCs w:val="24"/>
+        </w:rPr>
+        <w:t>，但其机制仍需结合实时</w:t>
+      </w:r>
+      <w:r>
+        <w:rPr>
+          <w:szCs w:val="24"/>
+        </w:rPr>
+        <w:t>RTSP</w:t>
+      </w:r>
+      <w:r>
+        <w:rPr>
+          <w:szCs w:val="24"/>
+        </w:rPr>
+        <w:t>链路继续验证。</w:t>
       </w:r>
     </w:p>
     <w:p>
@@ -34599,19 +34592,19 @@
         <w:rPr>
           <w:szCs w:val="24"/>
         </w:rPr>
-        <w:t>该实验虽然没有带来性能提升，但对论文仍然有价值。它说明本文的优化过程不是只停留在经验调参，而是通过阶段计时定位瓶颈，并对输入内存路径进行验证。当前稳定演示路径应继续保持</w:t>
-      </w:r>
-      <w:r>
-        <w:rPr>
-          <w:szCs w:val="24"/>
-        </w:rPr>
-        <w:t>RK_YOLO_ZERO_COPY_INPUT=0</w:t>
-      </w:r>
-      <w:r>
-        <w:rPr>
-          <w:szCs w:val="24"/>
-        </w:rPr>
-        <w:t>，</w:t>
+        <w:t>因此，本文将</w:t>
+      </w:r>
+      <w:r>
+        <w:rPr>
+          <w:szCs w:val="24"/>
+        </w:rPr>
+        <w:t>RGA</w:t>
+      </w:r>
+      <w:r>
+        <w:rPr>
+          <w:szCs w:val="24"/>
+        </w:rPr>
+        <w:t>和</w:t>
       </w:r>
       <w:r>
         <w:rPr>
@@ -34623,7 +34616,19 @@
         <w:rPr>
           <w:szCs w:val="24"/>
         </w:rPr>
-        <w:t>与</w:t>
+        <w:t>作为已经完成可切换验证的硬件优化探索，而不是默认稳定路径。当前演示仍建议保持</w:t>
+      </w:r>
+      <w:r>
+        <w:rPr>
+          <w:szCs w:val="24"/>
+        </w:rPr>
+        <w:t>OpenCV</w:t>
+      </w:r>
+      <w:r>
+        <w:rPr>
+          <w:szCs w:val="24"/>
+        </w:rPr>
+        <w:t>预处理和常规输入设置；</w:t>
       </w:r>
       <w:r>
         <w:rPr>
@@ -34635,7 +34640,31 @@
         <w:rPr>
           <w:szCs w:val="24"/>
         </w:rPr>
-        <w:t>硬件预处理可作为后续优化方向。</w:t>
+        <w:t>、</w:t>
+      </w:r>
+      <w:r>
+        <w:rPr>
+          <w:szCs w:val="24"/>
+        </w:rPr>
+        <w:t>zero-copy</w:t>
+      </w:r>
+      <w:r>
+        <w:rPr>
+          <w:szCs w:val="24"/>
+        </w:rPr>
+        <w:t>和</w:t>
+      </w:r>
+      <w:r>
+        <w:rPr>
+          <w:szCs w:val="24"/>
+        </w:rPr>
+        <w:t>INT8</w:t>
+      </w:r>
+      <w:r>
+        <w:rPr>
+          <w:szCs w:val="24"/>
+        </w:rPr>
+        <w:t>输入匹配可作为后续进一步压缩输入传输与预处理开销的方向。</w:t>
       </w:r>
     </w:p>
     <w:p>
@@ -34643,7 +34672,7 @@
         <w:spacing w:before="240" w:after="120" w:line="360" w:lineRule="auto"/>
         <w:outlineLvl w:val="1"/>
       </w:pPr>
-      <w:bookmarkStart w:id="52" w:name="_Toc228286752"/>
+      <w:bookmarkStart w:id="52" w:name="_Toc228306673"/>
       <w:r>
         <w:rPr>
           <w:rFonts w:eastAsia="黑体"/>
@@ -34739,7 +34768,6 @@
         <w:rPr>
           <w:szCs w:val="24"/>
         </w:rPr>
-        <w:lastRenderedPageBreak/>
         <w:t>RK3588</w:t>
       </w:r>
       <w:r>
@@ -34806,6 +34834,7 @@
         <w:rPr>
           <w:szCs w:val="24"/>
         </w:rPr>
+        <w:lastRenderedPageBreak/>
         <w:t>第三，</w:t>
       </w:r>
       <w:r>
@@ -34830,7 +34859,7 @@
         <w:rPr>
           <w:szCs w:val="24"/>
         </w:rPr>
-        <w:t>并行对每帧检测吞吐具有提升作用。相比单</w:t>
+        <w:t>并行对每帧检测吞吐具有明显提升作用。相比单</w:t>
       </w:r>
       <w:r>
         <w:rPr>
@@ -34860,7 +34889,19 @@
         <w:rPr>
           <w:szCs w:val="24"/>
         </w:rPr>
-        <w:t>NPU FPS</w:t>
+        <w:t>stream_fps</w:t>
+      </w:r>
+      <w:r>
+        <w:rPr>
+          <w:szCs w:val="24"/>
+        </w:rPr>
+        <w:t>和</w:t>
+      </w:r>
+      <w:r>
+        <w:rPr>
+          <w:szCs w:val="24"/>
+        </w:rPr>
+        <w:t>npu_fps</w:t>
       </w:r>
       <w:r>
         <w:rPr>
@@ -34872,7 +34913,7 @@
         <w:rPr>
           <w:szCs w:val="24"/>
         </w:rPr>
-        <w:t>8.59</w:t>
+        <w:t>6.80</w:t>
       </w:r>
       <w:r>
         <w:rPr>
@@ -34884,13 +34925,13 @@
         <w:rPr>
           <w:szCs w:val="24"/>
         </w:rPr>
-        <w:t>10.64</w:t>
-      </w:r>
-      <w:r>
-        <w:rPr>
-          <w:szCs w:val="24"/>
-        </w:rPr>
-        <w:t>，并消除了采集丢帧。但三</w:t>
+        <w:t>13.71</w:t>
+      </w:r>
+      <w:r>
+        <w:rPr>
+          <w:szCs w:val="24"/>
+        </w:rPr>
+        <w:t>，并消除了采集丢帧，说明多</w:t>
       </w:r>
       <w:r>
         <w:rPr>
@@ -34902,7 +34943,19 @@
         <w:rPr>
           <w:szCs w:val="24"/>
         </w:rPr>
-        <w:t>没有继续带来收益，说明系统已出现输入传输和调度瓶颈。</w:t>
+        <w:t>并行是本系统最明确的</w:t>
+      </w:r>
+      <w:r>
+        <w:rPr>
+          <w:szCs w:val="24"/>
+        </w:rPr>
+        <w:t>NPU</w:t>
+      </w:r>
+      <w:r>
+        <w:rPr>
+          <w:szCs w:val="24"/>
+        </w:rPr>
+        <w:t>硬件优化收益点。</w:t>
       </w:r>
     </w:p>
     <w:p>
@@ -34926,7 +34979,7 @@
         <w:rPr>
           <w:szCs w:val="24"/>
         </w:rPr>
-        <w:t>。多</w:t>
+        <w:t>。双</w:t>
       </w:r>
       <w:r>
         <w:rPr>
@@ -34938,7 +34991,31 @@
         <w:rPr>
           <w:szCs w:val="24"/>
         </w:rPr>
-        <w:t>全帧检测吞吐更高，但端到端延迟较大；策略优化模式通过跳帧检测、动态</w:t>
+        <w:t>全帧检测适合展示</w:t>
+      </w:r>
+      <w:r>
+        <w:rPr>
+          <w:szCs w:val="24"/>
+        </w:rPr>
+        <w:t>NPU</w:t>
+      </w:r>
+      <w:r>
+        <w:rPr>
+          <w:szCs w:val="24"/>
+        </w:rPr>
+        <w:t>并行吞吐能力，而</w:t>
+      </w:r>
+      <w:r>
+        <w:rPr>
+          <w:szCs w:val="24"/>
+        </w:rPr>
+        <w:t>detect_every_n=3</w:t>
+      </w:r>
+      <w:r>
+        <w:rPr>
+          <w:szCs w:val="24"/>
+        </w:rPr>
+        <w:t>配合动态</w:t>
       </w:r>
       <w:r>
         <w:rPr>
@@ -34950,7 +35027,31 @@
         <w:rPr>
           <w:szCs w:val="24"/>
         </w:rPr>
-        <w:t>和框平滑获得更好的观看响应。因此，系统级推荐配置和硬件优化实验配置应分开表述。</w:t>
+        <w:t>、运动预测和框平滑的策略在本轮实验中取得约</w:t>
+      </w:r>
+      <w:r>
+        <w:rPr>
+          <w:szCs w:val="24"/>
+        </w:rPr>
+        <w:t>13.40 FPS</w:t>
+      </w:r>
+      <w:r>
+        <w:rPr>
+          <w:szCs w:val="24"/>
+        </w:rPr>
+        <w:t>和</w:t>
+      </w:r>
+      <w:r>
+        <w:rPr>
+          <w:szCs w:val="24"/>
+        </w:rPr>
+        <w:t>92.16 ms</w:t>
+      </w:r>
+      <w:r>
+        <w:rPr>
+          <w:szCs w:val="24"/>
+        </w:rPr>
+        <w:t>平均端到端延迟，更适合实时观看演示。</w:t>
       </w:r>
     </w:p>
     <w:p>
@@ -35059,7 +35160,7 @@
             </w:pPr>
             <w:r>
               <w:rPr>
-                <w:rFonts w:eastAsia="黑体"/>
+                <w:rFonts w:eastAsia="黑体" w:hint="eastAsia"/>
                 <w:b/>
                 <w:sz w:val="20"/>
                 <w:szCs w:val="20"/>
@@ -35090,7 +35191,7 @@
             </w:pPr>
             <w:r>
               <w:rPr>
-                <w:rFonts w:eastAsia="黑体"/>
+                <w:rFonts w:eastAsia="黑体" w:hint="eastAsia"/>
                 <w:b/>
                 <w:sz w:val="20"/>
                 <w:szCs w:val="20"/>
@@ -35121,7 +35222,7 @@
             </w:pPr>
             <w:r>
               <w:rPr>
-                <w:rFonts w:eastAsia="黑体"/>
+                <w:rFonts w:eastAsia="黑体" w:hint="eastAsia"/>
                 <w:b/>
                 <w:sz w:val="20"/>
                 <w:szCs w:val="20"/>
@@ -35153,6 +35254,7 @@
             </w:pPr>
             <w:r>
               <w:rPr>
+                <w:rFonts w:hint="eastAsia"/>
                 <w:sz w:val="20"/>
                 <w:szCs w:val="20"/>
               </w:rPr>
@@ -35177,13 +35279,15 @@
             </w:pPr>
             <w:r>
               <w:rPr>
-                <w:sz w:val="20"/>
-                <w:szCs w:val="20"/>
-              </w:rPr>
-              <w:t>detect_every_n=2</w:t>
-            </w:r>
-            <w:r>
-              <w:rPr>
+                <w:rFonts w:hint="eastAsia"/>
+                <w:sz w:val="20"/>
+                <w:szCs w:val="20"/>
+              </w:rPr>
+              <w:t>detect_every_n=3</w:t>
+            </w:r>
+            <w:r>
+              <w:rPr>
+                <w:rFonts w:hint="eastAsia"/>
                 <w:sz w:val="20"/>
                 <w:szCs w:val="20"/>
               </w:rPr>
@@ -35191,6 +35295,7 @@
             </w:r>
             <w:r>
               <w:rPr>
+                <w:rFonts w:hint="eastAsia"/>
                 <w:sz w:val="20"/>
                 <w:szCs w:val="20"/>
               </w:rPr>
@@ -35198,6 +35303,7 @@
             </w:r>
             <w:r>
               <w:rPr>
+                <w:rFonts w:hint="eastAsia"/>
                 <w:sz w:val="20"/>
                 <w:szCs w:val="20"/>
               </w:rPr>
@@ -35205,6 +35311,7 @@
             </w:r>
             <w:r>
               <w:rPr>
+                <w:rFonts w:hint="eastAsia"/>
                 <w:sz w:val="20"/>
                 <w:szCs w:val="20"/>
               </w:rPr>
@@ -35212,6 +35319,7 @@
             </w:r>
             <w:r>
               <w:rPr>
+                <w:rFonts w:hint="eastAsia"/>
                 <w:sz w:val="20"/>
                 <w:szCs w:val="20"/>
               </w:rPr>
@@ -35219,11 +35327,28 @@
             </w:r>
             <w:r>
               <w:rPr>
+                <w:rFonts w:hint="eastAsia"/>
                 <w:sz w:val="20"/>
                 <w:szCs w:val="20"/>
               </w:rPr>
               <w:t>dynamic_roi=on</w:t>
             </w:r>
+            <w:r>
+              <w:rPr>
+                <w:rFonts w:hint="eastAsia"/>
+                <w:sz w:val="20"/>
+                <w:szCs w:val="20"/>
+              </w:rPr>
+              <w:t>，</w:t>
+            </w:r>
+            <w:r>
+              <w:rPr>
+                <w:rFonts w:hint="eastAsia"/>
+                <w:sz w:val="20"/>
+                <w:szCs w:val="20"/>
+              </w:rPr>
+              <w:t>track_mode=motion</w:t>
+            </w:r>
           </w:p>
         </w:tc>
         <w:tc>
@@ -35243,31 +35368,59 @@
             </w:pPr>
             <w:r>
               <w:rPr>
-                <w:sz w:val="20"/>
-                <w:szCs w:val="20"/>
-              </w:rPr>
-              <w:t>检测框更稳定，输出约</w:t>
-            </w:r>
-            <w:r>
-              <w:rPr>
-                <w:sz w:val="20"/>
-                <w:szCs w:val="20"/>
-              </w:rPr>
-              <w:t>10 FPS</w:t>
-            </w:r>
-            <w:r>
-              <w:rPr>
-                <w:sz w:val="20"/>
-                <w:szCs w:val="20"/>
-              </w:rPr>
-              <w:t>，延迟约</w:t>
-            </w:r>
-            <w:r>
-              <w:rPr>
-                <w:sz w:val="20"/>
-                <w:szCs w:val="20"/>
-              </w:rPr>
-              <w:t>110 ms</w:t>
+                <w:rFonts w:hint="eastAsia"/>
+                <w:sz w:val="20"/>
+                <w:szCs w:val="20"/>
+              </w:rPr>
+              <w:t>平均</w:t>
+            </w:r>
+            <w:r>
+              <w:rPr>
+                <w:rFonts w:hint="eastAsia"/>
+                <w:sz w:val="20"/>
+                <w:szCs w:val="20"/>
+              </w:rPr>
+              <w:t>stream_fps</w:t>
+            </w:r>
+            <w:r>
+              <w:rPr>
+                <w:rFonts w:hint="eastAsia"/>
+                <w:sz w:val="20"/>
+                <w:szCs w:val="20"/>
+              </w:rPr>
+              <w:t>约</w:t>
+            </w:r>
+            <w:r>
+              <w:rPr>
+                <w:rFonts w:hint="eastAsia"/>
+                <w:sz w:val="20"/>
+                <w:szCs w:val="20"/>
+              </w:rPr>
+              <w:t>13.40</w:t>
+            </w:r>
+            <w:r>
+              <w:rPr>
+                <w:rFonts w:hint="eastAsia"/>
+                <w:sz w:val="20"/>
+                <w:szCs w:val="20"/>
+              </w:rPr>
+              <w:t>，端到端延迟约</w:t>
+            </w:r>
+            <w:r>
+              <w:rPr>
+                <w:rFonts w:hint="eastAsia"/>
+                <w:sz w:val="20"/>
+                <w:szCs w:val="20"/>
+              </w:rPr>
+              <w:t>92.16 ms</w:t>
+            </w:r>
+            <w:r>
+              <w:rPr>
+                <w:rFonts w:hint="eastAsia"/>
+                <w:sz w:val="20"/>
+                <w:szCs w:val="20"/>
+              </w:rPr>
+              <w:t>，且无采集和发布丢帧</w:t>
             </w:r>
           </w:p>
         </w:tc>
@@ -35294,10 +35447,11 @@
             </w:pPr>
             <w:r>
               <w:rPr>
-                <w:sz w:val="20"/>
-                <w:szCs w:val="20"/>
-              </w:rPr>
-              <w:t>低延迟无目标巡检</w:t>
+                <w:rFonts w:hint="eastAsia"/>
+                <w:sz w:val="20"/>
+                <w:szCs w:val="20"/>
+              </w:rPr>
+              <w:t>目标刷新优先</w:t>
             </w:r>
           </w:p>
         </w:tc>
@@ -35318,13 +35472,15 @@
             </w:pPr>
             <w:r>
               <w:rPr>
-                <w:sz w:val="20"/>
-                <w:szCs w:val="20"/>
-              </w:rPr>
-              <w:t>detect_every_n=3</w:t>
-            </w:r>
-            <w:r>
-              <w:rPr>
+                <w:rFonts w:hint="eastAsia"/>
+                <w:sz w:val="20"/>
+                <w:szCs w:val="20"/>
+              </w:rPr>
+              <w:t>detect_every_n=2</w:t>
+            </w:r>
+            <w:r>
+              <w:rPr>
+                <w:rFonts w:hint="eastAsia"/>
                 <w:sz w:val="20"/>
                 <w:szCs w:val="20"/>
               </w:rPr>
@@ -35332,6 +35488,7 @@
             </w:r>
             <w:r>
               <w:rPr>
+                <w:rFonts w:hint="eastAsia"/>
                 <w:sz w:val="20"/>
                 <w:szCs w:val="20"/>
               </w:rPr>
@@ -35339,6 +35496,7 @@
             </w:r>
             <w:r>
               <w:rPr>
+                <w:rFonts w:hint="eastAsia"/>
                 <w:sz w:val="20"/>
                 <w:szCs w:val="20"/>
               </w:rPr>
@@ -35346,11 +35504,44 @@
             </w:r>
             <w:r>
               <w:rPr>
+                <w:rFonts w:hint="eastAsia"/>
+                <w:sz w:val="20"/>
+                <w:szCs w:val="20"/>
+              </w:rPr>
+              <w:t>box_smooth=on</w:t>
+            </w:r>
+            <w:r>
+              <w:rPr>
+                <w:rFonts w:hint="eastAsia"/>
+                <w:sz w:val="20"/>
+                <w:szCs w:val="20"/>
+              </w:rPr>
+              <w:t>，</w:t>
+            </w:r>
+            <w:r>
+              <w:rPr>
+                <w:rFonts w:hint="eastAsia"/>
                 <w:sz w:val="20"/>
                 <w:szCs w:val="20"/>
               </w:rPr>
               <w:t>dynamic_roi=on</w:t>
             </w:r>
+            <w:r>
+              <w:rPr>
+                <w:rFonts w:hint="eastAsia"/>
+                <w:sz w:val="20"/>
+                <w:szCs w:val="20"/>
+              </w:rPr>
+              <w:t>，</w:t>
+            </w:r>
+            <w:r>
+              <w:rPr>
+                <w:rFonts w:hint="eastAsia"/>
+                <w:sz w:val="20"/>
+                <w:szCs w:val="20"/>
+              </w:rPr>
+              <w:t>track_mode=motion</w:t>
+            </w:r>
           </w:p>
         </w:tc>
         <w:tc>
@@ -35370,10 +35561,35 @@
             </w:pPr>
             <w:r>
               <w:rPr>
-                <w:sz w:val="20"/>
-                <w:szCs w:val="20"/>
-              </w:rPr>
-              <w:t>延迟较低，资源占用较小，适合一般实时查看</w:t>
+                <w:rFonts w:hint="eastAsia"/>
+                <w:sz w:val="20"/>
+                <w:szCs w:val="20"/>
+              </w:rPr>
+              <w:t>NPU</w:t>
+            </w:r>
+            <w:r>
+              <w:rPr>
+                <w:rFonts w:hint="eastAsia"/>
+                <w:sz w:val="20"/>
+                <w:szCs w:val="20"/>
+              </w:rPr>
+              <w:t>刷新频率约</w:t>
+            </w:r>
+            <w:r>
+              <w:rPr>
+                <w:rFonts w:hint="eastAsia"/>
+                <w:sz w:val="20"/>
+                <w:szCs w:val="20"/>
+              </w:rPr>
+              <w:t>6.75 FPS</w:t>
+            </w:r>
+            <w:r>
+              <w:rPr>
+                <w:rFonts w:hint="eastAsia"/>
+                <w:sz w:val="20"/>
+                <w:szCs w:val="20"/>
+              </w:rPr>
+              <w:t>，适合目标运动较快或更重视检测新鲜度的场景</w:t>
             </w:r>
           </w:p>
         </w:tc>
@@ -35400,6 +35616,7 @@
             </w:pPr>
             <w:r>
               <w:rPr>
+                <w:rFonts w:hint="eastAsia"/>
                 <w:sz w:val="20"/>
                 <w:szCs w:val="20"/>
               </w:rPr>
@@ -35407,6 +35624,7 @@
             </w:r>
             <w:r>
               <w:rPr>
+                <w:rFonts w:hint="eastAsia"/>
                 <w:sz w:val="20"/>
                 <w:szCs w:val="20"/>
               </w:rPr>
@@ -35431,6 +35649,7 @@
             </w:pPr>
             <w:r>
               <w:rPr>
+                <w:rFonts w:hint="eastAsia"/>
                 <w:sz w:val="20"/>
                 <w:szCs w:val="20"/>
               </w:rPr>
@@ -35438,6 +35657,7 @@
             </w:r>
             <w:r>
               <w:rPr>
+                <w:rFonts w:hint="eastAsia"/>
                 <w:sz w:val="20"/>
                 <w:szCs w:val="20"/>
               </w:rPr>
@@ -35445,6 +35665,7 @@
             </w:r>
             <w:r>
               <w:rPr>
+                <w:rFonts w:hint="eastAsia"/>
                 <w:sz w:val="20"/>
                 <w:szCs w:val="20"/>
               </w:rPr>
@@ -35469,13 +35690,15 @@
             </w:pPr>
             <w:r>
               <w:rPr>
-                <w:sz w:val="20"/>
-                <w:szCs w:val="20"/>
-              </w:rPr>
-              <w:t>能体现双</w:t>
-            </w:r>
-            <w:r>
-              <w:rPr>
+                <w:rFonts w:hint="eastAsia"/>
+                <w:sz w:val="20"/>
+                <w:szCs w:val="20"/>
+              </w:rPr>
+              <w:t>相比单</w:t>
+            </w:r>
+            <w:r>
+              <w:rPr>
+                <w:rFonts w:hint="eastAsia"/>
                 <w:sz w:val="20"/>
                 <w:szCs w:val="20"/>
               </w:rPr>
@@ -35483,10 +35706,75 @@
             </w:r>
             <w:r>
               <w:rPr>
-                <w:sz w:val="20"/>
-                <w:szCs w:val="20"/>
-              </w:rPr>
-              <w:t>对吞吐的提升，适合作为硬件优化论证</w:t>
+                <w:rFonts w:hint="eastAsia"/>
+                <w:sz w:val="20"/>
+                <w:szCs w:val="20"/>
+              </w:rPr>
+              <w:t>全帧检测，</w:t>
+            </w:r>
+            <w:r>
+              <w:rPr>
+                <w:rFonts w:hint="eastAsia"/>
+                <w:sz w:val="20"/>
+                <w:szCs w:val="20"/>
+              </w:rPr>
+              <w:t>stream_fps</w:t>
+            </w:r>
+            <w:r>
+              <w:rPr>
+                <w:rFonts w:hint="eastAsia"/>
+                <w:sz w:val="20"/>
+                <w:szCs w:val="20"/>
+              </w:rPr>
+              <w:t>由</w:t>
+            </w:r>
+            <w:r>
+              <w:rPr>
+                <w:rFonts w:hint="eastAsia"/>
+                <w:sz w:val="20"/>
+                <w:szCs w:val="20"/>
+              </w:rPr>
+              <w:t>6.80</w:t>
+            </w:r>
+            <w:r>
+              <w:rPr>
+                <w:rFonts w:hint="eastAsia"/>
+                <w:sz w:val="20"/>
+                <w:szCs w:val="20"/>
+              </w:rPr>
+              <w:t>提升到</w:t>
+            </w:r>
+            <w:r>
+              <w:rPr>
+                <w:rFonts w:hint="eastAsia"/>
+                <w:sz w:val="20"/>
+                <w:szCs w:val="20"/>
+              </w:rPr>
+              <w:t>13.71</w:t>
+            </w:r>
+            <w:r>
+              <w:rPr>
+                <w:rFonts w:hint="eastAsia"/>
+                <w:sz w:val="20"/>
+                <w:szCs w:val="20"/>
+              </w:rPr>
+              <w:t>，可体现双</w:t>
+            </w:r>
+            <w:r>
+              <w:rPr>
+                <w:rFonts w:hint="eastAsia"/>
+                <w:sz w:val="20"/>
+                <w:szCs w:val="20"/>
+              </w:rPr>
+              <w:t>context</w:t>
+            </w:r>
+            <w:r>
+              <w:rPr>
+                <w:rFonts w:hint="eastAsia"/>
+                <w:sz w:val="20"/>
+                <w:szCs w:val="20"/>
+              </w:rPr>
+              <w:t>并行收益</w:t>
             </w:r>
           </w:p>
         </w:tc>
@@ -35513,10 +35801,11 @@
             </w:pPr>
             <w:r>
               <w:rPr>
-                <w:sz w:val="20"/>
-                <w:szCs w:val="20"/>
-              </w:rPr>
-              <w:t>后续优化方向</w:t>
+                <w:rFonts w:hint="eastAsia"/>
+                <w:sz w:val="20"/>
+                <w:szCs w:val="20"/>
+              </w:rPr>
+              <w:t>硬件优化探索</w:t>
             </w:r>
           </w:p>
         </w:tc>
@@ -35537,24 +35826,51 @@
             </w:pPr>
             <w:r>
               <w:rPr>
-                <w:sz w:val="20"/>
-                <w:szCs w:val="20"/>
-              </w:rPr>
-              <w:t>输入内存路径、</w:t>
-            </w:r>
-            <w:r>
-              <w:rPr>
-                <w:sz w:val="20"/>
-                <w:szCs w:val="20"/>
-              </w:rPr>
-              <w:t>RGA</w:t>
-            </w:r>
-            <w:r>
-              <w:rPr>
-                <w:sz w:val="20"/>
-                <w:szCs w:val="20"/>
-              </w:rPr>
-              <w:t>预处理、量化输入匹配</w:t>
+                <w:rFonts w:hint="eastAsia"/>
+                <w:sz w:val="20"/>
+                <w:szCs w:val="20"/>
+              </w:rPr>
+              <w:t>zero-copy</w:t>
+            </w:r>
+            <w:r>
+              <w:rPr>
+                <w:rFonts w:hint="eastAsia"/>
+                <w:sz w:val="20"/>
+                <w:szCs w:val="20"/>
+              </w:rPr>
+              <w:t>输入、</w:t>
+            </w:r>
+            <w:r>
+              <w:rPr>
+                <w:rFonts w:hint="eastAsia"/>
+                <w:sz w:val="20"/>
+                <w:szCs w:val="20"/>
+              </w:rPr>
+              <w:t>RGA cvt+resize</w:t>
+            </w:r>
+            <w:r>
+              <w:rPr>
+                <w:rFonts w:hint="eastAsia"/>
+                <w:sz w:val="20"/>
+                <w:szCs w:val="20"/>
+              </w:rPr>
+              <w:t>、</w:t>
+            </w:r>
+            <w:r>
+              <w:rPr>
+                <w:rFonts w:hint="eastAsia"/>
+                <w:sz w:val="20"/>
+                <w:szCs w:val="20"/>
+              </w:rPr>
+              <w:t>INT8</w:t>
+            </w:r>
+            <w:r>
+              <w:rPr>
+                <w:rFonts w:hint="eastAsia"/>
+                <w:sz w:val="20"/>
+                <w:szCs w:val="20"/>
+              </w:rPr>
+              <w:t>量化输入匹配</w:t>
             </w:r>
           </w:p>
         </w:tc>
@@ -35575,31 +35891,43 @@
             </w:pPr>
             <w:r>
               <w:rPr>
-                <w:sz w:val="20"/>
-                <w:szCs w:val="20"/>
-              </w:rPr>
-              <w:t>当前瓶颈主要在</w:t>
-            </w:r>
-            <w:r>
-              <w:rPr>
-                <w:sz w:val="20"/>
-                <w:szCs w:val="20"/>
-              </w:rPr>
-              <w:t>rknn_inputs_set</w:t>
-            </w:r>
-            <w:r>
-              <w:rPr>
-                <w:sz w:val="20"/>
-                <w:szCs w:val="20"/>
-              </w:rPr>
-              <w:t>和</w:t>
-            </w:r>
-            <w:r>
-              <w:rPr>
-                <w:sz w:val="20"/>
-                <w:szCs w:val="20"/>
-              </w:rPr>
-              <w:t>rknn_run</w:t>
+                <w:rFonts w:hint="eastAsia"/>
+                <w:sz w:val="20"/>
+                <w:szCs w:val="20"/>
+              </w:rPr>
+              <w:t>已完成可切换验证，但默认演示仍保持稳定</w:t>
+            </w:r>
+            <w:r>
+              <w:rPr>
+                <w:rFonts w:hint="eastAsia"/>
+                <w:sz w:val="20"/>
+                <w:szCs w:val="20"/>
+              </w:rPr>
+              <w:t>OpenCV</w:t>
+            </w:r>
+            <w:r>
+              <w:rPr>
+                <w:rFonts w:hint="eastAsia"/>
+                <w:sz w:val="20"/>
+                <w:szCs w:val="20"/>
+              </w:rPr>
+              <w:t>与</w:t>
+            </w:r>
+            <w:r>
+              <w:rPr>
+                <w:rFonts w:hint="eastAsia"/>
+                <w:sz w:val="20"/>
+                <w:szCs w:val="20"/>
+              </w:rPr>
+              <w:t>FP RKNN</w:t>
+            </w:r>
+            <w:r>
+              <w:rPr>
+                <w:rFonts w:hint="eastAsia"/>
+                <w:sz w:val="20"/>
+                <w:szCs w:val="20"/>
+              </w:rPr>
+              <w:t>路径</w:t>
             </w:r>
           </w:p>
         </w:tc>
@@ -35652,13 +35980,27 @@
           <w:rFonts w:cs="Times New Roman" w:hint="eastAsia"/>
           <w:szCs w:val="24"/>
         </w:rPr>
-        <w:t>开发板、</w:t>
+        <w:t>开发板、公开无人机视频输入、</w:t>
       </w:r>
       <w:r>
         <w:rPr>
           <w:rFonts w:cs="Times New Roman" w:hint="eastAsia"/>
           <w:szCs w:val="24"/>
         </w:rPr>
+        <w:t>FP RKNN</w:t>
+      </w:r>
+      <w:r>
+        <w:rPr>
+          <w:rFonts w:cs="Times New Roman" w:hint="eastAsia"/>
+          <w:szCs w:val="24"/>
+        </w:rPr>
+        <w:t>单类无人机模型以及本文当前后处理实现得到。若后续更换为</w:t>
+      </w:r>
+      <w:r>
+        <w:rPr>
+          <w:rFonts w:cs="Times New Roman" w:hint="eastAsia"/>
+          <w:szCs w:val="24"/>
+        </w:rPr>
         <w:t>USB</w:t>
       </w:r>
       <w:r>
@@ -35666,49 +36008,35 @@
           <w:rFonts w:cs="Times New Roman" w:hint="eastAsia"/>
           <w:szCs w:val="24"/>
         </w:rPr>
-        <w:t>摄像头或公开公开视频输入、</w:t>
+        <w:t>摄像头实时输入、</w:t>
       </w:r>
       <w:r>
         <w:rPr>
           <w:rFonts w:cs="Times New Roman" w:hint="eastAsia"/>
           <w:szCs w:val="24"/>
         </w:rPr>
-        <w:t>FP RKNN</w:t>
+        <w:t>INT8</w:t>
       </w:r>
       <w:r>
         <w:rPr>
           <w:rFonts w:cs="Times New Roman" w:hint="eastAsia"/>
           <w:szCs w:val="24"/>
         </w:rPr>
-        <w:t>单类无人机模型以及本文当前后处理实现得到。若后续更换为</w:t>
+        <w:t>模型、</w:t>
       </w:r>
       <w:r>
         <w:rPr>
           <w:rFonts w:cs="Times New Roman" w:hint="eastAsia"/>
           <w:szCs w:val="24"/>
         </w:rPr>
-        <w:t>INT8</w:t>
+        <w:t>RGA</w:t>
       </w:r>
       <w:r>
         <w:rPr>
           <w:rFonts w:cs="Times New Roman" w:hint="eastAsia"/>
           <w:szCs w:val="24"/>
         </w:rPr>
-        <w:t>模型、</w:t>
-      </w:r>
-      <w:r>
-        <w:rPr>
-          <w:rFonts w:cs="Times New Roman" w:hint="eastAsia"/>
-          <w:szCs w:val="24"/>
-        </w:rPr>
-        <w:t>RGA</w:t>
-      </w:r>
-      <w:r>
-        <w:rPr>
-          <w:rFonts w:cs="Times New Roman" w:hint="eastAsia"/>
-          <w:szCs w:val="24"/>
-        </w:rPr>
-        <w:t>硬件预处理路径或不同分辨率输入，推荐参数仍需重新测试。</w:t>
+        <w:t>完整硬件预处理路径或不同分辨率输入，推荐参数仍需重新测试。</w:t>
       </w:r>
     </w:p>
     <w:p>
@@ -35732,7 +36060,7 @@
         <w:rPr>
           <w:szCs w:val="24"/>
         </w:rPr>
-        <w:t>量化和</w:t>
+        <w:t>量化和完整</w:t>
       </w:r>
       <w:r>
         <w:rPr>
@@ -35744,7 +36072,7 @@
         <w:rPr>
           <w:szCs w:val="24"/>
         </w:rPr>
-        <w:t>硬件预处理目前不应写成已经完成的稳定优化结果。根据当前实验，</w:t>
+        <w:t>硬件预处理目前不应写成已经替代主路径的稳定优化结果。根据当前实验，</w:t>
       </w:r>
       <w:r>
         <w:rPr>
@@ -35756,7 +36084,31 @@
         <w:rPr>
           <w:szCs w:val="24"/>
         </w:rPr>
-        <w:t>模型是稳定主路径，</w:t>
+        <w:t>模型和</w:t>
+      </w:r>
+      <w:r>
+        <w:rPr>
+          <w:szCs w:val="24"/>
+        </w:rPr>
+        <w:t>OpenCV</w:t>
+      </w:r>
+      <w:r>
+        <w:rPr>
+          <w:szCs w:val="24"/>
+        </w:rPr>
+        <w:t>预处理仍是稳定主路径；</w:t>
+      </w:r>
+      <w:r>
+        <w:rPr>
+          <w:szCs w:val="24"/>
+        </w:rPr>
+        <w:t>RGA cvt+resize</w:t>
+      </w:r>
+      <w:r>
+        <w:rPr>
+          <w:szCs w:val="24"/>
+        </w:rPr>
+        <w:t>和</w:t>
       </w:r>
       <w:r>
         <w:rPr>
@@ -35768,7 +36120,14 @@
         <w:rPr>
           <w:szCs w:val="24"/>
         </w:rPr>
-        <w:t>输入路径仍处于探索状态。论文中应将这些内容表述为后续优化方向，而不是已验证成果。</w:t>
+        <w:t>输入路径已经完成可切换验证，但仍应表述为硬</w:t>
+      </w:r>
+      <w:r>
+        <w:rPr>
+          <w:szCs w:val="24"/>
+        </w:rPr>
+        <w:lastRenderedPageBreak/>
+        <w:t>件优化探索与后续扩展方向。</w:t>
       </w:r>
     </w:p>
     <w:p>
@@ -35776,7 +36135,7 @@
         <w:spacing w:before="240" w:after="120" w:line="360" w:lineRule="auto"/>
         <w:outlineLvl w:val="1"/>
       </w:pPr>
-      <w:bookmarkStart w:id="53" w:name="_Toc228286753"/>
+      <w:bookmarkStart w:id="53" w:name="_Toc228306674"/>
       <w:r>
         <w:rPr>
           <w:rFonts w:eastAsia="黑体"/>
@@ -35784,7 +36143,6 @@
           <w:sz w:val="28"/>
           <w:szCs w:val="28"/>
         </w:rPr>
-        <w:lastRenderedPageBreak/>
         <w:t>5.10</w:t>
       </w:r>
       <w:r>
@@ -35843,7 +36201,7 @@
         <w:rPr>
           <w:szCs w:val="24"/>
         </w:rPr>
-        <w:t>并行和阶段耗时等实验分析。训练结果表明当前单类无人机模型具备基本检测能力；公开视频固定输入验证表明恢复后的无人机</w:t>
+        <w:t>并行和硬件输入路径等实验分析。训练结果表明当前单类无人机模型具备基本检测能力；公开视频固定输入验证表明恢复后的无人机</w:t>
       </w:r>
       <w:r>
         <w:rPr>
@@ -35879,7 +36237,7 @@
         <w:rPr>
           <w:szCs w:val="24"/>
         </w:rPr>
-        <w:t>实验说明多</w:t>
+        <w:t>实验说明双</w:t>
       </w:r>
       <w:r>
         <w:rPr>
@@ -35891,7 +36249,7 @@
         <w:rPr>
           <w:szCs w:val="24"/>
         </w:rPr>
-        <w:t>可以提升吞吐，而检测间隔、动态</w:t>
+        <w:t>可以显著提升每帧检测吞吐，而检测间隔、动态</w:t>
       </w:r>
       <w:r>
         <w:rPr>
@@ -35903,7 +36261,7 @@
         <w:rPr>
           <w:szCs w:val="24"/>
         </w:rPr>
-        <w:t>和框平滑更适合改善低延迟观看体验。</w:t>
+        <w:t>、运动预测和框平滑更适合改善低延迟观看体验。</w:t>
       </w:r>
     </w:p>
     <w:p>
@@ -35927,7 +36285,7 @@
         <w:rPr>
           <w:szCs w:val="24"/>
         </w:rPr>
-        <w:t>输入设置和</w:t>
+        <w:t>输入设置、</w:t>
       </w:r>
       <w:r>
         <w:rPr>
@@ -35939,7 +36297,19 @@
         <w:rPr>
           <w:szCs w:val="24"/>
         </w:rPr>
-        <w:t>执行阶段。</w:t>
+        <w:t>执行和实时调度之间的组合开销。</w:t>
+      </w:r>
+      <w:r>
+        <w:rPr>
+          <w:szCs w:val="24"/>
+        </w:rPr>
+        <w:t>RGA cvt+resize</w:t>
+      </w:r>
+      <w:r>
+        <w:rPr>
+          <w:szCs w:val="24"/>
+        </w:rPr>
+        <w:t>和</w:t>
       </w:r>
       <w:r>
         <w:rPr>
@@ -35951,7 +36321,31 @@
         <w:rPr>
           <w:szCs w:val="24"/>
         </w:rPr>
-        <w:t>实验表明，简单绑定输入内存不能直接解决性能问题，后续需要结合输入数据类型、模型量化方式和硬件预处理路径继续优化。</w:t>
+        <w:t>实验表明，硬件输入路径具备继续优化空间，但在成为默认路径前仍需结合输入数据类型、模型量化方式、</w:t>
+      </w:r>
+      <w:r>
+        <w:rPr>
+          <w:szCs w:val="24"/>
+        </w:rPr>
+        <w:t>MPP</w:t>
+      </w:r>
+      <w:r>
+        <w:rPr>
+          <w:szCs w:val="24"/>
+        </w:rPr>
+        <w:t>解码和实时</w:t>
+      </w:r>
+      <w:r>
+        <w:rPr>
+          <w:szCs w:val="24"/>
+        </w:rPr>
+        <w:t>RTSP</w:t>
+      </w:r>
+      <w:r>
+        <w:rPr>
+          <w:szCs w:val="24"/>
+        </w:rPr>
+        <w:t>链路继续验证。</w:t>
       </w:r>
     </w:p>
     <w:p>
@@ -36013,7 +36407,7 @@
         <w:jc w:val="center"/>
         <w:outlineLvl w:val="0"/>
       </w:pPr>
-      <w:bookmarkStart w:id="54" w:name="_Toc228286754"/>
+      <w:bookmarkStart w:id="54" w:name="_Toc228306675"/>
       <w:r>
         <w:rPr>
           <w:rFonts w:eastAsia="黑体" w:hint="eastAsia"/>
@@ -36055,7 +36449,7 @@
           <w:szCs w:val="24"/>
         </w:rPr>
       </w:pPr>
-      <w:bookmarkStart w:id="55" w:name="_Toc228286755"/>
+      <w:bookmarkStart w:id="55" w:name="_Toc228306676"/>
       <w:r>
         <w:rPr>
           <w:rFonts w:eastAsia="黑体" w:hint="eastAsia"/>
@@ -36249,7 +36643,7 @@
           <w:szCs w:val="24"/>
         </w:rPr>
       </w:pPr>
-      <w:bookmarkStart w:id="56" w:name="_Toc228286756"/>
+      <w:bookmarkStart w:id="56" w:name="_Toc228306677"/>
       <w:r>
         <w:rPr>
           <w:rFonts w:eastAsia="黑体" w:hint="eastAsia"/>
@@ -36551,7 +36945,7 @@
         <w:jc w:val="center"/>
         <w:outlineLvl w:val="0"/>
       </w:pPr>
-      <w:bookmarkStart w:id="57" w:name="_Toc228286757"/>
+      <w:bookmarkStart w:id="57" w:name="_Toc228306678"/>
       <w:r>
         <w:rPr>
           <w:rFonts w:eastAsia="黑体"/>
@@ -36799,35 +37193,26 @@
           <w:sz w:val="21"/>
           <w:szCs w:val="36"/>
         </w:rPr>
-        <w:t>[13] NVIDIA. Jetson Nano Technical Specifications[EB/OL]. [2026-04-28]. https://www.nvidia.com/en-us/autonomous-machines/embedded-syste</w:t>
-      </w:r>
-      <w:r>
+        <w:t>[13] NVIDIA. Jetson Nano Technical Specifications[EB/OL]. [2026-04-28]. https://www.nvidia.com/en-us/autonomous-machines/embedded-systems/jetson-nano/product-development/.</w:t>
+      </w:r>
+    </w:p>
+    <w:p>
+      <w:pPr>
+        <w:widowControl/>
+        <w:spacing w:line="240" w:lineRule="auto"/>
+        <w:jc w:val="left"/>
         <w:rPr>
           <w:rFonts w:cs="Times New Roman"/>
           <w:sz w:val="21"/>
           <w:szCs w:val="36"/>
         </w:rPr>
-        <w:lastRenderedPageBreak/>
-        <w:t>ms/jetson-nano/product-development/.</w:t>
-      </w:r>
-    </w:p>
-    <w:p>
-      <w:pPr>
-        <w:widowControl/>
-        <w:spacing w:line="240" w:lineRule="auto"/>
-        <w:jc w:val="left"/>
+      </w:pPr>
+      <w:r>
         <w:rPr>
           <w:rFonts w:cs="Times New Roman"/>
           <w:sz w:val="21"/>
           <w:szCs w:val="36"/>
         </w:rPr>
-      </w:pPr>
-      <w:r>
-        <w:rPr>
-          <w:rFonts w:cs="Times New Roman"/>
-          <w:sz w:val="21"/>
-          <w:szCs w:val="36"/>
-        </w:rPr>
         <w:t>[14] NVIDIA. Jetson[EB/OL]. [2026-04-28]. https://developer.nvidia.com/jetson.</w:t>
       </w:r>
     </w:p>
@@ -36837,7 +37222,7 @@
         <w:jc w:val="center"/>
         <w:outlineLvl w:val="0"/>
       </w:pPr>
-      <w:bookmarkStart w:id="58" w:name="_Toc228286758"/>
+      <w:bookmarkStart w:id="58" w:name="_Toc228306679"/>
       <w:r>
         <w:rPr>
           <w:rFonts w:eastAsia="黑体"/>

</xml_diff>

<commit_message>
Address thesis review minor findings
</commit_message>
<xml_diff>
--- a/Thesis Project/paper/full_thesis_latest_merged.docx
+++ b/Thesis Project/paper/full_thesis_latest_merged.docx
@@ -1595,7 +1595,7 @@
         </w:rPr>
         <w:fldChar w:fldCharType="separate"/>
       </w:r>
-      <w:hyperlink w:anchor="_Toc228306621" w:history="1">
+      <w:hyperlink w:anchor="_Toc228308149" w:history="1">
         <w:r>
           <w:rPr>
             <w:rStyle w:val="af3"/>
@@ -1636,7 +1636,7 @@
             <w:noProof/>
             <w:webHidden/>
           </w:rPr>
-          <w:instrText xml:space="preserve"> PAGEREF _Toc228306621 \h </w:instrText>
+          <w:instrText xml:space="preserve"> PAGEREF _Toc228308149 \h </w:instrText>
         </w:r>
         <w:r>
           <w:rPr>
@@ -1679,7 +1679,7 @@
           <w14:ligatures w14:val="standardContextual"/>
         </w:rPr>
       </w:pPr>
-      <w:hyperlink w:anchor="_Toc228306622" w:history="1">
+      <w:hyperlink w:anchor="_Toc228308150" w:history="1">
         <w:r>
           <w:rPr>
             <w:rStyle w:val="af3"/>
@@ -1717,7 +1717,7 @@
             <w:noProof/>
             <w:webHidden/>
           </w:rPr>
-          <w:instrText xml:space="preserve"> PAGEREF _Toc228306622 \h </w:instrText>
+          <w:instrText xml:space="preserve"> PAGEREF _Toc228308150 \h </w:instrText>
         </w:r>
         <w:r>
           <w:rPr>
@@ -1760,7 +1760,7 @@
           <w14:ligatures w14:val="standardContextual"/>
         </w:rPr>
       </w:pPr>
-      <w:hyperlink w:anchor="_Toc228306623" w:history="1">
+      <w:hyperlink w:anchor="_Toc228308151" w:history="1">
         <w:r>
           <w:rPr>
             <w:rStyle w:val="af3"/>
@@ -1798,7 +1798,7 @@
             <w:noProof/>
             <w:webHidden/>
           </w:rPr>
-          <w:instrText xml:space="preserve"> PAGEREF _Toc228306623 \h </w:instrText>
+          <w:instrText xml:space="preserve"> PAGEREF _Toc228308151 \h </w:instrText>
         </w:r>
         <w:r>
           <w:rPr>
@@ -1841,7 +1841,7 @@
           <w14:ligatures w14:val="standardContextual"/>
         </w:rPr>
       </w:pPr>
-      <w:hyperlink w:anchor="_Toc228306624" w:history="1">
+      <w:hyperlink w:anchor="_Toc228308152" w:history="1">
         <w:r>
           <w:rPr>
             <w:rStyle w:val="af3"/>
@@ -1879,7 +1879,7 @@
             <w:noProof/>
             <w:webHidden/>
           </w:rPr>
-          <w:instrText xml:space="preserve"> PAGEREF _Toc228306624 \h </w:instrText>
+          <w:instrText xml:space="preserve"> PAGEREF _Toc228308152 \h </w:instrText>
         </w:r>
         <w:r>
           <w:rPr>
@@ -1922,7 +1922,7 @@
           <w14:ligatures w14:val="standardContextual"/>
         </w:rPr>
       </w:pPr>
-      <w:hyperlink w:anchor="_Toc228306625" w:history="1">
+      <w:hyperlink w:anchor="_Toc228308153" w:history="1">
         <w:r>
           <w:rPr>
             <w:rStyle w:val="af3"/>
@@ -1960,7 +1960,7 @@
             <w:noProof/>
             <w:webHidden/>
           </w:rPr>
-          <w:instrText xml:space="preserve"> PAGEREF _Toc228306625 \h </w:instrText>
+          <w:instrText xml:space="preserve"> PAGEREF _Toc228308153 \h </w:instrText>
         </w:r>
         <w:r>
           <w:rPr>
@@ -2003,7 +2003,7 @@
           <w14:ligatures w14:val="standardContextual"/>
         </w:rPr>
       </w:pPr>
-      <w:hyperlink w:anchor="_Toc228306626" w:history="1">
+      <w:hyperlink w:anchor="_Toc228308154" w:history="1">
         <w:r>
           <w:rPr>
             <w:rStyle w:val="af3"/>
@@ -2047,7 +2047,7 @@
             <w:noProof/>
             <w:webHidden/>
           </w:rPr>
-          <w:instrText xml:space="preserve"> PAGEREF _Toc228306626 \h </w:instrText>
+          <w:instrText xml:space="preserve"> PAGEREF _Toc228308154 \h </w:instrText>
         </w:r>
         <w:r>
           <w:rPr>
@@ -2090,7 +2090,7 @@
           <w14:ligatures w14:val="standardContextual"/>
         </w:rPr>
       </w:pPr>
-      <w:hyperlink w:anchor="_Toc228306627" w:history="1">
+      <w:hyperlink w:anchor="_Toc228308155" w:history="1">
         <w:r>
           <w:rPr>
             <w:rStyle w:val="af3"/>
@@ -2128,7 +2128,7 @@
             <w:noProof/>
             <w:webHidden/>
           </w:rPr>
-          <w:instrText xml:space="preserve"> PAGEREF _Toc228306627 \h </w:instrText>
+          <w:instrText xml:space="preserve"> PAGEREF _Toc228308155 \h </w:instrText>
         </w:r>
         <w:r>
           <w:rPr>
@@ -2171,7 +2171,7 @@
           <w14:ligatures w14:val="standardContextual"/>
         </w:rPr>
       </w:pPr>
-      <w:hyperlink w:anchor="_Toc228306628" w:history="1">
+      <w:hyperlink w:anchor="_Toc228308156" w:history="1">
         <w:r>
           <w:rPr>
             <w:rStyle w:val="af3"/>
@@ -2209,7 +2209,7 @@
             <w:noProof/>
             <w:webHidden/>
           </w:rPr>
-          <w:instrText xml:space="preserve"> PAGEREF _Toc228306628 \h </w:instrText>
+          <w:instrText xml:space="preserve"> PAGEREF _Toc228308156 \h </w:instrText>
         </w:r>
         <w:r>
           <w:rPr>
@@ -2252,7 +2252,7 @@
           <w14:ligatures w14:val="standardContextual"/>
         </w:rPr>
       </w:pPr>
-      <w:hyperlink w:anchor="_Toc228306629" w:history="1">
+      <w:hyperlink w:anchor="_Toc228308157" w:history="1">
         <w:r>
           <w:rPr>
             <w:rStyle w:val="af3"/>
@@ -2290,7 +2290,7 @@
             <w:noProof/>
             <w:webHidden/>
           </w:rPr>
-          <w:instrText xml:space="preserve"> PAGEREF _Toc228306629 \h </w:instrText>
+          <w:instrText xml:space="preserve"> PAGEREF _Toc228308157 \h </w:instrText>
         </w:r>
         <w:r>
           <w:rPr>
@@ -2333,7 +2333,7 @@
           <w14:ligatures w14:val="standardContextual"/>
         </w:rPr>
       </w:pPr>
-      <w:hyperlink w:anchor="_Toc228306630" w:history="1">
+      <w:hyperlink w:anchor="_Toc228308158" w:history="1">
         <w:r>
           <w:rPr>
             <w:rStyle w:val="af3"/>
@@ -2371,7 +2371,7 @@
             <w:noProof/>
             <w:webHidden/>
           </w:rPr>
-          <w:instrText xml:space="preserve"> PAGEREF _Toc228306630 \h </w:instrText>
+          <w:instrText xml:space="preserve"> PAGEREF _Toc228308158 \h </w:instrText>
         </w:r>
         <w:r>
           <w:rPr>
@@ -2414,7 +2414,7 @@
           <w14:ligatures w14:val="standardContextual"/>
         </w:rPr>
       </w:pPr>
-      <w:hyperlink w:anchor="_Toc228306631" w:history="1">
+      <w:hyperlink w:anchor="_Toc228308159" w:history="1">
         <w:r>
           <w:rPr>
             <w:rStyle w:val="af3"/>
@@ -2452,7 +2452,7 @@
             <w:noProof/>
             <w:webHidden/>
           </w:rPr>
-          <w:instrText xml:space="preserve"> PAGEREF _Toc228306631 \h </w:instrText>
+          <w:instrText xml:space="preserve"> PAGEREF _Toc228308159 \h </w:instrText>
         </w:r>
         <w:r>
           <w:rPr>
@@ -2495,7 +2495,7 @@
           <w14:ligatures w14:val="standardContextual"/>
         </w:rPr>
       </w:pPr>
-      <w:hyperlink w:anchor="_Toc228306632" w:history="1">
+      <w:hyperlink w:anchor="_Toc228308160" w:history="1">
         <w:r>
           <w:rPr>
             <w:rStyle w:val="af3"/>
@@ -2533,7 +2533,7 @@
             <w:noProof/>
             <w:webHidden/>
           </w:rPr>
-          <w:instrText xml:space="preserve"> PAGEREF _Toc228306632 \h </w:instrText>
+          <w:instrText xml:space="preserve"> PAGEREF _Toc228308160 \h </w:instrText>
         </w:r>
         <w:r>
           <w:rPr>
@@ -2576,7 +2576,7 @@
           <w14:ligatures w14:val="standardContextual"/>
         </w:rPr>
       </w:pPr>
-      <w:hyperlink w:anchor="_Toc228306633" w:history="1">
+      <w:hyperlink w:anchor="_Toc228308161" w:history="1">
         <w:r>
           <w:rPr>
             <w:rStyle w:val="af3"/>
@@ -2620,7 +2620,7 @@
             <w:noProof/>
             <w:webHidden/>
           </w:rPr>
-          <w:instrText xml:space="preserve"> PAGEREF _Toc228306633 \h </w:instrText>
+          <w:instrText xml:space="preserve"> PAGEREF _Toc228308161 \h </w:instrText>
         </w:r>
         <w:r>
           <w:rPr>
@@ -2663,7 +2663,7 @@
           <w14:ligatures w14:val="standardContextual"/>
         </w:rPr>
       </w:pPr>
-      <w:hyperlink w:anchor="_Toc228306634" w:history="1">
+      <w:hyperlink w:anchor="_Toc228308162" w:history="1">
         <w:r>
           <w:rPr>
             <w:rStyle w:val="af3"/>
@@ -2701,7 +2701,7 @@
             <w:noProof/>
             <w:webHidden/>
           </w:rPr>
-          <w:instrText xml:space="preserve"> PAGEREF _Toc228306634 \h </w:instrText>
+          <w:instrText xml:space="preserve"> PAGEREF _Toc228308162 \h </w:instrText>
         </w:r>
         <w:r>
           <w:rPr>
@@ -2743,7 +2743,7 @@
           <w14:ligatures w14:val="standardContextual"/>
         </w:rPr>
       </w:pPr>
-      <w:hyperlink w:anchor="_Toc228306635" w:history="1">
+      <w:hyperlink w:anchor="_Toc228308163" w:history="1">
         <w:r>
           <w:rPr>
             <w:rStyle w:val="af3"/>
@@ -2781,7 +2781,7 @@
             <w:noProof/>
             <w:webHidden/>
           </w:rPr>
-          <w:instrText xml:space="preserve"> PAGEREF _Toc228306635 \h </w:instrText>
+          <w:instrText xml:space="preserve"> PAGEREF _Toc228308163 \h </w:instrText>
         </w:r>
         <w:r>
           <w:rPr>
@@ -2823,7 +2823,7 @@
           <w14:ligatures w14:val="standardContextual"/>
         </w:rPr>
       </w:pPr>
-      <w:hyperlink w:anchor="_Toc228306636" w:history="1">
+      <w:hyperlink w:anchor="_Toc228308164" w:history="1">
         <w:r>
           <w:rPr>
             <w:rStyle w:val="af3"/>
@@ -2861,7 +2861,7 @@
             <w:noProof/>
             <w:webHidden/>
           </w:rPr>
-          <w:instrText xml:space="preserve"> PAGEREF _Toc228306636 \h </w:instrText>
+          <w:instrText xml:space="preserve"> PAGEREF _Toc228308164 \h </w:instrText>
         </w:r>
         <w:r>
           <w:rPr>
@@ -2903,7 +2903,7 @@
           <w14:ligatures w14:val="standardContextual"/>
         </w:rPr>
       </w:pPr>
-      <w:hyperlink w:anchor="_Toc228306637" w:history="1">
+      <w:hyperlink w:anchor="_Toc228308165" w:history="1">
         <w:r>
           <w:rPr>
             <w:rStyle w:val="af3"/>
@@ -2941,7 +2941,7 @@
             <w:noProof/>
             <w:webHidden/>
           </w:rPr>
-          <w:instrText xml:space="preserve"> PAGEREF _Toc228306637 \h </w:instrText>
+          <w:instrText xml:space="preserve"> PAGEREF _Toc228308165 \h </w:instrText>
         </w:r>
         <w:r>
           <w:rPr>
@@ -2984,7 +2984,7 @@
           <w14:ligatures w14:val="standardContextual"/>
         </w:rPr>
       </w:pPr>
-      <w:hyperlink w:anchor="_Toc228306638" w:history="1">
+      <w:hyperlink w:anchor="_Toc228308166" w:history="1">
         <w:r>
           <w:rPr>
             <w:rStyle w:val="af3"/>
@@ -3022,7 +3022,7 @@
             <w:noProof/>
             <w:webHidden/>
           </w:rPr>
-          <w:instrText xml:space="preserve"> PAGEREF _Toc228306638 \h </w:instrText>
+          <w:instrText xml:space="preserve"> PAGEREF _Toc228308166 \h </w:instrText>
         </w:r>
         <w:r>
           <w:rPr>
@@ -3065,7 +3065,7 @@
           <w14:ligatures w14:val="standardContextual"/>
         </w:rPr>
       </w:pPr>
-      <w:hyperlink w:anchor="_Toc228306639" w:history="1">
+      <w:hyperlink w:anchor="_Toc228308167" w:history="1">
         <w:r>
           <w:rPr>
             <w:rStyle w:val="af3"/>
@@ -3103,7 +3103,7 @@
             <w:noProof/>
             <w:webHidden/>
           </w:rPr>
-          <w:instrText xml:space="preserve"> PAGEREF _Toc228306639 \h </w:instrText>
+          <w:instrText xml:space="preserve"> PAGEREF _Toc228308167 \h </w:instrText>
         </w:r>
         <w:r>
           <w:rPr>
@@ -3145,7 +3145,7 @@
           <w14:ligatures w14:val="standardContextual"/>
         </w:rPr>
       </w:pPr>
-      <w:hyperlink w:anchor="_Toc228306640" w:history="1">
+      <w:hyperlink w:anchor="_Toc228308168" w:history="1">
         <w:r>
           <w:rPr>
             <w:rStyle w:val="af3"/>
@@ -3183,7 +3183,7 @@
             <w:noProof/>
             <w:webHidden/>
           </w:rPr>
-          <w:instrText xml:space="preserve"> PAGEREF _Toc228306640 \h </w:instrText>
+          <w:instrText xml:space="preserve"> PAGEREF _Toc228308168 \h </w:instrText>
         </w:r>
         <w:r>
           <w:rPr>
@@ -3225,7 +3225,7 @@
           <w14:ligatures w14:val="standardContextual"/>
         </w:rPr>
       </w:pPr>
-      <w:hyperlink w:anchor="_Toc228306641" w:history="1">
+      <w:hyperlink w:anchor="_Toc228308169" w:history="1">
         <w:r>
           <w:rPr>
             <w:rStyle w:val="af3"/>
@@ -3263,7 +3263,7 @@
             <w:noProof/>
             <w:webHidden/>
           </w:rPr>
-          <w:instrText xml:space="preserve"> PAGEREF _Toc228306641 \h </w:instrText>
+          <w:instrText xml:space="preserve"> PAGEREF _Toc228308169 \h </w:instrText>
         </w:r>
         <w:r>
           <w:rPr>
@@ -3306,7 +3306,7 @@
           <w14:ligatures w14:val="standardContextual"/>
         </w:rPr>
       </w:pPr>
-      <w:hyperlink w:anchor="_Toc228306642" w:history="1">
+      <w:hyperlink w:anchor="_Toc228308170" w:history="1">
         <w:r>
           <w:rPr>
             <w:rStyle w:val="af3"/>
@@ -3344,7 +3344,7 @@
             <w:noProof/>
             <w:webHidden/>
           </w:rPr>
-          <w:instrText xml:space="preserve"> PAGEREF _Toc228306642 \h </w:instrText>
+          <w:instrText xml:space="preserve"> PAGEREF _Toc228308170 \h </w:instrText>
         </w:r>
         <w:r>
           <w:rPr>
@@ -3386,7 +3386,7 @@
           <w14:ligatures w14:val="standardContextual"/>
         </w:rPr>
       </w:pPr>
-      <w:hyperlink w:anchor="_Toc228306643" w:history="1">
+      <w:hyperlink w:anchor="_Toc228308171" w:history="1">
         <w:r>
           <w:rPr>
             <w:rStyle w:val="af3"/>
@@ -3424,7 +3424,7 @@
             <w:noProof/>
             <w:webHidden/>
           </w:rPr>
-          <w:instrText xml:space="preserve"> PAGEREF _Toc228306643 \h </w:instrText>
+          <w:instrText xml:space="preserve"> PAGEREF _Toc228308171 \h </w:instrText>
         </w:r>
         <w:r>
           <w:rPr>
@@ -3466,7 +3466,7 @@
           <w14:ligatures w14:val="standardContextual"/>
         </w:rPr>
       </w:pPr>
-      <w:hyperlink w:anchor="_Toc228306644" w:history="1">
+      <w:hyperlink w:anchor="_Toc228308172" w:history="1">
         <w:r>
           <w:rPr>
             <w:rStyle w:val="af3"/>
@@ -3504,7 +3504,7 @@
             <w:noProof/>
             <w:webHidden/>
           </w:rPr>
-          <w:instrText xml:space="preserve"> PAGEREF _Toc228306644 \h </w:instrText>
+          <w:instrText xml:space="preserve"> PAGEREF _Toc228308172 \h </w:instrText>
         </w:r>
         <w:r>
           <w:rPr>
@@ -3547,7 +3547,7 @@
           <w14:ligatures w14:val="standardContextual"/>
         </w:rPr>
       </w:pPr>
-      <w:hyperlink w:anchor="_Toc228306645" w:history="1">
+      <w:hyperlink w:anchor="_Toc228308173" w:history="1">
         <w:r>
           <w:rPr>
             <w:rStyle w:val="af3"/>
@@ -3603,7 +3603,7 @@
             <w:noProof/>
             <w:webHidden/>
           </w:rPr>
-          <w:instrText xml:space="preserve"> PAGEREF _Toc228306645 \h </w:instrText>
+          <w:instrText xml:space="preserve"> PAGEREF _Toc228308173 \h </w:instrText>
         </w:r>
         <w:r>
           <w:rPr>
@@ -3645,7 +3645,7 @@
           <w14:ligatures w14:val="standardContextual"/>
         </w:rPr>
       </w:pPr>
-      <w:hyperlink w:anchor="_Toc228306646" w:history="1">
+      <w:hyperlink w:anchor="_Toc228308174" w:history="1">
         <w:r>
           <w:rPr>
             <w:rStyle w:val="af3"/>
@@ -3683,7 +3683,7 @@
             <w:noProof/>
             <w:webHidden/>
           </w:rPr>
-          <w:instrText xml:space="preserve"> PAGEREF _Toc228306646 \h </w:instrText>
+          <w:instrText xml:space="preserve"> PAGEREF _Toc228308174 \h </w:instrText>
         </w:r>
         <w:r>
           <w:rPr>
@@ -3725,7 +3725,7 @@
           <w14:ligatures w14:val="standardContextual"/>
         </w:rPr>
       </w:pPr>
-      <w:hyperlink w:anchor="_Toc228306647" w:history="1">
+      <w:hyperlink w:anchor="_Toc228308175" w:history="1">
         <w:r>
           <w:rPr>
             <w:rStyle w:val="af3"/>
@@ -3781,7 +3781,7 @@
             <w:noProof/>
             <w:webHidden/>
           </w:rPr>
-          <w:instrText xml:space="preserve"> PAGEREF _Toc228306647 \h </w:instrText>
+          <w:instrText xml:space="preserve"> PAGEREF _Toc228308175 \h </w:instrText>
         </w:r>
         <w:r>
           <w:rPr>
@@ -3823,7 +3823,7 @@
           <w14:ligatures w14:val="standardContextual"/>
         </w:rPr>
       </w:pPr>
-      <w:hyperlink w:anchor="_Toc228306648" w:history="1">
+      <w:hyperlink w:anchor="_Toc228308176" w:history="1">
         <w:r>
           <w:rPr>
             <w:rStyle w:val="af3"/>
@@ -3861,7 +3861,7 @@
             <w:noProof/>
             <w:webHidden/>
           </w:rPr>
-          <w:instrText xml:space="preserve"> PAGEREF _Toc228306648 \h </w:instrText>
+          <w:instrText xml:space="preserve"> PAGEREF _Toc228308176 \h </w:instrText>
         </w:r>
         <w:r>
           <w:rPr>
@@ -3904,7 +3904,7 @@
           <w14:ligatures w14:val="standardContextual"/>
         </w:rPr>
       </w:pPr>
-      <w:hyperlink w:anchor="_Toc228306649" w:history="1">
+      <w:hyperlink w:anchor="_Toc228308177" w:history="1">
         <w:r>
           <w:rPr>
             <w:rStyle w:val="af3"/>
@@ -3960,7 +3960,7 @@
             <w:noProof/>
             <w:webHidden/>
           </w:rPr>
-          <w:instrText xml:space="preserve"> PAGEREF _Toc228306649 \h </w:instrText>
+          <w:instrText xml:space="preserve"> PAGEREF _Toc228308177 \h </w:instrText>
         </w:r>
         <w:r>
           <w:rPr>
@@ -4002,7 +4002,7 @@
           <w14:ligatures w14:val="standardContextual"/>
         </w:rPr>
       </w:pPr>
-      <w:hyperlink w:anchor="_Toc228306650" w:history="1">
+      <w:hyperlink w:anchor="_Toc228308178" w:history="1">
         <w:r>
           <w:rPr>
             <w:rStyle w:val="af3"/>
@@ -4058,7 +4058,7 @@
             <w:noProof/>
             <w:webHidden/>
           </w:rPr>
-          <w:instrText xml:space="preserve"> PAGEREF _Toc228306650 \h </w:instrText>
+          <w:instrText xml:space="preserve"> PAGEREF _Toc228308178 \h </w:instrText>
         </w:r>
         <w:r>
           <w:rPr>
@@ -4100,7 +4100,7 @@
           <w14:ligatures w14:val="standardContextual"/>
         </w:rPr>
       </w:pPr>
-      <w:hyperlink w:anchor="_Toc228306651" w:history="1">
+      <w:hyperlink w:anchor="_Toc228308179" w:history="1">
         <w:r>
           <w:rPr>
             <w:rStyle w:val="af3"/>
@@ -4156,7 +4156,7 @@
             <w:noProof/>
             <w:webHidden/>
           </w:rPr>
-          <w:instrText xml:space="preserve"> PAGEREF _Toc228306651 \h </w:instrText>
+          <w:instrText xml:space="preserve"> PAGEREF _Toc228308179 \h </w:instrText>
         </w:r>
         <w:r>
           <w:rPr>
@@ -4198,7 +4198,7 @@
           <w14:ligatures w14:val="standardContextual"/>
         </w:rPr>
       </w:pPr>
-      <w:hyperlink w:anchor="_Toc228306652" w:history="1">
+      <w:hyperlink w:anchor="_Toc228308180" w:history="1">
         <w:r>
           <w:rPr>
             <w:rStyle w:val="af3"/>
@@ -4236,7 +4236,7 @@
             <w:noProof/>
             <w:webHidden/>
           </w:rPr>
-          <w:instrText xml:space="preserve"> PAGEREF _Toc228306652 \h </w:instrText>
+          <w:instrText xml:space="preserve"> PAGEREF _Toc228308180 \h </w:instrText>
         </w:r>
         <w:r>
           <w:rPr>
@@ -4279,7 +4279,7 @@
           <w14:ligatures w14:val="standardContextual"/>
         </w:rPr>
       </w:pPr>
-      <w:hyperlink w:anchor="_Toc228306653" w:history="1">
+      <w:hyperlink w:anchor="_Toc228308181" w:history="1">
         <w:r>
           <w:rPr>
             <w:rStyle w:val="af3"/>
@@ -4317,7 +4317,7 @@
             <w:noProof/>
             <w:webHidden/>
           </w:rPr>
-          <w:instrText xml:space="preserve"> PAGEREF _Toc228306653 \h </w:instrText>
+          <w:instrText xml:space="preserve"> PAGEREF _Toc228308181 \h </w:instrText>
         </w:r>
         <w:r>
           <w:rPr>
@@ -4360,7 +4360,7 @@
           <w14:ligatures w14:val="standardContextual"/>
         </w:rPr>
       </w:pPr>
-      <w:hyperlink w:anchor="_Toc228306654" w:history="1">
+      <w:hyperlink w:anchor="_Toc228308182" w:history="1">
         <w:r>
           <w:rPr>
             <w:rStyle w:val="af3"/>
@@ -4404,7 +4404,7 @@
             <w:noProof/>
             <w:webHidden/>
           </w:rPr>
-          <w:instrText xml:space="preserve"> PAGEREF _Toc228306654 \h </w:instrText>
+          <w:instrText xml:space="preserve"> PAGEREF _Toc228308182 \h </w:instrText>
         </w:r>
         <w:r>
           <w:rPr>
@@ -4447,7 +4447,7 @@
           <w14:ligatures w14:val="standardContextual"/>
         </w:rPr>
       </w:pPr>
-      <w:hyperlink w:anchor="_Toc228306655" w:history="1">
+      <w:hyperlink w:anchor="_Toc228308183" w:history="1">
         <w:r>
           <w:rPr>
             <w:rStyle w:val="af3"/>
@@ -4485,7 +4485,7 @@
             <w:noProof/>
             <w:webHidden/>
           </w:rPr>
-          <w:instrText xml:space="preserve"> PAGEREF _Toc228306655 \h </w:instrText>
+          <w:instrText xml:space="preserve"> PAGEREF _Toc228308183 \h </w:instrText>
         </w:r>
         <w:r>
           <w:rPr>
@@ -4528,7 +4528,7 @@
           <w14:ligatures w14:val="standardContextual"/>
         </w:rPr>
       </w:pPr>
-      <w:hyperlink w:anchor="_Toc228306656" w:history="1">
+      <w:hyperlink w:anchor="_Toc228308184" w:history="1">
         <w:r>
           <w:rPr>
             <w:rStyle w:val="af3"/>
@@ -4584,7 +4584,7 @@
             <w:noProof/>
             <w:webHidden/>
           </w:rPr>
-          <w:instrText xml:space="preserve"> PAGEREF _Toc228306656 \h </w:instrText>
+          <w:instrText xml:space="preserve"> PAGEREF _Toc228308184 \h </w:instrText>
         </w:r>
         <w:r>
           <w:rPr>
@@ -4627,7 +4627,7 @@
           <w14:ligatures w14:val="standardContextual"/>
         </w:rPr>
       </w:pPr>
-      <w:hyperlink w:anchor="_Toc228306657" w:history="1">
+      <w:hyperlink w:anchor="_Toc228308185" w:history="1">
         <w:r>
           <w:rPr>
             <w:rStyle w:val="af3"/>
@@ -4665,7 +4665,7 @@
             <w:noProof/>
             <w:webHidden/>
           </w:rPr>
-          <w:instrText xml:space="preserve"> PAGEREF _Toc228306657 \h </w:instrText>
+          <w:instrText xml:space="preserve"> PAGEREF _Toc228308185 \h </w:instrText>
         </w:r>
         <w:r>
           <w:rPr>
@@ -4708,7 +4708,7 @@
           <w14:ligatures w14:val="standardContextual"/>
         </w:rPr>
       </w:pPr>
-      <w:hyperlink w:anchor="_Toc228306658" w:history="1">
+      <w:hyperlink w:anchor="_Toc228308186" w:history="1">
         <w:r>
           <w:rPr>
             <w:rStyle w:val="af3"/>
@@ -4746,7 +4746,7 @@
             <w:noProof/>
             <w:webHidden/>
           </w:rPr>
-          <w:instrText xml:space="preserve"> PAGEREF _Toc228306658 \h </w:instrText>
+          <w:instrText xml:space="preserve"> PAGEREF _Toc228308186 \h </w:instrText>
         </w:r>
         <w:r>
           <w:rPr>
@@ -4789,7 +4789,7 @@
           <w14:ligatures w14:val="standardContextual"/>
         </w:rPr>
       </w:pPr>
-      <w:hyperlink w:anchor="_Toc228306659" w:history="1">
+      <w:hyperlink w:anchor="_Toc228308187" w:history="1">
         <w:r>
           <w:rPr>
             <w:rStyle w:val="af3"/>
@@ -4845,7 +4845,7 @@
             <w:noProof/>
             <w:webHidden/>
           </w:rPr>
-          <w:instrText xml:space="preserve"> PAGEREF _Toc228306659 \h </w:instrText>
+          <w:instrText xml:space="preserve"> PAGEREF _Toc228308187 \h </w:instrText>
         </w:r>
         <w:r>
           <w:rPr>
@@ -4888,7 +4888,7 @@
           <w14:ligatures w14:val="standardContextual"/>
         </w:rPr>
       </w:pPr>
-      <w:hyperlink w:anchor="_Toc228306660" w:history="1">
+      <w:hyperlink w:anchor="_Toc228308188" w:history="1">
         <w:r>
           <w:rPr>
             <w:rStyle w:val="af3"/>
@@ -4944,7 +4944,7 @@
             <w:noProof/>
             <w:webHidden/>
           </w:rPr>
-          <w:instrText xml:space="preserve"> PAGEREF _Toc228306660 \h </w:instrText>
+          <w:instrText xml:space="preserve"> PAGEREF _Toc228308188 \h </w:instrText>
         </w:r>
         <w:r>
           <w:rPr>
@@ -4987,7 +4987,7 @@
           <w14:ligatures w14:val="standardContextual"/>
         </w:rPr>
       </w:pPr>
-      <w:hyperlink w:anchor="_Toc228306661" w:history="1">
+      <w:hyperlink w:anchor="_Toc228308189" w:history="1">
         <w:r>
           <w:rPr>
             <w:rStyle w:val="af3"/>
@@ -5043,7 +5043,7 @@
             <w:noProof/>
             <w:webHidden/>
           </w:rPr>
-          <w:instrText xml:space="preserve"> PAGEREF _Toc228306661 \h </w:instrText>
+          <w:instrText xml:space="preserve"> PAGEREF _Toc228308189 \h </w:instrText>
         </w:r>
         <w:r>
           <w:rPr>
@@ -5086,7 +5086,7 @@
           <w14:ligatures w14:val="standardContextual"/>
         </w:rPr>
       </w:pPr>
-      <w:hyperlink w:anchor="_Toc228306662" w:history="1">
+      <w:hyperlink w:anchor="_Toc228308190" w:history="1">
         <w:r>
           <w:rPr>
             <w:rStyle w:val="af3"/>
@@ -5124,7 +5124,7 @@
             <w:noProof/>
             <w:webHidden/>
           </w:rPr>
-          <w:instrText xml:space="preserve"> PAGEREF _Toc228306662 \h </w:instrText>
+          <w:instrText xml:space="preserve"> PAGEREF _Toc228308190 \h </w:instrText>
         </w:r>
         <w:r>
           <w:rPr>
@@ -5167,7 +5167,7 @@
           <w14:ligatures w14:val="standardContextual"/>
         </w:rPr>
       </w:pPr>
-      <w:hyperlink w:anchor="_Toc228306663" w:history="1">
+      <w:hyperlink w:anchor="_Toc228308191" w:history="1">
         <w:r>
           <w:rPr>
             <w:rStyle w:val="af3"/>
@@ -5205,7 +5205,7 @@
             <w:noProof/>
             <w:webHidden/>
           </w:rPr>
-          <w:instrText xml:space="preserve"> PAGEREF _Toc228306663 \h </w:instrText>
+          <w:instrText xml:space="preserve"> PAGEREF _Toc228308191 \h </w:instrText>
         </w:r>
         <w:r>
           <w:rPr>
@@ -5248,7 +5248,7 @@
           <w14:ligatures w14:val="standardContextual"/>
         </w:rPr>
       </w:pPr>
-      <w:hyperlink w:anchor="_Toc228306664" w:history="1">
+      <w:hyperlink w:anchor="_Toc228308192" w:history="1">
         <w:r>
           <w:rPr>
             <w:rStyle w:val="af3"/>
@@ -5292,7 +5292,7 @@
             <w:noProof/>
             <w:webHidden/>
           </w:rPr>
-          <w:instrText xml:space="preserve"> PAGEREF _Toc228306664 \h </w:instrText>
+          <w:instrText xml:space="preserve"> PAGEREF _Toc228308192 \h </w:instrText>
         </w:r>
         <w:r>
           <w:rPr>
@@ -5335,7 +5335,7 @@
           <w14:ligatures w14:val="standardContextual"/>
         </w:rPr>
       </w:pPr>
-      <w:hyperlink w:anchor="_Toc228306665" w:history="1">
+      <w:hyperlink w:anchor="_Toc228308193" w:history="1">
         <w:r>
           <w:rPr>
             <w:rStyle w:val="af3"/>
@@ -5373,7 +5373,7 @@
             <w:noProof/>
             <w:webHidden/>
           </w:rPr>
-          <w:instrText xml:space="preserve"> PAGEREF _Toc228306665 \h </w:instrText>
+          <w:instrText xml:space="preserve"> PAGEREF _Toc228308193 \h </w:instrText>
         </w:r>
         <w:r>
           <w:rPr>
@@ -5416,7 +5416,7 @@
           <w14:ligatures w14:val="standardContextual"/>
         </w:rPr>
       </w:pPr>
-      <w:hyperlink w:anchor="_Toc228306666" w:history="1">
+      <w:hyperlink w:anchor="_Toc228308194" w:history="1">
         <w:r>
           <w:rPr>
             <w:rStyle w:val="af3"/>
@@ -5454,7 +5454,7 @@
             <w:noProof/>
             <w:webHidden/>
           </w:rPr>
-          <w:instrText xml:space="preserve"> PAGEREF _Toc228306666 \h </w:instrText>
+          <w:instrText xml:space="preserve"> PAGEREF _Toc228308194 \h </w:instrText>
         </w:r>
         <w:r>
           <w:rPr>
@@ -5497,7 +5497,7 @@
           <w14:ligatures w14:val="standardContextual"/>
         </w:rPr>
       </w:pPr>
-      <w:hyperlink w:anchor="_Toc228306667" w:history="1">
+      <w:hyperlink w:anchor="_Toc228308195" w:history="1">
         <w:r>
           <w:rPr>
             <w:rStyle w:val="af3"/>
@@ -5535,7 +5535,7 @@
             <w:noProof/>
             <w:webHidden/>
           </w:rPr>
-          <w:instrText xml:space="preserve"> PAGEREF _Toc228306667 \h </w:instrText>
+          <w:instrText xml:space="preserve"> PAGEREF _Toc228308195 \h </w:instrText>
         </w:r>
         <w:r>
           <w:rPr>
@@ -5578,7 +5578,7 @@
           <w14:ligatures w14:val="standardContextual"/>
         </w:rPr>
       </w:pPr>
-      <w:hyperlink w:anchor="_Toc228306668" w:history="1">
+      <w:hyperlink w:anchor="_Toc228308196" w:history="1">
         <w:r>
           <w:rPr>
             <w:rStyle w:val="af3"/>
@@ -5634,7 +5634,7 @@
             <w:noProof/>
             <w:webHidden/>
           </w:rPr>
-          <w:instrText xml:space="preserve"> PAGEREF _Toc228306668 \h </w:instrText>
+          <w:instrText xml:space="preserve"> PAGEREF _Toc228308196 \h </w:instrText>
         </w:r>
         <w:r>
           <w:rPr>
@@ -5677,7 +5677,7 @@
           <w14:ligatures w14:val="standardContextual"/>
         </w:rPr>
       </w:pPr>
-      <w:hyperlink w:anchor="_Toc228306669" w:history="1">
+      <w:hyperlink w:anchor="_Toc228308197" w:history="1">
         <w:r>
           <w:rPr>
             <w:rStyle w:val="af3"/>
@@ -5715,7 +5715,7 @@
             <w:noProof/>
             <w:webHidden/>
           </w:rPr>
-          <w:instrText xml:space="preserve"> PAGEREF _Toc228306669 \h </w:instrText>
+          <w:instrText xml:space="preserve"> PAGEREF _Toc228308197 \h </w:instrText>
         </w:r>
         <w:r>
           <w:rPr>
@@ -5758,7 +5758,7 @@
           <w14:ligatures w14:val="standardContextual"/>
         </w:rPr>
       </w:pPr>
-      <w:hyperlink w:anchor="_Toc228306670" w:history="1">
+      <w:hyperlink w:anchor="_Toc228308198" w:history="1">
         <w:r>
           <w:rPr>
             <w:rStyle w:val="af3"/>
@@ -5814,7 +5814,7 @@
             <w:noProof/>
             <w:webHidden/>
           </w:rPr>
-          <w:instrText xml:space="preserve"> PAGEREF _Toc228306670 \h </w:instrText>
+          <w:instrText xml:space="preserve"> PAGEREF _Toc228308198 \h </w:instrText>
         </w:r>
         <w:r>
           <w:rPr>
@@ -5857,7 +5857,7 @@
           <w14:ligatures w14:val="standardContextual"/>
         </w:rPr>
       </w:pPr>
-      <w:hyperlink w:anchor="_Toc228306671" w:history="1">
+      <w:hyperlink w:anchor="_Toc228308199" w:history="1">
         <w:r>
           <w:rPr>
             <w:rStyle w:val="af3"/>
@@ -5895,7 +5895,7 @@
             <w:noProof/>
             <w:webHidden/>
           </w:rPr>
-          <w:instrText xml:space="preserve"> PAGEREF _Toc228306671 \h </w:instrText>
+          <w:instrText xml:space="preserve"> PAGEREF _Toc228308199 \h </w:instrText>
         </w:r>
         <w:r>
           <w:rPr>
@@ -5938,7 +5938,7 @@
           <w14:ligatures w14:val="standardContextual"/>
         </w:rPr>
       </w:pPr>
-      <w:hyperlink w:anchor="_Toc228306672" w:history="1">
+      <w:hyperlink w:anchor="_Toc228308200" w:history="1">
         <w:r>
           <w:rPr>
             <w:rStyle w:val="af3"/>
@@ -5976,7 +5976,7 @@
             <w:noProof/>
             <w:webHidden/>
           </w:rPr>
-          <w:instrText xml:space="preserve"> PAGEREF _Toc228306672 \h </w:instrText>
+          <w:instrText xml:space="preserve"> PAGEREF _Toc228308200 \h </w:instrText>
         </w:r>
         <w:r>
           <w:rPr>
@@ -6019,7 +6019,7 @@
           <w14:ligatures w14:val="standardContextual"/>
         </w:rPr>
       </w:pPr>
-      <w:hyperlink w:anchor="_Toc228306673" w:history="1">
+      <w:hyperlink w:anchor="_Toc228308201" w:history="1">
         <w:r>
           <w:rPr>
             <w:rStyle w:val="af3"/>
@@ -6057,7 +6057,7 @@
             <w:noProof/>
             <w:webHidden/>
           </w:rPr>
-          <w:instrText xml:space="preserve"> PAGEREF _Toc228306673 \h </w:instrText>
+          <w:instrText xml:space="preserve"> PAGEREF _Toc228308201 \h </w:instrText>
         </w:r>
         <w:r>
           <w:rPr>
@@ -6100,7 +6100,7 @@
           <w14:ligatures w14:val="standardContextual"/>
         </w:rPr>
       </w:pPr>
-      <w:hyperlink w:anchor="_Toc228306674" w:history="1">
+      <w:hyperlink w:anchor="_Toc228308202" w:history="1">
         <w:r>
           <w:rPr>
             <w:rStyle w:val="af3"/>
@@ -6138,7 +6138,7 @@
             <w:noProof/>
             <w:webHidden/>
           </w:rPr>
-          <w:instrText xml:space="preserve"> PAGEREF _Toc228306674 \h </w:instrText>
+          <w:instrText xml:space="preserve"> PAGEREF _Toc228308202 \h </w:instrText>
         </w:r>
         <w:r>
           <w:rPr>
@@ -6181,7 +6181,7 @@
           <w14:ligatures w14:val="standardContextual"/>
         </w:rPr>
       </w:pPr>
-      <w:hyperlink w:anchor="_Toc228306675" w:history="1">
+      <w:hyperlink w:anchor="_Toc228308203" w:history="1">
         <w:r>
           <w:rPr>
             <w:rStyle w:val="af3"/>
@@ -6225,7 +6225,7 @@
             <w:noProof/>
             <w:webHidden/>
           </w:rPr>
-          <w:instrText xml:space="preserve"> PAGEREF _Toc228306675 \h </w:instrText>
+          <w:instrText xml:space="preserve"> PAGEREF _Toc228308203 \h </w:instrText>
         </w:r>
         <w:r>
           <w:rPr>
@@ -6268,7 +6268,7 @@
           <w14:ligatures w14:val="standardContextual"/>
         </w:rPr>
       </w:pPr>
-      <w:hyperlink w:anchor="_Toc228306676" w:history="1">
+      <w:hyperlink w:anchor="_Toc228308204" w:history="1">
         <w:r>
           <w:rPr>
             <w:rStyle w:val="af3"/>
@@ -6306,7 +6306,7 @@
             <w:noProof/>
             <w:webHidden/>
           </w:rPr>
-          <w:instrText xml:space="preserve"> PAGEREF _Toc228306676 \h </w:instrText>
+          <w:instrText xml:space="preserve"> PAGEREF _Toc228308204 \h </w:instrText>
         </w:r>
         <w:r>
           <w:rPr>
@@ -6349,7 +6349,7 @@
           <w14:ligatures w14:val="standardContextual"/>
         </w:rPr>
       </w:pPr>
-      <w:hyperlink w:anchor="_Toc228306677" w:history="1">
+      <w:hyperlink w:anchor="_Toc228308205" w:history="1">
         <w:r>
           <w:rPr>
             <w:rStyle w:val="af3"/>
@@ -6387,7 +6387,7 @@
             <w:noProof/>
             <w:webHidden/>
           </w:rPr>
-          <w:instrText xml:space="preserve"> PAGEREF _Toc228306677 \h </w:instrText>
+          <w:instrText xml:space="preserve"> PAGEREF _Toc228308205 \h </w:instrText>
         </w:r>
         <w:r>
           <w:rPr>
@@ -6430,7 +6430,7 @@
           <w14:ligatures w14:val="standardContextual"/>
         </w:rPr>
       </w:pPr>
-      <w:hyperlink w:anchor="_Toc228306678" w:history="1">
+      <w:hyperlink w:anchor="_Toc228308206" w:history="1">
         <w:r>
           <w:rPr>
             <w:rStyle w:val="af3"/>
@@ -6458,7 +6458,7 @@
             <w:noProof/>
             <w:webHidden/>
           </w:rPr>
-          <w:instrText xml:space="preserve"> PAGEREF _Toc228306678 \h </w:instrText>
+          <w:instrText xml:space="preserve"> PAGEREF _Toc228308206 \h </w:instrText>
         </w:r>
         <w:r>
           <w:rPr>
@@ -6501,7 +6501,7 @@
           <w14:ligatures w14:val="standardContextual"/>
         </w:rPr>
       </w:pPr>
-      <w:hyperlink w:anchor="_Toc228306679" w:history="1">
+      <w:hyperlink w:anchor="_Toc228308207" w:history="1">
         <w:r>
           <w:rPr>
             <w:rStyle w:val="af3"/>
@@ -6529,7 +6529,7 @@
             <w:noProof/>
             <w:webHidden/>
           </w:rPr>
-          <w:instrText xml:space="preserve"> PAGEREF _Toc228306679 \h </w:instrText>
+          <w:instrText xml:space="preserve"> PAGEREF _Toc228308207 \h </w:instrText>
         </w:r>
         <w:r>
           <w:rPr>
@@ -6576,7 +6576,7 @@
         </w:rPr>
         <w:fldChar w:fldCharType="end"/>
       </w:r>
-      <w:bookmarkStart w:id="0" w:name="_Toc228306621"/>
+      <w:bookmarkStart w:id="0" w:name="_Toc228308149"/>
       <w:r>
         <w:rPr>
           <w:rFonts w:cs="Times New Roman"/>
@@ -6605,7 +6605,7 @@
         <w:spacing w:before="240" w:after="120" w:line="360" w:lineRule="auto"/>
         <w:outlineLvl w:val="1"/>
       </w:pPr>
-      <w:bookmarkStart w:id="1" w:name="_Toc228306622"/>
+      <w:bookmarkStart w:id="1" w:name="_Toc228308150"/>
       <w:r>
         <w:rPr>
           <w:rFonts w:eastAsia="黑体"/>
@@ -6805,7 +6805,7 @@
         <w:spacing w:before="240" w:after="120" w:line="360" w:lineRule="auto"/>
         <w:outlineLvl w:val="1"/>
       </w:pPr>
-      <w:bookmarkStart w:id="2" w:name="_Toc228306623"/>
+      <w:bookmarkStart w:id="2" w:name="_Toc228308151"/>
       <w:r>
         <w:rPr>
           <w:rFonts w:eastAsia="黑体"/>
@@ -7015,7 +7015,7 @@
         <w:spacing w:before="240" w:after="120" w:line="360" w:lineRule="auto"/>
         <w:outlineLvl w:val="1"/>
       </w:pPr>
-      <w:bookmarkStart w:id="3" w:name="_Toc228306624"/>
+      <w:bookmarkStart w:id="3" w:name="_Toc228308152"/>
       <w:r>
         <w:rPr>
           <w:rFonts w:eastAsia="黑体"/>
@@ -7372,7 +7372,7 @@
         <w:spacing w:before="240" w:after="120" w:line="360" w:lineRule="auto"/>
         <w:outlineLvl w:val="1"/>
       </w:pPr>
-      <w:bookmarkStart w:id="4" w:name="_Toc228306625"/>
+      <w:bookmarkStart w:id="4" w:name="_Toc228308153"/>
       <w:r>
         <w:rPr>
           <w:rFonts w:eastAsia="黑体"/>
@@ -7586,7 +7586,7 @@
         <w:jc w:val="center"/>
         <w:outlineLvl w:val="0"/>
       </w:pPr>
-      <w:bookmarkStart w:id="5" w:name="_Toc228306626"/>
+      <w:bookmarkStart w:id="5" w:name="_Toc228308154"/>
       <w:r>
         <w:rPr>
           <w:rFonts w:eastAsia="黑体"/>
@@ -7622,7 +7622,7 @@
         <w:spacing w:before="240" w:after="120" w:line="360" w:lineRule="auto"/>
         <w:outlineLvl w:val="1"/>
       </w:pPr>
-      <w:bookmarkStart w:id="6" w:name="_Toc228306627"/>
+      <w:bookmarkStart w:id="6" w:name="_Toc228308155"/>
       <w:r>
         <w:rPr>
           <w:rFonts w:eastAsia="黑体"/>
@@ -7697,7 +7697,7 @@
         <w:spacing w:before="240" w:after="120" w:line="360" w:lineRule="auto"/>
         <w:outlineLvl w:val="1"/>
       </w:pPr>
-      <w:bookmarkStart w:id="7" w:name="_Toc228306628"/>
+      <w:bookmarkStart w:id="7" w:name="_Toc228308156"/>
       <w:r>
         <w:rPr>
           <w:rFonts w:eastAsia="黑体"/>
@@ -7778,7 +7778,7 @@
         <w:spacing w:before="240" w:after="120" w:line="360" w:lineRule="auto"/>
         <w:outlineLvl w:val="1"/>
       </w:pPr>
-      <w:bookmarkStart w:id="8" w:name="_Toc228306629"/>
+      <w:bookmarkStart w:id="8" w:name="_Toc228308157"/>
       <w:r>
         <w:rPr>
           <w:rFonts w:eastAsia="黑体"/>
@@ -8641,7 +8641,7 @@
         <w:spacing w:before="240" w:after="120" w:line="360" w:lineRule="auto"/>
         <w:outlineLvl w:val="1"/>
       </w:pPr>
-      <w:bookmarkStart w:id="9" w:name="_Toc228306630"/>
+      <w:bookmarkStart w:id="9" w:name="_Toc228308158"/>
       <w:r>
         <w:rPr>
           <w:rFonts w:eastAsia="黑体"/>
@@ -8861,7 +8861,7 @@
         <w:spacing w:before="240" w:after="120" w:line="360" w:lineRule="auto"/>
         <w:outlineLvl w:val="1"/>
       </w:pPr>
-      <w:bookmarkStart w:id="10" w:name="_Toc228306631"/>
+      <w:bookmarkStart w:id="10" w:name="_Toc228308159"/>
       <w:r>
         <w:rPr>
           <w:rFonts w:eastAsia="黑体"/>
@@ -9044,7 +9044,7 @@
         <w:spacing w:before="240" w:after="120" w:line="360" w:lineRule="auto"/>
         <w:outlineLvl w:val="1"/>
       </w:pPr>
-      <w:bookmarkStart w:id="11" w:name="_Toc228306632"/>
+      <w:bookmarkStart w:id="11" w:name="_Toc228308160"/>
       <w:r>
         <w:rPr>
           <w:rFonts w:eastAsia="黑体"/>
@@ -9130,7 +9130,7 @@
         <w:jc w:val="center"/>
         <w:outlineLvl w:val="0"/>
       </w:pPr>
-      <w:bookmarkStart w:id="12" w:name="_Toc228306633"/>
+      <w:bookmarkStart w:id="12" w:name="_Toc228308161"/>
       <w:r>
         <w:rPr>
           <w:rFonts w:eastAsia="黑体"/>
@@ -9322,7 +9322,7 @@
         <w:spacing w:before="240" w:after="120" w:line="360" w:lineRule="auto"/>
         <w:outlineLvl w:val="1"/>
       </w:pPr>
-      <w:bookmarkStart w:id="13" w:name="_Toc228306634"/>
+      <w:bookmarkStart w:id="13" w:name="_Toc228308162"/>
       <w:r>
         <w:rPr>
           <w:rFonts w:eastAsia="黑体"/>
@@ -9348,7 +9348,7 @@
         <w:spacing w:before="180" w:after="80" w:line="360" w:lineRule="auto"/>
         <w:outlineLvl w:val="2"/>
       </w:pPr>
-      <w:bookmarkStart w:id="14" w:name="_Toc228306635"/>
+      <w:bookmarkStart w:id="14" w:name="_Toc228308163"/>
       <w:r>
         <w:rPr>
           <w:rFonts w:eastAsia="黑体"/>
@@ -10168,7 +10168,7 @@
         <w:spacing w:before="180" w:after="80" w:line="360" w:lineRule="auto"/>
         <w:outlineLvl w:val="2"/>
       </w:pPr>
-      <w:bookmarkStart w:id="15" w:name="_Toc228306636"/>
+      <w:bookmarkStart w:id="15" w:name="_Toc228308164"/>
       <w:r>
         <w:rPr>
           <w:rFonts w:eastAsia="黑体"/>
@@ -10995,7 +10995,7 @@
         <w:spacing w:before="180" w:after="80" w:line="360" w:lineRule="auto"/>
         <w:outlineLvl w:val="2"/>
       </w:pPr>
-      <w:bookmarkStart w:id="16" w:name="_Toc228306637"/>
+      <w:bookmarkStart w:id="16" w:name="_Toc228308165"/>
       <w:r>
         <w:rPr>
           <w:rFonts w:eastAsia="黑体"/>
@@ -11236,7 +11236,7 @@
         <w:spacing w:before="240" w:after="120" w:line="360" w:lineRule="auto"/>
         <w:outlineLvl w:val="1"/>
       </w:pPr>
-      <w:bookmarkStart w:id="17" w:name="_Toc228306638"/>
+      <w:bookmarkStart w:id="17" w:name="_Toc228308166"/>
       <w:r>
         <w:rPr>
           <w:rFonts w:eastAsia="黑体"/>
@@ -11547,7 +11547,7 @@
         <w:spacing w:before="240" w:after="120" w:line="360" w:lineRule="auto"/>
         <w:outlineLvl w:val="1"/>
       </w:pPr>
-      <w:bookmarkStart w:id="18" w:name="_Toc228306639"/>
+      <w:bookmarkStart w:id="18" w:name="_Toc228308167"/>
       <w:r>
         <w:rPr>
           <w:rFonts w:eastAsia="黑体"/>
@@ -11573,7 +11573,7 @@
         <w:spacing w:before="180" w:after="80" w:line="360" w:lineRule="auto"/>
         <w:outlineLvl w:val="2"/>
       </w:pPr>
-      <w:bookmarkStart w:id="19" w:name="_Toc228306640"/>
+      <w:bookmarkStart w:id="19" w:name="_Toc228308168"/>
       <w:r>
         <w:rPr>
           <w:rFonts w:eastAsia="黑体"/>
@@ -12138,7 +12138,7 @@
         <w:spacing w:before="180" w:after="80" w:line="360" w:lineRule="auto"/>
         <w:outlineLvl w:val="2"/>
       </w:pPr>
-      <w:bookmarkStart w:id="20" w:name="_Toc228306641"/>
+      <w:bookmarkStart w:id="20" w:name="_Toc228308169"/>
       <w:r>
         <w:rPr>
           <w:rFonts w:eastAsia="黑体"/>
@@ -12320,7 +12320,7 @@
         <w:spacing w:before="240" w:after="120" w:line="360" w:lineRule="auto"/>
         <w:outlineLvl w:val="1"/>
       </w:pPr>
-      <w:bookmarkStart w:id="21" w:name="_Toc228306642"/>
+      <w:bookmarkStart w:id="21" w:name="_Toc228308170"/>
       <w:r>
         <w:rPr>
           <w:rFonts w:eastAsia="黑体"/>
@@ -12346,7 +12346,7 @@
         <w:spacing w:before="180" w:after="80" w:line="360" w:lineRule="auto"/>
         <w:outlineLvl w:val="2"/>
       </w:pPr>
-      <w:bookmarkStart w:id="22" w:name="_Toc228306643"/>
+      <w:bookmarkStart w:id="22" w:name="_Toc228308171"/>
       <w:r>
         <w:rPr>
           <w:rFonts w:eastAsia="黑体"/>
@@ -12492,7 +12492,7 @@
         <w:spacing w:before="180" w:after="80" w:line="360" w:lineRule="auto"/>
         <w:outlineLvl w:val="2"/>
       </w:pPr>
-      <w:bookmarkStart w:id="23" w:name="_Toc228306644"/>
+      <w:bookmarkStart w:id="23" w:name="_Toc228308172"/>
       <w:r>
         <w:rPr>
           <w:rFonts w:eastAsia="黑体"/>
@@ -12607,7 +12607,7 @@
         <w:spacing w:before="240" w:after="120" w:line="360" w:lineRule="auto"/>
         <w:outlineLvl w:val="1"/>
       </w:pPr>
-      <w:bookmarkStart w:id="24" w:name="_Toc228306645"/>
+      <w:bookmarkStart w:id="24" w:name="_Toc228308173"/>
       <w:r>
         <w:rPr>
           <w:rFonts w:eastAsia="黑体"/>
@@ -12651,7 +12651,7 @@
         <w:spacing w:before="180" w:after="80" w:line="360" w:lineRule="auto"/>
         <w:outlineLvl w:val="2"/>
       </w:pPr>
-      <w:bookmarkStart w:id="25" w:name="_Toc228306646"/>
+      <w:bookmarkStart w:id="25" w:name="_Toc228308174"/>
       <w:r>
         <w:rPr>
           <w:rFonts w:eastAsia="黑体"/>
@@ -12901,7 +12901,7 @@
         <w:spacing w:before="180" w:after="80" w:line="360" w:lineRule="auto"/>
         <w:outlineLvl w:val="2"/>
       </w:pPr>
-      <w:bookmarkStart w:id="26" w:name="_Toc228306647"/>
+      <w:bookmarkStart w:id="26" w:name="_Toc228308175"/>
       <w:r>
         <w:rPr>
           <w:rFonts w:eastAsia="黑体"/>
@@ -13037,7 +13037,7 @@
         <w:spacing w:before="180" w:after="80" w:line="360" w:lineRule="auto"/>
         <w:outlineLvl w:val="2"/>
       </w:pPr>
-      <w:bookmarkStart w:id="27" w:name="_Toc228306648"/>
+      <w:bookmarkStart w:id="27" w:name="_Toc228308176"/>
       <w:r>
         <w:rPr>
           <w:rFonts w:eastAsia="黑体"/>
@@ -13344,7 +13344,7 @@
         <w:spacing w:before="240" w:after="120" w:line="360" w:lineRule="auto"/>
         <w:outlineLvl w:val="1"/>
       </w:pPr>
-      <w:bookmarkStart w:id="28" w:name="_Toc228306649"/>
+      <w:bookmarkStart w:id="28" w:name="_Toc228308177"/>
       <w:r>
         <w:rPr>
           <w:rFonts w:eastAsia="黑体"/>
@@ -13388,7 +13388,7 @@
         <w:spacing w:before="180" w:after="80" w:line="360" w:lineRule="auto"/>
         <w:outlineLvl w:val="2"/>
       </w:pPr>
-      <w:bookmarkStart w:id="29" w:name="_Toc228306650"/>
+      <w:bookmarkStart w:id="29" w:name="_Toc228308178"/>
       <w:r>
         <w:rPr>
           <w:rFonts w:eastAsia="黑体"/>
@@ -13685,7 +13685,7 @@
         <w:spacing w:before="180" w:after="80" w:line="360" w:lineRule="auto"/>
         <w:outlineLvl w:val="2"/>
       </w:pPr>
-      <w:bookmarkStart w:id="30" w:name="_Toc228306651"/>
+      <w:bookmarkStart w:id="30" w:name="_Toc228308179"/>
       <w:r>
         <w:rPr>
           <w:rFonts w:eastAsia="黑体"/>
@@ -13917,7 +13917,7 @@
         <w:spacing w:before="180" w:after="80" w:line="360" w:lineRule="auto"/>
         <w:outlineLvl w:val="2"/>
       </w:pPr>
-      <w:bookmarkStart w:id="31" w:name="_Toc228306652"/>
+      <w:bookmarkStart w:id="31" w:name="_Toc228308180"/>
       <w:r>
         <w:rPr>
           <w:rFonts w:eastAsia="黑体"/>
@@ -14044,7 +14044,7 @@
         <w:spacing w:before="240" w:after="120" w:line="360" w:lineRule="auto"/>
         <w:outlineLvl w:val="1"/>
       </w:pPr>
-      <w:bookmarkStart w:id="32" w:name="_Toc228306653"/>
+      <w:bookmarkStart w:id="32" w:name="_Toc228308181"/>
       <w:r>
         <w:rPr>
           <w:rFonts w:eastAsia="黑体"/>
@@ -14208,7 +14208,7 @@
         <w:jc w:val="center"/>
         <w:outlineLvl w:val="0"/>
       </w:pPr>
-      <w:bookmarkStart w:id="33" w:name="_Toc228306654"/>
+      <w:bookmarkStart w:id="33" w:name="_Toc228308182"/>
       <w:r>
         <w:rPr>
           <w:rFonts w:eastAsia="黑体"/>
@@ -14364,7 +14364,7 @@
         <w:spacing w:before="240" w:after="120" w:line="360" w:lineRule="auto"/>
         <w:outlineLvl w:val="1"/>
       </w:pPr>
-      <w:bookmarkStart w:id="34" w:name="_Toc228306655"/>
+      <w:bookmarkStart w:id="34" w:name="_Toc228308183"/>
       <w:r>
         <w:rPr>
           <w:rFonts w:eastAsia="黑体"/>
@@ -15657,7 +15657,7 @@
         <w:spacing w:before="240" w:after="120" w:line="360" w:lineRule="auto"/>
         <w:outlineLvl w:val="1"/>
       </w:pPr>
-      <w:bookmarkStart w:id="35" w:name="_Toc228306656"/>
+      <w:bookmarkStart w:id="35" w:name="_Toc228308184"/>
       <w:r>
         <w:rPr>
           <w:rFonts w:eastAsia="黑体"/>
@@ -16574,7 +16574,7 @@
         <w:spacing w:before="240" w:after="120" w:line="360" w:lineRule="auto"/>
         <w:outlineLvl w:val="1"/>
       </w:pPr>
-      <w:bookmarkStart w:id="36" w:name="_Toc228306657"/>
+      <w:bookmarkStart w:id="36" w:name="_Toc228308185"/>
       <w:r>
         <w:rPr>
           <w:rFonts w:eastAsia="黑体"/>
@@ -17882,7 +17882,7 @@
         <w:spacing w:before="240" w:after="120" w:line="360" w:lineRule="auto"/>
         <w:outlineLvl w:val="1"/>
       </w:pPr>
-      <w:bookmarkStart w:id="37" w:name="_Toc228306658"/>
+      <w:bookmarkStart w:id="37" w:name="_Toc228308186"/>
       <w:r>
         <w:rPr>
           <w:rFonts w:eastAsia="黑体"/>
@@ -18376,7 +18376,7 @@
         <w:spacing w:before="240" w:after="120" w:line="360" w:lineRule="auto"/>
         <w:outlineLvl w:val="1"/>
       </w:pPr>
-      <w:bookmarkStart w:id="38" w:name="_Toc228306659"/>
+      <w:bookmarkStart w:id="38" w:name="_Toc228308187"/>
       <w:r>
         <w:rPr>
           <w:rFonts w:eastAsia="黑体"/>
@@ -19184,7 +19184,7 @@
         <w:spacing w:before="240" w:after="120" w:line="360" w:lineRule="auto"/>
         <w:outlineLvl w:val="1"/>
       </w:pPr>
-      <w:bookmarkStart w:id="39" w:name="_Toc228306660"/>
+      <w:bookmarkStart w:id="39" w:name="_Toc228308188"/>
       <w:r>
         <w:rPr>
           <w:rFonts w:eastAsia="黑体"/>
@@ -20632,7 +20632,7 @@
         <w:spacing w:before="240" w:after="120" w:line="360" w:lineRule="auto"/>
         <w:outlineLvl w:val="1"/>
       </w:pPr>
-      <w:bookmarkStart w:id="40" w:name="_Toc228306661"/>
+      <w:bookmarkStart w:id="40" w:name="_Toc228308189"/>
       <w:r>
         <w:rPr>
           <w:rFonts w:eastAsia="黑体"/>
@@ -21770,7 +21770,7 @@
         <w:spacing w:before="240" w:after="120" w:line="360" w:lineRule="auto"/>
         <w:outlineLvl w:val="1"/>
       </w:pPr>
-      <w:bookmarkStart w:id="41" w:name="_Toc228306662"/>
+      <w:bookmarkStart w:id="41" w:name="_Toc228308190"/>
       <w:r>
         <w:rPr>
           <w:rFonts w:eastAsia="黑体"/>
@@ -22242,7 +22242,7 @@
         <w:spacing w:before="240" w:after="120" w:line="360" w:lineRule="auto"/>
         <w:outlineLvl w:val="1"/>
       </w:pPr>
-      <w:bookmarkStart w:id="42" w:name="_Toc228306663"/>
+      <w:bookmarkStart w:id="42" w:name="_Toc228308191"/>
       <w:r>
         <w:rPr>
           <w:rFonts w:eastAsia="黑体"/>
@@ -22563,7 +22563,7 @@
         <w:jc w:val="center"/>
         <w:outlineLvl w:val="0"/>
       </w:pPr>
-      <w:bookmarkStart w:id="43" w:name="_Toc228306664"/>
+      <w:bookmarkStart w:id="43" w:name="_Toc228308192"/>
       <w:r>
         <w:rPr>
           <w:rFonts w:eastAsia="黑体"/>
@@ -22719,7 +22719,7 @@
         <w:spacing w:before="240" w:after="120" w:line="360" w:lineRule="auto"/>
         <w:outlineLvl w:val="1"/>
       </w:pPr>
-      <w:bookmarkStart w:id="44" w:name="_Toc228306665"/>
+      <w:bookmarkStart w:id="44" w:name="_Toc228308193"/>
       <w:r>
         <w:rPr>
           <w:rFonts w:eastAsia="黑体"/>
@@ -24930,7 +24930,7 @@
         <w:spacing w:before="240" w:after="120" w:line="360" w:lineRule="auto"/>
         <w:outlineLvl w:val="1"/>
       </w:pPr>
-      <w:bookmarkStart w:id="45" w:name="_Toc228306666"/>
+      <w:bookmarkStart w:id="45" w:name="_Toc228308194"/>
       <w:r>
         <w:rPr>
           <w:rFonts w:eastAsia="黑体"/>
@@ -25797,7 +25797,7 @@
         <w:spacing w:before="240" w:after="120" w:line="360" w:lineRule="auto"/>
         <w:outlineLvl w:val="1"/>
       </w:pPr>
-      <w:bookmarkStart w:id="46" w:name="_Toc228306667"/>
+      <w:bookmarkStart w:id="46" w:name="_Toc228308195"/>
       <w:r>
         <w:rPr>
           <w:rFonts w:eastAsia="黑体"/>
@@ -26700,7 +26700,7 @@
         <w:spacing w:before="240" w:after="120" w:line="360" w:lineRule="auto"/>
         <w:outlineLvl w:val="1"/>
       </w:pPr>
-      <w:bookmarkStart w:id="47" w:name="_Toc228306668"/>
+      <w:bookmarkStart w:id="47" w:name="_Toc228308196"/>
       <w:r>
         <w:rPr>
           <w:rFonts w:eastAsia="黑体"/>
@@ -27908,7 +27908,7 @@
         <w:spacing w:before="240" w:after="120" w:line="360" w:lineRule="auto"/>
         <w:outlineLvl w:val="1"/>
       </w:pPr>
-      <w:bookmarkStart w:id="48" w:name="_Toc228306669"/>
+      <w:bookmarkStart w:id="48" w:name="_Toc228308197"/>
       <w:r>
         <w:rPr>
           <w:rFonts w:eastAsia="黑体"/>
@@ -30159,7 +30159,7 @@
         <w:spacing w:before="240" w:after="120" w:line="360" w:lineRule="auto"/>
         <w:outlineLvl w:val="1"/>
       </w:pPr>
-      <w:bookmarkStart w:id="49" w:name="_Toc228306670"/>
+      <w:bookmarkStart w:id="49" w:name="_Toc228308198"/>
       <w:r>
         <w:rPr>
           <w:rFonts w:eastAsia="黑体"/>
@@ -32149,7 +32149,7 @@
         <w:spacing w:before="240" w:after="120" w:line="360" w:lineRule="auto"/>
         <w:outlineLvl w:val="1"/>
       </w:pPr>
-      <w:bookmarkStart w:id="50" w:name="_Toc228306671"/>
+      <w:bookmarkStart w:id="50" w:name="_Toc228308199"/>
       <w:r>
         <w:rPr>
           <w:rFonts w:eastAsia="黑体"/>
@@ -33474,66 +33474,77 @@
       </w:pPr>
       <w:r>
         <w:rPr>
+          <w:rFonts w:hint="eastAsia"/>
           <w:szCs w:val="24"/>
         </w:rPr>
         <w:t>更重要的是，</w:t>
       </w:r>
       <w:r>
         <w:rPr>
+          <w:rFonts w:hint="eastAsia"/>
           <w:szCs w:val="24"/>
         </w:rPr>
         <w:t>rknn_inputs_set</w:t>
       </w:r>
       <w:r>
         <w:rPr>
+          <w:rFonts w:hint="eastAsia"/>
           <w:szCs w:val="24"/>
         </w:rPr>
         <w:t>的耗时约为</w:t>
       </w:r>
       <w:r>
         <w:rPr>
+          <w:rFonts w:hint="eastAsia"/>
           <w:szCs w:val="24"/>
         </w:rPr>
         <w:t>62</w:t>
       </w:r>
       <w:r>
         <w:rPr>
+          <w:rFonts w:hint="eastAsia"/>
           <w:szCs w:val="24"/>
         </w:rPr>
         <w:t>至</w:t>
       </w:r>
       <w:r>
         <w:rPr>
+          <w:rFonts w:hint="eastAsia"/>
           <w:szCs w:val="24"/>
         </w:rPr>
         <w:t>64 ms</w:t>
       </w:r>
       <w:r>
         <w:rPr>
+          <w:rFonts w:hint="eastAsia"/>
           <w:szCs w:val="24"/>
         </w:rPr>
         <w:t>，甚至高于</w:t>
       </w:r>
       <w:r>
         <w:rPr>
+          <w:rFonts w:hint="eastAsia"/>
           <w:szCs w:val="24"/>
         </w:rPr>
         <w:t>rknn_run</w:t>
       </w:r>
       <w:r>
         <w:rPr>
+          <w:rFonts w:hint="eastAsia"/>
           <w:szCs w:val="24"/>
         </w:rPr>
         <w:t>的约</w:t>
       </w:r>
       <w:r>
         <w:rPr>
+          <w:rFonts w:hint="eastAsia"/>
           <w:szCs w:val="24"/>
         </w:rPr>
         <w:t xml:space="preserve">46 </w:t>
       </w:r>
       <w:r>
         <w:rPr>
+          <w:rFonts w:hint="eastAsia"/>
           <w:szCs w:val="24"/>
         </w:rPr>
         <w:lastRenderedPageBreak/>
@@ -33541,69 +33552,178 @@
       </w:r>
       <w:r>
         <w:rPr>
+          <w:rFonts w:hint="eastAsia"/>
           <w:szCs w:val="24"/>
         </w:rPr>
         <w:t>。这表明当前瓶颈并不在后处理或绘制阶段。</w:t>
       </w:r>
       <w:r>
         <w:rPr>
+          <w:rFonts w:hint="eastAsia"/>
           <w:szCs w:val="24"/>
         </w:rPr>
         <w:t>Decode + NMS</w:t>
       </w:r>
       <w:r>
         <w:rPr>
+          <w:rFonts w:hint="eastAsia"/>
           <w:szCs w:val="24"/>
         </w:rPr>
         <w:t>仅约</w:t>
       </w:r>
       <w:r>
         <w:rPr>
+          <w:rFonts w:hint="eastAsia"/>
           <w:szCs w:val="24"/>
         </w:rPr>
         <w:t>2.4 ms</w:t>
       </w:r>
       <w:r>
         <w:rPr>
+          <w:rFonts w:hint="eastAsia"/>
           <w:szCs w:val="24"/>
         </w:rPr>
         <w:t>，</w:t>
       </w:r>
       <w:r>
         <w:rPr>
+          <w:rFonts w:hint="eastAsia"/>
           <w:szCs w:val="24"/>
         </w:rPr>
         <w:t>Render</w:t>
       </w:r>
       <w:r>
         <w:rPr>
+          <w:rFonts w:hint="eastAsia"/>
           <w:szCs w:val="24"/>
         </w:rPr>
         <w:t>仅约</w:t>
       </w:r>
       <w:r>
         <w:rPr>
+          <w:rFonts w:hint="eastAsia"/>
           <w:szCs w:val="24"/>
         </w:rPr>
         <w:t>0.1</w:t>
       </w:r>
       <w:r>
         <w:rPr>
+          <w:rFonts w:hint="eastAsia"/>
           <w:szCs w:val="24"/>
         </w:rPr>
         <w:t>至</w:t>
       </w:r>
       <w:r>
         <w:rPr>
+          <w:rFonts w:hint="eastAsia"/>
           <w:szCs w:val="24"/>
         </w:rPr>
         <w:t>0.2 ms</w:t>
       </w:r>
       <w:r>
         <w:rPr>
-          <w:szCs w:val="24"/>
-        </w:rPr>
-        <w:t>，继续优化画框或标签绘制对整体吞吐帮助有限。后续若要进一步提升性能，应优先考虑输入数据传输、预处理和内存布局优化。</w:t>
+          <w:rFonts w:hint="eastAsia"/>
+          <w:szCs w:val="24"/>
+        </w:rPr>
+        <w:t>，继续优化画框或标签绘制对整体吞吐帮助有限。造成输入设置耗时较高的可能原因包括：应用侧输入图像的数据排布、颜色通道顺序或数据类型与</w:t>
+      </w:r>
+      <w:r>
+        <w:rPr>
+          <w:rFonts w:hint="eastAsia"/>
+          <w:szCs w:val="24"/>
+        </w:rPr>
+        <w:t>RKNN</w:t>
+      </w:r>
+      <w:r>
+        <w:rPr>
+          <w:rFonts w:hint="eastAsia"/>
+          <w:szCs w:val="24"/>
+        </w:rPr>
+        <w:t>模型期望输入格式不完全一致，</w:t>
+      </w:r>
+      <w:r>
+        <w:rPr>
+          <w:rFonts w:hint="eastAsia"/>
+          <w:szCs w:val="24"/>
+        </w:rPr>
+        <w:t>Runtime</w:t>
+      </w:r>
+      <w:r>
+        <w:rPr>
+          <w:rFonts w:hint="eastAsia"/>
+          <w:szCs w:val="24"/>
+        </w:rPr>
+        <w:t>在设置输入时需要执行隐式格式转换或缓存同步；同时，视频帧从</w:t>
+      </w:r>
+      <w:r>
+        <w:rPr>
+          <w:rFonts w:hint="eastAsia"/>
+          <w:szCs w:val="24"/>
+        </w:rPr>
+        <w:t>CPU</w:t>
+      </w:r>
+      <w:r>
+        <w:rPr>
+          <w:rFonts w:hint="eastAsia"/>
+          <w:szCs w:val="24"/>
+        </w:rPr>
+        <w:t>侧内存写入</w:t>
+      </w:r>
+      <w:r>
+        <w:rPr>
+          <w:rFonts w:hint="eastAsia"/>
+          <w:szCs w:val="24"/>
+        </w:rPr>
+        <w:t>NPU</w:t>
+      </w:r>
+      <w:r>
+        <w:rPr>
+          <w:rFonts w:hint="eastAsia"/>
+          <w:szCs w:val="24"/>
+        </w:rPr>
+        <w:t>可访问输入缓冲区也会带来额外传输开销。因此，后续若要进一步提升性能，应优先考虑输入数据传输、预处理和内存布局优化，例如结合</w:t>
+      </w:r>
+      <w:r>
+        <w:rPr>
+          <w:rFonts w:hint="eastAsia"/>
+          <w:szCs w:val="24"/>
+        </w:rPr>
+        <w:t>INT8</w:t>
+      </w:r>
+      <w:r>
+        <w:rPr>
+          <w:rFonts w:hint="eastAsia"/>
+          <w:szCs w:val="24"/>
+        </w:rPr>
+        <w:t>输入匹配、</w:t>
+      </w:r>
+      <w:r>
+        <w:rPr>
+          <w:rFonts w:hint="eastAsia"/>
+          <w:szCs w:val="24"/>
+        </w:rPr>
+        <w:t>RGA</w:t>
+      </w:r>
+      <w:r>
+        <w:rPr>
+          <w:rFonts w:hint="eastAsia"/>
+          <w:szCs w:val="24"/>
+        </w:rPr>
+        <w:t>硬件预处理、</w:t>
+      </w:r>
+      <w:r>
+        <w:rPr>
+          <w:rFonts w:hint="eastAsia"/>
+          <w:szCs w:val="24"/>
+        </w:rPr>
+        <w:t>MPP</w:t>
+      </w:r>
+      <w:r>
+        <w:rPr>
+          <w:rFonts w:hint="eastAsia"/>
+          <w:szCs w:val="24"/>
+        </w:rPr>
+        <w:t>解码输出缓冲区复用以及更完整的零拷贝输入链路。</w:t>
       </w:r>
     </w:p>
     <w:p>
@@ -33611,7 +33731,7 @@
         <w:spacing w:before="240" w:after="120" w:line="360" w:lineRule="auto"/>
         <w:outlineLvl w:val="1"/>
       </w:pPr>
-      <w:bookmarkStart w:id="51" w:name="_Toc228306672"/>
+      <w:bookmarkStart w:id="51" w:name="_Toc228308200"/>
       <w:r>
         <w:rPr>
           <w:rFonts w:eastAsia="黑体"/>
@@ -34672,7 +34792,7 @@
         <w:spacing w:before="240" w:after="120" w:line="360" w:lineRule="auto"/>
         <w:outlineLvl w:val="1"/>
       </w:pPr>
-      <w:bookmarkStart w:id="52" w:name="_Toc228306673"/>
+      <w:bookmarkStart w:id="52" w:name="_Toc228308201"/>
       <w:r>
         <w:rPr>
           <w:rFonts w:eastAsia="黑体"/>
@@ -36135,7 +36255,7 @@
         <w:spacing w:before="240" w:after="120" w:line="360" w:lineRule="auto"/>
         <w:outlineLvl w:val="1"/>
       </w:pPr>
-      <w:bookmarkStart w:id="53" w:name="_Toc228306674"/>
+      <w:bookmarkStart w:id="53" w:name="_Toc228308202"/>
       <w:r>
         <w:rPr>
           <w:rFonts w:eastAsia="黑体"/>
@@ -36407,7 +36527,7 @@
         <w:jc w:val="center"/>
         <w:outlineLvl w:val="0"/>
       </w:pPr>
-      <w:bookmarkStart w:id="54" w:name="_Toc228306675"/>
+      <w:bookmarkStart w:id="54" w:name="_Toc228308203"/>
       <w:r>
         <w:rPr>
           <w:rFonts w:eastAsia="黑体" w:hint="eastAsia"/>
@@ -36449,7 +36569,7 @@
           <w:szCs w:val="24"/>
         </w:rPr>
       </w:pPr>
-      <w:bookmarkStart w:id="55" w:name="_Toc228306676"/>
+      <w:bookmarkStart w:id="55" w:name="_Toc228308204"/>
       <w:r>
         <w:rPr>
           <w:rFonts w:eastAsia="黑体" w:hint="eastAsia"/>
@@ -36643,7 +36763,7 @@
           <w:szCs w:val="24"/>
         </w:rPr>
       </w:pPr>
-      <w:bookmarkStart w:id="56" w:name="_Toc228306677"/>
+      <w:bookmarkStart w:id="56" w:name="_Toc228308205"/>
       <w:r>
         <w:rPr>
           <w:rFonts w:eastAsia="黑体" w:hint="eastAsia"/>
@@ -36945,7 +37065,7 @@
         <w:jc w:val="center"/>
         <w:outlineLvl w:val="0"/>
       </w:pPr>
-      <w:bookmarkStart w:id="57" w:name="_Toc228306678"/>
+      <w:bookmarkStart w:id="57" w:name="_Toc228308206"/>
       <w:r>
         <w:rPr>
           <w:rFonts w:eastAsia="黑体"/>
@@ -37222,7 +37342,7 @@
         <w:jc w:val="center"/>
         <w:outlineLvl w:val="0"/>
       </w:pPr>
-      <w:bookmarkStart w:id="58" w:name="_Toc228306679"/>
+      <w:bookmarkStart w:id="58" w:name="_Toc228308207"/>
       <w:r>
         <w:rPr>
           <w:rFonts w:eastAsia="黑体"/>

</xml_diff>

<commit_message>
Sync thesis hardware optimization summary
</commit_message>
<xml_diff>
--- a/Thesis Project/paper/full_thesis_latest_merged.docx
+++ b/Thesis Project/paper/full_thesis_latest_merged.docx
@@ -1595,7 +1595,7 @@
         </w:rPr>
         <w:fldChar w:fldCharType="separate"/>
       </w:r>
-      <w:hyperlink w:anchor="_Toc228308149" w:history="1">
+      <w:hyperlink w:anchor="_Toc228348232" w:history="1">
         <w:r>
           <w:rPr>
             <w:rStyle w:val="af3"/>
@@ -1636,7 +1636,7 @@
             <w:noProof/>
             <w:webHidden/>
           </w:rPr>
-          <w:instrText xml:space="preserve"> PAGEREF _Toc228308149 \h </w:instrText>
+          <w:instrText xml:space="preserve"> PAGEREF _Toc228348232 \h </w:instrText>
         </w:r>
         <w:r>
           <w:rPr>
@@ -1679,7 +1679,7 @@
           <w14:ligatures w14:val="standardContextual"/>
         </w:rPr>
       </w:pPr>
-      <w:hyperlink w:anchor="_Toc228308150" w:history="1">
+      <w:hyperlink w:anchor="_Toc228348233" w:history="1">
         <w:r>
           <w:rPr>
             <w:rStyle w:val="af3"/>
@@ -1717,7 +1717,7 @@
             <w:noProof/>
             <w:webHidden/>
           </w:rPr>
-          <w:instrText xml:space="preserve"> PAGEREF _Toc228308150 \h </w:instrText>
+          <w:instrText xml:space="preserve"> PAGEREF _Toc228348233 \h </w:instrText>
         </w:r>
         <w:r>
           <w:rPr>
@@ -1760,7 +1760,7 @@
           <w14:ligatures w14:val="standardContextual"/>
         </w:rPr>
       </w:pPr>
-      <w:hyperlink w:anchor="_Toc228308151" w:history="1">
+      <w:hyperlink w:anchor="_Toc228348234" w:history="1">
         <w:r>
           <w:rPr>
             <w:rStyle w:val="af3"/>
@@ -1798,7 +1798,7 @@
             <w:noProof/>
             <w:webHidden/>
           </w:rPr>
-          <w:instrText xml:space="preserve"> PAGEREF _Toc228308151 \h </w:instrText>
+          <w:instrText xml:space="preserve"> PAGEREF _Toc228348234 \h </w:instrText>
         </w:r>
         <w:r>
           <w:rPr>
@@ -1841,7 +1841,7 @@
           <w14:ligatures w14:val="standardContextual"/>
         </w:rPr>
       </w:pPr>
-      <w:hyperlink w:anchor="_Toc228308152" w:history="1">
+      <w:hyperlink w:anchor="_Toc228348235" w:history="1">
         <w:r>
           <w:rPr>
             <w:rStyle w:val="af3"/>
@@ -1879,7 +1879,7 @@
             <w:noProof/>
             <w:webHidden/>
           </w:rPr>
-          <w:instrText xml:space="preserve"> PAGEREF _Toc228308152 \h </w:instrText>
+          <w:instrText xml:space="preserve"> PAGEREF _Toc228348235 \h </w:instrText>
         </w:r>
         <w:r>
           <w:rPr>
@@ -1922,7 +1922,7 @@
           <w14:ligatures w14:val="standardContextual"/>
         </w:rPr>
       </w:pPr>
-      <w:hyperlink w:anchor="_Toc228308153" w:history="1">
+      <w:hyperlink w:anchor="_Toc228348236" w:history="1">
         <w:r>
           <w:rPr>
             <w:rStyle w:val="af3"/>
@@ -1960,7 +1960,7 @@
             <w:noProof/>
             <w:webHidden/>
           </w:rPr>
-          <w:instrText xml:space="preserve"> PAGEREF _Toc228308153 \h </w:instrText>
+          <w:instrText xml:space="preserve"> PAGEREF _Toc228348236 \h </w:instrText>
         </w:r>
         <w:r>
           <w:rPr>
@@ -2003,7 +2003,7 @@
           <w14:ligatures w14:val="standardContextual"/>
         </w:rPr>
       </w:pPr>
-      <w:hyperlink w:anchor="_Toc228308154" w:history="1">
+      <w:hyperlink w:anchor="_Toc228348237" w:history="1">
         <w:r>
           <w:rPr>
             <w:rStyle w:val="af3"/>
@@ -2047,7 +2047,7 @@
             <w:noProof/>
             <w:webHidden/>
           </w:rPr>
-          <w:instrText xml:space="preserve"> PAGEREF _Toc228308154 \h </w:instrText>
+          <w:instrText xml:space="preserve"> PAGEREF _Toc228348237 \h </w:instrText>
         </w:r>
         <w:r>
           <w:rPr>
@@ -2090,7 +2090,7 @@
           <w14:ligatures w14:val="standardContextual"/>
         </w:rPr>
       </w:pPr>
-      <w:hyperlink w:anchor="_Toc228308155" w:history="1">
+      <w:hyperlink w:anchor="_Toc228348238" w:history="1">
         <w:r>
           <w:rPr>
             <w:rStyle w:val="af3"/>
@@ -2128,7 +2128,7 @@
             <w:noProof/>
             <w:webHidden/>
           </w:rPr>
-          <w:instrText xml:space="preserve"> PAGEREF _Toc228308155 \h </w:instrText>
+          <w:instrText xml:space="preserve"> PAGEREF _Toc228348238 \h </w:instrText>
         </w:r>
         <w:r>
           <w:rPr>
@@ -2171,7 +2171,7 @@
           <w14:ligatures w14:val="standardContextual"/>
         </w:rPr>
       </w:pPr>
-      <w:hyperlink w:anchor="_Toc228308156" w:history="1">
+      <w:hyperlink w:anchor="_Toc228348239" w:history="1">
         <w:r>
           <w:rPr>
             <w:rStyle w:val="af3"/>
@@ -2209,7 +2209,7 @@
             <w:noProof/>
             <w:webHidden/>
           </w:rPr>
-          <w:instrText xml:space="preserve"> PAGEREF _Toc228308156 \h </w:instrText>
+          <w:instrText xml:space="preserve"> PAGEREF _Toc228348239 \h </w:instrText>
         </w:r>
         <w:r>
           <w:rPr>
@@ -2252,7 +2252,7 @@
           <w14:ligatures w14:val="standardContextual"/>
         </w:rPr>
       </w:pPr>
-      <w:hyperlink w:anchor="_Toc228308157" w:history="1">
+      <w:hyperlink w:anchor="_Toc228348240" w:history="1">
         <w:r>
           <w:rPr>
             <w:rStyle w:val="af3"/>
@@ -2290,7 +2290,7 @@
             <w:noProof/>
             <w:webHidden/>
           </w:rPr>
-          <w:instrText xml:space="preserve"> PAGEREF _Toc228308157 \h </w:instrText>
+          <w:instrText xml:space="preserve"> PAGEREF _Toc228348240 \h </w:instrText>
         </w:r>
         <w:r>
           <w:rPr>
@@ -2333,7 +2333,7 @@
           <w14:ligatures w14:val="standardContextual"/>
         </w:rPr>
       </w:pPr>
-      <w:hyperlink w:anchor="_Toc228308158" w:history="1">
+      <w:hyperlink w:anchor="_Toc228348241" w:history="1">
         <w:r>
           <w:rPr>
             <w:rStyle w:val="af3"/>
@@ -2371,7 +2371,7 @@
             <w:noProof/>
             <w:webHidden/>
           </w:rPr>
-          <w:instrText xml:space="preserve"> PAGEREF _Toc228308158 \h </w:instrText>
+          <w:instrText xml:space="preserve"> PAGEREF _Toc228348241 \h </w:instrText>
         </w:r>
         <w:r>
           <w:rPr>
@@ -2414,7 +2414,7 @@
           <w14:ligatures w14:val="standardContextual"/>
         </w:rPr>
       </w:pPr>
-      <w:hyperlink w:anchor="_Toc228308159" w:history="1">
+      <w:hyperlink w:anchor="_Toc228348242" w:history="1">
         <w:r>
           <w:rPr>
             <w:rStyle w:val="af3"/>
@@ -2452,7 +2452,7 @@
             <w:noProof/>
             <w:webHidden/>
           </w:rPr>
-          <w:instrText xml:space="preserve"> PAGEREF _Toc228308159 \h </w:instrText>
+          <w:instrText xml:space="preserve"> PAGEREF _Toc228348242 \h </w:instrText>
         </w:r>
         <w:r>
           <w:rPr>
@@ -2495,7 +2495,7 @@
           <w14:ligatures w14:val="standardContextual"/>
         </w:rPr>
       </w:pPr>
-      <w:hyperlink w:anchor="_Toc228308160" w:history="1">
+      <w:hyperlink w:anchor="_Toc228348243" w:history="1">
         <w:r>
           <w:rPr>
             <w:rStyle w:val="af3"/>
@@ -2533,7 +2533,7 @@
             <w:noProof/>
             <w:webHidden/>
           </w:rPr>
-          <w:instrText xml:space="preserve"> PAGEREF _Toc228308160 \h </w:instrText>
+          <w:instrText xml:space="preserve"> PAGEREF _Toc228348243 \h </w:instrText>
         </w:r>
         <w:r>
           <w:rPr>
@@ -2576,7 +2576,7 @@
           <w14:ligatures w14:val="standardContextual"/>
         </w:rPr>
       </w:pPr>
-      <w:hyperlink w:anchor="_Toc228308161" w:history="1">
+      <w:hyperlink w:anchor="_Toc228348244" w:history="1">
         <w:r>
           <w:rPr>
             <w:rStyle w:val="af3"/>
@@ -2620,7 +2620,7 @@
             <w:noProof/>
             <w:webHidden/>
           </w:rPr>
-          <w:instrText xml:space="preserve"> PAGEREF _Toc228308161 \h </w:instrText>
+          <w:instrText xml:space="preserve"> PAGEREF _Toc228348244 \h </w:instrText>
         </w:r>
         <w:r>
           <w:rPr>
@@ -2663,7 +2663,7 @@
           <w14:ligatures w14:val="standardContextual"/>
         </w:rPr>
       </w:pPr>
-      <w:hyperlink w:anchor="_Toc228308162" w:history="1">
+      <w:hyperlink w:anchor="_Toc228348245" w:history="1">
         <w:r>
           <w:rPr>
             <w:rStyle w:val="af3"/>
@@ -2701,7 +2701,7 @@
             <w:noProof/>
             <w:webHidden/>
           </w:rPr>
-          <w:instrText xml:space="preserve"> PAGEREF _Toc228308162 \h </w:instrText>
+          <w:instrText xml:space="preserve"> PAGEREF _Toc228348245 \h </w:instrText>
         </w:r>
         <w:r>
           <w:rPr>
@@ -2743,7 +2743,7 @@
           <w14:ligatures w14:val="standardContextual"/>
         </w:rPr>
       </w:pPr>
-      <w:hyperlink w:anchor="_Toc228308163" w:history="1">
+      <w:hyperlink w:anchor="_Toc228348246" w:history="1">
         <w:r>
           <w:rPr>
             <w:rStyle w:val="af3"/>
@@ -2781,7 +2781,7 @@
             <w:noProof/>
             <w:webHidden/>
           </w:rPr>
-          <w:instrText xml:space="preserve"> PAGEREF _Toc228308163 \h </w:instrText>
+          <w:instrText xml:space="preserve"> PAGEREF _Toc228348246 \h </w:instrText>
         </w:r>
         <w:r>
           <w:rPr>
@@ -2823,7 +2823,7 @@
           <w14:ligatures w14:val="standardContextual"/>
         </w:rPr>
       </w:pPr>
-      <w:hyperlink w:anchor="_Toc228308164" w:history="1">
+      <w:hyperlink w:anchor="_Toc228348247" w:history="1">
         <w:r>
           <w:rPr>
             <w:rStyle w:val="af3"/>
@@ -2861,7 +2861,7 @@
             <w:noProof/>
             <w:webHidden/>
           </w:rPr>
-          <w:instrText xml:space="preserve"> PAGEREF _Toc228308164 \h </w:instrText>
+          <w:instrText xml:space="preserve"> PAGEREF _Toc228348247 \h </w:instrText>
         </w:r>
         <w:r>
           <w:rPr>
@@ -2903,7 +2903,7 @@
           <w14:ligatures w14:val="standardContextual"/>
         </w:rPr>
       </w:pPr>
-      <w:hyperlink w:anchor="_Toc228308165" w:history="1">
+      <w:hyperlink w:anchor="_Toc228348248" w:history="1">
         <w:r>
           <w:rPr>
             <w:rStyle w:val="af3"/>
@@ -2941,7 +2941,7 @@
             <w:noProof/>
             <w:webHidden/>
           </w:rPr>
-          <w:instrText xml:space="preserve"> PAGEREF _Toc228308165 \h </w:instrText>
+          <w:instrText xml:space="preserve"> PAGEREF _Toc228348248 \h </w:instrText>
         </w:r>
         <w:r>
           <w:rPr>
@@ -2984,7 +2984,7 @@
           <w14:ligatures w14:val="standardContextual"/>
         </w:rPr>
       </w:pPr>
-      <w:hyperlink w:anchor="_Toc228308166" w:history="1">
+      <w:hyperlink w:anchor="_Toc228348249" w:history="1">
         <w:r>
           <w:rPr>
             <w:rStyle w:val="af3"/>
@@ -3022,7 +3022,7 @@
             <w:noProof/>
             <w:webHidden/>
           </w:rPr>
-          <w:instrText xml:space="preserve"> PAGEREF _Toc228308166 \h </w:instrText>
+          <w:instrText xml:space="preserve"> PAGEREF _Toc228348249 \h </w:instrText>
         </w:r>
         <w:r>
           <w:rPr>
@@ -3065,7 +3065,7 @@
           <w14:ligatures w14:val="standardContextual"/>
         </w:rPr>
       </w:pPr>
-      <w:hyperlink w:anchor="_Toc228308167" w:history="1">
+      <w:hyperlink w:anchor="_Toc228348250" w:history="1">
         <w:r>
           <w:rPr>
             <w:rStyle w:val="af3"/>
@@ -3103,7 +3103,7 @@
             <w:noProof/>
             <w:webHidden/>
           </w:rPr>
-          <w:instrText xml:space="preserve"> PAGEREF _Toc228308167 \h </w:instrText>
+          <w:instrText xml:space="preserve"> PAGEREF _Toc228348250 \h </w:instrText>
         </w:r>
         <w:r>
           <w:rPr>
@@ -3145,7 +3145,7 @@
           <w14:ligatures w14:val="standardContextual"/>
         </w:rPr>
       </w:pPr>
-      <w:hyperlink w:anchor="_Toc228308168" w:history="1">
+      <w:hyperlink w:anchor="_Toc228348251" w:history="1">
         <w:r>
           <w:rPr>
             <w:rStyle w:val="af3"/>
@@ -3183,7 +3183,7 @@
             <w:noProof/>
             <w:webHidden/>
           </w:rPr>
-          <w:instrText xml:space="preserve"> PAGEREF _Toc228308168 \h </w:instrText>
+          <w:instrText xml:space="preserve"> PAGEREF _Toc228348251 \h </w:instrText>
         </w:r>
         <w:r>
           <w:rPr>
@@ -3225,7 +3225,7 @@
           <w14:ligatures w14:val="standardContextual"/>
         </w:rPr>
       </w:pPr>
-      <w:hyperlink w:anchor="_Toc228308169" w:history="1">
+      <w:hyperlink w:anchor="_Toc228348252" w:history="1">
         <w:r>
           <w:rPr>
             <w:rStyle w:val="af3"/>
@@ -3263,7 +3263,7 @@
             <w:noProof/>
             <w:webHidden/>
           </w:rPr>
-          <w:instrText xml:space="preserve"> PAGEREF _Toc228308169 \h </w:instrText>
+          <w:instrText xml:space="preserve"> PAGEREF _Toc228348252 \h </w:instrText>
         </w:r>
         <w:r>
           <w:rPr>
@@ -3306,7 +3306,7 @@
           <w14:ligatures w14:val="standardContextual"/>
         </w:rPr>
       </w:pPr>
-      <w:hyperlink w:anchor="_Toc228308170" w:history="1">
+      <w:hyperlink w:anchor="_Toc228348253" w:history="1">
         <w:r>
           <w:rPr>
             <w:rStyle w:val="af3"/>
@@ -3344,7 +3344,7 @@
             <w:noProof/>
             <w:webHidden/>
           </w:rPr>
-          <w:instrText xml:space="preserve"> PAGEREF _Toc228308170 \h </w:instrText>
+          <w:instrText xml:space="preserve"> PAGEREF _Toc228348253 \h </w:instrText>
         </w:r>
         <w:r>
           <w:rPr>
@@ -3386,7 +3386,7 @@
           <w14:ligatures w14:val="standardContextual"/>
         </w:rPr>
       </w:pPr>
-      <w:hyperlink w:anchor="_Toc228308171" w:history="1">
+      <w:hyperlink w:anchor="_Toc228348254" w:history="1">
         <w:r>
           <w:rPr>
             <w:rStyle w:val="af3"/>
@@ -3424,7 +3424,7 @@
             <w:noProof/>
             <w:webHidden/>
           </w:rPr>
-          <w:instrText xml:space="preserve"> PAGEREF _Toc228308171 \h </w:instrText>
+          <w:instrText xml:space="preserve"> PAGEREF _Toc228348254 \h </w:instrText>
         </w:r>
         <w:r>
           <w:rPr>
@@ -3466,7 +3466,7 @@
           <w14:ligatures w14:val="standardContextual"/>
         </w:rPr>
       </w:pPr>
-      <w:hyperlink w:anchor="_Toc228308172" w:history="1">
+      <w:hyperlink w:anchor="_Toc228348255" w:history="1">
         <w:r>
           <w:rPr>
             <w:rStyle w:val="af3"/>
@@ -3504,7 +3504,7 @@
             <w:noProof/>
             <w:webHidden/>
           </w:rPr>
-          <w:instrText xml:space="preserve"> PAGEREF _Toc228308172 \h </w:instrText>
+          <w:instrText xml:space="preserve"> PAGEREF _Toc228348255 \h </w:instrText>
         </w:r>
         <w:r>
           <w:rPr>
@@ -3547,7 +3547,7 @@
           <w14:ligatures w14:val="standardContextual"/>
         </w:rPr>
       </w:pPr>
-      <w:hyperlink w:anchor="_Toc228308173" w:history="1">
+      <w:hyperlink w:anchor="_Toc228348256" w:history="1">
         <w:r>
           <w:rPr>
             <w:rStyle w:val="af3"/>
@@ -3603,7 +3603,7 @@
             <w:noProof/>
             <w:webHidden/>
           </w:rPr>
-          <w:instrText xml:space="preserve"> PAGEREF _Toc228308173 \h </w:instrText>
+          <w:instrText xml:space="preserve"> PAGEREF _Toc228348256 \h </w:instrText>
         </w:r>
         <w:r>
           <w:rPr>
@@ -3645,7 +3645,7 @@
           <w14:ligatures w14:val="standardContextual"/>
         </w:rPr>
       </w:pPr>
-      <w:hyperlink w:anchor="_Toc228308174" w:history="1">
+      <w:hyperlink w:anchor="_Toc228348257" w:history="1">
         <w:r>
           <w:rPr>
             <w:rStyle w:val="af3"/>
@@ -3683,7 +3683,7 @@
             <w:noProof/>
             <w:webHidden/>
           </w:rPr>
-          <w:instrText xml:space="preserve"> PAGEREF _Toc228308174 \h </w:instrText>
+          <w:instrText xml:space="preserve"> PAGEREF _Toc228348257 \h </w:instrText>
         </w:r>
         <w:r>
           <w:rPr>
@@ -3725,7 +3725,7 @@
           <w14:ligatures w14:val="standardContextual"/>
         </w:rPr>
       </w:pPr>
-      <w:hyperlink w:anchor="_Toc228308175" w:history="1">
+      <w:hyperlink w:anchor="_Toc228348258" w:history="1">
         <w:r>
           <w:rPr>
             <w:rStyle w:val="af3"/>
@@ -3781,7 +3781,7 @@
             <w:noProof/>
             <w:webHidden/>
           </w:rPr>
-          <w:instrText xml:space="preserve"> PAGEREF _Toc228308175 \h </w:instrText>
+          <w:instrText xml:space="preserve"> PAGEREF _Toc228348258 \h </w:instrText>
         </w:r>
         <w:r>
           <w:rPr>
@@ -3823,7 +3823,7 @@
           <w14:ligatures w14:val="standardContextual"/>
         </w:rPr>
       </w:pPr>
-      <w:hyperlink w:anchor="_Toc228308176" w:history="1">
+      <w:hyperlink w:anchor="_Toc228348259" w:history="1">
         <w:r>
           <w:rPr>
             <w:rStyle w:val="af3"/>
@@ -3861,7 +3861,7 @@
             <w:noProof/>
             <w:webHidden/>
           </w:rPr>
-          <w:instrText xml:space="preserve"> PAGEREF _Toc228308176 \h </w:instrText>
+          <w:instrText xml:space="preserve"> PAGEREF _Toc228348259 \h </w:instrText>
         </w:r>
         <w:r>
           <w:rPr>
@@ -3904,7 +3904,7 @@
           <w14:ligatures w14:val="standardContextual"/>
         </w:rPr>
       </w:pPr>
-      <w:hyperlink w:anchor="_Toc228308177" w:history="1">
+      <w:hyperlink w:anchor="_Toc228348260" w:history="1">
         <w:r>
           <w:rPr>
             <w:rStyle w:val="af3"/>
@@ -3960,7 +3960,7 @@
             <w:noProof/>
             <w:webHidden/>
           </w:rPr>
-          <w:instrText xml:space="preserve"> PAGEREF _Toc228308177 \h </w:instrText>
+          <w:instrText xml:space="preserve"> PAGEREF _Toc228348260 \h </w:instrText>
         </w:r>
         <w:r>
           <w:rPr>
@@ -4002,7 +4002,7 @@
           <w14:ligatures w14:val="standardContextual"/>
         </w:rPr>
       </w:pPr>
-      <w:hyperlink w:anchor="_Toc228308178" w:history="1">
+      <w:hyperlink w:anchor="_Toc228348261" w:history="1">
         <w:r>
           <w:rPr>
             <w:rStyle w:val="af3"/>
@@ -4058,7 +4058,7 @@
             <w:noProof/>
             <w:webHidden/>
           </w:rPr>
-          <w:instrText xml:space="preserve"> PAGEREF _Toc228308178 \h </w:instrText>
+          <w:instrText xml:space="preserve"> PAGEREF _Toc228348261 \h </w:instrText>
         </w:r>
         <w:r>
           <w:rPr>
@@ -4100,7 +4100,7 @@
           <w14:ligatures w14:val="standardContextual"/>
         </w:rPr>
       </w:pPr>
-      <w:hyperlink w:anchor="_Toc228308179" w:history="1">
+      <w:hyperlink w:anchor="_Toc228348262" w:history="1">
         <w:r>
           <w:rPr>
             <w:rStyle w:val="af3"/>
@@ -4156,7 +4156,7 @@
             <w:noProof/>
             <w:webHidden/>
           </w:rPr>
-          <w:instrText xml:space="preserve"> PAGEREF _Toc228308179 \h </w:instrText>
+          <w:instrText xml:space="preserve"> PAGEREF _Toc228348262 \h </w:instrText>
         </w:r>
         <w:r>
           <w:rPr>
@@ -4198,7 +4198,7 @@
           <w14:ligatures w14:val="standardContextual"/>
         </w:rPr>
       </w:pPr>
-      <w:hyperlink w:anchor="_Toc228308180" w:history="1">
+      <w:hyperlink w:anchor="_Toc228348263" w:history="1">
         <w:r>
           <w:rPr>
             <w:rStyle w:val="af3"/>
@@ -4236,7 +4236,7 @@
             <w:noProof/>
             <w:webHidden/>
           </w:rPr>
-          <w:instrText xml:space="preserve"> PAGEREF _Toc228308180 \h </w:instrText>
+          <w:instrText xml:space="preserve"> PAGEREF _Toc228348263 \h </w:instrText>
         </w:r>
         <w:r>
           <w:rPr>
@@ -4279,7 +4279,7 @@
           <w14:ligatures w14:val="standardContextual"/>
         </w:rPr>
       </w:pPr>
-      <w:hyperlink w:anchor="_Toc228308181" w:history="1">
+      <w:hyperlink w:anchor="_Toc228348264" w:history="1">
         <w:r>
           <w:rPr>
             <w:rStyle w:val="af3"/>
@@ -4317,7 +4317,7 @@
             <w:noProof/>
             <w:webHidden/>
           </w:rPr>
-          <w:instrText xml:space="preserve"> PAGEREF _Toc228308181 \h </w:instrText>
+          <w:instrText xml:space="preserve"> PAGEREF _Toc228348264 \h </w:instrText>
         </w:r>
         <w:r>
           <w:rPr>
@@ -4360,7 +4360,7 @@
           <w14:ligatures w14:val="standardContextual"/>
         </w:rPr>
       </w:pPr>
-      <w:hyperlink w:anchor="_Toc228308182" w:history="1">
+      <w:hyperlink w:anchor="_Toc228348265" w:history="1">
         <w:r>
           <w:rPr>
             <w:rStyle w:val="af3"/>
@@ -4404,7 +4404,7 @@
             <w:noProof/>
             <w:webHidden/>
           </w:rPr>
-          <w:instrText xml:space="preserve"> PAGEREF _Toc228308182 \h </w:instrText>
+          <w:instrText xml:space="preserve"> PAGEREF _Toc228348265 \h </w:instrText>
         </w:r>
         <w:r>
           <w:rPr>
@@ -4447,7 +4447,7 @@
           <w14:ligatures w14:val="standardContextual"/>
         </w:rPr>
       </w:pPr>
-      <w:hyperlink w:anchor="_Toc228308183" w:history="1">
+      <w:hyperlink w:anchor="_Toc228348266" w:history="1">
         <w:r>
           <w:rPr>
             <w:rStyle w:val="af3"/>
@@ -4485,7 +4485,7 @@
             <w:noProof/>
             <w:webHidden/>
           </w:rPr>
-          <w:instrText xml:space="preserve"> PAGEREF _Toc228308183 \h </w:instrText>
+          <w:instrText xml:space="preserve"> PAGEREF _Toc228348266 \h </w:instrText>
         </w:r>
         <w:r>
           <w:rPr>
@@ -4528,7 +4528,7 @@
           <w14:ligatures w14:val="standardContextual"/>
         </w:rPr>
       </w:pPr>
-      <w:hyperlink w:anchor="_Toc228308184" w:history="1">
+      <w:hyperlink w:anchor="_Toc228348267" w:history="1">
         <w:r>
           <w:rPr>
             <w:rStyle w:val="af3"/>
@@ -4584,7 +4584,7 @@
             <w:noProof/>
             <w:webHidden/>
           </w:rPr>
-          <w:instrText xml:space="preserve"> PAGEREF _Toc228308184 \h </w:instrText>
+          <w:instrText xml:space="preserve"> PAGEREF _Toc228348267 \h </w:instrText>
         </w:r>
         <w:r>
           <w:rPr>
@@ -4627,7 +4627,7 @@
           <w14:ligatures w14:val="standardContextual"/>
         </w:rPr>
       </w:pPr>
-      <w:hyperlink w:anchor="_Toc228308185" w:history="1">
+      <w:hyperlink w:anchor="_Toc228348268" w:history="1">
         <w:r>
           <w:rPr>
             <w:rStyle w:val="af3"/>
@@ -4665,7 +4665,7 @@
             <w:noProof/>
             <w:webHidden/>
           </w:rPr>
-          <w:instrText xml:space="preserve"> PAGEREF _Toc228308185 \h </w:instrText>
+          <w:instrText xml:space="preserve"> PAGEREF _Toc228348268 \h </w:instrText>
         </w:r>
         <w:r>
           <w:rPr>
@@ -4708,7 +4708,7 @@
           <w14:ligatures w14:val="standardContextual"/>
         </w:rPr>
       </w:pPr>
-      <w:hyperlink w:anchor="_Toc228308186" w:history="1">
+      <w:hyperlink w:anchor="_Toc228348269" w:history="1">
         <w:r>
           <w:rPr>
             <w:rStyle w:val="af3"/>
@@ -4746,7 +4746,7 @@
             <w:noProof/>
             <w:webHidden/>
           </w:rPr>
-          <w:instrText xml:space="preserve"> PAGEREF _Toc228308186 \h </w:instrText>
+          <w:instrText xml:space="preserve"> PAGEREF _Toc228348269 \h </w:instrText>
         </w:r>
         <w:r>
           <w:rPr>
@@ -4789,7 +4789,7 @@
           <w14:ligatures w14:val="standardContextual"/>
         </w:rPr>
       </w:pPr>
-      <w:hyperlink w:anchor="_Toc228308187" w:history="1">
+      <w:hyperlink w:anchor="_Toc228348270" w:history="1">
         <w:r>
           <w:rPr>
             <w:rStyle w:val="af3"/>
@@ -4845,7 +4845,7 @@
             <w:noProof/>
             <w:webHidden/>
           </w:rPr>
-          <w:instrText xml:space="preserve"> PAGEREF _Toc228308187 \h </w:instrText>
+          <w:instrText xml:space="preserve"> PAGEREF _Toc228348270 \h </w:instrText>
         </w:r>
         <w:r>
           <w:rPr>
@@ -4888,7 +4888,7 @@
           <w14:ligatures w14:val="standardContextual"/>
         </w:rPr>
       </w:pPr>
-      <w:hyperlink w:anchor="_Toc228308188" w:history="1">
+      <w:hyperlink w:anchor="_Toc228348271" w:history="1">
         <w:r>
           <w:rPr>
             <w:rStyle w:val="af3"/>
@@ -4944,7 +4944,7 @@
             <w:noProof/>
             <w:webHidden/>
           </w:rPr>
-          <w:instrText xml:space="preserve"> PAGEREF _Toc228308188 \h </w:instrText>
+          <w:instrText xml:space="preserve"> PAGEREF _Toc228348271 \h </w:instrText>
         </w:r>
         <w:r>
           <w:rPr>
@@ -4987,7 +4987,7 @@
           <w14:ligatures w14:val="standardContextual"/>
         </w:rPr>
       </w:pPr>
-      <w:hyperlink w:anchor="_Toc228308189" w:history="1">
+      <w:hyperlink w:anchor="_Toc228348272" w:history="1">
         <w:r>
           <w:rPr>
             <w:rStyle w:val="af3"/>
@@ -5043,7 +5043,7 @@
             <w:noProof/>
             <w:webHidden/>
           </w:rPr>
-          <w:instrText xml:space="preserve"> PAGEREF _Toc228308189 \h </w:instrText>
+          <w:instrText xml:space="preserve"> PAGEREF _Toc228348272 \h </w:instrText>
         </w:r>
         <w:r>
           <w:rPr>
@@ -5086,7 +5086,7 @@
           <w14:ligatures w14:val="standardContextual"/>
         </w:rPr>
       </w:pPr>
-      <w:hyperlink w:anchor="_Toc228308190" w:history="1">
+      <w:hyperlink w:anchor="_Toc228348273" w:history="1">
         <w:r>
           <w:rPr>
             <w:rStyle w:val="af3"/>
@@ -5124,7 +5124,7 @@
             <w:noProof/>
             <w:webHidden/>
           </w:rPr>
-          <w:instrText xml:space="preserve"> PAGEREF _Toc228308190 \h </w:instrText>
+          <w:instrText xml:space="preserve"> PAGEREF _Toc228348273 \h </w:instrText>
         </w:r>
         <w:r>
           <w:rPr>
@@ -5167,7 +5167,7 @@
           <w14:ligatures w14:val="standardContextual"/>
         </w:rPr>
       </w:pPr>
-      <w:hyperlink w:anchor="_Toc228308191" w:history="1">
+      <w:hyperlink w:anchor="_Toc228348274" w:history="1">
         <w:r>
           <w:rPr>
             <w:rStyle w:val="af3"/>
@@ -5205,7 +5205,7 @@
             <w:noProof/>
             <w:webHidden/>
           </w:rPr>
-          <w:instrText xml:space="preserve"> PAGEREF _Toc228308191 \h </w:instrText>
+          <w:instrText xml:space="preserve"> PAGEREF _Toc228348274 \h </w:instrText>
         </w:r>
         <w:r>
           <w:rPr>
@@ -5248,7 +5248,7 @@
           <w14:ligatures w14:val="standardContextual"/>
         </w:rPr>
       </w:pPr>
-      <w:hyperlink w:anchor="_Toc228308192" w:history="1">
+      <w:hyperlink w:anchor="_Toc228348275" w:history="1">
         <w:r>
           <w:rPr>
             <w:rStyle w:val="af3"/>
@@ -5292,7 +5292,7 @@
             <w:noProof/>
             <w:webHidden/>
           </w:rPr>
-          <w:instrText xml:space="preserve"> PAGEREF _Toc228308192 \h </w:instrText>
+          <w:instrText xml:space="preserve"> PAGEREF _Toc228348275 \h </w:instrText>
         </w:r>
         <w:r>
           <w:rPr>
@@ -5335,7 +5335,7 @@
           <w14:ligatures w14:val="standardContextual"/>
         </w:rPr>
       </w:pPr>
-      <w:hyperlink w:anchor="_Toc228308193" w:history="1">
+      <w:hyperlink w:anchor="_Toc228348276" w:history="1">
         <w:r>
           <w:rPr>
             <w:rStyle w:val="af3"/>
@@ -5373,7 +5373,7 @@
             <w:noProof/>
             <w:webHidden/>
           </w:rPr>
-          <w:instrText xml:space="preserve"> PAGEREF _Toc228308193 \h </w:instrText>
+          <w:instrText xml:space="preserve"> PAGEREF _Toc228348276 \h </w:instrText>
         </w:r>
         <w:r>
           <w:rPr>
@@ -5416,7 +5416,7 @@
           <w14:ligatures w14:val="standardContextual"/>
         </w:rPr>
       </w:pPr>
-      <w:hyperlink w:anchor="_Toc228308194" w:history="1">
+      <w:hyperlink w:anchor="_Toc228348277" w:history="1">
         <w:r>
           <w:rPr>
             <w:rStyle w:val="af3"/>
@@ -5454,7 +5454,7 @@
             <w:noProof/>
             <w:webHidden/>
           </w:rPr>
-          <w:instrText xml:space="preserve"> PAGEREF _Toc228308194 \h </w:instrText>
+          <w:instrText xml:space="preserve"> PAGEREF _Toc228348277 \h </w:instrText>
         </w:r>
         <w:r>
           <w:rPr>
@@ -5497,7 +5497,7 @@
           <w14:ligatures w14:val="standardContextual"/>
         </w:rPr>
       </w:pPr>
-      <w:hyperlink w:anchor="_Toc228308195" w:history="1">
+      <w:hyperlink w:anchor="_Toc228348278" w:history="1">
         <w:r>
           <w:rPr>
             <w:rStyle w:val="af3"/>
@@ -5535,7 +5535,7 @@
             <w:noProof/>
             <w:webHidden/>
           </w:rPr>
-          <w:instrText xml:space="preserve"> PAGEREF _Toc228308195 \h </w:instrText>
+          <w:instrText xml:space="preserve"> PAGEREF _Toc228348278 \h </w:instrText>
         </w:r>
         <w:r>
           <w:rPr>
@@ -5578,7 +5578,7 @@
           <w14:ligatures w14:val="standardContextual"/>
         </w:rPr>
       </w:pPr>
-      <w:hyperlink w:anchor="_Toc228308196" w:history="1">
+      <w:hyperlink w:anchor="_Toc228348279" w:history="1">
         <w:r>
           <w:rPr>
             <w:rStyle w:val="af3"/>
@@ -5634,7 +5634,7 @@
             <w:noProof/>
             <w:webHidden/>
           </w:rPr>
-          <w:instrText xml:space="preserve"> PAGEREF _Toc228308196 \h </w:instrText>
+          <w:instrText xml:space="preserve"> PAGEREF _Toc228348279 \h </w:instrText>
         </w:r>
         <w:r>
           <w:rPr>
@@ -5677,7 +5677,7 @@
           <w14:ligatures w14:val="standardContextual"/>
         </w:rPr>
       </w:pPr>
-      <w:hyperlink w:anchor="_Toc228308197" w:history="1">
+      <w:hyperlink w:anchor="_Toc228348280" w:history="1">
         <w:r>
           <w:rPr>
             <w:rStyle w:val="af3"/>
@@ -5715,7 +5715,7 @@
             <w:noProof/>
             <w:webHidden/>
           </w:rPr>
-          <w:instrText xml:space="preserve"> PAGEREF _Toc228308197 \h </w:instrText>
+          <w:instrText xml:space="preserve"> PAGEREF _Toc228348280 \h </w:instrText>
         </w:r>
         <w:r>
           <w:rPr>
@@ -5758,7 +5758,7 @@
           <w14:ligatures w14:val="standardContextual"/>
         </w:rPr>
       </w:pPr>
-      <w:hyperlink w:anchor="_Toc228308198" w:history="1">
+      <w:hyperlink w:anchor="_Toc228348281" w:history="1">
         <w:r>
           <w:rPr>
             <w:rStyle w:val="af3"/>
@@ -5814,7 +5814,7 @@
             <w:noProof/>
             <w:webHidden/>
           </w:rPr>
-          <w:instrText xml:space="preserve"> PAGEREF _Toc228308198 \h </w:instrText>
+          <w:instrText xml:space="preserve"> PAGEREF _Toc228348281 \h </w:instrText>
         </w:r>
         <w:r>
           <w:rPr>
@@ -5857,7 +5857,7 @@
           <w14:ligatures w14:val="standardContextual"/>
         </w:rPr>
       </w:pPr>
-      <w:hyperlink w:anchor="_Toc228308199" w:history="1">
+      <w:hyperlink w:anchor="_Toc228348282" w:history="1">
         <w:r>
           <w:rPr>
             <w:rStyle w:val="af3"/>
@@ -5895,7 +5895,7 @@
             <w:noProof/>
             <w:webHidden/>
           </w:rPr>
-          <w:instrText xml:space="preserve"> PAGEREF _Toc228308199 \h </w:instrText>
+          <w:instrText xml:space="preserve"> PAGEREF _Toc228348282 \h </w:instrText>
         </w:r>
         <w:r>
           <w:rPr>
@@ -5938,7 +5938,7 @@
           <w14:ligatures w14:val="standardContextual"/>
         </w:rPr>
       </w:pPr>
-      <w:hyperlink w:anchor="_Toc228308200" w:history="1">
+      <w:hyperlink w:anchor="_Toc228348283" w:history="1">
         <w:r>
           <w:rPr>
             <w:rStyle w:val="af3"/>
@@ -5976,7 +5976,7 @@
             <w:noProof/>
             <w:webHidden/>
           </w:rPr>
-          <w:instrText xml:space="preserve"> PAGEREF _Toc228308200 \h </w:instrText>
+          <w:instrText xml:space="preserve"> PAGEREF _Toc228348283 \h </w:instrText>
         </w:r>
         <w:r>
           <w:rPr>
@@ -6019,7 +6019,7 @@
           <w14:ligatures w14:val="standardContextual"/>
         </w:rPr>
       </w:pPr>
-      <w:hyperlink w:anchor="_Toc228308201" w:history="1">
+      <w:hyperlink w:anchor="_Toc228348284" w:history="1">
         <w:r>
           <w:rPr>
             <w:rStyle w:val="af3"/>
@@ -6057,7 +6057,7 @@
             <w:noProof/>
             <w:webHidden/>
           </w:rPr>
-          <w:instrText xml:space="preserve"> PAGEREF _Toc228308201 \h </w:instrText>
+          <w:instrText xml:space="preserve"> PAGEREF _Toc228348284 \h </w:instrText>
         </w:r>
         <w:r>
           <w:rPr>
@@ -6100,7 +6100,7 @@
           <w14:ligatures w14:val="standardContextual"/>
         </w:rPr>
       </w:pPr>
-      <w:hyperlink w:anchor="_Toc228308202" w:history="1">
+      <w:hyperlink w:anchor="_Toc228348285" w:history="1">
         <w:r>
           <w:rPr>
             <w:rStyle w:val="af3"/>
@@ -6138,7 +6138,7 @@
             <w:noProof/>
             <w:webHidden/>
           </w:rPr>
-          <w:instrText xml:space="preserve"> PAGEREF _Toc228308202 \h </w:instrText>
+          <w:instrText xml:space="preserve"> PAGEREF _Toc228348285 \h </w:instrText>
         </w:r>
         <w:r>
           <w:rPr>
@@ -6158,7 +6158,7 @@
             <w:noProof/>
             <w:webHidden/>
           </w:rPr>
-          <w:t>51</w:t>
+          <w:t>52</w:t>
         </w:r>
         <w:r>
           <w:rPr>
@@ -6181,7 +6181,7 @@
           <w14:ligatures w14:val="standardContextual"/>
         </w:rPr>
       </w:pPr>
-      <w:hyperlink w:anchor="_Toc228308203" w:history="1">
+      <w:hyperlink w:anchor="_Toc228348286" w:history="1">
         <w:r>
           <w:rPr>
             <w:rStyle w:val="af3"/>
@@ -6225,7 +6225,7 @@
             <w:noProof/>
             <w:webHidden/>
           </w:rPr>
-          <w:instrText xml:space="preserve"> PAGEREF _Toc228308203 \h </w:instrText>
+          <w:instrText xml:space="preserve"> PAGEREF _Toc228348286 \h </w:instrText>
         </w:r>
         <w:r>
           <w:rPr>
@@ -6245,7 +6245,7 @@
             <w:noProof/>
             <w:webHidden/>
           </w:rPr>
-          <w:t>52</w:t>
+          <w:t>54</w:t>
         </w:r>
         <w:r>
           <w:rPr>
@@ -6268,7 +6268,7 @@
           <w14:ligatures w14:val="standardContextual"/>
         </w:rPr>
       </w:pPr>
-      <w:hyperlink w:anchor="_Toc228308204" w:history="1">
+      <w:hyperlink w:anchor="_Toc228348287" w:history="1">
         <w:r>
           <w:rPr>
             <w:rStyle w:val="af3"/>
@@ -6306,7 +6306,7 @@
             <w:noProof/>
             <w:webHidden/>
           </w:rPr>
-          <w:instrText xml:space="preserve"> PAGEREF _Toc228308204 \h </w:instrText>
+          <w:instrText xml:space="preserve"> PAGEREF _Toc228348287 \h </w:instrText>
         </w:r>
         <w:r>
           <w:rPr>
@@ -6326,7 +6326,7 @@
             <w:noProof/>
             <w:webHidden/>
           </w:rPr>
-          <w:t>52</w:t>
+          <w:t>54</w:t>
         </w:r>
         <w:r>
           <w:rPr>
@@ -6349,7 +6349,7 @@
           <w14:ligatures w14:val="standardContextual"/>
         </w:rPr>
       </w:pPr>
-      <w:hyperlink w:anchor="_Toc228308205" w:history="1">
+      <w:hyperlink w:anchor="_Toc228348288" w:history="1">
         <w:r>
           <w:rPr>
             <w:rStyle w:val="af3"/>
@@ -6387,7 +6387,7 @@
             <w:noProof/>
             <w:webHidden/>
           </w:rPr>
-          <w:instrText xml:space="preserve"> PAGEREF _Toc228308205 \h </w:instrText>
+          <w:instrText xml:space="preserve"> PAGEREF _Toc228348288 \h </w:instrText>
         </w:r>
         <w:r>
           <w:rPr>
@@ -6407,7 +6407,7 @@
             <w:noProof/>
             <w:webHidden/>
           </w:rPr>
-          <w:t>52</w:t>
+          <w:t>54</w:t>
         </w:r>
         <w:r>
           <w:rPr>
@@ -6430,7 +6430,7 @@
           <w14:ligatures w14:val="standardContextual"/>
         </w:rPr>
       </w:pPr>
-      <w:hyperlink w:anchor="_Toc228308206" w:history="1">
+      <w:hyperlink w:anchor="_Toc228348289" w:history="1">
         <w:r>
           <w:rPr>
             <w:rStyle w:val="af3"/>
@@ -6458,7 +6458,7 @@
             <w:noProof/>
             <w:webHidden/>
           </w:rPr>
-          <w:instrText xml:space="preserve"> PAGEREF _Toc228308206 \h </w:instrText>
+          <w:instrText xml:space="preserve"> PAGEREF _Toc228348289 \h </w:instrText>
         </w:r>
         <w:r>
           <w:rPr>
@@ -6478,7 +6478,7 @@
             <w:noProof/>
             <w:webHidden/>
           </w:rPr>
-          <w:t>53</w:t>
+          <w:t>55</w:t>
         </w:r>
         <w:r>
           <w:rPr>
@@ -6501,7 +6501,7 @@
           <w14:ligatures w14:val="standardContextual"/>
         </w:rPr>
       </w:pPr>
-      <w:hyperlink w:anchor="_Toc228308207" w:history="1">
+      <w:hyperlink w:anchor="_Toc228348290" w:history="1">
         <w:r>
           <w:rPr>
             <w:rStyle w:val="af3"/>
@@ -6529,7 +6529,7 @@
             <w:noProof/>
             <w:webHidden/>
           </w:rPr>
-          <w:instrText xml:space="preserve"> PAGEREF _Toc228308207 \h </w:instrText>
+          <w:instrText xml:space="preserve"> PAGEREF _Toc228348290 \h </w:instrText>
         </w:r>
         <w:r>
           <w:rPr>
@@ -6549,7 +6549,7 @@
             <w:noProof/>
             <w:webHidden/>
           </w:rPr>
-          <w:t>54</w:t>
+          <w:t>56</w:t>
         </w:r>
         <w:r>
           <w:rPr>
@@ -6576,7 +6576,7 @@
         </w:rPr>
         <w:fldChar w:fldCharType="end"/>
       </w:r>
-      <w:bookmarkStart w:id="0" w:name="_Toc228308149"/>
+      <w:bookmarkStart w:id="0" w:name="_Toc228348232"/>
       <w:r>
         <w:rPr>
           <w:rFonts w:cs="Times New Roman"/>
@@ -6605,7 +6605,7 @@
         <w:spacing w:before="240" w:after="120" w:line="360" w:lineRule="auto"/>
         <w:outlineLvl w:val="1"/>
       </w:pPr>
-      <w:bookmarkStart w:id="1" w:name="_Toc228308150"/>
+      <w:bookmarkStart w:id="1" w:name="_Toc228348233"/>
       <w:r>
         <w:rPr>
           <w:rFonts w:eastAsia="黑体"/>
@@ -6707,7 +6707,14 @@
         <w:rPr>
           <w:szCs w:val="24"/>
         </w:rPr>
-        <w:t>），具备较强的端侧推理能力，适合用于构建实时目标检测系统。然而，在实际部署中，模型格式转换、算子兼容、输入输出张量解析、视频流处理、多线程调度和硬件资源利用之间存在紧密耦合，单纯完成模型转换并不能保证系统达到实时运行效果。</w:t>
+        <w:t>），具备较强的端侧推理能力，适合用于构建实时目标检测系统。然而，在实际部署中，模型格式转换、算子兼容、输入输出张量解析、视频流处理、多线程调度和硬件资源利用之间存在紧密耦合，单纯完成模型转换并不</w:t>
+      </w:r>
+      <w:r>
+        <w:rPr>
+          <w:szCs w:val="24"/>
+        </w:rPr>
+        <w:lastRenderedPageBreak/>
+        <w:t>能保证系统达到实时运行效果。</w:t>
       </w:r>
     </w:p>
     <w:p>
@@ -6805,7 +6812,7 @@
         <w:spacing w:before="240" w:after="120" w:line="360" w:lineRule="auto"/>
         <w:outlineLvl w:val="1"/>
       </w:pPr>
-      <w:bookmarkStart w:id="2" w:name="_Toc228308151"/>
+      <w:bookmarkStart w:id="2" w:name="_Toc228348234"/>
       <w:r>
         <w:rPr>
           <w:rFonts w:eastAsia="黑体"/>
@@ -6853,14 +6860,7 @@
         <w:rPr>
           <w:szCs w:val="24"/>
         </w:rPr>
-        <w:t>系列为代表的一阶段检测算法具有结构简洁、推理速度</w:t>
-      </w:r>
-      <w:r>
-        <w:rPr>
-          <w:szCs w:val="24"/>
-        </w:rPr>
-        <w:lastRenderedPageBreak/>
-        <w:t>快和工程部署方便等特点，在实时检测任务中应用广泛</w:t>
+        <w:t>系列为代表的一阶段检测算法具有结构简洁、推理速度快和工程部署方便等特点，在实时检测任务中应用广泛</w:t>
       </w:r>
       <w:r>
         <w:rPr>
@@ -7015,7 +7015,7 @@
         <w:spacing w:before="240" w:after="120" w:line="360" w:lineRule="auto"/>
         <w:outlineLvl w:val="1"/>
       </w:pPr>
-      <w:bookmarkStart w:id="3" w:name="_Toc228308152"/>
+      <w:bookmarkStart w:id="3" w:name="_Toc228348235"/>
       <w:r>
         <w:rPr>
           <w:rFonts w:eastAsia="黑体"/>
@@ -7145,6 +7145,7 @@
         <w:rPr>
           <w:szCs w:val="24"/>
         </w:rPr>
+        <w:lastRenderedPageBreak/>
         <w:t xml:space="preserve">2. </w:t>
       </w:r>
       <w:r>
@@ -7372,7 +7373,7 @@
         <w:spacing w:before="240" w:after="120" w:line="360" w:lineRule="auto"/>
         <w:outlineLvl w:val="1"/>
       </w:pPr>
-      <w:bookmarkStart w:id="4" w:name="_Toc228308153"/>
+      <w:bookmarkStart w:id="4" w:name="_Toc228348236"/>
       <w:r>
         <w:rPr>
           <w:rFonts w:eastAsia="黑体"/>
@@ -7380,7 +7381,6 @@
           <w:sz w:val="28"/>
           <w:szCs w:val="28"/>
         </w:rPr>
-        <w:lastRenderedPageBreak/>
         <w:t>1.4</w:t>
       </w:r>
       <w:r>
@@ -7586,7 +7586,7 @@
         <w:jc w:val="center"/>
         <w:outlineLvl w:val="0"/>
       </w:pPr>
-      <w:bookmarkStart w:id="5" w:name="_Toc228308154"/>
+      <w:bookmarkStart w:id="5" w:name="_Toc228348237"/>
       <w:r>
         <w:rPr>
           <w:rFonts w:eastAsia="黑体"/>
@@ -7622,7 +7622,7 @@
         <w:spacing w:before="240" w:after="120" w:line="360" w:lineRule="auto"/>
         <w:outlineLvl w:val="1"/>
       </w:pPr>
-      <w:bookmarkStart w:id="6" w:name="_Toc228308155"/>
+      <w:bookmarkStart w:id="6" w:name="_Toc228348238"/>
       <w:r>
         <w:rPr>
           <w:rFonts w:eastAsia="黑体"/>
@@ -7689,7 +7689,14 @@
         <w:rPr>
           <w:szCs w:val="24"/>
         </w:rPr>
-        <w:t>该类算法具有推理速度快、部署链路成熟和工程生态完善等优点，因此常被用于实时检测场景。本文所使用的无人机检测模型属于单类别目标检测模型，板端后处理重点集中在边界框解析、置信度筛选、非极大值抑制和坐标还原等步骤。</w:t>
+        <w:t>该类算法具有推理速度快、部署链路成熟和工</w:t>
+      </w:r>
+      <w:r>
+        <w:rPr>
+          <w:szCs w:val="24"/>
+        </w:rPr>
+        <w:lastRenderedPageBreak/>
+        <w:t>程生态完善等优点，因此常被用于实时检测场景。本文所使用的无人机检测模型属于单类别目标检测模型，板端后处理重点集中在边界框解析、置信度筛选、非极大值抑制和坐标还原等步骤。</w:t>
       </w:r>
     </w:p>
     <w:p>
@@ -7697,7 +7704,7 @@
         <w:spacing w:before="240" w:after="120" w:line="360" w:lineRule="auto"/>
         <w:outlineLvl w:val="1"/>
       </w:pPr>
-      <w:bookmarkStart w:id="7" w:name="_Toc228308156"/>
+      <w:bookmarkStart w:id="7" w:name="_Toc228348239"/>
       <w:r>
         <w:rPr>
           <w:rFonts w:eastAsia="黑体"/>
@@ -7778,7 +7785,7 @@
         <w:spacing w:before="240" w:after="120" w:line="360" w:lineRule="auto"/>
         <w:outlineLvl w:val="1"/>
       </w:pPr>
-      <w:bookmarkStart w:id="8" w:name="_Toc228308157"/>
+      <w:bookmarkStart w:id="8" w:name="_Toc228348240"/>
       <w:r>
         <w:rPr>
           <w:rFonts w:eastAsia="黑体"/>
@@ -8641,7 +8648,7 @@
         <w:spacing w:before="240" w:after="120" w:line="360" w:lineRule="auto"/>
         <w:outlineLvl w:val="1"/>
       </w:pPr>
-      <w:bookmarkStart w:id="9" w:name="_Toc228308158"/>
+      <w:bookmarkStart w:id="9" w:name="_Toc228348241"/>
       <w:r>
         <w:rPr>
           <w:rFonts w:eastAsia="黑体"/>
@@ -8861,7 +8868,7 @@
         <w:spacing w:before="240" w:after="120" w:line="360" w:lineRule="auto"/>
         <w:outlineLvl w:val="1"/>
       </w:pPr>
-      <w:bookmarkStart w:id="10" w:name="_Toc228308159"/>
+      <w:bookmarkStart w:id="10" w:name="_Toc228348242"/>
       <w:r>
         <w:rPr>
           <w:rFonts w:eastAsia="黑体"/>
@@ -9044,7 +9051,7 @@
         <w:spacing w:before="240" w:after="120" w:line="360" w:lineRule="auto"/>
         <w:outlineLvl w:val="1"/>
       </w:pPr>
-      <w:bookmarkStart w:id="11" w:name="_Toc228308160"/>
+      <w:bookmarkStart w:id="11" w:name="_Toc228348243"/>
       <w:r>
         <w:rPr>
           <w:rFonts w:eastAsia="黑体"/>
@@ -9130,7 +9137,7 @@
         <w:jc w:val="center"/>
         <w:outlineLvl w:val="0"/>
       </w:pPr>
-      <w:bookmarkStart w:id="12" w:name="_Toc228308161"/>
+      <w:bookmarkStart w:id="12" w:name="_Toc228348244"/>
       <w:r>
         <w:rPr>
           <w:rFonts w:eastAsia="黑体"/>
@@ -9322,7 +9329,7 @@
         <w:spacing w:before="240" w:after="120" w:line="360" w:lineRule="auto"/>
         <w:outlineLvl w:val="1"/>
       </w:pPr>
-      <w:bookmarkStart w:id="13" w:name="_Toc228308162"/>
+      <w:bookmarkStart w:id="13" w:name="_Toc228348245"/>
       <w:r>
         <w:rPr>
           <w:rFonts w:eastAsia="黑体"/>
@@ -9348,7 +9355,7 @@
         <w:spacing w:before="180" w:after="80" w:line="360" w:lineRule="auto"/>
         <w:outlineLvl w:val="2"/>
       </w:pPr>
-      <w:bookmarkStart w:id="14" w:name="_Toc228308163"/>
+      <w:bookmarkStart w:id="14" w:name="_Toc228348246"/>
       <w:r>
         <w:rPr>
           <w:rFonts w:eastAsia="黑体"/>
@@ -10168,7 +10175,7 @@
         <w:spacing w:before="180" w:after="80" w:line="360" w:lineRule="auto"/>
         <w:outlineLvl w:val="2"/>
       </w:pPr>
-      <w:bookmarkStart w:id="15" w:name="_Toc228308164"/>
+      <w:bookmarkStart w:id="15" w:name="_Toc228348247"/>
       <w:r>
         <w:rPr>
           <w:rFonts w:eastAsia="黑体"/>
@@ -10995,7 +11002,7 @@
         <w:spacing w:before="180" w:after="80" w:line="360" w:lineRule="auto"/>
         <w:outlineLvl w:val="2"/>
       </w:pPr>
-      <w:bookmarkStart w:id="16" w:name="_Toc228308165"/>
+      <w:bookmarkStart w:id="16" w:name="_Toc228348248"/>
       <w:r>
         <w:rPr>
           <w:rFonts w:eastAsia="黑体"/>
@@ -11236,7 +11243,7 @@
         <w:spacing w:before="240" w:after="120" w:line="360" w:lineRule="auto"/>
         <w:outlineLvl w:val="1"/>
       </w:pPr>
-      <w:bookmarkStart w:id="17" w:name="_Toc228308166"/>
+      <w:bookmarkStart w:id="17" w:name="_Toc228348249"/>
       <w:r>
         <w:rPr>
           <w:rFonts w:eastAsia="黑体"/>
@@ -11547,7 +11554,7 @@
         <w:spacing w:before="240" w:after="120" w:line="360" w:lineRule="auto"/>
         <w:outlineLvl w:val="1"/>
       </w:pPr>
-      <w:bookmarkStart w:id="18" w:name="_Toc228308167"/>
+      <w:bookmarkStart w:id="18" w:name="_Toc228348250"/>
       <w:r>
         <w:rPr>
           <w:rFonts w:eastAsia="黑体"/>
@@ -11573,7 +11580,7 @@
         <w:spacing w:before="180" w:after="80" w:line="360" w:lineRule="auto"/>
         <w:outlineLvl w:val="2"/>
       </w:pPr>
-      <w:bookmarkStart w:id="19" w:name="_Toc228308168"/>
+      <w:bookmarkStart w:id="19" w:name="_Toc228348251"/>
       <w:r>
         <w:rPr>
           <w:rFonts w:eastAsia="黑体"/>
@@ -12138,7 +12145,7 @@
         <w:spacing w:before="180" w:after="80" w:line="360" w:lineRule="auto"/>
         <w:outlineLvl w:val="2"/>
       </w:pPr>
-      <w:bookmarkStart w:id="20" w:name="_Toc228308169"/>
+      <w:bookmarkStart w:id="20" w:name="_Toc228348252"/>
       <w:r>
         <w:rPr>
           <w:rFonts w:eastAsia="黑体"/>
@@ -12320,7 +12327,7 @@
         <w:spacing w:before="240" w:after="120" w:line="360" w:lineRule="auto"/>
         <w:outlineLvl w:val="1"/>
       </w:pPr>
-      <w:bookmarkStart w:id="21" w:name="_Toc228308170"/>
+      <w:bookmarkStart w:id="21" w:name="_Toc228348253"/>
       <w:r>
         <w:rPr>
           <w:rFonts w:eastAsia="黑体"/>
@@ -12346,7 +12353,7 @@
         <w:spacing w:before="180" w:after="80" w:line="360" w:lineRule="auto"/>
         <w:outlineLvl w:val="2"/>
       </w:pPr>
-      <w:bookmarkStart w:id="22" w:name="_Toc228308171"/>
+      <w:bookmarkStart w:id="22" w:name="_Toc228348254"/>
       <w:r>
         <w:rPr>
           <w:rFonts w:eastAsia="黑体"/>
@@ -12492,7 +12499,7 @@
         <w:spacing w:before="180" w:after="80" w:line="360" w:lineRule="auto"/>
         <w:outlineLvl w:val="2"/>
       </w:pPr>
-      <w:bookmarkStart w:id="23" w:name="_Toc228308172"/>
+      <w:bookmarkStart w:id="23" w:name="_Toc228348255"/>
       <w:r>
         <w:rPr>
           <w:rFonts w:eastAsia="黑体"/>
@@ -12607,7 +12614,7 @@
         <w:spacing w:before="240" w:after="120" w:line="360" w:lineRule="auto"/>
         <w:outlineLvl w:val="1"/>
       </w:pPr>
-      <w:bookmarkStart w:id="24" w:name="_Toc228308173"/>
+      <w:bookmarkStart w:id="24" w:name="_Toc228348256"/>
       <w:r>
         <w:rPr>
           <w:rFonts w:eastAsia="黑体"/>
@@ -12651,7 +12658,7 @@
         <w:spacing w:before="180" w:after="80" w:line="360" w:lineRule="auto"/>
         <w:outlineLvl w:val="2"/>
       </w:pPr>
-      <w:bookmarkStart w:id="25" w:name="_Toc228308174"/>
+      <w:bookmarkStart w:id="25" w:name="_Toc228348257"/>
       <w:r>
         <w:rPr>
           <w:rFonts w:eastAsia="黑体"/>
@@ -12901,7 +12908,7 @@
         <w:spacing w:before="180" w:after="80" w:line="360" w:lineRule="auto"/>
         <w:outlineLvl w:val="2"/>
       </w:pPr>
-      <w:bookmarkStart w:id="26" w:name="_Toc228308175"/>
+      <w:bookmarkStart w:id="26" w:name="_Toc228348258"/>
       <w:r>
         <w:rPr>
           <w:rFonts w:eastAsia="黑体"/>
@@ -13037,7 +13044,7 @@
         <w:spacing w:before="180" w:after="80" w:line="360" w:lineRule="auto"/>
         <w:outlineLvl w:val="2"/>
       </w:pPr>
-      <w:bookmarkStart w:id="27" w:name="_Toc228308176"/>
+      <w:bookmarkStart w:id="27" w:name="_Toc228348259"/>
       <w:r>
         <w:rPr>
           <w:rFonts w:eastAsia="黑体"/>
@@ -13344,7 +13351,7 @@
         <w:spacing w:before="240" w:after="120" w:line="360" w:lineRule="auto"/>
         <w:outlineLvl w:val="1"/>
       </w:pPr>
-      <w:bookmarkStart w:id="28" w:name="_Toc228308177"/>
+      <w:bookmarkStart w:id="28" w:name="_Toc228348260"/>
       <w:r>
         <w:rPr>
           <w:rFonts w:eastAsia="黑体"/>
@@ -13388,7 +13395,7 @@
         <w:spacing w:before="180" w:after="80" w:line="360" w:lineRule="auto"/>
         <w:outlineLvl w:val="2"/>
       </w:pPr>
-      <w:bookmarkStart w:id="29" w:name="_Toc228308178"/>
+      <w:bookmarkStart w:id="29" w:name="_Toc228348261"/>
       <w:r>
         <w:rPr>
           <w:rFonts w:eastAsia="黑体"/>
@@ -13685,7 +13692,7 @@
         <w:spacing w:before="180" w:after="80" w:line="360" w:lineRule="auto"/>
         <w:outlineLvl w:val="2"/>
       </w:pPr>
-      <w:bookmarkStart w:id="30" w:name="_Toc228308179"/>
+      <w:bookmarkStart w:id="30" w:name="_Toc228348262"/>
       <w:r>
         <w:rPr>
           <w:rFonts w:eastAsia="黑体"/>
@@ -13917,7 +13924,7 @@
         <w:spacing w:before="180" w:after="80" w:line="360" w:lineRule="auto"/>
         <w:outlineLvl w:val="2"/>
       </w:pPr>
-      <w:bookmarkStart w:id="31" w:name="_Toc228308180"/>
+      <w:bookmarkStart w:id="31" w:name="_Toc228348263"/>
       <w:r>
         <w:rPr>
           <w:rFonts w:eastAsia="黑体"/>
@@ -14044,7 +14051,7 @@
         <w:spacing w:before="240" w:after="120" w:line="360" w:lineRule="auto"/>
         <w:outlineLvl w:val="1"/>
       </w:pPr>
-      <w:bookmarkStart w:id="32" w:name="_Toc228308181"/>
+      <w:bookmarkStart w:id="32" w:name="_Toc228348264"/>
       <w:r>
         <w:rPr>
           <w:rFonts w:eastAsia="黑体"/>
@@ -14208,7 +14215,7 @@
         <w:jc w:val="center"/>
         <w:outlineLvl w:val="0"/>
       </w:pPr>
-      <w:bookmarkStart w:id="33" w:name="_Toc228308182"/>
+      <w:bookmarkStart w:id="33" w:name="_Toc228348265"/>
       <w:r>
         <w:rPr>
           <w:rFonts w:eastAsia="黑体"/>
@@ -14364,7 +14371,7 @@
         <w:spacing w:before="240" w:after="120" w:line="360" w:lineRule="auto"/>
         <w:outlineLvl w:val="1"/>
       </w:pPr>
-      <w:bookmarkStart w:id="34" w:name="_Toc228308183"/>
+      <w:bookmarkStart w:id="34" w:name="_Toc228348266"/>
       <w:r>
         <w:rPr>
           <w:rFonts w:eastAsia="黑体"/>
@@ -15657,7 +15664,7 @@
         <w:spacing w:before="240" w:after="120" w:line="360" w:lineRule="auto"/>
         <w:outlineLvl w:val="1"/>
       </w:pPr>
-      <w:bookmarkStart w:id="35" w:name="_Toc228308184"/>
+      <w:bookmarkStart w:id="35" w:name="_Toc228348267"/>
       <w:r>
         <w:rPr>
           <w:rFonts w:eastAsia="黑体"/>
@@ -16574,7 +16581,7 @@
         <w:spacing w:before="240" w:after="120" w:line="360" w:lineRule="auto"/>
         <w:outlineLvl w:val="1"/>
       </w:pPr>
-      <w:bookmarkStart w:id="36" w:name="_Toc228308185"/>
+      <w:bookmarkStart w:id="36" w:name="_Toc228348268"/>
       <w:r>
         <w:rPr>
           <w:rFonts w:eastAsia="黑体"/>
@@ -17882,7 +17889,7 @@
         <w:spacing w:before="240" w:after="120" w:line="360" w:lineRule="auto"/>
         <w:outlineLvl w:val="1"/>
       </w:pPr>
-      <w:bookmarkStart w:id="37" w:name="_Toc228308186"/>
+      <w:bookmarkStart w:id="37" w:name="_Toc228348269"/>
       <w:r>
         <w:rPr>
           <w:rFonts w:eastAsia="黑体"/>
@@ -18376,7 +18383,7 @@
         <w:spacing w:before="240" w:after="120" w:line="360" w:lineRule="auto"/>
         <w:outlineLvl w:val="1"/>
       </w:pPr>
-      <w:bookmarkStart w:id="38" w:name="_Toc228308187"/>
+      <w:bookmarkStart w:id="38" w:name="_Toc228348270"/>
       <w:r>
         <w:rPr>
           <w:rFonts w:eastAsia="黑体"/>
@@ -19184,7 +19191,7 @@
         <w:spacing w:before="240" w:after="120" w:line="360" w:lineRule="auto"/>
         <w:outlineLvl w:val="1"/>
       </w:pPr>
-      <w:bookmarkStart w:id="39" w:name="_Toc228308188"/>
+      <w:bookmarkStart w:id="39" w:name="_Toc228348271"/>
       <w:r>
         <w:rPr>
           <w:rFonts w:eastAsia="黑体"/>
@@ -20632,7 +20639,7 @@
         <w:spacing w:before="240" w:after="120" w:line="360" w:lineRule="auto"/>
         <w:outlineLvl w:val="1"/>
       </w:pPr>
-      <w:bookmarkStart w:id="40" w:name="_Toc228308189"/>
+      <w:bookmarkStart w:id="40" w:name="_Toc228348272"/>
       <w:r>
         <w:rPr>
           <w:rFonts w:eastAsia="黑体"/>
@@ -21770,7 +21777,7 @@
         <w:spacing w:before="240" w:after="120" w:line="360" w:lineRule="auto"/>
         <w:outlineLvl w:val="1"/>
       </w:pPr>
-      <w:bookmarkStart w:id="41" w:name="_Toc228308190"/>
+      <w:bookmarkStart w:id="41" w:name="_Toc228348273"/>
       <w:r>
         <w:rPr>
           <w:rFonts w:eastAsia="黑体"/>
@@ -22242,7 +22249,7 @@
         <w:spacing w:before="240" w:after="120" w:line="360" w:lineRule="auto"/>
         <w:outlineLvl w:val="1"/>
       </w:pPr>
-      <w:bookmarkStart w:id="42" w:name="_Toc228308191"/>
+      <w:bookmarkStart w:id="42" w:name="_Toc228348274"/>
       <w:r>
         <w:rPr>
           <w:rFonts w:eastAsia="黑体"/>
@@ -22563,7 +22570,7 @@
         <w:jc w:val="center"/>
         <w:outlineLvl w:val="0"/>
       </w:pPr>
-      <w:bookmarkStart w:id="43" w:name="_Toc228308192"/>
+      <w:bookmarkStart w:id="43" w:name="_Toc228348275"/>
       <w:r>
         <w:rPr>
           <w:rFonts w:eastAsia="黑体"/>
@@ -22719,7 +22726,7 @@
         <w:spacing w:before="240" w:after="120" w:line="360" w:lineRule="auto"/>
         <w:outlineLvl w:val="1"/>
       </w:pPr>
-      <w:bookmarkStart w:id="44" w:name="_Toc228308193"/>
+      <w:bookmarkStart w:id="44" w:name="_Toc228348276"/>
       <w:r>
         <w:rPr>
           <w:rFonts w:eastAsia="黑体"/>
@@ -24930,7 +24937,7 @@
         <w:spacing w:before="240" w:after="120" w:line="360" w:lineRule="auto"/>
         <w:outlineLvl w:val="1"/>
       </w:pPr>
-      <w:bookmarkStart w:id="45" w:name="_Toc228308194"/>
+      <w:bookmarkStart w:id="45" w:name="_Toc228348277"/>
       <w:r>
         <w:rPr>
           <w:rFonts w:eastAsia="黑体"/>
@@ -25797,7 +25804,7 @@
         <w:spacing w:before="240" w:after="120" w:line="360" w:lineRule="auto"/>
         <w:outlineLvl w:val="1"/>
       </w:pPr>
-      <w:bookmarkStart w:id="46" w:name="_Toc228308195"/>
+      <w:bookmarkStart w:id="46" w:name="_Toc228348278"/>
       <w:r>
         <w:rPr>
           <w:rFonts w:eastAsia="黑体"/>
@@ -26700,7 +26707,7 @@
         <w:spacing w:before="240" w:after="120" w:line="360" w:lineRule="auto"/>
         <w:outlineLvl w:val="1"/>
       </w:pPr>
-      <w:bookmarkStart w:id="47" w:name="_Toc228308196"/>
+      <w:bookmarkStart w:id="47" w:name="_Toc228348279"/>
       <w:r>
         <w:rPr>
           <w:rFonts w:eastAsia="黑体"/>
@@ -27908,7 +27915,7 @@
         <w:spacing w:before="240" w:after="120" w:line="360" w:lineRule="auto"/>
         <w:outlineLvl w:val="1"/>
       </w:pPr>
-      <w:bookmarkStart w:id="48" w:name="_Toc228308197"/>
+      <w:bookmarkStart w:id="48" w:name="_Toc228348280"/>
       <w:r>
         <w:rPr>
           <w:rFonts w:eastAsia="黑体"/>
@@ -30159,7 +30166,7 @@
         <w:spacing w:before="240" w:after="120" w:line="360" w:lineRule="auto"/>
         <w:outlineLvl w:val="1"/>
       </w:pPr>
-      <w:bookmarkStart w:id="49" w:name="_Toc228308198"/>
+      <w:bookmarkStart w:id="49" w:name="_Toc228348281"/>
       <w:r>
         <w:rPr>
           <w:rFonts w:eastAsia="黑体"/>
@@ -32149,7 +32156,7 @@
         <w:spacing w:before="240" w:after="120" w:line="360" w:lineRule="auto"/>
         <w:outlineLvl w:val="1"/>
       </w:pPr>
-      <w:bookmarkStart w:id="50" w:name="_Toc228308199"/>
+      <w:bookmarkStart w:id="50" w:name="_Toc228348282"/>
       <w:r>
         <w:rPr>
           <w:rFonts w:eastAsia="黑体"/>
@@ -33731,7 +33738,7 @@
         <w:spacing w:before="240" w:after="120" w:line="360" w:lineRule="auto"/>
         <w:outlineLvl w:val="1"/>
       </w:pPr>
-      <w:bookmarkStart w:id="51" w:name="_Toc228308200"/>
+      <w:bookmarkStart w:id="51" w:name="_Toc228348283"/>
       <w:r>
         <w:rPr>
           <w:rFonts w:eastAsia="黑体"/>
@@ -34792,7 +34799,7 @@
         <w:spacing w:before="240" w:after="120" w:line="360" w:lineRule="auto"/>
         <w:outlineLvl w:val="1"/>
       </w:pPr>
-      <w:bookmarkStart w:id="52" w:name="_Toc228308201"/>
+      <w:bookmarkStart w:id="52" w:name="_Toc228348284"/>
       <w:r>
         <w:rPr>
           <w:rFonts w:eastAsia="黑体"/>
@@ -36252,19 +36259,1669 @@
     </w:p>
     <w:p>
       <w:pPr>
-        <w:spacing w:before="240" w:after="120" w:line="360" w:lineRule="auto"/>
+        <w:ind w:firstLine="420"/>
+        <w:jc w:val="left"/>
+      </w:pPr>
+      <w:r>
+        <w:rPr>
+          <w:rFonts w:hint="eastAsia"/>
+        </w:rPr>
+        <w:t>第五，从硬件优化路径看，本文已完成多</w:t>
+      </w:r>
+      <w:r>
+        <w:rPr>
+          <w:rFonts w:hint="eastAsia"/>
+        </w:rPr>
+        <w:t xml:space="preserve"> context NPU</w:t>
+      </w:r>
+      <w:r>
+        <w:rPr>
+          <w:rFonts w:hint="eastAsia"/>
+        </w:rPr>
+        <w:t>、</w:t>
+      </w:r>
+      <w:r>
+        <w:rPr>
+          <w:rFonts w:hint="eastAsia"/>
+        </w:rPr>
+        <w:t xml:space="preserve">RGA </w:t>
+      </w:r>
+      <w:r>
+        <w:rPr>
+          <w:rFonts w:hint="eastAsia"/>
+        </w:rPr>
+        <w:t>预处理、</w:t>
+      </w:r>
+      <w:r>
+        <w:rPr>
+          <w:rFonts w:hint="eastAsia"/>
+        </w:rPr>
+        <w:t xml:space="preserve">RGA </w:t>
+      </w:r>
+      <w:r>
+        <w:rPr>
+          <w:rFonts w:hint="eastAsia"/>
+        </w:rPr>
+        <w:t>帧缩放、</w:t>
+      </w:r>
+      <w:r>
+        <w:rPr>
+          <w:rFonts w:hint="eastAsia"/>
+        </w:rPr>
+        <w:t xml:space="preserve">RGA </w:t>
+      </w:r>
+      <w:r>
+        <w:rPr>
+          <w:rFonts w:hint="eastAsia"/>
+        </w:rPr>
+        <w:t>发布格式、</w:t>
+      </w:r>
+      <w:r>
+        <w:rPr>
+          <w:rFonts w:hint="eastAsia"/>
+        </w:rPr>
+        <w:t>RGA letterbox</w:t>
+      </w:r>
+      <w:r>
+        <w:rPr>
+          <w:rFonts w:hint="eastAsia"/>
+        </w:rPr>
+        <w:t>、</w:t>
+      </w:r>
+      <w:r>
+        <w:rPr>
+          <w:rFonts w:hint="eastAsia"/>
+        </w:rPr>
+        <w:t xml:space="preserve">RKNN zero-copy </w:t>
+      </w:r>
+      <w:r>
+        <w:rPr>
+          <w:rFonts w:hint="eastAsia"/>
+        </w:rPr>
+        <w:t>输入和软件告警等多种可切换实验。不同优化项的收益并不相同，因此本文不简单以是否使用硬件加速作为默认配置依据，而是结合端到端延迟、输出帧率、检测一致性和演示稳定性进行选择。</w:t>
+      </w:r>
+    </w:p>
+    <w:p>
+      <w:pPr>
+        <w:jc w:val="center"/>
+      </w:pPr>
+      <w:r>
+        <w:rPr>
+          <w:rFonts w:hint="eastAsia"/>
+        </w:rPr>
+        <w:t>表</w:t>
+      </w:r>
+      <w:r>
+        <w:rPr>
+          <w:rFonts w:hint="eastAsia"/>
+        </w:rPr>
+        <w:t xml:space="preserve">5.12 </w:t>
+      </w:r>
+      <w:r>
+        <w:rPr>
+          <w:rFonts w:hint="eastAsia"/>
+        </w:rPr>
+        <w:t>硬件优化路径综合对比</w:t>
+      </w:r>
+    </w:p>
+    <w:tbl>
+      <w:tblPr>
+        <w:tblW w:w="5000" w:type="pct"/>
+        <w:tblBorders>
+          <w:top w:val="single" w:sz="4" w:space="0" w:color="auto"/>
+          <w:left w:val="single" w:sz="4" w:space="0" w:color="auto"/>
+          <w:bottom w:val="single" w:sz="4" w:space="0" w:color="auto"/>
+          <w:right w:val="single" w:sz="4" w:space="0" w:color="auto"/>
+          <w:insideH w:val="single" w:sz="4" w:space="0" w:color="auto"/>
+          <w:insideV w:val="single" w:sz="4" w:space="0" w:color="auto"/>
+        </w:tblBorders>
+        <w:tblCellMar>
+          <w:top w:w="60" w:type="dxa"/>
+          <w:left w:w="60" w:type="dxa"/>
+          <w:bottom w:w="60" w:type="dxa"/>
+          <w:right w:w="60" w:type="dxa"/>
+        </w:tblCellMar>
+        <w:tblLook w:val="0000" w:firstRow="0" w:lastRow="0" w:firstColumn="0" w:lastColumn="0" w:noHBand="0" w:noVBand="0"/>
+      </w:tblPr>
+      <w:tblGrid>
+        <w:gridCol w:w="1788"/>
+        <w:gridCol w:w="3407"/>
+        <w:gridCol w:w="1791"/>
+        <w:gridCol w:w="1791"/>
+      </w:tblGrid>
+      <w:tr>
+        <w:trPr>
+          <w:cantSplit/>
+          <w:tblHeader/>
+        </w:trPr>
+        <w:tc>
+          <w:tcPr>
+            <w:tcW w:w="1019" w:type="pct"/>
+            <w:shd w:val="clear" w:color="auto" w:fill="F2F2F2"/>
+            <w:vAlign w:val="center"/>
+          </w:tcPr>
+          <w:p>
+            <w:pPr>
+              <w:spacing w:line="240" w:lineRule="auto"/>
+              <w:jc w:val="center"/>
+              <w:rPr>
+                <w:rFonts w:cs="Times New Roman"/>
+                <w:b/>
+                <w:sz w:val="16"/>
+              </w:rPr>
+            </w:pPr>
+            <w:r>
+              <w:rPr>
+                <w:rFonts w:cs="Times New Roman" w:hint="eastAsia"/>
+                <w:b/>
+                <w:sz w:val="16"/>
+              </w:rPr>
+              <w:t>优化项</w:t>
+            </w:r>
+          </w:p>
+        </w:tc>
+        <w:tc>
+          <w:tcPr>
+            <w:tcW w:w="1941" w:type="pct"/>
+            <w:shd w:val="clear" w:color="auto" w:fill="F2F2F2"/>
+            <w:vAlign w:val="center"/>
+          </w:tcPr>
+          <w:p>
+            <w:pPr>
+              <w:spacing w:line="240" w:lineRule="auto"/>
+              <w:jc w:val="center"/>
+              <w:rPr>
+                <w:rFonts w:cs="Times New Roman"/>
+                <w:b/>
+                <w:sz w:val="16"/>
+              </w:rPr>
+            </w:pPr>
+            <w:r>
+              <w:rPr>
+                <w:rFonts w:cs="Times New Roman" w:hint="eastAsia"/>
+                <w:b/>
+                <w:sz w:val="16"/>
+              </w:rPr>
+              <w:t>开关或配置</w:t>
+            </w:r>
+          </w:p>
+        </w:tc>
+        <w:tc>
+          <w:tcPr>
+            <w:tcW w:w="1020" w:type="pct"/>
+            <w:shd w:val="clear" w:color="auto" w:fill="F2F2F2"/>
+            <w:vAlign w:val="center"/>
+          </w:tcPr>
+          <w:p>
+            <w:pPr>
+              <w:spacing w:line="240" w:lineRule="auto"/>
+              <w:jc w:val="center"/>
+              <w:rPr>
+                <w:rFonts w:cs="Times New Roman"/>
+                <w:b/>
+                <w:sz w:val="16"/>
+              </w:rPr>
+            </w:pPr>
+            <w:r>
+              <w:rPr>
+                <w:rFonts w:cs="Times New Roman" w:hint="eastAsia"/>
+                <w:b/>
+                <w:sz w:val="16"/>
+              </w:rPr>
+              <w:t>实验结论</w:t>
+            </w:r>
+          </w:p>
+        </w:tc>
+        <w:tc>
+          <w:tcPr>
+            <w:tcW w:w="1020" w:type="pct"/>
+            <w:shd w:val="clear" w:color="auto" w:fill="F2F2F2"/>
+            <w:vAlign w:val="center"/>
+          </w:tcPr>
+          <w:p>
+            <w:pPr>
+              <w:spacing w:line="240" w:lineRule="auto"/>
+              <w:jc w:val="center"/>
+              <w:rPr>
+                <w:rFonts w:cs="Times New Roman"/>
+                <w:b/>
+                <w:sz w:val="16"/>
+              </w:rPr>
+            </w:pPr>
+            <w:r>
+              <w:rPr>
+                <w:rFonts w:cs="Times New Roman" w:hint="eastAsia"/>
+                <w:b/>
+                <w:sz w:val="16"/>
+              </w:rPr>
+              <w:t>默认建议</w:t>
+            </w:r>
+          </w:p>
+        </w:tc>
+      </w:tr>
+      <w:tr>
+        <w:trPr>
+          <w:cantSplit/>
+        </w:trPr>
+        <w:tc>
+          <w:tcPr>
+            <w:tcW w:w="1019" w:type="pct"/>
+            <w:vAlign w:val="center"/>
+          </w:tcPr>
+          <w:p>
+            <w:pPr>
+              <w:spacing w:line="240" w:lineRule="auto"/>
+              <w:jc w:val="center"/>
+              <w:rPr>
+                <w:rFonts w:cs="Times New Roman"/>
+                <w:sz w:val="16"/>
+              </w:rPr>
+            </w:pPr>
+            <w:r>
+              <w:rPr>
+                <w:rFonts w:cs="Times New Roman" w:hint="eastAsia"/>
+                <w:sz w:val="16"/>
+              </w:rPr>
+              <w:t xml:space="preserve">NPU </w:t>
+            </w:r>
+            <w:r>
+              <w:rPr>
+                <w:rFonts w:cs="Times New Roman" w:hint="eastAsia"/>
+                <w:sz w:val="16"/>
+              </w:rPr>
+              <w:t>多</w:t>
+            </w:r>
+            <w:r>
+              <w:rPr>
+                <w:rFonts w:cs="Times New Roman" w:hint="eastAsia"/>
+                <w:sz w:val="16"/>
+              </w:rPr>
+              <w:t xml:space="preserve"> context </w:t>
+            </w:r>
+            <w:r>
+              <w:rPr>
+                <w:rFonts w:cs="Times New Roman" w:hint="eastAsia"/>
+                <w:sz w:val="16"/>
+              </w:rPr>
+              <w:t>推理</w:t>
+            </w:r>
+          </w:p>
+        </w:tc>
+        <w:tc>
+          <w:tcPr>
+            <w:tcW w:w="1941" w:type="pct"/>
+            <w:vAlign w:val="center"/>
+          </w:tcPr>
+          <w:p>
+            <w:pPr>
+              <w:spacing w:line="240" w:lineRule="auto"/>
+              <w:jc w:val="center"/>
+              <w:rPr>
+                <w:rFonts w:cs="Times New Roman"/>
+                <w:sz w:val="16"/>
+              </w:rPr>
+            </w:pPr>
+            <w:r>
+              <w:rPr>
+                <w:rFonts w:cs="Times New Roman" w:hint="eastAsia"/>
+                <w:sz w:val="16"/>
+              </w:rPr>
+              <w:t>RK_YOLO_INFER_WORKERS=2</w:t>
+            </w:r>
+            <w:r>
+              <w:rPr>
+                <w:rFonts w:cs="Times New Roman" w:hint="eastAsia"/>
+                <w:sz w:val="16"/>
+              </w:rPr>
+              <w:t>；</w:t>
+            </w:r>
+            <w:r>
+              <w:rPr>
+                <w:rFonts w:cs="Times New Roman" w:hint="eastAsia"/>
+                <w:sz w:val="16"/>
+              </w:rPr>
+              <w:t>detect_every_n=1</w:t>
+            </w:r>
+          </w:p>
+        </w:tc>
+        <w:tc>
+          <w:tcPr>
+            <w:tcW w:w="1020" w:type="pct"/>
+            <w:vAlign w:val="center"/>
+          </w:tcPr>
+          <w:p>
+            <w:pPr>
+              <w:spacing w:line="240" w:lineRule="auto"/>
+              <w:jc w:val="center"/>
+              <w:rPr>
+                <w:rFonts w:cs="Times New Roman"/>
+                <w:sz w:val="16"/>
+              </w:rPr>
+            </w:pPr>
+            <w:r>
+              <w:rPr>
+                <w:rFonts w:cs="Times New Roman" w:hint="eastAsia"/>
+                <w:sz w:val="16"/>
+              </w:rPr>
+              <w:t>每帧检测场景下，双</w:t>
+            </w:r>
+            <w:r>
+              <w:rPr>
+                <w:rFonts w:cs="Times New Roman" w:hint="eastAsia"/>
+                <w:sz w:val="16"/>
+              </w:rPr>
+              <w:t xml:space="preserve"> context </w:t>
+            </w:r>
+            <w:r>
+              <w:rPr>
+                <w:rFonts w:cs="Times New Roman" w:hint="eastAsia"/>
+                <w:sz w:val="16"/>
+              </w:rPr>
+              <w:t>将</w:t>
+            </w:r>
+            <w:r>
+              <w:rPr>
+                <w:rFonts w:cs="Times New Roman" w:hint="eastAsia"/>
+                <w:sz w:val="16"/>
+              </w:rPr>
+              <w:t xml:space="preserve"> NPU FPS </w:t>
+            </w:r>
+            <w:r>
+              <w:rPr>
+                <w:rFonts w:cs="Times New Roman" w:hint="eastAsia"/>
+                <w:sz w:val="16"/>
+              </w:rPr>
+              <w:t>从约</w:t>
+            </w:r>
+            <w:r>
+              <w:rPr>
+                <w:rFonts w:cs="Times New Roman" w:hint="eastAsia"/>
+                <w:sz w:val="16"/>
+              </w:rPr>
+              <w:t xml:space="preserve"> 8.59 </w:t>
+            </w:r>
+            <w:r>
+              <w:rPr>
+                <w:rFonts w:cs="Times New Roman" w:hint="eastAsia"/>
+                <w:sz w:val="16"/>
+              </w:rPr>
+              <w:t>提升到</w:t>
+            </w:r>
+            <w:r>
+              <w:rPr>
+                <w:rFonts w:cs="Times New Roman" w:hint="eastAsia"/>
+                <w:sz w:val="16"/>
+              </w:rPr>
+              <w:t xml:space="preserve"> 10.64</w:t>
+            </w:r>
+            <w:r>
+              <w:rPr>
+                <w:rFonts w:cs="Times New Roman" w:hint="eastAsia"/>
+                <w:sz w:val="16"/>
+              </w:rPr>
+              <w:t>，并将平均延迟从</w:t>
+            </w:r>
+            <w:r>
+              <w:rPr>
+                <w:rFonts w:cs="Times New Roman" w:hint="eastAsia"/>
+                <w:sz w:val="16"/>
+              </w:rPr>
+              <w:t xml:space="preserve"> 268.89 ms </w:t>
+            </w:r>
+            <w:r>
+              <w:rPr>
+                <w:rFonts w:cs="Times New Roman" w:hint="eastAsia"/>
+                <w:sz w:val="16"/>
+              </w:rPr>
+              <w:t>降至</w:t>
+            </w:r>
+            <w:r>
+              <w:rPr>
+                <w:rFonts w:cs="Times New Roman" w:hint="eastAsia"/>
+                <w:sz w:val="16"/>
+              </w:rPr>
+              <w:t xml:space="preserve"> 173.58 ms</w:t>
+            </w:r>
+            <w:r>
+              <w:rPr>
+                <w:rFonts w:cs="Times New Roman" w:hint="eastAsia"/>
+                <w:sz w:val="16"/>
+              </w:rPr>
+              <w:t>。</w:t>
+            </w:r>
+          </w:p>
+        </w:tc>
+        <w:tc>
+          <w:tcPr>
+            <w:tcW w:w="1020" w:type="pct"/>
+            <w:vAlign w:val="center"/>
+          </w:tcPr>
+          <w:p>
+            <w:pPr>
+              <w:spacing w:line="240" w:lineRule="auto"/>
+              <w:jc w:val="center"/>
+              <w:rPr>
+                <w:rFonts w:cs="Times New Roman"/>
+                <w:sz w:val="16"/>
+              </w:rPr>
+            </w:pPr>
+            <w:r>
+              <w:rPr>
+                <w:rFonts w:cs="Times New Roman" w:hint="eastAsia"/>
+                <w:sz w:val="16"/>
+              </w:rPr>
+              <w:t>作为硬件并行实验结论；不作为实时观看默认。</w:t>
+            </w:r>
+          </w:p>
+        </w:tc>
+      </w:tr>
+      <w:tr>
+        <w:trPr>
+          <w:cantSplit/>
+        </w:trPr>
+        <w:tc>
+          <w:tcPr>
+            <w:tcW w:w="1019" w:type="pct"/>
+            <w:vAlign w:val="center"/>
+          </w:tcPr>
+          <w:p>
+            <w:pPr>
+              <w:spacing w:line="240" w:lineRule="auto"/>
+              <w:jc w:val="center"/>
+              <w:rPr>
+                <w:rFonts w:cs="Times New Roman"/>
+                <w:sz w:val="16"/>
+              </w:rPr>
+            </w:pPr>
+            <w:r>
+              <w:rPr>
+                <w:rFonts w:cs="Times New Roman" w:hint="eastAsia"/>
+                <w:sz w:val="16"/>
+              </w:rPr>
+              <w:t>检测间隔、运动跟踪与框平滑</w:t>
+            </w:r>
+          </w:p>
+        </w:tc>
+        <w:tc>
+          <w:tcPr>
+            <w:tcW w:w="1941" w:type="pct"/>
+            <w:vAlign w:val="center"/>
+          </w:tcPr>
+          <w:p>
+            <w:pPr>
+              <w:spacing w:line="240" w:lineRule="auto"/>
+              <w:jc w:val="center"/>
+              <w:rPr>
+                <w:rFonts w:cs="Times New Roman"/>
+                <w:sz w:val="16"/>
+              </w:rPr>
+            </w:pPr>
+            <w:r>
+              <w:rPr>
+                <w:rFonts w:cs="Times New Roman" w:hint="eastAsia"/>
+                <w:sz w:val="16"/>
+              </w:rPr>
+              <w:t>detect_every_n=2</w:t>
+            </w:r>
+            <w:r>
+              <w:rPr>
+                <w:rFonts w:cs="Times New Roman" w:hint="eastAsia"/>
+                <w:sz w:val="16"/>
+              </w:rPr>
+              <w:t>；</w:t>
+            </w:r>
+            <w:r>
+              <w:rPr>
+                <w:rFonts w:cs="Times New Roman" w:hint="eastAsia"/>
+                <w:sz w:val="16"/>
+              </w:rPr>
+              <w:t>RK_YOLO_TRACK_MODE=motion</w:t>
+            </w:r>
+            <w:r>
+              <w:rPr>
+                <w:rFonts w:cs="Times New Roman" w:hint="eastAsia"/>
+                <w:sz w:val="16"/>
+              </w:rPr>
+              <w:t>；</w:t>
+            </w:r>
+            <w:r>
+              <w:rPr>
+                <w:rFonts w:cs="Times New Roman" w:hint="eastAsia"/>
+                <w:sz w:val="16"/>
+              </w:rPr>
+              <w:t>RK_YOLO_BOX_SMOOTH=1</w:t>
+            </w:r>
+          </w:p>
+        </w:tc>
+        <w:tc>
+          <w:tcPr>
+            <w:tcW w:w="1020" w:type="pct"/>
+            <w:vAlign w:val="center"/>
+          </w:tcPr>
+          <w:p>
+            <w:pPr>
+              <w:spacing w:line="240" w:lineRule="auto"/>
+              <w:jc w:val="center"/>
+              <w:rPr>
+                <w:rFonts w:cs="Times New Roman"/>
+                <w:sz w:val="16"/>
+              </w:rPr>
+            </w:pPr>
+            <w:r>
+              <w:rPr>
+                <w:rFonts w:cs="Times New Roman" w:hint="eastAsia"/>
+                <w:sz w:val="16"/>
+              </w:rPr>
+              <w:t>在保持约</w:t>
+            </w:r>
+            <w:r>
+              <w:rPr>
+                <w:rFonts w:cs="Times New Roman" w:hint="eastAsia"/>
+                <w:sz w:val="16"/>
+              </w:rPr>
+              <w:t xml:space="preserve"> 10 FPS </w:t>
+            </w:r>
+            <w:r>
+              <w:rPr>
+                <w:rFonts w:cs="Times New Roman" w:hint="eastAsia"/>
+                <w:sz w:val="16"/>
+              </w:rPr>
+              <w:t>输出的同时减少检测框左右抖动，更适合实时观看和课堂演示。</w:t>
+            </w:r>
+          </w:p>
+        </w:tc>
+        <w:tc>
+          <w:tcPr>
+            <w:tcW w:w="1020" w:type="pct"/>
+            <w:vAlign w:val="center"/>
+          </w:tcPr>
+          <w:p>
+            <w:pPr>
+              <w:spacing w:line="240" w:lineRule="auto"/>
+              <w:jc w:val="center"/>
+              <w:rPr>
+                <w:rFonts w:cs="Times New Roman"/>
+                <w:sz w:val="16"/>
+              </w:rPr>
+            </w:pPr>
+            <w:r>
+              <w:rPr>
+                <w:rFonts w:cs="Times New Roman" w:hint="eastAsia"/>
+                <w:sz w:val="16"/>
+              </w:rPr>
+              <w:t>推荐作为当前实时演示主配置。</w:t>
+            </w:r>
+          </w:p>
+        </w:tc>
+      </w:tr>
+      <w:tr>
+        <w:trPr>
+          <w:cantSplit/>
+        </w:trPr>
+        <w:tc>
+          <w:tcPr>
+            <w:tcW w:w="1019" w:type="pct"/>
+            <w:vAlign w:val="center"/>
+          </w:tcPr>
+          <w:p>
+            <w:pPr>
+              <w:spacing w:line="240" w:lineRule="auto"/>
+              <w:jc w:val="center"/>
+              <w:rPr>
+                <w:rFonts w:cs="Times New Roman"/>
+                <w:sz w:val="16"/>
+              </w:rPr>
+            </w:pPr>
+            <w:r>
+              <w:rPr>
+                <w:rFonts w:cs="Times New Roman" w:hint="eastAsia"/>
+                <w:sz w:val="16"/>
+              </w:rPr>
+              <w:t xml:space="preserve">RGA </w:t>
+            </w:r>
+            <w:r>
+              <w:rPr>
+                <w:rFonts w:cs="Times New Roman" w:hint="eastAsia"/>
+                <w:sz w:val="16"/>
+              </w:rPr>
+              <w:t>颜色转换与缩放</w:t>
+            </w:r>
+          </w:p>
+        </w:tc>
+        <w:tc>
+          <w:tcPr>
+            <w:tcW w:w="1941" w:type="pct"/>
+            <w:vAlign w:val="center"/>
+          </w:tcPr>
+          <w:p>
+            <w:pPr>
+              <w:spacing w:line="240" w:lineRule="auto"/>
+              <w:jc w:val="center"/>
+              <w:rPr>
+                <w:rFonts w:cs="Times New Roman"/>
+                <w:sz w:val="16"/>
+              </w:rPr>
+            </w:pPr>
+            <w:r>
+              <w:rPr>
+                <w:rFonts w:cs="Times New Roman"/>
+                <w:sz w:val="16"/>
+              </w:rPr>
+              <w:t>RK_YOLO_PREPROCESS=rga_cvt_resize</w:t>
+            </w:r>
+          </w:p>
+        </w:tc>
+        <w:tc>
+          <w:tcPr>
+            <w:tcW w:w="1020" w:type="pct"/>
+            <w:vAlign w:val="center"/>
+          </w:tcPr>
+          <w:p>
+            <w:pPr>
+              <w:spacing w:line="240" w:lineRule="auto"/>
+              <w:jc w:val="center"/>
+              <w:rPr>
+                <w:rFonts w:cs="Times New Roman"/>
+                <w:sz w:val="16"/>
+              </w:rPr>
+            </w:pPr>
+            <w:r>
+              <w:rPr>
+                <w:rFonts w:cs="Times New Roman" w:hint="eastAsia"/>
+                <w:sz w:val="16"/>
+              </w:rPr>
+              <w:t>全帧压力测试中</w:t>
+            </w:r>
+            <w:r>
+              <w:rPr>
+                <w:rFonts w:cs="Times New Roman" w:hint="eastAsia"/>
+                <w:sz w:val="16"/>
+              </w:rPr>
+              <w:t xml:space="preserve"> stream_fps </w:t>
+            </w:r>
+            <w:r>
+              <w:rPr>
+                <w:rFonts w:cs="Times New Roman" w:hint="eastAsia"/>
+                <w:sz w:val="16"/>
+              </w:rPr>
+              <w:t>和</w:t>
+            </w:r>
+            <w:r>
+              <w:rPr>
+                <w:rFonts w:cs="Times New Roman" w:hint="eastAsia"/>
+                <w:sz w:val="16"/>
+              </w:rPr>
+              <w:t xml:space="preserve"> npu_fps </w:t>
+            </w:r>
+            <w:r>
+              <w:rPr>
+                <w:rFonts w:cs="Times New Roman" w:hint="eastAsia"/>
+                <w:sz w:val="16"/>
+              </w:rPr>
+              <w:t>由约</w:t>
+            </w:r>
+            <w:r>
+              <w:rPr>
+                <w:rFonts w:cs="Times New Roman" w:hint="eastAsia"/>
+                <w:sz w:val="16"/>
+              </w:rPr>
+              <w:t xml:space="preserve"> 6.99 </w:t>
+            </w:r>
+            <w:r>
+              <w:rPr>
+                <w:rFonts w:cs="Times New Roman" w:hint="eastAsia"/>
+                <w:sz w:val="16"/>
+              </w:rPr>
+              <w:t>提升到</w:t>
+            </w:r>
+            <w:r>
+              <w:rPr>
+                <w:rFonts w:cs="Times New Roman" w:hint="eastAsia"/>
+                <w:sz w:val="16"/>
+              </w:rPr>
+              <w:t xml:space="preserve"> 8.00</w:t>
+            </w:r>
+            <w:r>
+              <w:rPr>
+                <w:rFonts w:cs="Times New Roman" w:hint="eastAsia"/>
+                <w:sz w:val="16"/>
+              </w:rPr>
+              <w:t>，平均工作耗时由</w:t>
+            </w:r>
+            <w:r>
+              <w:rPr>
+                <w:rFonts w:cs="Times New Roman" w:hint="eastAsia"/>
+                <w:sz w:val="16"/>
+              </w:rPr>
+              <w:t xml:space="preserve"> 145.23 ms </w:t>
+            </w:r>
+            <w:r>
+              <w:rPr>
+                <w:rFonts w:cs="Times New Roman" w:hint="eastAsia"/>
+                <w:sz w:val="16"/>
+              </w:rPr>
+              <w:t>降至</w:t>
+            </w:r>
+            <w:r>
+              <w:rPr>
+                <w:rFonts w:cs="Times New Roman" w:hint="eastAsia"/>
+                <w:sz w:val="16"/>
+              </w:rPr>
+              <w:t xml:space="preserve"> 132.65 ms</w:t>
+            </w:r>
+            <w:r>
+              <w:rPr>
+                <w:rFonts w:cs="Times New Roman" w:hint="eastAsia"/>
+                <w:sz w:val="16"/>
+              </w:rPr>
+              <w:t>。</w:t>
+            </w:r>
+          </w:p>
+        </w:tc>
+        <w:tc>
+          <w:tcPr>
+            <w:tcW w:w="1020" w:type="pct"/>
+            <w:vAlign w:val="center"/>
+          </w:tcPr>
+          <w:p>
+            <w:pPr>
+              <w:spacing w:line="240" w:lineRule="auto"/>
+              <w:jc w:val="center"/>
+              <w:rPr>
+                <w:rFonts w:cs="Times New Roman"/>
+                <w:sz w:val="16"/>
+              </w:rPr>
+            </w:pPr>
+            <w:r>
+              <w:rPr>
+                <w:rFonts w:cs="Times New Roman" w:hint="eastAsia"/>
+                <w:sz w:val="16"/>
+              </w:rPr>
+              <w:t>可作为硬件预处理实验路径。</w:t>
+            </w:r>
+          </w:p>
+        </w:tc>
+      </w:tr>
+      <w:tr>
+        <w:trPr>
+          <w:cantSplit/>
+        </w:trPr>
+        <w:tc>
+          <w:tcPr>
+            <w:tcW w:w="1019" w:type="pct"/>
+            <w:vAlign w:val="center"/>
+          </w:tcPr>
+          <w:p>
+            <w:pPr>
+              <w:spacing w:line="240" w:lineRule="auto"/>
+              <w:jc w:val="center"/>
+              <w:rPr>
+                <w:rFonts w:cs="Times New Roman"/>
+                <w:sz w:val="16"/>
+              </w:rPr>
+            </w:pPr>
+            <w:r>
+              <w:rPr>
+                <w:rFonts w:cs="Times New Roman" w:hint="eastAsia"/>
+                <w:sz w:val="16"/>
+              </w:rPr>
+              <w:t xml:space="preserve">RGA </w:t>
+            </w:r>
+            <w:r>
+              <w:rPr>
+                <w:rFonts w:cs="Times New Roman" w:hint="eastAsia"/>
+                <w:sz w:val="16"/>
+              </w:rPr>
+              <w:t>实时帧缩放</w:t>
+            </w:r>
+          </w:p>
+        </w:tc>
+        <w:tc>
+          <w:tcPr>
+            <w:tcW w:w="1941" w:type="pct"/>
+            <w:vAlign w:val="center"/>
+          </w:tcPr>
+          <w:p>
+            <w:pPr>
+              <w:spacing w:line="240" w:lineRule="auto"/>
+              <w:jc w:val="center"/>
+              <w:rPr>
+                <w:rFonts w:cs="Times New Roman"/>
+                <w:sz w:val="16"/>
+              </w:rPr>
+            </w:pPr>
+            <w:r>
+              <w:rPr>
+                <w:rFonts w:cs="Times New Roman"/>
+                <w:sz w:val="16"/>
+              </w:rPr>
+              <w:t>RK_YOLO_RGA_FRAME_RESIZE=1</w:t>
+            </w:r>
+          </w:p>
+        </w:tc>
+        <w:tc>
+          <w:tcPr>
+            <w:tcW w:w="1020" w:type="pct"/>
+            <w:vAlign w:val="center"/>
+          </w:tcPr>
+          <w:p>
+            <w:pPr>
+              <w:spacing w:line="240" w:lineRule="auto"/>
+              <w:jc w:val="center"/>
+              <w:rPr>
+                <w:rFonts w:cs="Times New Roman"/>
+                <w:sz w:val="16"/>
+              </w:rPr>
+            </w:pPr>
+            <w:r>
+              <w:rPr>
+                <w:rFonts w:cs="Times New Roman" w:hint="eastAsia"/>
+                <w:sz w:val="16"/>
+              </w:rPr>
+              <w:t>当</w:t>
+            </w:r>
+            <w:r>
+              <w:rPr>
+                <w:rFonts w:cs="Times New Roman" w:hint="eastAsia"/>
+                <w:sz w:val="16"/>
+              </w:rPr>
+              <w:t xml:space="preserve"> 1920</w:t>
+            </w:r>
+            <w:r>
+              <w:rPr>
+                <w:rFonts w:cs="Times New Roman" w:hint="eastAsia"/>
+                <w:sz w:val="16"/>
+              </w:rPr>
+              <w:t>×</w:t>
+            </w:r>
+            <w:r>
+              <w:rPr>
+                <w:rFonts w:cs="Times New Roman" w:hint="eastAsia"/>
+                <w:sz w:val="16"/>
+              </w:rPr>
+              <w:t xml:space="preserve">1080 </w:t>
+            </w:r>
+            <w:r>
+              <w:rPr>
+                <w:rFonts w:cs="Times New Roman" w:hint="eastAsia"/>
+                <w:sz w:val="16"/>
+              </w:rPr>
+              <w:t>输入缩放至</w:t>
+            </w:r>
+            <w:r>
+              <w:rPr>
+                <w:rFonts w:cs="Times New Roman" w:hint="eastAsia"/>
+                <w:sz w:val="16"/>
+              </w:rPr>
+              <w:t xml:space="preserve"> 640</w:t>
+            </w:r>
+            <w:r>
+              <w:rPr>
+                <w:rFonts w:cs="Times New Roman" w:hint="eastAsia"/>
+                <w:sz w:val="16"/>
+              </w:rPr>
+              <w:t>×</w:t>
+            </w:r>
+            <w:r>
+              <w:rPr>
+                <w:rFonts w:cs="Times New Roman" w:hint="eastAsia"/>
+                <w:sz w:val="16"/>
+              </w:rPr>
+              <w:t xml:space="preserve">480 </w:t>
+            </w:r>
+            <w:r>
+              <w:rPr>
+                <w:rFonts w:cs="Times New Roman" w:hint="eastAsia"/>
+                <w:sz w:val="16"/>
+              </w:rPr>
+              <w:t>输出时，平均工作耗时由</w:t>
+            </w:r>
+            <w:r>
+              <w:rPr>
+                <w:rFonts w:cs="Times New Roman" w:hint="eastAsia"/>
+                <w:sz w:val="16"/>
+              </w:rPr>
+              <w:t xml:space="preserve"> 108.90 ms </w:t>
+            </w:r>
+            <w:r>
+              <w:rPr>
+                <w:rFonts w:cs="Times New Roman" w:hint="eastAsia"/>
+                <w:sz w:val="16"/>
+              </w:rPr>
+              <w:t>降至</w:t>
+            </w:r>
+            <w:r>
+              <w:rPr>
+                <w:rFonts w:cs="Times New Roman" w:hint="eastAsia"/>
+                <w:sz w:val="16"/>
+              </w:rPr>
+              <w:t xml:space="preserve"> 93.42 ms</w:t>
+            </w:r>
+            <w:r>
+              <w:rPr>
+                <w:rFonts w:cs="Times New Roman" w:hint="eastAsia"/>
+                <w:sz w:val="16"/>
+              </w:rPr>
+              <w:t>。</w:t>
+            </w:r>
+          </w:p>
+        </w:tc>
+        <w:tc>
+          <w:tcPr>
+            <w:tcW w:w="1020" w:type="pct"/>
+            <w:vAlign w:val="center"/>
+          </w:tcPr>
+          <w:p>
+            <w:pPr>
+              <w:spacing w:line="240" w:lineRule="auto"/>
+              <w:jc w:val="center"/>
+              <w:rPr>
+                <w:rFonts w:cs="Times New Roman"/>
+                <w:sz w:val="16"/>
+              </w:rPr>
+            </w:pPr>
+            <w:r>
+              <w:rPr>
+                <w:rFonts w:cs="Times New Roman" w:hint="eastAsia"/>
+                <w:sz w:val="16"/>
+              </w:rPr>
+              <w:t>高分辨率输入场景下可开启。</w:t>
+            </w:r>
+          </w:p>
+        </w:tc>
+      </w:tr>
+      <w:tr>
+        <w:trPr>
+          <w:cantSplit/>
+        </w:trPr>
+        <w:tc>
+          <w:tcPr>
+            <w:tcW w:w="1019" w:type="pct"/>
+            <w:vAlign w:val="center"/>
+          </w:tcPr>
+          <w:p>
+            <w:pPr>
+              <w:spacing w:line="240" w:lineRule="auto"/>
+              <w:jc w:val="center"/>
+              <w:rPr>
+                <w:rFonts w:cs="Times New Roman"/>
+                <w:sz w:val="16"/>
+              </w:rPr>
+            </w:pPr>
+            <w:r>
+              <w:rPr>
+                <w:rFonts w:cs="Times New Roman" w:hint="eastAsia"/>
+                <w:sz w:val="16"/>
+              </w:rPr>
+              <w:t xml:space="preserve">RGA letterbox </w:t>
+            </w:r>
+            <w:r>
+              <w:rPr>
+                <w:rFonts w:cs="Times New Roman" w:hint="eastAsia"/>
+                <w:sz w:val="16"/>
+              </w:rPr>
+              <w:t>输入画布</w:t>
+            </w:r>
+          </w:p>
+        </w:tc>
+        <w:tc>
+          <w:tcPr>
+            <w:tcW w:w="1941" w:type="pct"/>
+            <w:vAlign w:val="center"/>
+          </w:tcPr>
+          <w:p>
+            <w:pPr>
+              <w:spacing w:line="240" w:lineRule="auto"/>
+              <w:jc w:val="center"/>
+              <w:rPr>
+                <w:rFonts w:cs="Times New Roman"/>
+                <w:sz w:val="16"/>
+              </w:rPr>
+            </w:pPr>
+            <w:r>
+              <w:rPr>
+                <w:rFonts w:cs="Times New Roman"/>
+                <w:sz w:val="16"/>
+              </w:rPr>
+              <w:t>RK_YOLO_RGA_LETTERBOX=1</w:t>
+            </w:r>
+          </w:p>
+        </w:tc>
+        <w:tc>
+          <w:tcPr>
+            <w:tcW w:w="1020" w:type="pct"/>
+            <w:vAlign w:val="center"/>
+          </w:tcPr>
+          <w:p>
+            <w:pPr>
+              <w:spacing w:line="240" w:lineRule="auto"/>
+              <w:jc w:val="center"/>
+              <w:rPr>
+                <w:rFonts w:cs="Times New Roman"/>
+                <w:sz w:val="16"/>
+              </w:rPr>
+            </w:pPr>
+            <w:r>
+              <w:rPr>
+                <w:rFonts w:cs="Times New Roman" w:hint="eastAsia"/>
+                <w:sz w:val="16"/>
+              </w:rPr>
+              <w:t>固定视频测试中检测条数与基线一致；短视频平均</w:t>
+            </w:r>
+            <w:r>
+              <w:rPr>
+                <w:rFonts w:cs="Times New Roman" w:hint="eastAsia"/>
+                <w:sz w:val="16"/>
+              </w:rPr>
+              <w:t xml:space="preserve"> total_work_ms </w:t>
+            </w:r>
+            <w:r>
+              <w:rPr>
+                <w:rFonts w:cs="Times New Roman" w:hint="eastAsia"/>
+                <w:sz w:val="16"/>
+              </w:rPr>
+              <w:t>由</w:t>
+            </w:r>
+            <w:r>
+              <w:rPr>
+                <w:rFonts w:cs="Times New Roman" w:hint="eastAsia"/>
+                <w:sz w:val="16"/>
+              </w:rPr>
+              <w:t xml:space="preserve"> 148.05 ms </w:t>
+            </w:r>
+            <w:r>
+              <w:rPr>
+                <w:rFonts w:cs="Times New Roman" w:hint="eastAsia"/>
+                <w:sz w:val="16"/>
+              </w:rPr>
+              <w:t>降至</w:t>
+            </w:r>
+            <w:r>
+              <w:rPr>
+                <w:rFonts w:cs="Times New Roman" w:hint="eastAsia"/>
+                <w:sz w:val="16"/>
+              </w:rPr>
+              <w:t xml:space="preserve"> 137.24 ms</w:t>
+            </w:r>
+            <w:r>
+              <w:rPr>
+                <w:rFonts w:cs="Times New Roman" w:hint="eastAsia"/>
+                <w:sz w:val="16"/>
+              </w:rPr>
+              <w:t>，但</w:t>
+            </w:r>
+            <w:r>
+              <w:rPr>
+                <w:rFonts w:cs="Times New Roman" w:hint="eastAsia"/>
+                <w:sz w:val="16"/>
+              </w:rPr>
+              <w:t xml:space="preserve"> prepare_ms </w:t>
+            </w:r>
+            <w:r>
+              <w:rPr>
+                <w:rFonts w:cs="Times New Roman" w:hint="eastAsia"/>
+                <w:sz w:val="16"/>
+              </w:rPr>
+              <w:t>略有增加。</w:t>
+            </w:r>
+          </w:p>
+        </w:tc>
+        <w:tc>
+          <w:tcPr>
+            <w:tcW w:w="1020" w:type="pct"/>
+            <w:vAlign w:val="center"/>
+          </w:tcPr>
+          <w:p>
+            <w:pPr>
+              <w:spacing w:line="240" w:lineRule="auto"/>
+              <w:jc w:val="center"/>
+              <w:rPr>
+                <w:rFonts w:cs="Times New Roman"/>
+                <w:sz w:val="16"/>
+              </w:rPr>
+            </w:pPr>
+            <w:r>
+              <w:rPr>
+                <w:rFonts w:cs="Times New Roman" w:hint="eastAsia"/>
+                <w:sz w:val="16"/>
+              </w:rPr>
+              <w:t>保留为可选实验路径，暂不设为默认。</w:t>
+            </w:r>
+          </w:p>
+        </w:tc>
+      </w:tr>
+      <w:tr>
+        <w:trPr>
+          <w:cantSplit/>
+        </w:trPr>
+        <w:tc>
+          <w:tcPr>
+            <w:tcW w:w="1019" w:type="pct"/>
+            <w:vAlign w:val="center"/>
+          </w:tcPr>
+          <w:p>
+            <w:pPr>
+              <w:spacing w:line="240" w:lineRule="auto"/>
+              <w:jc w:val="center"/>
+              <w:rPr>
+                <w:rFonts w:cs="Times New Roman"/>
+                <w:sz w:val="16"/>
+              </w:rPr>
+            </w:pPr>
+            <w:r>
+              <w:rPr>
+                <w:rFonts w:cs="Times New Roman" w:hint="eastAsia"/>
+                <w:sz w:val="16"/>
+              </w:rPr>
+              <w:lastRenderedPageBreak/>
+              <w:t xml:space="preserve">RGA NV12 </w:t>
+            </w:r>
+            <w:r>
+              <w:rPr>
+                <w:rFonts w:cs="Times New Roman" w:hint="eastAsia"/>
+                <w:sz w:val="16"/>
+              </w:rPr>
+              <w:t>发布</w:t>
+            </w:r>
+          </w:p>
+        </w:tc>
+        <w:tc>
+          <w:tcPr>
+            <w:tcW w:w="1941" w:type="pct"/>
+            <w:vAlign w:val="center"/>
+          </w:tcPr>
+          <w:p>
+            <w:pPr>
+              <w:spacing w:line="240" w:lineRule="auto"/>
+              <w:jc w:val="center"/>
+              <w:rPr>
+                <w:rFonts w:cs="Times New Roman"/>
+                <w:sz w:val="16"/>
+              </w:rPr>
+            </w:pPr>
+            <w:r>
+              <w:rPr>
+                <w:rFonts w:cs="Times New Roman"/>
+                <w:sz w:val="16"/>
+              </w:rPr>
+              <w:t>RK_YOLO_RGA_PUBLISH_NV12=1</w:t>
+            </w:r>
+          </w:p>
+        </w:tc>
+        <w:tc>
+          <w:tcPr>
+            <w:tcW w:w="1020" w:type="pct"/>
+            <w:vAlign w:val="center"/>
+          </w:tcPr>
+          <w:p>
+            <w:pPr>
+              <w:spacing w:line="240" w:lineRule="auto"/>
+              <w:jc w:val="center"/>
+              <w:rPr>
+                <w:rFonts w:cs="Times New Roman"/>
+                <w:sz w:val="16"/>
+              </w:rPr>
+            </w:pPr>
+            <w:r>
+              <w:rPr>
+                <w:rFonts w:cs="Times New Roman" w:hint="eastAsia"/>
+                <w:sz w:val="16"/>
+              </w:rPr>
+              <w:t>能够绕过</w:t>
+            </w:r>
+            <w:r>
+              <w:rPr>
+                <w:rFonts w:cs="Times New Roman" w:hint="eastAsia"/>
+                <w:sz w:val="16"/>
+              </w:rPr>
+              <w:t xml:space="preserve"> videoconvert </w:t>
+            </w:r>
+            <w:r>
+              <w:rPr>
+                <w:rFonts w:cs="Times New Roman" w:hint="eastAsia"/>
+                <w:sz w:val="16"/>
+              </w:rPr>
+              <w:t>并直接向编码器输入</w:t>
+            </w:r>
+            <w:r>
+              <w:rPr>
+                <w:rFonts w:cs="Times New Roman" w:hint="eastAsia"/>
+                <w:sz w:val="16"/>
+              </w:rPr>
+              <w:t xml:space="preserve"> NV12</w:t>
+            </w:r>
+            <w:r>
+              <w:rPr>
+                <w:rFonts w:cs="Times New Roman" w:hint="eastAsia"/>
+                <w:sz w:val="16"/>
+              </w:rPr>
+              <w:t>，但测试中总体平均延迟未改善。</w:t>
+            </w:r>
+          </w:p>
+        </w:tc>
+        <w:tc>
+          <w:tcPr>
+            <w:tcW w:w="1020" w:type="pct"/>
+            <w:vAlign w:val="center"/>
+          </w:tcPr>
+          <w:p>
+            <w:pPr>
+              <w:spacing w:line="240" w:lineRule="auto"/>
+              <w:jc w:val="center"/>
+              <w:rPr>
+                <w:rFonts w:cs="Times New Roman"/>
+                <w:sz w:val="16"/>
+              </w:rPr>
+            </w:pPr>
+            <w:r>
+              <w:rPr>
+                <w:rFonts w:cs="Times New Roman" w:hint="eastAsia"/>
+                <w:sz w:val="16"/>
+              </w:rPr>
+              <w:t>保持关闭，用于说明硬件路径需实测选择。</w:t>
+            </w:r>
+          </w:p>
+        </w:tc>
+      </w:tr>
+      <w:tr>
+        <w:trPr>
+          <w:cantSplit/>
+        </w:trPr>
+        <w:tc>
+          <w:tcPr>
+            <w:tcW w:w="1019" w:type="pct"/>
+            <w:vAlign w:val="center"/>
+          </w:tcPr>
+          <w:p>
+            <w:pPr>
+              <w:spacing w:line="240" w:lineRule="auto"/>
+              <w:jc w:val="center"/>
+              <w:rPr>
+                <w:rFonts w:cs="Times New Roman"/>
+                <w:sz w:val="16"/>
+              </w:rPr>
+            </w:pPr>
+            <w:r>
+              <w:rPr>
+                <w:rFonts w:cs="Times New Roman" w:hint="eastAsia"/>
+                <w:sz w:val="16"/>
+              </w:rPr>
+              <w:t xml:space="preserve">RKNN zero-copy </w:t>
+            </w:r>
+            <w:r>
+              <w:rPr>
+                <w:rFonts w:cs="Times New Roman" w:hint="eastAsia"/>
+                <w:sz w:val="16"/>
+              </w:rPr>
+              <w:t>输入</w:t>
+            </w:r>
+          </w:p>
+        </w:tc>
+        <w:tc>
+          <w:tcPr>
+            <w:tcW w:w="1941" w:type="pct"/>
+            <w:vAlign w:val="center"/>
+          </w:tcPr>
+          <w:p>
+            <w:pPr>
+              <w:spacing w:line="240" w:lineRule="auto"/>
+              <w:jc w:val="center"/>
+              <w:rPr>
+                <w:rFonts w:cs="Times New Roman"/>
+                <w:sz w:val="16"/>
+              </w:rPr>
+            </w:pPr>
+            <w:r>
+              <w:rPr>
+                <w:rFonts w:cs="Times New Roman"/>
+                <w:sz w:val="16"/>
+              </w:rPr>
+              <w:t>RK_YOLO_ZERO_COPY_INPUT=1</w:t>
+            </w:r>
+          </w:p>
+        </w:tc>
+        <w:tc>
+          <w:tcPr>
+            <w:tcW w:w="1020" w:type="pct"/>
+            <w:vAlign w:val="center"/>
+          </w:tcPr>
+          <w:p>
+            <w:pPr>
+              <w:spacing w:line="240" w:lineRule="auto"/>
+              <w:jc w:val="center"/>
+              <w:rPr>
+                <w:rFonts w:cs="Times New Roman"/>
+                <w:sz w:val="16"/>
+              </w:rPr>
+            </w:pPr>
+            <w:r>
+              <w:rPr>
+                <w:rFonts w:cs="Times New Roman" w:hint="eastAsia"/>
+                <w:sz w:val="16"/>
+              </w:rPr>
+              <w:t>输入更新阶段显著下降，但</w:t>
+            </w:r>
+            <w:r>
+              <w:rPr>
+                <w:rFonts w:cs="Times New Roman" w:hint="eastAsia"/>
+                <w:sz w:val="16"/>
+              </w:rPr>
+              <w:t xml:space="preserve"> rknn_run </w:t>
+            </w:r>
+            <w:r>
+              <w:rPr>
+                <w:rFonts w:cs="Times New Roman" w:hint="eastAsia"/>
+                <w:sz w:val="16"/>
+              </w:rPr>
+              <w:t>阶段增加，端到端收益不稳定。</w:t>
+            </w:r>
+          </w:p>
+        </w:tc>
+        <w:tc>
+          <w:tcPr>
+            <w:tcW w:w="1020" w:type="pct"/>
+            <w:vAlign w:val="center"/>
+          </w:tcPr>
+          <w:p>
+            <w:pPr>
+              <w:spacing w:line="240" w:lineRule="auto"/>
+              <w:jc w:val="center"/>
+              <w:rPr>
+                <w:rFonts w:cs="Times New Roman"/>
+                <w:sz w:val="16"/>
+              </w:rPr>
+            </w:pPr>
+            <w:r>
+              <w:rPr>
+                <w:rFonts w:cs="Times New Roman" w:hint="eastAsia"/>
+                <w:sz w:val="16"/>
+              </w:rPr>
+              <w:t>保持关闭，作为后续</w:t>
+            </w:r>
+            <w:r>
+              <w:rPr>
+                <w:rFonts w:cs="Times New Roman" w:hint="eastAsia"/>
+                <w:sz w:val="16"/>
+              </w:rPr>
+              <w:t xml:space="preserve"> INT8 </w:t>
+            </w:r>
+            <w:r>
+              <w:rPr>
+                <w:rFonts w:cs="Times New Roman" w:hint="eastAsia"/>
+                <w:sz w:val="16"/>
+              </w:rPr>
+              <w:t>和输入格式匹配优化方向。</w:t>
+            </w:r>
+          </w:p>
+        </w:tc>
+      </w:tr>
+      <w:tr>
+        <w:trPr>
+          <w:cantSplit/>
+        </w:trPr>
+        <w:tc>
+          <w:tcPr>
+            <w:tcW w:w="1019" w:type="pct"/>
+            <w:vAlign w:val="center"/>
+          </w:tcPr>
+          <w:p>
+            <w:pPr>
+              <w:spacing w:line="240" w:lineRule="auto"/>
+              <w:jc w:val="center"/>
+              <w:rPr>
+                <w:rFonts w:cs="Times New Roman"/>
+                <w:sz w:val="16"/>
+              </w:rPr>
+            </w:pPr>
+            <w:r>
+              <w:rPr>
+                <w:rFonts w:cs="Times New Roman" w:hint="eastAsia"/>
+                <w:sz w:val="16"/>
+              </w:rPr>
+              <w:t>软件告警覆盖层</w:t>
+            </w:r>
+          </w:p>
+        </w:tc>
+        <w:tc>
+          <w:tcPr>
+            <w:tcW w:w="1941" w:type="pct"/>
+            <w:vAlign w:val="center"/>
+          </w:tcPr>
+          <w:p>
+            <w:pPr>
+              <w:spacing w:line="240" w:lineRule="auto"/>
+              <w:jc w:val="center"/>
+              <w:rPr>
+                <w:rFonts w:cs="Times New Roman"/>
+                <w:sz w:val="16"/>
+              </w:rPr>
+            </w:pPr>
+            <w:r>
+              <w:rPr>
+                <w:rFonts w:cs="Times New Roman"/>
+                <w:sz w:val="16"/>
+              </w:rPr>
+              <w:t>RK_YOLO_ALARM_OVERLAY=1</w:t>
+            </w:r>
+          </w:p>
+        </w:tc>
+        <w:tc>
+          <w:tcPr>
+            <w:tcW w:w="1020" w:type="pct"/>
+            <w:vAlign w:val="center"/>
+          </w:tcPr>
+          <w:p>
+            <w:pPr>
+              <w:spacing w:line="240" w:lineRule="auto"/>
+              <w:jc w:val="center"/>
+              <w:rPr>
+                <w:rFonts w:cs="Times New Roman"/>
+                <w:sz w:val="16"/>
+              </w:rPr>
+            </w:pPr>
+            <w:r>
+              <w:rPr>
+                <w:rFonts w:cs="Times New Roman" w:hint="eastAsia"/>
+                <w:sz w:val="16"/>
+              </w:rPr>
+              <w:t>无需外接继电器或蜂鸣器即可在视频画面中显示</w:t>
+            </w:r>
+            <w:r>
+              <w:rPr>
+                <w:rFonts w:cs="Times New Roman" w:hint="eastAsia"/>
+                <w:sz w:val="16"/>
+              </w:rPr>
+              <w:t xml:space="preserve"> UAV ALERT / NORMAL </w:t>
+            </w:r>
+            <w:r>
+              <w:rPr>
+                <w:rFonts w:cs="Times New Roman" w:hint="eastAsia"/>
+                <w:sz w:val="16"/>
+              </w:rPr>
+              <w:t>状态，并输出</w:t>
+            </w:r>
+            <w:r>
+              <w:rPr>
+                <w:rFonts w:cs="Times New Roman" w:hint="eastAsia"/>
+                <w:sz w:val="16"/>
+              </w:rPr>
+              <w:t xml:space="preserve"> alarm CSV</w:t>
+            </w:r>
+            <w:r>
+              <w:rPr>
+                <w:rFonts w:cs="Times New Roman" w:hint="eastAsia"/>
+                <w:sz w:val="16"/>
+              </w:rPr>
+              <w:t>。</w:t>
+            </w:r>
+          </w:p>
+        </w:tc>
+        <w:tc>
+          <w:tcPr>
+            <w:tcW w:w="1020" w:type="pct"/>
+            <w:vAlign w:val="center"/>
+          </w:tcPr>
+          <w:p>
+            <w:pPr>
+              <w:spacing w:line="240" w:lineRule="auto"/>
+              <w:jc w:val="center"/>
+              <w:rPr>
+                <w:rFonts w:cs="Times New Roman"/>
+                <w:sz w:val="16"/>
+              </w:rPr>
+            </w:pPr>
+            <w:r>
+              <w:rPr>
+                <w:rFonts w:cs="Times New Roman" w:hint="eastAsia"/>
+                <w:sz w:val="16"/>
+              </w:rPr>
+              <w:t>课堂演示建议开启。</w:t>
+            </w:r>
+          </w:p>
+        </w:tc>
+      </w:tr>
+    </w:tbl>
+    <w:p>
+      <w:pPr>
+        <w:spacing w:before="240" w:after="120" w:line="400" w:lineRule="auto"/>
+        <w:jc w:val="center"/>
         <w:outlineLvl w:val="1"/>
-      </w:pPr>
-      <w:bookmarkStart w:id="53" w:name="_Toc228308202"/>
-      <w:r>
         <w:rPr>
           <w:rFonts w:eastAsia="黑体"/>
           <w:b/>
           <w:sz w:val="28"/>
           <w:szCs w:val="28"/>
         </w:rPr>
-        <w:t>5.10</w:t>
-      </w:r>
+      </w:pPr>
+    </w:p>
+    <w:p>
+      <w:pPr>
+        <w:ind w:firstLine="420"/>
+        <w:jc w:val="left"/>
+      </w:pPr>
+      <w:r>
+        <w:rPr>
+          <w:rFonts w:hint="eastAsia"/>
+        </w:rPr>
+        <w:t>由表</w:t>
+      </w:r>
+      <w:r>
+        <w:rPr>
+          <w:rFonts w:hint="eastAsia"/>
+        </w:rPr>
+        <w:t>5.12</w:t>
+      </w:r>
+      <w:r>
+        <w:rPr>
+          <w:rFonts w:hint="eastAsia"/>
+        </w:rPr>
+        <w:t>可知，本文最终推荐的实时演示方案并不是单一硬件模块的极限配置，而是检测间隔、轻量跟踪、框平滑和动态</w:t>
+      </w:r>
+      <w:r>
+        <w:rPr>
+          <w:rFonts w:hint="eastAsia"/>
+        </w:rPr>
+        <w:t xml:space="preserve"> ROI </w:t>
+      </w:r>
+      <w:r>
+        <w:rPr>
+          <w:rFonts w:hint="eastAsia"/>
+        </w:rPr>
+        <w:t>的组合策略。多</w:t>
+      </w:r>
+      <w:r>
+        <w:rPr>
+          <w:rFonts w:hint="eastAsia"/>
+        </w:rPr>
+        <w:t xml:space="preserve"> context NPU </w:t>
+      </w:r>
+      <w:r>
+        <w:rPr>
+          <w:rFonts w:hint="eastAsia"/>
+        </w:rPr>
+        <w:t>和</w:t>
+      </w:r>
+      <w:r>
+        <w:rPr>
+          <w:rFonts w:hint="eastAsia"/>
+        </w:rPr>
+        <w:t xml:space="preserve"> RGA </w:t>
+      </w:r>
+      <w:r>
+        <w:rPr>
+          <w:rFonts w:hint="eastAsia"/>
+        </w:rPr>
+        <w:t>相关路径则用于支撑硬件优化实验，说明系统已经围绕</w:t>
+      </w:r>
+      <w:r>
+        <w:rPr>
+          <w:rFonts w:hint="eastAsia"/>
+        </w:rPr>
+        <w:t xml:space="preserve"> RK3588 </w:t>
+      </w:r>
+      <w:r>
+        <w:rPr>
+          <w:rFonts w:hint="eastAsia"/>
+        </w:rPr>
+        <w:t>的</w:t>
+      </w:r>
+      <w:r>
+        <w:rPr>
+          <w:rFonts w:hint="eastAsia"/>
+        </w:rPr>
+        <w:t xml:space="preserve"> NPU </w:t>
+      </w:r>
+      <w:r>
+        <w:rPr>
+          <w:rFonts w:hint="eastAsia"/>
+        </w:rPr>
+        <w:t>和</w:t>
+      </w:r>
+      <w:r>
+        <w:rPr>
+          <w:rFonts w:hint="eastAsia"/>
+        </w:rPr>
+        <w:t xml:space="preserve"> RGA </w:t>
+      </w:r>
+      <w:r>
+        <w:rPr>
+          <w:rFonts w:hint="eastAsia"/>
+        </w:rPr>
+        <w:t>资源进行了分层验证。</w:t>
+      </w:r>
+      <w:r>
+        <w:rPr>
+          <w:rFonts w:hint="eastAsia"/>
+        </w:rPr>
+        <w:t xml:space="preserve">Zero-copy </w:t>
+      </w:r>
+      <w:r>
+        <w:rPr>
+          <w:rFonts w:hint="eastAsia"/>
+        </w:rPr>
+        <w:t>和</w:t>
+      </w:r>
+      <w:r>
+        <w:rPr>
+          <w:rFonts w:hint="eastAsia"/>
+        </w:rPr>
+        <w:t xml:space="preserve"> NV12 </w:t>
+      </w:r>
+      <w:r>
+        <w:rPr>
+          <w:rFonts w:hint="eastAsia"/>
+        </w:rPr>
+        <w:t>发布路径虽然已经实现并验证可运行，但由于端到端收益不稳定，本文将其作为后续优化方向而非默认配置。</w:t>
+      </w:r>
+    </w:p>
+    <w:p>
+      <w:pPr>
+        <w:spacing w:before="240" w:after="120" w:line="400" w:lineRule="auto"/>
+        <w:ind w:firstLine="420"/>
+        <w:jc w:val="left"/>
+        <w:outlineLvl w:val="1"/>
+      </w:pPr>
+      <w:bookmarkStart w:id="53" w:name="_Toc228348285"/>
       <w:r>
         <w:rPr>
           <w:rFonts w:eastAsia="黑体"/>
@@ -36272,6 +37929,15 @@
           <w:sz w:val="28"/>
           <w:szCs w:val="28"/>
         </w:rPr>
+        <w:t>5.10</w:t>
+      </w:r>
+      <w:r>
+        <w:rPr>
+          <w:rFonts w:eastAsia="黑体"/>
+          <w:b/>
+          <w:sz w:val="28"/>
+          <w:szCs w:val="28"/>
+        </w:rPr>
         <w:t>本章小结</w:t>
       </w:r>
       <w:bookmarkEnd w:id="53"/>
@@ -36388,81 +38054,139 @@
       <w:pPr>
         <w:spacing w:line="360" w:lineRule="auto"/>
         <w:ind w:firstLine="480"/>
-      </w:pPr>
-      <w:r>
-        <w:rPr>
+        <w:rPr>
+          <w:szCs w:val="24"/>
+        </w:rPr>
+      </w:pPr>
+      <w:r>
+        <w:rPr>
+          <w:rFonts w:hint="eastAsia"/>
           <w:szCs w:val="24"/>
         </w:rPr>
         <w:t>阶段耗时分析进一步指出，当前系统的主要瓶颈不是后处理和画框，而是</w:t>
       </w:r>
       <w:r>
         <w:rPr>
-          <w:szCs w:val="24"/>
-        </w:rPr>
-        <w:t>RKNN</w:t>
-      </w:r>
-      <w:r>
-        <w:rPr>
+          <w:rFonts w:hint="eastAsia"/>
+          <w:szCs w:val="24"/>
+        </w:rPr>
+        <w:t xml:space="preserve"> RKNN </w:t>
+      </w:r>
+      <w:r>
+        <w:rPr>
+          <w:rFonts w:hint="eastAsia"/>
           <w:szCs w:val="24"/>
         </w:rPr>
         <w:t>输入设置、</w:t>
       </w:r>
       <w:r>
         <w:rPr>
-          <w:szCs w:val="24"/>
-        </w:rPr>
-        <w:t>NPU</w:t>
-      </w:r>
-      <w:r>
-        <w:rPr>
+          <w:rFonts w:hint="eastAsia"/>
+          <w:szCs w:val="24"/>
+        </w:rPr>
+        <w:t xml:space="preserve">NPU </w:t>
+      </w:r>
+      <w:r>
+        <w:rPr>
+          <w:rFonts w:hint="eastAsia"/>
           <w:szCs w:val="24"/>
         </w:rPr>
         <w:t>执行和实时调度之间的组合开销。</w:t>
       </w:r>
       <w:r>
         <w:rPr>
+          <w:rFonts w:hint="eastAsia"/>
           <w:szCs w:val="24"/>
         </w:rPr>
         <w:t>RGA cvt+resize</w:t>
       </w:r>
       <w:r>
         <w:rPr>
+          <w:rFonts w:hint="eastAsia"/>
+          <w:szCs w:val="24"/>
+        </w:rPr>
+        <w:t>、</w:t>
+      </w:r>
+      <w:r>
+        <w:rPr>
+          <w:rFonts w:hint="eastAsia"/>
+          <w:szCs w:val="24"/>
+        </w:rPr>
+        <w:t xml:space="preserve">RGA </w:t>
+      </w:r>
+      <w:r>
+        <w:rPr>
+          <w:rFonts w:hint="eastAsia"/>
+          <w:szCs w:val="24"/>
+        </w:rPr>
+        <w:t>帧缩放、</w:t>
+      </w:r>
+      <w:r>
+        <w:rPr>
+          <w:rFonts w:hint="eastAsia"/>
+          <w:szCs w:val="24"/>
+        </w:rPr>
+        <w:t xml:space="preserve">RGA letterbox </w:t>
+      </w:r>
+      <w:r>
+        <w:rPr>
+          <w:rFonts w:hint="eastAsia"/>
           <w:szCs w:val="24"/>
         </w:rPr>
         <w:t>和</w:t>
       </w:r>
       <w:r>
         <w:rPr>
-          <w:szCs w:val="24"/>
-        </w:rPr>
-        <w:t>zero-copy</w:t>
-      </w:r>
-      <w:r>
-        <w:rPr>
-          <w:szCs w:val="24"/>
-        </w:rPr>
-        <w:t>实验表明，硬件输入路径具备继续优化空间，但在成为默认路径前仍需结合输入数据类型、模型量化方式、</w:t>
-      </w:r>
-      <w:r>
-        <w:rPr>
-          <w:szCs w:val="24"/>
-        </w:rPr>
-        <w:t>MPP</w:t>
-      </w:r>
-      <w:r>
-        <w:rPr>
-          <w:szCs w:val="24"/>
-        </w:rPr>
-        <w:t>解码和实时</w:t>
-      </w:r>
-      <w:r>
-        <w:rPr>
-          <w:szCs w:val="24"/>
-        </w:rPr>
-        <w:t>RTSP</w:t>
-      </w:r>
-      <w:r>
-        <w:rPr>
+          <w:rFonts w:hint="eastAsia"/>
+          <w:szCs w:val="24"/>
+        </w:rPr>
+        <w:t xml:space="preserve"> zero-copy </w:t>
+      </w:r>
+      <w:r>
+        <w:rPr>
+          <w:rFonts w:hint="eastAsia"/>
+          <w:szCs w:val="24"/>
+        </w:rPr>
+        <w:t>实验表明，硬件输入路径具备继续优化空间，但不同路径对端到端性能的影响并不一致。在成为默认路径前，仍需结合输入数据类型、模型量化方式、</w:t>
+      </w:r>
+      <w:r>
+        <w:rPr>
+          <w:rFonts w:hint="eastAsia"/>
+          <w:szCs w:val="24"/>
+        </w:rPr>
+        <w:t xml:space="preserve">MPP </w:t>
+      </w:r>
+      <w:r>
+        <w:rPr>
+          <w:rFonts w:hint="eastAsia"/>
+          <w:szCs w:val="24"/>
+        </w:rPr>
+        <w:t>解码、</w:t>
+      </w:r>
+      <w:r>
+        <w:rPr>
+          <w:rFonts w:hint="eastAsia"/>
+          <w:szCs w:val="24"/>
+        </w:rPr>
+        <w:t xml:space="preserve">RGA </w:t>
+      </w:r>
+      <w:r>
+        <w:rPr>
+          <w:rFonts w:hint="eastAsia"/>
+          <w:szCs w:val="24"/>
+        </w:rPr>
+        <w:t>物理连续内存和实时</w:t>
+      </w:r>
+      <w:r>
+        <w:rPr>
+          <w:rFonts w:hint="eastAsia"/>
+          <w:szCs w:val="24"/>
+        </w:rPr>
+        <w:t xml:space="preserve"> RTSP </w:t>
+      </w:r>
+      <w:r>
+        <w:rPr>
+          <w:rFonts w:hint="eastAsia"/>
           <w:szCs w:val="24"/>
         </w:rPr>
         <w:t>链路继续验证。</w:t>
@@ -36477,6 +38201,7 @@
         <w:rPr>
           <w:szCs w:val="24"/>
         </w:rPr>
+        <w:lastRenderedPageBreak/>
         <w:t>总体来看，本文已经形成了较完整的实验链路：模型训练、</w:t>
       </w:r>
       <w:r>
@@ -36527,7 +38252,7 @@
         <w:jc w:val="center"/>
         <w:outlineLvl w:val="0"/>
       </w:pPr>
-      <w:bookmarkStart w:id="54" w:name="_Toc228308203"/>
+      <w:bookmarkStart w:id="54" w:name="_Toc228348286"/>
       <w:r>
         <w:rPr>
           <w:rFonts w:eastAsia="黑体" w:hint="eastAsia"/>
@@ -36569,7 +38294,7 @@
           <w:szCs w:val="24"/>
         </w:rPr>
       </w:pPr>
-      <w:bookmarkStart w:id="55" w:name="_Toc228308204"/>
+      <w:bookmarkStart w:id="55" w:name="_Toc228348287"/>
       <w:r>
         <w:rPr>
           <w:rFonts w:eastAsia="黑体" w:hint="eastAsia"/>
@@ -36763,7 +38488,7 @@
           <w:szCs w:val="24"/>
         </w:rPr>
       </w:pPr>
-      <w:bookmarkStart w:id="56" w:name="_Toc228308205"/>
+      <w:bookmarkStart w:id="56" w:name="_Toc228348288"/>
       <w:r>
         <w:rPr>
           <w:rFonts w:eastAsia="黑体" w:hint="eastAsia"/>
@@ -37065,7 +38790,7 @@
         <w:jc w:val="center"/>
         <w:outlineLvl w:val="0"/>
       </w:pPr>
-      <w:bookmarkStart w:id="57" w:name="_Toc228308206"/>
+      <w:bookmarkStart w:id="57" w:name="_Toc228348289"/>
       <w:r>
         <w:rPr>
           <w:rFonts w:eastAsia="黑体"/>
@@ -37342,7 +39067,7 @@
         <w:jc w:val="center"/>
         <w:outlineLvl w:val="0"/>
       </w:pPr>
-      <w:bookmarkStart w:id="58" w:name="_Toc228308207"/>
+      <w:bookmarkStart w:id="58" w:name="_Toc228348290"/>
       <w:r>
         <w:rPr>
           <w:rFonts w:eastAsia="黑体"/>
@@ -39068,6 +40793,138 @@
       <w:color w:val="404040" w:themeColor="text1" w:themeTint="BF"/>
     </w:rPr>
   </w:style>
+  <w:style w:type="paragraph" w:styleId="TOC4">
+    <w:name w:val="toc 4"/>
+    <w:basedOn w:val="a1"/>
+    <w:next w:val="a1"/>
+    <w:autoRedefine/>
+    <w:uiPriority w:val="39"/>
+    <w:unhideWhenUsed/>
+    <w:rsid w:val="00D835C5"/>
+    <w:pPr>
+      <w:spacing w:after="160" w:line="278" w:lineRule="auto"/>
+      <w:ind w:leftChars="600" w:left="1260"/>
+      <w:jc w:val="left"/>
+    </w:pPr>
+    <w:rPr>
+      <w:rFonts w:asciiTheme="minorHAnsi" w:eastAsiaTheme="minorEastAsia" w:hAnsiTheme="minorHAnsi"/>
+      <w:sz w:val="22"/>
+      <w:szCs w:val="24"/>
+      <w14:ligatures w14:val="standardContextual"/>
+    </w:rPr>
+  </w:style>
+  <w:style w:type="paragraph" w:styleId="TOC5">
+    <w:name w:val="toc 5"/>
+    <w:basedOn w:val="a1"/>
+    <w:next w:val="a1"/>
+    <w:autoRedefine/>
+    <w:uiPriority w:val="39"/>
+    <w:unhideWhenUsed/>
+    <w:rsid w:val="00D835C5"/>
+    <w:pPr>
+      <w:spacing w:after="160" w:line="278" w:lineRule="auto"/>
+      <w:ind w:leftChars="800" w:left="1680"/>
+      <w:jc w:val="left"/>
+    </w:pPr>
+    <w:rPr>
+      <w:rFonts w:asciiTheme="minorHAnsi" w:eastAsiaTheme="minorEastAsia" w:hAnsiTheme="minorHAnsi"/>
+      <w:sz w:val="22"/>
+      <w:szCs w:val="24"/>
+      <w14:ligatures w14:val="standardContextual"/>
+    </w:rPr>
+  </w:style>
+  <w:style w:type="paragraph" w:styleId="TOC6">
+    <w:name w:val="toc 6"/>
+    <w:basedOn w:val="a1"/>
+    <w:next w:val="a1"/>
+    <w:autoRedefine/>
+    <w:uiPriority w:val="39"/>
+    <w:unhideWhenUsed/>
+    <w:rsid w:val="00D835C5"/>
+    <w:pPr>
+      <w:spacing w:after="160" w:line="278" w:lineRule="auto"/>
+      <w:ind w:leftChars="1000" w:left="2100"/>
+      <w:jc w:val="left"/>
+    </w:pPr>
+    <w:rPr>
+      <w:rFonts w:asciiTheme="minorHAnsi" w:eastAsiaTheme="minorEastAsia" w:hAnsiTheme="minorHAnsi"/>
+      <w:sz w:val="22"/>
+      <w:szCs w:val="24"/>
+      <w14:ligatures w14:val="standardContextual"/>
+    </w:rPr>
+  </w:style>
+  <w:style w:type="paragraph" w:styleId="TOC7">
+    <w:name w:val="toc 7"/>
+    <w:basedOn w:val="a1"/>
+    <w:next w:val="a1"/>
+    <w:autoRedefine/>
+    <w:uiPriority w:val="39"/>
+    <w:unhideWhenUsed/>
+    <w:rsid w:val="00D835C5"/>
+    <w:pPr>
+      <w:spacing w:after="160" w:line="278" w:lineRule="auto"/>
+      <w:ind w:leftChars="1200" w:left="2520"/>
+      <w:jc w:val="left"/>
+    </w:pPr>
+    <w:rPr>
+      <w:rFonts w:asciiTheme="minorHAnsi" w:eastAsiaTheme="minorEastAsia" w:hAnsiTheme="minorHAnsi"/>
+      <w:sz w:val="22"/>
+      <w:szCs w:val="24"/>
+      <w14:ligatures w14:val="standardContextual"/>
+    </w:rPr>
+  </w:style>
+  <w:style w:type="paragraph" w:styleId="TOC8">
+    <w:name w:val="toc 8"/>
+    <w:basedOn w:val="a1"/>
+    <w:next w:val="a1"/>
+    <w:autoRedefine/>
+    <w:uiPriority w:val="39"/>
+    <w:unhideWhenUsed/>
+    <w:rsid w:val="00D835C5"/>
+    <w:pPr>
+      <w:spacing w:after="160" w:line="278" w:lineRule="auto"/>
+      <w:ind w:leftChars="1400" w:left="2940"/>
+      <w:jc w:val="left"/>
+    </w:pPr>
+    <w:rPr>
+      <w:rFonts w:asciiTheme="minorHAnsi" w:eastAsiaTheme="minorEastAsia" w:hAnsiTheme="minorHAnsi"/>
+      <w:sz w:val="22"/>
+      <w:szCs w:val="24"/>
+      <w14:ligatures w14:val="standardContextual"/>
+    </w:rPr>
+  </w:style>
+  <w:style w:type="paragraph" w:styleId="TOC9">
+    <w:name w:val="toc 9"/>
+    <w:basedOn w:val="a1"/>
+    <w:next w:val="a1"/>
+    <w:autoRedefine/>
+    <w:uiPriority w:val="39"/>
+    <w:unhideWhenUsed/>
+    <w:rsid w:val="00D835C5"/>
+    <w:pPr>
+      <w:spacing w:after="160" w:line="278" w:lineRule="auto"/>
+      <w:ind w:leftChars="1600" w:left="3360"/>
+      <w:jc w:val="left"/>
+    </w:pPr>
+    <w:rPr>
+      <w:rFonts w:asciiTheme="minorHAnsi" w:eastAsiaTheme="minorEastAsia" w:hAnsiTheme="minorHAnsi"/>
+      <w:sz w:val="22"/>
+      <w:szCs w:val="24"/>
+      <w14:ligatures w14:val="standardContextual"/>
+    </w:rPr>
+  </w:style>
+  <w:style w:type="character" w:styleId="af8">
+    <w:name w:val="Unresolved Mention"/>
+    <w:basedOn w:val="a2"/>
+    <w:uiPriority w:val="99"/>
+    <w:semiHidden/>
+    <w:unhideWhenUsed/>
+    <w:rsid w:val="00D835C5"/>
+    <w:rPr>
+      <w:color w:val="605E5C"/>
+      <w:shd w:val="clear" w:color="auto" w:fill="E1DFDD"/>
+    </w:rPr>
+  </w:style>
 </w:styles>
 </file>
 

</xml_diff>

<commit_message>
Align thesis wording with implemented optimizations
</commit_message>
<xml_diff>
--- a/Thesis Project/paper/full_thesis_latest_merged.docx
+++ b/Thesis Project/paper/full_thesis_latest_merged.docx
@@ -1595,7 +1595,7 @@
         </w:rPr>
         <w:fldChar w:fldCharType="separate"/>
       </w:r>
-      <w:hyperlink w:anchor="_Toc228348232" w:history="1">
+      <w:hyperlink w:anchor="_Toc228349026" w:history="1">
         <w:r>
           <w:rPr>
             <w:rStyle w:val="af3"/>
@@ -1636,7 +1636,7 @@
             <w:noProof/>
             <w:webHidden/>
           </w:rPr>
-          <w:instrText xml:space="preserve"> PAGEREF _Toc228348232 \h </w:instrText>
+          <w:instrText xml:space="preserve"> PAGEREF _Toc228349026 \h </w:instrText>
         </w:r>
         <w:r>
           <w:rPr>
@@ -1679,7 +1679,7 @@
           <w14:ligatures w14:val="standardContextual"/>
         </w:rPr>
       </w:pPr>
-      <w:hyperlink w:anchor="_Toc228348233" w:history="1">
+      <w:hyperlink w:anchor="_Toc228349027" w:history="1">
         <w:r>
           <w:rPr>
             <w:rStyle w:val="af3"/>
@@ -1717,7 +1717,7 @@
             <w:noProof/>
             <w:webHidden/>
           </w:rPr>
-          <w:instrText xml:space="preserve"> PAGEREF _Toc228348233 \h </w:instrText>
+          <w:instrText xml:space="preserve"> PAGEREF _Toc228349027 \h </w:instrText>
         </w:r>
         <w:r>
           <w:rPr>
@@ -1760,7 +1760,7 @@
           <w14:ligatures w14:val="standardContextual"/>
         </w:rPr>
       </w:pPr>
-      <w:hyperlink w:anchor="_Toc228348234" w:history="1">
+      <w:hyperlink w:anchor="_Toc228349028" w:history="1">
         <w:r>
           <w:rPr>
             <w:rStyle w:val="af3"/>
@@ -1798,7 +1798,7 @@
             <w:noProof/>
             <w:webHidden/>
           </w:rPr>
-          <w:instrText xml:space="preserve"> PAGEREF _Toc228348234 \h </w:instrText>
+          <w:instrText xml:space="preserve"> PAGEREF _Toc228349028 \h </w:instrText>
         </w:r>
         <w:r>
           <w:rPr>
@@ -1841,7 +1841,7 @@
           <w14:ligatures w14:val="standardContextual"/>
         </w:rPr>
       </w:pPr>
-      <w:hyperlink w:anchor="_Toc228348235" w:history="1">
+      <w:hyperlink w:anchor="_Toc228349029" w:history="1">
         <w:r>
           <w:rPr>
             <w:rStyle w:val="af3"/>
@@ -1879,7 +1879,7 @@
             <w:noProof/>
             <w:webHidden/>
           </w:rPr>
-          <w:instrText xml:space="preserve"> PAGEREF _Toc228348235 \h </w:instrText>
+          <w:instrText xml:space="preserve"> PAGEREF _Toc228349029 \h </w:instrText>
         </w:r>
         <w:r>
           <w:rPr>
@@ -1922,7 +1922,7 @@
           <w14:ligatures w14:val="standardContextual"/>
         </w:rPr>
       </w:pPr>
-      <w:hyperlink w:anchor="_Toc228348236" w:history="1">
+      <w:hyperlink w:anchor="_Toc228349030" w:history="1">
         <w:r>
           <w:rPr>
             <w:rStyle w:val="af3"/>
@@ -1960,7 +1960,7 @@
             <w:noProof/>
             <w:webHidden/>
           </w:rPr>
-          <w:instrText xml:space="preserve"> PAGEREF _Toc228348236 \h </w:instrText>
+          <w:instrText xml:space="preserve"> PAGEREF _Toc228349030 \h </w:instrText>
         </w:r>
         <w:r>
           <w:rPr>
@@ -2003,7 +2003,7 @@
           <w14:ligatures w14:val="standardContextual"/>
         </w:rPr>
       </w:pPr>
-      <w:hyperlink w:anchor="_Toc228348237" w:history="1">
+      <w:hyperlink w:anchor="_Toc228349031" w:history="1">
         <w:r>
           <w:rPr>
             <w:rStyle w:val="af3"/>
@@ -2047,7 +2047,7 @@
             <w:noProof/>
             <w:webHidden/>
           </w:rPr>
-          <w:instrText xml:space="preserve"> PAGEREF _Toc228348237 \h </w:instrText>
+          <w:instrText xml:space="preserve"> PAGEREF _Toc228349031 \h </w:instrText>
         </w:r>
         <w:r>
           <w:rPr>
@@ -2090,7 +2090,7 @@
           <w14:ligatures w14:val="standardContextual"/>
         </w:rPr>
       </w:pPr>
-      <w:hyperlink w:anchor="_Toc228348238" w:history="1">
+      <w:hyperlink w:anchor="_Toc228349032" w:history="1">
         <w:r>
           <w:rPr>
             <w:rStyle w:val="af3"/>
@@ -2128,7 +2128,7 @@
             <w:noProof/>
             <w:webHidden/>
           </w:rPr>
-          <w:instrText xml:space="preserve"> PAGEREF _Toc228348238 \h </w:instrText>
+          <w:instrText xml:space="preserve"> PAGEREF _Toc228349032 \h </w:instrText>
         </w:r>
         <w:r>
           <w:rPr>
@@ -2171,7 +2171,7 @@
           <w14:ligatures w14:val="standardContextual"/>
         </w:rPr>
       </w:pPr>
-      <w:hyperlink w:anchor="_Toc228348239" w:history="1">
+      <w:hyperlink w:anchor="_Toc228349033" w:history="1">
         <w:r>
           <w:rPr>
             <w:rStyle w:val="af3"/>
@@ -2209,7 +2209,7 @@
             <w:noProof/>
             <w:webHidden/>
           </w:rPr>
-          <w:instrText xml:space="preserve"> PAGEREF _Toc228348239 \h </w:instrText>
+          <w:instrText xml:space="preserve"> PAGEREF _Toc228349033 \h </w:instrText>
         </w:r>
         <w:r>
           <w:rPr>
@@ -2252,7 +2252,7 @@
           <w14:ligatures w14:val="standardContextual"/>
         </w:rPr>
       </w:pPr>
-      <w:hyperlink w:anchor="_Toc228348240" w:history="1">
+      <w:hyperlink w:anchor="_Toc228349034" w:history="1">
         <w:r>
           <w:rPr>
             <w:rStyle w:val="af3"/>
@@ -2290,7 +2290,7 @@
             <w:noProof/>
             <w:webHidden/>
           </w:rPr>
-          <w:instrText xml:space="preserve"> PAGEREF _Toc228348240 \h </w:instrText>
+          <w:instrText xml:space="preserve"> PAGEREF _Toc228349034 \h </w:instrText>
         </w:r>
         <w:r>
           <w:rPr>
@@ -2333,7 +2333,7 @@
           <w14:ligatures w14:val="standardContextual"/>
         </w:rPr>
       </w:pPr>
-      <w:hyperlink w:anchor="_Toc228348241" w:history="1">
+      <w:hyperlink w:anchor="_Toc228349035" w:history="1">
         <w:r>
           <w:rPr>
             <w:rStyle w:val="af3"/>
@@ -2371,7 +2371,7 @@
             <w:noProof/>
             <w:webHidden/>
           </w:rPr>
-          <w:instrText xml:space="preserve"> PAGEREF _Toc228348241 \h </w:instrText>
+          <w:instrText xml:space="preserve"> PAGEREF _Toc228349035 \h </w:instrText>
         </w:r>
         <w:r>
           <w:rPr>
@@ -2414,7 +2414,7 @@
           <w14:ligatures w14:val="standardContextual"/>
         </w:rPr>
       </w:pPr>
-      <w:hyperlink w:anchor="_Toc228348242" w:history="1">
+      <w:hyperlink w:anchor="_Toc228349036" w:history="1">
         <w:r>
           <w:rPr>
             <w:rStyle w:val="af3"/>
@@ -2452,7 +2452,7 @@
             <w:noProof/>
             <w:webHidden/>
           </w:rPr>
-          <w:instrText xml:space="preserve"> PAGEREF _Toc228348242 \h </w:instrText>
+          <w:instrText xml:space="preserve"> PAGEREF _Toc228349036 \h </w:instrText>
         </w:r>
         <w:r>
           <w:rPr>
@@ -2495,7 +2495,7 @@
           <w14:ligatures w14:val="standardContextual"/>
         </w:rPr>
       </w:pPr>
-      <w:hyperlink w:anchor="_Toc228348243" w:history="1">
+      <w:hyperlink w:anchor="_Toc228349037" w:history="1">
         <w:r>
           <w:rPr>
             <w:rStyle w:val="af3"/>
@@ -2533,7 +2533,7 @@
             <w:noProof/>
             <w:webHidden/>
           </w:rPr>
-          <w:instrText xml:space="preserve"> PAGEREF _Toc228348243 \h </w:instrText>
+          <w:instrText xml:space="preserve"> PAGEREF _Toc228349037 \h </w:instrText>
         </w:r>
         <w:r>
           <w:rPr>
@@ -2576,7 +2576,7 @@
           <w14:ligatures w14:val="standardContextual"/>
         </w:rPr>
       </w:pPr>
-      <w:hyperlink w:anchor="_Toc228348244" w:history="1">
+      <w:hyperlink w:anchor="_Toc228349038" w:history="1">
         <w:r>
           <w:rPr>
             <w:rStyle w:val="af3"/>
@@ -2620,7 +2620,7 @@
             <w:noProof/>
             <w:webHidden/>
           </w:rPr>
-          <w:instrText xml:space="preserve"> PAGEREF _Toc228348244 \h </w:instrText>
+          <w:instrText xml:space="preserve"> PAGEREF _Toc228349038 \h </w:instrText>
         </w:r>
         <w:r>
           <w:rPr>
@@ -2663,7 +2663,7 @@
           <w14:ligatures w14:val="standardContextual"/>
         </w:rPr>
       </w:pPr>
-      <w:hyperlink w:anchor="_Toc228348245" w:history="1">
+      <w:hyperlink w:anchor="_Toc228349039" w:history="1">
         <w:r>
           <w:rPr>
             <w:rStyle w:val="af3"/>
@@ -2701,7 +2701,7 @@
             <w:noProof/>
             <w:webHidden/>
           </w:rPr>
-          <w:instrText xml:space="preserve"> PAGEREF _Toc228348245 \h </w:instrText>
+          <w:instrText xml:space="preserve"> PAGEREF _Toc228349039 \h </w:instrText>
         </w:r>
         <w:r>
           <w:rPr>
@@ -2743,7 +2743,7 @@
           <w14:ligatures w14:val="standardContextual"/>
         </w:rPr>
       </w:pPr>
-      <w:hyperlink w:anchor="_Toc228348246" w:history="1">
+      <w:hyperlink w:anchor="_Toc228349040" w:history="1">
         <w:r>
           <w:rPr>
             <w:rStyle w:val="af3"/>
@@ -2781,7 +2781,7 @@
             <w:noProof/>
             <w:webHidden/>
           </w:rPr>
-          <w:instrText xml:space="preserve"> PAGEREF _Toc228348246 \h </w:instrText>
+          <w:instrText xml:space="preserve"> PAGEREF _Toc228349040 \h </w:instrText>
         </w:r>
         <w:r>
           <w:rPr>
@@ -2823,7 +2823,7 @@
           <w14:ligatures w14:val="standardContextual"/>
         </w:rPr>
       </w:pPr>
-      <w:hyperlink w:anchor="_Toc228348247" w:history="1">
+      <w:hyperlink w:anchor="_Toc228349041" w:history="1">
         <w:r>
           <w:rPr>
             <w:rStyle w:val="af3"/>
@@ -2861,7 +2861,7 @@
             <w:noProof/>
             <w:webHidden/>
           </w:rPr>
-          <w:instrText xml:space="preserve"> PAGEREF _Toc228348247 \h </w:instrText>
+          <w:instrText xml:space="preserve"> PAGEREF _Toc228349041 \h </w:instrText>
         </w:r>
         <w:r>
           <w:rPr>
@@ -2903,7 +2903,7 @@
           <w14:ligatures w14:val="standardContextual"/>
         </w:rPr>
       </w:pPr>
-      <w:hyperlink w:anchor="_Toc228348248" w:history="1">
+      <w:hyperlink w:anchor="_Toc228349042" w:history="1">
         <w:r>
           <w:rPr>
             <w:rStyle w:val="af3"/>
@@ -2941,7 +2941,7 @@
             <w:noProof/>
             <w:webHidden/>
           </w:rPr>
-          <w:instrText xml:space="preserve"> PAGEREF _Toc228348248 \h </w:instrText>
+          <w:instrText xml:space="preserve"> PAGEREF _Toc228349042 \h </w:instrText>
         </w:r>
         <w:r>
           <w:rPr>
@@ -2984,7 +2984,7 @@
           <w14:ligatures w14:val="standardContextual"/>
         </w:rPr>
       </w:pPr>
-      <w:hyperlink w:anchor="_Toc228348249" w:history="1">
+      <w:hyperlink w:anchor="_Toc228349043" w:history="1">
         <w:r>
           <w:rPr>
             <w:rStyle w:val="af3"/>
@@ -3022,7 +3022,7 @@
             <w:noProof/>
             <w:webHidden/>
           </w:rPr>
-          <w:instrText xml:space="preserve"> PAGEREF _Toc228348249 \h </w:instrText>
+          <w:instrText xml:space="preserve"> PAGEREF _Toc228349043 \h </w:instrText>
         </w:r>
         <w:r>
           <w:rPr>
@@ -3065,7 +3065,7 @@
           <w14:ligatures w14:val="standardContextual"/>
         </w:rPr>
       </w:pPr>
-      <w:hyperlink w:anchor="_Toc228348250" w:history="1">
+      <w:hyperlink w:anchor="_Toc228349044" w:history="1">
         <w:r>
           <w:rPr>
             <w:rStyle w:val="af3"/>
@@ -3103,7 +3103,7 @@
             <w:noProof/>
             <w:webHidden/>
           </w:rPr>
-          <w:instrText xml:space="preserve"> PAGEREF _Toc228348250 \h </w:instrText>
+          <w:instrText xml:space="preserve"> PAGEREF _Toc228349044 \h </w:instrText>
         </w:r>
         <w:r>
           <w:rPr>
@@ -3145,7 +3145,7 @@
           <w14:ligatures w14:val="standardContextual"/>
         </w:rPr>
       </w:pPr>
-      <w:hyperlink w:anchor="_Toc228348251" w:history="1">
+      <w:hyperlink w:anchor="_Toc228349045" w:history="1">
         <w:r>
           <w:rPr>
             <w:rStyle w:val="af3"/>
@@ -3183,7 +3183,7 @@
             <w:noProof/>
             <w:webHidden/>
           </w:rPr>
-          <w:instrText xml:space="preserve"> PAGEREF _Toc228348251 \h </w:instrText>
+          <w:instrText xml:space="preserve"> PAGEREF _Toc228349045 \h </w:instrText>
         </w:r>
         <w:r>
           <w:rPr>
@@ -3225,7 +3225,7 @@
           <w14:ligatures w14:val="standardContextual"/>
         </w:rPr>
       </w:pPr>
-      <w:hyperlink w:anchor="_Toc228348252" w:history="1">
+      <w:hyperlink w:anchor="_Toc228349046" w:history="1">
         <w:r>
           <w:rPr>
             <w:rStyle w:val="af3"/>
@@ -3263,7 +3263,7 @@
             <w:noProof/>
             <w:webHidden/>
           </w:rPr>
-          <w:instrText xml:space="preserve"> PAGEREF _Toc228348252 \h </w:instrText>
+          <w:instrText xml:space="preserve"> PAGEREF _Toc228349046 \h </w:instrText>
         </w:r>
         <w:r>
           <w:rPr>
@@ -3306,7 +3306,7 @@
           <w14:ligatures w14:val="standardContextual"/>
         </w:rPr>
       </w:pPr>
-      <w:hyperlink w:anchor="_Toc228348253" w:history="1">
+      <w:hyperlink w:anchor="_Toc228349047" w:history="1">
         <w:r>
           <w:rPr>
             <w:rStyle w:val="af3"/>
@@ -3344,7 +3344,7 @@
             <w:noProof/>
             <w:webHidden/>
           </w:rPr>
-          <w:instrText xml:space="preserve"> PAGEREF _Toc228348253 \h </w:instrText>
+          <w:instrText xml:space="preserve"> PAGEREF _Toc228349047 \h </w:instrText>
         </w:r>
         <w:r>
           <w:rPr>
@@ -3386,7 +3386,7 @@
           <w14:ligatures w14:val="standardContextual"/>
         </w:rPr>
       </w:pPr>
-      <w:hyperlink w:anchor="_Toc228348254" w:history="1">
+      <w:hyperlink w:anchor="_Toc228349048" w:history="1">
         <w:r>
           <w:rPr>
             <w:rStyle w:val="af3"/>
@@ -3424,7 +3424,7 @@
             <w:noProof/>
             <w:webHidden/>
           </w:rPr>
-          <w:instrText xml:space="preserve"> PAGEREF _Toc228348254 \h </w:instrText>
+          <w:instrText xml:space="preserve"> PAGEREF _Toc228349048 \h </w:instrText>
         </w:r>
         <w:r>
           <w:rPr>
@@ -3466,7 +3466,7 @@
           <w14:ligatures w14:val="standardContextual"/>
         </w:rPr>
       </w:pPr>
-      <w:hyperlink w:anchor="_Toc228348255" w:history="1">
+      <w:hyperlink w:anchor="_Toc228349049" w:history="1">
         <w:r>
           <w:rPr>
             <w:rStyle w:val="af3"/>
@@ -3504,7 +3504,7 @@
             <w:noProof/>
             <w:webHidden/>
           </w:rPr>
-          <w:instrText xml:space="preserve"> PAGEREF _Toc228348255 \h </w:instrText>
+          <w:instrText xml:space="preserve"> PAGEREF _Toc228349049 \h </w:instrText>
         </w:r>
         <w:r>
           <w:rPr>
@@ -3547,7 +3547,7 @@
           <w14:ligatures w14:val="standardContextual"/>
         </w:rPr>
       </w:pPr>
-      <w:hyperlink w:anchor="_Toc228348256" w:history="1">
+      <w:hyperlink w:anchor="_Toc228349050" w:history="1">
         <w:r>
           <w:rPr>
             <w:rStyle w:val="af3"/>
@@ -3603,7 +3603,7 @@
             <w:noProof/>
             <w:webHidden/>
           </w:rPr>
-          <w:instrText xml:space="preserve"> PAGEREF _Toc228348256 \h </w:instrText>
+          <w:instrText xml:space="preserve"> PAGEREF _Toc228349050 \h </w:instrText>
         </w:r>
         <w:r>
           <w:rPr>
@@ -3645,7 +3645,7 @@
           <w14:ligatures w14:val="standardContextual"/>
         </w:rPr>
       </w:pPr>
-      <w:hyperlink w:anchor="_Toc228348257" w:history="1">
+      <w:hyperlink w:anchor="_Toc228349051" w:history="1">
         <w:r>
           <w:rPr>
             <w:rStyle w:val="af3"/>
@@ -3683,7 +3683,7 @@
             <w:noProof/>
             <w:webHidden/>
           </w:rPr>
-          <w:instrText xml:space="preserve"> PAGEREF _Toc228348257 \h </w:instrText>
+          <w:instrText xml:space="preserve"> PAGEREF _Toc228349051 \h </w:instrText>
         </w:r>
         <w:r>
           <w:rPr>
@@ -3725,7 +3725,7 @@
           <w14:ligatures w14:val="standardContextual"/>
         </w:rPr>
       </w:pPr>
-      <w:hyperlink w:anchor="_Toc228348258" w:history="1">
+      <w:hyperlink w:anchor="_Toc228349052" w:history="1">
         <w:r>
           <w:rPr>
             <w:rStyle w:val="af3"/>
@@ -3781,7 +3781,7 @@
             <w:noProof/>
             <w:webHidden/>
           </w:rPr>
-          <w:instrText xml:space="preserve"> PAGEREF _Toc228348258 \h </w:instrText>
+          <w:instrText xml:space="preserve"> PAGEREF _Toc228349052 \h </w:instrText>
         </w:r>
         <w:r>
           <w:rPr>
@@ -3823,7 +3823,7 @@
           <w14:ligatures w14:val="standardContextual"/>
         </w:rPr>
       </w:pPr>
-      <w:hyperlink w:anchor="_Toc228348259" w:history="1">
+      <w:hyperlink w:anchor="_Toc228349053" w:history="1">
         <w:r>
           <w:rPr>
             <w:rStyle w:val="af3"/>
@@ -3861,7 +3861,7 @@
             <w:noProof/>
             <w:webHidden/>
           </w:rPr>
-          <w:instrText xml:space="preserve"> PAGEREF _Toc228348259 \h </w:instrText>
+          <w:instrText xml:space="preserve"> PAGEREF _Toc228349053 \h </w:instrText>
         </w:r>
         <w:r>
           <w:rPr>
@@ -3904,7 +3904,7 @@
           <w14:ligatures w14:val="standardContextual"/>
         </w:rPr>
       </w:pPr>
-      <w:hyperlink w:anchor="_Toc228348260" w:history="1">
+      <w:hyperlink w:anchor="_Toc228349054" w:history="1">
         <w:r>
           <w:rPr>
             <w:rStyle w:val="af3"/>
@@ -3960,7 +3960,7 @@
             <w:noProof/>
             <w:webHidden/>
           </w:rPr>
-          <w:instrText xml:space="preserve"> PAGEREF _Toc228348260 \h </w:instrText>
+          <w:instrText xml:space="preserve"> PAGEREF _Toc228349054 \h </w:instrText>
         </w:r>
         <w:r>
           <w:rPr>
@@ -4002,7 +4002,7 @@
           <w14:ligatures w14:val="standardContextual"/>
         </w:rPr>
       </w:pPr>
-      <w:hyperlink w:anchor="_Toc228348261" w:history="1">
+      <w:hyperlink w:anchor="_Toc228349055" w:history="1">
         <w:r>
           <w:rPr>
             <w:rStyle w:val="af3"/>
@@ -4058,7 +4058,7 @@
             <w:noProof/>
             <w:webHidden/>
           </w:rPr>
-          <w:instrText xml:space="preserve"> PAGEREF _Toc228348261 \h </w:instrText>
+          <w:instrText xml:space="preserve"> PAGEREF _Toc228349055 \h </w:instrText>
         </w:r>
         <w:r>
           <w:rPr>
@@ -4100,7 +4100,7 @@
           <w14:ligatures w14:val="standardContextual"/>
         </w:rPr>
       </w:pPr>
-      <w:hyperlink w:anchor="_Toc228348262" w:history="1">
+      <w:hyperlink w:anchor="_Toc228349056" w:history="1">
         <w:r>
           <w:rPr>
             <w:rStyle w:val="af3"/>
@@ -4156,7 +4156,7 @@
             <w:noProof/>
             <w:webHidden/>
           </w:rPr>
-          <w:instrText xml:space="preserve"> PAGEREF _Toc228348262 \h </w:instrText>
+          <w:instrText xml:space="preserve"> PAGEREF _Toc228349056 \h </w:instrText>
         </w:r>
         <w:r>
           <w:rPr>
@@ -4198,7 +4198,7 @@
           <w14:ligatures w14:val="standardContextual"/>
         </w:rPr>
       </w:pPr>
-      <w:hyperlink w:anchor="_Toc228348263" w:history="1">
+      <w:hyperlink w:anchor="_Toc228349057" w:history="1">
         <w:r>
           <w:rPr>
             <w:rStyle w:val="af3"/>
@@ -4236,7 +4236,7 @@
             <w:noProof/>
             <w:webHidden/>
           </w:rPr>
-          <w:instrText xml:space="preserve"> PAGEREF _Toc228348263 \h </w:instrText>
+          <w:instrText xml:space="preserve"> PAGEREF _Toc228349057 \h </w:instrText>
         </w:r>
         <w:r>
           <w:rPr>
@@ -4279,7 +4279,7 @@
           <w14:ligatures w14:val="standardContextual"/>
         </w:rPr>
       </w:pPr>
-      <w:hyperlink w:anchor="_Toc228348264" w:history="1">
+      <w:hyperlink w:anchor="_Toc228349058" w:history="1">
         <w:r>
           <w:rPr>
             <w:rStyle w:val="af3"/>
@@ -4317,7 +4317,7 @@
             <w:noProof/>
             <w:webHidden/>
           </w:rPr>
-          <w:instrText xml:space="preserve"> PAGEREF _Toc228348264 \h </w:instrText>
+          <w:instrText xml:space="preserve"> PAGEREF _Toc228349058 \h </w:instrText>
         </w:r>
         <w:r>
           <w:rPr>
@@ -4360,7 +4360,7 @@
           <w14:ligatures w14:val="standardContextual"/>
         </w:rPr>
       </w:pPr>
-      <w:hyperlink w:anchor="_Toc228348265" w:history="1">
+      <w:hyperlink w:anchor="_Toc228349059" w:history="1">
         <w:r>
           <w:rPr>
             <w:rStyle w:val="af3"/>
@@ -4404,7 +4404,7 @@
             <w:noProof/>
             <w:webHidden/>
           </w:rPr>
-          <w:instrText xml:space="preserve"> PAGEREF _Toc228348265 \h </w:instrText>
+          <w:instrText xml:space="preserve"> PAGEREF _Toc228349059 \h </w:instrText>
         </w:r>
         <w:r>
           <w:rPr>
@@ -4447,7 +4447,7 @@
           <w14:ligatures w14:val="standardContextual"/>
         </w:rPr>
       </w:pPr>
-      <w:hyperlink w:anchor="_Toc228348266" w:history="1">
+      <w:hyperlink w:anchor="_Toc228349060" w:history="1">
         <w:r>
           <w:rPr>
             <w:rStyle w:val="af3"/>
@@ -4485,7 +4485,7 @@
             <w:noProof/>
             <w:webHidden/>
           </w:rPr>
-          <w:instrText xml:space="preserve"> PAGEREF _Toc228348266 \h </w:instrText>
+          <w:instrText xml:space="preserve"> PAGEREF _Toc228349060 \h </w:instrText>
         </w:r>
         <w:r>
           <w:rPr>
@@ -4528,7 +4528,7 @@
           <w14:ligatures w14:val="standardContextual"/>
         </w:rPr>
       </w:pPr>
-      <w:hyperlink w:anchor="_Toc228348267" w:history="1">
+      <w:hyperlink w:anchor="_Toc228349061" w:history="1">
         <w:r>
           <w:rPr>
             <w:rStyle w:val="af3"/>
@@ -4584,7 +4584,7 @@
             <w:noProof/>
             <w:webHidden/>
           </w:rPr>
-          <w:instrText xml:space="preserve"> PAGEREF _Toc228348267 \h </w:instrText>
+          <w:instrText xml:space="preserve"> PAGEREF _Toc228349061 \h </w:instrText>
         </w:r>
         <w:r>
           <w:rPr>
@@ -4627,7 +4627,7 @@
           <w14:ligatures w14:val="standardContextual"/>
         </w:rPr>
       </w:pPr>
-      <w:hyperlink w:anchor="_Toc228348268" w:history="1">
+      <w:hyperlink w:anchor="_Toc228349062" w:history="1">
         <w:r>
           <w:rPr>
             <w:rStyle w:val="af3"/>
@@ -4665,7 +4665,7 @@
             <w:noProof/>
             <w:webHidden/>
           </w:rPr>
-          <w:instrText xml:space="preserve"> PAGEREF _Toc228348268 \h </w:instrText>
+          <w:instrText xml:space="preserve"> PAGEREF _Toc228349062 \h </w:instrText>
         </w:r>
         <w:r>
           <w:rPr>
@@ -4708,7 +4708,7 @@
           <w14:ligatures w14:val="standardContextual"/>
         </w:rPr>
       </w:pPr>
-      <w:hyperlink w:anchor="_Toc228348269" w:history="1">
+      <w:hyperlink w:anchor="_Toc228349063" w:history="1">
         <w:r>
           <w:rPr>
             <w:rStyle w:val="af3"/>
@@ -4746,7 +4746,7 @@
             <w:noProof/>
             <w:webHidden/>
           </w:rPr>
-          <w:instrText xml:space="preserve"> PAGEREF _Toc228348269 \h </w:instrText>
+          <w:instrText xml:space="preserve"> PAGEREF _Toc228349063 \h </w:instrText>
         </w:r>
         <w:r>
           <w:rPr>
@@ -4789,7 +4789,7 @@
           <w14:ligatures w14:val="standardContextual"/>
         </w:rPr>
       </w:pPr>
-      <w:hyperlink w:anchor="_Toc228348270" w:history="1">
+      <w:hyperlink w:anchor="_Toc228349064" w:history="1">
         <w:r>
           <w:rPr>
             <w:rStyle w:val="af3"/>
@@ -4845,7 +4845,7 @@
             <w:noProof/>
             <w:webHidden/>
           </w:rPr>
-          <w:instrText xml:space="preserve"> PAGEREF _Toc228348270 \h </w:instrText>
+          <w:instrText xml:space="preserve"> PAGEREF _Toc228349064 \h </w:instrText>
         </w:r>
         <w:r>
           <w:rPr>
@@ -4888,7 +4888,7 @@
           <w14:ligatures w14:val="standardContextual"/>
         </w:rPr>
       </w:pPr>
-      <w:hyperlink w:anchor="_Toc228348271" w:history="1">
+      <w:hyperlink w:anchor="_Toc228349065" w:history="1">
         <w:r>
           <w:rPr>
             <w:rStyle w:val="af3"/>
@@ -4944,7 +4944,7 @@
             <w:noProof/>
             <w:webHidden/>
           </w:rPr>
-          <w:instrText xml:space="preserve"> PAGEREF _Toc228348271 \h </w:instrText>
+          <w:instrText xml:space="preserve"> PAGEREF _Toc228349065 \h </w:instrText>
         </w:r>
         <w:r>
           <w:rPr>
@@ -4987,7 +4987,7 @@
           <w14:ligatures w14:val="standardContextual"/>
         </w:rPr>
       </w:pPr>
-      <w:hyperlink w:anchor="_Toc228348272" w:history="1">
+      <w:hyperlink w:anchor="_Toc228349066" w:history="1">
         <w:r>
           <w:rPr>
             <w:rStyle w:val="af3"/>
@@ -5043,7 +5043,7 @@
             <w:noProof/>
             <w:webHidden/>
           </w:rPr>
-          <w:instrText xml:space="preserve"> PAGEREF _Toc228348272 \h </w:instrText>
+          <w:instrText xml:space="preserve"> PAGEREF _Toc228349066 \h </w:instrText>
         </w:r>
         <w:r>
           <w:rPr>
@@ -5086,7 +5086,7 @@
           <w14:ligatures w14:val="standardContextual"/>
         </w:rPr>
       </w:pPr>
-      <w:hyperlink w:anchor="_Toc228348273" w:history="1">
+      <w:hyperlink w:anchor="_Toc228349067" w:history="1">
         <w:r>
           <w:rPr>
             <w:rStyle w:val="af3"/>
@@ -5124,7 +5124,7 @@
             <w:noProof/>
             <w:webHidden/>
           </w:rPr>
-          <w:instrText xml:space="preserve"> PAGEREF _Toc228348273 \h </w:instrText>
+          <w:instrText xml:space="preserve"> PAGEREF _Toc228349067 \h </w:instrText>
         </w:r>
         <w:r>
           <w:rPr>
@@ -5167,7 +5167,7 @@
           <w14:ligatures w14:val="standardContextual"/>
         </w:rPr>
       </w:pPr>
-      <w:hyperlink w:anchor="_Toc228348274" w:history="1">
+      <w:hyperlink w:anchor="_Toc228349068" w:history="1">
         <w:r>
           <w:rPr>
             <w:rStyle w:val="af3"/>
@@ -5205,7 +5205,7 @@
             <w:noProof/>
             <w:webHidden/>
           </w:rPr>
-          <w:instrText xml:space="preserve"> PAGEREF _Toc228348274 \h </w:instrText>
+          <w:instrText xml:space="preserve"> PAGEREF _Toc228349068 \h </w:instrText>
         </w:r>
         <w:r>
           <w:rPr>
@@ -5248,7 +5248,7 @@
           <w14:ligatures w14:val="standardContextual"/>
         </w:rPr>
       </w:pPr>
-      <w:hyperlink w:anchor="_Toc228348275" w:history="1">
+      <w:hyperlink w:anchor="_Toc228349069" w:history="1">
         <w:r>
           <w:rPr>
             <w:rStyle w:val="af3"/>
@@ -5292,7 +5292,7 @@
             <w:noProof/>
             <w:webHidden/>
           </w:rPr>
-          <w:instrText xml:space="preserve"> PAGEREF _Toc228348275 \h </w:instrText>
+          <w:instrText xml:space="preserve"> PAGEREF _Toc228349069 \h </w:instrText>
         </w:r>
         <w:r>
           <w:rPr>
@@ -5335,7 +5335,7 @@
           <w14:ligatures w14:val="standardContextual"/>
         </w:rPr>
       </w:pPr>
-      <w:hyperlink w:anchor="_Toc228348276" w:history="1">
+      <w:hyperlink w:anchor="_Toc228349070" w:history="1">
         <w:r>
           <w:rPr>
             <w:rStyle w:val="af3"/>
@@ -5373,7 +5373,7 @@
             <w:noProof/>
             <w:webHidden/>
           </w:rPr>
-          <w:instrText xml:space="preserve"> PAGEREF _Toc228348276 \h </w:instrText>
+          <w:instrText xml:space="preserve"> PAGEREF _Toc228349070 \h </w:instrText>
         </w:r>
         <w:r>
           <w:rPr>
@@ -5416,7 +5416,7 @@
           <w14:ligatures w14:val="standardContextual"/>
         </w:rPr>
       </w:pPr>
-      <w:hyperlink w:anchor="_Toc228348277" w:history="1">
+      <w:hyperlink w:anchor="_Toc228349071" w:history="1">
         <w:r>
           <w:rPr>
             <w:rStyle w:val="af3"/>
@@ -5454,7 +5454,7 @@
             <w:noProof/>
             <w:webHidden/>
           </w:rPr>
-          <w:instrText xml:space="preserve"> PAGEREF _Toc228348277 \h </w:instrText>
+          <w:instrText xml:space="preserve"> PAGEREF _Toc228349071 \h </w:instrText>
         </w:r>
         <w:r>
           <w:rPr>
@@ -5497,7 +5497,7 @@
           <w14:ligatures w14:val="standardContextual"/>
         </w:rPr>
       </w:pPr>
-      <w:hyperlink w:anchor="_Toc228348278" w:history="1">
+      <w:hyperlink w:anchor="_Toc228349072" w:history="1">
         <w:r>
           <w:rPr>
             <w:rStyle w:val="af3"/>
@@ -5535,7 +5535,7 @@
             <w:noProof/>
             <w:webHidden/>
           </w:rPr>
-          <w:instrText xml:space="preserve"> PAGEREF _Toc228348278 \h </w:instrText>
+          <w:instrText xml:space="preserve"> PAGEREF _Toc228349072 \h </w:instrText>
         </w:r>
         <w:r>
           <w:rPr>
@@ -5578,7 +5578,7 @@
           <w14:ligatures w14:val="standardContextual"/>
         </w:rPr>
       </w:pPr>
-      <w:hyperlink w:anchor="_Toc228348279" w:history="1">
+      <w:hyperlink w:anchor="_Toc228349073" w:history="1">
         <w:r>
           <w:rPr>
             <w:rStyle w:val="af3"/>
@@ -5634,7 +5634,7 @@
             <w:noProof/>
             <w:webHidden/>
           </w:rPr>
-          <w:instrText xml:space="preserve"> PAGEREF _Toc228348279 \h </w:instrText>
+          <w:instrText xml:space="preserve"> PAGEREF _Toc228349073 \h </w:instrText>
         </w:r>
         <w:r>
           <w:rPr>
@@ -5677,7 +5677,7 @@
           <w14:ligatures w14:val="standardContextual"/>
         </w:rPr>
       </w:pPr>
-      <w:hyperlink w:anchor="_Toc228348280" w:history="1">
+      <w:hyperlink w:anchor="_Toc228349074" w:history="1">
         <w:r>
           <w:rPr>
             <w:rStyle w:val="af3"/>
@@ -5715,7 +5715,7 @@
             <w:noProof/>
             <w:webHidden/>
           </w:rPr>
-          <w:instrText xml:space="preserve"> PAGEREF _Toc228348280 \h </w:instrText>
+          <w:instrText xml:space="preserve"> PAGEREF _Toc228349074 \h </w:instrText>
         </w:r>
         <w:r>
           <w:rPr>
@@ -5758,7 +5758,7 @@
           <w14:ligatures w14:val="standardContextual"/>
         </w:rPr>
       </w:pPr>
-      <w:hyperlink w:anchor="_Toc228348281" w:history="1">
+      <w:hyperlink w:anchor="_Toc228349075" w:history="1">
         <w:r>
           <w:rPr>
             <w:rStyle w:val="af3"/>
@@ -5814,7 +5814,7 @@
             <w:noProof/>
             <w:webHidden/>
           </w:rPr>
-          <w:instrText xml:space="preserve"> PAGEREF _Toc228348281 \h </w:instrText>
+          <w:instrText xml:space="preserve"> PAGEREF _Toc228349075 \h </w:instrText>
         </w:r>
         <w:r>
           <w:rPr>
@@ -5857,7 +5857,7 @@
           <w14:ligatures w14:val="standardContextual"/>
         </w:rPr>
       </w:pPr>
-      <w:hyperlink w:anchor="_Toc228348282" w:history="1">
+      <w:hyperlink w:anchor="_Toc228349076" w:history="1">
         <w:r>
           <w:rPr>
             <w:rStyle w:val="af3"/>
@@ -5895,7 +5895,7 @@
             <w:noProof/>
             <w:webHidden/>
           </w:rPr>
-          <w:instrText xml:space="preserve"> PAGEREF _Toc228348282 \h </w:instrText>
+          <w:instrText xml:space="preserve"> PAGEREF _Toc228349076 \h </w:instrText>
         </w:r>
         <w:r>
           <w:rPr>
@@ -5938,7 +5938,7 @@
           <w14:ligatures w14:val="standardContextual"/>
         </w:rPr>
       </w:pPr>
-      <w:hyperlink w:anchor="_Toc228348283" w:history="1">
+      <w:hyperlink w:anchor="_Toc228349077" w:history="1">
         <w:r>
           <w:rPr>
             <w:rStyle w:val="af3"/>
@@ -5976,7 +5976,7 @@
             <w:noProof/>
             <w:webHidden/>
           </w:rPr>
-          <w:instrText xml:space="preserve"> PAGEREF _Toc228348283 \h </w:instrText>
+          <w:instrText xml:space="preserve"> PAGEREF _Toc228349077 \h </w:instrText>
         </w:r>
         <w:r>
           <w:rPr>
@@ -6019,7 +6019,7 @@
           <w14:ligatures w14:val="standardContextual"/>
         </w:rPr>
       </w:pPr>
-      <w:hyperlink w:anchor="_Toc228348284" w:history="1">
+      <w:hyperlink w:anchor="_Toc228349078" w:history="1">
         <w:r>
           <w:rPr>
             <w:rStyle w:val="af3"/>
@@ -6057,7 +6057,7 @@
             <w:noProof/>
             <w:webHidden/>
           </w:rPr>
-          <w:instrText xml:space="preserve"> PAGEREF _Toc228348284 \h </w:instrText>
+          <w:instrText xml:space="preserve"> PAGEREF _Toc228349078 \h </w:instrText>
         </w:r>
         <w:r>
           <w:rPr>
@@ -6100,7 +6100,7 @@
           <w14:ligatures w14:val="standardContextual"/>
         </w:rPr>
       </w:pPr>
-      <w:hyperlink w:anchor="_Toc228348285" w:history="1">
+      <w:hyperlink w:anchor="_Toc228349079" w:history="1">
         <w:r>
           <w:rPr>
             <w:rStyle w:val="af3"/>
@@ -6138,7 +6138,7 @@
             <w:noProof/>
             <w:webHidden/>
           </w:rPr>
-          <w:instrText xml:space="preserve"> PAGEREF _Toc228348285 \h </w:instrText>
+          <w:instrText xml:space="preserve"> PAGEREF _Toc228349079 \h </w:instrText>
         </w:r>
         <w:r>
           <w:rPr>
@@ -6181,7 +6181,7 @@
           <w14:ligatures w14:val="standardContextual"/>
         </w:rPr>
       </w:pPr>
-      <w:hyperlink w:anchor="_Toc228348286" w:history="1">
+      <w:hyperlink w:anchor="_Toc228349080" w:history="1">
         <w:r>
           <w:rPr>
             <w:rStyle w:val="af3"/>
@@ -6204,7 +6204,16 @@
             <w:b/>
             <w:noProof/>
           </w:rPr>
-          <w:t>总结与展望</w:t>
+          <w:t>总结与展</w:t>
+        </w:r>
+        <w:r>
+          <w:rPr>
+            <w:rStyle w:val="af3"/>
+            <w:b/>
+            <w:noProof/>
+          </w:rPr>
+          <w:lastRenderedPageBreak/>
+          <w:t>望</w:t>
         </w:r>
         <w:r>
           <w:rPr>
@@ -6225,7 +6234,7 @@
             <w:noProof/>
             <w:webHidden/>
           </w:rPr>
-          <w:instrText xml:space="preserve"> PAGEREF _Toc228348286 \h </w:instrText>
+          <w:instrText xml:space="preserve"> PAGEREF _Toc228349080 \h </w:instrText>
         </w:r>
         <w:r>
           <w:rPr>
@@ -6268,7 +6277,7 @@
           <w14:ligatures w14:val="standardContextual"/>
         </w:rPr>
       </w:pPr>
-      <w:hyperlink w:anchor="_Toc228348287" w:history="1">
+      <w:hyperlink w:anchor="_Toc228349081" w:history="1">
         <w:r>
           <w:rPr>
             <w:rStyle w:val="af3"/>
@@ -6306,7 +6315,7 @@
             <w:noProof/>
             <w:webHidden/>
           </w:rPr>
-          <w:instrText xml:space="preserve"> PAGEREF _Toc228348287 \h </w:instrText>
+          <w:instrText xml:space="preserve"> PAGEREF _Toc228349081 \h </w:instrText>
         </w:r>
         <w:r>
           <w:rPr>
@@ -6349,7 +6358,7 @@
           <w14:ligatures w14:val="standardContextual"/>
         </w:rPr>
       </w:pPr>
-      <w:hyperlink w:anchor="_Toc228348288" w:history="1">
+      <w:hyperlink w:anchor="_Toc228349082" w:history="1">
         <w:r>
           <w:rPr>
             <w:rStyle w:val="af3"/>
@@ -6387,7 +6396,7 @@
             <w:noProof/>
             <w:webHidden/>
           </w:rPr>
-          <w:instrText xml:space="preserve"> PAGEREF _Toc228348288 \h </w:instrText>
+          <w:instrText xml:space="preserve"> PAGEREF _Toc228349082 \h </w:instrText>
         </w:r>
         <w:r>
           <w:rPr>
@@ -6430,7 +6439,7 @@
           <w14:ligatures w14:val="standardContextual"/>
         </w:rPr>
       </w:pPr>
-      <w:hyperlink w:anchor="_Toc228348289" w:history="1">
+      <w:hyperlink w:anchor="_Toc228349083" w:history="1">
         <w:r>
           <w:rPr>
             <w:rStyle w:val="af3"/>
@@ -6458,7 +6467,7 @@
             <w:noProof/>
             <w:webHidden/>
           </w:rPr>
-          <w:instrText xml:space="preserve"> PAGEREF _Toc228348289 \h </w:instrText>
+          <w:instrText xml:space="preserve"> PAGEREF _Toc228349083 \h </w:instrText>
         </w:r>
         <w:r>
           <w:rPr>
@@ -6501,7 +6510,7 @@
           <w14:ligatures w14:val="standardContextual"/>
         </w:rPr>
       </w:pPr>
-      <w:hyperlink w:anchor="_Toc228348290" w:history="1">
+      <w:hyperlink w:anchor="_Toc228349084" w:history="1">
         <w:r>
           <w:rPr>
             <w:rStyle w:val="af3"/>
@@ -6529,7 +6538,7 @@
             <w:noProof/>
             <w:webHidden/>
           </w:rPr>
-          <w:instrText xml:space="preserve"> PAGEREF _Toc228348290 \h </w:instrText>
+          <w:instrText xml:space="preserve"> PAGEREF _Toc228349084 \h </w:instrText>
         </w:r>
         <w:r>
           <w:rPr>
@@ -6576,7 +6585,7 @@
         </w:rPr>
         <w:fldChar w:fldCharType="end"/>
       </w:r>
-      <w:bookmarkStart w:id="0" w:name="_Toc228348232"/>
+      <w:bookmarkStart w:id="0" w:name="_Toc228349026"/>
       <w:r>
         <w:rPr>
           <w:rFonts w:cs="Times New Roman"/>
@@ -6605,7 +6614,7 @@
         <w:spacing w:before="240" w:after="120" w:line="360" w:lineRule="auto"/>
         <w:outlineLvl w:val="1"/>
       </w:pPr>
-      <w:bookmarkStart w:id="1" w:name="_Toc228348233"/>
+      <w:bookmarkStart w:id="1" w:name="_Toc228349027"/>
       <w:r>
         <w:rPr>
           <w:rFonts w:eastAsia="黑体"/>
@@ -6707,14 +6716,7 @@
         <w:rPr>
           <w:szCs w:val="24"/>
         </w:rPr>
-        <w:t>），具备较强的端侧推理能力，适合用于构建实时目标检测系统。然而，在实际部署中，模型格式转换、算子兼容、输入输出张量解析、视频流处理、多线程调度和硬件资源利用之间存在紧密耦合，单纯完成模型转换并不</w:t>
-      </w:r>
-      <w:r>
-        <w:rPr>
-          <w:szCs w:val="24"/>
-        </w:rPr>
-        <w:lastRenderedPageBreak/>
-        <w:t>能保证系统达到实时运行效果。</w:t>
+        <w:t>），具备较强的端侧推理能力，适合用于构建实时目标检测系统。然而，在实际部署中，模型格式转换、算子兼容、输入输出张量解析、视频流处理、多线程调度和硬件资源利用之间存在紧密耦合，单纯完成模型转换并不能保证系统达到实时运行效果。</w:t>
       </w:r>
     </w:p>
     <w:p>
@@ -6812,7 +6814,7 @@
         <w:spacing w:before="240" w:after="120" w:line="360" w:lineRule="auto"/>
         <w:outlineLvl w:val="1"/>
       </w:pPr>
-      <w:bookmarkStart w:id="2" w:name="_Toc228348234"/>
+      <w:bookmarkStart w:id="2" w:name="_Toc228349028"/>
       <w:r>
         <w:rPr>
           <w:rFonts w:eastAsia="黑体"/>
@@ -6860,7 +6862,14 @@
         <w:rPr>
           <w:szCs w:val="24"/>
         </w:rPr>
-        <w:t>系列为代表的一阶段检测算法具有结构简洁、推理速度快和工程部署方便等特点，在实时检测任务中应用广泛</w:t>
+        <w:t>系列为代表的一阶段检测算法具有结构简洁、推理速度</w:t>
+      </w:r>
+      <w:r>
+        <w:rPr>
+          <w:szCs w:val="24"/>
+        </w:rPr>
+        <w:lastRenderedPageBreak/>
+        <w:t>快和工程部署方便等特点，在实时检测任务中应用广泛</w:t>
       </w:r>
       <w:r>
         <w:rPr>
@@ -7015,7 +7024,7 @@
         <w:spacing w:before="240" w:after="120" w:line="360" w:lineRule="auto"/>
         <w:outlineLvl w:val="1"/>
       </w:pPr>
-      <w:bookmarkStart w:id="3" w:name="_Toc228348235"/>
+      <w:bookmarkStart w:id="3" w:name="_Toc228349029"/>
       <w:r>
         <w:rPr>
           <w:rFonts w:eastAsia="黑体"/>
@@ -7145,7 +7154,6 @@
         <w:rPr>
           <w:szCs w:val="24"/>
         </w:rPr>
-        <w:lastRenderedPageBreak/>
         <w:t xml:space="preserve">2. </w:t>
       </w:r>
       <w:r>
@@ -7373,7 +7381,7 @@
         <w:spacing w:before="240" w:after="120" w:line="360" w:lineRule="auto"/>
         <w:outlineLvl w:val="1"/>
       </w:pPr>
-      <w:bookmarkStart w:id="4" w:name="_Toc228348236"/>
+      <w:bookmarkStart w:id="4" w:name="_Toc228349030"/>
       <w:r>
         <w:rPr>
           <w:rFonts w:eastAsia="黑体"/>
@@ -7381,6 +7389,7 @@
           <w:sz w:val="28"/>
           <w:szCs w:val="28"/>
         </w:rPr>
+        <w:lastRenderedPageBreak/>
         <w:t>1.4</w:t>
       </w:r>
       <w:r>
@@ -7544,7 +7553,7 @@
           <w:rFonts w:hint="eastAsia"/>
           <w:szCs w:val="24"/>
         </w:rPr>
-        <w:t>量化、</w:t>
+        <w:t>量化、完整</w:t>
       </w:r>
       <w:r>
         <w:rPr>
@@ -7558,7 +7567,7 @@
           <w:rFonts w:hint="eastAsia"/>
           <w:szCs w:val="24"/>
         </w:rPr>
-        <w:t>硬件预处理、</w:t>
+        <w:t>硬件预处理闭环、</w:t>
       </w:r>
       <w:r>
         <w:rPr>
@@ -7572,7 +7581,14 @@
           <w:rFonts w:hint="eastAsia"/>
           <w:szCs w:val="24"/>
         </w:rPr>
-        <w:t>闭环控制和真实飞行测试等后续方向进行展望。</w:t>
+        <w:t>闭环控制和真实飞行测试等后续方向</w:t>
+      </w:r>
+      <w:r>
+        <w:rPr>
+          <w:rFonts w:hint="eastAsia"/>
+          <w:szCs w:val="24"/>
+        </w:rPr>
+        <w:t>进行展望。</w:t>
       </w:r>
     </w:p>
     <w:p>
@@ -7586,7 +7602,7 @@
         <w:jc w:val="center"/>
         <w:outlineLvl w:val="0"/>
       </w:pPr>
-      <w:bookmarkStart w:id="5" w:name="_Toc228348237"/>
+      <w:bookmarkStart w:id="5" w:name="_Toc228349031"/>
       <w:r>
         <w:rPr>
           <w:rFonts w:eastAsia="黑体"/>
@@ -7622,7 +7638,7 @@
         <w:spacing w:before="240" w:after="120" w:line="360" w:lineRule="auto"/>
         <w:outlineLvl w:val="1"/>
       </w:pPr>
-      <w:bookmarkStart w:id="6" w:name="_Toc228348238"/>
+      <w:bookmarkStart w:id="6" w:name="_Toc228349032"/>
       <w:r>
         <w:rPr>
           <w:rFonts w:eastAsia="黑体"/>
@@ -7689,14 +7705,7 @@
         <w:rPr>
           <w:szCs w:val="24"/>
         </w:rPr>
-        <w:t>该类算法具有推理速度快、部署链路成熟和工</w:t>
-      </w:r>
-      <w:r>
-        <w:rPr>
-          <w:szCs w:val="24"/>
-        </w:rPr>
-        <w:lastRenderedPageBreak/>
-        <w:t>程生态完善等优点，因此常被用于实时检测场景。本文所使用的无人机检测模型属于单类别目标检测模型，板端后处理重点集中在边界框解析、置信度筛选、非极大值抑制和坐标还原等步骤。</w:t>
+        <w:t>该类算法具有推理速度快、部署链路成熟和工程生态完善等优点，因此常被用于实时检测场景。本文所使用的无人机检测模型属于单类别目标检测模型，板端后处理重点集中在边界框解析、置信度筛选、非极大值抑制和坐标还原等步骤。</w:t>
       </w:r>
     </w:p>
     <w:p>
@@ -7704,7 +7713,7 @@
         <w:spacing w:before="240" w:after="120" w:line="360" w:lineRule="auto"/>
         <w:outlineLvl w:val="1"/>
       </w:pPr>
-      <w:bookmarkStart w:id="7" w:name="_Toc228348239"/>
+      <w:bookmarkStart w:id="7" w:name="_Toc228349033"/>
       <w:r>
         <w:rPr>
           <w:rFonts w:eastAsia="黑体"/>
@@ -7785,7 +7794,7 @@
         <w:spacing w:before="240" w:after="120" w:line="360" w:lineRule="auto"/>
         <w:outlineLvl w:val="1"/>
       </w:pPr>
-      <w:bookmarkStart w:id="8" w:name="_Toc228348240"/>
+      <w:bookmarkStart w:id="8" w:name="_Toc228349034"/>
       <w:r>
         <w:rPr>
           <w:rFonts w:eastAsia="黑体"/>
@@ -8648,7 +8657,7 @@
         <w:spacing w:before="240" w:after="120" w:line="360" w:lineRule="auto"/>
         <w:outlineLvl w:val="1"/>
       </w:pPr>
-      <w:bookmarkStart w:id="9" w:name="_Toc228348241"/>
+      <w:bookmarkStart w:id="9" w:name="_Toc228349035"/>
       <w:r>
         <w:rPr>
           <w:rFonts w:eastAsia="黑体"/>
@@ -8868,7 +8877,7 @@
         <w:spacing w:before="240" w:after="120" w:line="360" w:lineRule="auto"/>
         <w:outlineLvl w:val="1"/>
       </w:pPr>
-      <w:bookmarkStart w:id="10" w:name="_Toc228348242"/>
+      <w:bookmarkStart w:id="10" w:name="_Toc228349036"/>
       <w:r>
         <w:rPr>
           <w:rFonts w:eastAsia="黑体"/>
@@ -9051,7 +9060,7 @@
         <w:spacing w:before="240" w:after="120" w:line="360" w:lineRule="auto"/>
         <w:outlineLvl w:val="1"/>
       </w:pPr>
-      <w:bookmarkStart w:id="11" w:name="_Toc228348243"/>
+      <w:bookmarkStart w:id="11" w:name="_Toc228349037"/>
       <w:r>
         <w:rPr>
           <w:rFonts w:eastAsia="黑体"/>
@@ -9137,7 +9146,7 @@
         <w:jc w:val="center"/>
         <w:outlineLvl w:val="0"/>
       </w:pPr>
-      <w:bookmarkStart w:id="12" w:name="_Toc228348244"/>
+      <w:bookmarkStart w:id="12" w:name="_Toc228349038"/>
       <w:r>
         <w:rPr>
           <w:rFonts w:eastAsia="黑体"/>
@@ -9329,7 +9338,7 @@
         <w:spacing w:before="240" w:after="120" w:line="360" w:lineRule="auto"/>
         <w:outlineLvl w:val="1"/>
       </w:pPr>
-      <w:bookmarkStart w:id="13" w:name="_Toc228348245"/>
+      <w:bookmarkStart w:id="13" w:name="_Toc228349039"/>
       <w:r>
         <w:rPr>
           <w:rFonts w:eastAsia="黑体"/>
@@ -9355,7 +9364,7 @@
         <w:spacing w:before="180" w:after="80" w:line="360" w:lineRule="auto"/>
         <w:outlineLvl w:val="2"/>
       </w:pPr>
-      <w:bookmarkStart w:id="14" w:name="_Toc228348246"/>
+      <w:bookmarkStart w:id="14" w:name="_Toc228349040"/>
       <w:r>
         <w:rPr>
           <w:rFonts w:eastAsia="黑体"/>
@@ -10175,7 +10184,7 @@
         <w:spacing w:before="180" w:after="80" w:line="360" w:lineRule="auto"/>
         <w:outlineLvl w:val="2"/>
       </w:pPr>
-      <w:bookmarkStart w:id="15" w:name="_Toc228348247"/>
+      <w:bookmarkStart w:id="15" w:name="_Toc228349041"/>
       <w:r>
         <w:rPr>
           <w:rFonts w:eastAsia="黑体"/>
@@ -11002,7 +11011,7 @@
         <w:spacing w:before="180" w:after="80" w:line="360" w:lineRule="auto"/>
         <w:outlineLvl w:val="2"/>
       </w:pPr>
-      <w:bookmarkStart w:id="16" w:name="_Toc228348248"/>
+      <w:bookmarkStart w:id="16" w:name="_Toc228349042"/>
       <w:r>
         <w:rPr>
           <w:rFonts w:eastAsia="黑体"/>
@@ -11223,7 +11232,7 @@
         <w:rPr>
           <w:szCs w:val="24"/>
         </w:rPr>
-        <w:t>量化优化和</w:t>
+        <w:t>量化优化和完整</w:t>
       </w:r>
       <w:r>
         <w:rPr>
@@ -11235,7 +11244,7 @@
         <w:rPr>
           <w:szCs w:val="24"/>
         </w:rPr>
-        <w:t>硬件预处理作为后续扩展方向，不在本章中作为已完成主线进行描述。</w:t>
+        <w:t>硬件预处理闭环作为后续扩展方向，不在本章中作为已完成主线进行描述。</w:t>
       </w:r>
     </w:p>
     <w:p>
@@ -11243,7 +11252,7 @@
         <w:spacing w:before="240" w:after="120" w:line="360" w:lineRule="auto"/>
         <w:outlineLvl w:val="1"/>
       </w:pPr>
-      <w:bookmarkStart w:id="17" w:name="_Toc228348249"/>
+      <w:bookmarkStart w:id="17" w:name="_Toc228349043"/>
       <w:r>
         <w:rPr>
           <w:rFonts w:eastAsia="黑体"/>
@@ -11554,7 +11563,7 @@
         <w:spacing w:before="240" w:after="120" w:line="360" w:lineRule="auto"/>
         <w:outlineLvl w:val="1"/>
       </w:pPr>
-      <w:bookmarkStart w:id="18" w:name="_Toc228348250"/>
+      <w:bookmarkStart w:id="18" w:name="_Toc228349044"/>
       <w:r>
         <w:rPr>
           <w:rFonts w:eastAsia="黑体"/>
@@ -11580,7 +11589,7 @@
         <w:spacing w:before="180" w:after="80" w:line="360" w:lineRule="auto"/>
         <w:outlineLvl w:val="2"/>
       </w:pPr>
-      <w:bookmarkStart w:id="19" w:name="_Toc228348251"/>
+      <w:bookmarkStart w:id="19" w:name="_Toc228349045"/>
       <w:r>
         <w:rPr>
           <w:rFonts w:eastAsia="黑体"/>
@@ -12145,7 +12154,7 @@
         <w:spacing w:before="180" w:after="80" w:line="360" w:lineRule="auto"/>
         <w:outlineLvl w:val="2"/>
       </w:pPr>
-      <w:bookmarkStart w:id="20" w:name="_Toc228348252"/>
+      <w:bookmarkStart w:id="20" w:name="_Toc228349046"/>
       <w:r>
         <w:rPr>
           <w:rFonts w:eastAsia="黑体"/>
@@ -12327,7 +12336,7 @@
         <w:spacing w:before="240" w:after="120" w:line="360" w:lineRule="auto"/>
         <w:outlineLvl w:val="1"/>
       </w:pPr>
-      <w:bookmarkStart w:id="21" w:name="_Toc228348253"/>
+      <w:bookmarkStart w:id="21" w:name="_Toc228349047"/>
       <w:r>
         <w:rPr>
           <w:rFonts w:eastAsia="黑体"/>
@@ -12353,7 +12362,7 @@
         <w:spacing w:before="180" w:after="80" w:line="360" w:lineRule="auto"/>
         <w:outlineLvl w:val="2"/>
       </w:pPr>
-      <w:bookmarkStart w:id="22" w:name="_Toc228348254"/>
+      <w:bookmarkStart w:id="22" w:name="_Toc228349048"/>
       <w:r>
         <w:rPr>
           <w:rFonts w:eastAsia="黑体"/>
@@ -12499,7 +12508,7 @@
         <w:spacing w:before="180" w:after="80" w:line="360" w:lineRule="auto"/>
         <w:outlineLvl w:val="2"/>
       </w:pPr>
-      <w:bookmarkStart w:id="23" w:name="_Toc228348255"/>
+      <w:bookmarkStart w:id="23" w:name="_Toc228349049"/>
       <w:r>
         <w:rPr>
           <w:rFonts w:eastAsia="黑体"/>
@@ -12614,7 +12623,7 @@
         <w:spacing w:before="240" w:after="120" w:line="360" w:lineRule="auto"/>
         <w:outlineLvl w:val="1"/>
       </w:pPr>
-      <w:bookmarkStart w:id="24" w:name="_Toc228348256"/>
+      <w:bookmarkStart w:id="24" w:name="_Toc228349050"/>
       <w:r>
         <w:rPr>
           <w:rFonts w:eastAsia="黑体"/>
@@ -12658,7 +12667,7 @@
         <w:spacing w:before="180" w:after="80" w:line="360" w:lineRule="auto"/>
         <w:outlineLvl w:val="2"/>
       </w:pPr>
-      <w:bookmarkStart w:id="25" w:name="_Toc228348257"/>
+      <w:bookmarkStart w:id="25" w:name="_Toc228349051"/>
       <w:r>
         <w:rPr>
           <w:rFonts w:eastAsia="黑体"/>
@@ -12908,7 +12917,7 @@
         <w:spacing w:before="180" w:after="80" w:line="360" w:lineRule="auto"/>
         <w:outlineLvl w:val="2"/>
       </w:pPr>
-      <w:bookmarkStart w:id="26" w:name="_Toc228348258"/>
+      <w:bookmarkStart w:id="26" w:name="_Toc228349052"/>
       <w:r>
         <w:rPr>
           <w:rFonts w:eastAsia="黑体"/>
@@ -13044,7 +13053,7 @@
         <w:spacing w:before="180" w:after="80" w:line="360" w:lineRule="auto"/>
         <w:outlineLvl w:val="2"/>
       </w:pPr>
-      <w:bookmarkStart w:id="27" w:name="_Toc228348259"/>
+      <w:bookmarkStart w:id="27" w:name="_Toc228349053"/>
       <w:r>
         <w:rPr>
           <w:rFonts w:eastAsia="黑体"/>
@@ -13351,7 +13360,7 @@
         <w:spacing w:before="240" w:after="120" w:line="360" w:lineRule="auto"/>
         <w:outlineLvl w:val="1"/>
       </w:pPr>
-      <w:bookmarkStart w:id="28" w:name="_Toc228348260"/>
+      <w:bookmarkStart w:id="28" w:name="_Toc228349054"/>
       <w:r>
         <w:rPr>
           <w:rFonts w:eastAsia="黑体"/>
@@ -13395,7 +13404,7 @@
         <w:spacing w:before="180" w:after="80" w:line="360" w:lineRule="auto"/>
         <w:outlineLvl w:val="2"/>
       </w:pPr>
-      <w:bookmarkStart w:id="29" w:name="_Toc228348261"/>
+      <w:bookmarkStart w:id="29" w:name="_Toc228349055"/>
       <w:r>
         <w:rPr>
           <w:rFonts w:eastAsia="黑体"/>
@@ -13692,7 +13701,7 @@
         <w:spacing w:before="180" w:after="80" w:line="360" w:lineRule="auto"/>
         <w:outlineLvl w:val="2"/>
       </w:pPr>
-      <w:bookmarkStart w:id="30" w:name="_Toc228348262"/>
+      <w:bookmarkStart w:id="30" w:name="_Toc228349056"/>
       <w:r>
         <w:rPr>
           <w:rFonts w:eastAsia="黑体"/>
@@ -13924,7 +13933,7 @@
         <w:spacing w:before="180" w:after="80" w:line="360" w:lineRule="auto"/>
         <w:outlineLvl w:val="2"/>
       </w:pPr>
-      <w:bookmarkStart w:id="31" w:name="_Toc228348263"/>
+      <w:bookmarkStart w:id="31" w:name="_Toc228349057"/>
       <w:r>
         <w:rPr>
           <w:rFonts w:eastAsia="黑体"/>
@@ -14051,7 +14060,7 @@
         <w:spacing w:before="240" w:after="120" w:line="360" w:lineRule="auto"/>
         <w:outlineLvl w:val="1"/>
       </w:pPr>
-      <w:bookmarkStart w:id="32" w:name="_Toc228348264"/>
+      <w:bookmarkStart w:id="32" w:name="_Toc228349058"/>
       <w:r>
         <w:rPr>
           <w:rFonts w:eastAsia="黑体"/>
@@ -14215,7 +14224,7 @@
         <w:jc w:val="center"/>
         <w:outlineLvl w:val="0"/>
       </w:pPr>
-      <w:bookmarkStart w:id="33" w:name="_Toc228348265"/>
+      <w:bookmarkStart w:id="33" w:name="_Toc228349059"/>
       <w:r>
         <w:rPr>
           <w:rFonts w:eastAsia="黑体"/>
@@ -14371,7 +14380,7 @@
         <w:spacing w:before="240" w:after="120" w:line="360" w:lineRule="auto"/>
         <w:outlineLvl w:val="1"/>
       </w:pPr>
-      <w:bookmarkStart w:id="34" w:name="_Toc228348266"/>
+      <w:bookmarkStart w:id="34" w:name="_Toc228349060"/>
       <w:r>
         <w:rPr>
           <w:rFonts w:eastAsia="黑体"/>
@@ -15664,7 +15673,7 @@
         <w:spacing w:before="240" w:after="120" w:line="360" w:lineRule="auto"/>
         <w:outlineLvl w:val="1"/>
       </w:pPr>
-      <w:bookmarkStart w:id="35" w:name="_Toc228348267"/>
+      <w:bookmarkStart w:id="35" w:name="_Toc228349061"/>
       <w:r>
         <w:rPr>
           <w:rFonts w:eastAsia="黑体"/>
@@ -16581,7 +16590,7 @@
         <w:spacing w:before="240" w:after="120" w:line="360" w:lineRule="auto"/>
         <w:outlineLvl w:val="1"/>
       </w:pPr>
-      <w:bookmarkStart w:id="36" w:name="_Toc228348268"/>
+      <w:bookmarkStart w:id="36" w:name="_Toc228349062"/>
       <w:r>
         <w:rPr>
           <w:rFonts w:eastAsia="黑体"/>
@@ -17889,7 +17898,7 @@
         <w:spacing w:before="240" w:after="120" w:line="360" w:lineRule="auto"/>
         <w:outlineLvl w:val="1"/>
       </w:pPr>
-      <w:bookmarkStart w:id="37" w:name="_Toc228348269"/>
+      <w:bookmarkStart w:id="37" w:name="_Toc228349063"/>
       <w:r>
         <w:rPr>
           <w:rFonts w:eastAsia="黑体"/>
@@ -18383,7 +18392,7 @@
         <w:spacing w:before="240" w:after="120" w:line="360" w:lineRule="auto"/>
         <w:outlineLvl w:val="1"/>
       </w:pPr>
-      <w:bookmarkStart w:id="38" w:name="_Toc228348270"/>
+      <w:bookmarkStart w:id="38" w:name="_Toc228349064"/>
       <w:r>
         <w:rPr>
           <w:rFonts w:eastAsia="黑体"/>
@@ -19191,7 +19200,7 @@
         <w:spacing w:before="240" w:after="120" w:line="360" w:lineRule="auto"/>
         <w:outlineLvl w:val="1"/>
       </w:pPr>
-      <w:bookmarkStart w:id="39" w:name="_Toc228348271"/>
+      <w:bookmarkStart w:id="39" w:name="_Toc228349065"/>
       <w:r>
         <w:rPr>
           <w:rFonts w:eastAsia="黑体"/>
@@ -20639,7 +20648,7 @@
         <w:spacing w:before="240" w:after="120" w:line="360" w:lineRule="auto"/>
         <w:outlineLvl w:val="1"/>
       </w:pPr>
-      <w:bookmarkStart w:id="40" w:name="_Toc228348272"/>
+      <w:bookmarkStart w:id="40" w:name="_Toc228349066"/>
       <w:r>
         <w:rPr>
           <w:rFonts w:eastAsia="黑体"/>
@@ -21777,7 +21786,7 @@
         <w:spacing w:before="240" w:after="120" w:line="360" w:lineRule="auto"/>
         <w:outlineLvl w:val="1"/>
       </w:pPr>
-      <w:bookmarkStart w:id="41" w:name="_Toc228348273"/>
+      <w:bookmarkStart w:id="41" w:name="_Toc228349067"/>
       <w:r>
         <w:rPr>
           <w:rFonts w:eastAsia="黑体"/>
@@ -22249,7 +22258,7 @@
         <w:spacing w:before="240" w:after="120" w:line="360" w:lineRule="auto"/>
         <w:outlineLvl w:val="1"/>
       </w:pPr>
-      <w:bookmarkStart w:id="42" w:name="_Toc228348274"/>
+      <w:bookmarkStart w:id="42" w:name="_Toc228349068"/>
       <w:r>
         <w:rPr>
           <w:rFonts w:eastAsia="黑体"/>
@@ -22570,7 +22579,7 @@
         <w:jc w:val="center"/>
         <w:outlineLvl w:val="0"/>
       </w:pPr>
-      <w:bookmarkStart w:id="43" w:name="_Toc228348275"/>
+      <w:bookmarkStart w:id="43" w:name="_Toc228349069"/>
       <w:r>
         <w:rPr>
           <w:rFonts w:eastAsia="黑体"/>
@@ -22726,7 +22735,7 @@
         <w:spacing w:before="240" w:after="120" w:line="360" w:lineRule="auto"/>
         <w:outlineLvl w:val="1"/>
       </w:pPr>
-      <w:bookmarkStart w:id="44" w:name="_Toc228348276"/>
+      <w:bookmarkStart w:id="44" w:name="_Toc228349070"/>
       <w:r>
         <w:rPr>
           <w:rFonts w:eastAsia="黑体"/>
@@ -24937,7 +24946,7 @@
         <w:spacing w:before="240" w:after="120" w:line="360" w:lineRule="auto"/>
         <w:outlineLvl w:val="1"/>
       </w:pPr>
-      <w:bookmarkStart w:id="45" w:name="_Toc228348277"/>
+      <w:bookmarkStart w:id="45" w:name="_Toc228349071"/>
       <w:r>
         <w:rPr>
           <w:rFonts w:eastAsia="黑体"/>
@@ -25804,7 +25813,7 @@
         <w:spacing w:before="240" w:after="120" w:line="360" w:lineRule="auto"/>
         <w:outlineLvl w:val="1"/>
       </w:pPr>
-      <w:bookmarkStart w:id="46" w:name="_Toc228348278"/>
+      <w:bookmarkStart w:id="46" w:name="_Toc228349072"/>
       <w:r>
         <w:rPr>
           <w:rFonts w:eastAsia="黑体"/>
@@ -26707,7 +26716,7 @@
         <w:spacing w:before="240" w:after="120" w:line="360" w:lineRule="auto"/>
         <w:outlineLvl w:val="1"/>
       </w:pPr>
-      <w:bookmarkStart w:id="47" w:name="_Toc228348279"/>
+      <w:bookmarkStart w:id="47" w:name="_Toc228349073"/>
       <w:r>
         <w:rPr>
           <w:rFonts w:eastAsia="黑体"/>
@@ -27915,7 +27924,7 @@
         <w:spacing w:before="240" w:after="120" w:line="360" w:lineRule="auto"/>
         <w:outlineLvl w:val="1"/>
       </w:pPr>
-      <w:bookmarkStart w:id="48" w:name="_Toc228348280"/>
+      <w:bookmarkStart w:id="48" w:name="_Toc228349074"/>
       <w:r>
         <w:rPr>
           <w:rFonts w:eastAsia="黑体"/>
@@ -30166,7 +30175,7 @@
         <w:spacing w:before="240" w:after="120" w:line="360" w:lineRule="auto"/>
         <w:outlineLvl w:val="1"/>
       </w:pPr>
-      <w:bookmarkStart w:id="49" w:name="_Toc228348281"/>
+      <w:bookmarkStart w:id="49" w:name="_Toc228349075"/>
       <w:r>
         <w:rPr>
           <w:rFonts w:eastAsia="黑体"/>
@@ -32156,7 +32165,7 @@
         <w:spacing w:before="240" w:after="120" w:line="360" w:lineRule="auto"/>
         <w:outlineLvl w:val="1"/>
       </w:pPr>
-      <w:bookmarkStart w:id="50" w:name="_Toc228348282"/>
+      <w:bookmarkStart w:id="50" w:name="_Toc228349076"/>
       <w:r>
         <w:rPr>
           <w:rFonts w:eastAsia="黑体"/>
@@ -33688,13 +33697,20 @@
           <w:rFonts w:hint="eastAsia"/>
           <w:szCs w:val="24"/>
         </w:rPr>
-        <w:t>可访问输入缓冲区也会带来额外传输开销。因此，后续若要进一步提升性能，应优先考虑输入数据传输、预处理和内存布局优化，例如结合</w:t>
+        <w:t>可访问输入缓冲区也会带来额外传输开销。因此，后续若要进一步提升性能，应优先考虑输入数据传输、预处理和内存布局优化，</w:t>
       </w:r>
       <w:r>
         <w:rPr>
           <w:rFonts w:hint="eastAsia"/>
           <w:szCs w:val="24"/>
         </w:rPr>
+        <w:t>例如结合</w:t>
+      </w:r>
+      <w:r>
+        <w:rPr>
+          <w:rFonts w:hint="eastAsia"/>
+          <w:szCs w:val="24"/>
+        </w:rPr>
         <w:t>INT8</w:t>
       </w:r>
       <w:r>
@@ -33702,7 +33718,7 @@
           <w:rFonts w:hint="eastAsia"/>
           <w:szCs w:val="24"/>
         </w:rPr>
-        <w:t>输入匹配、</w:t>
+        <w:t>输入匹配、更完整的</w:t>
       </w:r>
       <w:r>
         <w:rPr>
@@ -33716,7 +33732,7 @@
           <w:rFonts w:hint="eastAsia"/>
           <w:szCs w:val="24"/>
         </w:rPr>
-        <w:t>硬件预处理、</w:t>
+        <w:t>硬件预处理闭环、</w:t>
       </w:r>
       <w:r>
         <w:rPr>
@@ -33738,7 +33754,7 @@
         <w:spacing w:before="240" w:after="120" w:line="360" w:lineRule="auto"/>
         <w:outlineLvl w:val="1"/>
       </w:pPr>
-      <w:bookmarkStart w:id="51" w:name="_Toc228348283"/>
+      <w:bookmarkStart w:id="51" w:name="_Toc228349077"/>
       <w:r>
         <w:rPr>
           <w:rFonts w:eastAsia="黑体"/>
@@ -34799,7 +34815,7 @@
         <w:spacing w:before="240" w:after="120" w:line="360" w:lineRule="auto"/>
         <w:outlineLvl w:val="1"/>
       </w:pPr>
-      <w:bookmarkStart w:id="52" w:name="_Toc228348284"/>
+      <w:bookmarkStart w:id="52" w:name="_Toc228349078"/>
       <w:r>
         <w:rPr>
           <w:rFonts w:eastAsia="黑体"/>
@@ -37921,7 +37937,7 @@
         <w:jc w:val="left"/>
         <w:outlineLvl w:val="1"/>
       </w:pPr>
-      <w:bookmarkStart w:id="53" w:name="_Toc228348285"/>
+      <w:bookmarkStart w:id="53" w:name="_Toc228349079"/>
       <w:r>
         <w:rPr>
           <w:rFonts w:eastAsia="黑体"/>
@@ -38252,7 +38268,7 @@
         <w:jc w:val="center"/>
         <w:outlineLvl w:val="0"/>
       </w:pPr>
-      <w:bookmarkStart w:id="54" w:name="_Toc228348286"/>
+      <w:bookmarkStart w:id="54" w:name="_Toc228349080"/>
       <w:r>
         <w:rPr>
           <w:rFonts w:eastAsia="黑体" w:hint="eastAsia"/>
@@ -38294,7 +38310,7 @@
           <w:szCs w:val="24"/>
         </w:rPr>
       </w:pPr>
-      <w:bookmarkStart w:id="55" w:name="_Toc228348287"/>
+      <w:bookmarkStart w:id="55" w:name="_Toc228349081"/>
       <w:r>
         <w:rPr>
           <w:rFonts w:eastAsia="黑体" w:hint="eastAsia"/>
@@ -38488,7 +38504,7 @@
           <w:szCs w:val="24"/>
         </w:rPr>
       </w:pPr>
-      <w:bookmarkStart w:id="56" w:name="_Toc228348288"/>
+      <w:bookmarkStart w:id="56" w:name="_Toc228349082"/>
       <w:r>
         <w:rPr>
           <w:rFonts w:eastAsia="黑体" w:hint="eastAsia"/>
@@ -38753,7 +38769,7 @@
           <w:rFonts w:cs="Times New Roman" w:hint="eastAsia"/>
           <w:szCs w:val="36"/>
         </w:rPr>
-        <w:t>量化、</w:t>
+        <w:t>量化、完整</w:t>
       </w:r>
       <w:r>
         <w:rPr>
@@ -38767,7 +38783,7 @@
           <w:rFonts w:cs="Times New Roman" w:hint="eastAsia"/>
           <w:szCs w:val="36"/>
         </w:rPr>
-        <w:t>硬件预处理和</w:t>
+        <w:t>硬件预处理闭环和</w:t>
       </w:r>
       <w:r>
         <w:rPr>
@@ -38781,7 +38797,14 @@
           <w:rFonts w:cs="Times New Roman" w:hint="eastAsia"/>
           <w:szCs w:val="36"/>
         </w:rPr>
-        <w:t>闭环控制仍保留为后续拓展方向，而不作为本文已经完成并验证的结果。这样的处理能够保证论文结论与当前代码和实验数据保持一致。</w:t>
+        <w:t>闭环控制仍保留为后续拓展方向，而不作为本文已经完成并验证的稳定主路径。</w:t>
+      </w:r>
+      <w:r>
+        <w:rPr>
+          <w:rFonts w:cs="Times New Roman" w:hint="eastAsia"/>
+          <w:szCs w:val="36"/>
+        </w:rPr>
+        <w:t>这样的处理能够保证论文结论与当前代码和实验数据保持一致。</w:t>
       </w:r>
     </w:p>
     <w:p>
@@ -38790,7 +38813,7 @@
         <w:jc w:val="center"/>
         <w:outlineLvl w:val="0"/>
       </w:pPr>
-      <w:bookmarkStart w:id="57" w:name="_Toc228348289"/>
+      <w:bookmarkStart w:id="57" w:name="_Toc228349083"/>
       <w:r>
         <w:rPr>
           <w:rFonts w:eastAsia="黑体"/>
@@ -39067,7 +39090,7 @@
         <w:jc w:val="center"/>
         <w:outlineLvl w:val="0"/>
       </w:pPr>
-      <w:bookmarkStart w:id="58" w:name="_Toc228348290"/>
+      <w:bookmarkStart w:id="58" w:name="_Toc228349084"/>
       <w:r>
         <w:rPr>
           <w:rFonts w:eastAsia="黑体"/>

</xml_diff>

<commit_message>
Apply thesis audit text and reference fixes
</commit_message>
<xml_diff>
--- a/Thesis Project/paper/full_thesis_latest_merged.docx
+++ b/Thesis Project/paper/full_thesis_latest_merged.docx
@@ -1314,105 +1314,54 @@
         <w:ind w:firstLine="480"/>
       </w:pPr>
       <w:r>
-        <w:rPr>
-          <w:szCs w:val="24"/>
-        </w:rPr>
         <w:t>在系统实现方面，本文构建了视频输入、图像预处理、</w:t>
       </w:r>
       <w:r>
-        <w:rPr>
-          <w:szCs w:val="24"/>
-        </w:rPr>
         <w:t>NPU</w:t>
       </w:r>
       <w:r>
-        <w:rPr>
-          <w:szCs w:val="24"/>
-        </w:rPr>
         <w:t>推理、后处理、显示推流和日志记录相互解耦的处理流程。针对实时检测过程中容易出现的吞吐不足、端到端延迟升高和检测框抖动问题，系统实现了检测间隔控制、动态</w:t>
       </w:r>
       <w:r>
-        <w:rPr>
-          <w:szCs w:val="24"/>
-        </w:rPr>
         <w:t>ROI</w:t>
       </w:r>
       <w:r>
-        <w:rPr>
-          <w:szCs w:val="24"/>
-        </w:rPr>
         <w:t>、轻量跟踪、检测框平滑和多</w:t>
       </w:r>
       <w:r>
-        <w:rPr>
-          <w:szCs w:val="24"/>
-        </w:rPr>
         <w:t>context NPU</w:t>
       </w:r>
       <w:r>
-        <w:rPr>
-          <w:szCs w:val="24"/>
-        </w:rPr>
-        <w:t>并行推理等策略。实验结果表明，恢复后的单类无人机</w:t>
-      </w:r>
-      <w:r>
-        <w:rPr>
-          <w:szCs w:val="24"/>
-        </w:rPr>
+        <w:t>并行推理等策略，并通过画面报警提示和事件日志记录实现检测结果的直观反馈。实验结果表明，恢复后的单类无人机</w:t>
+      </w:r>
+      <w:r>
         <w:t>RKNN</w:t>
       </w:r>
       <w:r>
-        <w:rPr>
-          <w:szCs w:val="24"/>
-        </w:rPr>
         <w:t>模型能够在</w:t>
       </w:r>
       <w:r>
-        <w:rPr>
-          <w:szCs w:val="24"/>
-        </w:rPr>
         <w:t>RK3588</w:t>
       </w:r>
       <w:r>
-        <w:rPr>
-          <w:szCs w:val="24"/>
-        </w:rPr>
         <w:t>上完成固定视频检测，并可通过</w:t>
       </w:r>
       <w:r>
-        <w:rPr>
-          <w:szCs w:val="24"/>
-        </w:rPr>
         <w:t>RTSP</w:t>
       </w:r>
       <w:r>
-        <w:rPr>
-          <w:szCs w:val="24"/>
-        </w:rPr>
         <w:t>输出带框视频流。多</w:t>
       </w:r>
       <w:r>
-        <w:rPr>
-          <w:szCs w:val="24"/>
-        </w:rPr>
         <w:t>context</w:t>
       </w:r>
       <w:r>
-        <w:rPr>
-          <w:szCs w:val="24"/>
-        </w:rPr>
         <w:t>机制在每帧检测场景下能够提高</w:t>
       </w:r>
       <w:r>
-        <w:rPr>
-          <w:szCs w:val="24"/>
-        </w:rPr>
         <w:t>NPU</w:t>
       </w:r>
       <w:r>
-        <w:rPr>
-          <w:szCs w:val="24"/>
-        </w:rPr>
         <w:t>推理吞吐，而检测间隔与框平滑策略更适合低延迟实时观看场景。本文工作为目标检测算法在国产嵌入式平台上的工程化部署与系统级优化提供了参考。</w:t>
       </w:r>
     </w:p>
@@ -1491,22 +1440,7 @@
         <w:ind w:firstLine="480"/>
       </w:pPr>
       <w:r>
-        <w:rPr>
-          <w:szCs w:val="24"/>
-        </w:rPr>
-        <w:t xml:space="preserve">In terms of system implementation, the proposed system decouples video input, </w:t>
-      </w:r>
-      <w:r>
-        <w:rPr>
-          <w:szCs w:val="24"/>
-        </w:rPr>
-        <w:t>image preprocessing, Neural Processing Unit (NPU) inference, post-processing</w:t>
-      </w:r>
-      <w:r>
-        <w:rPr>
-          <w:szCs w:val="24"/>
-        </w:rPr>
-        <w:t>, display streaming, and logging. To reduce throughput bottlenecks, end-to-end latency, and bounding-box jitter in real-time detection, the system implements detection interval control, dynamic ROI, lightweight tracking, bounding-box smoothing, and multi-context NPU parallel inference. Experimental results show that the recovered single-class UAV RKNN model can perform fixed-video detection on RK3588 and output annotated video streams through RTSP. The multi-context mechanism improves inference throughput in frame-by-frame detection, while detection interval control and bounding-box smoothing are more suitable for low-latency real-time viewing. This work provides a practical reference for engineering deployment and system-level optimization of object detection algorithms on domestic embedded platforms.</w:t>
+        <w:t>In terms of system implementation, the proposed system decouples video input, image preprocessing, Neural Processing Unit (NPU) inference, post-processing, display streaming, and logging. To reduce throughput bottlenecks, end-to-end latency, and bounding-box jitter in real-time detection, the system implements detection interval control, dynamic ROI, lightweight tracking, bounding-box smoothing, and multi-context NPU parallel inference. It also provides visual alarm overlay and event logging to make detection results observable during demonstrations. Experimental results show that the recovered single-class UAV RKNN model can perform fixed-video detection on RK3588 and output annotated video streams through RTSP. The multi-context mechanism improves inference throughput in frame-by-frame detection, while detection interval control and bounding-box smoothing are more suitable for low-latency real-time viewing. This work provides a practical reference for engineering deployment and system-level optimization of object detection algorithms on domestic embedded platforms.</w:t>
       </w:r>
     </w:p>
     <w:p>
@@ -1595,7 +1529,7 @@
         </w:rPr>
         <w:fldChar w:fldCharType="separate"/>
       </w:r>
-      <w:hyperlink w:anchor="_Toc228349026" w:history="1">
+      <w:hyperlink w:anchor="_Toc228357896" w:history="1">
         <w:r>
           <w:rPr>
             <w:rStyle w:val="af3"/>
@@ -1636,7 +1570,7 @@
             <w:noProof/>
             <w:webHidden/>
           </w:rPr>
-          <w:instrText xml:space="preserve"> PAGEREF _Toc228349026 \h </w:instrText>
+          <w:instrText xml:space="preserve"> PAGEREF _Toc228357896 \h </w:instrText>
         </w:r>
         <w:r>
           <w:rPr>
@@ -1679,7 +1613,7 @@
           <w14:ligatures w14:val="standardContextual"/>
         </w:rPr>
       </w:pPr>
-      <w:hyperlink w:anchor="_Toc228349027" w:history="1">
+      <w:hyperlink w:anchor="_Toc228357897" w:history="1">
         <w:r>
           <w:rPr>
             <w:rStyle w:val="af3"/>
@@ -1717,7 +1651,7 @@
             <w:noProof/>
             <w:webHidden/>
           </w:rPr>
-          <w:instrText xml:space="preserve"> PAGEREF _Toc228349027 \h </w:instrText>
+          <w:instrText xml:space="preserve"> PAGEREF _Toc228357897 \h </w:instrText>
         </w:r>
         <w:r>
           <w:rPr>
@@ -1760,7 +1694,7 @@
           <w14:ligatures w14:val="standardContextual"/>
         </w:rPr>
       </w:pPr>
-      <w:hyperlink w:anchor="_Toc228349028" w:history="1">
+      <w:hyperlink w:anchor="_Toc228357898" w:history="1">
         <w:r>
           <w:rPr>
             <w:rStyle w:val="af3"/>
@@ -1798,7 +1732,7 @@
             <w:noProof/>
             <w:webHidden/>
           </w:rPr>
-          <w:instrText xml:space="preserve"> PAGEREF _Toc228349028 \h </w:instrText>
+          <w:instrText xml:space="preserve"> PAGEREF _Toc228357898 \h </w:instrText>
         </w:r>
         <w:r>
           <w:rPr>
@@ -1841,7 +1775,7 @@
           <w14:ligatures w14:val="standardContextual"/>
         </w:rPr>
       </w:pPr>
-      <w:hyperlink w:anchor="_Toc228349029" w:history="1">
+      <w:hyperlink w:anchor="_Toc228357899" w:history="1">
         <w:r>
           <w:rPr>
             <w:rStyle w:val="af3"/>
@@ -1879,7 +1813,7 @@
             <w:noProof/>
             <w:webHidden/>
           </w:rPr>
-          <w:instrText xml:space="preserve"> PAGEREF _Toc228349029 \h </w:instrText>
+          <w:instrText xml:space="preserve"> PAGEREF _Toc228357899 \h </w:instrText>
         </w:r>
         <w:r>
           <w:rPr>
@@ -1922,7 +1856,7 @@
           <w14:ligatures w14:val="standardContextual"/>
         </w:rPr>
       </w:pPr>
-      <w:hyperlink w:anchor="_Toc228349030" w:history="1">
+      <w:hyperlink w:anchor="_Toc228357900" w:history="1">
         <w:r>
           <w:rPr>
             <w:rStyle w:val="af3"/>
@@ -1960,7 +1894,7 @@
             <w:noProof/>
             <w:webHidden/>
           </w:rPr>
-          <w:instrText xml:space="preserve"> PAGEREF _Toc228349030 \h </w:instrText>
+          <w:instrText xml:space="preserve"> PAGEREF _Toc228357900 \h </w:instrText>
         </w:r>
         <w:r>
           <w:rPr>
@@ -2003,7 +1937,7 @@
           <w14:ligatures w14:val="standardContextual"/>
         </w:rPr>
       </w:pPr>
-      <w:hyperlink w:anchor="_Toc228349031" w:history="1">
+      <w:hyperlink w:anchor="_Toc228357901" w:history="1">
         <w:r>
           <w:rPr>
             <w:rStyle w:val="af3"/>
@@ -2047,7 +1981,7 @@
             <w:noProof/>
             <w:webHidden/>
           </w:rPr>
-          <w:instrText xml:space="preserve"> PAGEREF _Toc228349031 \h </w:instrText>
+          <w:instrText xml:space="preserve"> PAGEREF _Toc228357901 \h </w:instrText>
         </w:r>
         <w:r>
           <w:rPr>
@@ -2090,7 +2024,7 @@
           <w14:ligatures w14:val="standardContextual"/>
         </w:rPr>
       </w:pPr>
-      <w:hyperlink w:anchor="_Toc228349032" w:history="1">
+      <w:hyperlink w:anchor="_Toc228357902" w:history="1">
         <w:r>
           <w:rPr>
             <w:rStyle w:val="af3"/>
@@ -2128,7 +2062,7 @@
             <w:noProof/>
             <w:webHidden/>
           </w:rPr>
-          <w:instrText xml:space="preserve"> PAGEREF _Toc228349032 \h </w:instrText>
+          <w:instrText xml:space="preserve"> PAGEREF _Toc228357902 \h </w:instrText>
         </w:r>
         <w:r>
           <w:rPr>
@@ -2171,7 +2105,7 @@
           <w14:ligatures w14:val="standardContextual"/>
         </w:rPr>
       </w:pPr>
-      <w:hyperlink w:anchor="_Toc228349033" w:history="1">
+      <w:hyperlink w:anchor="_Toc228357903" w:history="1">
         <w:r>
           <w:rPr>
             <w:rStyle w:val="af3"/>
@@ -2209,7 +2143,7 @@
             <w:noProof/>
             <w:webHidden/>
           </w:rPr>
-          <w:instrText xml:space="preserve"> PAGEREF _Toc228349033 \h </w:instrText>
+          <w:instrText xml:space="preserve"> PAGEREF _Toc228357903 \h </w:instrText>
         </w:r>
         <w:r>
           <w:rPr>
@@ -2252,7 +2186,7 @@
           <w14:ligatures w14:val="standardContextual"/>
         </w:rPr>
       </w:pPr>
-      <w:hyperlink w:anchor="_Toc228349034" w:history="1">
+      <w:hyperlink w:anchor="_Toc228357904" w:history="1">
         <w:r>
           <w:rPr>
             <w:rStyle w:val="af3"/>
@@ -2290,7 +2224,7 @@
             <w:noProof/>
             <w:webHidden/>
           </w:rPr>
-          <w:instrText xml:space="preserve"> PAGEREF _Toc228349034 \h </w:instrText>
+          <w:instrText xml:space="preserve"> PAGEREF _Toc228357904 \h </w:instrText>
         </w:r>
         <w:r>
           <w:rPr>
@@ -2310,7 +2244,7 @@
             <w:noProof/>
             <w:webHidden/>
           </w:rPr>
-          <w:t>10</w:t>
+          <w:t>11</w:t>
         </w:r>
         <w:r>
           <w:rPr>
@@ -2333,7 +2267,7 @@
           <w14:ligatures w14:val="standardContextual"/>
         </w:rPr>
       </w:pPr>
-      <w:hyperlink w:anchor="_Toc228349035" w:history="1">
+      <w:hyperlink w:anchor="_Toc228357905" w:history="1">
         <w:r>
           <w:rPr>
             <w:rStyle w:val="af3"/>
@@ -2371,7 +2305,7 @@
             <w:noProof/>
             <w:webHidden/>
           </w:rPr>
-          <w:instrText xml:space="preserve"> PAGEREF _Toc228349035 \h </w:instrText>
+          <w:instrText xml:space="preserve"> PAGEREF _Toc228357905 \h </w:instrText>
         </w:r>
         <w:r>
           <w:rPr>
@@ -2391,7 +2325,7 @@
             <w:noProof/>
             <w:webHidden/>
           </w:rPr>
-          <w:t>11</w:t>
+          <w:t>12</w:t>
         </w:r>
         <w:r>
           <w:rPr>
@@ -2414,7 +2348,7 @@
           <w14:ligatures w14:val="standardContextual"/>
         </w:rPr>
       </w:pPr>
-      <w:hyperlink w:anchor="_Toc228349036" w:history="1">
+      <w:hyperlink w:anchor="_Toc228357906" w:history="1">
         <w:r>
           <w:rPr>
             <w:rStyle w:val="af3"/>
@@ -2452,7 +2386,7 @@
             <w:noProof/>
             <w:webHidden/>
           </w:rPr>
-          <w:instrText xml:space="preserve"> PAGEREF _Toc228349036 \h </w:instrText>
+          <w:instrText xml:space="preserve"> PAGEREF _Toc228357906 \h </w:instrText>
         </w:r>
         <w:r>
           <w:rPr>
@@ -2495,7 +2429,7 @@
           <w14:ligatures w14:val="standardContextual"/>
         </w:rPr>
       </w:pPr>
-      <w:hyperlink w:anchor="_Toc228349037" w:history="1">
+      <w:hyperlink w:anchor="_Toc228357907" w:history="1">
         <w:r>
           <w:rPr>
             <w:rStyle w:val="af3"/>
@@ -2533,7 +2467,7 @@
             <w:noProof/>
             <w:webHidden/>
           </w:rPr>
-          <w:instrText xml:space="preserve"> PAGEREF _Toc228349037 \h </w:instrText>
+          <w:instrText xml:space="preserve"> PAGEREF _Toc228357907 \h </w:instrText>
         </w:r>
         <w:r>
           <w:rPr>
@@ -2553,7 +2487,7 @@
             <w:noProof/>
             <w:webHidden/>
           </w:rPr>
-          <w:t>12</w:t>
+          <w:t>13</w:t>
         </w:r>
         <w:r>
           <w:rPr>
@@ -2576,7 +2510,7 @@
           <w14:ligatures w14:val="standardContextual"/>
         </w:rPr>
       </w:pPr>
-      <w:hyperlink w:anchor="_Toc228349038" w:history="1">
+      <w:hyperlink w:anchor="_Toc228357908" w:history="1">
         <w:r>
           <w:rPr>
             <w:rStyle w:val="af3"/>
@@ -2620,7 +2554,7 @@
             <w:noProof/>
             <w:webHidden/>
           </w:rPr>
-          <w:instrText xml:space="preserve"> PAGEREF _Toc228349038 \h </w:instrText>
+          <w:instrText xml:space="preserve"> PAGEREF _Toc228357908 \h </w:instrText>
         </w:r>
         <w:r>
           <w:rPr>
@@ -2640,7 +2574,7 @@
             <w:noProof/>
             <w:webHidden/>
           </w:rPr>
-          <w:t>13</w:t>
+          <w:t>14</w:t>
         </w:r>
         <w:r>
           <w:rPr>
@@ -2663,7 +2597,7 @@
           <w14:ligatures w14:val="standardContextual"/>
         </w:rPr>
       </w:pPr>
-      <w:hyperlink w:anchor="_Toc228349039" w:history="1">
+      <w:hyperlink w:anchor="_Toc228357909" w:history="1">
         <w:r>
           <w:rPr>
             <w:rStyle w:val="af3"/>
@@ -2701,7 +2635,7 @@
             <w:noProof/>
             <w:webHidden/>
           </w:rPr>
-          <w:instrText xml:space="preserve"> PAGEREF _Toc228349039 \h </w:instrText>
+          <w:instrText xml:space="preserve"> PAGEREF _Toc228357909 \h </w:instrText>
         </w:r>
         <w:r>
           <w:rPr>
@@ -2721,7 +2655,7 @@
             <w:noProof/>
             <w:webHidden/>
           </w:rPr>
-          <w:t>13</w:t>
+          <w:t>14</w:t>
         </w:r>
         <w:r>
           <w:rPr>
@@ -2743,7 +2677,7 @@
           <w14:ligatures w14:val="standardContextual"/>
         </w:rPr>
       </w:pPr>
-      <w:hyperlink w:anchor="_Toc228349040" w:history="1">
+      <w:hyperlink w:anchor="_Toc228357910" w:history="1">
         <w:r>
           <w:rPr>
             <w:rStyle w:val="af3"/>
@@ -2781,7 +2715,7 @@
             <w:noProof/>
             <w:webHidden/>
           </w:rPr>
-          <w:instrText xml:space="preserve"> PAGEREF _Toc228349040 \h </w:instrText>
+          <w:instrText xml:space="preserve"> PAGEREF _Toc228357910 \h </w:instrText>
         </w:r>
         <w:r>
           <w:rPr>
@@ -2801,7 +2735,7 @@
             <w:noProof/>
             <w:webHidden/>
           </w:rPr>
-          <w:t>13</w:t>
+          <w:t>14</w:t>
         </w:r>
         <w:r>
           <w:rPr>
@@ -2823,7 +2757,7 @@
           <w14:ligatures w14:val="standardContextual"/>
         </w:rPr>
       </w:pPr>
-      <w:hyperlink w:anchor="_Toc228349041" w:history="1">
+      <w:hyperlink w:anchor="_Toc228357911" w:history="1">
         <w:r>
           <w:rPr>
             <w:rStyle w:val="af3"/>
@@ -2861,7 +2795,7 @@
             <w:noProof/>
             <w:webHidden/>
           </w:rPr>
-          <w:instrText xml:space="preserve"> PAGEREF _Toc228349041 \h </w:instrText>
+          <w:instrText xml:space="preserve"> PAGEREF _Toc228357911 \h </w:instrText>
         </w:r>
         <w:r>
           <w:rPr>
@@ -2881,7 +2815,7 @@
             <w:noProof/>
             <w:webHidden/>
           </w:rPr>
-          <w:t>14</w:t>
+          <w:t>15</w:t>
         </w:r>
         <w:r>
           <w:rPr>
@@ -2903,7 +2837,7 @@
           <w14:ligatures w14:val="standardContextual"/>
         </w:rPr>
       </w:pPr>
-      <w:hyperlink w:anchor="_Toc228349042" w:history="1">
+      <w:hyperlink w:anchor="_Toc228357912" w:history="1">
         <w:r>
           <w:rPr>
             <w:rStyle w:val="af3"/>
@@ -2941,7 +2875,7 @@
             <w:noProof/>
             <w:webHidden/>
           </w:rPr>
-          <w:instrText xml:space="preserve"> PAGEREF _Toc228349042 \h </w:instrText>
+          <w:instrText xml:space="preserve"> PAGEREF _Toc228357912 \h </w:instrText>
         </w:r>
         <w:r>
           <w:rPr>
@@ -2961,7 +2895,7 @@
             <w:noProof/>
             <w:webHidden/>
           </w:rPr>
-          <w:t>15</w:t>
+          <w:t>16</w:t>
         </w:r>
         <w:r>
           <w:rPr>
@@ -2984,7 +2918,7 @@
           <w14:ligatures w14:val="standardContextual"/>
         </w:rPr>
       </w:pPr>
-      <w:hyperlink w:anchor="_Toc228349043" w:history="1">
+      <w:hyperlink w:anchor="_Toc228357913" w:history="1">
         <w:r>
           <w:rPr>
             <w:rStyle w:val="af3"/>
@@ -3022,7 +2956,7 @@
             <w:noProof/>
             <w:webHidden/>
           </w:rPr>
-          <w:instrText xml:space="preserve"> PAGEREF _Toc228349043 \h </w:instrText>
+          <w:instrText xml:space="preserve"> PAGEREF _Toc228357913 \h </w:instrText>
         </w:r>
         <w:r>
           <w:rPr>
@@ -3042,7 +2976,7 @@
             <w:noProof/>
             <w:webHidden/>
           </w:rPr>
-          <w:t>15</w:t>
+          <w:t>16</w:t>
         </w:r>
         <w:r>
           <w:rPr>
@@ -3065,7 +2999,7 @@
           <w14:ligatures w14:val="standardContextual"/>
         </w:rPr>
       </w:pPr>
-      <w:hyperlink w:anchor="_Toc228349044" w:history="1">
+      <w:hyperlink w:anchor="_Toc228357914" w:history="1">
         <w:r>
           <w:rPr>
             <w:rStyle w:val="af3"/>
@@ -3103,7 +3037,7 @@
             <w:noProof/>
             <w:webHidden/>
           </w:rPr>
-          <w:instrText xml:space="preserve"> PAGEREF _Toc228349044 \h </w:instrText>
+          <w:instrText xml:space="preserve"> PAGEREF _Toc228357914 \h </w:instrText>
         </w:r>
         <w:r>
           <w:rPr>
@@ -3123,7 +3057,7 @@
             <w:noProof/>
             <w:webHidden/>
           </w:rPr>
-          <w:t>16</w:t>
+          <w:t>17</w:t>
         </w:r>
         <w:r>
           <w:rPr>
@@ -3145,7 +3079,7 @@
           <w14:ligatures w14:val="standardContextual"/>
         </w:rPr>
       </w:pPr>
-      <w:hyperlink w:anchor="_Toc228349045" w:history="1">
+      <w:hyperlink w:anchor="_Toc228357915" w:history="1">
         <w:r>
           <w:rPr>
             <w:rStyle w:val="af3"/>
@@ -3183,7 +3117,7 @@
             <w:noProof/>
             <w:webHidden/>
           </w:rPr>
-          <w:instrText xml:space="preserve"> PAGEREF _Toc228349045 \h </w:instrText>
+          <w:instrText xml:space="preserve"> PAGEREF _Toc228357915 \h </w:instrText>
         </w:r>
         <w:r>
           <w:rPr>
@@ -3203,7 +3137,7 @@
             <w:noProof/>
             <w:webHidden/>
           </w:rPr>
-          <w:t>16</w:t>
+          <w:t>17</w:t>
         </w:r>
         <w:r>
           <w:rPr>
@@ -3225,7 +3159,7 @@
           <w14:ligatures w14:val="standardContextual"/>
         </w:rPr>
       </w:pPr>
-      <w:hyperlink w:anchor="_Toc228349046" w:history="1">
+      <w:hyperlink w:anchor="_Toc228357916" w:history="1">
         <w:r>
           <w:rPr>
             <w:rStyle w:val="af3"/>
@@ -3263,7 +3197,7 @@
             <w:noProof/>
             <w:webHidden/>
           </w:rPr>
-          <w:instrText xml:space="preserve"> PAGEREF _Toc228349046 \h </w:instrText>
+          <w:instrText xml:space="preserve"> PAGEREF _Toc228357916 \h </w:instrText>
         </w:r>
         <w:r>
           <w:rPr>
@@ -3283,7 +3217,7 @@
             <w:noProof/>
             <w:webHidden/>
           </w:rPr>
-          <w:t>17</w:t>
+          <w:t>18</w:t>
         </w:r>
         <w:r>
           <w:rPr>
@@ -3306,7 +3240,7 @@
           <w14:ligatures w14:val="standardContextual"/>
         </w:rPr>
       </w:pPr>
-      <w:hyperlink w:anchor="_Toc228349047" w:history="1">
+      <w:hyperlink w:anchor="_Toc228357917" w:history="1">
         <w:r>
           <w:rPr>
             <w:rStyle w:val="af3"/>
@@ -3344,7 +3278,7 @@
             <w:noProof/>
             <w:webHidden/>
           </w:rPr>
-          <w:instrText xml:space="preserve"> PAGEREF _Toc228349047 \h </w:instrText>
+          <w:instrText xml:space="preserve"> PAGEREF _Toc228357917 \h </w:instrText>
         </w:r>
         <w:r>
           <w:rPr>
@@ -3364,7 +3298,7 @@
             <w:noProof/>
             <w:webHidden/>
           </w:rPr>
-          <w:t>18</w:t>
+          <w:t>19</w:t>
         </w:r>
         <w:r>
           <w:rPr>
@@ -3386,7 +3320,7 @@
           <w14:ligatures w14:val="standardContextual"/>
         </w:rPr>
       </w:pPr>
-      <w:hyperlink w:anchor="_Toc228349048" w:history="1">
+      <w:hyperlink w:anchor="_Toc228357918" w:history="1">
         <w:r>
           <w:rPr>
             <w:rStyle w:val="af3"/>
@@ -3424,7 +3358,7 @@
             <w:noProof/>
             <w:webHidden/>
           </w:rPr>
-          <w:instrText xml:space="preserve"> PAGEREF _Toc228349048 \h </w:instrText>
+          <w:instrText xml:space="preserve"> PAGEREF _Toc228357918 \h </w:instrText>
         </w:r>
         <w:r>
           <w:rPr>
@@ -3444,7 +3378,7 @@
             <w:noProof/>
             <w:webHidden/>
           </w:rPr>
-          <w:t>18</w:t>
+          <w:t>19</w:t>
         </w:r>
         <w:r>
           <w:rPr>
@@ -3466,7 +3400,7 @@
           <w14:ligatures w14:val="standardContextual"/>
         </w:rPr>
       </w:pPr>
-      <w:hyperlink w:anchor="_Toc228349049" w:history="1">
+      <w:hyperlink w:anchor="_Toc228357919" w:history="1">
         <w:r>
           <w:rPr>
             <w:rStyle w:val="af3"/>
@@ -3504,7 +3438,7 @@
             <w:noProof/>
             <w:webHidden/>
           </w:rPr>
-          <w:instrText xml:space="preserve"> PAGEREF _Toc228349049 \h </w:instrText>
+          <w:instrText xml:space="preserve"> PAGEREF _Toc228357919 \h </w:instrText>
         </w:r>
         <w:r>
           <w:rPr>
@@ -3524,7 +3458,7 @@
             <w:noProof/>
             <w:webHidden/>
           </w:rPr>
-          <w:t>18</w:t>
+          <w:t>19</w:t>
         </w:r>
         <w:r>
           <w:rPr>
@@ -3547,7 +3481,7 @@
           <w14:ligatures w14:val="standardContextual"/>
         </w:rPr>
       </w:pPr>
-      <w:hyperlink w:anchor="_Toc228349050" w:history="1">
+      <w:hyperlink w:anchor="_Toc228357920" w:history="1">
         <w:r>
           <w:rPr>
             <w:rStyle w:val="af3"/>
@@ -3603,7 +3537,7 @@
             <w:noProof/>
             <w:webHidden/>
           </w:rPr>
-          <w:instrText xml:space="preserve"> PAGEREF _Toc228349050 \h </w:instrText>
+          <w:instrText xml:space="preserve"> PAGEREF _Toc228357920 \h </w:instrText>
         </w:r>
         <w:r>
           <w:rPr>
@@ -3623,7 +3557,7 @@
             <w:noProof/>
             <w:webHidden/>
           </w:rPr>
-          <w:t>19</w:t>
+          <w:t>20</w:t>
         </w:r>
         <w:r>
           <w:rPr>
@@ -3645,7 +3579,7 @@
           <w14:ligatures w14:val="standardContextual"/>
         </w:rPr>
       </w:pPr>
-      <w:hyperlink w:anchor="_Toc228349051" w:history="1">
+      <w:hyperlink w:anchor="_Toc228357921" w:history="1">
         <w:r>
           <w:rPr>
             <w:rStyle w:val="af3"/>
@@ -3683,7 +3617,7 @@
             <w:noProof/>
             <w:webHidden/>
           </w:rPr>
-          <w:instrText xml:space="preserve"> PAGEREF _Toc228349051 \h </w:instrText>
+          <w:instrText xml:space="preserve"> PAGEREF _Toc228357921 \h </w:instrText>
         </w:r>
         <w:r>
           <w:rPr>
@@ -3703,7 +3637,7 @@
             <w:noProof/>
             <w:webHidden/>
           </w:rPr>
-          <w:t>19</w:t>
+          <w:t>20</w:t>
         </w:r>
         <w:r>
           <w:rPr>
@@ -3725,7 +3659,7 @@
           <w14:ligatures w14:val="standardContextual"/>
         </w:rPr>
       </w:pPr>
-      <w:hyperlink w:anchor="_Toc228349052" w:history="1">
+      <w:hyperlink w:anchor="_Toc228357922" w:history="1">
         <w:r>
           <w:rPr>
             <w:rStyle w:val="af3"/>
@@ -3781,7 +3715,7 @@
             <w:noProof/>
             <w:webHidden/>
           </w:rPr>
-          <w:instrText xml:space="preserve"> PAGEREF _Toc228349052 \h </w:instrText>
+          <w:instrText xml:space="preserve"> PAGEREF _Toc228357922 \h </w:instrText>
         </w:r>
         <w:r>
           <w:rPr>
@@ -3801,7 +3735,7 @@
             <w:noProof/>
             <w:webHidden/>
           </w:rPr>
-          <w:t>19</w:t>
+          <w:t>20</w:t>
         </w:r>
         <w:r>
           <w:rPr>
@@ -3823,7 +3757,7 @@
           <w14:ligatures w14:val="standardContextual"/>
         </w:rPr>
       </w:pPr>
-      <w:hyperlink w:anchor="_Toc228349053" w:history="1">
+      <w:hyperlink w:anchor="_Toc228357923" w:history="1">
         <w:r>
           <w:rPr>
             <w:rStyle w:val="af3"/>
@@ -3861,7 +3795,7 @@
             <w:noProof/>
             <w:webHidden/>
           </w:rPr>
-          <w:instrText xml:space="preserve"> PAGEREF _Toc228349053 \h </w:instrText>
+          <w:instrText xml:space="preserve"> PAGEREF _Toc228357923 \h </w:instrText>
         </w:r>
         <w:r>
           <w:rPr>
@@ -3881,7 +3815,7 @@
             <w:noProof/>
             <w:webHidden/>
           </w:rPr>
-          <w:t>19</w:t>
+          <w:t>20</w:t>
         </w:r>
         <w:r>
           <w:rPr>
@@ -3904,7 +3838,7 @@
           <w14:ligatures w14:val="standardContextual"/>
         </w:rPr>
       </w:pPr>
-      <w:hyperlink w:anchor="_Toc228349054" w:history="1">
+      <w:hyperlink w:anchor="_Toc228357924" w:history="1">
         <w:r>
           <w:rPr>
             <w:rStyle w:val="af3"/>
@@ -3960,7 +3894,7 @@
             <w:noProof/>
             <w:webHidden/>
           </w:rPr>
-          <w:instrText xml:space="preserve"> PAGEREF _Toc228349054 \h </w:instrText>
+          <w:instrText xml:space="preserve"> PAGEREF _Toc228357924 \h </w:instrText>
         </w:r>
         <w:r>
           <w:rPr>
@@ -3980,7 +3914,7 @@
             <w:noProof/>
             <w:webHidden/>
           </w:rPr>
-          <w:t>20</w:t>
+          <w:t>21</w:t>
         </w:r>
         <w:r>
           <w:rPr>
@@ -4002,7 +3936,7 @@
           <w14:ligatures w14:val="standardContextual"/>
         </w:rPr>
       </w:pPr>
-      <w:hyperlink w:anchor="_Toc228349055" w:history="1">
+      <w:hyperlink w:anchor="_Toc228357925" w:history="1">
         <w:r>
           <w:rPr>
             <w:rStyle w:val="af3"/>
@@ -4058,7 +3992,7 @@
             <w:noProof/>
             <w:webHidden/>
           </w:rPr>
-          <w:instrText xml:space="preserve"> PAGEREF _Toc228349055 \h </w:instrText>
+          <w:instrText xml:space="preserve"> PAGEREF _Toc228357925 \h </w:instrText>
         </w:r>
         <w:r>
           <w:rPr>
@@ -4078,7 +4012,7 @@
             <w:noProof/>
             <w:webHidden/>
           </w:rPr>
-          <w:t>20</w:t>
+          <w:t>21</w:t>
         </w:r>
         <w:r>
           <w:rPr>
@@ -4100,7 +4034,7 @@
           <w14:ligatures w14:val="standardContextual"/>
         </w:rPr>
       </w:pPr>
-      <w:hyperlink w:anchor="_Toc228349056" w:history="1">
+      <w:hyperlink w:anchor="_Toc228357926" w:history="1">
         <w:r>
           <w:rPr>
             <w:rStyle w:val="af3"/>
@@ -4156,7 +4090,7 @@
             <w:noProof/>
             <w:webHidden/>
           </w:rPr>
-          <w:instrText xml:space="preserve"> PAGEREF _Toc228349056 \h </w:instrText>
+          <w:instrText xml:space="preserve"> PAGEREF _Toc228357926 \h </w:instrText>
         </w:r>
         <w:r>
           <w:rPr>
@@ -4176,7 +4110,7 @@
             <w:noProof/>
             <w:webHidden/>
           </w:rPr>
-          <w:t>21</w:t>
+          <w:t>22</w:t>
         </w:r>
         <w:r>
           <w:rPr>
@@ -4198,7 +4132,7 @@
           <w14:ligatures w14:val="standardContextual"/>
         </w:rPr>
       </w:pPr>
-      <w:hyperlink w:anchor="_Toc228349057" w:history="1">
+      <w:hyperlink w:anchor="_Toc228357927" w:history="1">
         <w:r>
           <w:rPr>
             <w:rStyle w:val="af3"/>
@@ -4236,7 +4170,7 @@
             <w:noProof/>
             <w:webHidden/>
           </w:rPr>
-          <w:instrText xml:space="preserve"> PAGEREF _Toc228349057 \h </w:instrText>
+          <w:instrText xml:space="preserve"> PAGEREF _Toc228357927 \h </w:instrText>
         </w:r>
         <w:r>
           <w:rPr>
@@ -4256,7 +4190,7 @@
             <w:noProof/>
             <w:webHidden/>
           </w:rPr>
-          <w:t>21</w:t>
+          <w:t>22</w:t>
         </w:r>
         <w:r>
           <w:rPr>
@@ -4279,7 +4213,7 @@
           <w14:ligatures w14:val="standardContextual"/>
         </w:rPr>
       </w:pPr>
-      <w:hyperlink w:anchor="_Toc228349058" w:history="1">
+      <w:hyperlink w:anchor="_Toc228357928" w:history="1">
         <w:r>
           <w:rPr>
             <w:rStyle w:val="af3"/>
@@ -4317,7 +4251,7 @@
             <w:noProof/>
             <w:webHidden/>
           </w:rPr>
-          <w:instrText xml:space="preserve"> PAGEREF _Toc228349058 \h </w:instrText>
+          <w:instrText xml:space="preserve"> PAGEREF _Toc228357928 \h </w:instrText>
         </w:r>
         <w:r>
           <w:rPr>
@@ -4337,7 +4271,7 @@
             <w:noProof/>
             <w:webHidden/>
           </w:rPr>
-          <w:t>22</w:t>
+          <w:t>23</w:t>
         </w:r>
         <w:r>
           <w:rPr>
@@ -4360,7 +4294,7 @@
           <w14:ligatures w14:val="standardContextual"/>
         </w:rPr>
       </w:pPr>
-      <w:hyperlink w:anchor="_Toc228349059" w:history="1">
+      <w:hyperlink w:anchor="_Toc228357929" w:history="1">
         <w:r>
           <w:rPr>
             <w:rStyle w:val="af3"/>
@@ -4404,7 +4338,7 @@
             <w:noProof/>
             <w:webHidden/>
           </w:rPr>
-          <w:instrText xml:space="preserve"> PAGEREF _Toc228349059 \h </w:instrText>
+          <w:instrText xml:space="preserve"> PAGEREF _Toc228357929 \h </w:instrText>
         </w:r>
         <w:r>
           <w:rPr>
@@ -4424,7 +4358,7 @@
             <w:noProof/>
             <w:webHidden/>
           </w:rPr>
-          <w:t>23</w:t>
+          <w:t>24</w:t>
         </w:r>
         <w:r>
           <w:rPr>
@@ -4447,7 +4381,7 @@
           <w14:ligatures w14:val="standardContextual"/>
         </w:rPr>
       </w:pPr>
-      <w:hyperlink w:anchor="_Toc228349060" w:history="1">
+      <w:hyperlink w:anchor="_Toc228357930" w:history="1">
         <w:r>
           <w:rPr>
             <w:rStyle w:val="af3"/>
@@ -4485,7 +4419,7 @@
             <w:noProof/>
             <w:webHidden/>
           </w:rPr>
-          <w:instrText xml:space="preserve"> PAGEREF _Toc228349060 \h </w:instrText>
+          <w:instrText xml:space="preserve"> PAGEREF _Toc228357930 \h </w:instrText>
         </w:r>
         <w:r>
           <w:rPr>
@@ -4505,7 +4439,7 @@
             <w:noProof/>
             <w:webHidden/>
           </w:rPr>
-          <w:t>23</w:t>
+          <w:t>24</w:t>
         </w:r>
         <w:r>
           <w:rPr>
@@ -4528,7 +4462,7 @@
           <w14:ligatures w14:val="standardContextual"/>
         </w:rPr>
       </w:pPr>
-      <w:hyperlink w:anchor="_Toc228349061" w:history="1">
+      <w:hyperlink w:anchor="_Toc228357931" w:history="1">
         <w:r>
           <w:rPr>
             <w:rStyle w:val="af3"/>
@@ -4584,7 +4518,7 @@
             <w:noProof/>
             <w:webHidden/>
           </w:rPr>
-          <w:instrText xml:space="preserve"> PAGEREF _Toc228349061 \h </w:instrText>
+          <w:instrText xml:space="preserve"> PAGEREF _Toc228357931 \h </w:instrText>
         </w:r>
         <w:r>
           <w:rPr>
@@ -4604,7 +4538,7 @@
             <w:noProof/>
             <w:webHidden/>
           </w:rPr>
-          <w:t>25</w:t>
+          <w:t>26</w:t>
         </w:r>
         <w:r>
           <w:rPr>
@@ -4627,7 +4561,7 @@
           <w14:ligatures w14:val="standardContextual"/>
         </w:rPr>
       </w:pPr>
-      <w:hyperlink w:anchor="_Toc228349062" w:history="1">
+      <w:hyperlink w:anchor="_Toc228357932" w:history="1">
         <w:r>
           <w:rPr>
             <w:rStyle w:val="af3"/>
@@ -4665,7 +4599,7 @@
             <w:noProof/>
             <w:webHidden/>
           </w:rPr>
-          <w:instrText xml:space="preserve"> PAGEREF _Toc228349062 \h </w:instrText>
+          <w:instrText xml:space="preserve"> PAGEREF _Toc228357932 \h </w:instrText>
         </w:r>
         <w:r>
           <w:rPr>
@@ -4685,7 +4619,7 @@
             <w:noProof/>
             <w:webHidden/>
           </w:rPr>
-          <w:t>26</w:t>
+          <w:t>27</w:t>
         </w:r>
         <w:r>
           <w:rPr>
@@ -4708,7 +4642,7 @@
           <w14:ligatures w14:val="standardContextual"/>
         </w:rPr>
       </w:pPr>
-      <w:hyperlink w:anchor="_Toc228349063" w:history="1">
+      <w:hyperlink w:anchor="_Toc228357933" w:history="1">
         <w:r>
           <w:rPr>
             <w:rStyle w:val="af3"/>
@@ -4746,7 +4680,7 @@
             <w:noProof/>
             <w:webHidden/>
           </w:rPr>
-          <w:instrText xml:space="preserve"> PAGEREF _Toc228349063 \h </w:instrText>
+          <w:instrText xml:space="preserve"> PAGEREF _Toc228357933 \h </w:instrText>
         </w:r>
         <w:r>
           <w:rPr>
@@ -4766,7 +4700,7 @@
             <w:noProof/>
             <w:webHidden/>
           </w:rPr>
-          <w:t>27</w:t>
+          <w:t>28</w:t>
         </w:r>
         <w:r>
           <w:rPr>
@@ -4789,7 +4723,7 @@
           <w14:ligatures w14:val="standardContextual"/>
         </w:rPr>
       </w:pPr>
-      <w:hyperlink w:anchor="_Toc228349064" w:history="1">
+      <w:hyperlink w:anchor="_Toc228357934" w:history="1">
         <w:r>
           <w:rPr>
             <w:rStyle w:val="af3"/>
@@ -4845,7 +4779,7 @@
             <w:noProof/>
             <w:webHidden/>
           </w:rPr>
-          <w:instrText xml:space="preserve"> PAGEREF _Toc228349064 \h </w:instrText>
+          <w:instrText xml:space="preserve"> PAGEREF _Toc228357934 \h </w:instrText>
         </w:r>
         <w:r>
           <w:rPr>
@@ -4865,7 +4799,7 @@
             <w:noProof/>
             <w:webHidden/>
           </w:rPr>
-          <w:t>28</w:t>
+          <w:t>29</w:t>
         </w:r>
         <w:r>
           <w:rPr>
@@ -4888,7 +4822,7 @@
           <w14:ligatures w14:val="standardContextual"/>
         </w:rPr>
       </w:pPr>
-      <w:hyperlink w:anchor="_Toc228349065" w:history="1">
+      <w:hyperlink w:anchor="_Toc228357935" w:history="1">
         <w:r>
           <w:rPr>
             <w:rStyle w:val="af3"/>
@@ -4944,7 +4878,7 @@
             <w:noProof/>
             <w:webHidden/>
           </w:rPr>
-          <w:instrText xml:space="preserve"> PAGEREF _Toc228349065 \h </w:instrText>
+          <w:instrText xml:space="preserve"> PAGEREF _Toc228357935 \h </w:instrText>
         </w:r>
         <w:r>
           <w:rPr>
@@ -4964,7 +4898,7 @@
             <w:noProof/>
             <w:webHidden/>
           </w:rPr>
-          <w:t>30</w:t>
+          <w:t>31</w:t>
         </w:r>
         <w:r>
           <w:rPr>
@@ -4987,7 +4921,7 @@
           <w14:ligatures w14:val="standardContextual"/>
         </w:rPr>
       </w:pPr>
-      <w:hyperlink w:anchor="_Toc228349066" w:history="1">
+      <w:hyperlink w:anchor="_Toc228357936" w:history="1">
         <w:r>
           <w:rPr>
             <w:rStyle w:val="af3"/>
@@ -5043,7 +4977,7 @@
             <w:noProof/>
             <w:webHidden/>
           </w:rPr>
-          <w:instrText xml:space="preserve"> PAGEREF _Toc228349066 \h </w:instrText>
+          <w:instrText xml:space="preserve"> PAGEREF _Toc228357936 \h </w:instrText>
         </w:r>
         <w:r>
           <w:rPr>
@@ -5063,7 +4997,7 @@
             <w:noProof/>
             <w:webHidden/>
           </w:rPr>
-          <w:t>32</w:t>
+          <w:t>33</w:t>
         </w:r>
         <w:r>
           <w:rPr>
@@ -5086,7 +5020,7 @@
           <w14:ligatures w14:val="standardContextual"/>
         </w:rPr>
       </w:pPr>
-      <w:hyperlink w:anchor="_Toc228349067" w:history="1">
+      <w:hyperlink w:anchor="_Toc228357937" w:history="1">
         <w:r>
           <w:rPr>
             <w:rStyle w:val="af3"/>
@@ -5124,7 +5058,7 @@
             <w:noProof/>
             <w:webHidden/>
           </w:rPr>
-          <w:instrText xml:space="preserve"> PAGEREF _Toc228349067 \h </w:instrText>
+          <w:instrText xml:space="preserve"> PAGEREF _Toc228357937 \h </w:instrText>
         </w:r>
         <w:r>
           <w:rPr>
@@ -5144,7 +5078,7 @@
             <w:noProof/>
             <w:webHidden/>
           </w:rPr>
-          <w:t>34</w:t>
+          <w:t>35</w:t>
         </w:r>
         <w:r>
           <w:rPr>
@@ -5167,7 +5101,7 @@
           <w14:ligatures w14:val="standardContextual"/>
         </w:rPr>
       </w:pPr>
-      <w:hyperlink w:anchor="_Toc228349068" w:history="1">
+      <w:hyperlink w:anchor="_Toc228357938" w:history="1">
         <w:r>
           <w:rPr>
             <w:rStyle w:val="af3"/>
@@ -5205,7 +5139,7 @@
             <w:noProof/>
             <w:webHidden/>
           </w:rPr>
-          <w:instrText xml:space="preserve"> PAGEREF _Toc228349068 \h </w:instrText>
+          <w:instrText xml:space="preserve"> PAGEREF _Toc228357938 \h </w:instrText>
         </w:r>
         <w:r>
           <w:rPr>
@@ -5225,7 +5159,7 @@
             <w:noProof/>
             <w:webHidden/>
           </w:rPr>
-          <w:t>35</w:t>
+          <w:t>36</w:t>
         </w:r>
         <w:r>
           <w:rPr>
@@ -5248,7 +5182,7 @@
           <w14:ligatures w14:val="standardContextual"/>
         </w:rPr>
       </w:pPr>
-      <w:hyperlink w:anchor="_Toc228349069" w:history="1">
+      <w:hyperlink w:anchor="_Toc228357939" w:history="1">
         <w:r>
           <w:rPr>
             <w:rStyle w:val="af3"/>
@@ -5292,7 +5226,7 @@
             <w:noProof/>
             <w:webHidden/>
           </w:rPr>
-          <w:instrText xml:space="preserve"> PAGEREF _Toc228349069 \h </w:instrText>
+          <w:instrText xml:space="preserve"> PAGEREF _Toc228357939 \h </w:instrText>
         </w:r>
         <w:r>
           <w:rPr>
@@ -5312,7 +5246,7 @@
             <w:noProof/>
             <w:webHidden/>
           </w:rPr>
-          <w:t>36</w:t>
+          <w:t>37</w:t>
         </w:r>
         <w:r>
           <w:rPr>
@@ -5335,7 +5269,7 @@
           <w14:ligatures w14:val="standardContextual"/>
         </w:rPr>
       </w:pPr>
-      <w:hyperlink w:anchor="_Toc228349070" w:history="1">
+      <w:hyperlink w:anchor="_Toc228357940" w:history="1">
         <w:r>
           <w:rPr>
             <w:rStyle w:val="af3"/>
@@ -5373,7 +5307,7 @@
             <w:noProof/>
             <w:webHidden/>
           </w:rPr>
-          <w:instrText xml:space="preserve"> PAGEREF _Toc228349070 \h </w:instrText>
+          <w:instrText xml:space="preserve"> PAGEREF _Toc228357940 \h </w:instrText>
         </w:r>
         <w:r>
           <w:rPr>
@@ -5393,7 +5327,7 @@
             <w:noProof/>
             <w:webHidden/>
           </w:rPr>
-          <w:t>36</w:t>
+          <w:t>37</w:t>
         </w:r>
         <w:r>
           <w:rPr>
@@ -5416,7 +5350,7 @@
           <w14:ligatures w14:val="standardContextual"/>
         </w:rPr>
       </w:pPr>
-      <w:hyperlink w:anchor="_Toc228349071" w:history="1">
+      <w:hyperlink w:anchor="_Toc228357941" w:history="1">
         <w:r>
           <w:rPr>
             <w:rStyle w:val="af3"/>
@@ -5454,7 +5388,7 @@
             <w:noProof/>
             <w:webHidden/>
           </w:rPr>
-          <w:instrText xml:space="preserve"> PAGEREF _Toc228349071 \h </w:instrText>
+          <w:instrText xml:space="preserve"> PAGEREF _Toc228357941 \h </w:instrText>
         </w:r>
         <w:r>
           <w:rPr>
@@ -5474,7 +5408,7 @@
             <w:noProof/>
             <w:webHidden/>
           </w:rPr>
-          <w:t>38</w:t>
+          <w:t>39</w:t>
         </w:r>
         <w:r>
           <w:rPr>
@@ -5497,7 +5431,7 @@
           <w14:ligatures w14:val="standardContextual"/>
         </w:rPr>
       </w:pPr>
-      <w:hyperlink w:anchor="_Toc228349072" w:history="1">
+      <w:hyperlink w:anchor="_Toc228357942" w:history="1">
         <w:r>
           <w:rPr>
             <w:rStyle w:val="af3"/>
@@ -5535,7 +5469,7 @@
             <w:noProof/>
             <w:webHidden/>
           </w:rPr>
-          <w:instrText xml:space="preserve"> PAGEREF _Toc228349072 \h </w:instrText>
+          <w:instrText xml:space="preserve"> PAGEREF _Toc228357942 \h </w:instrText>
         </w:r>
         <w:r>
           <w:rPr>
@@ -5555,7 +5489,7 @@
             <w:noProof/>
             <w:webHidden/>
           </w:rPr>
-          <w:t>40</w:t>
+          <w:t>41</w:t>
         </w:r>
         <w:r>
           <w:rPr>
@@ -5578,7 +5512,7 @@
           <w14:ligatures w14:val="standardContextual"/>
         </w:rPr>
       </w:pPr>
-      <w:hyperlink w:anchor="_Toc228349073" w:history="1">
+      <w:hyperlink w:anchor="_Toc228357943" w:history="1">
         <w:r>
           <w:rPr>
             <w:rStyle w:val="af3"/>
@@ -5634,7 +5568,7 @@
             <w:noProof/>
             <w:webHidden/>
           </w:rPr>
-          <w:instrText xml:space="preserve"> PAGEREF _Toc228349073 \h </w:instrText>
+          <w:instrText xml:space="preserve"> PAGEREF _Toc228357943 \h </w:instrText>
         </w:r>
         <w:r>
           <w:rPr>
@@ -5654,7 +5588,7 @@
             <w:noProof/>
             <w:webHidden/>
           </w:rPr>
-          <w:t>41</w:t>
+          <w:t>42</w:t>
         </w:r>
         <w:r>
           <w:rPr>
@@ -5677,7 +5611,7 @@
           <w14:ligatures w14:val="standardContextual"/>
         </w:rPr>
       </w:pPr>
-      <w:hyperlink w:anchor="_Toc228349074" w:history="1">
+      <w:hyperlink w:anchor="_Toc228357944" w:history="1">
         <w:r>
           <w:rPr>
             <w:rStyle w:val="af3"/>
@@ -5715,7 +5649,7 @@
             <w:noProof/>
             <w:webHidden/>
           </w:rPr>
-          <w:instrText xml:space="preserve"> PAGEREF _Toc228349074 \h </w:instrText>
+          <w:instrText xml:space="preserve"> PAGEREF _Toc228357944 \h </w:instrText>
         </w:r>
         <w:r>
           <w:rPr>
@@ -5735,7 +5669,7 @@
             <w:noProof/>
             <w:webHidden/>
           </w:rPr>
-          <w:t>42</w:t>
+          <w:t>43</w:t>
         </w:r>
         <w:r>
           <w:rPr>
@@ -5758,7 +5692,7 @@
           <w14:ligatures w14:val="standardContextual"/>
         </w:rPr>
       </w:pPr>
-      <w:hyperlink w:anchor="_Toc228349075" w:history="1">
+      <w:hyperlink w:anchor="_Toc228357945" w:history="1">
         <w:r>
           <w:rPr>
             <w:rStyle w:val="af3"/>
@@ -5814,7 +5748,7 @@
             <w:noProof/>
             <w:webHidden/>
           </w:rPr>
-          <w:instrText xml:space="preserve"> PAGEREF _Toc228349075 \h </w:instrText>
+          <w:instrText xml:space="preserve"> PAGEREF _Toc228357945 \h </w:instrText>
         </w:r>
         <w:r>
           <w:rPr>
@@ -5834,7 +5768,7 @@
             <w:noProof/>
             <w:webHidden/>
           </w:rPr>
-          <w:t>44</w:t>
+          <w:t>45</w:t>
         </w:r>
         <w:r>
           <w:rPr>
@@ -5857,7 +5791,7 @@
           <w14:ligatures w14:val="standardContextual"/>
         </w:rPr>
       </w:pPr>
-      <w:hyperlink w:anchor="_Toc228349076" w:history="1">
+      <w:hyperlink w:anchor="_Toc228357946" w:history="1">
         <w:r>
           <w:rPr>
             <w:rStyle w:val="af3"/>
@@ -5895,7 +5829,7 @@
             <w:noProof/>
             <w:webHidden/>
           </w:rPr>
-          <w:instrText xml:space="preserve"> PAGEREF _Toc228349076 \h </w:instrText>
+          <w:instrText xml:space="preserve"> PAGEREF _Toc228357946 \h </w:instrText>
         </w:r>
         <w:r>
           <w:rPr>
@@ -5915,7 +5849,7 @@
             <w:noProof/>
             <w:webHidden/>
           </w:rPr>
-          <w:t>45</w:t>
+          <w:t>46</w:t>
         </w:r>
         <w:r>
           <w:rPr>
@@ -5938,7 +5872,7 @@
           <w14:ligatures w14:val="standardContextual"/>
         </w:rPr>
       </w:pPr>
-      <w:hyperlink w:anchor="_Toc228349077" w:history="1">
+      <w:hyperlink w:anchor="_Toc228357947" w:history="1">
         <w:r>
           <w:rPr>
             <w:rStyle w:val="af3"/>
@@ -5976,7 +5910,7 @@
             <w:noProof/>
             <w:webHidden/>
           </w:rPr>
-          <w:instrText xml:space="preserve"> PAGEREF _Toc228349077 \h </w:instrText>
+          <w:instrText xml:space="preserve"> PAGEREF _Toc228357947 \h </w:instrText>
         </w:r>
         <w:r>
           <w:rPr>
@@ -5996,7 +5930,7 @@
             <w:noProof/>
             <w:webHidden/>
           </w:rPr>
-          <w:t>48</w:t>
+          <w:t>49</w:t>
         </w:r>
         <w:r>
           <w:rPr>
@@ -6019,7 +5953,7 @@
           <w14:ligatures w14:val="standardContextual"/>
         </w:rPr>
       </w:pPr>
-      <w:hyperlink w:anchor="_Toc228349078" w:history="1">
+      <w:hyperlink w:anchor="_Toc228357948" w:history="1">
         <w:r>
           <w:rPr>
             <w:rStyle w:val="af3"/>
@@ -6057,7 +5991,7 @@
             <w:noProof/>
             <w:webHidden/>
           </w:rPr>
-          <w:instrText xml:space="preserve"> PAGEREF _Toc228349078 \h </w:instrText>
+          <w:instrText xml:space="preserve"> PAGEREF _Toc228357948 \h </w:instrText>
         </w:r>
         <w:r>
           <w:rPr>
@@ -6077,7 +6011,7 @@
             <w:noProof/>
             <w:webHidden/>
           </w:rPr>
-          <w:t>49</w:t>
+          <w:t>50</w:t>
         </w:r>
         <w:r>
           <w:rPr>
@@ -6100,7 +6034,7 @@
           <w14:ligatures w14:val="standardContextual"/>
         </w:rPr>
       </w:pPr>
-      <w:hyperlink w:anchor="_Toc228349079" w:history="1">
+      <w:hyperlink w:anchor="_Toc228357949" w:history="1">
         <w:r>
           <w:rPr>
             <w:rStyle w:val="af3"/>
@@ -6138,7 +6072,7 @@
             <w:noProof/>
             <w:webHidden/>
           </w:rPr>
-          <w:instrText xml:space="preserve"> PAGEREF _Toc228349079 \h </w:instrText>
+          <w:instrText xml:space="preserve"> PAGEREF _Toc228357949 \h </w:instrText>
         </w:r>
         <w:r>
           <w:rPr>
@@ -6158,7 +6092,7 @@
             <w:noProof/>
             <w:webHidden/>
           </w:rPr>
-          <w:t>52</w:t>
+          <w:t>53</w:t>
         </w:r>
         <w:r>
           <w:rPr>
@@ -6181,7 +6115,7 @@
           <w14:ligatures w14:val="standardContextual"/>
         </w:rPr>
       </w:pPr>
-      <w:hyperlink w:anchor="_Toc228349080" w:history="1">
+      <w:hyperlink w:anchor="_Toc228357950" w:history="1">
         <w:r>
           <w:rPr>
             <w:rStyle w:val="af3"/>
@@ -6234,7 +6168,7 @@
             <w:noProof/>
             <w:webHidden/>
           </w:rPr>
-          <w:instrText xml:space="preserve"> PAGEREF _Toc228349080 \h </w:instrText>
+          <w:instrText xml:space="preserve"> PAGEREF _Toc228357950 \h </w:instrText>
         </w:r>
         <w:r>
           <w:rPr>
@@ -6254,7 +6188,7 @@
             <w:noProof/>
             <w:webHidden/>
           </w:rPr>
-          <w:t>54</w:t>
+          <w:t>55</w:t>
         </w:r>
         <w:r>
           <w:rPr>
@@ -6277,7 +6211,7 @@
           <w14:ligatures w14:val="standardContextual"/>
         </w:rPr>
       </w:pPr>
-      <w:hyperlink w:anchor="_Toc228349081" w:history="1">
+      <w:hyperlink w:anchor="_Toc228357951" w:history="1">
         <w:r>
           <w:rPr>
             <w:rStyle w:val="af3"/>
@@ -6315,7 +6249,7 @@
             <w:noProof/>
             <w:webHidden/>
           </w:rPr>
-          <w:instrText xml:space="preserve"> PAGEREF _Toc228349081 \h </w:instrText>
+          <w:instrText xml:space="preserve"> PAGEREF _Toc228357951 \h </w:instrText>
         </w:r>
         <w:r>
           <w:rPr>
@@ -6335,7 +6269,7 @@
             <w:noProof/>
             <w:webHidden/>
           </w:rPr>
-          <w:t>54</w:t>
+          <w:t>55</w:t>
         </w:r>
         <w:r>
           <w:rPr>
@@ -6358,7 +6292,7 @@
           <w14:ligatures w14:val="standardContextual"/>
         </w:rPr>
       </w:pPr>
-      <w:hyperlink w:anchor="_Toc228349082" w:history="1">
+      <w:hyperlink w:anchor="_Toc228357952" w:history="1">
         <w:r>
           <w:rPr>
             <w:rStyle w:val="af3"/>
@@ -6396,7 +6330,7 @@
             <w:noProof/>
             <w:webHidden/>
           </w:rPr>
-          <w:instrText xml:space="preserve"> PAGEREF _Toc228349082 \h </w:instrText>
+          <w:instrText xml:space="preserve"> PAGEREF _Toc228357952 \h </w:instrText>
         </w:r>
         <w:r>
           <w:rPr>
@@ -6416,7 +6350,7 @@
             <w:noProof/>
             <w:webHidden/>
           </w:rPr>
-          <w:t>54</w:t>
+          <w:t>55</w:t>
         </w:r>
         <w:r>
           <w:rPr>
@@ -6439,7 +6373,7 @@
           <w14:ligatures w14:val="standardContextual"/>
         </w:rPr>
       </w:pPr>
-      <w:hyperlink w:anchor="_Toc228349083" w:history="1">
+      <w:hyperlink w:anchor="_Toc228357953" w:history="1">
         <w:r>
           <w:rPr>
             <w:rStyle w:val="af3"/>
@@ -6467,7 +6401,7 @@
             <w:noProof/>
             <w:webHidden/>
           </w:rPr>
-          <w:instrText xml:space="preserve"> PAGEREF _Toc228349083 \h </w:instrText>
+          <w:instrText xml:space="preserve"> PAGEREF _Toc228357953 \h </w:instrText>
         </w:r>
         <w:r>
           <w:rPr>
@@ -6487,7 +6421,7 @@
             <w:noProof/>
             <w:webHidden/>
           </w:rPr>
-          <w:t>55</w:t>
+          <w:t>56</w:t>
         </w:r>
         <w:r>
           <w:rPr>
@@ -6510,7 +6444,7 @@
           <w14:ligatures w14:val="standardContextual"/>
         </w:rPr>
       </w:pPr>
-      <w:hyperlink w:anchor="_Toc228349084" w:history="1">
+      <w:hyperlink w:anchor="_Toc228357954" w:history="1">
         <w:r>
           <w:rPr>
             <w:rStyle w:val="af3"/>
@@ -6538,7 +6472,7 @@
             <w:noProof/>
             <w:webHidden/>
           </w:rPr>
-          <w:instrText xml:space="preserve"> PAGEREF _Toc228349084 \h </w:instrText>
+          <w:instrText xml:space="preserve"> PAGEREF _Toc228357954 \h </w:instrText>
         </w:r>
         <w:r>
           <w:rPr>
@@ -6558,7 +6492,7 @@
             <w:noProof/>
             <w:webHidden/>
           </w:rPr>
-          <w:t>56</w:t>
+          <w:t>57</w:t>
         </w:r>
         <w:r>
           <w:rPr>
@@ -6585,7 +6519,7 @@
         </w:rPr>
         <w:fldChar w:fldCharType="end"/>
       </w:r>
-      <w:bookmarkStart w:id="0" w:name="_Toc228349026"/>
+      <w:bookmarkStart w:id="0" w:name="_Toc228357896"/>
       <w:r>
         <w:rPr>
           <w:rFonts w:cs="Times New Roman"/>
@@ -6614,7 +6548,7 @@
         <w:spacing w:before="240" w:after="120" w:line="360" w:lineRule="auto"/>
         <w:outlineLvl w:val="1"/>
       </w:pPr>
-      <w:bookmarkStart w:id="1" w:name="_Toc228349027"/>
+      <w:bookmarkStart w:id="1" w:name="_Toc228357897"/>
       <w:r>
         <w:rPr>
           <w:rFonts w:eastAsia="黑体"/>
@@ -6814,7 +6748,7 @@
         <w:spacing w:before="240" w:after="120" w:line="360" w:lineRule="auto"/>
         <w:outlineLvl w:val="1"/>
       </w:pPr>
-      <w:bookmarkStart w:id="2" w:name="_Toc228349028"/>
+      <w:bookmarkStart w:id="2" w:name="_Toc228357898"/>
       <w:r>
         <w:rPr>
           <w:rFonts w:eastAsia="黑体"/>
@@ -7024,7 +6958,7 @@
         <w:spacing w:before="240" w:after="120" w:line="360" w:lineRule="auto"/>
         <w:outlineLvl w:val="1"/>
       </w:pPr>
-      <w:bookmarkStart w:id="3" w:name="_Toc228349029"/>
+      <w:bookmarkStart w:id="3" w:name="_Toc228357899"/>
       <w:r>
         <w:rPr>
           <w:rFonts w:eastAsia="黑体"/>
@@ -7381,7 +7315,7 @@
         <w:spacing w:before="240" w:after="120" w:line="360" w:lineRule="auto"/>
         <w:outlineLvl w:val="1"/>
       </w:pPr>
-      <w:bookmarkStart w:id="4" w:name="_Toc228349030"/>
+      <w:bookmarkStart w:id="4" w:name="_Toc228357900"/>
       <w:r>
         <w:rPr>
           <w:rFonts w:eastAsia="黑体"/>
@@ -7602,7 +7536,7 @@
         <w:jc w:val="center"/>
         <w:outlineLvl w:val="0"/>
       </w:pPr>
-      <w:bookmarkStart w:id="5" w:name="_Toc228349031"/>
+      <w:bookmarkStart w:id="5" w:name="_Toc228357901"/>
       <w:r>
         <w:rPr>
           <w:rFonts w:eastAsia="黑体"/>
@@ -7638,7 +7572,7 @@
         <w:spacing w:before="240" w:after="120" w:line="360" w:lineRule="auto"/>
         <w:outlineLvl w:val="1"/>
       </w:pPr>
-      <w:bookmarkStart w:id="6" w:name="_Toc228349032"/>
+      <w:bookmarkStart w:id="6" w:name="_Toc228357902"/>
       <w:r>
         <w:rPr>
           <w:rFonts w:eastAsia="黑体"/>
@@ -7710,10 +7644,118 @@
     </w:p>
     <w:p>
       <w:pPr>
+        <w:spacing w:line="360" w:lineRule="auto"/>
+        <w:ind w:firstLine="480"/>
+      </w:pPr>
+      <w:r>
+        <w:t>从网络结构看，</w:t>
+      </w:r>
+      <w:r>
+        <w:t>YOLO</w:t>
+      </w:r>
+      <w:r>
+        <w:t>类检测器通常通过不同下采样倍率的特征图同时预测大、中、小尺度目标。对于</w:t>
+      </w:r>
+      <w:r>
+        <w:t>640×640</w:t>
+      </w:r>
+      <w:r>
+        <w:t>输入，常见检测头会在</w:t>
+      </w:r>
+      <w:r>
+        <w:t>80×80</w:t>
+      </w:r>
+      <w:r>
+        <w:t>、</w:t>
+      </w:r>
+      <w:r>
+        <w:t>40×40</w:t>
+      </w:r>
+      <w:r>
+        <w:t>和</w:t>
+      </w:r>
+      <w:r>
+        <w:t>20×20</w:t>
+      </w:r>
+      <w:r>
+        <w:t>等尺度上产生候选位置，从而兼顾定位精度和计算量。</w:t>
+      </w:r>
+      <w:r>
+        <w:t>YOLOv10</w:t>
+      </w:r>
+      <w:r>
+        <w:t>进一步提出端到端训练与</w:t>
+      </w:r>
+      <w:r>
+        <w:t>NMS-free</w:t>
+      </w:r>
+      <w:r>
+        <w:t>设计，用于减少传统非极大值抑制带来的后处理开销</w:t>
+      </w:r>
+      <w:r>
+        <w:t>[3]</w:t>
+      </w:r>
+      <w:r>
+        <w:t>。但在</w:t>
+      </w:r>
+      <w:r>
+        <w:t>RKNN</w:t>
+      </w:r>
+      <w:r>
+        <w:t>端侧部署时，模型输出格式、算子兼容性和后处理可控性同样重要，因此本文采用</w:t>
+      </w:r>
+      <w:r>
+        <w:t>end2end=False</w:t>
+      </w:r>
+      <w:r>
+        <w:t>的导出方式，在</w:t>
+      </w:r>
+      <w:r>
+        <w:t>C++17</w:t>
+      </w:r>
+      <w:r>
+        <w:t>程序中完成置信度筛选、坐标还原和</w:t>
+      </w:r>
+      <w:r>
+        <w:t>NMS</w:t>
+      </w:r>
+      <w:r>
+        <w:t>处理。</w:t>
+      </w:r>
+    </w:p>
+    <w:p>
+      <w:pPr>
+        <w:spacing w:line="360" w:lineRule="auto"/>
+        <w:ind w:firstLine="480"/>
+      </w:pPr>
+      <w:r>
+        <w:t>在嵌入式部署场景中，目标检测算法不仅需要关注精度指标，还需要关注参数量、计算量、内存访问和硬件算子支持情况。</w:t>
+      </w:r>
+      <w:r>
+        <w:t>MobileNetV2</w:t>
+      </w:r>
+      <w:r>
+        <w:t>等轻量化网络通过倒残差结构和深度可分离卷积降低计算开销</w:t>
+      </w:r>
+      <w:r>
+        <w:t>[18]</w:t>
+      </w:r>
+      <w:r>
+        <w:t>，模型量化则通过降低权重和激活位宽减少存储与推理成本</w:t>
+      </w:r>
+      <w:r>
+        <w:t>[17]</w:t>
+      </w:r>
+      <w:r>
+        <w:t>。这些研究说明，边缘端目标检测系统的性能通常由模型结构、数值精度、预处理链路和硬件运行时共同决定。</w:t>
+      </w:r>
+    </w:p>
+    <w:p>
+      <w:pPr>
         <w:spacing w:before="240" w:after="120" w:line="360" w:lineRule="auto"/>
         <w:outlineLvl w:val="1"/>
       </w:pPr>
-      <w:bookmarkStart w:id="7" w:name="_Toc228349033"/>
+      <w:bookmarkStart w:id="7" w:name="_Toc228357903"/>
       <w:r>
         <w:rPr>
           <w:rFonts w:eastAsia="黑体"/>
@@ -7762,7 +7804,14 @@
         <w:rPr>
           <w:szCs w:val="24"/>
         </w:rPr>
-        <w:t>在地面对空拍摄场景中，远距离无人机在画面中所占像素较少，目标外观信息有限，且容易与鸟类、云层、树枝、建筑边缘和图像噪声混淆。当目标尺寸较小时，轻微的定位偏差就可能导致</w:t>
+        <w:t>在地面对空拍摄场景中，远距离无人机在画面中所占像素较少，目标外观信息有限，且容易与鸟类、</w:t>
+      </w:r>
+      <w:r>
+        <w:rPr>
+          <w:szCs w:val="24"/>
+        </w:rPr>
+        <w:lastRenderedPageBreak/>
+        <w:t>云层、树枝、建筑边缘和图像噪声混淆。当目标尺寸较小时，轻微的定位偏差就可能导致</w:t>
       </w:r>
       <w:r>
         <w:rPr>
@@ -7794,7 +7843,7 @@
         <w:spacing w:before="240" w:after="120" w:line="360" w:lineRule="auto"/>
         <w:outlineLvl w:val="1"/>
       </w:pPr>
-      <w:bookmarkStart w:id="8" w:name="_Toc228349034"/>
+      <w:bookmarkStart w:id="8" w:name="_Toc228357904"/>
       <w:r>
         <w:rPr>
           <w:rFonts w:eastAsia="黑体"/>
@@ -7947,15 +7996,7 @@
           <w:rFonts w:hint="eastAsia"/>
           <w:szCs w:val="24"/>
         </w:rPr>
-        <w:t>、神经网络处</w:t>
-      </w:r>
-      <w:r>
-        <w:rPr>
-          <w:rFonts w:hint="eastAsia"/>
-          <w:szCs w:val="24"/>
-        </w:rPr>
-        <w:lastRenderedPageBreak/>
-        <w:t>理单元（</w:t>
+        <w:t>、神经网络处理单元（</w:t>
       </w:r>
       <w:r>
         <w:rPr>
@@ -8535,7 +8576,15 @@
           <w:rFonts w:hint="eastAsia"/>
           <w:szCs w:val="24"/>
         </w:rPr>
-        <w:t>指标，但</w:t>
+        <w:t>指标，</w:t>
+      </w:r>
+      <w:r>
+        <w:rPr>
+          <w:rFonts w:hint="eastAsia"/>
+          <w:szCs w:val="24"/>
+        </w:rPr>
+        <w:lastRenderedPageBreak/>
+        <w:t>但</w:t>
       </w:r>
       <w:r>
         <w:rPr>
@@ -8657,7 +8706,7 @@
         <w:spacing w:before="240" w:after="120" w:line="360" w:lineRule="auto"/>
         <w:outlineLvl w:val="1"/>
       </w:pPr>
-      <w:bookmarkStart w:id="9" w:name="_Toc228349035"/>
+      <w:bookmarkStart w:id="9" w:name="_Toc228357905"/>
       <w:r>
         <w:rPr>
           <w:rFonts w:eastAsia="黑体"/>
@@ -8723,14 +8772,7 @@
         <w:rPr>
           <w:szCs w:val="24"/>
         </w:rPr>
-        <w:t>通常情况</w:t>
-      </w:r>
-      <w:r>
-        <w:rPr>
-          <w:szCs w:val="24"/>
-        </w:rPr>
-        <w:lastRenderedPageBreak/>
-        <w:t>下，训练得到的</w:t>
+        <w:t>通常情况下，训练得到的</w:t>
       </w:r>
       <w:r>
         <w:rPr>
@@ -8806,70 +8848,166 @@
         <w:ind w:firstLine="480"/>
       </w:pPr>
       <w:r>
-        <w:rPr>
-          <w:szCs w:val="24"/>
-        </w:rPr>
+        <w:t>在板端运行阶段，</w:t>
+      </w:r>
+      <w:r>
+        <w:t>RKNN Runtime</w:t>
+      </w:r>
+      <w:r>
+        <w:t>的核心调用流程包括模型初始化、输入设置、</w:t>
+      </w:r>
+      <w:r>
+        <w:t>NPU</w:t>
+      </w:r>
+      <w:r>
+        <w:t>执行和输出读取。程序通常先通过</w:t>
+      </w:r>
+      <w:r>
+        <w:t>rknn_init</w:t>
+      </w:r>
+      <w:r>
+        <w:t>加载</w:t>
+      </w:r>
+      <w:r>
+        <w:t>RKNN</w:t>
+      </w:r>
+      <w:r>
+        <w:t>模型并查询输入输出张量属性，再调用</w:t>
+      </w:r>
+      <w:r>
+        <w:t>rknn_inputs_set</w:t>
+      </w:r>
+      <w:r>
+        <w:t>或</w:t>
+      </w:r>
+      <w:r>
+        <w:t>rknn_set_io_mem</w:t>
+      </w:r>
+      <w:r>
+        <w:t>设置输入数据，随后执行</w:t>
+      </w:r>
+      <w:r>
+        <w:t>rknn_run</w:t>
+      </w:r>
+      <w:r>
+        <w:t>触发</w:t>
+      </w:r>
+      <w:r>
+        <w:t>NPU</w:t>
+      </w:r>
+      <w:r>
+        <w:t>推理，最后通过</w:t>
+      </w:r>
+      <w:r>
+        <w:t>rknn_outputs_get</w:t>
+      </w:r>
+      <w:r>
+        <w:t>读取输出张量并在应用侧完成解码。本文的阶段耗时分析正是围绕</w:t>
+      </w:r>
+      <w:r>
+        <w:t>prepare</w:t>
+      </w:r>
+      <w:r>
+        <w:t>、</w:t>
+      </w:r>
+      <w:r>
+        <w:t>input_set_or_update</w:t>
+      </w:r>
+      <w:r>
+        <w:t>、</w:t>
+      </w:r>
+      <w:r>
+        <w:t>rknn_run</w:t>
+      </w:r>
+      <w:r>
+        <w:t>、</w:t>
+      </w:r>
+      <w:r>
+        <w:t>outputs_get</w:t>
+      </w:r>
+      <w:r>
+        <w:t>、</w:t>
+      </w:r>
+      <w:r>
+        <w:t>decode</w:t>
+      </w:r>
+      <w:r>
+        <w:t>和</w:t>
+      </w:r>
+      <w:r>
+        <w:t>render</w:t>
+      </w:r>
+      <w:r>
+        <w:t>等环节展开，用于判断瓶颈位于</w:t>
+      </w:r>
+      <w:r>
+        <w:t>NPU</w:t>
+      </w:r>
+      <w:r>
+        <w:t>计算、输入设置还是后处理阶段。</w:t>
+      </w:r>
+    </w:p>
+    <w:p>
+      <w:pPr>
+        <w:spacing w:line="360" w:lineRule="auto"/>
+        <w:ind w:firstLine="480"/>
+      </w:pPr>
+      <w:r>
         <w:t>本文当前稳定主路径采用浮点</w:t>
       </w:r>
       <w:r>
-        <w:rPr>
-          <w:szCs w:val="24"/>
-        </w:rPr>
         <w:t>RKNN</w:t>
       </w:r>
       <w:r>
-        <w:rPr>
-          <w:szCs w:val="24"/>
-        </w:rPr>
         <w:t>模型。虽然</w:t>
       </w:r>
       <w:r>
-        <w:rPr>
-          <w:szCs w:val="24"/>
-        </w:rPr>
         <w:t>INT8</w:t>
       </w:r>
       <w:r>
-        <w:rPr>
-          <w:szCs w:val="24"/>
-        </w:rPr>
-        <w:t>量化理论上可以降低计算和存储开销，但量化需要校准数据、误差分析和板端精度验证。</w:t>
-      </w:r>
-      <w:r>
-        <w:rPr>
-          <w:szCs w:val="24"/>
-        </w:rPr>
-        <w:t>考虑到当前系统已稳定运行浮点模型</w:t>
-      </w:r>
-      <w:r>
-        <w:rPr>
-          <w:szCs w:val="24"/>
-        </w:rPr>
-        <w:t>，本文将</w:t>
-      </w:r>
-      <w:r>
-        <w:rPr>
-          <w:szCs w:val="24"/>
-        </w:rPr>
+        <w:t>量化理论上可以降低计算和存储开销，相关研究表明整数推理能够显著减少模型存储和算术开销</w:t>
+      </w:r>
+      <w:r>
+        <w:t>[17]</w:t>
+      </w:r>
+      <w:r>
+        <w:t>，但量化部署需要校准数据、误差分析和板端精度验证。本文已完成</w:t>
+      </w:r>
+      <w:r>
+        <w:t>INT8 RKNN</w:t>
+      </w:r>
+      <w:r>
+        <w:t>模型的离线转换，并建立了</w:t>
+      </w:r>
+      <w:r>
+        <w:t>FP</w:t>
+      </w:r>
+      <w:r>
+        <w:t>、</w:t>
+      </w:r>
+      <w:r>
+        <w:t>INT8</w:t>
+      </w:r>
+      <w:r>
+        <w:t>、</w:t>
+      </w:r>
+      <w:r>
+        <w:t>RGA</w:t>
+      </w:r>
+      <w:r>
+        <w:t>和</w:t>
+      </w:r>
+      <w:r>
+        <w:t>zero-copy</w:t>
+      </w:r>
+      <w:r>
+        <w:t>的板端对比实验脚本；在尚未完成充分板端精度与速度对比前，本文仍将</w:t>
+      </w:r>
+      <w:r>
         <w:t>FP RKNN</w:t>
       </w:r>
       <w:r>
-        <w:rPr>
-          <w:szCs w:val="24"/>
-        </w:rPr>
-        <w:t>作为主要实验对象，</w:t>
-      </w:r>
-      <w:r>
-        <w:rPr>
-          <w:szCs w:val="24"/>
-        </w:rPr>
-        <w:t>INT8</w:t>
-      </w:r>
-      <w:r>
-        <w:rPr>
-          <w:szCs w:val="24"/>
-        </w:rPr>
-        <w:t>量化作为后续优化方向进行讨论，而不将其写成已经完整完成的优化结果。</w:t>
+        <w:t>作为主要演示和结论依据。</w:t>
       </w:r>
     </w:p>
     <w:p>
@@ -8877,7 +9015,7 @@
         <w:spacing w:before="240" w:after="120" w:line="360" w:lineRule="auto"/>
         <w:outlineLvl w:val="1"/>
       </w:pPr>
-      <w:bookmarkStart w:id="10" w:name="_Toc228349036"/>
+      <w:bookmarkStart w:id="10" w:name="_Toc228357906"/>
       <w:r>
         <w:rPr>
           <w:rFonts w:eastAsia="黑体"/>
@@ -8925,7 +9063,14 @@
         <w:rPr>
           <w:szCs w:val="24"/>
         </w:rPr>
-        <w:t>实时视频检测系统通常包含多个具有不同耗时特征的处理阶段。如果所有阶段在单线程中串行执行，系统整体帧率会受到最慢阶段限制，同时难以充分利用多核</w:t>
+        <w:t>实时视频检测系统通常包含多个具有不同耗时特征的处理阶段。如果所有阶段在</w:t>
+      </w:r>
+      <w:r>
+        <w:rPr>
+          <w:szCs w:val="24"/>
+        </w:rPr>
+        <w:lastRenderedPageBreak/>
+        <w:t>单线程中串行执行，系统整体帧率会受到最慢阶段限制，同时难以充分利用多核</w:t>
       </w:r>
       <w:r>
         <w:rPr>
@@ -8958,101 +9103,82 @@
         <w:ind w:firstLine="480"/>
       </w:pPr>
       <w:r>
-        <w:rPr>
-          <w:szCs w:val="24"/>
-        </w:rPr>
         <w:t>本文系统采用</w:t>
       </w:r>
       <w:r>
-        <w:rPr>
-          <w:szCs w:val="24"/>
-        </w:rPr>
-        <w:t>C++17</w:t>
-      </w:r>
-      <w:r>
-        <w:rPr>
-          <w:szCs w:val="24"/>
-        </w:rPr>
-        <w:t xml:space="preserve"> </w:t>
-      </w:r>
-      <w:r>
-        <w:rPr>
-          <w:szCs w:val="24"/>
-        </w:rPr>
+        <w:t xml:space="preserve">C++17 </w:t>
+      </w:r>
+      <w:r>
         <w:t>实现板端程序，主要原因在于</w:t>
       </w:r>
       <w:r>
-        <w:rPr>
-          <w:szCs w:val="24"/>
-        </w:rPr>
-        <w:t>C++17</w:t>
-      </w:r>
-      <w:r>
-        <w:rPr>
-          <w:szCs w:val="24"/>
-        </w:rPr>
-        <w:t xml:space="preserve"> </w:t>
-      </w:r>
-      <w:r>
-        <w:rPr>
-          <w:szCs w:val="24"/>
-        </w:rPr>
-        <w:t>便于直接调用</w:t>
-      </w:r>
-      <w:r>
-        <w:rPr>
-          <w:szCs w:val="24"/>
-        </w:rPr>
+        <w:t xml:space="preserve">C++17 </w:t>
+      </w:r>
+      <w:r>
+        <w:t>是嵌入式</w:t>
+      </w:r>
+      <w:r>
+        <w:t>Linux</w:t>
+      </w:r>
+      <w:r>
+        <w:t>环境中较成熟的系统级开发语言标准</w:t>
+      </w:r>
+      <w:r>
+        <w:t>[20]</w:t>
+      </w:r>
+      <w:r>
+        <w:t>，便于直接调用</w:t>
+      </w:r>
+      <w:r>
         <w:t>RKNN Runtime</w:t>
       </w:r>
       <w:r>
-        <w:rPr>
-          <w:szCs w:val="24"/>
-        </w:rPr>
         <w:t>、</w:t>
       </w:r>
       <w:r>
-        <w:rPr>
-          <w:szCs w:val="24"/>
-        </w:rPr>
         <w:t>OpenCV</w:t>
       </w:r>
       <w:r>
-        <w:rPr>
-          <w:szCs w:val="24"/>
-        </w:rPr>
         <w:t>和</w:t>
       </w:r>
       <w:r>
-        <w:rPr>
-          <w:szCs w:val="24"/>
-        </w:rPr>
         <w:t>GStreamer</w:t>
       </w:r>
       <w:r>
-        <w:rPr>
-          <w:szCs w:val="24"/>
-        </w:rPr>
         <w:t>等底层库，并能够更精细地控制线程、队列和内存生命周期</w:t>
       </w:r>
       <w:r>
-        <w:rPr>
-          <w:szCs w:val="24"/>
-          <w:vertAlign w:val="superscript"/>
-        </w:rPr>
         <w:t>[7,10-11]</w:t>
       </w:r>
       <w:r>
-        <w:rPr>
-          <w:szCs w:val="24"/>
-        </w:rPr>
-        <w:t>。</w:t>
-      </w:r>
-      <w:r>
-        <w:rPr>
-          <w:szCs w:val="24"/>
-        </w:rPr>
-        <w:t>在线程协作方面，系统使用有限长度队列连接不同模块，避免输入速度高于处理速度时造成无限堆积。对于实时显示任务，系统更关注最新帧和低延迟，因此在必要时允许丢弃过旧帧，以换取更好的观看响应。</w:t>
+        <w:t>。在线程协作方面，系统使用有限长度队列连接不同模块，避免输入速度高于处理速度时造成无限堆积。对于实时显示任务，系统更关注最新帧和低延迟，因此在必要时允许丢弃过旧帧，以换取更好的观看响应。</w:t>
+      </w:r>
+    </w:p>
+    <w:p>
+      <w:pPr>
+        <w:spacing w:line="360" w:lineRule="auto"/>
+        <w:ind w:firstLine="480"/>
+      </w:pPr>
+      <w:r>
+        <w:t>具体实现中，采集线程、推理线程和推流线程通过互斥锁、条件变量和原子变量进行同步。有限队列用于在不同处理阶段之间传递帧数据和检测结果，既能吸收短时间的处理抖动，又能在系统过载时限制内存增长。多</w:t>
+      </w:r>
+      <w:r>
+        <w:t>context</w:t>
+      </w:r>
+      <w:r>
+        <w:t>推理模式则在每帧检测实验中创建多个独立</w:t>
+      </w:r>
+      <w:r>
+        <w:t>RKNN</w:t>
+      </w:r>
+      <w:r>
+        <w:t>上下文，使多个工作线程能够并行提交推理任务，从而更充分地利用</w:t>
+      </w:r>
+      <w:r>
+        <w:t>RK3588 NPU</w:t>
+      </w:r>
+      <w:r>
+        <w:t>资源。</w:t>
       </w:r>
     </w:p>
     <w:p>
@@ -9060,7 +9186,7 @@
         <w:spacing w:before="240" w:after="120" w:line="360" w:lineRule="auto"/>
         <w:outlineLvl w:val="1"/>
       </w:pPr>
-      <w:bookmarkStart w:id="11" w:name="_Toc228349037"/>
+      <w:bookmarkStart w:id="11" w:name="_Toc228357907"/>
       <w:r>
         <w:rPr>
           <w:rFonts w:eastAsia="黑体"/>
@@ -9146,7 +9272,7 @@
         <w:jc w:val="center"/>
         <w:outlineLvl w:val="0"/>
       </w:pPr>
-      <w:bookmarkStart w:id="12" w:name="_Toc228349038"/>
+      <w:bookmarkStart w:id="12" w:name="_Toc228357908"/>
       <w:r>
         <w:rPr>
           <w:rFonts w:eastAsia="黑体"/>
@@ -9338,7 +9464,7 @@
         <w:spacing w:before="240" w:after="120" w:line="360" w:lineRule="auto"/>
         <w:outlineLvl w:val="1"/>
       </w:pPr>
-      <w:bookmarkStart w:id="13" w:name="_Toc228349039"/>
+      <w:bookmarkStart w:id="13" w:name="_Toc228357909"/>
       <w:r>
         <w:rPr>
           <w:rFonts w:eastAsia="黑体"/>
@@ -9364,7 +9490,7 @@
         <w:spacing w:before="180" w:after="80" w:line="360" w:lineRule="auto"/>
         <w:outlineLvl w:val="2"/>
       </w:pPr>
-      <w:bookmarkStart w:id="14" w:name="_Toc228349040"/>
+      <w:bookmarkStart w:id="14" w:name="_Toc228357910"/>
       <w:r>
         <w:rPr>
           <w:rFonts w:eastAsia="黑体"/>
@@ -10184,7 +10310,7 @@
         <w:spacing w:before="180" w:after="80" w:line="360" w:lineRule="auto"/>
         <w:outlineLvl w:val="2"/>
       </w:pPr>
-      <w:bookmarkStart w:id="15" w:name="_Toc228349041"/>
+      <w:bookmarkStart w:id="15" w:name="_Toc228357911"/>
       <w:r>
         <w:rPr>
           <w:rFonts w:eastAsia="黑体"/>
@@ -11011,7 +11137,7 @@
         <w:spacing w:before="180" w:after="80" w:line="360" w:lineRule="auto"/>
         <w:outlineLvl w:val="2"/>
       </w:pPr>
-      <w:bookmarkStart w:id="16" w:name="_Toc228349042"/>
+      <w:bookmarkStart w:id="16" w:name="_Toc228357912"/>
       <w:r>
         <w:rPr>
           <w:rFonts w:eastAsia="黑体"/>
@@ -11252,7 +11378,7 @@
         <w:spacing w:before="240" w:after="120" w:line="360" w:lineRule="auto"/>
         <w:outlineLvl w:val="1"/>
       </w:pPr>
-      <w:bookmarkStart w:id="17" w:name="_Toc228349043"/>
+      <w:bookmarkStart w:id="17" w:name="_Toc228357913"/>
       <w:r>
         <w:rPr>
           <w:rFonts w:eastAsia="黑体"/>
@@ -11282,6 +11408,7 @@
         <w:rPr>
           <w:szCs w:val="24"/>
         </w:rPr>
+        <w:lastRenderedPageBreak/>
         <w:t>本文系统采用</w:t>
       </w:r>
       <w:r>
@@ -11306,14 +11433,7 @@
         <w:rPr>
           <w:szCs w:val="24"/>
         </w:rPr>
-        <w:t>推理层、后处理层、策略控制层和</w:t>
-      </w:r>
-      <w:r>
-        <w:rPr>
-          <w:szCs w:val="24"/>
-        </w:rPr>
-        <w:lastRenderedPageBreak/>
-        <w:t>结果输出层</w:t>
+        <w:t>推理层、后处理层、策略控制层和结果输出层</w:t>
       </w:r>
       <w:r>
         <w:rPr>
@@ -11563,7 +11683,7 @@
         <w:spacing w:before="240" w:after="120" w:line="360" w:lineRule="auto"/>
         <w:outlineLvl w:val="1"/>
       </w:pPr>
-      <w:bookmarkStart w:id="18" w:name="_Toc228349044"/>
+      <w:bookmarkStart w:id="18" w:name="_Toc228357914"/>
       <w:r>
         <w:rPr>
           <w:rFonts w:eastAsia="黑体"/>
@@ -11589,7 +11709,7 @@
         <w:spacing w:before="180" w:after="80" w:line="360" w:lineRule="auto"/>
         <w:outlineLvl w:val="2"/>
       </w:pPr>
-      <w:bookmarkStart w:id="19" w:name="_Toc228349045"/>
+      <w:bookmarkStart w:id="19" w:name="_Toc228357915"/>
       <w:r>
         <w:rPr>
           <w:rFonts w:eastAsia="黑体"/>
@@ -12154,7 +12274,7 @@
         <w:spacing w:before="180" w:after="80" w:line="360" w:lineRule="auto"/>
         <w:outlineLvl w:val="2"/>
       </w:pPr>
-      <w:bookmarkStart w:id="20" w:name="_Toc228349046"/>
+      <w:bookmarkStart w:id="20" w:name="_Toc228357916"/>
       <w:r>
         <w:rPr>
           <w:rFonts w:eastAsia="黑体"/>
@@ -12336,7 +12456,7 @@
         <w:spacing w:before="240" w:after="120" w:line="360" w:lineRule="auto"/>
         <w:outlineLvl w:val="1"/>
       </w:pPr>
-      <w:bookmarkStart w:id="21" w:name="_Toc228349047"/>
+      <w:bookmarkStart w:id="21" w:name="_Toc228357917"/>
       <w:r>
         <w:rPr>
           <w:rFonts w:eastAsia="黑体"/>
@@ -12362,7 +12482,7 @@
         <w:spacing w:before="180" w:after="80" w:line="360" w:lineRule="auto"/>
         <w:outlineLvl w:val="2"/>
       </w:pPr>
-      <w:bookmarkStart w:id="22" w:name="_Toc228349048"/>
+      <w:bookmarkStart w:id="22" w:name="_Toc228357918"/>
       <w:r>
         <w:rPr>
           <w:rFonts w:eastAsia="黑体"/>
@@ -12508,7 +12628,7 @@
         <w:spacing w:before="180" w:after="80" w:line="360" w:lineRule="auto"/>
         <w:outlineLvl w:val="2"/>
       </w:pPr>
-      <w:bookmarkStart w:id="23" w:name="_Toc228349049"/>
+      <w:bookmarkStart w:id="23" w:name="_Toc228357919"/>
       <w:r>
         <w:rPr>
           <w:rFonts w:eastAsia="黑体"/>
@@ -12623,7 +12743,7 @@
         <w:spacing w:before="240" w:after="120" w:line="360" w:lineRule="auto"/>
         <w:outlineLvl w:val="1"/>
       </w:pPr>
-      <w:bookmarkStart w:id="24" w:name="_Toc228349050"/>
+      <w:bookmarkStart w:id="24" w:name="_Toc228357920"/>
       <w:r>
         <w:rPr>
           <w:rFonts w:eastAsia="黑体"/>
@@ -12667,7 +12787,7 @@
         <w:spacing w:before="180" w:after="80" w:line="360" w:lineRule="auto"/>
         <w:outlineLvl w:val="2"/>
       </w:pPr>
-      <w:bookmarkStart w:id="25" w:name="_Toc228349051"/>
+      <w:bookmarkStart w:id="25" w:name="_Toc228357921"/>
       <w:r>
         <w:rPr>
           <w:rFonts w:eastAsia="黑体"/>
@@ -12917,7 +13037,7 @@
         <w:spacing w:before="180" w:after="80" w:line="360" w:lineRule="auto"/>
         <w:outlineLvl w:val="2"/>
       </w:pPr>
-      <w:bookmarkStart w:id="26" w:name="_Toc228349052"/>
+      <w:bookmarkStart w:id="26" w:name="_Toc228357922"/>
       <w:r>
         <w:rPr>
           <w:rFonts w:eastAsia="黑体"/>
@@ -13053,7 +13173,7 @@
         <w:spacing w:before="180" w:after="80" w:line="360" w:lineRule="auto"/>
         <w:outlineLvl w:val="2"/>
       </w:pPr>
-      <w:bookmarkStart w:id="27" w:name="_Toc228349053"/>
+      <w:bookmarkStart w:id="27" w:name="_Toc228357923"/>
       <w:r>
         <w:rPr>
           <w:rFonts w:eastAsia="黑体"/>
@@ -13094,25 +13214,13 @@
         </w:rPr>
       </w:pPr>
       <w:r>
-        <w:rPr>
-          <w:rFonts w:hint="eastAsia"/>
-          <w:szCs w:val="24"/>
-        </w:rPr>
         <w:t>本文实现的轻量跟踪包含运动预测和光流跟踪两种模式。在</w:t>
       </w:r>
       <w:r>
-        <w:rPr>
-          <w:rFonts w:hint="eastAsia"/>
-          <w:szCs w:val="24"/>
-        </w:rPr>
         <w:t>TrackMode::kMotion</w:t>
       </w:r>
       <w:r>
-        <w:rPr>
-          <w:rFonts w:hint="eastAsia"/>
-          <w:szCs w:val="24"/>
-        </w:rPr>
-        <w:t>模式下，系统根据相邻检测帧之间检测框中心点位移估计目标运动方向，并将该位移外推到未执行完整检测的帧上。该方法计算量较小，不依赖额外训练模型，适合目标运动较平稳且检测间隔较短的实时演示场景。当目标突然加速或检测框本身存在明显跳变时，系统会通过边界裁剪和周期性全帧检测降低漂移风险。</w:t>
+        <w:t>模式下，系统根据连续两次检测结果的检测框中心点位移向量进行线性运动预测，并将预测位移外推到未执行完整检测的帧上。为避免小目标检测框偶发跳变导致显示框快速漂移，程序对单步位移量设置约束上限，并结合边界裁剪和周期性全帧检测进行修正。该方法计算量较小，不依赖额外训练模型，适合目标运动较平稳且检测间隔较短的实时演示场景。</w:t>
       </w:r>
     </w:p>
     <w:p>
@@ -13124,81 +13232,67 @@
         </w:rPr>
       </w:pPr>
       <w:r>
-        <w:rPr>
-          <w:rFonts w:hint="eastAsia"/>
-          <w:szCs w:val="24"/>
-        </w:rPr>
         <w:t>在</w:t>
       </w:r>
       <w:r>
-        <w:rPr>
-          <w:rFonts w:hint="eastAsia"/>
-          <w:szCs w:val="24"/>
-        </w:rPr>
         <w:t>TrackMode::kOpticalFlow</w:t>
       </w:r>
       <w:r>
-        <w:rPr>
-          <w:rFonts w:hint="eastAsia"/>
-          <w:szCs w:val="24"/>
-        </w:rPr>
         <w:t>模式下，系统采用</w:t>
       </w:r>
       <w:r>
-        <w:rPr>
-          <w:rFonts w:hint="eastAsia"/>
-          <w:szCs w:val="24"/>
-        </w:rPr>
         <w:t>Lucas-Kanade</w:t>
       </w:r>
       <w:r>
-        <w:rPr>
-          <w:rFonts w:hint="eastAsia"/>
-          <w:szCs w:val="24"/>
-        </w:rPr>
-        <w:t>稀疏光流方法估计目标区域运动。具体而言，系统首先在上一帧检测框或动态</w:t>
-      </w:r>
-      <w:r>
-        <w:rPr>
-          <w:rFonts w:hint="eastAsia"/>
-          <w:szCs w:val="24"/>
-        </w:rPr>
+        <w:t>稀疏光流方法估计目标区域运动</w:t>
+      </w:r>
+      <w:r>
+        <w:t>[15]</w:t>
+      </w:r>
+      <w:r>
+        <w:t>。具体而言，系统首先在上一帧检测框或动态</w:t>
+      </w:r>
+      <w:r>
         <w:t>ROI</w:t>
       </w:r>
       <w:r>
-        <w:rPr>
-          <w:rFonts w:hint="eastAsia"/>
-          <w:szCs w:val="24"/>
-        </w:rPr>
         <w:t>区域内利用</w:t>
       </w:r>
       <w:r>
-        <w:rPr>
-          <w:rFonts w:hint="eastAsia"/>
-          <w:szCs w:val="24"/>
-        </w:rPr>
         <w:t>goodFeaturesToTrack</w:t>
       </w:r>
       <w:r>
-        <w:rPr>
-          <w:rFonts w:hint="eastAsia"/>
-          <w:szCs w:val="24"/>
-        </w:rPr>
-        <w:t>提取角点特征，然后调用</w:t>
-      </w:r>
-      <w:r>
-        <w:rPr>
-          <w:rFonts w:hint="eastAsia"/>
-          <w:szCs w:val="24"/>
-        </w:rPr>
+        <w:t>提取</w:t>
+      </w:r>
+      <w:r>
+        <w:t>Shi-Tomasi</w:t>
+      </w:r>
+      <w:r>
+        <w:t>角点特征</w:t>
+      </w:r>
+      <w:r>
+        <w:t>[16]</w:t>
+      </w:r>
+      <w:r>
+        <w:t>，然后调用</w:t>
+      </w:r>
+      <w:r>
         <w:t>cv::calcOpticalFlowPyrLK</w:t>
       </w:r>
       <w:r>
-        <w:rPr>
-          <w:rFonts w:hint="eastAsia"/>
-          <w:szCs w:val="24"/>
-        </w:rPr>
-        <w:t>计算这些特征点在当前帧中的对应位置。为了抑制异常点影响，系统不直接使用所有光流位移的平均值，而是计算有效特征点位移的中值，并将该中值位移作用到上一帧检测框上。当有效特征点数量不足或光流跟踪失败时，系统退回到运动预测或上一帧框复用策略，从而保证显示过程连续。</w:t>
+        <w:t>计算这些特征点在当前帧中的对应位置。为了抑制异常点影响，系统不直接使用所有光流位移的平均值，而是计算有效特征点位移的中值，并将该中值位移作用到上一帧检测框上。当有效特征点数量不足或光流跟踪失败时，系统退回到运动预测或上一帧框复用策略，从而保证显示过程连续。与</w:t>
+      </w:r>
+      <w:r>
+        <w:t>DeepSORT</w:t>
+      </w:r>
+      <w:r>
+        <w:t>等完整多目标跟踪框架相比</w:t>
+      </w:r>
+      <w:r>
+        <w:t>[19]</w:t>
+      </w:r>
+      <w:r>
+        <w:t>，本文跟踪模块仅服务于检测间隔期间的显示框连续性，不承担跨目标身份保持任务。</w:t>
       </w:r>
     </w:p>
     <w:p>
@@ -13360,7 +13454,7 @@
         <w:spacing w:before="240" w:after="120" w:line="360" w:lineRule="auto"/>
         <w:outlineLvl w:val="1"/>
       </w:pPr>
-      <w:bookmarkStart w:id="28" w:name="_Toc228349054"/>
+      <w:bookmarkStart w:id="28" w:name="_Toc228357924"/>
       <w:r>
         <w:rPr>
           <w:rFonts w:eastAsia="黑体"/>
@@ -13404,7 +13498,7 @@
         <w:spacing w:before="180" w:after="80" w:line="360" w:lineRule="auto"/>
         <w:outlineLvl w:val="2"/>
       </w:pPr>
-      <w:bookmarkStart w:id="29" w:name="_Toc228349055"/>
+      <w:bookmarkStart w:id="29" w:name="_Toc228357925"/>
       <w:r>
         <w:rPr>
           <w:rFonts w:eastAsia="黑体"/>
@@ -13448,6 +13542,7 @@
         <w:rPr>
           <w:szCs w:val="24"/>
         </w:rPr>
+        <w:lastRenderedPageBreak/>
         <w:t>RK3588</w:t>
       </w:r>
       <w:r>
@@ -13514,14 +13609,7 @@
         <w:rPr>
           <w:szCs w:val="24"/>
         </w:rPr>
-        <w:t>并行推理结构，即创</w:t>
-      </w:r>
-      <w:r>
-        <w:rPr>
-          <w:szCs w:val="24"/>
-        </w:rPr>
-        <w:lastRenderedPageBreak/>
-        <w:t>建多个</w:t>
+        <w:t>并行推理结构，即创建多个</w:t>
       </w:r>
       <w:r>
         <w:rPr>
@@ -13701,7 +13789,7 @@
         <w:spacing w:before="180" w:after="80" w:line="360" w:lineRule="auto"/>
         <w:outlineLvl w:val="2"/>
       </w:pPr>
-      <w:bookmarkStart w:id="30" w:name="_Toc228349056"/>
+      <w:bookmarkStart w:id="30" w:name="_Toc228357926"/>
       <w:r>
         <w:rPr>
           <w:rFonts w:eastAsia="黑体"/>
@@ -13933,7 +14021,7 @@
         <w:spacing w:before="180" w:after="80" w:line="360" w:lineRule="auto"/>
         <w:outlineLvl w:val="2"/>
       </w:pPr>
-      <w:bookmarkStart w:id="31" w:name="_Toc228349057"/>
+      <w:bookmarkStart w:id="31" w:name="_Toc228357927"/>
       <w:r>
         <w:rPr>
           <w:rFonts w:eastAsia="黑体"/>
@@ -13973,7 +14061,14 @@
         <w:rPr>
           <w:szCs w:val="24"/>
         </w:rPr>
-        <w:t>运行、输出读取、检测解码和资源释放等阶段。通过记录各阶段耗时，可以判断瓶颈来自</w:t>
+        <w:t>运行、输出读取、检测解码和资源释放等阶段。</w:t>
+      </w:r>
+      <w:r>
+        <w:rPr>
+          <w:szCs w:val="24"/>
+        </w:rPr>
+        <w:lastRenderedPageBreak/>
+        <w:t>通过记录各阶段耗时，可以判断瓶颈来自</w:t>
       </w:r>
       <w:r>
         <w:rPr>
@@ -13997,14 +14092,7 @@
         <w:rPr>
           <w:szCs w:val="24"/>
         </w:rPr>
-        <w:t>阶段耗时分析的意义在于避免盲目优化。例如，如果后处理耗时很低，而输入设</w:t>
-      </w:r>
-      <w:r>
-        <w:rPr>
-          <w:szCs w:val="24"/>
-        </w:rPr>
-        <w:lastRenderedPageBreak/>
-        <w:t>置和</w:t>
+        <w:t>阶段耗时分析的意义在于避免盲目优化。例如，如果后处理耗时很低，而输入设置和</w:t>
       </w:r>
       <w:r>
         <w:rPr>
@@ -14060,7 +14148,7 @@
         <w:spacing w:before="240" w:after="120" w:line="360" w:lineRule="auto"/>
         <w:outlineLvl w:val="1"/>
       </w:pPr>
-      <w:bookmarkStart w:id="32" w:name="_Toc228349058"/>
+      <w:bookmarkStart w:id="32" w:name="_Toc228357928"/>
       <w:r>
         <w:rPr>
           <w:rFonts w:eastAsia="黑体"/>
@@ -14224,7 +14312,7 @@
         <w:jc w:val="center"/>
         <w:outlineLvl w:val="0"/>
       </w:pPr>
-      <w:bookmarkStart w:id="33" w:name="_Toc228349059"/>
+      <w:bookmarkStart w:id="33" w:name="_Toc228357929"/>
       <w:r>
         <w:rPr>
           <w:rFonts w:eastAsia="黑体"/>
@@ -14380,7 +14468,7 @@
         <w:spacing w:before="240" w:after="120" w:line="360" w:lineRule="auto"/>
         <w:outlineLvl w:val="1"/>
       </w:pPr>
-      <w:bookmarkStart w:id="34" w:name="_Toc228349060"/>
+      <w:bookmarkStart w:id="34" w:name="_Toc228357930"/>
       <w:r>
         <w:rPr>
           <w:rFonts w:eastAsia="黑体"/>
@@ -15673,7 +15761,7 @@
         <w:spacing w:before="240" w:after="120" w:line="360" w:lineRule="auto"/>
         <w:outlineLvl w:val="1"/>
       </w:pPr>
-      <w:bookmarkStart w:id="35" w:name="_Toc228349061"/>
+      <w:bookmarkStart w:id="35" w:name="_Toc228357931"/>
       <w:r>
         <w:rPr>
           <w:rFonts w:eastAsia="黑体"/>
@@ -16590,7 +16678,7 @@
         <w:spacing w:before="240" w:after="120" w:line="360" w:lineRule="auto"/>
         <w:outlineLvl w:val="1"/>
       </w:pPr>
-      <w:bookmarkStart w:id="36" w:name="_Toc228349062"/>
+      <w:bookmarkStart w:id="36" w:name="_Toc228357932"/>
       <w:r>
         <w:rPr>
           <w:rFonts w:eastAsia="黑体"/>
@@ -17898,7 +17986,7 @@
         <w:spacing w:before="240" w:after="120" w:line="360" w:lineRule="auto"/>
         <w:outlineLvl w:val="1"/>
       </w:pPr>
-      <w:bookmarkStart w:id="37" w:name="_Toc228349063"/>
+      <w:bookmarkStart w:id="37" w:name="_Toc228357933"/>
       <w:r>
         <w:rPr>
           <w:rFonts w:eastAsia="黑体"/>
@@ -18392,7 +18480,7 @@
         <w:spacing w:before="240" w:after="120" w:line="360" w:lineRule="auto"/>
         <w:outlineLvl w:val="1"/>
       </w:pPr>
-      <w:bookmarkStart w:id="38" w:name="_Toc228349064"/>
+      <w:bookmarkStart w:id="38" w:name="_Toc228357934"/>
       <w:r>
         <w:rPr>
           <w:rFonts w:eastAsia="黑体"/>
@@ -19200,7 +19288,7 @@
         <w:spacing w:before="240" w:after="120" w:line="360" w:lineRule="auto"/>
         <w:outlineLvl w:val="1"/>
       </w:pPr>
-      <w:bookmarkStart w:id="39" w:name="_Toc228349065"/>
+      <w:bookmarkStart w:id="39" w:name="_Toc228357935"/>
       <w:r>
         <w:rPr>
           <w:rFonts w:eastAsia="黑体"/>
@@ -19574,60 +19662,22 @@
         </w:rPr>
       </w:pPr>
       <w:r>
-        <w:rPr>
-          <w:rFonts w:hint="eastAsia"/>
-          <w:szCs w:val="24"/>
-        </w:rPr>
-        <w:t>在程序实现中，轻量跟踪模式通过</w:t>
-      </w:r>
-      <w:r>
-        <w:rPr>
-          <w:rFonts w:hint="eastAsia"/>
-          <w:szCs w:val="24"/>
-        </w:rPr>
-        <w:t>RK_YOLO_TRACK_MODE</w:t>
-      </w:r>
-      <w:r>
-        <w:rPr>
-          <w:rFonts w:hint="eastAsia"/>
-          <w:szCs w:val="24"/>
-        </w:rPr>
-        <w:t>参数选择。当跟</w:t>
-      </w:r>
-      <w:r>
-        <w:rPr>
-          <w:rFonts w:hint="eastAsia"/>
-          <w:szCs w:val="24"/>
-        </w:rPr>
+        <w:t>当跟踪模式为</w:t>
+      </w:r>
+      <w:r>
+        <w:t>TrackMode::kMotion</w:t>
+      </w:r>
+      <w:r>
+        <w:t>时，程序保存最近两次有效检测结果，根据检</w:t>
+      </w:r>
+      <w:r>
         <w:lastRenderedPageBreak/>
-        <w:t>踪模式为</w:t>
-      </w:r>
-      <w:r>
-        <w:rPr>
-          <w:rFonts w:hint="eastAsia"/>
-          <w:szCs w:val="24"/>
-        </w:rPr>
-        <w:t>TrackMode::kMotion</w:t>
-      </w:r>
-      <w:r>
-        <w:rPr>
-          <w:rFonts w:hint="eastAsia"/>
-          <w:szCs w:val="24"/>
-        </w:rPr>
-        <w:t>时，程序保存最近一次有效检测框及其历史位移，根据检测框中心点变化计算线性预测量，并在非关键帧中更新显示框位置。该方式只涉及少量坐标运算，</w:t>
-      </w:r>
-      <w:r>
-        <w:rPr>
-          <w:rFonts w:hint="eastAsia"/>
-          <w:szCs w:val="24"/>
-        </w:rPr>
+        <w:t>测框中心点位移向量进行线性运动预测，并对单步位移量进行限幅处理，防止检测框在目标很小或置信度波动时出现过大跳变。该方式只涉及少量坐标运算，</w:t>
+      </w:r>
+      <w:r>
         <w:t>CPU</w:t>
       </w:r>
       <w:r>
-        <w:rPr>
-          <w:rFonts w:hint="eastAsia"/>
-          <w:szCs w:val="24"/>
-        </w:rPr>
         <w:t>开销低，适合作为默认的轻量预测路径。</w:t>
       </w:r>
     </w:p>
@@ -20648,7 +20698,7 @@
         <w:spacing w:before="240" w:after="120" w:line="360" w:lineRule="auto"/>
         <w:outlineLvl w:val="1"/>
       </w:pPr>
-      <w:bookmarkStart w:id="40" w:name="_Toc228349066"/>
+      <w:bookmarkStart w:id="40" w:name="_Toc228357936"/>
       <w:r>
         <w:rPr>
           <w:rFonts w:eastAsia="黑体"/>
@@ -21786,7 +21836,7 @@
         <w:spacing w:before="240" w:after="120" w:line="360" w:lineRule="auto"/>
         <w:outlineLvl w:val="1"/>
       </w:pPr>
-      <w:bookmarkStart w:id="41" w:name="_Toc228349067"/>
+      <w:bookmarkStart w:id="41" w:name="_Toc228357937"/>
       <w:r>
         <w:rPr>
           <w:rFonts w:eastAsia="黑体"/>
@@ -22258,7 +22308,7 @@
         <w:spacing w:before="240" w:after="120" w:line="360" w:lineRule="auto"/>
         <w:outlineLvl w:val="1"/>
       </w:pPr>
-      <w:bookmarkStart w:id="42" w:name="_Toc228349068"/>
+      <w:bookmarkStart w:id="42" w:name="_Toc228357938"/>
       <w:r>
         <w:rPr>
           <w:rFonts w:eastAsia="黑体"/>
@@ -22579,7 +22629,7 @@
         <w:jc w:val="center"/>
         <w:outlineLvl w:val="0"/>
       </w:pPr>
-      <w:bookmarkStart w:id="43" w:name="_Toc228349069"/>
+      <w:bookmarkStart w:id="43" w:name="_Toc228357939"/>
       <w:r>
         <w:rPr>
           <w:rFonts w:eastAsia="黑体"/>
@@ -22735,7 +22785,7 @@
         <w:spacing w:before="240" w:after="120" w:line="360" w:lineRule="auto"/>
         <w:outlineLvl w:val="1"/>
       </w:pPr>
-      <w:bookmarkStart w:id="44" w:name="_Toc228349070"/>
+      <w:bookmarkStart w:id="44" w:name="_Toc228357940"/>
       <w:r>
         <w:rPr>
           <w:rFonts w:eastAsia="黑体"/>
@@ -24946,7 +24996,7 @@
         <w:spacing w:before="240" w:after="120" w:line="360" w:lineRule="auto"/>
         <w:outlineLvl w:val="1"/>
       </w:pPr>
-      <w:bookmarkStart w:id="45" w:name="_Toc228349071"/>
+      <w:bookmarkStart w:id="45" w:name="_Toc228357941"/>
       <w:r>
         <w:rPr>
           <w:rFonts w:eastAsia="黑体"/>
@@ -25813,7 +25863,7 @@
         <w:spacing w:before="240" w:after="120" w:line="360" w:lineRule="auto"/>
         <w:outlineLvl w:val="1"/>
       </w:pPr>
-      <w:bookmarkStart w:id="46" w:name="_Toc228349072"/>
+      <w:bookmarkStart w:id="46" w:name="_Toc228357942"/>
       <w:r>
         <w:rPr>
           <w:rFonts w:eastAsia="黑体"/>
@@ -26716,7 +26766,7 @@
         <w:spacing w:before="240" w:after="120" w:line="360" w:lineRule="auto"/>
         <w:outlineLvl w:val="1"/>
       </w:pPr>
-      <w:bookmarkStart w:id="47" w:name="_Toc228349073"/>
+      <w:bookmarkStart w:id="47" w:name="_Toc228357943"/>
       <w:r>
         <w:rPr>
           <w:rFonts w:eastAsia="黑体"/>
@@ -27924,7 +27974,7 @@
         <w:spacing w:before="240" w:after="120" w:line="360" w:lineRule="auto"/>
         <w:outlineLvl w:val="1"/>
       </w:pPr>
-      <w:bookmarkStart w:id="48" w:name="_Toc228349074"/>
+      <w:bookmarkStart w:id="48" w:name="_Toc228357944"/>
       <w:r>
         <w:rPr>
           <w:rFonts w:eastAsia="黑体"/>
@@ -30175,7 +30225,7 @@
         <w:spacing w:before="240" w:after="120" w:line="360" w:lineRule="auto"/>
         <w:outlineLvl w:val="1"/>
       </w:pPr>
-      <w:bookmarkStart w:id="49" w:name="_Toc228349075"/>
+      <w:bookmarkStart w:id="49" w:name="_Toc228357945"/>
       <w:r>
         <w:rPr>
           <w:rFonts w:eastAsia="黑体"/>
@@ -32165,7 +32215,7 @@
         <w:spacing w:before="240" w:after="120" w:line="360" w:lineRule="auto"/>
         <w:outlineLvl w:val="1"/>
       </w:pPr>
-      <w:bookmarkStart w:id="50" w:name="_Toc228349076"/>
+      <w:bookmarkStart w:id="50" w:name="_Toc228357946"/>
       <w:r>
         <w:rPr>
           <w:rFonts w:eastAsia="黑体"/>
@@ -33754,7 +33804,7 @@
         <w:spacing w:before="240" w:after="120" w:line="360" w:lineRule="auto"/>
         <w:outlineLvl w:val="1"/>
       </w:pPr>
-      <w:bookmarkStart w:id="51" w:name="_Toc228349077"/>
+      <w:bookmarkStart w:id="51" w:name="_Toc228357947"/>
       <w:r>
         <w:rPr>
           <w:rFonts w:eastAsia="黑体"/>
@@ -34815,7 +34865,7 @@
         <w:spacing w:before="240" w:after="120" w:line="360" w:lineRule="auto"/>
         <w:outlineLvl w:val="1"/>
       </w:pPr>
-      <w:bookmarkStart w:id="52" w:name="_Toc228349078"/>
+      <w:bookmarkStart w:id="52" w:name="_Toc228357948"/>
       <w:r>
         <w:rPr>
           <w:rFonts w:eastAsia="黑体"/>
@@ -37937,7 +37987,7 @@
         <w:jc w:val="left"/>
         <w:outlineLvl w:val="1"/>
       </w:pPr>
-      <w:bookmarkStart w:id="53" w:name="_Toc228349079"/>
+      <w:bookmarkStart w:id="53" w:name="_Toc228357949"/>
       <w:r>
         <w:rPr>
           <w:rFonts w:eastAsia="黑体"/>
@@ -38268,7 +38318,7 @@
         <w:jc w:val="center"/>
         <w:outlineLvl w:val="0"/>
       </w:pPr>
-      <w:bookmarkStart w:id="54" w:name="_Toc228349080"/>
+      <w:bookmarkStart w:id="54" w:name="_Toc228357950"/>
       <w:r>
         <w:rPr>
           <w:rFonts w:eastAsia="黑体" w:hint="eastAsia"/>
@@ -38310,7 +38360,7 @@
           <w:szCs w:val="24"/>
         </w:rPr>
       </w:pPr>
-      <w:bookmarkStart w:id="55" w:name="_Toc228349081"/>
+      <w:bookmarkStart w:id="55" w:name="_Toc228357951"/>
       <w:r>
         <w:rPr>
           <w:rFonts w:eastAsia="黑体" w:hint="eastAsia"/>
@@ -38504,7 +38554,7 @@
           <w:szCs w:val="24"/>
         </w:rPr>
       </w:pPr>
-      <w:bookmarkStart w:id="56" w:name="_Toc228349082"/>
+      <w:bookmarkStart w:id="56" w:name="_Toc228357952"/>
       <w:r>
         <w:rPr>
           <w:rFonts w:eastAsia="黑体" w:hint="eastAsia"/>
@@ -38531,123 +38581,115 @@
         <w:ind w:firstLine="480"/>
       </w:pPr>
       <w:r>
-        <w:rPr>
-          <w:rFonts w:hint="eastAsia"/>
-          <w:szCs w:val="24"/>
-        </w:rPr>
-        <w:t>本文工作仍存在若干可继续完善之处。首先，当前主路径采用</w:t>
-      </w:r>
-      <w:r>
-        <w:rPr>
-          <w:rFonts w:hint="eastAsia"/>
-          <w:szCs w:val="24"/>
-        </w:rPr>
+        <w:t>本文工作仍存在若干可继续完善之处。首先，当前最终演示主路径仍以</w:t>
+      </w:r>
+      <w:r>
         <w:t>FP RKNN</w:t>
       </w:r>
       <w:r>
-        <w:rPr>
-          <w:rFonts w:hint="eastAsia"/>
-          <w:szCs w:val="24"/>
-        </w:rPr>
-        <w:t>模型，</w:t>
-      </w:r>
-      <w:r>
-        <w:rPr>
-          <w:rFonts w:hint="eastAsia"/>
-          <w:szCs w:val="24"/>
-        </w:rPr>
+        <w:t>模型为主。项目后期已经完成</w:t>
+      </w:r>
+      <w:r>
+        <w:t>INT8 RKNN</w:t>
+      </w:r>
+      <w:r>
+        <w:t>模型的离线转换，并建立了</w:t>
+      </w:r>
+      <w:r>
+        <w:t>FP</w:t>
+      </w:r>
+      <w:r>
+        <w:t>、</w:t>
+      </w:r>
+      <w:r>
         <w:t>INT8</w:t>
       </w:r>
       <w:r>
-        <w:rPr>
-          <w:rFonts w:hint="eastAsia"/>
-          <w:szCs w:val="24"/>
-        </w:rPr>
-        <w:t>量化尚未形成完整的精度和速度闭环验证，后续可基于更充分的校准数据开展量化实验，并比较</w:t>
-      </w:r>
-      <w:r>
-        <w:rPr>
-          <w:rFonts w:hint="eastAsia"/>
-          <w:szCs w:val="24"/>
-        </w:rPr>
+        <w:t>、</w:t>
+      </w:r>
+      <w:r>
+        <w:t>RGA</w:t>
+      </w:r>
+      <w:r>
+        <w:t>和</w:t>
+      </w:r>
+      <w:r>
+        <w:t>zero-copy</w:t>
+      </w:r>
+      <w:r>
+        <w:t>的板端固定视频对比脚本，但</w:t>
+      </w:r>
+      <w:r>
+        <w:t>INT8</w:t>
+      </w:r>
+      <w:r>
+        <w:t>模型尚需在</w:t>
+      </w:r>
+      <w:r>
+        <w:t>RK3588</w:t>
+      </w:r>
+      <w:r>
+        <w:t>上进一步完成精度、延迟和稳定性对比。因此，本文不将</w:t>
+      </w:r>
+      <w:r>
+        <w:t>INT8</w:t>
+      </w:r>
+      <w:r>
+        <w:t>写成已经优于</w:t>
+      </w:r>
+      <w:r>
         <w:t>FP</w:t>
       </w:r>
       <w:r>
-        <w:rPr>
-          <w:rFonts w:hint="eastAsia"/>
-          <w:szCs w:val="24"/>
-        </w:rPr>
-        <w:t>、</w:t>
-      </w:r>
-      <w:r>
-        <w:rPr>
-          <w:rFonts w:hint="eastAsia"/>
-          <w:szCs w:val="24"/>
-        </w:rPr>
-        <w:t>FP16</w:t>
-      </w:r>
-      <w:r>
-        <w:rPr>
-          <w:rFonts w:hint="eastAsia"/>
-          <w:szCs w:val="24"/>
-        </w:rPr>
-        <w:t>和</w:t>
-      </w:r>
-      <w:r>
-        <w:rPr>
-          <w:rFonts w:hint="eastAsia"/>
-          <w:szCs w:val="24"/>
-        </w:rPr>
-        <w:t>INT8</w:t>
-      </w:r>
-      <w:r>
-        <w:rPr>
-          <w:rFonts w:hint="eastAsia"/>
-          <w:szCs w:val="24"/>
-        </w:rPr>
-        <w:t>模型在精度、延迟和资源占用上的差异。其次，当前预处理路径主要采用</w:t>
-      </w:r>
-      <w:r>
-        <w:rPr>
-          <w:rFonts w:hint="eastAsia"/>
-          <w:szCs w:val="24"/>
-        </w:rPr>
-        <w:t>OpenCV</w:t>
-      </w:r>
-      <w:r>
-        <w:rPr>
-          <w:rFonts w:hint="eastAsia"/>
-          <w:szCs w:val="24"/>
-        </w:rPr>
-        <w:t>实现，</w:t>
-      </w:r>
-      <w:r>
-        <w:rPr>
-          <w:rFonts w:hint="eastAsia"/>
-          <w:szCs w:val="24"/>
-        </w:rPr>
+        <w:t>主路径的结论，而将其作为已经具备上板验证条件的后续优化方向。其次，</w:t>
+      </w:r>
+      <w:r>
         <w:t>RGA</w:t>
       </w:r>
       <w:r>
-        <w:rPr>
-          <w:rFonts w:hint="eastAsia"/>
-          <w:szCs w:val="24"/>
-        </w:rPr>
-        <w:t>硬件缩放、颜色空间转换和图像拷贝优化仍可作为后续重点方向。第三，外设</w:t>
-      </w:r>
-      <w:r>
-        <w:rPr>
-          <w:rFonts w:hint="eastAsia"/>
-          <w:szCs w:val="24"/>
-        </w:rPr>
+        <w:t>硬件预处理、</w:t>
+      </w:r>
+      <w:r>
+        <w:t>RGA</w:t>
+      </w:r>
+      <w:r>
+        <w:t>帧缩放和</w:t>
+      </w:r>
+      <w:r>
+        <w:t>NV12</w:t>
+      </w:r>
+      <w:r>
+        <w:t>发布路径已经实现并完成部分验证，但不同</w:t>
+      </w:r>
+      <w:r>
+        <w:t>RGA</w:t>
+      </w:r>
+      <w:r>
+        <w:t>路径的端到端收益并不一致，后续仍需结合</w:t>
+      </w:r>
+      <w:r>
+        <w:t>MPP</w:t>
+      </w:r>
+      <w:r>
+        <w:t>解码、物理连续内存和模型输入格式继续优化。第三，外设</w:t>
+      </w:r>
+      <w:r>
         <w:t>GPIO</w:t>
       </w:r>
       <w:r>
-        <w:rPr>
-          <w:rFonts w:hint="eastAsia"/>
-          <w:szCs w:val="24"/>
-        </w:rPr>
-        <w:t>闭环控制尚未作为本文已完成主线，后续可进一步接入报警、云台或其他执行机构，形成从目标感知到硬件响应的完整系统。最后，本文公开视频和室内演示能够支持系统验证，但真实飞行场景受测试条件限制仍不充分，后续应在安全合规条件下补充不同距离、光照、背景和运动状态下的真实无人机测试。</w:t>
+        <w:t>闭环控制尚未作为本文已完成主线，当前系统采用软件报警</w:t>
+      </w:r>
+      <w:r>
+        <w:t>overlay</w:t>
+      </w:r>
+      <w:r>
+        <w:t>和报警事件</w:t>
+      </w:r>
+      <w:r>
+        <w:t>CSV</w:t>
+      </w:r>
+      <w:r>
+        <w:t>作为直观替代；后续可进一步接入报警、云台或其他执行机构，形成从目标感知到硬件响应的完整系统。最后，本文公开视频和室内演示能够支持系统验证，但真实飞行场景受测试条件限制仍不充分，后续应在安全合规条件下补充不同距离、光照、背景和运动状态下的真实无人机测试。</w:t>
       </w:r>
     </w:p>
     <w:p>
@@ -38666,145 +38708,68 @@
         </w:rPr>
       </w:pPr>
       <w:r>
-        <w:rPr>
-          <w:rFonts w:cs="Times New Roman" w:hint="eastAsia"/>
-          <w:szCs w:val="36"/>
-        </w:rPr>
         <w:lastRenderedPageBreak/>
         <w:t>与任务书和开题阶段的初始设想相比，本文实际实施过程中对研究重点进行了收敛。由于无人机专用模型在</w:t>
       </w:r>
       <w:r>
-        <w:rPr>
-          <w:rFonts w:cs="Times New Roman" w:hint="eastAsia"/>
-          <w:szCs w:val="36"/>
-        </w:rPr>
         <w:t>RK3588</w:t>
       </w:r>
       <w:r>
-        <w:rPr>
-          <w:rFonts w:cs="Times New Roman" w:hint="eastAsia"/>
-          <w:szCs w:val="36"/>
-        </w:rPr>
         <w:t>板端适配过程中出现过输出张量不匹配和</w:t>
       </w:r>
       <w:r>
-        <w:rPr>
-          <w:rFonts w:cs="Times New Roman" w:hint="eastAsia"/>
-          <w:szCs w:val="36"/>
-        </w:rPr>
         <w:t>rknn_run</w:t>
       </w:r>
       <w:r>
-        <w:rPr>
-          <w:rFonts w:cs="Times New Roman" w:hint="eastAsia"/>
-          <w:szCs w:val="36"/>
-        </w:rPr>
         <w:t>运行异常等问题，模型恢复、后处理适配和实时链路稳定性调试占用了较多周期。因此，本文将可验证主线集中在</w:t>
       </w:r>
       <w:r>
-        <w:rPr>
-          <w:rFonts w:cs="Times New Roman" w:hint="eastAsia"/>
-          <w:szCs w:val="36"/>
-        </w:rPr>
         <w:t>FP RKNN</w:t>
       </w:r>
       <w:r>
-        <w:rPr>
-          <w:rFonts w:cs="Times New Roman" w:hint="eastAsia"/>
-          <w:szCs w:val="36"/>
-        </w:rPr>
         <w:t>模型稳定部署、固定视频与</w:t>
       </w:r>
       <w:r>
-        <w:rPr>
-          <w:rFonts w:cs="Times New Roman" w:hint="eastAsia"/>
-          <w:szCs w:val="36"/>
-        </w:rPr>
         <w:t>RTSP</w:t>
       </w:r>
       <w:r>
-        <w:rPr>
-          <w:rFonts w:cs="Times New Roman" w:hint="eastAsia"/>
-          <w:szCs w:val="36"/>
-        </w:rPr>
         <w:t>实时检测、检测间隔</w:t>
       </w:r>
       <w:r>
-        <w:rPr>
-          <w:rFonts w:cs="Times New Roman" w:hint="eastAsia"/>
-          <w:szCs w:val="36"/>
-        </w:rPr>
         <w:t>/</w:t>
       </w:r>
       <w:r>
-        <w:rPr>
-          <w:rFonts w:cs="Times New Roman" w:hint="eastAsia"/>
-          <w:szCs w:val="36"/>
-        </w:rPr>
         <w:t>框平滑策略以及多</w:t>
       </w:r>
       <w:r>
-        <w:rPr>
-          <w:rFonts w:cs="Times New Roman" w:hint="eastAsia"/>
-          <w:szCs w:val="36"/>
-        </w:rPr>
         <w:t>context NPU</w:t>
       </w:r>
       <w:r>
-        <w:rPr>
-          <w:rFonts w:cs="Times New Roman" w:hint="eastAsia"/>
-          <w:szCs w:val="36"/>
-        </w:rPr>
         <w:t>并行推理实验上。</w:t>
       </w:r>
       <w:r>
-        <w:rPr>
-          <w:rFonts w:cs="Times New Roman" w:hint="eastAsia"/>
-          <w:szCs w:val="36"/>
-        </w:rPr>
         <w:t>INT8</w:t>
       </w:r>
       <w:r>
-        <w:rPr>
-          <w:rFonts w:cs="Times New Roman" w:hint="eastAsia"/>
-          <w:szCs w:val="36"/>
-        </w:rPr>
-        <w:t>量化、完整</w:t>
-      </w:r>
-      <w:r>
-        <w:rPr>
-          <w:rFonts w:cs="Times New Roman" w:hint="eastAsia"/>
-          <w:szCs w:val="36"/>
-        </w:rPr>
+        <w:t>量化已完成离线</w:t>
+      </w:r>
+      <w:r>
+        <w:t>RKNN</w:t>
+      </w:r>
+      <w:r>
+        <w:t>转换但仍需板端充分验证；</w:t>
+      </w:r>
+      <w:r>
         <w:t>RGA</w:t>
       </w:r>
       <w:r>
-        <w:rPr>
-          <w:rFonts w:cs="Times New Roman" w:hint="eastAsia"/>
-          <w:szCs w:val="36"/>
-        </w:rPr>
-        <w:t>硬件预处理闭环和</w:t>
-      </w:r>
-      <w:r>
-        <w:rPr>
-          <w:rFonts w:cs="Times New Roman" w:hint="eastAsia"/>
-          <w:szCs w:val="36"/>
-        </w:rPr>
+        <w:t>相关路径已完成若干可选实验但尚未成为所有场景下的默认路径；</w:t>
+      </w:r>
+      <w:r>
         <w:t>GPIO</w:t>
       </w:r>
       <w:r>
-        <w:rPr>
-          <w:rFonts w:cs="Times New Roman" w:hint="eastAsia"/>
-          <w:szCs w:val="36"/>
-        </w:rPr>
-        <w:t>闭环控制仍保留为后续拓展方向，而不作为本文已经完成并验证的稳定主路径。</w:t>
-      </w:r>
-      <w:r>
-        <w:rPr>
-          <w:rFonts w:cs="Times New Roman" w:hint="eastAsia"/>
-          <w:szCs w:val="36"/>
-        </w:rPr>
-        <w:t>这样的处理能够保证论文结论与当前代码和实验数据保持一致。</w:t>
+        <w:t>硬件闭环则以软件报警显示和事件日志作为替代演示。这样的处理能够保证论文结论与当前代码和实验数据保持一致。</w:t>
       </w:r>
     </w:p>
     <w:p>
@@ -38813,7 +38778,7 @@
         <w:jc w:val="center"/>
         <w:outlineLvl w:val="0"/>
       </w:pPr>
-      <w:bookmarkStart w:id="57" w:name="_Toc228349083"/>
+      <w:bookmarkStart w:id="57" w:name="_Toc228357953"/>
       <w:r>
         <w:rPr>
           <w:rFonts w:eastAsia="黑体"/>
@@ -39086,11 +39051,66 @@
     </w:p>
     <w:p>
       <w:pPr>
+        <w:spacing w:line="240" w:lineRule="auto"/>
+        <w:jc w:val="left"/>
+      </w:pPr>
+      <w:r>
+        <w:lastRenderedPageBreak/>
+        <w:t>[15] Lucas B D, Kanade T. An Iterative Image Registration Technique with an Application to Stereo Vision[C]//Proceedings of the 7th International Joint Conference on Artificial Intelligence. 1981, 2: 674-679.</w:t>
+      </w:r>
+    </w:p>
+    <w:p>
+      <w:pPr>
+        <w:spacing w:line="240" w:lineRule="auto"/>
+        <w:jc w:val="left"/>
+      </w:pPr>
+      <w:r>
+        <w:t>[16] Shi J, Tomasi C. Good Features to Track[C]//Proceedings of IEEE Conference on Computer Vision and Pattern Recognition. 1994: 593-600.</w:t>
+      </w:r>
+    </w:p>
+    <w:p>
+      <w:pPr>
+        <w:spacing w:line="240" w:lineRule="auto"/>
+        <w:jc w:val="left"/>
+      </w:pPr>
+      <w:r>
+        <w:t>[17] Jacob B, Kligys S, Chen B, et al. Quantization and Training of Neural Networks for Efficient Integer-Arithmetic-Only Inference[C]//Proceedings of the IEEE Conference on Computer Vision and Pattern Recognition. 2018: 2704-2713.</w:t>
+      </w:r>
+    </w:p>
+    <w:p>
+      <w:pPr>
+        <w:spacing w:line="240" w:lineRule="auto"/>
+        <w:jc w:val="left"/>
+      </w:pPr>
+      <w:r>
+        <w:t>[18] Sandler M, Howard A, Zhu M, et al. MobileNetV2: Inverted Residuals and Linear Bottlenecks[C]//Proceedings of the IEEE Conference on Computer Vision and Pattern Recognition. 2018: 4510-4520.</w:t>
+      </w:r>
+    </w:p>
+    <w:p>
+      <w:pPr>
+        <w:spacing w:line="240" w:lineRule="auto"/>
+        <w:jc w:val="left"/>
+      </w:pPr>
+      <w:r>
+        <w:t>[19] Wojke N, Bewley A, Paulus D. Simple Online and Realtime Tracking with a Deep Association Metric[C]//2017 IEEE International Conference on Image Processing. 2017: 3645-3649.</w:t>
+      </w:r>
+    </w:p>
+    <w:p>
+      <w:pPr>
+        <w:spacing w:line="240" w:lineRule="auto"/>
+        <w:jc w:val="left"/>
+      </w:pPr>
+      <w:r>
+        <w:t>[20] International Organization for Standardization. ISO/IEC 14882:2017 Programming Languages -- C++[S]. Geneva: ISO, 2017.</w:t>
+      </w:r>
+    </w:p>
+    <w:p>
+      <w:pPr>
         <w:spacing w:before="240" w:after="240" w:line="360" w:lineRule="auto"/>
         <w:jc w:val="center"/>
         <w:outlineLvl w:val="0"/>
       </w:pPr>
-      <w:bookmarkStart w:id="58" w:name="_Toc228349084"/>
+      <w:bookmarkStart w:id="58" w:name="_Toc228357954"/>
       <w:r>
         <w:rPr>
           <w:rFonts w:eastAsia="黑体"/>
@@ -39098,7 +39118,6 @@
           <w:sz w:val="36"/>
           <w:szCs w:val="36"/>
         </w:rPr>
-        <w:lastRenderedPageBreak/>
         <w:t>致谢</w:t>
       </w:r>
       <w:bookmarkEnd w:id="58"/>

</xml_diff>

<commit_message>
Add required thesis appendices
</commit_message>
<xml_diff>
--- a/Thesis Project/paper/full_thesis_latest_merged.docx
+++ b/Thesis Project/paper/full_thesis_latest_merged.docx
@@ -1529,7 +1529,7 @@
         </w:rPr>
         <w:fldChar w:fldCharType="separate"/>
       </w:r>
-      <w:hyperlink w:anchor="_Toc228357896" w:history="1">
+      <w:hyperlink w:anchor="_Toc228360825" w:history="1">
         <w:r>
           <w:rPr>
             <w:rStyle w:val="af3"/>
@@ -1570,7 +1570,7 @@
             <w:noProof/>
             <w:webHidden/>
           </w:rPr>
-          <w:instrText xml:space="preserve"> PAGEREF _Toc228357896 \h </w:instrText>
+          <w:instrText xml:space="preserve"> PAGEREF _Toc228360825 \h </w:instrText>
         </w:r>
         <w:r>
           <w:rPr>
@@ -1590,7 +1590,7 @@
             <w:noProof/>
             <w:webHidden/>
           </w:rPr>
-          <w:t>7</w:t>
+          <w:t>8</w:t>
         </w:r>
         <w:r>
           <w:rPr>
@@ -1613,7 +1613,7 @@
           <w14:ligatures w14:val="standardContextual"/>
         </w:rPr>
       </w:pPr>
-      <w:hyperlink w:anchor="_Toc228357897" w:history="1">
+      <w:hyperlink w:anchor="_Toc228360826" w:history="1">
         <w:r>
           <w:rPr>
             <w:rStyle w:val="af3"/>
@@ -1651,7 +1651,7 @@
             <w:noProof/>
             <w:webHidden/>
           </w:rPr>
-          <w:instrText xml:space="preserve"> PAGEREF _Toc228357897 \h </w:instrText>
+          <w:instrText xml:space="preserve"> PAGEREF _Toc228360826 \h </w:instrText>
         </w:r>
         <w:r>
           <w:rPr>
@@ -1671,7 +1671,7 @@
             <w:noProof/>
             <w:webHidden/>
           </w:rPr>
-          <w:t>7</w:t>
+          <w:t>8</w:t>
         </w:r>
         <w:r>
           <w:rPr>
@@ -1694,7 +1694,7 @@
           <w14:ligatures w14:val="standardContextual"/>
         </w:rPr>
       </w:pPr>
-      <w:hyperlink w:anchor="_Toc228357898" w:history="1">
+      <w:hyperlink w:anchor="_Toc228360827" w:history="1">
         <w:r>
           <w:rPr>
             <w:rStyle w:val="af3"/>
@@ -1732,7 +1732,7 @@
             <w:noProof/>
             <w:webHidden/>
           </w:rPr>
-          <w:instrText xml:space="preserve"> PAGEREF _Toc228357898 \h </w:instrText>
+          <w:instrText xml:space="preserve"> PAGEREF _Toc228360827 \h </w:instrText>
         </w:r>
         <w:r>
           <w:rPr>
@@ -1752,7 +1752,7 @@
             <w:noProof/>
             <w:webHidden/>
           </w:rPr>
-          <w:t>7</w:t>
+          <w:t>8</w:t>
         </w:r>
         <w:r>
           <w:rPr>
@@ -1775,7 +1775,7 @@
           <w14:ligatures w14:val="standardContextual"/>
         </w:rPr>
       </w:pPr>
-      <w:hyperlink w:anchor="_Toc228357899" w:history="1">
+      <w:hyperlink w:anchor="_Toc228360828" w:history="1">
         <w:r>
           <w:rPr>
             <w:rStyle w:val="af3"/>
@@ -1813,7 +1813,7 @@
             <w:noProof/>
             <w:webHidden/>
           </w:rPr>
-          <w:instrText xml:space="preserve"> PAGEREF _Toc228357899 \h </w:instrText>
+          <w:instrText xml:space="preserve"> PAGEREF _Toc228360828 \h </w:instrText>
         </w:r>
         <w:r>
           <w:rPr>
@@ -1833,7 +1833,7 @@
             <w:noProof/>
             <w:webHidden/>
           </w:rPr>
-          <w:t>8</w:t>
+          <w:t>9</w:t>
         </w:r>
         <w:r>
           <w:rPr>
@@ -1856,7 +1856,7 @@
           <w14:ligatures w14:val="standardContextual"/>
         </w:rPr>
       </w:pPr>
-      <w:hyperlink w:anchor="_Toc228357900" w:history="1">
+      <w:hyperlink w:anchor="_Toc228360829" w:history="1">
         <w:r>
           <w:rPr>
             <w:rStyle w:val="af3"/>
@@ -1894,7 +1894,7 @@
             <w:noProof/>
             <w:webHidden/>
           </w:rPr>
-          <w:instrText xml:space="preserve"> PAGEREF _Toc228357900 \h </w:instrText>
+          <w:instrText xml:space="preserve"> PAGEREF _Toc228360829 \h </w:instrText>
         </w:r>
         <w:r>
           <w:rPr>
@@ -1937,7 +1937,7 @@
           <w14:ligatures w14:val="standardContextual"/>
         </w:rPr>
       </w:pPr>
-      <w:hyperlink w:anchor="_Toc228357901" w:history="1">
+      <w:hyperlink w:anchor="_Toc228360830" w:history="1">
         <w:r>
           <w:rPr>
             <w:rStyle w:val="af3"/>
@@ -1981,7 +1981,7 @@
             <w:noProof/>
             <w:webHidden/>
           </w:rPr>
-          <w:instrText xml:space="preserve"> PAGEREF _Toc228357901 \h </w:instrText>
+          <w:instrText xml:space="preserve"> PAGEREF _Toc228360830 \h </w:instrText>
         </w:r>
         <w:r>
           <w:rPr>
@@ -2001,7 +2001,7 @@
             <w:noProof/>
             <w:webHidden/>
           </w:rPr>
-          <w:t>10</w:t>
+          <w:t>11</w:t>
         </w:r>
         <w:r>
           <w:rPr>
@@ -2024,7 +2024,7 @@
           <w14:ligatures w14:val="standardContextual"/>
         </w:rPr>
       </w:pPr>
-      <w:hyperlink w:anchor="_Toc228357902" w:history="1">
+      <w:hyperlink w:anchor="_Toc228360831" w:history="1">
         <w:r>
           <w:rPr>
             <w:rStyle w:val="af3"/>
@@ -2062,7 +2062,7 @@
             <w:noProof/>
             <w:webHidden/>
           </w:rPr>
-          <w:instrText xml:space="preserve"> PAGEREF _Toc228357902 \h </w:instrText>
+          <w:instrText xml:space="preserve"> PAGEREF _Toc228360831 \h </w:instrText>
         </w:r>
         <w:r>
           <w:rPr>
@@ -2082,7 +2082,7 @@
             <w:noProof/>
             <w:webHidden/>
           </w:rPr>
-          <w:t>10</w:t>
+          <w:t>11</w:t>
         </w:r>
         <w:r>
           <w:rPr>
@@ -2105,7 +2105,7 @@
           <w14:ligatures w14:val="standardContextual"/>
         </w:rPr>
       </w:pPr>
-      <w:hyperlink w:anchor="_Toc228357903" w:history="1">
+      <w:hyperlink w:anchor="_Toc228360832" w:history="1">
         <w:r>
           <w:rPr>
             <w:rStyle w:val="af3"/>
@@ -2143,7 +2143,7 @@
             <w:noProof/>
             <w:webHidden/>
           </w:rPr>
-          <w:instrText xml:space="preserve"> PAGEREF _Toc228357903 \h </w:instrText>
+          <w:instrText xml:space="preserve"> PAGEREF _Toc228360832 \h </w:instrText>
         </w:r>
         <w:r>
           <w:rPr>
@@ -2163,7 +2163,7 @@
             <w:noProof/>
             <w:webHidden/>
           </w:rPr>
-          <w:t>10</w:t>
+          <w:t>11</w:t>
         </w:r>
         <w:r>
           <w:rPr>
@@ -2186,7 +2186,7 @@
           <w14:ligatures w14:val="standardContextual"/>
         </w:rPr>
       </w:pPr>
-      <w:hyperlink w:anchor="_Toc228357904" w:history="1">
+      <w:hyperlink w:anchor="_Toc228360833" w:history="1">
         <w:r>
           <w:rPr>
             <w:rStyle w:val="af3"/>
@@ -2224,7 +2224,7 @@
             <w:noProof/>
             <w:webHidden/>
           </w:rPr>
-          <w:instrText xml:space="preserve"> PAGEREF _Toc228357904 \h </w:instrText>
+          <w:instrText xml:space="preserve"> PAGEREF _Toc228360833 \h </w:instrText>
         </w:r>
         <w:r>
           <w:rPr>
@@ -2244,7 +2244,7 @@
             <w:noProof/>
             <w:webHidden/>
           </w:rPr>
-          <w:t>11</w:t>
+          <w:t>12</w:t>
         </w:r>
         <w:r>
           <w:rPr>
@@ -2267,7 +2267,7 @@
           <w14:ligatures w14:val="standardContextual"/>
         </w:rPr>
       </w:pPr>
-      <w:hyperlink w:anchor="_Toc228357905" w:history="1">
+      <w:hyperlink w:anchor="_Toc228360834" w:history="1">
         <w:r>
           <w:rPr>
             <w:rStyle w:val="af3"/>
@@ -2305,7 +2305,7 @@
             <w:noProof/>
             <w:webHidden/>
           </w:rPr>
-          <w:instrText xml:space="preserve"> PAGEREF _Toc228357905 \h </w:instrText>
+          <w:instrText xml:space="preserve"> PAGEREF _Toc228360834 \h </w:instrText>
         </w:r>
         <w:r>
           <w:rPr>
@@ -2325,7 +2325,7 @@
             <w:noProof/>
             <w:webHidden/>
           </w:rPr>
-          <w:t>12</w:t>
+          <w:t>13</w:t>
         </w:r>
         <w:r>
           <w:rPr>
@@ -2348,7 +2348,7 @@
           <w14:ligatures w14:val="standardContextual"/>
         </w:rPr>
       </w:pPr>
-      <w:hyperlink w:anchor="_Toc228357906" w:history="1">
+      <w:hyperlink w:anchor="_Toc228360835" w:history="1">
         <w:r>
           <w:rPr>
             <w:rStyle w:val="af3"/>
@@ -2386,7 +2386,7 @@
             <w:noProof/>
             <w:webHidden/>
           </w:rPr>
-          <w:instrText xml:space="preserve"> PAGEREF _Toc228357906 \h </w:instrText>
+          <w:instrText xml:space="preserve"> PAGEREF _Toc228360835 \h </w:instrText>
         </w:r>
         <w:r>
           <w:rPr>
@@ -2406,7 +2406,7 @@
             <w:noProof/>
             <w:webHidden/>
           </w:rPr>
-          <w:t>12</w:t>
+          <w:t>13</w:t>
         </w:r>
         <w:r>
           <w:rPr>
@@ -2429,7 +2429,7 @@
           <w14:ligatures w14:val="standardContextual"/>
         </w:rPr>
       </w:pPr>
-      <w:hyperlink w:anchor="_Toc228357907" w:history="1">
+      <w:hyperlink w:anchor="_Toc228360836" w:history="1">
         <w:r>
           <w:rPr>
             <w:rStyle w:val="af3"/>
@@ -2467,7 +2467,7 @@
             <w:noProof/>
             <w:webHidden/>
           </w:rPr>
-          <w:instrText xml:space="preserve"> PAGEREF _Toc228357907 \h </w:instrText>
+          <w:instrText xml:space="preserve"> PAGEREF _Toc228360836 \h </w:instrText>
         </w:r>
         <w:r>
           <w:rPr>
@@ -2487,7 +2487,7 @@
             <w:noProof/>
             <w:webHidden/>
           </w:rPr>
-          <w:t>13</w:t>
+          <w:t>14</w:t>
         </w:r>
         <w:r>
           <w:rPr>
@@ -2510,7 +2510,7 @@
           <w14:ligatures w14:val="standardContextual"/>
         </w:rPr>
       </w:pPr>
-      <w:hyperlink w:anchor="_Toc228357908" w:history="1">
+      <w:hyperlink w:anchor="_Toc228360837" w:history="1">
         <w:r>
           <w:rPr>
             <w:rStyle w:val="af3"/>
@@ -2554,7 +2554,7 @@
             <w:noProof/>
             <w:webHidden/>
           </w:rPr>
-          <w:instrText xml:space="preserve"> PAGEREF _Toc228357908 \h </w:instrText>
+          <w:instrText xml:space="preserve"> PAGEREF _Toc228360837 \h </w:instrText>
         </w:r>
         <w:r>
           <w:rPr>
@@ -2574,7 +2574,7 @@
             <w:noProof/>
             <w:webHidden/>
           </w:rPr>
-          <w:t>14</w:t>
+          <w:t>15</w:t>
         </w:r>
         <w:r>
           <w:rPr>
@@ -2597,7 +2597,7 @@
           <w14:ligatures w14:val="standardContextual"/>
         </w:rPr>
       </w:pPr>
-      <w:hyperlink w:anchor="_Toc228357909" w:history="1">
+      <w:hyperlink w:anchor="_Toc228360838" w:history="1">
         <w:r>
           <w:rPr>
             <w:rStyle w:val="af3"/>
@@ -2635,7 +2635,7 @@
             <w:noProof/>
             <w:webHidden/>
           </w:rPr>
-          <w:instrText xml:space="preserve"> PAGEREF _Toc228357909 \h </w:instrText>
+          <w:instrText xml:space="preserve"> PAGEREF _Toc228360838 \h </w:instrText>
         </w:r>
         <w:r>
           <w:rPr>
@@ -2655,7 +2655,7 @@
             <w:noProof/>
             <w:webHidden/>
           </w:rPr>
-          <w:t>14</w:t>
+          <w:t>15</w:t>
         </w:r>
         <w:r>
           <w:rPr>
@@ -2677,7 +2677,7 @@
           <w14:ligatures w14:val="standardContextual"/>
         </w:rPr>
       </w:pPr>
-      <w:hyperlink w:anchor="_Toc228357910" w:history="1">
+      <w:hyperlink w:anchor="_Toc228360839" w:history="1">
         <w:r>
           <w:rPr>
             <w:rStyle w:val="af3"/>
@@ -2715,7 +2715,7 @@
             <w:noProof/>
             <w:webHidden/>
           </w:rPr>
-          <w:instrText xml:space="preserve"> PAGEREF _Toc228357910 \h </w:instrText>
+          <w:instrText xml:space="preserve"> PAGEREF _Toc228360839 \h </w:instrText>
         </w:r>
         <w:r>
           <w:rPr>
@@ -2735,7 +2735,7 @@
             <w:noProof/>
             <w:webHidden/>
           </w:rPr>
-          <w:t>14</w:t>
+          <w:t>15</w:t>
         </w:r>
         <w:r>
           <w:rPr>
@@ -2757,7 +2757,7 @@
           <w14:ligatures w14:val="standardContextual"/>
         </w:rPr>
       </w:pPr>
-      <w:hyperlink w:anchor="_Toc228357911" w:history="1">
+      <w:hyperlink w:anchor="_Toc228360840" w:history="1">
         <w:r>
           <w:rPr>
             <w:rStyle w:val="af3"/>
@@ -2795,7 +2795,7 @@
             <w:noProof/>
             <w:webHidden/>
           </w:rPr>
-          <w:instrText xml:space="preserve"> PAGEREF _Toc228357911 \h </w:instrText>
+          <w:instrText xml:space="preserve"> PAGEREF _Toc228360840 \h </w:instrText>
         </w:r>
         <w:r>
           <w:rPr>
@@ -2815,7 +2815,7 @@
             <w:noProof/>
             <w:webHidden/>
           </w:rPr>
-          <w:t>15</w:t>
+          <w:t>16</w:t>
         </w:r>
         <w:r>
           <w:rPr>
@@ -2837,7 +2837,7 @@
           <w14:ligatures w14:val="standardContextual"/>
         </w:rPr>
       </w:pPr>
-      <w:hyperlink w:anchor="_Toc228357912" w:history="1">
+      <w:hyperlink w:anchor="_Toc228360841" w:history="1">
         <w:r>
           <w:rPr>
             <w:rStyle w:val="af3"/>
@@ -2875,7 +2875,7 @@
             <w:noProof/>
             <w:webHidden/>
           </w:rPr>
-          <w:instrText xml:space="preserve"> PAGEREF _Toc228357912 \h </w:instrText>
+          <w:instrText xml:space="preserve"> PAGEREF _Toc228360841 \h </w:instrText>
         </w:r>
         <w:r>
           <w:rPr>
@@ -2895,7 +2895,7 @@
             <w:noProof/>
             <w:webHidden/>
           </w:rPr>
-          <w:t>16</w:t>
+          <w:t>17</w:t>
         </w:r>
         <w:r>
           <w:rPr>
@@ -2918,7 +2918,7 @@
           <w14:ligatures w14:val="standardContextual"/>
         </w:rPr>
       </w:pPr>
-      <w:hyperlink w:anchor="_Toc228357913" w:history="1">
+      <w:hyperlink w:anchor="_Toc228360842" w:history="1">
         <w:r>
           <w:rPr>
             <w:rStyle w:val="af3"/>
@@ -2956,7 +2956,7 @@
             <w:noProof/>
             <w:webHidden/>
           </w:rPr>
-          <w:instrText xml:space="preserve"> PAGEREF _Toc228357913 \h </w:instrText>
+          <w:instrText xml:space="preserve"> PAGEREF _Toc228360842 \h </w:instrText>
         </w:r>
         <w:r>
           <w:rPr>
@@ -2976,7 +2976,7 @@
             <w:noProof/>
             <w:webHidden/>
           </w:rPr>
-          <w:t>16</w:t>
+          <w:t>17</w:t>
         </w:r>
         <w:r>
           <w:rPr>
@@ -2999,7 +2999,7 @@
           <w14:ligatures w14:val="standardContextual"/>
         </w:rPr>
       </w:pPr>
-      <w:hyperlink w:anchor="_Toc228357914" w:history="1">
+      <w:hyperlink w:anchor="_Toc228360843" w:history="1">
         <w:r>
           <w:rPr>
             <w:rStyle w:val="af3"/>
@@ -3037,7 +3037,7 @@
             <w:noProof/>
             <w:webHidden/>
           </w:rPr>
-          <w:instrText xml:space="preserve"> PAGEREF _Toc228357914 \h </w:instrText>
+          <w:instrText xml:space="preserve"> PAGEREF _Toc228360843 \h </w:instrText>
         </w:r>
         <w:r>
           <w:rPr>
@@ -3057,7 +3057,7 @@
             <w:noProof/>
             <w:webHidden/>
           </w:rPr>
-          <w:t>17</w:t>
+          <w:t>18</w:t>
         </w:r>
         <w:r>
           <w:rPr>
@@ -3079,7 +3079,7 @@
           <w14:ligatures w14:val="standardContextual"/>
         </w:rPr>
       </w:pPr>
-      <w:hyperlink w:anchor="_Toc228357915" w:history="1">
+      <w:hyperlink w:anchor="_Toc228360844" w:history="1">
         <w:r>
           <w:rPr>
             <w:rStyle w:val="af3"/>
@@ -3117,7 +3117,7 @@
             <w:noProof/>
             <w:webHidden/>
           </w:rPr>
-          <w:instrText xml:space="preserve"> PAGEREF _Toc228357915 \h </w:instrText>
+          <w:instrText xml:space="preserve"> PAGEREF _Toc228360844 \h </w:instrText>
         </w:r>
         <w:r>
           <w:rPr>
@@ -3137,7 +3137,7 @@
             <w:noProof/>
             <w:webHidden/>
           </w:rPr>
-          <w:t>17</w:t>
+          <w:t>18</w:t>
         </w:r>
         <w:r>
           <w:rPr>
@@ -3159,7 +3159,7 @@
           <w14:ligatures w14:val="standardContextual"/>
         </w:rPr>
       </w:pPr>
-      <w:hyperlink w:anchor="_Toc228357916" w:history="1">
+      <w:hyperlink w:anchor="_Toc228360845" w:history="1">
         <w:r>
           <w:rPr>
             <w:rStyle w:val="af3"/>
@@ -3197,7 +3197,7 @@
             <w:noProof/>
             <w:webHidden/>
           </w:rPr>
-          <w:instrText xml:space="preserve"> PAGEREF _Toc228357916 \h </w:instrText>
+          <w:instrText xml:space="preserve"> PAGEREF _Toc228360845 \h </w:instrText>
         </w:r>
         <w:r>
           <w:rPr>
@@ -3217,7 +3217,7 @@
             <w:noProof/>
             <w:webHidden/>
           </w:rPr>
-          <w:t>18</w:t>
+          <w:t>19</w:t>
         </w:r>
         <w:r>
           <w:rPr>
@@ -3240,7 +3240,7 @@
           <w14:ligatures w14:val="standardContextual"/>
         </w:rPr>
       </w:pPr>
-      <w:hyperlink w:anchor="_Toc228357917" w:history="1">
+      <w:hyperlink w:anchor="_Toc228360846" w:history="1">
         <w:r>
           <w:rPr>
             <w:rStyle w:val="af3"/>
@@ -3278,7 +3278,7 @@
             <w:noProof/>
             <w:webHidden/>
           </w:rPr>
-          <w:instrText xml:space="preserve"> PAGEREF _Toc228357917 \h </w:instrText>
+          <w:instrText xml:space="preserve"> PAGEREF _Toc228360846 \h </w:instrText>
         </w:r>
         <w:r>
           <w:rPr>
@@ -3298,7 +3298,7 @@
             <w:noProof/>
             <w:webHidden/>
           </w:rPr>
-          <w:t>19</w:t>
+          <w:t>20</w:t>
         </w:r>
         <w:r>
           <w:rPr>
@@ -3320,7 +3320,7 @@
           <w14:ligatures w14:val="standardContextual"/>
         </w:rPr>
       </w:pPr>
-      <w:hyperlink w:anchor="_Toc228357918" w:history="1">
+      <w:hyperlink w:anchor="_Toc228360847" w:history="1">
         <w:r>
           <w:rPr>
             <w:rStyle w:val="af3"/>
@@ -3358,7 +3358,7 @@
             <w:noProof/>
             <w:webHidden/>
           </w:rPr>
-          <w:instrText xml:space="preserve"> PAGEREF _Toc228357918 \h </w:instrText>
+          <w:instrText xml:space="preserve"> PAGEREF _Toc228360847 \h </w:instrText>
         </w:r>
         <w:r>
           <w:rPr>
@@ -3378,7 +3378,7 @@
             <w:noProof/>
             <w:webHidden/>
           </w:rPr>
-          <w:t>19</w:t>
+          <w:t>20</w:t>
         </w:r>
         <w:r>
           <w:rPr>
@@ -3400,7 +3400,7 @@
           <w14:ligatures w14:val="standardContextual"/>
         </w:rPr>
       </w:pPr>
-      <w:hyperlink w:anchor="_Toc228357919" w:history="1">
+      <w:hyperlink w:anchor="_Toc228360848" w:history="1">
         <w:r>
           <w:rPr>
             <w:rStyle w:val="af3"/>
@@ -3438,7 +3438,7 @@
             <w:noProof/>
             <w:webHidden/>
           </w:rPr>
-          <w:instrText xml:space="preserve"> PAGEREF _Toc228357919 \h </w:instrText>
+          <w:instrText xml:space="preserve"> PAGEREF _Toc228360848 \h </w:instrText>
         </w:r>
         <w:r>
           <w:rPr>
@@ -3458,7 +3458,7 @@
             <w:noProof/>
             <w:webHidden/>
           </w:rPr>
-          <w:t>19</w:t>
+          <w:t>20</w:t>
         </w:r>
         <w:r>
           <w:rPr>
@@ -3481,7 +3481,7 @@
           <w14:ligatures w14:val="standardContextual"/>
         </w:rPr>
       </w:pPr>
-      <w:hyperlink w:anchor="_Toc228357920" w:history="1">
+      <w:hyperlink w:anchor="_Toc228360849" w:history="1">
         <w:r>
           <w:rPr>
             <w:rStyle w:val="af3"/>
@@ -3537,7 +3537,7 @@
             <w:noProof/>
             <w:webHidden/>
           </w:rPr>
-          <w:instrText xml:space="preserve"> PAGEREF _Toc228357920 \h </w:instrText>
+          <w:instrText xml:space="preserve"> PAGEREF _Toc228360849 \h </w:instrText>
         </w:r>
         <w:r>
           <w:rPr>
@@ -3557,7 +3557,7 @@
             <w:noProof/>
             <w:webHidden/>
           </w:rPr>
-          <w:t>20</w:t>
+          <w:t>21</w:t>
         </w:r>
         <w:r>
           <w:rPr>
@@ -3579,7 +3579,7 @@
           <w14:ligatures w14:val="standardContextual"/>
         </w:rPr>
       </w:pPr>
-      <w:hyperlink w:anchor="_Toc228357921" w:history="1">
+      <w:hyperlink w:anchor="_Toc228360850" w:history="1">
         <w:r>
           <w:rPr>
             <w:rStyle w:val="af3"/>
@@ -3617,7 +3617,7 @@
             <w:noProof/>
             <w:webHidden/>
           </w:rPr>
-          <w:instrText xml:space="preserve"> PAGEREF _Toc228357921 \h </w:instrText>
+          <w:instrText xml:space="preserve"> PAGEREF _Toc228360850 \h </w:instrText>
         </w:r>
         <w:r>
           <w:rPr>
@@ -3637,7 +3637,7 @@
             <w:noProof/>
             <w:webHidden/>
           </w:rPr>
-          <w:t>20</w:t>
+          <w:t>21</w:t>
         </w:r>
         <w:r>
           <w:rPr>
@@ -3659,7 +3659,7 @@
           <w14:ligatures w14:val="standardContextual"/>
         </w:rPr>
       </w:pPr>
-      <w:hyperlink w:anchor="_Toc228357922" w:history="1">
+      <w:hyperlink w:anchor="_Toc228360851" w:history="1">
         <w:r>
           <w:rPr>
             <w:rStyle w:val="af3"/>
@@ -3715,7 +3715,7 @@
             <w:noProof/>
             <w:webHidden/>
           </w:rPr>
-          <w:instrText xml:space="preserve"> PAGEREF _Toc228357922 \h </w:instrText>
+          <w:instrText xml:space="preserve"> PAGEREF _Toc228360851 \h </w:instrText>
         </w:r>
         <w:r>
           <w:rPr>
@@ -3735,7 +3735,7 @@
             <w:noProof/>
             <w:webHidden/>
           </w:rPr>
-          <w:t>20</w:t>
+          <w:t>21</w:t>
         </w:r>
         <w:r>
           <w:rPr>
@@ -3757,7 +3757,7 @@
           <w14:ligatures w14:val="standardContextual"/>
         </w:rPr>
       </w:pPr>
-      <w:hyperlink w:anchor="_Toc228357923" w:history="1">
+      <w:hyperlink w:anchor="_Toc228360852" w:history="1">
         <w:r>
           <w:rPr>
             <w:rStyle w:val="af3"/>
@@ -3795,7 +3795,7 @@
             <w:noProof/>
             <w:webHidden/>
           </w:rPr>
-          <w:instrText xml:space="preserve"> PAGEREF _Toc228357923 \h </w:instrText>
+          <w:instrText xml:space="preserve"> PAGEREF _Toc228360852 \h </w:instrText>
         </w:r>
         <w:r>
           <w:rPr>
@@ -3815,7 +3815,7 @@
             <w:noProof/>
             <w:webHidden/>
           </w:rPr>
-          <w:t>20</w:t>
+          <w:t>21</w:t>
         </w:r>
         <w:r>
           <w:rPr>
@@ -3838,7 +3838,7 @@
           <w14:ligatures w14:val="standardContextual"/>
         </w:rPr>
       </w:pPr>
-      <w:hyperlink w:anchor="_Toc228357924" w:history="1">
+      <w:hyperlink w:anchor="_Toc228360853" w:history="1">
         <w:r>
           <w:rPr>
             <w:rStyle w:val="af3"/>
@@ -3894,7 +3894,7 @@
             <w:noProof/>
             <w:webHidden/>
           </w:rPr>
-          <w:instrText xml:space="preserve"> PAGEREF _Toc228357924 \h </w:instrText>
+          <w:instrText xml:space="preserve"> PAGEREF _Toc228360853 \h </w:instrText>
         </w:r>
         <w:r>
           <w:rPr>
@@ -3914,7 +3914,7 @@
             <w:noProof/>
             <w:webHidden/>
           </w:rPr>
-          <w:t>21</w:t>
+          <w:t>22</w:t>
         </w:r>
         <w:r>
           <w:rPr>
@@ -3936,7 +3936,7 @@
           <w14:ligatures w14:val="standardContextual"/>
         </w:rPr>
       </w:pPr>
-      <w:hyperlink w:anchor="_Toc228357925" w:history="1">
+      <w:hyperlink w:anchor="_Toc228360854" w:history="1">
         <w:r>
           <w:rPr>
             <w:rStyle w:val="af3"/>
@@ -3992,7 +3992,7 @@
             <w:noProof/>
             <w:webHidden/>
           </w:rPr>
-          <w:instrText xml:space="preserve"> PAGEREF _Toc228357925 \h </w:instrText>
+          <w:instrText xml:space="preserve"> PAGEREF _Toc228360854 \h </w:instrText>
         </w:r>
         <w:r>
           <w:rPr>
@@ -4012,7 +4012,7 @@
             <w:noProof/>
             <w:webHidden/>
           </w:rPr>
-          <w:t>21</w:t>
+          <w:t>22</w:t>
         </w:r>
         <w:r>
           <w:rPr>
@@ -4034,7 +4034,7 @@
           <w14:ligatures w14:val="standardContextual"/>
         </w:rPr>
       </w:pPr>
-      <w:hyperlink w:anchor="_Toc228357926" w:history="1">
+      <w:hyperlink w:anchor="_Toc228360855" w:history="1">
         <w:r>
           <w:rPr>
             <w:rStyle w:val="af3"/>
@@ -4090,7 +4090,7 @@
             <w:noProof/>
             <w:webHidden/>
           </w:rPr>
-          <w:instrText xml:space="preserve"> PAGEREF _Toc228357926 \h </w:instrText>
+          <w:instrText xml:space="preserve"> PAGEREF _Toc228360855 \h </w:instrText>
         </w:r>
         <w:r>
           <w:rPr>
@@ -4110,7 +4110,7 @@
             <w:noProof/>
             <w:webHidden/>
           </w:rPr>
-          <w:t>22</w:t>
+          <w:t>23</w:t>
         </w:r>
         <w:r>
           <w:rPr>
@@ -4132,7 +4132,7 @@
           <w14:ligatures w14:val="standardContextual"/>
         </w:rPr>
       </w:pPr>
-      <w:hyperlink w:anchor="_Toc228357927" w:history="1">
+      <w:hyperlink w:anchor="_Toc228360856" w:history="1">
         <w:r>
           <w:rPr>
             <w:rStyle w:val="af3"/>
@@ -4170,7 +4170,7 @@
             <w:noProof/>
             <w:webHidden/>
           </w:rPr>
-          <w:instrText xml:space="preserve"> PAGEREF _Toc228357927 \h </w:instrText>
+          <w:instrText xml:space="preserve"> PAGEREF _Toc228360856 \h </w:instrText>
         </w:r>
         <w:r>
           <w:rPr>
@@ -4190,7 +4190,7 @@
             <w:noProof/>
             <w:webHidden/>
           </w:rPr>
-          <w:t>22</w:t>
+          <w:t>23</w:t>
         </w:r>
         <w:r>
           <w:rPr>
@@ -4213,7 +4213,7 @@
           <w14:ligatures w14:val="standardContextual"/>
         </w:rPr>
       </w:pPr>
-      <w:hyperlink w:anchor="_Toc228357928" w:history="1">
+      <w:hyperlink w:anchor="_Toc228360857" w:history="1">
         <w:r>
           <w:rPr>
             <w:rStyle w:val="af3"/>
@@ -4251,7 +4251,7 @@
             <w:noProof/>
             <w:webHidden/>
           </w:rPr>
-          <w:instrText xml:space="preserve"> PAGEREF _Toc228357928 \h </w:instrText>
+          <w:instrText xml:space="preserve"> PAGEREF _Toc228360857 \h </w:instrText>
         </w:r>
         <w:r>
           <w:rPr>
@@ -4271,7 +4271,7 @@
             <w:noProof/>
             <w:webHidden/>
           </w:rPr>
-          <w:t>23</w:t>
+          <w:t>24</w:t>
         </w:r>
         <w:r>
           <w:rPr>
@@ -4294,7 +4294,7 @@
           <w14:ligatures w14:val="standardContextual"/>
         </w:rPr>
       </w:pPr>
-      <w:hyperlink w:anchor="_Toc228357929" w:history="1">
+      <w:hyperlink w:anchor="_Toc228360858" w:history="1">
         <w:r>
           <w:rPr>
             <w:rStyle w:val="af3"/>
@@ -4338,7 +4338,7 @@
             <w:noProof/>
             <w:webHidden/>
           </w:rPr>
-          <w:instrText xml:space="preserve"> PAGEREF _Toc228357929 \h </w:instrText>
+          <w:instrText xml:space="preserve"> PAGEREF _Toc228360858 \h </w:instrText>
         </w:r>
         <w:r>
           <w:rPr>
@@ -4358,7 +4358,7 @@
             <w:noProof/>
             <w:webHidden/>
           </w:rPr>
-          <w:t>24</w:t>
+          <w:t>25</w:t>
         </w:r>
         <w:r>
           <w:rPr>
@@ -4381,7 +4381,7 @@
           <w14:ligatures w14:val="standardContextual"/>
         </w:rPr>
       </w:pPr>
-      <w:hyperlink w:anchor="_Toc228357930" w:history="1">
+      <w:hyperlink w:anchor="_Toc228360859" w:history="1">
         <w:r>
           <w:rPr>
             <w:rStyle w:val="af3"/>
@@ -4419,7 +4419,7 @@
             <w:noProof/>
             <w:webHidden/>
           </w:rPr>
-          <w:instrText xml:space="preserve"> PAGEREF _Toc228357930 \h </w:instrText>
+          <w:instrText xml:space="preserve"> PAGEREF _Toc228360859 \h </w:instrText>
         </w:r>
         <w:r>
           <w:rPr>
@@ -4439,7 +4439,7 @@
             <w:noProof/>
             <w:webHidden/>
           </w:rPr>
-          <w:t>24</w:t>
+          <w:t>25</w:t>
         </w:r>
         <w:r>
           <w:rPr>
@@ -4462,7 +4462,7 @@
           <w14:ligatures w14:val="standardContextual"/>
         </w:rPr>
       </w:pPr>
-      <w:hyperlink w:anchor="_Toc228357931" w:history="1">
+      <w:hyperlink w:anchor="_Toc228360860" w:history="1">
         <w:r>
           <w:rPr>
             <w:rStyle w:val="af3"/>
@@ -4518,7 +4518,7 @@
             <w:noProof/>
             <w:webHidden/>
           </w:rPr>
-          <w:instrText xml:space="preserve"> PAGEREF _Toc228357931 \h </w:instrText>
+          <w:instrText xml:space="preserve"> PAGEREF _Toc228360860 \h </w:instrText>
         </w:r>
         <w:r>
           <w:rPr>
@@ -4538,7 +4538,7 @@
             <w:noProof/>
             <w:webHidden/>
           </w:rPr>
-          <w:t>26</w:t>
+          <w:t>27</w:t>
         </w:r>
         <w:r>
           <w:rPr>
@@ -4561,7 +4561,7 @@
           <w14:ligatures w14:val="standardContextual"/>
         </w:rPr>
       </w:pPr>
-      <w:hyperlink w:anchor="_Toc228357932" w:history="1">
+      <w:hyperlink w:anchor="_Toc228360861" w:history="1">
         <w:r>
           <w:rPr>
             <w:rStyle w:val="af3"/>
@@ -4599,7 +4599,7 @@
             <w:noProof/>
             <w:webHidden/>
           </w:rPr>
-          <w:instrText xml:space="preserve"> PAGEREF _Toc228357932 \h </w:instrText>
+          <w:instrText xml:space="preserve"> PAGEREF _Toc228360861 \h </w:instrText>
         </w:r>
         <w:r>
           <w:rPr>
@@ -4619,7 +4619,7 @@
             <w:noProof/>
             <w:webHidden/>
           </w:rPr>
-          <w:t>27</w:t>
+          <w:t>28</w:t>
         </w:r>
         <w:r>
           <w:rPr>
@@ -4642,7 +4642,7 @@
           <w14:ligatures w14:val="standardContextual"/>
         </w:rPr>
       </w:pPr>
-      <w:hyperlink w:anchor="_Toc228357933" w:history="1">
+      <w:hyperlink w:anchor="_Toc228360862" w:history="1">
         <w:r>
           <w:rPr>
             <w:rStyle w:val="af3"/>
@@ -4680,7 +4680,7 @@
             <w:noProof/>
             <w:webHidden/>
           </w:rPr>
-          <w:instrText xml:space="preserve"> PAGEREF _Toc228357933 \h </w:instrText>
+          <w:instrText xml:space="preserve"> PAGEREF _Toc228360862 \h </w:instrText>
         </w:r>
         <w:r>
           <w:rPr>
@@ -4700,7 +4700,7 @@
             <w:noProof/>
             <w:webHidden/>
           </w:rPr>
-          <w:t>28</w:t>
+          <w:t>29</w:t>
         </w:r>
         <w:r>
           <w:rPr>
@@ -4723,7 +4723,7 @@
           <w14:ligatures w14:val="standardContextual"/>
         </w:rPr>
       </w:pPr>
-      <w:hyperlink w:anchor="_Toc228357934" w:history="1">
+      <w:hyperlink w:anchor="_Toc228360863" w:history="1">
         <w:r>
           <w:rPr>
             <w:rStyle w:val="af3"/>
@@ -4779,7 +4779,7 @@
             <w:noProof/>
             <w:webHidden/>
           </w:rPr>
-          <w:instrText xml:space="preserve"> PAGEREF _Toc228357934 \h </w:instrText>
+          <w:instrText xml:space="preserve"> PAGEREF _Toc228360863 \h </w:instrText>
         </w:r>
         <w:r>
           <w:rPr>
@@ -4799,7 +4799,7 @@
             <w:noProof/>
             <w:webHidden/>
           </w:rPr>
-          <w:t>29</w:t>
+          <w:t>30</w:t>
         </w:r>
         <w:r>
           <w:rPr>
@@ -4822,7 +4822,7 @@
           <w14:ligatures w14:val="standardContextual"/>
         </w:rPr>
       </w:pPr>
-      <w:hyperlink w:anchor="_Toc228357935" w:history="1">
+      <w:hyperlink w:anchor="_Toc228360864" w:history="1">
         <w:r>
           <w:rPr>
             <w:rStyle w:val="af3"/>
@@ -4878,7 +4878,7 @@
             <w:noProof/>
             <w:webHidden/>
           </w:rPr>
-          <w:instrText xml:space="preserve"> PAGEREF _Toc228357935 \h </w:instrText>
+          <w:instrText xml:space="preserve"> PAGEREF _Toc228360864 \h </w:instrText>
         </w:r>
         <w:r>
           <w:rPr>
@@ -4898,7 +4898,7 @@
             <w:noProof/>
             <w:webHidden/>
           </w:rPr>
-          <w:t>31</w:t>
+          <w:t>32</w:t>
         </w:r>
         <w:r>
           <w:rPr>
@@ -4921,7 +4921,7 @@
           <w14:ligatures w14:val="standardContextual"/>
         </w:rPr>
       </w:pPr>
-      <w:hyperlink w:anchor="_Toc228357936" w:history="1">
+      <w:hyperlink w:anchor="_Toc228360865" w:history="1">
         <w:r>
           <w:rPr>
             <w:rStyle w:val="af3"/>
@@ -4977,7 +4977,7 @@
             <w:noProof/>
             <w:webHidden/>
           </w:rPr>
-          <w:instrText xml:space="preserve"> PAGEREF _Toc228357936 \h </w:instrText>
+          <w:instrText xml:space="preserve"> PAGEREF _Toc228360865 \h </w:instrText>
         </w:r>
         <w:r>
           <w:rPr>
@@ -4997,7 +4997,7 @@
             <w:noProof/>
             <w:webHidden/>
           </w:rPr>
-          <w:t>33</w:t>
+          <w:t>34</w:t>
         </w:r>
         <w:r>
           <w:rPr>
@@ -5020,7 +5020,7 @@
           <w14:ligatures w14:val="standardContextual"/>
         </w:rPr>
       </w:pPr>
-      <w:hyperlink w:anchor="_Toc228357937" w:history="1">
+      <w:hyperlink w:anchor="_Toc228360866" w:history="1">
         <w:r>
           <w:rPr>
             <w:rStyle w:val="af3"/>
@@ -5058,7 +5058,7 @@
             <w:noProof/>
             <w:webHidden/>
           </w:rPr>
-          <w:instrText xml:space="preserve"> PAGEREF _Toc228357937 \h </w:instrText>
+          <w:instrText xml:space="preserve"> PAGEREF _Toc228360866 \h </w:instrText>
         </w:r>
         <w:r>
           <w:rPr>
@@ -5078,7 +5078,7 @@
             <w:noProof/>
             <w:webHidden/>
           </w:rPr>
-          <w:t>35</w:t>
+          <w:t>36</w:t>
         </w:r>
         <w:r>
           <w:rPr>
@@ -5101,7 +5101,7 @@
           <w14:ligatures w14:val="standardContextual"/>
         </w:rPr>
       </w:pPr>
-      <w:hyperlink w:anchor="_Toc228357938" w:history="1">
+      <w:hyperlink w:anchor="_Toc228360867" w:history="1">
         <w:r>
           <w:rPr>
             <w:rStyle w:val="af3"/>
@@ -5139,7 +5139,7 @@
             <w:noProof/>
             <w:webHidden/>
           </w:rPr>
-          <w:instrText xml:space="preserve"> PAGEREF _Toc228357938 \h </w:instrText>
+          <w:instrText xml:space="preserve"> PAGEREF _Toc228360867 \h </w:instrText>
         </w:r>
         <w:r>
           <w:rPr>
@@ -5159,7 +5159,7 @@
             <w:noProof/>
             <w:webHidden/>
           </w:rPr>
-          <w:t>36</w:t>
+          <w:t>37</w:t>
         </w:r>
         <w:r>
           <w:rPr>
@@ -5182,7 +5182,7 @@
           <w14:ligatures w14:val="standardContextual"/>
         </w:rPr>
       </w:pPr>
-      <w:hyperlink w:anchor="_Toc228357939" w:history="1">
+      <w:hyperlink w:anchor="_Toc228360868" w:history="1">
         <w:r>
           <w:rPr>
             <w:rStyle w:val="af3"/>
@@ -5226,7 +5226,7 @@
             <w:noProof/>
             <w:webHidden/>
           </w:rPr>
-          <w:instrText xml:space="preserve"> PAGEREF _Toc228357939 \h </w:instrText>
+          <w:instrText xml:space="preserve"> PAGEREF _Toc228360868 \h </w:instrText>
         </w:r>
         <w:r>
           <w:rPr>
@@ -5246,7 +5246,7 @@
             <w:noProof/>
             <w:webHidden/>
           </w:rPr>
-          <w:t>37</w:t>
+          <w:t>38</w:t>
         </w:r>
         <w:r>
           <w:rPr>
@@ -5269,7 +5269,7 @@
           <w14:ligatures w14:val="standardContextual"/>
         </w:rPr>
       </w:pPr>
-      <w:hyperlink w:anchor="_Toc228357940" w:history="1">
+      <w:hyperlink w:anchor="_Toc228360869" w:history="1">
         <w:r>
           <w:rPr>
             <w:rStyle w:val="af3"/>
@@ -5307,7 +5307,7 @@
             <w:noProof/>
             <w:webHidden/>
           </w:rPr>
-          <w:instrText xml:space="preserve"> PAGEREF _Toc228357940 \h </w:instrText>
+          <w:instrText xml:space="preserve"> PAGEREF _Toc228360869 \h </w:instrText>
         </w:r>
         <w:r>
           <w:rPr>
@@ -5327,7 +5327,7 @@
             <w:noProof/>
             <w:webHidden/>
           </w:rPr>
-          <w:t>37</w:t>
+          <w:t>38</w:t>
         </w:r>
         <w:r>
           <w:rPr>
@@ -5350,7 +5350,7 @@
           <w14:ligatures w14:val="standardContextual"/>
         </w:rPr>
       </w:pPr>
-      <w:hyperlink w:anchor="_Toc228357941" w:history="1">
+      <w:hyperlink w:anchor="_Toc228360870" w:history="1">
         <w:r>
           <w:rPr>
             <w:rStyle w:val="af3"/>
@@ -5388,7 +5388,7 @@
             <w:noProof/>
             <w:webHidden/>
           </w:rPr>
-          <w:instrText xml:space="preserve"> PAGEREF _Toc228357941 \h </w:instrText>
+          <w:instrText xml:space="preserve"> PAGEREF _Toc228360870 \h </w:instrText>
         </w:r>
         <w:r>
           <w:rPr>
@@ -5408,7 +5408,7 @@
             <w:noProof/>
             <w:webHidden/>
           </w:rPr>
-          <w:t>39</w:t>
+          <w:t>40</w:t>
         </w:r>
         <w:r>
           <w:rPr>
@@ -5431,7 +5431,7 @@
           <w14:ligatures w14:val="standardContextual"/>
         </w:rPr>
       </w:pPr>
-      <w:hyperlink w:anchor="_Toc228357942" w:history="1">
+      <w:hyperlink w:anchor="_Toc228360871" w:history="1">
         <w:r>
           <w:rPr>
             <w:rStyle w:val="af3"/>
@@ -5469,7 +5469,7 @@
             <w:noProof/>
             <w:webHidden/>
           </w:rPr>
-          <w:instrText xml:space="preserve"> PAGEREF _Toc228357942 \h </w:instrText>
+          <w:instrText xml:space="preserve"> PAGEREF _Toc228360871 \h </w:instrText>
         </w:r>
         <w:r>
           <w:rPr>
@@ -5489,7 +5489,7 @@
             <w:noProof/>
             <w:webHidden/>
           </w:rPr>
-          <w:t>41</w:t>
+          <w:t>42</w:t>
         </w:r>
         <w:r>
           <w:rPr>
@@ -5512,7 +5512,7 @@
           <w14:ligatures w14:val="standardContextual"/>
         </w:rPr>
       </w:pPr>
-      <w:hyperlink w:anchor="_Toc228357943" w:history="1">
+      <w:hyperlink w:anchor="_Toc228360872" w:history="1">
         <w:r>
           <w:rPr>
             <w:rStyle w:val="af3"/>
@@ -5568,7 +5568,7 @@
             <w:noProof/>
             <w:webHidden/>
           </w:rPr>
-          <w:instrText xml:space="preserve"> PAGEREF _Toc228357943 \h </w:instrText>
+          <w:instrText xml:space="preserve"> PAGEREF _Toc228360872 \h </w:instrText>
         </w:r>
         <w:r>
           <w:rPr>
@@ -5588,7 +5588,7 @@
             <w:noProof/>
             <w:webHidden/>
           </w:rPr>
-          <w:t>42</w:t>
+          <w:t>43</w:t>
         </w:r>
         <w:r>
           <w:rPr>
@@ -5611,7 +5611,7 @@
           <w14:ligatures w14:val="standardContextual"/>
         </w:rPr>
       </w:pPr>
-      <w:hyperlink w:anchor="_Toc228357944" w:history="1">
+      <w:hyperlink w:anchor="_Toc228360873" w:history="1">
         <w:r>
           <w:rPr>
             <w:rStyle w:val="af3"/>
@@ -5649,7 +5649,7 @@
             <w:noProof/>
             <w:webHidden/>
           </w:rPr>
-          <w:instrText xml:space="preserve"> PAGEREF _Toc228357944 \h </w:instrText>
+          <w:instrText xml:space="preserve"> PAGEREF _Toc228360873 \h </w:instrText>
         </w:r>
         <w:r>
           <w:rPr>
@@ -5669,7 +5669,7 @@
             <w:noProof/>
             <w:webHidden/>
           </w:rPr>
-          <w:t>43</w:t>
+          <w:t>44</w:t>
         </w:r>
         <w:r>
           <w:rPr>
@@ -5692,7 +5692,7 @@
           <w14:ligatures w14:val="standardContextual"/>
         </w:rPr>
       </w:pPr>
-      <w:hyperlink w:anchor="_Toc228357945" w:history="1">
+      <w:hyperlink w:anchor="_Toc228360874" w:history="1">
         <w:r>
           <w:rPr>
             <w:rStyle w:val="af3"/>
@@ -5748,7 +5748,7 @@
             <w:noProof/>
             <w:webHidden/>
           </w:rPr>
-          <w:instrText xml:space="preserve"> PAGEREF _Toc228357945 \h </w:instrText>
+          <w:instrText xml:space="preserve"> PAGEREF _Toc228360874 \h </w:instrText>
         </w:r>
         <w:r>
           <w:rPr>
@@ -5768,7 +5768,7 @@
             <w:noProof/>
             <w:webHidden/>
           </w:rPr>
-          <w:t>45</w:t>
+          <w:t>46</w:t>
         </w:r>
         <w:r>
           <w:rPr>
@@ -5791,7 +5791,7 @@
           <w14:ligatures w14:val="standardContextual"/>
         </w:rPr>
       </w:pPr>
-      <w:hyperlink w:anchor="_Toc228357946" w:history="1">
+      <w:hyperlink w:anchor="_Toc228360875" w:history="1">
         <w:r>
           <w:rPr>
             <w:rStyle w:val="af3"/>
@@ -5829,7 +5829,7 @@
             <w:noProof/>
             <w:webHidden/>
           </w:rPr>
-          <w:instrText xml:space="preserve"> PAGEREF _Toc228357946 \h </w:instrText>
+          <w:instrText xml:space="preserve"> PAGEREF _Toc228360875 \h </w:instrText>
         </w:r>
         <w:r>
           <w:rPr>
@@ -5849,7 +5849,7 @@
             <w:noProof/>
             <w:webHidden/>
           </w:rPr>
-          <w:t>46</w:t>
+          <w:t>47</w:t>
         </w:r>
         <w:r>
           <w:rPr>
@@ -5872,7 +5872,7 @@
           <w14:ligatures w14:val="standardContextual"/>
         </w:rPr>
       </w:pPr>
-      <w:hyperlink w:anchor="_Toc228357947" w:history="1">
+      <w:hyperlink w:anchor="_Toc228360876" w:history="1">
         <w:r>
           <w:rPr>
             <w:rStyle w:val="af3"/>
@@ -5910,7 +5910,7 @@
             <w:noProof/>
             <w:webHidden/>
           </w:rPr>
-          <w:instrText xml:space="preserve"> PAGEREF _Toc228357947 \h </w:instrText>
+          <w:instrText xml:space="preserve"> PAGEREF _Toc228360876 \h </w:instrText>
         </w:r>
         <w:r>
           <w:rPr>
@@ -5930,7 +5930,7 @@
             <w:noProof/>
             <w:webHidden/>
           </w:rPr>
-          <w:t>49</w:t>
+          <w:t>50</w:t>
         </w:r>
         <w:r>
           <w:rPr>
@@ -5953,7 +5953,7 @@
           <w14:ligatures w14:val="standardContextual"/>
         </w:rPr>
       </w:pPr>
-      <w:hyperlink w:anchor="_Toc228357948" w:history="1">
+      <w:hyperlink w:anchor="_Toc228360877" w:history="1">
         <w:r>
           <w:rPr>
             <w:rStyle w:val="af3"/>
@@ -5991,7 +5991,7 @@
             <w:noProof/>
             <w:webHidden/>
           </w:rPr>
-          <w:instrText xml:space="preserve"> PAGEREF _Toc228357948 \h </w:instrText>
+          <w:instrText xml:space="preserve"> PAGEREF _Toc228360877 \h </w:instrText>
         </w:r>
         <w:r>
           <w:rPr>
@@ -6011,7 +6011,7 @@
             <w:noProof/>
             <w:webHidden/>
           </w:rPr>
-          <w:t>50</w:t>
+          <w:t>51</w:t>
         </w:r>
         <w:r>
           <w:rPr>
@@ -6034,7 +6034,7 @@
           <w14:ligatures w14:val="standardContextual"/>
         </w:rPr>
       </w:pPr>
-      <w:hyperlink w:anchor="_Toc228357949" w:history="1">
+      <w:hyperlink w:anchor="_Toc228360878" w:history="1">
         <w:r>
           <w:rPr>
             <w:rStyle w:val="af3"/>
@@ -6072,7 +6072,7 @@
             <w:noProof/>
             <w:webHidden/>
           </w:rPr>
-          <w:instrText xml:space="preserve"> PAGEREF _Toc228357949 \h </w:instrText>
+          <w:instrText xml:space="preserve"> PAGEREF _Toc228360878 \h </w:instrText>
         </w:r>
         <w:r>
           <w:rPr>
@@ -6092,7 +6092,7 @@
             <w:noProof/>
             <w:webHidden/>
           </w:rPr>
-          <w:t>53</w:t>
+          <w:t>54</w:t>
         </w:r>
         <w:r>
           <w:rPr>
@@ -6115,7 +6115,7 @@
           <w14:ligatures w14:val="standardContextual"/>
         </w:rPr>
       </w:pPr>
-      <w:hyperlink w:anchor="_Toc228357950" w:history="1">
+      <w:hyperlink w:anchor="_Toc228360879" w:history="1">
         <w:r>
           <w:rPr>
             <w:rStyle w:val="af3"/>
@@ -6138,16 +6138,7 @@
             <w:b/>
             <w:noProof/>
           </w:rPr>
-          <w:t>总结与展</w:t>
-        </w:r>
-        <w:r>
-          <w:rPr>
-            <w:rStyle w:val="af3"/>
-            <w:b/>
-            <w:noProof/>
-          </w:rPr>
-          <w:lastRenderedPageBreak/>
-          <w:t>望</w:t>
+          <w:t>总结与展望</w:t>
         </w:r>
         <w:r>
           <w:rPr>
@@ -6168,7 +6159,7 @@
             <w:noProof/>
             <w:webHidden/>
           </w:rPr>
-          <w:instrText xml:space="preserve"> PAGEREF _Toc228357950 \h </w:instrText>
+          <w:instrText xml:space="preserve"> PAGEREF _Toc228360879 \h </w:instrText>
         </w:r>
         <w:r>
           <w:rPr>
@@ -6188,7 +6179,7 @@
             <w:noProof/>
             <w:webHidden/>
           </w:rPr>
-          <w:t>55</w:t>
+          <w:t>56</w:t>
         </w:r>
         <w:r>
           <w:rPr>
@@ -6211,7 +6202,7 @@
           <w14:ligatures w14:val="standardContextual"/>
         </w:rPr>
       </w:pPr>
-      <w:hyperlink w:anchor="_Toc228357951" w:history="1">
+      <w:hyperlink w:anchor="_Toc228360880" w:history="1">
         <w:r>
           <w:rPr>
             <w:rStyle w:val="af3"/>
@@ -6249,7 +6240,7 @@
             <w:noProof/>
             <w:webHidden/>
           </w:rPr>
-          <w:instrText xml:space="preserve"> PAGEREF _Toc228357951 \h </w:instrText>
+          <w:instrText xml:space="preserve"> PAGEREF _Toc228360880 \h </w:instrText>
         </w:r>
         <w:r>
           <w:rPr>
@@ -6269,7 +6260,7 @@
             <w:noProof/>
             <w:webHidden/>
           </w:rPr>
-          <w:t>55</w:t>
+          <w:t>56</w:t>
         </w:r>
         <w:r>
           <w:rPr>
@@ -6292,7 +6283,7 @@
           <w14:ligatures w14:val="standardContextual"/>
         </w:rPr>
       </w:pPr>
-      <w:hyperlink w:anchor="_Toc228357952" w:history="1">
+      <w:hyperlink w:anchor="_Toc228360881" w:history="1">
         <w:r>
           <w:rPr>
             <w:rStyle w:val="af3"/>
@@ -6330,7 +6321,7 @@
             <w:noProof/>
             <w:webHidden/>
           </w:rPr>
-          <w:instrText xml:space="preserve"> PAGEREF _Toc228357952 \h </w:instrText>
+          <w:instrText xml:space="preserve"> PAGEREF _Toc228360881 \h </w:instrText>
         </w:r>
         <w:r>
           <w:rPr>
@@ -6350,7 +6341,7 @@
             <w:noProof/>
             <w:webHidden/>
           </w:rPr>
-          <w:t>55</w:t>
+          <w:t>56</w:t>
         </w:r>
         <w:r>
           <w:rPr>
@@ -6373,7 +6364,7 @@
           <w14:ligatures w14:val="standardContextual"/>
         </w:rPr>
       </w:pPr>
-      <w:hyperlink w:anchor="_Toc228357953" w:history="1">
+      <w:hyperlink w:anchor="_Toc228360882" w:history="1">
         <w:r>
           <w:rPr>
             <w:rStyle w:val="af3"/>
@@ -6401,7 +6392,7 @@
             <w:noProof/>
             <w:webHidden/>
           </w:rPr>
-          <w:instrText xml:space="preserve"> PAGEREF _Toc228357953 \h </w:instrText>
+          <w:instrText xml:space="preserve"> PAGEREF _Toc228360882 \h </w:instrText>
         </w:r>
         <w:r>
           <w:rPr>
@@ -6421,7 +6412,7 @@
             <w:noProof/>
             <w:webHidden/>
           </w:rPr>
-          <w:t>56</w:t>
+          <w:t>57</w:t>
         </w:r>
         <w:r>
           <w:rPr>
@@ -6444,13 +6435,280 @@
           <w14:ligatures w14:val="standardContextual"/>
         </w:rPr>
       </w:pPr>
-      <w:hyperlink w:anchor="_Toc228357954" w:history="1">
+      <w:hyperlink w:anchor="_Toc228360883" w:history="1">
         <w:r>
           <w:rPr>
             <w:rStyle w:val="af3"/>
             <w:b/>
             <w:noProof/>
           </w:rPr>
+          <w:t>附</w:t>
+        </w:r>
+        <w:r>
+          <w:rPr>
+            <w:rStyle w:val="af3"/>
+            <w:b/>
+            <w:noProof/>
+          </w:rPr>
+          <w:t xml:space="preserve">  </w:t>
+        </w:r>
+        <w:r>
+          <w:rPr>
+            <w:rStyle w:val="af3"/>
+            <w:b/>
+            <w:noProof/>
+          </w:rPr>
+          <w:t>录</w:t>
+        </w:r>
+        <w:r>
+          <w:rPr>
+            <w:noProof/>
+            <w:webHidden/>
+          </w:rPr>
+          <w:tab/>
+        </w:r>
+        <w:r>
+          <w:rPr>
+            <w:noProof/>
+            <w:webHidden/>
+          </w:rPr>
+          <w:fldChar w:fldCharType="begin"/>
+        </w:r>
+        <w:r>
+          <w:rPr>
+            <w:noProof/>
+            <w:webHidden/>
+          </w:rPr>
+          <w:instrText xml:space="preserve"> PAGEREF _Toc228360883 \h </w:instrText>
+        </w:r>
+        <w:r>
+          <w:rPr>
+            <w:noProof/>
+            <w:webHidden/>
+          </w:rPr>
+        </w:r>
+        <w:r>
+          <w:rPr>
+            <w:noProof/>
+            <w:webHidden/>
+          </w:rPr>
+          <w:fldChar w:fldCharType="separate"/>
+        </w:r>
+        <w:r>
+          <w:rPr>
+            <w:noProof/>
+            <w:webHidden/>
+          </w:rPr>
+          <w:t>59</w:t>
+        </w:r>
+        <w:r>
+          <w:rPr>
+            <w:noProof/>
+            <w:webHidden/>
+          </w:rPr>
+          <w:fldChar w:fldCharType="end"/>
+        </w:r>
+      </w:hyperlink>
+    </w:p>
+    <w:p>
+      <w:pPr>
+        <w:pStyle w:val="TOC2"/>
+        <w:rPr>
+          <w:rFonts w:asciiTheme="minorHAnsi" w:eastAsiaTheme="minorEastAsia" w:hAnsiTheme="minorHAnsi" w:cstheme="minorBidi"/>
+          <w:noProof/>
+          <w:kern w:val="2"/>
+          <w:sz w:val="22"/>
+          <w:szCs w:val="24"/>
+          <w14:ligatures w14:val="standardContextual"/>
+        </w:rPr>
+      </w:pPr>
+      <w:hyperlink w:anchor="_Toc228360884" w:history="1">
+        <w:r>
+          <w:rPr>
+            <w:rStyle w:val="af3"/>
+            <w:rFonts w:eastAsia="黑体"/>
+            <w:b/>
+            <w:noProof/>
+          </w:rPr>
+          <w:t>附录</w:t>
+        </w:r>
+        <w:r>
+          <w:rPr>
+            <w:rStyle w:val="af3"/>
+            <w:rFonts w:eastAsia="黑体"/>
+            <w:b/>
+            <w:noProof/>
+          </w:rPr>
+          <w:t xml:space="preserve">A </w:t>
+        </w:r>
+        <w:r>
+          <w:rPr>
+            <w:rStyle w:val="af3"/>
+            <w:rFonts w:eastAsia="黑体"/>
+            <w:b/>
+            <w:noProof/>
+          </w:rPr>
+          <w:t>英译汉</w:t>
+        </w:r>
+        <w:r>
+          <w:rPr>
+            <w:noProof/>
+            <w:webHidden/>
+          </w:rPr>
+          <w:tab/>
+        </w:r>
+        <w:r>
+          <w:rPr>
+            <w:noProof/>
+            <w:webHidden/>
+          </w:rPr>
+          <w:fldChar w:fldCharType="begin"/>
+        </w:r>
+        <w:r>
+          <w:rPr>
+            <w:noProof/>
+            <w:webHidden/>
+          </w:rPr>
+          <w:instrText xml:space="preserve"> PAGEREF _Toc228360884 \h </w:instrText>
+        </w:r>
+        <w:r>
+          <w:rPr>
+            <w:noProof/>
+            <w:webHidden/>
+          </w:rPr>
+        </w:r>
+        <w:r>
+          <w:rPr>
+            <w:noProof/>
+            <w:webHidden/>
+          </w:rPr>
+          <w:fldChar w:fldCharType="separate"/>
+        </w:r>
+        <w:r>
+          <w:rPr>
+            <w:noProof/>
+            <w:webHidden/>
+          </w:rPr>
+          <w:t>59</w:t>
+        </w:r>
+        <w:r>
+          <w:rPr>
+            <w:noProof/>
+            <w:webHidden/>
+          </w:rPr>
+          <w:fldChar w:fldCharType="end"/>
+        </w:r>
+      </w:hyperlink>
+    </w:p>
+    <w:p>
+      <w:pPr>
+        <w:pStyle w:val="TOC2"/>
+        <w:rPr>
+          <w:rFonts w:asciiTheme="minorHAnsi" w:eastAsiaTheme="minorEastAsia" w:hAnsiTheme="minorHAnsi" w:cstheme="minorBidi"/>
+          <w:noProof/>
+          <w:kern w:val="2"/>
+          <w:sz w:val="22"/>
+          <w:szCs w:val="24"/>
+          <w14:ligatures w14:val="standardContextual"/>
+        </w:rPr>
+      </w:pPr>
+      <w:hyperlink w:anchor="_Toc228360885" w:history="1">
+        <w:r>
+          <w:rPr>
+            <w:rStyle w:val="af3"/>
+            <w:rFonts w:eastAsia="黑体"/>
+            <w:b/>
+            <w:noProof/>
+          </w:rPr>
+          <w:t>附录</w:t>
+        </w:r>
+        <w:r>
+          <w:rPr>
+            <w:rStyle w:val="af3"/>
+            <w:rFonts w:eastAsia="黑体"/>
+            <w:b/>
+            <w:noProof/>
+          </w:rPr>
+          <w:t xml:space="preserve">B </w:t>
+        </w:r>
+        <w:r>
+          <w:rPr>
+            <w:rStyle w:val="af3"/>
+            <w:rFonts w:eastAsia="黑体"/>
+            <w:b/>
+            <w:noProof/>
+          </w:rPr>
+          <w:t>课题调研报告</w:t>
+        </w:r>
+        <w:r>
+          <w:rPr>
+            <w:noProof/>
+            <w:webHidden/>
+          </w:rPr>
+          <w:tab/>
+        </w:r>
+        <w:r>
+          <w:rPr>
+            <w:noProof/>
+            <w:webHidden/>
+          </w:rPr>
+          <w:fldChar w:fldCharType="begin"/>
+        </w:r>
+        <w:r>
+          <w:rPr>
+            <w:noProof/>
+            <w:webHidden/>
+          </w:rPr>
+          <w:instrText xml:space="preserve"> PAGEREF _Toc228360885 \h </w:instrText>
+        </w:r>
+        <w:r>
+          <w:rPr>
+            <w:noProof/>
+            <w:webHidden/>
+          </w:rPr>
+        </w:r>
+        <w:r>
+          <w:rPr>
+            <w:noProof/>
+            <w:webHidden/>
+          </w:rPr>
+          <w:fldChar w:fldCharType="separate"/>
+        </w:r>
+        <w:r>
+          <w:rPr>
+            <w:noProof/>
+            <w:webHidden/>
+          </w:rPr>
+          <w:t>66</w:t>
+        </w:r>
+        <w:r>
+          <w:rPr>
+            <w:noProof/>
+            <w:webHidden/>
+          </w:rPr>
+          <w:fldChar w:fldCharType="end"/>
+        </w:r>
+      </w:hyperlink>
+    </w:p>
+    <w:p>
+      <w:pPr>
+        <w:pStyle w:val="TOC1"/>
+        <w:rPr>
+          <w:rFonts w:asciiTheme="minorHAnsi" w:eastAsiaTheme="minorEastAsia" w:hAnsiTheme="minorHAnsi" w:cstheme="minorBidi"/>
+          <w:noProof/>
+          <w:kern w:val="2"/>
+          <w:sz w:val="22"/>
+          <w:szCs w:val="24"/>
+          <w14:ligatures w14:val="standardContextual"/>
+        </w:rPr>
+      </w:pPr>
+      <w:hyperlink w:anchor="_Toc228360886" w:history="1">
+        <w:r>
+          <w:rPr>
+            <w:rStyle w:val="af3"/>
+            <w:b/>
+            <w:noProof/>
+          </w:rPr>
           <w:t>致谢</w:t>
         </w:r>
         <w:r>
@@ -6472,7 +6730,7 @@
             <w:noProof/>
             <w:webHidden/>
           </w:rPr>
-          <w:instrText xml:space="preserve"> PAGEREF _Toc228357954 \h </w:instrText>
+          <w:instrText xml:space="preserve"> PAGEREF _Toc228360886 \h </w:instrText>
         </w:r>
         <w:r>
           <w:rPr>
@@ -6492,7 +6750,7 @@
             <w:noProof/>
             <w:webHidden/>
           </w:rPr>
-          <w:t>57</w:t>
+          <w:t>68</w:t>
         </w:r>
         <w:r>
           <w:rPr>
@@ -6505,6 +6763,7 @@
     </w:p>
     <w:p>
       <w:pPr>
+        <w:pageBreakBefore/>
         <w:spacing w:line="360" w:lineRule="auto"/>
         <w:jc w:val="center"/>
         <w:outlineLvl w:val="0"/>
@@ -6517,9 +6776,10 @@
           <w:rFonts w:cs="Times New Roman"/>
           <w:szCs w:val="36"/>
         </w:rPr>
+        <w:lastRenderedPageBreak/>
         <w:fldChar w:fldCharType="end"/>
       </w:r>
-      <w:bookmarkStart w:id="0" w:name="_Toc228357896"/>
+      <w:bookmarkStart w:id="0" w:name="_Toc228360825"/>
       <w:r>
         <w:rPr>
           <w:rFonts w:cs="Times New Roman"/>
@@ -6548,7 +6808,7 @@
         <w:spacing w:before="240" w:after="120" w:line="360" w:lineRule="auto"/>
         <w:outlineLvl w:val="1"/>
       </w:pPr>
-      <w:bookmarkStart w:id="1" w:name="_Toc228357897"/>
+      <w:bookmarkStart w:id="1" w:name="_Toc228360826"/>
       <w:r>
         <w:rPr>
           <w:rFonts w:eastAsia="黑体"/>
@@ -6748,7 +7008,7 @@
         <w:spacing w:before="240" w:after="120" w:line="360" w:lineRule="auto"/>
         <w:outlineLvl w:val="1"/>
       </w:pPr>
-      <w:bookmarkStart w:id="2" w:name="_Toc228357898"/>
+      <w:bookmarkStart w:id="2" w:name="_Toc228360827"/>
       <w:r>
         <w:rPr>
           <w:rFonts w:eastAsia="黑体"/>
@@ -6796,14 +7056,7 @@
         <w:rPr>
           <w:szCs w:val="24"/>
         </w:rPr>
-        <w:t>系列为代表的一阶段检测算法具有结构简洁、推理速度</w:t>
-      </w:r>
-      <w:r>
-        <w:rPr>
-          <w:szCs w:val="24"/>
-        </w:rPr>
-        <w:lastRenderedPageBreak/>
-        <w:t>快和工程部署方便等特点，在实时检测任务中应用广泛</w:t>
+        <w:t>系列为代表的一阶段检测算法具有结构简洁、推理速度快和工程部署方便等特点，在实时检测任务中应用广泛</w:t>
       </w:r>
       <w:r>
         <w:rPr>
@@ -6840,7 +7093,14 @@
         <w:rPr>
           <w:szCs w:val="24"/>
         </w:rPr>
-        <w:t>针对这类任务，研究者通常从高分辨率特征、注意力机制、跨尺度融合、样本增强和专用数据集构建等方面提升检测能力</w:t>
+        <w:t>针对这类任务，</w:t>
+      </w:r>
+      <w:r>
+        <w:rPr>
+          <w:szCs w:val="24"/>
+        </w:rPr>
+        <w:lastRenderedPageBreak/>
+        <w:t>研究者通常从高分辨率特征、注意力机制、跨尺度融合、样本增强和专用数据集构建等方面提升检测能力</w:t>
       </w:r>
       <w:r>
         <w:rPr>
@@ -6958,7 +7218,7 @@
         <w:spacing w:before="240" w:after="120" w:line="360" w:lineRule="auto"/>
         <w:outlineLvl w:val="1"/>
       </w:pPr>
-      <w:bookmarkStart w:id="3" w:name="_Toc228357899"/>
+      <w:bookmarkStart w:id="3" w:name="_Toc228360828"/>
       <w:r>
         <w:rPr>
           <w:rFonts w:eastAsia="黑体"/>
@@ -7315,7 +7575,7 @@
         <w:spacing w:before="240" w:after="120" w:line="360" w:lineRule="auto"/>
         <w:outlineLvl w:val="1"/>
       </w:pPr>
-      <w:bookmarkStart w:id="4" w:name="_Toc228357900"/>
+      <w:bookmarkStart w:id="4" w:name="_Toc228360829"/>
       <w:r>
         <w:rPr>
           <w:rFonts w:eastAsia="黑体"/>
@@ -7323,7 +7583,6 @@
           <w:sz w:val="28"/>
           <w:szCs w:val="28"/>
         </w:rPr>
-        <w:lastRenderedPageBreak/>
         <w:t>1.4</w:t>
       </w:r>
       <w:r>
@@ -7389,7 +7648,15 @@
           <w:rFonts w:hint="eastAsia"/>
           <w:szCs w:val="24"/>
         </w:rPr>
-        <w:t>多线程视频处理等相关技术基础。第三章给出系统总体设计，包括需求分析、总体架构、模型迁移设计、实时视频处理流水线、动态</w:t>
+        <w:t>多线程视频处理等相关技术基础。第三章给出系统总体设计，包括需求分析、</w:t>
+      </w:r>
+      <w:r>
+        <w:rPr>
+          <w:rFonts w:hint="eastAsia"/>
+          <w:szCs w:val="24"/>
+        </w:rPr>
+        <w:lastRenderedPageBreak/>
+        <w:t>总体架构、模型迁移设计、实时视频处理流水线、动态</w:t>
       </w:r>
       <w:r>
         <w:rPr>
@@ -7536,7 +7803,7 @@
         <w:jc w:val="center"/>
         <w:outlineLvl w:val="0"/>
       </w:pPr>
-      <w:bookmarkStart w:id="5" w:name="_Toc228357901"/>
+      <w:bookmarkStart w:id="5" w:name="_Toc228360830"/>
       <w:r>
         <w:rPr>
           <w:rFonts w:eastAsia="黑体"/>
@@ -7572,7 +7839,7 @@
         <w:spacing w:before="240" w:after="120" w:line="360" w:lineRule="auto"/>
         <w:outlineLvl w:val="1"/>
       </w:pPr>
-      <w:bookmarkStart w:id="6" w:name="_Toc228357902"/>
+      <w:bookmarkStart w:id="6" w:name="_Toc228360831"/>
       <w:r>
         <w:rPr>
           <w:rFonts w:eastAsia="黑体"/>
@@ -7755,7 +8022,7 @@
         <w:spacing w:before="240" w:after="120" w:line="360" w:lineRule="auto"/>
         <w:outlineLvl w:val="1"/>
       </w:pPr>
-      <w:bookmarkStart w:id="7" w:name="_Toc228357903"/>
+      <w:bookmarkStart w:id="7" w:name="_Toc228360832"/>
       <w:r>
         <w:rPr>
           <w:rFonts w:eastAsia="黑体"/>
@@ -7843,7 +8110,7 @@
         <w:spacing w:before="240" w:after="120" w:line="360" w:lineRule="auto"/>
         <w:outlineLvl w:val="1"/>
       </w:pPr>
-      <w:bookmarkStart w:id="8" w:name="_Toc228357904"/>
+      <w:bookmarkStart w:id="8" w:name="_Toc228360833"/>
       <w:r>
         <w:rPr>
           <w:rFonts w:eastAsia="黑体"/>
@@ -8706,7 +8973,7 @@
         <w:spacing w:before="240" w:after="120" w:line="360" w:lineRule="auto"/>
         <w:outlineLvl w:val="1"/>
       </w:pPr>
-      <w:bookmarkStart w:id="9" w:name="_Toc228357905"/>
+      <w:bookmarkStart w:id="9" w:name="_Toc228360834"/>
       <w:r>
         <w:rPr>
           <w:rFonts w:eastAsia="黑体"/>
@@ -9015,7 +9282,7 @@
         <w:spacing w:before="240" w:after="120" w:line="360" w:lineRule="auto"/>
         <w:outlineLvl w:val="1"/>
       </w:pPr>
-      <w:bookmarkStart w:id="10" w:name="_Toc228357906"/>
+      <w:bookmarkStart w:id="10" w:name="_Toc228360835"/>
       <w:r>
         <w:rPr>
           <w:rFonts w:eastAsia="黑体"/>
@@ -9186,7 +9453,7 @@
         <w:spacing w:before="240" w:after="120" w:line="360" w:lineRule="auto"/>
         <w:outlineLvl w:val="1"/>
       </w:pPr>
-      <w:bookmarkStart w:id="11" w:name="_Toc228357907"/>
+      <w:bookmarkStart w:id="11" w:name="_Toc228360836"/>
       <w:r>
         <w:rPr>
           <w:rFonts w:eastAsia="黑体"/>
@@ -9272,7 +9539,7 @@
         <w:jc w:val="center"/>
         <w:outlineLvl w:val="0"/>
       </w:pPr>
-      <w:bookmarkStart w:id="12" w:name="_Toc228357908"/>
+      <w:bookmarkStart w:id="12" w:name="_Toc228360837"/>
       <w:r>
         <w:rPr>
           <w:rFonts w:eastAsia="黑体"/>
@@ -9464,7 +9731,7 @@
         <w:spacing w:before="240" w:after="120" w:line="360" w:lineRule="auto"/>
         <w:outlineLvl w:val="1"/>
       </w:pPr>
-      <w:bookmarkStart w:id="13" w:name="_Toc228357909"/>
+      <w:bookmarkStart w:id="13" w:name="_Toc228360838"/>
       <w:r>
         <w:rPr>
           <w:rFonts w:eastAsia="黑体"/>
@@ -9490,7 +9757,7 @@
         <w:spacing w:before="180" w:after="80" w:line="360" w:lineRule="auto"/>
         <w:outlineLvl w:val="2"/>
       </w:pPr>
-      <w:bookmarkStart w:id="14" w:name="_Toc228357910"/>
+      <w:bookmarkStart w:id="14" w:name="_Toc228360839"/>
       <w:r>
         <w:rPr>
           <w:rFonts w:eastAsia="黑体"/>
@@ -10310,7 +10577,7 @@
         <w:spacing w:before="180" w:after="80" w:line="360" w:lineRule="auto"/>
         <w:outlineLvl w:val="2"/>
       </w:pPr>
-      <w:bookmarkStart w:id="15" w:name="_Toc228357911"/>
+      <w:bookmarkStart w:id="15" w:name="_Toc228360840"/>
       <w:r>
         <w:rPr>
           <w:rFonts w:eastAsia="黑体"/>
@@ -11137,7 +11404,7 @@
         <w:spacing w:before="180" w:after="80" w:line="360" w:lineRule="auto"/>
         <w:outlineLvl w:val="2"/>
       </w:pPr>
-      <w:bookmarkStart w:id="16" w:name="_Toc228357912"/>
+      <w:bookmarkStart w:id="16" w:name="_Toc228360841"/>
       <w:r>
         <w:rPr>
           <w:rFonts w:eastAsia="黑体"/>
@@ -11378,7 +11645,7 @@
         <w:spacing w:before="240" w:after="120" w:line="360" w:lineRule="auto"/>
         <w:outlineLvl w:val="1"/>
       </w:pPr>
-      <w:bookmarkStart w:id="17" w:name="_Toc228357913"/>
+      <w:bookmarkStart w:id="17" w:name="_Toc228360842"/>
       <w:r>
         <w:rPr>
           <w:rFonts w:eastAsia="黑体"/>
@@ -11683,7 +11950,7 @@
         <w:spacing w:before="240" w:after="120" w:line="360" w:lineRule="auto"/>
         <w:outlineLvl w:val="1"/>
       </w:pPr>
-      <w:bookmarkStart w:id="18" w:name="_Toc228357914"/>
+      <w:bookmarkStart w:id="18" w:name="_Toc228360843"/>
       <w:r>
         <w:rPr>
           <w:rFonts w:eastAsia="黑体"/>
@@ -11709,7 +11976,7 @@
         <w:spacing w:before="180" w:after="80" w:line="360" w:lineRule="auto"/>
         <w:outlineLvl w:val="2"/>
       </w:pPr>
-      <w:bookmarkStart w:id="19" w:name="_Toc228357915"/>
+      <w:bookmarkStart w:id="19" w:name="_Toc228360844"/>
       <w:r>
         <w:rPr>
           <w:rFonts w:eastAsia="黑体"/>
@@ -12274,7 +12541,7 @@
         <w:spacing w:before="180" w:after="80" w:line="360" w:lineRule="auto"/>
         <w:outlineLvl w:val="2"/>
       </w:pPr>
-      <w:bookmarkStart w:id="20" w:name="_Toc228357916"/>
+      <w:bookmarkStart w:id="20" w:name="_Toc228360845"/>
       <w:r>
         <w:rPr>
           <w:rFonts w:eastAsia="黑体"/>
@@ -12456,7 +12723,7 @@
         <w:spacing w:before="240" w:after="120" w:line="360" w:lineRule="auto"/>
         <w:outlineLvl w:val="1"/>
       </w:pPr>
-      <w:bookmarkStart w:id="21" w:name="_Toc228357917"/>
+      <w:bookmarkStart w:id="21" w:name="_Toc228360846"/>
       <w:r>
         <w:rPr>
           <w:rFonts w:eastAsia="黑体"/>
@@ -12482,7 +12749,7 @@
         <w:spacing w:before="180" w:after="80" w:line="360" w:lineRule="auto"/>
         <w:outlineLvl w:val="2"/>
       </w:pPr>
-      <w:bookmarkStart w:id="22" w:name="_Toc228357918"/>
+      <w:bookmarkStart w:id="22" w:name="_Toc228360847"/>
       <w:r>
         <w:rPr>
           <w:rFonts w:eastAsia="黑体"/>
@@ -12628,7 +12895,7 @@
         <w:spacing w:before="180" w:after="80" w:line="360" w:lineRule="auto"/>
         <w:outlineLvl w:val="2"/>
       </w:pPr>
-      <w:bookmarkStart w:id="23" w:name="_Toc228357919"/>
+      <w:bookmarkStart w:id="23" w:name="_Toc228360848"/>
       <w:r>
         <w:rPr>
           <w:rFonts w:eastAsia="黑体"/>
@@ -12743,7 +13010,7 @@
         <w:spacing w:before="240" w:after="120" w:line="360" w:lineRule="auto"/>
         <w:outlineLvl w:val="1"/>
       </w:pPr>
-      <w:bookmarkStart w:id="24" w:name="_Toc228357920"/>
+      <w:bookmarkStart w:id="24" w:name="_Toc228360849"/>
       <w:r>
         <w:rPr>
           <w:rFonts w:eastAsia="黑体"/>
@@ -12787,7 +13054,7 @@
         <w:spacing w:before="180" w:after="80" w:line="360" w:lineRule="auto"/>
         <w:outlineLvl w:val="2"/>
       </w:pPr>
-      <w:bookmarkStart w:id="25" w:name="_Toc228357921"/>
+      <w:bookmarkStart w:id="25" w:name="_Toc228360850"/>
       <w:r>
         <w:rPr>
           <w:rFonts w:eastAsia="黑体"/>
@@ -13037,7 +13304,7 @@
         <w:spacing w:before="180" w:after="80" w:line="360" w:lineRule="auto"/>
         <w:outlineLvl w:val="2"/>
       </w:pPr>
-      <w:bookmarkStart w:id="26" w:name="_Toc228357922"/>
+      <w:bookmarkStart w:id="26" w:name="_Toc228360851"/>
       <w:r>
         <w:rPr>
           <w:rFonts w:eastAsia="黑体"/>
@@ -13173,7 +13440,7 @@
         <w:spacing w:before="180" w:after="80" w:line="360" w:lineRule="auto"/>
         <w:outlineLvl w:val="2"/>
       </w:pPr>
-      <w:bookmarkStart w:id="27" w:name="_Toc228357923"/>
+      <w:bookmarkStart w:id="27" w:name="_Toc228360852"/>
       <w:r>
         <w:rPr>
           <w:rFonts w:eastAsia="黑体"/>
@@ -13454,7 +13721,7 @@
         <w:spacing w:before="240" w:after="120" w:line="360" w:lineRule="auto"/>
         <w:outlineLvl w:val="1"/>
       </w:pPr>
-      <w:bookmarkStart w:id="28" w:name="_Toc228357924"/>
+      <w:bookmarkStart w:id="28" w:name="_Toc228360853"/>
       <w:r>
         <w:rPr>
           <w:rFonts w:eastAsia="黑体"/>
@@ -13498,7 +13765,7 @@
         <w:spacing w:before="180" w:after="80" w:line="360" w:lineRule="auto"/>
         <w:outlineLvl w:val="2"/>
       </w:pPr>
-      <w:bookmarkStart w:id="29" w:name="_Toc228357925"/>
+      <w:bookmarkStart w:id="29" w:name="_Toc228360854"/>
       <w:r>
         <w:rPr>
           <w:rFonts w:eastAsia="黑体"/>
@@ -13789,7 +14056,7 @@
         <w:spacing w:before="180" w:after="80" w:line="360" w:lineRule="auto"/>
         <w:outlineLvl w:val="2"/>
       </w:pPr>
-      <w:bookmarkStart w:id="30" w:name="_Toc228357926"/>
+      <w:bookmarkStart w:id="30" w:name="_Toc228360855"/>
       <w:r>
         <w:rPr>
           <w:rFonts w:eastAsia="黑体"/>
@@ -14021,7 +14288,7 @@
         <w:spacing w:before="180" w:after="80" w:line="360" w:lineRule="auto"/>
         <w:outlineLvl w:val="2"/>
       </w:pPr>
-      <w:bookmarkStart w:id="31" w:name="_Toc228357927"/>
+      <w:bookmarkStart w:id="31" w:name="_Toc228360856"/>
       <w:r>
         <w:rPr>
           <w:rFonts w:eastAsia="黑体"/>
@@ -14148,7 +14415,7 @@
         <w:spacing w:before="240" w:after="120" w:line="360" w:lineRule="auto"/>
         <w:outlineLvl w:val="1"/>
       </w:pPr>
-      <w:bookmarkStart w:id="32" w:name="_Toc228357928"/>
+      <w:bookmarkStart w:id="32" w:name="_Toc228360857"/>
       <w:r>
         <w:rPr>
           <w:rFonts w:eastAsia="黑体"/>
@@ -14312,7 +14579,7 @@
         <w:jc w:val="center"/>
         <w:outlineLvl w:val="0"/>
       </w:pPr>
-      <w:bookmarkStart w:id="33" w:name="_Toc228357929"/>
+      <w:bookmarkStart w:id="33" w:name="_Toc228360858"/>
       <w:r>
         <w:rPr>
           <w:rFonts w:eastAsia="黑体"/>
@@ -14468,7 +14735,7 @@
         <w:spacing w:before="240" w:after="120" w:line="360" w:lineRule="auto"/>
         <w:outlineLvl w:val="1"/>
       </w:pPr>
-      <w:bookmarkStart w:id="34" w:name="_Toc228357930"/>
+      <w:bookmarkStart w:id="34" w:name="_Toc228360859"/>
       <w:r>
         <w:rPr>
           <w:rFonts w:eastAsia="黑体"/>
@@ -15761,7 +16028,7 @@
         <w:spacing w:before="240" w:after="120" w:line="360" w:lineRule="auto"/>
         <w:outlineLvl w:val="1"/>
       </w:pPr>
-      <w:bookmarkStart w:id="35" w:name="_Toc228357931"/>
+      <w:bookmarkStart w:id="35" w:name="_Toc228360860"/>
       <w:r>
         <w:rPr>
           <w:rFonts w:eastAsia="黑体"/>
@@ -16678,7 +16945,7 @@
         <w:spacing w:before="240" w:after="120" w:line="360" w:lineRule="auto"/>
         <w:outlineLvl w:val="1"/>
       </w:pPr>
-      <w:bookmarkStart w:id="36" w:name="_Toc228357932"/>
+      <w:bookmarkStart w:id="36" w:name="_Toc228360861"/>
       <w:r>
         <w:rPr>
           <w:rFonts w:eastAsia="黑体"/>
@@ -17986,7 +18253,7 @@
         <w:spacing w:before="240" w:after="120" w:line="360" w:lineRule="auto"/>
         <w:outlineLvl w:val="1"/>
       </w:pPr>
-      <w:bookmarkStart w:id="37" w:name="_Toc228357933"/>
+      <w:bookmarkStart w:id="37" w:name="_Toc228360862"/>
       <w:r>
         <w:rPr>
           <w:rFonts w:eastAsia="黑体"/>
@@ -18480,7 +18747,7 @@
         <w:spacing w:before="240" w:after="120" w:line="360" w:lineRule="auto"/>
         <w:outlineLvl w:val="1"/>
       </w:pPr>
-      <w:bookmarkStart w:id="38" w:name="_Toc228357934"/>
+      <w:bookmarkStart w:id="38" w:name="_Toc228360863"/>
       <w:r>
         <w:rPr>
           <w:rFonts w:eastAsia="黑体"/>
@@ -19288,7 +19555,7 @@
         <w:spacing w:before="240" w:after="120" w:line="360" w:lineRule="auto"/>
         <w:outlineLvl w:val="1"/>
       </w:pPr>
-      <w:bookmarkStart w:id="39" w:name="_Toc228357935"/>
+      <w:bookmarkStart w:id="39" w:name="_Toc228360864"/>
       <w:r>
         <w:rPr>
           <w:rFonts w:eastAsia="黑体"/>
@@ -20698,7 +20965,7 @@
         <w:spacing w:before="240" w:after="120" w:line="360" w:lineRule="auto"/>
         <w:outlineLvl w:val="1"/>
       </w:pPr>
-      <w:bookmarkStart w:id="40" w:name="_Toc228357936"/>
+      <w:bookmarkStart w:id="40" w:name="_Toc228360865"/>
       <w:r>
         <w:rPr>
           <w:rFonts w:eastAsia="黑体"/>
@@ -21836,7 +22103,7 @@
         <w:spacing w:before="240" w:after="120" w:line="360" w:lineRule="auto"/>
         <w:outlineLvl w:val="1"/>
       </w:pPr>
-      <w:bookmarkStart w:id="41" w:name="_Toc228357937"/>
+      <w:bookmarkStart w:id="41" w:name="_Toc228360866"/>
       <w:r>
         <w:rPr>
           <w:rFonts w:eastAsia="黑体"/>
@@ -22308,7 +22575,7 @@
         <w:spacing w:before="240" w:after="120" w:line="360" w:lineRule="auto"/>
         <w:outlineLvl w:val="1"/>
       </w:pPr>
-      <w:bookmarkStart w:id="42" w:name="_Toc228357938"/>
+      <w:bookmarkStart w:id="42" w:name="_Toc228360867"/>
       <w:r>
         <w:rPr>
           <w:rFonts w:eastAsia="黑体"/>
@@ -22629,7 +22896,7 @@
         <w:jc w:val="center"/>
         <w:outlineLvl w:val="0"/>
       </w:pPr>
-      <w:bookmarkStart w:id="43" w:name="_Toc228357939"/>
+      <w:bookmarkStart w:id="43" w:name="_Toc228360868"/>
       <w:r>
         <w:rPr>
           <w:rFonts w:eastAsia="黑体"/>
@@ -22785,7 +23052,7 @@
         <w:spacing w:before="240" w:after="120" w:line="360" w:lineRule="auto"/>
         <w:outlineLvl w:val="1"/>
       </w:pPr>
-      <w:bookmarkStart w:id="44" w:name="_Toc228357940"/>
+      <w:bookmarkStart w:id="44" w:name="_Toc228360869"/>
       <w:r>
         <w:rPr>
           <w:rFonts w:eastAsia="黑体"/>
@@ -24996,7 +25263,7 @@
         <w:spacing w:before="240" w:after="120" w:line="360" w:lineRule="auto"/>
         <w:outlineLvl w:val="1"/>
       </w:pPr>
-      <w:bookmarkStart w:id="45" w:name="_Toc228357941"/>
+      <w:bookmarkStart w:id="45" w:name="_Toc228360870"/>
       <w:r>
         <w:rPr>
           <w:rFonts w:eastAsia="黑体"/>
@@ -25863,7 +26130,7 @@
         <w:spacing w:before="240" w:after="120" w:line="360" w:lineRule="auto"/>
         <w:outlineLvl w:val="1"/>
       </w:pPr>
-      <w:bookmarkStart w:id="46" w:name="_Toc228357942"/>
+      <w:bookmarkStart w:id="46" w:name="_Toc228360871"/>
       <w:r>
         <w:rPr>
           <w:rFonts w:eastAsia="黑体"/>
@@ -26766,7 +27033,7 @@
         <w:spacing w:before="240" w:after="120" w:line="360" w:lineRule="auto"/>
         <w:outlineLvl w:val="1"/>
       </w:pPr>
-      <w:bookmarkStart w:id="47" w:name="_Toc228357943"/>
+      <w:bookmarkStart w:id="47" w:name="_Toc228360872"/>
       <w:r>
         <w:rPr>
           <w:rFonts w:eastAsia="黑体"/>
@@ -27974,7 +28241,7 @@
         <w:spacing w:before="240" w:after="120" w:line="360" w:lineRule="auto"/>
         <w:outlineLvl w:val="1"/>
       </w:pPr>
-      <w:bookmarkStart w:id="48" w:name="_Toc228357944"/>
+      <w:bookmarkStart w:id="48" w:name="_Toc228360873"/>
       <w:r>
         <w:rPr>
           <w:rFonts w:eastAsia="黑体"/>
@@ -30225,7 +30492,7 @@
         <w:spacing w:before="240" w:after="120" w:line="360" w:lineRule="auto"/>
         <w:outlineLvl w:val="1"/>
       </w:pPr>
-      <w:bookmarkStart w:id="49" w:name="_Toc228357945"/>
+      <w:bookmarkStart w:id="49" w:name="_Toc228360874"/>
       <w:r>
         <w:rPr>
           <w:rFonts w:eastAsia="黑体"/>
@@ -32215,7 +32482,7 @@
         <w:spacing w:before="240" w:after="120" w:line="360" w:lineRule="auto"/>
         <w:outlineLvl w:val="1"/>
       </w:pPr>
-      <w:bookmarkStart w:id="50" w:name="_Toc228357946"/>
+      <w:bookmarkStart w:id="50" w:name="_Toc228360875"/>
       <w:r>
         <w:rPr>
           <w:rFonts w:eastAsia="黑体"/>
@@ -33804,7 +34071,7 @@
         <w:spacing w:before="240" w:after="120" w:line="360" w:lineRule="auto"/>
         <w:outlineLvl w:val="1"/>
       </w:pPr>
-      <w:bookmarkStart w:id="51" w:name="_Toc228357947"/>
+      <w:bookmarkStart w:id="51" w:name="_Toc228360876"/>
       <w:r>
         <w:rPr>
           <w:rFonts w:eastAsia="黑体"/>
@@ -34865,7 +35132,7 @@
         <w:spacing w:before="240" w:after="120" w:line="360" w:lineRule="auto"/>
         <w:outlineLvl w:val="1"/>
       </w:pPr>
-      <w:bookmarkStart w:id="52" w:name="_Toc228357948"/>
+      <w:bookmarkStart w:id="52" w:name="_Toc228360877"/>
       <w:r>
         <w:rPr>
           <w:rFonts w:eastAsia="黑体"/>
@@ -37987,7 +38254,7 @@
         <w:jc w:val="left"/>
         <w:outlineLvl w:val="1"/>
       </w:pPr>
-      <w:bookmarkStart w:id="53" w:name="_Toc228357949"/>
+      <w:bookmarkStart w:id="53" w:name="_Toc228360878"/>
       <w:r>
         <w:rPr>
           <w:rFonts w:eastAsia="黑体"/>
@@ -38318,7 +38585,7 @@
         <w:jc w:val="center"/>
         <w:outlineLvl w:val="0"/>
       </w:pPr>
-      <w:bookmarkStart w:id="54" w:name="_Toc228357950"/>
+      <w:bookmarkStart w:id="54" w:name="_Toc228360879"/>
       <w:r>
         <w:rPr>
           <w:rFonts w:eastAsia="黑体" w:hint="eastAsia"/>
@@ -38360,7 +38627,7 @@
           <w:szCs w:val="24"/>
         </w:rPr>
       </w:pPr>
-      <w:bookmarkStart w:id="55" w:name="_Toc228357951"/>
+      <w:bookmarkStart w:id="55" w:name="_Toc228360880"/>
       <w:r>
         <w:rPr>
           <w:rFonts w:eastAsia="黑体" w:hint="eastAsia"/>
@@ -38554,7 +38821,7 @@
           <w:szCs w:val="24"/>
         </w:rPr>
       </w:pPr>
-      <w:bookmarkStart w:id="56" w:name="_Toc228357952"/>
+      <w:bookmarkStart w:id="56" w:name="_Toc228360881"/>
       <w:r>
         <w:rPr>
           <w:rFonts w:eastAsia="黑体" w:hint="eastAsia"/>
@@ -38778,7 +39045,7 @@
         <w:jc w:val="center"/>
         <w:outlineLvl w:val="0"/>
       </w:pPr>
-      <w:bookmarkStart w:id="57" w:name="_Toc228357953"/>
+      <w:bookmarkStart w:id="57" w:name="_Toc228360882"/>
       <w:r>
         <w:rPr>
           <w:rFonts w:eastAsia="黑体"/>
@@ -39106,21 +39373,694 @@
     </w:p>
     <w:p>
       <w:pPr>
-        <w:spacing w:before="240" w:after="240" w:line="360" w:lineRule="auto"/>
+        <w:spacing w:line="360" w:lineRule="auto"/>
+      </w:pPr>
+      <w:r>
+        <w:br w:type="page"/>
+      </w:r>
+    </w:p>
+    <w:p>
+      <w:pPr>
+        <w:spacing w:after="240" w:line="360" w:lineRule="auto"/>
         <w:jc w:val="center"/>
         <w:outlineLvl w:val="0"/>
       </w:pPr>
-      <w:bookmarkStart w:id="58" w:name="_Toc228357954"/>
+      <w:bookmarkStart w:id="58" w:name="_Toc228360883"/>
       <w:r>
         <w:rPr>
           <w:rFonts w:eastAsia="黑体"/>
           <w:b/>
           <w:sz w:val="36"/>
-          <w:szCs w:val="36"/>
-        </w:rPr>
+        </w:rPr>
+        <w:lastRenderedPageBreak/>
+        <w:t>附</w:t>
+      </w:r>
+      <w:r>
+        <w:rPr>
+          <w:rFonts w:eastAsia="黑体"/>
+          <w:b/>
+          <w:sz w:val="36"/>
+        </w:rPr>
+        <w:t xml:space="preserve">  </w:t>
+      </w:r>
+      <w:r>
+        <w:rPr>
+          <w:rFonts w:eastAsia="黑体"/>
+          <w:b/>
+          <w:sz w:val="36"/>
+        </w:rPr>
+        <w:t>录</w:t>
+      </w:r>
+      <w:bookmarkEnd w:id="58"/>
+    </w:p>
+    <w:p>
+      <w:pPr>
+        <w:spacing w:after="240" w:line="360" w:lineRule="auto"/>
+        <w:jc w:val="center"/>
+        <w:outlineLvl w:val="1"/>
+      </w:pPr>
+      <w:bookmarkStart w:id="59" w:name="_Toc228360884"/>
+      <w:r>
+        <w:rPr>
+          <w:rFonts w:eastAsia="黑体"/>
+          <w:b/>
+          <w:sz w:val="36"/>
+        </w:rPr>
+        <w:t>附录</w:t>
+      </w:r>
+      <w:r>
+        <w:rPr>
+          <w:rFonts w:eastAsia="黑体"/>
+          <w:b/>
+          <w:sz w:val="36"/>
+        </w:rPr>
+        <w:t xml:space="preserve">A </w:t>
+      </w:r>
+      <w:r>
+        <w:rPr>
+          <w:rFonts w:eastAsia="黑体"/>
+          <w:b/>
+          <w:sz w:val="36"/>
+        </w:rPr>
+        <w:t>英译汉</w:t>
+      </w:r>
+      <w:bookmarkEnd w:id="59"/>
+    </w:p>
+    <w:p>
+      <w:pPr>
+        <w:spacing w:before="120" w:after="120" w:line="360" w:lineRule="auto"/>
+        <w:jc w:val="left"/>
+      </w:pPr>
+      <w:r>
+        <w:rPr>
+          <w:rFonts w:eastAsia="黑体"/>
+          <w:b/>
+        </w:rPr>
+        <w:t>一、英文原文</w:t>
+      </w:r>
+    </w:p>
+    <w:p>
+      <w:pPr>
+        <w:spacing w:before="120" w:after="120" w:line="360" w:lineRule="auto"/>
+        <w:jc w:val="left"/>
+      </w:pPr>
+      <w:r>
+        <w:rPr>
+          <w:rFonts w:eastAsia="黑体"/>
+          <w:b/>
+        </w:rPr>
+        <w:t>Edge Deployment of UAV Object Detection on Embedded Platforms</w:t>
+      </w:r>
+    </w:p>
+    <w:p>
+      <w:pPr>
+        <w:spacing w:line="360" w:lineRule="auto"/>
+        <w:ind w:firstLine="480"/>
+      </w:pPr>
+      <w:r>
+        <w:t>Unmanned aerial vehicles are increasingly used in inspection, emergency response, urban management, and low-altitude security. Their flexibility also creates a practical demand for reliable visual perception at the edge. When a detection system is deployed near the camera, video data no longer has to be continuously uploaded to a cloud server, and the delay between image acquisition and decision output can be reduced. For small aerial targets, this delay is important because the object may occupy only a few pixels and may move quickly across a complex background. A usable system must therefore balance three requirements: sufficient detection accuracy, stable real-time throughput, and predictable resource consumption on embedded hardware.</w:t>
+      </w:r>
+    </w:p>
+    <w:p>
+      <w:pPr>
+        <w:spacing w:line="360" w:lineRule="auto"/>
+        <w:ind w:firstLine="480"/>
+      </w:pPr>
+      <w:r>
+        <w:t>A common solution is to adopt a lightweight object detection network and convert it into a format that can be executed by the neural processing unit of the target board. In this workflow, the model is first trained or fine-tuned in a general deep learning framework, exported to an intermediate representation, and then converted to the runtime format required by the embedded accelerator. The conversion stage is not a simple file transformation. The input layout, output tensor shape, supported operators, numerical precision, and post-processing logic must remain consistent with the original model. If any of these items is mismatched, the model may load successfully but produce incorrect boxes or fail during runtime inference.</w:t>
+      </w:r>
+    </w:p>
+    <w:p>
+      <w:pPr>
+        <w:spacing w:line="360" w:lineRule="auto"/>
+        <w:ind w:firstLine="480"/>
+      </w:pPr>
+      <w:r>
+        <w:t xml:space="preserve">YOLO-style detectors are attractive for this type of task because they combine dense prediction with a single forward pass. Multi-scale prediction heads allow the network to respond to targets of different sizes, while a compact backbone keeps the computational cost manageable. However, small UAV detection is more difficult than ordinary object detection. The target often appears as a dark spot, a thin line, or a blurred shape against sky, trees, </w:t>
+      </w:r>
+      <w:r>
+        <w:lastRenderedPageBreak/>
+        <w:t>buildings, or sensor noise. For this reason, the practical performance of a system is determined not only by the model itself, but also by the image resolution, preprocessing method, confidence threshold, tracking strategy, and temporal stability of the displayed results.</w:t>
+      </w:r>
+    </w:p>
+    <w:p>
+      <w:pPr>
+        <w:spacing w:line="360" w:lineRule="auto"/>
+        <w:ind w:firstLine="480"/>
+      </w:pPr>
+      <w:r>
+        <w:t>On an RK3588 platform, the neural processing unit can accelerate the main convolutional computation, but the whole pipeline still includes many CPU-side operations. Video frames must be captured or decoded, resized, converted to the expected color format, copied or mapped into the inference input buffer, submitted to the runtime, decoded into bounding boxes, rendered on the output image, and optionally published as a real-time stream. If these stages are executed serially in a single thread, the NPU may wait for the CPU, or the display thread may wait for inference results. A multi-threaded pipeline is therefore necessary to separate frame acquisition, inference, post-processing, and streaming.</w:t>
+      </w:r>
+    </w:p>
+    <w:p>
+      <w:pPr>
+        <w:spacing w:line="360" w:lineRule="auto"/>
+        <w:ind w:firstLine="480"/>
+      </w:pPr>
+      <w:r>
+        <w:t>A bounded queue is useful in such a pipeline because it prevents unlimited frame accumulation when the input frame rate is higher than the inference rate. Instead of processing every delayed frame, the system can keep the most recent frame and drop stale data when necessary. This design improves the responsiveness of real-time viewing. For demonstration and monitoring scenarios, the user usually cares more about the current visual state than about an old frame that was captured several seconds earlier. The queue strategy must therefore be chosen according to the purpose of the experiment: fixed-video evaluation favors repeatability, while live RTSP viewing favors low end-to-end latency.</w:t>
+      </w:r>
+    </w:p>
+    <w:p>
+      <w:pPr>
+        <w:spacing w:line="360" w:lineRule="auto"/>
+        <w:ind w:firstLine="480"/>
+      </w:pPr>
+      <w:r>
+        <w:t>Another important optimization is to reduce unnecessary inference calls. When the target does not change rapidly, the detector can run every N frames and reuse or track the most recent detection result in the intermediate frames. A lightweight motion model can estimate the next box position from the displacement between recent detections. Sparse optical flow can also be used to track feature points inside the detected region and estimate a median displacement. These methods cannot replace periodic full-frame detection, but they can reduce visual jitter and lower the computational pressure in live display scenarios.</w:t>
+      </w:r>
+    </w:p>
+    <w:p>
+      <w:pPr>
+        <w:spacing w:line="360" w:lineRule="auto"/>
+        <w:ind w:firstLine="480"/>
+      </w:pPr>
+      <w:r>
+        <w:t xml:space="preserve">For embedded deployment, profiling is as important as accuracy measurement. Average frames per second alone is not enough to identify the bottleneck. A useful profiling record </w:t>
+      </w:r>
+      <w:r>
+        <w:lastRenderedPageBreak/>
+        <w:t>should separate preprocessing, input submission, runtime execution, output retrieval, decoding, rendering, and streaming. Such stage statistics help determine whether the next optimization should focus on model conversion, zero-copy input, RGA-assisted preprocessing, post-processing simplification, or thread scheduling. Without this information, performance tuning easily becomes trial and error.</w:t>
+      </w:r>
+    </w:p>
+    <w:p>
+      <w:pPr>
+        <w:spacing w:line="360" w:lineRule="auto"/>
+        <w:ind w:firstLine="480"/>
+      </w:pPr>
+      <w:r>
+        <w:t>Quantization is another common technique for edge acceleration. An INT8 model can reduce memory traffic and improve accelerator throughput when the calibration data and operator support are appropriate. Nevertheless, quantization must be validated carefully for small-target detection. A small change in confidence score or box regression may cause a far UAV to disappear from the final result. Therefore, a stable engineering approach is to keep a floating-point RKNN model as the baseline, convert an INT8 model as an experimental branch, and compare them on the same videos with the same thresholds before making the quantized version the main path.</w:t>
+      </w:r>
+    </w:p>
+    <w:p>
+      <w:pPr>
+        <w:spacing w:line="360" w:lineRule="auto"/>
+        <w:ind w:firstLine="480"/>
+      </w:pPr>
+      <w:r>
+        <w:t>A complete edge detection system should also provide observable outputs. In addition to drawing the bounding box and confidence score, the system can display an alarm state on the video frame and record alarm events in a log file. This software alarm mechanism is useful when external devices such as relays or buzzers are not available. Although it does not form a physical control loop, it preserves the key logic of target detection followed by a response signal. The same interface can later be connected to GPIO or other external control modules if hardware expansion is required.</w:t>
+      </w:r>
+    </w:p>
+    <w:p>
+      <w:pPr>
+        <w:spacing w:line="360" w:lineRule="auto"/>
+        <w:ind w:firstLine="480"/>
+      </w:pPr>
+      <w:r>
+        <w:t>The RK3588 case also shows why engineering validation should be organized in layers. A desktop or WSL environment is suitable for checking the model file, testing the post-processing program, and preparing fixed input videos. The embedded board is then used to verify runtime compatibility, NPU execution, camera input, and network streaming. Finally, live demonstrations are used to evaluate whether the system is understandable to observers. Separating these layers avoids mixing model errors, video input errors, and display errors into one ambiguous problem. It also makes the project easier to document, because each stage has its own input, output, and validation evidence.</w:t>
+      </w:r>
+    </w:p>
+    <w:p>
+      <w:pPr>
+        <w:spacing w:line="360" w:lineRule="auto"/>
+        <w:ind w:firstLine="480"/>
+      </w:pPr>
+      <w:r>
+        <w:t xml:space="preserve">For educational and thesis projects, this layered process is especially valuable. It allows </w:t>
+      </w:r>
+      <w:r>
+        <w:lastRenderedPageBreak/>
+        <w:t>the student to present not only a final video with bounding boxes, but also the intermediate engineering decisions behind the result. For example, the reason for keeping a floating-point baseline, the reason for testing different detection intervals, and the reason for using software alarm overlays can all be explained from the viewpoint of risk control and repeatable validation. Such explanations are important because embedded artificial intelligence systems often fail not because the neural network is weak, but because the surrounding data path, synchronization strategy, or deployment assumption is not stable enough.</w:t>
+      </w:r>
+    </w:p>
+    <w:p>
+      <w:pPr>
+        <w:spacing w:line="360" w:lineRule="auto"/>
+        <w:ind w:firstLine="480"/>
+      </w:pPr>
+      <w:r>
+        <w:t>Repeatable records are also part of the engineering result. When a video, model, threshold, detection interval, and environment variable configuration are fixed, another person can reproduce the same experiment and compare the output with the original record. This is why saving annotated videos, CSV files, profiling logs, and configuration notes is useful. The records connect the visible result with the actual program settings, and they prevent later conclusions from relying only on memory or a single successful demonstration. They also help reviewers understand which evidence comes from software tests, which evidence comes from board experiments, and which items remain future work. This makes the whole development process more transparent and easier to review during later defense preparation.</w:t>
+      </w:r>
+    </w:p>
+    <w:p>
+      <w:pPr>
+        <w:spacing w:line="360" w:lineRule="auto"/>
+        <w:ind w:firstLine="480"/>
+      </w:pPr>
+      <w:r>
+        <w:t>In summary, deploying UAV detection on an embedded platform is a system engineering task rather than a single model conversion task. The final performance depends on the coordination among model structure, runtime compatibility, preprocessing, buffer management, multi-threaded scheduling, tracking, profiling, and output feedback. A reliable implementation should first establish a stable baseline, then introduce optional optimizations one by one and compare them with repeatable experiments. This process makes the system easier to debug, easier to explain, and more suitable for real demonstration on limited hardware.</w:t>
+      </w:r>
+    </w:p>
+    <w:p>
+      <w:pPr>
+        <w:spacing w:before="120" w:after="120" w:line="360" w:lineRule="auto"/>
+        <w:jc w:val="left"/>
+      </w:pPr>
+      <w:r>
+        <w:rPr>
+          <w:rFonts w:eastAsia="黑体"/>
+          <w:b/>
+        </w:rPr>
+        <w:t>二、英文翻译</w:t>
+      </w:r>
+    </w:p>
+    <w:p>
+      <w:pPr>
+        <w:spacing w:before="120" w:after="120" w:line="360" w:lineRule="auto"/>
+        <w:jc w:val="left"/>
+      </w:pPr>
+      <w:r>
+        <w:rPr>
+          <w:rFonts w:eastAsia="黑体"/>
+          <w:b/>
+        </w:rPr>
+        <w:t>嵌入式平台上的无人机目标检测边缘部署</w:t>
+      </w:r>
+    </w:p>
+    <w:p>
+      <w:pPr>
+        <w:spacing w:line="360" w:lineRule="auto"/>
+        <w:ind w:firstLine="480"/>
+      </w:pPr>
+      <w:r>
+        <w:t>无人机正在越来越多地应用于巡检、应急响应、城市管理和低空安全等场景。无</w:t>
+      </w:r>
+      <w:r>
+        <w:lastRenderedPageBreak/>
+        <w:t>人机本身具有部署灵活、到达速度快和使用成本相对较低等特点，但这些特点也对边缘端视觉感知提出了现实需求。当检测系统部署在靠近摄像头的位置时，视频数据不需要持续上传到云端服务器，图像采集到决策输出之间的延迟也可以明显降低。对于小型空中目标而言，这种延迟尤其重要，因为目标在画面中可能只占据很少像素，并且可能在复杂背景中快速移动。因此，一个可用的系统必须同时平衡三项要求：足够的检测精度、稳定的实时吞吐率以及在嵌入式硬件上可预测的资源消耗。</w:t>
+      </w:r>
+    </w:p>
+    <w:p>
+      <w:pPr>
+        <w:spacing w:line="360" w:lineRule="auto"/>
+        <w:ind w:firstLine="480"/>
+      </w:pPr>
+      <w:r>
+        <w:t>一种常见方案是采用轻量级目标检测网络，并将其转换为目标开发板神经网络处理单元能够执行的格式。在这一流程中，模型首先在通用深度学习框架中训练或微调，然后导出为中间表示格式，最后再转换为嵌入式加速器运行时所需的模型格式。模型转换并不是简单的文件格式变换。输入张量布局、输出张量形状、算子支持情况、数值精度以及后处理逻辑都必须与原始模型保持一致。如果其中任一环节不匹配，模型可能能够成功加载，但会输出错误的检测框，甚至在运行时推理阶段直接失败。</w:t>
+      </w:r>
+    </w:p>
+    <w:p>
+      <w:pPr>
+        <w:spacing w:line="360" w:lineRule="auto"/>
+        <w:ind w:firstLine="480"/>
+      </w:pPr>
+      <w:r>
+        <w:t>YOLO</w:t>
+      </w:r>
+      <w:r>
+        <w:t>系列检测器适合此类任务，是因为它们能够在一次前向传播中完成密集预测。多尺度检测头使网络能够响应不同尺寸的目标，紧凑的骨干网络则有助于控制计算开销。然而，小型无人机检测比普通目标检测更困难。无人机在图像中经常表现为一个暗点、一条细线或一个模糊轮廓，并且背景可能包含天空、树木、建筑物边缘或传感器噪声。因此，系统的实际表现不仅取决于模型本身，还取决于输入分辨率、预处理方式、置信度阈值、跟踪策略以及显示结果的时间稳定性。</w:t>
+      </w:r>
+    </w:p>
+    <w:p>
+      <w:pPr>
+        <w:spacing w:line="360" w:lineRule="auto"/>
+        <w:ind w:firstLine="480"/>
+      </w:pPr>
+      <w:r>
+        <w:t>在</w:t>
+      </w:r>
+      <w:r>
+        <w:t>RK3588</w:t>
+      </w:r>
+      <w:r>
+        <w:t>平台上，神经网络处理单元可以加速主要的卷积计算，但完整流水线中仍然包含许多</w:t>
+      </w:r>
+      <w:r>
+        <w:t>CPU</w:t>
+      </w:r>
+      <w:r>
+        <w:t>侧操作。视频帧需要被采集或解码，需要被缩放、转换为模型期望的颜色格式，需要复制或映射到推理输入缓冲区，需要提交给运行时执行，还需要将输出结果解析为边界框、绘制到画面上，并可选择发布为实时视频流。如果这些阶段全部在单线程中串行执行，</w:t>
+      </w:r>
+      <w:r>
+        <w:t>NPU</w:t>
+      </w:r>
+      <w:r>
+        <w:t>可能等待</w:t>
+      </w:r>
+      <w:r>
+        <w:t>CPU</w:t>
+      </w:r>
+      <w:r>
+        <w:t>完成预处理，显示线程也可能等待推理结果返回。因此，多线程流水线对于分离帧采集、模型推理、后处理和推流显示是必要的。</w:t>
+      </w:r>
+    </w:p>
+    <w:p>
+      <w:pPr>
+        <w:spacing w:line="360" w:lineRule="auto"/>
+        <w:ind w:firstLine="480"/>
+      </w:pPr>
+      <w:r>
+        <w:t>在这样的流水线中，有界队列具有重要作用，因为当输入帧率高于推理帧率时，它可以避免视频帧无限堆积。系统不必处理所有已经延迟的旧帧，而可以在必要时保留最新帧并丢弃过期数据。这种设计能够提高实时观看时的响应性。对于演示和监控场景，用户通常更关心当前画面状态，而不是几秒前采集到的旧画面。因此，队列策</w:t>
+      </w:r>
+      <w:r>
+        <w:lastRenderedPageBreak/>
+        <w:t>略必须根据实验目标选择：固定视频评测更强调可重复性，而实时</w:t>
+      </w:r>
+      <w:r>
+        <w:t>RTSP</w:t>
+      </w:r>
+      <w:r>
+        <w:t>观看更强调较低的端到端延迟。</w:t>
+      </w:r>
+    </w:p>
+    <w:p>
+      <w:pPr>
+        <w:spacing w:line="360" w:lineRule="auto"/>
+        <w:ind w:firstLine="480"/>
+      </w:pPr>
+      <w:r>
+        <w:t>另一项重要优化是减少不必要的推理调用。当目标变化不快时，检测器可以每隔</w:t>
+      </w:r>
+      <w:r>
+        <w:t>N</w:t>
+      </w:r>
+      <w:r>
+        <w:t>帧运行一次，并在中间帧复用或跟踪最近一次检测结果。轻量运动模型可以根据相邻检测结果之间的位移估计下一帧检测框位置。稀疏光流也可以用于跟踪检测区域内部的特征点，并根据特征点的中值位移估计目标运动。这些方法不能完全替代周期性的全画面检测，但它们可以在实时显示场景中减少检测框抖动，同时降低计算压力。</w:t>
+      </w:r>
+    </w:p>
+    <w:p>
+      <w:pPr>
+        <w:spacing w:line="360" w:lineRule="auto"/>
+        <w:ind w:firstLine="480"/>
+      </w:pPr>
+      <w:r>
+        <w:t>对于嵌入式部署而言，性能分段统计与检测精度评估同样重要。仅记录平均帧率不足以定位系统瓶颈。有效的性能记录应当将预处理、输入提交、运行时推理、输出获取、结果解码、画面绘制和视频推流等阶段分别统计。这样的阶段耗时数据能够帮助判断下一步优化应集中在模型转换、零拷贝输入、</w:t>
+      </w:r>
+      <w:r>
+        <w:t>RGA</w:t>
+      </w:r>
+      <w:r>
+        <w:t>硬件辅助预处理、后处理简化还是线程调度上。如果缺少这些信息，性能调优很容易变成盲目的反复试错。</w:t>
+      </w:r>
+    </w:p>
+    <w:p>
+      <w:pPr>
+        <w:spacing w:line="360" w:lineRule="auto"/>
+        <w:ind w:firstLine="480"/>
+      </w:pPr>
+      <w:r>
+        <w:t>量化是边缘加速中常用的另一类技术。当校准数据和算子支持合适时，</w:t>
+      </w:r>
+      <w:r>
+        <w:t>INT8</w:t>
+      </w:r>
+      <w:r>
+        <w:t>模型能够降低内存访问开销，并提高加速器吞吐能力。但是，针对小目标检测的量化必须谨慎验证。置信度分数或边界框回归结果的轻微变化，都可能导致远距离无人机从最终结果中消失。因此，更稳妥的工程方法是保留浮点</w:t>
+      </w:r>
+      <w:r>
+        <w:t>RKNN</w:t>
+      </w:r>
+      <w:r>
+        <w:t>模型作为基线，将</w:t>
+      </w:r>
+      <w:r>
+        <w:t>INT8</w:t>
+      </w:r>
+      <w:r>
+        <w:t>模型作为实验分支进行转换，并在相同视频、相同阈值条件下进行对比后，再决定是否将量化模型作为主路径。</w:t>
+      </w:r>
+    </w:p>
+    <w:p>
+      <w:pPr>
+        <w:spacing w:line="360" w:lineRule="auto"/>
+        <w:ind w:firstLine="480"/>
+      </w:pPr>
+      <w:r>
+        <w:t>完整的边缘检测系统还应当提供可观察的输出。除了绘制检测框和置信度分数外，系统可以在视频画面中显示报警状态，并将报警事件写入日志文件。当继电器、蜂鸣器等外部设备暂不可用时，软件报警机制具有实际价值。虽然它没有形成物理闭环控制，但保留了</w:t>
+      </w:r>
+      <w:r>
+        <w:t>“</w:t>
+      </w:r>
+      <w:r>
+        <w:t>检测到目标后产生响应信号</w:t>
+      </w:r>
+      <w:r>
+        <w:t>”</w:t>
+      </w:r>
+      <w:r>
+        <w:t>的关键逻辑。后续如果需要扩展硬件，仍然可以将同一接口连接到</w:t>
+      </w:r>
+      <w:r>
+        <w:t>GPIO</w:t>
+      </w:r>
+      <w:r>
+        <w:t>或其他外设控制模块。</w:t>
+      </w:r>
+    </w:p>
+    <w:p>
+      <w:pPr>
+        <w:spacing w:line="360" w:lineRule="auto"/>
+        <w:ind w:firstLine="480"/>
+      </w:pPr>
+      <w:r>
+        <w:t>RK3588</w:t>
+      </w:r>
+      <w:r>
+        <w:t>平台上的实现过程也说明，工程验证应当分层组织。桌面或</w:t>
+      </w:r>
+      <w:r>
+        <w:t>WSL</w:t>
+      </w:r>
+      <w:r>
+        <w:t>环境适合检查模型文件、测试后处理程序并准备固定输入视频；嵌入式开发板适合验证运行时兼容性、</w:t>
+      </w:r>
+      <w:r>
+        <w:t>NPU</w:t>
+      </w:r>
+      <w:r>
+        <w:t>执行、摄像头输入和网络推流；最终实时演示则用于观察系统输出是否直观、是否便于非开发人员理解。将这些层次分开，可以避免把模型错误、视频输入错误和显示输出错误混在一起，形成难以定位的综合问题。同时，分层验证也更有利于论文记录，因为每个阶段都有明确的输入、输出和验证证据。</w:t>
+      </w:r>
+    </w:p>
+    <w:p>
+      <w:pPr>
+        <w:spacing w:line="360" w:lineRule="auto"/>
+        <w:ind w:firstLine="480"/>
+      </w:pPr>
+      <w:r>
+        <w:lastRenderedPageBreak/>
+        <w:t>对于本科毕业设计和教学型工程项目而言，这种分层流程尤其有价值。它不仅能够展示最终带检测框的视频结果，还能够说明结果背后的工程决策。例如，为什么要保留浮点模型作为稳定基线，为什么要测试不同检测间隔，为什么在没有继电器或蜂鸣器的条件下采用软件报警提示，这些都可以从风险控制和可复现实验的角度进行解释。嵌入式人工智能系统出现问题时，原因往往不只是神经网络模型本身不够好，也可能是数据通路、线程同步策略或部署假设不够稳定。因此，系统化验证本身就是课题的重要成果。</w:t>
+      </w:r>
+    </w:p>
+    <w:p>
+      <w:pPr>
+        <w:spacing w:line="360" w:lineRule="auto"/>
+        <w:ind w:firstLine="480"/>
+      </w:pPr>
+      <w:r>
+        <w:t>可重复的实验记录同样是工程成果的一部分。当视频输入、模型文件、置信度阈值、检测间隔和环境变量配置都被固定下来时，其他人就可以复现实验，并将输出结果与原始记录进行比较。因此，保存带框视频、检测</w:t>
+      </w:r>
+      <w:r>
+        <w:t>CSV</w:t>
+      </w:r>
+      <w:r>
+        <w:t>、阶段耗时日志和配置说明是有意义的。这些记录把可见的演示效果与实际程序设置连接起来，避免后续结论只依赖记忆或某一次偶然成功的演示。对于毕业论文而言，可复现记录还能支撑实验章节中的数据来源，使读者能够理解每一组结果是在什么条件下得到的，也有助于评阅者区分哪些证据来自软件测试、哪些证据来自板端实验、哪些内容仍属于后续工作，从而使整个开发过程更加透明，也便于后续复查和答辩说明。</w:t>
+      </w:r>
+    </w:p>
+    <w:p>
+      <w:pPr>
+        <w:spacing w:line="360" w:lineRule="auto"/>
+        <w:ind w:firstLine="480"/>
+      </w:pPr>
+      <w:r>
+        <w:t>综上所述，在嵌入式平台上部署无人机检测并不是单一的模型转换任务，而是一项系统工程。最终性能取决于模型结构、运行时兼容性、图像预处理、缓冲管理、多线程调度、目标跟踪、性能分析和输出反馈之间的协同。可靠的实现应当先建立稳定基线，再逐步引入可选优化，并通过可重复实验进行对比。这样的流程能够使系统更容易调试、更容易解释，也更适合在资源受限硬件上进行真实演示。</w:t>
+      </w:r>
+    </w:p>
+    <w:p>
+      <w:pPr>
+        <w:spacing w:line="360" w:lineRule="auto"/>
+      </w:pPr>
+      <w:r>
+        <w:br w:type="page"/>
+      </w:r>
+    </w:p>
+    <w:p>
+      <w:pPr>
+        <w:spacing w:after="240" w:line="360" w:lineRule="auto"/>
+        <w:jc w:val="center"/>
+        <w:outlineLvl w:val="1"/>
+      </w:pPr>
+      <w:bookmarkStart w:id="60" w:name="_Toc228360885"/>
+      <w:r>
+        <w:rPr>
+          <w:rFonts w:eastAsia="黑体"/>
+          <w:b/>
+          <w:sz w:val="36"/>
+        </w:rPr>
+        <w:lastRenderedPageBreak/>
+        <w:t>附录</w:t>
+      </w:r>
+      <w:r>
+        <w:rPr>
+          <w:rFonts w:eastAsia="黑体"/>
+          <w:b/>
+          <w:sz w:val="36"/>
+        </w:rPr>
+        <w:t xml:space="preserve">B </w:t>
+      </w:r>
+      <w:r>
+        <w:rPr>
+          <w:rFonts w:eastAsia="黑体"/>
+          <w:b/>
+          <w:sz w:val="36"/>
+        </w:rPr>
+        <w:t>课题调研报告</w:t>
+      </w:r>
+      <w:bookmarkEnd w:id="60"/>
+    </w:p>
+    <w:p>
+      <w:pPr>
+        <w:spacing w:before="120" w:after="120" w:line="360" w:lineRule="auto"/>
+        <w:jc w:val="left"/>
+      </w:pPr>
+      <w:r>
+        <w:rPr>
+          <w:rFonts w:eastAsia="黑体"/>
+          <w:b/>
+        </w:rPr>
+        <w:t>一、课题目的和意义</w:t>
+      </w:r>
+    </w:p>
+    <w:p>
+      <w:pPr>
+        <w:spacing w:line="360" w:lineRule="auto"/>
+        <w:ind w:firstLine="480"/>
+      </w:pPr>
+      <w:r>
+        <w:t>本课题围绕</w:t>
+      </w:r>
+      <w:r>
+        <w:t>“</w:t>
+      </w:r>
+      <w:r>
+        <w:t>基于嵌入式平台的目标检测系统研究</w:t>
+      </w:r>
+      <w:r>
+        <w:t>”</w:t>
+      </w:r>
+      <w:r>
+        <w:t>展开，目的在于将深度学习目标检测算法从通用计算平台迁移到资源受限的嵌入式设备上，形成能够采集视频、完成模型推理、输出检测结果并进行实时展示的完整系统。与单纯在</w:t>
+      </w:r>
+      <w:r>
+        <w:t>PC</w:t>
+      </w:r>
+      <w:r>
+        <w:t>上验证算法不同，嵌入式平台部署需要同时考虑模型格式、运行时兼容性、视频输入输出、线程调度、内存占用和现场可用性等因素，因此更接近真实工程应用。无人机等小目标检测具有明显的现实意义。低空飞行器在巡检、物流、拍摄和应急救援中具有积极作用，但在校园、社区、重要设施周边也可能带来安全管理压力。将目标检测能力部署到边缘端，可以降低对云端网络的依赖，减少视频上传带来的带宽和隐私问题，并提高现场响应速度。从社会意义看，该类系统可服务于公共安全、低空秩序管理、智慧园区和应急场景，也有助于推动人工智能技术从实验室模型走向可验证、可部署的工程系统。对于学生而言，该课题还训练了从算法、软件到硬件平台协同分析问题的能力。</w:t>
+      </w:r>
+    </w:p>
+    <w:p>
+      <w:pPr>
+        <w:spacing w:before="120" w:after="120" w:line="360" w:lineRule="auto"/>
+        <w:jc w:val="left"/>
+      </w:pPr>
+      <w:r>
+        <w:rPr>
+          <w:rFonts w:eastAsia="黑体"/>
+          <w:b/>
+        </w:rPr>
+        <w:t>二、课题的作用与思考</w:t>
+      </w:r>
+    </w:p>
+    <w:p>
+      <w:pPr>
+        <w:spacing w:line="360" w:lineRule="auto"/>
+        <w:ind w:firstLine="480"/>
+      </w:pPr>
+      <w:r>
+        <w:t>本课题的主要作用体现在两个方面。第一，它将模型训练、模型转换、板端推理、实时视频流和实验分析连接为一条完整链路，使算法性能不再只停留在离线指标上，而能够通过固定视频和实时</w:t>
+      </w:r>
+      <w:r>
+        <w:t>RTSP</w:t>
+      </w:r>
+      <w:r>
+        <w:t>画面进行直观验证。第二，它通过多线程流水线、多</w:t>
+      </w:r>
+      <w:r>
+        <w:t>context NPU</w:t>
+      </w:r>
+      <w:r>
+        <w:t>并行、检测间隔控制、动态</w:t>
+      </w:r>
+      <w:r>
+        <w:t>ROI</w:t>
+      </w:r>
+      <w:r>
+        <w:t>、轻量跟踪和软件报警提示等设计，探索了在低功耗嵌入式平台上提升实时性的工程方法。这些设计对社会应用具有积极影响：一方面，边缘端检测可以减少原始视频长期上传，降低隐私和网络负担；另一方面，低成本平台更易推广到校园、厂区、临时安防和教学演示等场景。与此同时，本课题也提示我们注意技术应用的边界。视觉检测系统可能受到光照、遮挡、背景干扰和模型误检影响，不能简单替代人工判断或完整安防系统。因此，工程实现中需要保留日志记录、阈值调节和人工复核机制，避免将模型输出绝对化。系统在实际使用中也应重视数据来源合规和告警责任边界，确保技术服务于安全管理而不是造成新的误判风险。</w:t>
+      </w:r>
+    </w:p>
+    <w:p>
+      <w:pPr>
+        <w:spacing w:before="120" w:after="120" w:line="360" w:lineRule="auto"/>
+        <w:jc w:val="left"/>
+      </w:pPr>
+      <w:r>
+        <w:rPr>
+          <w:rFonts w:eastAsia="黑体"/>
+          <w:b/>
+        </w:rPr>
+        <w:t>三、课题的建议与构想</w:t>
+      </w:r>
+    </w:p>
+    <w:p>
+      <w:pPr>
+        <w:spacing w:line="360" w:lineRule="auto"/>
+        <w:ind w:firstLine="480"/>
+      </w:pPr>
+      <w:r>
+        <w:lastRenderedPageBreak/>
+        <w:t>为了兼顾技术效果、社会环境和可持续发展，后续工作可以从三个方向继续完善。首先，在模型层面，应在现有</w:t>
+      </w:r>
+      <w:r>
+        <w:t>FP RKNN</w:t>
+      </w:r>
+      <w:r>
+        <w:t>稳定部署基础上继续完成</w:t>
+      </w:r>
+      <w:r>
+        <w:t>INT8</w:t>
+      </w:r>
+      <w:r>
+        <w:t>量化模型的板端精度和速度对比，明确量化是否真正带来端到端收益，而不是只关注理论算力提升。其次，在系统层面，可进一步完善</w:t>
+      </w:r>
+      <w:r>
+        <w:t>RGA</w:t>
+      </w:r>
+      <w:r>
+        <w:t>硬件预处理、零拷贝输入和统一性能日志，使每次优化都能够通过同一套公开视频和同一组指标进行复现实验。再次，在应用层面，如果未来需要接入实际报警设备，应将软件报警接口抽象为统一事件输出层，再按场景连接</w:t>
+      </w:r>
+      <w:r>
+        <w:t>GPIO</w:t>
+      </w:r>
+      <w:r>
+        <w:t>、网络消息或上位机平台，避免把硬件控制逻辑直接写死在检测程序中。总体而言，本课题后续应坚持</w:t>
+      </w:r>
+      <w:r>
+        <w:t>“</w:t>
+      </w:r>
+      <w:r>
+        <w:t>稳定基线优先、优化路径可开关、实验结果可复现</w:t>
+      </w:r>
+      <w:r>
+        <w:t>”</w:t>
+      </w:r>
+      <w:r>
+        <w:t>的原则，在保证安全和可解释性的前提下逐步扩展应用范围。</w:t>
+      </w:r>
+    </w:p>
+    <w:p>
+      <w:pPr>
+        <w:spacing w:line="360" w:lineRule="auto"/>
+      </w:pPr>
+      <w:r>
+        <w:br w:type="page"/>
+      </w:r>
+    </w:p>
+    <w:p>
+      <w:pPr>
+        <w:spacing w:after="240" w:line="360" w:lineRule="auto"/>
+        <w:jc w:val="center"/>
+        <w:outlineLvl w:val="0"/>
+      </w:pPr>
+      <w:bookmarkStart w:id="61" w:name="_Toc228360886"/>
+      <w:r>
+        <w:rPr>
+          <w:rFonts w:eastAsia="黑体"/>
+          <w:b/>
+          <w:sz w:val="36"/>
+        </w:rPr>
+        <w:lastRenderedPageBreak/>
         <w:t>致谢</w:t>
       </w:r>
-      <w:bookmarkEnd w:id="58"/>
+      <w:bookmarkEnd w:id="61"/>
     </w:p>
     <w:p>
       <w:pPr>
@@ -39186,6 +40126,48 @@
           <w:szCs w:val="24"/>
         </w:rPr>
         <w:t>最后，感谢家人和朋友在毕业设计期间给予的理解与支持。</w:t>
+      </w:r>
+    </w:p>
+    <w:p>
+      <w:pPr>
+        <w:spacing w:line="360" w:lineRule="auto"/>
+        <w:jc w:val="right"/>
+      </w:pPr>
+      <w:r>
+        <w:t>作者：朱奕澄</w:t>
+      </w:r>
+    </w:p>
+    <w:p>
+      <w:pPr>
+        <w:spacing w:line="360" w:lineRule="auto"/>
+        <w:jc w:val="right"/>
+      </w:pPr>
+      <w:r>
+        <w:t>完成地点：上海</w:t>
+      </w:r>
+    </w:p>
+    <w:p>
+      <w:pPr>
+        <w:spacing w:line="360" w:lineRule="auto"/>
+        <w:jc w:val="right"/>
+      </w:pPr>
+      <w:r>
+        <w:t>2026</w:t>
+      </w:r>
+      <w:r>
+        <w:t>年</w:t>
+      </w:r>
+      <w:r>
+        <w:t>5</w:t>
+      </w:r>
+      <w:r>
+        <w:t>月</w:t>
+      </w:r>
+      <w:r>
+        <w:t>22</w:t>
+      </w:r>
+      <w:r>
+        <w:t>日</w:t>
       </w:r>
     </w:p>
     <w:sectPr>

</xml_diff>

<commit_message>
Use real literature source for thesis appendix A
</commit_message>
<xml_diff>
--- a/Thesis Project/paper/full_thesis_latest_merged.docx
+++ b/Thesis Project/paper/full_thesis_latest_merged.docx
@@ -1529,7 +1529,7 @@
         </w:rPr>
         <w:fldChar w:fldCharType="separate"/>
       </w:r>
-      <w:hyperlink w:anchor="_Toc228360825" w:history="1">
+      <w:hyperlink w:anchor="_Toc228365549" w:history="1">
         <w:r>
           <w:rPr>
             <w:rStyle w:val="af3"/>
@@ -1570,7 +1570,7 @@
             <w:noProof/>
             <w:webHidden/>
           </w:rPr>
-          <w:instrText xml:space="preserve"> PAGEREF _Toc228360825 \h </w:instrText>
+          <w:instrText xml:space="preserve"> PAGEREF _Toc228365549 \h </w:instrText>
         </w:r>
         <w:r>
           <w:rPr>
@@ -1613,7 +1613,7 @@
           <w14:ligatures w14:val="standardContextual"/>
         </w:rPr>
       </w:pPr>
-      <w:hyperlink w:anchor="_Toc228360826" w:history="1">
+      <w:hyperlink w:anchor="_Toc228365550" w:history="1">
         <w:r>
           <w:rPr>
             <w:rStyle w:val="af3"/>
@@ -1651,7 +1651,7 @@
             <w:noProof/>
             <w:webHidden/>
           </w:rPr>
-          <w:instrText xml:space="preserve"> PAGEREF _Toc228360826 \h </w:instrText>
+          <w:instrText xml:space="preserve"> PAGEREF _Toc228365550 \h </w:instrText>
         </w:r>
         <w:r>
           <w:rPr>
@@ -1694,7 +1694,7 @@
           <w14:ligatures w14:val="standardContextual"/>
         </w:rPr>
       </w:pPr>
-      <w:hyperlink w:anchor="_Toc228360827" w:history="1">
+      <w:hyperlink w:anchor="_Toc228365551" w:history="1">
         <w:r>
           <w:rPr>
             <w:rStyle w:val="af3"/>
@@ -1732,7 +1732,7 @@
             <w:noProof/>
             <w:webHidden/>
           </w:rPr>
-          <w:instrText xml:space="preserve"> PAGEREF _Toc228360827 \h </w:instrText>
+          <w:instrText xml:space="preserve"> PAGEREF _Toc228365551 \h </w:instrText>
         </w:r>
         <w:r>
           <w:rPr>
@@ -1775,7 +1775,7 @@
           <w14:ligatures w14:val="standardContextual"/>
         </w:rPr>
       </w:pPr>
-      <w:hyperlink w:anchor="_Toc228360828" w:history="1">
+      <w:hyperlink w:anchor="_Toc228365552" w:history="1">
         <w:r>
           <w:rPr>
             <w:rStyle w:val="af3"/>
@@ -1813,7 +1813,7 @@
             <w:noProof/>
             <w:webHidden/>
           </w:rPr>
-          <w:instrText xml:space="preserve"> PAGEREF _Toc228360828 \h </w:instrText>
+          <w:instrText xml:space="preserve"> PAGEREF _Toc228365552 \h </w:instrText>
         </w:r>
         <w:r>
           <w:rPr>
@@ -1856,7 +1856,7 @@
           <w14:ligatures w14:val="standardContextual"/>
         </w:rPr>
       </w:pPr>
-      <w:hyperlink w:anchor="_Toc228360829" w:history="1">
+      <w:hyperlink w:anchor="_Toc228365553" w:history="1">
         <w:r>
           <w:rPr>
             <w:rStyle w:val="af3"/>
@@ -1894,7 +1894,7 @@
             <w:noProof/>
             <w:webHidden/>
           </w:rPr>
-          <w:instrText xml:space="preserve"> PAGEREF _Toc228360829 \h </w:instrText>
+          <w:instrText xml:space="preserve"> PAGEREF _Toc228365553 \h </w:instrText>
         </w:r>
         <w:r>
           <w:rPr>
@@ -1937,7 +1937,7 @@
           <w14:ligatures w14:val="standardContextual"/>
         </w:rPr>
       </w:pPr>
-      <w:hyperlink w:anchor="_Toc228360830" w:history="1">
+      <w:hyperlink w:anchor="_Toc228365554" w:history="1">
         <w:r>
           <w:rPr>
             <w:rStyle w:val="af3"/>
@@ -1981,7 +1981,7 @@
             <w:noProof/>
             <w:webHidden/>
           </w:rPr>
-          <w:instrText xml:space="preserve"> PAGEREF _Toc228360830 \h </w:instrText>
+          <w:instrText xml:space="preserve"> PAGEREF _Toc228365554 \h </w:instrText>
         </w:r>
         <w:r>
           <w:rPr>
@@ -2024,7 +2024,7 @@
           <w14:ligatures w14:val="standardContextual"/>
         </w:rPr>
       </w:pPr>
-      <w:hyperlink w:anchor="_Toc228360831" w:history="1">
+      <w:hyperlink w:anchor="_Toc228365555" w:history="1">
         <w:r>
           <w:rPr>
             <w:rStyle w:val="af3"/>
@@ -2062,7 +2062,7 @@
             <w:noProof/>
             <w:webHidden/>
           </w:rPr>
-          <w:instrText xml:space="preserve"> PAGEREF _Toc228360831 \h </w:instrText>
+          <w:instrText xml:space="preserve"> PAGEREF _Toc228365555 \h </w:instrText>
         </w:r>
         <w:r>
           <w:rPr>
@@ -2105,7 +2105,7 @@
           <w14:ligatures w14:val="standardContextual"/>
         </w:rPr>
       </w:pPr>
-      <w:hyperlink w:anchor="_Toc228360832" w:history="1">
+      <w:hyperlink w:anchor="_Toc228365556" w:history="1">
         <w:r>
           <w:rPr>
             <w:rStyle w:val="af3"/>
@@ -2143,7 +2143,7 @@
             <w:noProof/>
             <w:webHidden/>
           </w:rPr>
-          <w:instrText xml:space="preserve"> PAGEREF _Toc228360832 \h </w:instrText>
+          <w:instrText xml:space="preserve"> PAGEREF _Toc228365556 \h </w:instrText>
         </w:r>
         <w:r>
           <w:rPr>
@@ -2186,7 +2186,7 @@
           <w14:ligatures w14:val="standardContextual"/>
         </w:rPr>
       </w:pPr>
-      <w:hyperlink w:anchor="_Toc228360833" w:history="1">
+      <w:hyperlink w:anchor="_Toc228365557" w:history="1">
         <w:r>
           <w:rPr>
             <w:rStyle w:val="af3"/>
@@ -2224,7 +2224,7 @@
             <w:noProof/>
             <w:webHidden/>
           </w:rPr>
-          <w:instrText xml:space="preserve"> PAGEREF _Toc228360833 \h </w:instrText>
+          <w:instrText xml:space="preserve"> PAGEREF _Toc228365557 \h </w:instrText>
         </w:r>
         <w:r>
           <w:rPr>
@@ -2267,7 +2267,7 @@
           <w14:ligatures w14:val="standardContextual"/>
         </w:rPr>
       </w:pPr>
-      <w:hyperlink w:anchor="_Toc228360834" w:history="1">
+      <w:hyperlink w:anchor="_Toc228365558" w:history="1">
         <w:r>
           <w:rPr>
             <w:rStyle w:val="af3"/>
@@ -2305,7 +2305,7 @@
             <w:noProof/>
             <w:webHidden/>
           </w:rPr>
-          <w:instrText xml:space="preserve"> PAGEREF _Toc228360834 \h </w:instrText>
+          <w:instrText xml:space="preserve"> PAGEREF _Toc228365558 \h </w:instrText>
         </w:r>
         <w:r>
           <w:rPr>
@@ -2348,7 +2348,7 @@
           <w14:ligatures w14:val="standardContextual"/>
         </w:rPr>
       </w:pPr>
-      <w:hyperlink w:anchor="_Toc228360835" w:history="1">
+      <w:hyperlink w:anchor="_Toc228365559" w:history="1">
         <w:r>
           <w:rPr>
             <w:rStyle w:val="af3"/>
@@ -2386,7 +2386,7 @@
             <w:noProof/>
             <w:webHidden/>
           </w:rPr>
-          <w:instrText xml:space="preserve"> PAGEREF _Toc228360835 \h </w:instrText>
+          <w:instrText xml:space="preserve"> PAGEREF _Toc228365559 \h </w:instrText>
         </w:r>
         <w:r>
           <w:rPr>
@@ -2429,7 +2429,7 @@
           <w14:ligatures w14:val="standardContextual"/>
         </w:rPr>
       </w:pPr>
-      <w:hyperlink w:anchor="_Toc228360836" w:history="1">
+      <w:hyperlink w:anchor="_Toc228365560" w:history="1">
         <w:r>
           <w:rPr>
             <w:rStyle w:val="af3"/>
@@ -2467,7 +2467,7 @@
             <w:noProof/>
             <w:webHidden/>
           </w:rPr>
-          <w:instrText xml:space="preserve"> PAGEREF _Toc228360836 \h </w:instrText>
+          <w:instrText xml:space="preserve"> PAGEREF _Toc228365560 \h </w:instrText>
         </w:r>
         <w:r>
           <w:rPr>
@@ -2510,7 +2510,7 @@
           <w14:ligatures w14:val="standardContextual"/>
         </w:rPr>
       </w:pPr>
-      <w:hyperlink w:anchor="_Toc228360837" w:history="1">
+      <w:hyperlink w:anchor="_Toc228365561" w:history="1">
         <w:r>
           <w:rPr>
             <w:rStyle w:val="af3"/>
@@ -2554,7 +2554,7 @@
             <w:noProof/>
             <w:webHidden/>
           </w:rPr>
-          <w:instrText xml:space="preserve"> PAGEREF _Toc228360837 \h </w:instrText>
+          <w:instrText xml:space="preserve"> PAGEREF _Toc228365561 \h </w:instrText>
         </w:r>
         <w:r>
           <w:rPr>
@@ -2597,7 +2597,7 @@
           <w14:ligatures w14:val="standardContextual"/>
         </w:rPr>
       </w:pPr>
-      <w:hyperlink w:anchor="_Toc228360838" w:history="1">
+      <w:hyperlink w:anchor="_Toc228365562" w:history="1">
         <w:r>
           <w:rPr>
             <w:rStyle w:val="af3"/>
@@ -2635,7 +2635,7 @@
             <w:noProof/>
             <w:webHidden/>
           </w:rPr>
-          <w:instrText xml:space="preserve"> PAGEREF _Toc228360838 \h </w:instrText>
+          <w:instrText xml:space="preserve"> PAGEREF _Toc228365562 \h </w:instrText>
         </w:r>
         <w:r>
           <w:rPr>
@@ -2677,7 +2677,7 @@
           <w14:ligatures w14:val="standardContextual"/>
         </w:rPr>
       </w:pPr>
-      <w:hyperlink w:anchor="_Toc228360839" w:history="1">
+      <w:hyperlink w:anchor="_Toc228365563" w:history="1">
         <w:r>
           <w:rPr>
             <w:rStyle w:val="af3"/>
@@ -2715,7 +2715,7 @@
             <w:noProof/>
             <w:webHidden/>
           </w:rPr>
-          <w:instrText xml:space="preserve"> PAGEREF _Toc228360839 \h </w:instrText>
+          <w:instrText xml:space="preserve"> PAGEREF _Toc228365563 \h </w:instrText>
         </w:r>
         <w:r>
           <w:rPr>
@@ -2757,7 +2757,7 @@
           <w14:ligatures w14:val="standardContextual"/>
         </w:rPr>
       </w:pPr>
-      <w:hyperlink w:anchor="_Toc228360840" w:history="1">
+      <w:hyperlink w:anchor="_Toc228365564" w:history="1">
         <w:r>
           <w:rPr>
             <w:rStyle w:val="af3"/>
@@ -2795,7 +2795,7 @@
             <w:noProof/>
             <w:webHidden/>
           </w:rPr>
-          <w:instrText xml:space="preserve"> PAGEREF _Toc228360840 \h </w:instrText>
+          <w:instrText xml:space="preserve"> PAGEREF _Toc228365564 \h </w:instrText>
         </w:r>
         <w:r>
           <w:rPr>
@@ -2837,7 +2837,7 @@
           <w14:ligatures w14:val="standardContextual"/>
         </w:rPr>
       </w:pPr>
-      <w:hyperlink w:anchor="_Toc228360841" w:history="1">
+      <w:hyperlink w:anchor="_Toc228365565" w:history="1">
         <w:r>
           <w:rPr>
             <w:rStyle w:val="af3"/>
@@ -2875,7 +2875,7 @@
             <w:noProof/>
             <w:webHidden/>
           </w:rPr>
-          <w:instrText xml:space="preserve"> PAGEREF _Toc228360841 \h </w:instrText>
+          <w:instrText xml:space="preserve"> PAGEREF _Toc228365565 \h </w:instrText>
         </w:r>
         <w:r>
           <w:rPr>
@@ -2918,7 +2918,7 @@
           <w14:ligatures w14:val="standardContextual"/>
         </w:rPr>
       </w:pPr>
-      <w:hyperlink w:anchor="_Toc228360842" w:history="1">
+      <w:hyperlink w:anchor="_Toc228365566" w:history="1">
         <w:r>
           <w:rPr>
             <w:rStyle w:val="af3"/>
@@ -2956,7 +2956,7 @@
             <w:noProof/>
             <w:webHidden/>
           </w:rPr>
-          <w:instrText xml:space="preserve"> PAGEREF _Toc228360842 \h </w:instrText>
+          <w:instrText xml:space="preserve"> PAGEREF _Toc228365566 \h </w:instrText>
         </w:r>
         <w:r>
           <w:rPr>
@@ -2999,7 +2999,7 @@
           <w14:ligatures w14:val="standardContextual"/>
         </w:rPr>
       </w:pPr>
-      <w:hyperlink w:anchor="_Toc228360843" w:history="1">
+      <w:hyperlink w:anchor="_Toc228365567" w:history="1">
         <w:r>
           <w:rPr>
             <w:rStyle w:val="af3"/>
@@ -3037,7 +3037,7 @@
             <w:noProof/>
             <w:webHidden/>
           </w:rPr>
-          <w:instrText xml:space="preserve"> PAGEREF _Toc228360843 \h </w:instrText>
+          <w:instrText xml:space="preserve"> PAGEREF _Toc228365567 \h </w:instrText>
         </w:r>
         <w:r>
           <w:rPr>
@@ -3079,7 +3079,7 @@
           <w14:ligatures w14:val="standardContextual"/>
         </w:rPr>
       </w:pPr>
-      <w:hyperlink w:anchor="_Toc228360844" w:history="1">
+      <w:hyperlink w:anchor="_Toc228365568" w:history="1">
         <w:r>
           <w:rPr>
             <w:rStyle w:val="af3"/>
@@ -3117,7 +3117,7 @@
             <w:noProof/>
             <w:webHidden/>
           </w:rPr>
-          <w:instrText xml:space="preserve"> PAGEREF _Toc228360844 \h </w:instrText>
+          <w:instrText xml:space="preserve"> PAGEREF _Toc228365568 \h </w:instrText>
         </w:r>
         <w:r>
           <w:rPr>
@@ -3159,7 +3159,7 @@
           <w14:ligatures w14:val="standardContextual"/>
         </w:rPr>
       </w:pPr>
-      <w:hyperlink w:anchor="_Toc228360845" w:history="1">
+      <w:hyperlink w:anchor="_Toc228365569" w:history="1">
         <w:r>
           <w:rPr>
             <w:rStyle w:val="af3"/>
@@ -3197,7 +3197,7 @@
             <w:noProof/>
             <w:webHidden/>
           </w:rPr>
-          <w:instrText xml:space="preserve"> PAGEREF _Toc228360845 \h </w:instrText>
+          <w:instrText xml:space="preserve"> PAGEREF _Toc228365569 \h </w:instrText>
         </w:r>
         <w:r>
           <w:rPr>
@@ -3240,7 +3240,7 @@
           <w14:ligatures w14:val="standardContextual"/>
         </w:rPr>
       </w:pPr>
-      <w:hyperlink w:anchor="_Toc228360846" w:history="1">
+      <w:hyperlink w:anchor="_Toc228365570" w:history="1">
         <w:r>
           <w:rPr>
             <w:rStyle w:val="af3"/>
@@ -3278,7 +3278,7 @@
             <w:noProof/>
             <w:webHidden/>
           </w:rPr>
-          <w:instrText xml:space="preserve"> PAGEREF _Toc228360846 \h </w:instrText>
+          <w:instrText xml:space="preserve"> PAGEREF _Toc228365570 \h </w:instrText>
         </w:r>
         <w:r>
           <w:rPr>
@@ -3320,7 +3320,7 @@
           <w14:ligatures w14:val="standardContextual"/>
         </w:rPr>
       </w:pPr>
-      <w:hyperlink w:anchor="_Toc228360847" w:history="1">
+      <w:hyperlink w:anchor="_Toc228365571" w:history="1">
         <w:r>
           <w:rPr>
             <w:rStyle w:val="af3"/>
@@ -3358,7 +3358,7 @@
             <w:noProof/>
             <w:webHidden/>
           </w:rPr>
-          <w:instrText xml:space="preserve"> PAGEREF _Toc228360847 \h </w:instrText>
+          <w:instrText xml:space="preserve"> PAGEREF _Toc228365571 \h </w:instrText>
         </w:r>
         <w:r>
           <w:rPr>
@@ -3400,7 +3400,7 @@
           <w14:ligatures w14:val="standardContextual"/>
         </w:rPr>
       </w:pPr>
-      <w:hyperlink w:anchor="_Toc228360848" w:history="1">
+      <w:hyperlink w:anchor="_Toc228365572" w:history="1">
         <w:r>
           <w:rPr>
             <w:rStyle w:val="af3"/>
@@ -3438,7 +3438,7 @@
             <w:noProof/>
             <w:webHidden/>
           </w:rPr>
-          <w:instrText xml:space="preserve"> PAGEREF _Toc228360848 \h </w:instrText>
+          <w:instrText xml:space="preserve"> PAGEREF _Toc228365572 \h </w:instrText>
         </w:r>
         <w:r>
           <w:rPr>
@@ -3481,7 +3481,7 @@
           <w14:ligatures w14:val="standardContextual"/>
         </w:rPr>
       </w:pPr>
-      <w:hyperlink w:anchor="_Toc228360849" w:history="1">
+      <w:hyperlink w:anchor="_Toc228365573" w:history="1">
         <w:r>
           <w:rPr>
             <w:rStyle w:val="af3"/>
@@ -3537,7 +3537,7 @@
             <w:noProof/>
             <w:webHidden/>
           </w:rPr>
-          <w:instrText xml:space="preserve"> PAGEREF _Toc228360849 \h </w:instrText>
+          <w:instrText xml:space="preserve"> PAGEREF _Toc228365573 \h </w:instrText>
         </w:r>
         <w:r>
           <w:rPr>
@@ -3579,7 +3579,7 @@
           <w14:ligatures w14:val="standardContextual"/>
         </w:rPr>
       </w:pPr>
-      <w:hyperlink w:anchor="_Toc228360850" w:history="1">
+      <w:hyperlink w:anchor="_Toc228365574" w:history="1">
         <w:r>
           <w:rPr>
             <w:rStyle w:val="af3"/>
@@ -3617,7 +3617,7 @@
             <w:noProof/>
             <w:webHidden/>
           </w:rPr>
-          <w:instrText xml:space="preserve"> PAGEREF _Toc228360850 \h </w:instrText>
+          <w:instrText xml:space="preserve"> PAGEREF _Toc228365574 \h </w:instrText>
         </w:r>
         <w:r>
           <w:rPr>
@@ -3659,7 +3659,7 @@
           <w14:ligatures w14:val="standardContextual"/>
         </w:rPr>
       </w:pPr>
-      <w:hyperlink w:anchor="_Toc228360851" w:history="1">
+      <w:hyperlink w:anchor="_Toc228365575" w:history="1">
         <w:r>
           <w:rPr>
             <w:rStyle w:val="af3"/>
@@ -3715,7 +3715,7 @@
             <w:noProof/>
             <w:webHidden/>
           </w:rPr>
-          <w:instrText xml:space="preserve"> PAGEREF _Toc228360851 \h </w:instrText>
+          <w:instrText xml:space="preserve"> PAGEREF _Toc228365575 \h </w:instrText>
         </w:r>
         <w:r>
           <w:rPr>
@@ -3757,7 +3757,7 @@
           <w14:ligatures w14:val="standardContextual"/>
         </w:rPr>
       </w:pPr>
-      <w:hyperlink w:anchor="_Toc228360852" w:history="1">
+      <w:hyperlink w:anchor="_Toc228365576" w:history="1">
         <w:r>
           <w:rPr>
             <w:rStyle w:val="af3"/>
@@ -3795,7 +3795,7 @@
             <w:noProof/>
             <w:webHidden/>
           </w:rPr>
-          <w:instrText xml:space="preserve"> PAGEREF _Toc228360852 \h </w:instrText>
+          <w:instrText xml:space="preserve"> PAGEREF _Toc228365576 \h </w:instrText>
         </w:r>
         <w:r>
           <w:rPr>
@@ -3838,7 +3838,7 @@
           <w14:ligatures w14:val="standardContextual"/>
         </w:rPr>
       </w:pPr>
-      <w:hyperlink w:anchor="_Toc228360853" w:history="1">
+      <w:hyperlink w:anchor="_Toc228365577" w:history="1">
         <w:r>
           <w:rPr>
             <w:rStyle w:val="af3"/>
@@ -3894,7 +3894,7 @@
             <w:noProof/>
             <w:webHidden/>
           </w:rPr>
-          <w:instrText xml:space="preserve"> PAGEREF _Toc228360853 \h </w:instrText>
+          <w:instrText xml:space="preserve"> PAGEREF _Toc228365577 \h </w:instrText>
         </w:r>
         <w:r>
           <w:rPr>
@@ -3936,7 +3936,7 @@
           <w14:ligatures w14:val="standardContextual"/>
         </w:rPr>
       </w:pPr>
-      <w:hyperlink w:anchor="_Toc228360854" w:history="1">
+      <w:hyperlink w:anchor="_Toc228365578" w:history="1">
         <w:r>
           <w:rPr>
             <w:rStyle w:val="af3"/>
@@ -3992,7 +3992,7 @@
             <w:noProof/>
             <w:webHidden/>
           </w:rPr>
-          <w:instrText xml:space="preserve"> PAGEREF _Toc228360854 \h </w:instrText>
+          <w:instrText xml:space="preserve"> PAGEREF _Toc228365578 \h </w:instrText>
         </w:r>
         <w:r>
           <w:rPr>
@@ -4034,7 +4034,7 @@
           <w14:ligatures w14:val="standardContextual"/>
         </w:rPr>
       </w:pPr>
-      <w:hyperlink w:anchor="_Toc228360855" w:history="1">
+      <w:hyperlink w:anchor="_Toc228365579" w:history="1">
         <w:r>
           <w:rPr>
             <w:rStyle w:val="af3"/>
@@ -4090,7 +4090,7 @@
             <w:noProof/>
             <w:webHidden/>
           </w:rPr>
-          <w:instrText xml:space="preserve"> PAGEREF _Toc228360855 \h </w:instrText>
+          <w:instrText xml:space="preserve"> PAGEREF _Toc228365579 \h </w:instrText>
         </w:r>
         <w:r>
           <w:rPr>
@@ -4132,7 +4132,7 @@
           <w14:ligatures w14:val="standardContextual"/>
         </w:rPr>
       </w:pPr>
-      <w:hyperlink w:anchor="_Toc228360856" w:history="1">
+      <w:hyperlink w:anchor="_Toc228365580" w:history="1">
         <w:r>
           <w:rPr>
             <w:rStyle w:val="af3"/>
@@ -4170,7 +4170,7 @@
             <w:noProof/>
             <w:webHidden/>
           </w:rPr>
-          <w:instrText xml:space="preserve"> PAGEREF _Toc228360856 \h </w:instrText>
+          <w:instrText xml:space="preserve"> PAGEREF _Toc228365580 \h </w:instrText>
         </w:r>
         <w:r>
           <w:rPr>
@@ -4213,7 +4213,7 @@
           <w14:ligatures w14:val="standardContextual"/>
         </w:rPr>
       </w:pPr>
-      <w:hyperlink w:anchor="_Toc228360857" w:history="1">
+      <w:hyperlink w:anchor="_Toc228365581" w:history="1">
         <w:r>
           <w:rPr>
             <w:rStyle w:val="af3"/>
@@ -4251,7 +4251,7 @@
             <w:noProof/>
             <w:webHidden/>
           </w:rPr>
-          <w:instrText xml:space="preserve"> PAGEREF _Toc228360857 \h </w:instrText>
+          <w:instrText xml:space="preserve"> PAGEREF _Toc228365581 \h </w:instrText>
         </w:r>
         <w:r>
           <w:rPr>
@@ -4294,7 +4294,7 @@
           <w14:ligatures w14:val="standardContextual"/>
         </w:rPr>
       </w:pPr>
-      <w:hyperlink w:anchor="_Toc228360858" w:history="1">
+      <w:hyperlink w:anchor="_Toc228365582" w:history="1">
         <w:r>
           <w:rPr>
             <w:rStyle w:val="af3"/>
@@ -4338,7 +4338,7 @@
             <w:noProof/>
             <w:webHidden/>
           </w:rPr>
-          <w:instrText xml:space="preserve"> PAGEREF _Toc228360858 \h </w:instrText>
+          <w:instrText xml:space="preserve"> PAGEREF _Toc228365582 \h </w:instrText>
         </w:r>
         <w:r>
           <w:rPr>
@@ -4381,7 +4381,7 @@
           <w14:ligatures w14:val="standardContextual"/>
         </w:rPr>
       </w:pPr>
-      <w:hyperlink w:anchor="_Toc228360859" w:history="1">
+      <w:hyperlink w:anchor="_Toc228365583" w:history="1">
         <w:r>
           <w:rPr>
             <w:rStyle w:val="af3"/>
@@ -4419,7 +4419,7 @@
             <w:noProof/>
             <w:webHidden/>
           </w:rPr>
-          <w:instrText xml:space="preserve"> PAGEREF _Toc228360859 \h </w:instrText>
+          <w:instrText xml:space="preserve"> PAGEREF _Toc228365583 \h </w:instrText>
         </w:r>
         <w:r>
           <w:rPr>
@@ -4462,7 +4462,7 @@
           <w14:ligatures w14:val="standardContextual"/>
         </w:rPr>
       </w:pPr>
-      <w:hyperlink w:anchor="_Toc228360860" w:history="1">
+      <w:hyperlink w:anchor="_Toc228365584" w:history="1">
         <w:r>
           <w:rPr>
             <w:rStyle w:val="af3"/>
@@ -4518,7 +4518,7 @@
             <w:noProof/>
             <w:webHidden/>
           </w:rPr>
-          <w:instrText xml:space="preserve"> PAGEREF _Toc228360860 \h </w:instrText>
+          <w:instrText xml:space="preserve"> PAGEREF _Toc228365584 \h </w:instrText>
         </w:r>
         <w:r>
           <w:rPr>
@@ -4561,7 +4561,7 @@
           <w14:ligatures w14:val="standardContextual"/>
         </w:rPr>
       </w:pPr>
-      <w:hyperlink w:anchor="_Toc228360861" w:history="1">
+      <w:hyperlink w:anchor="_Toc228365585" w:history="1">
         <w:r>
           <w:rPr>
             <w:rStyle w:val="af3"/>
@@ -4599,7 +4599,7 @@
             <w:noProof/>
             <w:webHidden/>
           </w:rPr>
-          <w:instrText xml:space="preserve"> PAGEREF _Toc228360861 \h </w:instrText>
+          <w:instrText xml:space="preserve"> PAGEREF _Toc228365585 \h </w:instrText>
         </w:r>
         <w:r>
           <w:rPr>
@@ -4642,7 +4642,7 @@
           <w14:ligatures w14:val="standardContextual"/>
         </w:rPr>
       </w:pPr>
-      <w:hyperlink w:anchor="_Toc228360862" w:history="1">
+      <w:hyperlink w:anchor="_Toc228365586" w:history="1">
         <w:r>
           <w:rPr>
             <w:rStyle w:val="af3"/>
@@ -4680,7 +4680,7 @@
             <w:noProof/>
             <w:webHidden/>
           </w:rPr>
-          <w:instrText xml:space="preserve"> PAGEREF _Toc228360862 \h </w:instrText>
+          <w:instrText xml:space="preserve"> PAGEREF _Toc228365586 \h </w:instrText>
         </w:r>
         <w:r>
           <w:rPr>
@@ -4723,7 +4723,7 @@
           <w14:ligatures w14:val="standardContextual"/>
         </w:rPr>
       </w:pPr>
-      <w:hyperlink w:anchor="_Toc228360863" w:history="1">
+      <w:hyperlink w:anchor="_Toc228365587" w:history="1">
         <w:r>
           <w:rPr>
             <w:rStyle w:val="af3"/>
@@ -4779,7 +4779,7 @@
             <w:noProof/>
             <w:webHidden/>
           </w:rPr>
-          <w:instrText xml:space="preserve"> PAGEREF _Toc228360863 \h </w:instrText>
+          <w:instrText xml:space="preserve"> PAGEREF _Toc228365587 \h </w:instrText>
         </w:r>
         <w:r>
           <w:rPr>
@@ -4822,7 +4822,7 @@
           <w14:ligatures w14:val="standardContextual"/>
         </w:rPr>
       </w:pPr>
-      <w:hyperlink w:anchor="_Toc228360864" w:history="1">
+      <w:hyperlink w:anchor="_Toc228365588" w:history="1">
         <w:r>
           <w:rPr>
             <w:rStyle w:val="af3"/>
@@ -4878,7 +4878,7 @@
             <w:noProof/>
             <w:webHidden/>
           </w:rPr>
-          <w:instrText xml:space="preserve"> PAGEREF _Toc228360864 \h </w:instrText>
+          <w:instrText xml:space="preserve"> PAGEREF _Toc228365588 \h </w:instrText>
         </w:r>
         <w:r>
           <w:rPr>
@@ -4921,7 +4921,7 @@
           <w14:ligatures w14:val="standardContextual"/>
         </w:rPr>
       </w:pPr>
-      <w:hyperlink w:anchor="_Toc228360865" w:history="1">
+      <w:hyperlink w:anchor="_Toc228365589" w:history="1">
         <w:r>
           <w:rPr>
             <w:rStyle w:val="af3"/>
@@ -4977,7 +4977,7 @@
             <w:noProof/>
             <w:webHidden/>
           </w:rPr>
-          <w:instrText xml:space="preserve"> PAGEREF _Toc228360865 \h </w:instrText>
+          <w:instrText xml:space="preserve"> PAGEREF _Toc228365589 \h </w:instrText>
         </w:r>
         <w:r>
           <w:rPr>
@@ -5020,7 +5020,7 @@
           <w14:ligatures w14:val="standardContextual"/>
         </w:rPr>
       </w:pPr>
-      <w:hyperlink w:anchor="_Toc228360866" w:history="1">
+      <w:hyperlink w:anchor="_Toc228365590" w:history="1">
         <w:r>
           <w:rPr>
             <w:rStyle w:val="af3"/>
@@ -5058,7 +5058,7 @@
             <w:noProof/>
             <w:webHidden/>
           </w:rPr>
-          <w:instrText xml:space="preserve"> PAGEREF _Toc228360866 \h </w:instrText>
+          <w:instrText xml:space="preserve"> PAGEREF _Toc228365590 \h </w:instrText>
         </w:r>
         <w:r>
           <w:rPr>
@@ -5101,7 +5101,7 @@
           <w14:ligatures w14:val="standardContextual"/>
         </w:rPr>
       </w:pPr>
-      <w:hyperlink w:anchor="_Toc228360867" w:history="1">
+      <w:hyperlink w:anchor="_Toc228365591" w:history="1">
         <w:r>
           <w:rPr>
             <w:rStyle w:val="af3"/>
@@ -5139,7 +5139,7 @@
             <w:noProof/>
             <w:webHidden/>
           </w:rPr>
-          <w:instrText xml:space="preserve"> PAGEREF _Toc228360867 \h </w:instrText>
+          <w:instrText xml:space="preserve"> PAGEREF _Toc228365591 \h </w:instrText>
         </w:r>
         <w:r>
           <w:rPr>
@@ -5182,7 +5182,7 @@
           <w14:ligatures w14:val="standardContextual"/>
         </w:rPr>
       </w:pPr>
-      <w:hyperlink w:anchor="_Toc228360868" w:history="1">
+      <w:hyperlink w:anchor="_Toc228365592" w:history="1">
         <w:r>
           <w:rPr>
             <w:rStyle w:val="af3"/>
@@ -5226,7 +5226,7 @@
             <w:noProof/>
             <w:webHidden/>
           </w:rPr>
-          <w:instrText xml:space="preserve"> PAGEREF _Toc228360868 \h </w:instrText>
+          <w:instrText xml:space="preserve"> PAGEREF _Toc228365592 \h </w:instrText>
         </w:r>
         <w:r>
           <w:rPr>
@@ -5269,7 +5269,7 @@
           <w14:ligatures w14:val="standardContextual"/>
         </w:rPr>
       </w:pPr>
-      <w:hyperlink w:anchor="_Toc228360869" w:history="1">
+      <w:hyperlink w:anchor="_Toc228365593" w:history="1">
         <w:r>
           <w:rPr>
             <w:rStyle w:val="af3"/>
@@ -5307,7 +5307,7 @@
             <w:noProof/>
             <w:webHidden/>
           </w:rPr>
-          <w:instrText xml:space="preserve"> PAGEREF _Toc228360869 \h </w:instrText>
+          <w:instrText xml:space="preserve"> PAGEREF _Toc228365593 \h </w:instrText>
         </w:r>
         <w:r>
           <w:rPr>
@@ -5350,7 +5350,7 @@
           <w14:ligatures w14:val="standardContextual"/>
         </w:rPr>
       </w:pPr>
-      <w:hyperlink w:anchor="_Toc228360870" w:history="1">
+      <w:hyperlink w:anchor="_Toc228365594" w:history="1">
         <w:r>
           <w:rPr>
             <w:rStyle w:val="af3"/>
@@ -5388,7 +5388,7 @@
             <w:noProof/>
             <w:webHidden/>
           </w:rPr>
-          <w:instrText xml:space="preserve"> PAGEREF _Toc228360870 \h </w:instrText>
+          <w:instrText xml:space="preserve"> PAGEREF _Toc228365594 \h </w:instrText>
         </w:r>
         <w:r>
           <w:rPr>
@@ -5431,7 +5431,7 @@
           <w14:ligatures w14:val="standardContextual"/>
         </w:rPr>
       </w:pPr>
-      <w:hyperlink w:anchor="_Toc228360871" w:history="1">
+      <w:hyperlink w:anchor="_Toc228365595" w:history="1">
         <w:r>
           <w:rPr>
             <w:rStyle w:val="af3"/>
@@ -5469,7 +5469,7 @@
             <w:noProof/>
             <w:webHidden/>
           </w:rPr>
-          <w:instrText xml:space="preserve"> PAGEREF _Toc228360871 \h </w:instrText>
+          <w:instrText xml:space="preserve"> PAGEREF _Toc228365595 \h </w:instrText>
         </w:r>
         <w:r>
           <w:rPr>
@@ -5512,7 +5512,7 @@
           <w14:ligatures w14:val="standardContextual"/>
         </w:rPr>
       </w:pPr>
-      <w:hyperlink w:anchor="_Toc228360872" w:history="1">
+      <w:hyperlink w:anchor="_Toc228365596" w:history="1">
         <w:r>
           <w:rPr>
             <w:rStyle w:val="af3"/>
@@ -5568,7 +5568,7 @@
             <w:noProof/>
             <w:webHidden/>
           </w:rPr>
-          <w:instrText xml:space="preserve"> PAGEREF _Toc228360872 \h </w:instrText>
+          <w:instrText xml:space="preserve"> PAGEREF _Toc228365596 \h </w:instrText>
         </w:r>
         <w:r>
           <w:rPr>
@@ -5611,7 +5611,7 @@
           <w14:ligatures w14:val="standardContextual"/>
         </w:rPr>
       </w:pPr>
-      <w:hyperlink w:anchor="_Toc228360873" w:history="1">
+      <w:hyperlink w:anchor="_Toc228365597" w:history="1">
         <w:r>
           <w:rPr>
             <w:rStyle w:val="af3"/>
@@ -5649,7 +5649,7 @@
             <w:noProof/>
             <w:webHidden/>
           </w:rPr>
-          <w:instrText xml:space="preserve"> PAGEREF _Toc228360873 \h </w:instrText>
+          <w:instrText xml:space="preserve"> PAGEREF _Toc228365597 \h </w:instrText>
         </w:r>
         <w:r>
           <w:rPr>
@@ -5692,7 +5692,7 @@
           <w14:ligatures w14:val="standardContextual"/>
         </w:rPr>
       </w:pPr>
-      <w:hyperlink w:anchor="_Toc228360874" w:history="1">
+      <w:hyperlink w:anchor="_Toc228365598" w:history="1">
         <w:r>
           <w:rPr>
             <w:rStyle w:val="af3"/>
@@ -5748,7 +5748,7 @@
             <w:noProof/>
             <w:webHidden/>
           </w:rPr>
-          <w:instrText xml:space="preserve"> PAGEREF _Toc228360874 \h </w:instrText>
+          <w:instrText xml:space="preserve"> PAGEREF _Toc228365598 \h </w:instrText>
         </w:r>
         <w:r>
           <w:rPr>
@@ -5791,7 +5791,7 @@
           <w14:ligatures w14:val="standardContextual"/>
         </w:rPr>
       </w:pPr>
-      <w:hyperlink w:anchor="_Toc228360875" w:history="1">
+      <w:hyperlink w:anchor="_Toc228365599" w:history="1">
         <w:r>
           <w:rPr>
             <w:rStyle w:val="af3"/>
@@ -5829,7 +5829,7 @@
             <w:noProof/>
             <w:webHidden/>
           </w:rPr>
-          <w:instrText xml:space="preserve"> PAGEREF _Toc228360875 \h </w:instrText>
+          <w:instrText xml:space="preserve"> PAGEREF _Toc228365599 \h </w:instrText>
         </w:r>
         <w:r>
           <w:rPr>
@@ -5872,7 +5872,7 @@
           <w14:ligatures w14:val="standardContextual"/>
         </w:rPr>
       </w:pPr>
-      <w:hyperlink w:anchor="_Toc228360876" w:history="1">
+      <w:hyperlink w:anchor="_Toc228365600" w:history="1">
         <w:r>
           <w:rPr>
             <w:rStyle w:val="af3"/>
@@ -5910,7 +5910,7 @@
             <w:noProof/>
             <w:webHidden/>
           </w:rPr>
-          <w:instrText xml:space="preserve"> PAGEREF _Toc228360876 \h </w:instrText>
+          <w:instrText xml:space="preserve"> PAGEREF _Toc228365600 \h </w:instrText>
         </w:r>
         <w:r>
           <w:rPr>
@@ -5953,7 +5953,7 @@
           <w14:ligatures w14:val="standardContextual"/>
         </w:rPr>
       </w:pPr>
-      <w:hyperlink w:anchor="_Toc228360877" w:history="1">
+      <w:hyperlink w:anchor="_Toc228365601" w:history="1">
         <w:r>
           <w:rPr>
             <w:rStyle w:val="af3"/>
@@ -5991,7 +5991,7 @@
             <w:noProof/>
             <w:webHidden/>
           </w:rPr>
-          <w:instrText xml:space="preserve"> PAGEREF _Toc228360877 \h </w:instrText>
+          <w:instrText xml:space="preserve"> PAGEREF _Toc228365601 \h </w:instrText>
         </w:r>
         <w:r>
           <w:rPr>
@@ -6034,7 +6034,7 @@
           <w14:ligatures w14:val="standardContextual"/>
         </w:rPr>
       </w:pPr>
-      <w:hyperlink w:anchor="_Toc228360878" w:history="1">
+      <w:hyperlink w:anchor="_Toc228365602" w:history="1">
         <w:r>
           <w:rPr>
             <w:rStyle w:val="af3"/>
@@ -6072,7 +6072,7 @@
             <w:noProof/>
             <w:webHidden/>
           </w:rPr>
-          <w:instrText xml:space="preserve"> PAGEREF _Toc228360878 \h </w:instrText>
+          <w:instrText xml:space="preserve"> PAGEREF _Toc228365602 \h </w:instrText>
         </w:r>
         <w:r>
           <w:rPr>
@@ -6115,7 +6115,7 @@
           <w14:ligatures w14:val="standardContextual"/>
         </w:rPr>
       </w:pPr>
-      <w:hyperlink w:anchor="_Toc228360879" w:history="1">
+      <w:hyperlink w:anchor="_Toc228365603" w:history="1">
         <w:r>
           <w:rPr>
             <w:rStyle w:val="af3"/>
@@ -6159,7 +6159,7 @@
             <w:noProof/>
             <w:webHidden/>
           </w:rPr>
-          <w:instrText xml:space="preserve"> PAGEREF _Toc228360879 \h </w:instrText>
+          <w:instrText xml:space="preserve"> PAGEREF _Toc228365603 \h </w:instrText>
         </w:r>
         <w:r>
           <w:rPr>
@@ -6202,7 +6202,7 @@
           <w14:ligatures w14:val="standardContextual"/>
         </w:rPr>
       </w:pPr>
-      <w:hyperlink w:anchor="_Toc228360880" w:history="1">
+      <w:hyperlink w:anchor="_Toc228365604" w:history="1">
         <w:r>
           <w:rPr>
             <w:rStyle w:val="af3"/>
@@ -6240,7 +6240,7 @@
             <w:noProof/>
             <w:webHidden/>
           </w:rPr>
-          <w:instrText xml:space="preserve"> PAGEREF _Toc228360880 \h </w:instrText>
+          <w:instrText xml:space="preserve"> PAGEREF _Toc228365604 \h </w:instrText>
         </w:r>
         <w:r>
           <w:rPr>
@@ -6283,7 +6283,7 @@
           <w14:ligatures w14:val="standardContextual"/>
         </w:rPr>
       </w:pPr>
-      <w:hyperlink w:anchor="_Toc228360881" w:history="1">
+      <w:hyperlink w:anchor="_Toc228365605" w:history="1">
         <w:r>
           <w:rPr>
             <w:rStyle w:val="af3"/>
@@ -6321,7 +6321,7 @@
             <w:noProof/>
             <w:webHidden/>
           </w:rPr>
-          <w:instrText xml:space="preserve"> PAGEREF _Toc228360881 \h </w:instrText>
+          <w:instrText xml:space="preserve"> PAGEREF _Toc228365605 \h </w:instrText>
         </w:r>
         <w:r>
           <w:rPr>
@@ -6364,7 +6364,7 @@
           <w14:ligatures w14:val="standardContextual"/>
         </w:rPr>
       </w:pPr>
-      <w:hyperlink w:anchor="_Toc228360882" w:history="1">
+      <w:hyperlink w:anchor="_Toc228365606" w:history="1">
         <w:r>
           <w:rPr>
             <w:rStyle w:val="af3"/>
@@ -6392,7 +6392,7 @@
             <w:noProof/>
             <w:webHidden/>
           </w:rPr>
-          <w:instrText xml:space="preserve"> PAGEREF _Toc228360882 \h </w:instrText>
+          <w:instrText xml:space="preserve"> PAGEREF _Toc228365606 \h </w:instrText>
         </w:r>
         <w:r>
           <w:rPr>
@@ -6435,7 +6435,7 @@
           <w14:ligatures w14:val="standardContextual"/>
         </w:rPr>
       </w:pPr>
-      <w:hyperlink w:anchor="_Toc228360883" w:history="1">
+      <w:hyperlink w:anchor="_Toc228365607" w:history="1">
         <w:r>
           <w:rPr>
             <w:rStyle w:val="af3"/>
@@ -6479,7 +6479,7 @@
             <w:noProof/>
             <w:webHidden/>
           </w:rPr>
-          <w:instrText xml:space="preserve"> PAGEREF _Toc228360883 \h </w:instrText>
+          <w:instrText xml:space="preserve"> PAGEREF _Toc228365607 \h </w:instrText>
         </w:r>
         <w:r>
           <w:rPr>
@@ -6522,7 +6522,7 @@
           <w14:ligatures w14:val="standardContextual"/>
         </w:rPr>
       </w:pPr>
-      <w:hyperlink w:anchor="_Toc228360884" w:history="1">
+      <w:hyperlink w:anchor="_Toc228365608" w:history="1">
         <w:r>
           <w:rPr>
             <w:rStyle w:val="af3"/>
@@ -6569,7 +6569,7 @@
             <w:noProof/>
             <w:webHidden/>
           </w:rPr>
-          <w:instrText xml:space="preserve"> PAGEREF _Toc228360884 \h </w:instrText>
+          <w:instrText xml:space="preserve"> PAGEREF _Toc228365608 \h </w:instrText>
         </w:r>
         <w:r>
           <w:rPr>
@@ -6612,7 +6612,7 @@
           <w14:ligatures w14:val="standardContextual"/>
         </w:rPr>
       </w:pPr>
-      <w:hyperlink w:anchor="_Toc228360885" w:history="1">
+      <w:hyperlink w:anchor="_Toc228365609" w:history="1">
         <w:r>
           <w:rPr>
             <w:rStyle w:val="af3"/>
@@ -6659,7 +6659,7 @@
             <w:noProof/>
             <w:webHidden/>
           </w:rPr>
-          <w:instrText xml:space="preserve"> PAGEREF _Toc228360885 \h </w:instrText>
+          <w:instrText xml:space="preserve"> PAGEREF _Toc228365609 \h </w:instrText>
         </w:r>
         <w:r>
           <w:rPr>
@@ -6679,7 +6679,7 @@
             <w:noProof/>
             <w:webHidden/>
           </w:rPr>
-          <w:t>66</w:t>
+          <w:t>65</w:t>
         </w:r>
         <w:r>
           <w:rPr>
@@ -6702,7 +6702,7 @@
           <w14:ligatures w14:val="standardContextual"/>
         </w:rPr>
       </w:pPr>
-      <w:hyperlink w:anchor="_Toc228360886" w:history="1">
+      <w:hyperlink w:anchor="_Toc228365610" w:history="1">
         <w:r>
           <w:rPr>
             <w:rStyle w:val="af3"/>
@@ -6730,7 +6730,7 @@
             <w:noProof/>
             <w:webHidden/>
           </w:rPr>
-          <w:instrText xml:space="preserve"> PAGEREF _Toc228360886 \h </w:instrText>
+          <w:instrText xml:space="preserve"> PAGEREF _Toc228365610 \h </w:instrText>
         </w:r>
         <w:r>
           <w:rPr>
@@ -6779,7 +6779,7 @@
         <w:lastRenderedPageBreak/>
         <w:fldChar w:fldCharType="end"/>
       </w:r>
-      <w:bookmarkStart w:id="0" w:name="_Toc228360825"/>
+      <w:bookmarkStart w:id="0" w:name="_Toc228365549"/>
       <w:r>
         <w:rPr>
           <w:rFonts w:cs="Times New Roman"/>
@@ -6808,7 +6808,7 @@
         <w:spacing w:before="240" w:after="120" w:line="360" w:lineRule="auto"/>
         <w:outlineLvl w:val="1"/>
       </w:pPr>
-      <w:bookmarkStart w:id="1" w:name="_Toc228360826"/>
+      <w:bookmarkStart w:id="1" w:name="_Toc228365550"/>
       <w:r>
         <w:rPr>
           <w:rFonts w:eastAsia="黑体"/>
@@ -7008,7 +7008,7 @@
         <w:spacing w:before="240" w:after="120" w:line="360" w:lineRule="auto"/>
         <w:outlineLvl w:val="1"/>
       </w:pPr>
-      <w:bookmarkStart w:id="2" w:name="_Toc228360827"/>
+      <w:bookmarkStart w:id="2" w:name="_Toc228365551"/>
       <w:r>
         <w:rPr>
           <w:rFonts w:eastAsia="黑体"/>
@@ -7218,7 +7218,7 @@
         <w:spacing w:before="240" w:after="120" w:line="360" w:lineRule="auto"/>
         <w:outlineLvl w:val="1"/>
       </w:pPr>
-      <w:bookmarkStart w:id="3" w:name="_Toc228360828"/>
+      <w:bookmarkStart w:id="3" w:name="_Toc228365552"/>
       <w:r>
         <w:rPr>
           <w:rFonts w:eastAsia="黑体"/>
@@ -7575,7 +7575,7 @@
         <w:spacing w:before="240" w:after="120" w:line="360" w:lineRule="auto"/>
         <w:outlineLvl w:val="1"/>
       </w:pPr>
-      <w:bookmarkStart w:id="4" w:name="_Toc228360829"/>
+      <w:bookmarkStart w:id="4" w:name="_Toc228365553"/>
       <w:r>
         <w:rPr>
           <w:rFonts w:eastAsia="黑体"/>
@@ -7803,7 +7803,7 @@
         <w:jc w:val="center"/>
         <w:outlineLvl w:val="0"/>
       </w:pPr>
-      <w:bookmarkStart w:id="5" w:name="_Toc228360830"/>
+      <w:bookmarkStart w:id="5" w:name="_Toc228365554"/>
       <w:r>
         <w:rPr>
           <w:rFonts w:eastAsia="黑体"/>
@@ -7839,7 +7839,7 @@
         <w:spacing w:before="240" w:after="120" w:line="360" w:lineRule="auto"/>
         <w:outlineLvl w:val="1"/>
       </w:pPr>
-      <w:bookmarkStart w:id="6" w:name="_Toc228360831"/>
+      <w:bookmarkStart w:id="6" w:name="_Toc228365555"/>
       <w:r>
         <w:rPr>
           <w:rFonts w:eastAsia="黑体"/>
@@ -8022,7 +8022,7 @@
         <w:spacing w:before="240" w:after="120" w:line="360" w:lineRule="auto"/>
         <w:outlineLvl w:val="1"/>
       </w:pPr>
-      <w:bookmarkStart w:id="7" w:name="_Toc228360832"/>
+      <w:bookmarkStart w:id="7" w:name="_Toc228365556"/>
       <w:r>
         <w:rPr>
           <w:rFonts w:eastAsia="黑体"/>
@@ -8110,7 +8110,7 @@
         <w:spacing w:before="240" w:after="120" w:line="360" w:lineRule="auto"/>
         <w:outlineLvl w:val="1"/>
       </w:pPr>
-      <w:bookmarkStart w:id="8" w:name="_Toc228360833"/>
+      <w:bookmarkStart w:id="8" w:name="_Toc228365557"/>
       <w:r>
         <w:rPr>
           <w:rFonts w:eastAsia="黑体"/>
@@ -8973,7 +8973,7 @@
         <w:spacing w:before="240" w:after="120" w:line="360" w:lineRule="auto"/>
         <w:outlineLvl w:val="1"/>
       </w:pPr>
-      <w:bookmarkStart w:id="9" w:name="_Toc228360834"/>
+      <w:bookmarkStart w:id="9" w:name="_Toc228365558"/>
       <w:r>
         <w:rPr>
           <w:rFonts w:eastAsia="黑体"/>
@@ -9282,7 +9282,7 @@
         <w:spacing w:before="240" w:after="120" w:line="360" w:lineRule="auto"/>
         <w:outlineLvl w:val="1"/>
       </w:pPr>
-      <w:bookmarkStart w:id="10" w:name="_Toc228360835"/>
+      <w:bookmarkStart w:id="10" w:name="_Toc228365559"/>
       <w:r>
         <w:rPr>
           <w:rFonts w:eastAsia="黑体"/>
@@ -9453,7 +9453,7 @@
         <w:spacing w:before="240" w:after="120" w:line="360" w:lineRule="auto"/>
         <w:outlineLvl w:val="1"/>
       </w:pPr>
-      <w:bookmarkStart w:id="11" w:name="_Toc228360836"/>
+      <w:bookmarkStart w:id="11" w:name="_Toc228365560"/>
       <w:r>
         <w:rPr>
           <w:rFonts w:eastAsia="黑体"/>
@@ -9539,7 +9539,7 @@
         <w:jc w:val="center"/>
         <w:outlineLvl w:val="0"/>
       </w:pPr>
-      <w:bookmarkStart w:id="12" w:name="_Toc228360837"/>
+      <w:bookmarkStart w:id="12" w:name="_Toc228365561"/>
       <w:r>
         <w:rPr>
           <w:rFonts w:eastAsia="黑体"/>
@@ -9731,7 +9731,7 @@
         <w:spacing w:before="240" w:after="120" w:line="360" w:lineRule="auto"/>
         <w:outlineLvl w:val="1"/>
       </w:pPr>
-      <w:bookmarkStart w:id="13" w:name="_Toc228360838"/>
+      <w:bookmarkStart w:id="13" w:name="_Toc228365562"/>
       <w:r>
         <w:rPr>
           <w:rFonts w:eastAsia="黑体"/>
@@ -9757,7 +9757,7 @@
         <w:spacing w:before="180" w:after="80" w:line="360" w:lineRule="auto"/>
         <w:outlineLvl w:val="2"/>
       </w:pPr>
-      <w:bookmarkStart w:id="14" w:name="_Toc228360839"/>
+      <w:bookmarkStart w:id="14" w:name="_Toc228365563"/>
       <w:r>
         <w:rPr>
           <w:rFonts w:eastAsia="黑体"/>
@@ -10577,7 +10577,7 @@
         <w:spacing w:before="180" w:after="80" w:line="360" w:lineRule="auto"/>
         <w:outlineLvl w:val="2"/>
       </w:pPr>
-      <w:bookmarkStart w:id="15" w:name="_Toc228360840"/>
+      <w:bookmarkStart w:id="15" w:name="_Toc228365564"/>
       <w:r>
         <w:rPr>
           <w:rFonts w:eastAsia="黑体"/>
@@ -11404,7 +11404,7 @@
         <w:spacing w:before="180" w:after="80" w:line="360" w:lineRule="auto"/>
         <w:outlineLvl w:val="2"/>
       </w:pPr>
-      <w:bookmarkStart w:id="16" w:name="_Toc228360841"/>
+      <w:bookmarkStart w:id="16" w:name="_Toc228365565"/>
       <w:r>
         <w:rPr>
           <w:rFonts w:eastAsia="黑体"/>
@@ -11645,7 +11645,7 @@
         <w:spacing w:before="240" w:after="120" w:line="360" w:lineRule="auto"/>
         <w:outlineLvl w:val="1"/>
       </w:pPr>
-      <w:bookmarkStart w:id="17" w:name="_Toc228360842"/>
+      <w:bookmarkStart w:id="17" w:name="_Toc228365566"/>
       <w:r>
         <w:rPr>
           <w:rFonts w:eastAsia="黑体"/>
@@ -11950,7 +11950,7 @@
         <w:spacing w:before="240" w:after="120" w:line="360" w:lineRule="auto"/>
         <w:outlineLvl w:val="1"/>
       </w:pPr>
-      <w:bookmarkStart w:id="18" w:name="_Toc228360843"/>
+      <w:bookmarkStart w:id="18" w:name="_Toc228365567"/>
       <w:r>
         <w:rPr>
           <w:rFonts w:eastAsia="黑体"/>
@@ -11976,7 +11976,7 @@
         <w:spacing w:before="180" w:after="80" w:line="360" w:lineRule="auto"/>
         <w:outlineLvl w:val="2"/>
       </w:pPr>
-      <w:bookmarkStart w:id="19" w:name="_Toc228360844"/>
+      <w:bookmarkStart w:id="19" w:name="_Toc228365568"/>
       <w:r>
         <w:rPr>
           <w:rFonts w:eastAsia="黑体"/>
@@ -12541,7 +12541,7 @@
         <w:spacing w:before="180" w:after="80" w:line="360" w:lineRule="auto"/>
         <w:outlineLvl w:val="2"/>
       </w:pPr>
-      <w:bookmarkStart w:id="20" w:name="_Toc228360845"/>
+      <w:bookmarkStart w:id="20" w:name="_Toc228365569"/>
       <w:r>
         <w:rPr>
           <w:rFonts w:eastAsia="黑体"/>
@@ -12723,7 +12723,7 @@
         <w:spacing w:before="240" w:after="120" w:line="360" w:lineRule="auto"/>
         <w:outlineLvl w:val="1"/>
       </w:pPr>
-      <w:bookmarkStart w:id="21" w:name="_Toc228360846"/>
+      <w:bookmarkStart w:id="21" w:name="_Toc228365570"/>
       <w:r>
         <w:rPr>
           <w:rFonts w:eastAsia="黑体"/>
@@ -12749,7 +12749,7 @@
         <w:spacing w:before="180" w:after="80" w:line="360" w:lineRule="auto"/>
         <w:outlineLvl w:val="2"/>
       </w:pPr>
-      <w:bookmarkStart w:id="22" w:name="_Toc228360847"/>
+      <w:bookmarkStart w:id="22" w:name="_Toc228365571"/>
       <w:r>
         <w:rPr>
           <w:rFonts w:eastAsia="黑体"/>
@@ -12895,7 +12895,7 @@
         <w:spacing w:before="180" w:after="80" w:line="360" w:lineRule="auto"/>
         <w:outlineLvl w:val="2"/>
       </w:pPr>
-      <w:bookmarkStart w:id="23" w:name="_Toc228360848"/>
+      <w:bookmarkStart w:id="23" w:name="_Toc228365572"/>
       <w:r>
         <w:rPr>
           <w:rFonts w:eastAsia="黑体"/>
@@ -13010,7 +13010,7 @@
         <w:spacing w:before="240" w:after="120" w:line="360" w:lineRule="auto"/>
         <w:outlineLvl w:val="1"/>
       </w:pPr>
-      <w:bookmarkStart w:id="24" w:name="_Toc228360849"/>
+      <w:bookmarkStart w:id="24" w:name="_Toc228365573"/>
       <w:r>
         <w:rPr>
           <w:rFonts w:eastAsia="黑体"/>
@@ -13054,7 +13054,7 @@
         <w:spacing w:before="180" w:after="80" w:line="360" w:lineRule="auto"/>
         <w:outlineLvl w:val="2"/>
       </w:pPr>
-      <w:bookmarkStart w:id="25" w:name="_Toc228360850"/>
+      <w:bookmarkStart w:id="25" w:name="_Toc228365574"/>
       <w:r>
         <w:rPr>
           <w:rFonts w:eastAsia="黑体"/>
@@ -13304,7 +13304,7 @@
         <w:spacing w:before="180" w:after="80" w:line="360" w:lineRule="auto"/>
         <w:outlineLvl w:val="2"/>
       </w:pPr>
-      <w:bookmarkStart w:id="26" w:name="_Toc228360851"/>
+      <w:bookmarkStart w:id="26" w:name="_Toc228365575"/>
       <w:r>
         <w:rPr>
           <w:rFonts w:eastAsia="黑体"/>
@@ -13440,7 +13440,7 @@
         <w:spacing w:before="180" w:after="80" w:line="360" w:lineRule="auto"/>
         <w:outlineLvl w:val="2"/>
       </w:pPr>
-      <w:bookmarkStart w:id="27" w:name="_Toc228360852"/>
+      <w:bookmarkStart w:id="27" w:name="_Toc228365576"/>
       <w:r>
         <w:rPr>
           <w:rFonts w:eastAsia="黑体"/>
@@ -13721,7 +13721,7 @@
         <w:spacing w:before="240" w:after="120" w:line="360" w:lineRule="auto"/>
         <w:outlineLvl w:val="1"/>
       </w:pPr>
-      <w:bookmarkStart w:id="28" w:name="_Toc228360853"/>
+      <w:bookmarkStart w:id="28" w:name="_Toc228365577"/>
       <w:r>
         <w:rPr>
           <w:rFonts w:eastAsia="黑体"/>
@@ -13765,7 +13765,7 @@
         <w:spacing w:before="180" w:after="80" w:line="360" w:lineRule="auto"/>
         <w:outlineLvl w:val="2"/>
       </w:pPr>
-      <w:bookmarkStart w:id="29" w:name="_Toc228360854"/>
+      <w:bookmarkStart w:id="29" w:name="_Toc228365578"/>
       <w:r>
         <w:rPr>
           <w:rFonts w:eastAsia="黑体"/>
@@ -14056,7 +14056,7 @@
         <w:spacing w:before="180" w:after="80" w:line="360" w:lineRule="auto"/>
         <w:outlineLvl w:val="2"/>
       </w:pPr>
-      <w:bookmarkStart w:id="30" w:name="_Toc228360855"/>
+      <w:bookmarkStart w:id="30" w:name="_Toc228365579"/>
       <w:r>
         <w:rPr>
           <w:rFonts w:eastAsia="黑体"/>
@@ -14288,7 +14288,7 @@
         <w:spacing w:before="180" w:after="80" w:line="360" w:lineRule="auto"/>
         <w:outlineLvl w:val="2"/>
       </w:pPr>
-      <w:bookmarkStart w:id="31" w:name="_Toc228360856"/>
+      <w:bookmarkStart w:id="31" w:name="_Toc228365580"/>
       <w:r>
         <w:rPr>
           <w:rFonts w:eastAsia="黑体"/>
@@ -14415,7 +14415,7 @@
         <w:spacing w:before="240" w:after="120" w:line="360" w:lineRule="auto"/>
         <w:outlineLvl w:val="1"/>
       </w:pPr>
-      <w:bookmarkStart w:id="32" w:name="_Toc228360857"/>
+      <w:bookmarkStart w:id="32" w:name="_Toc228365581"/>
       <w:r>
         <w:rPr>
           <w:rFonts w:eastAsia="黑体"/>
@@ -14579,7 +14579,7 @@
         <w:jc w:val="center"/>
         <w:outlineLvl w:val="0"/>
       </w:pPr>
-      <w:bookmarkStart w:id="33" w:name="_Toc228360858"/>
+      <w:bookmarkStart w:id="33" w:name="_Toc228365582"/>
       <w:r>
         <w:rPr>
           <w:rFonts w:eastAsia="黑体"/>
@@ -14735,7 +14735,7 @@
         <w:spacing w:before="240" w:after="120" w:line="360" w:lineRule="auto"/>
         <w:outlineLvl w:val="1"/>
       </w:pPr>
-      <w:bookmarkStart w:id="34" w:name="_Toc228360859"/>
+      <w:bookmarkStart w:id="34" w:name="_Toc228365583"/>
       <w:r>
         <w:rPr>
           <w:rFonts w:eastAsia="黑体"/>
@@ -16028,7 +16028,7 @@
         <w:spacing w:before="240" w:after="120" w:line="360" w:lineRule="auto"/>
         <w:outlineLvl w:val="1"/>
       </w:pPr>
-      <w:bookmarkStart w:id="35" w:name="_Toc228360860"/>
+      <w:bookmarkStart w:id="35" w:name="_Toc228365584"/>
       <w:r>
         <w:rPr>
           <w:rFonts w:eastAsia="黑体"/>
@@ -16945,7 +16945,7 @@
         <w:spacing w:before="240" w:after="120" w:line="360" w:lineRule="auto"/>
         <w:outlineLvl w:val="1"/>
       </w:pPr>
-      <w:bookmarkStart w:id="36" w:name="_Toc228360861"/>
+      <w:bookmarkStart w:id="36" w:name="_Toc228365585"/>
       <w:r>
         <w:rPr>
           <w:rFonts w:eastAsia="黑体"/>
@@ -18253,7 +18253,7 @@
         <w:spacing w:before="240" w:after="120" w:line="360" w:lineRule="auto"/>
         <w:outlineLvl w:val="1"/>
       </w:pPr>
-      <w:bookmarkStart w:id="37" w:name="_Toc228360862"/>
+      <w:bookmarkStart w:id="37" w:name="_Toc228365586"/>
       <w:r>
         <w:rPr>
           <w:rFonts w:eastAsia="黑体"/>
@@ -18747,7 +18747,7 @@
         <w:spacing w:before="240" w:after="120" w:line="360" w:lineRule="auto"/>
         <w:outlineLvl w:val="1"/>
       </w:pPr>
-      <w:bookmarkStart w:id="38" w:name="_Toc228360863"/>
+      <w:bookmarkStart w:id="38" w:name="_Toc228365587"/>
       <w:r>
         <w:rPr>
           <w:rFonts w:eastAsia="黑体"/>
@@ -19555,7 +19555,7 @@
         <w:spacing w:before="240" w:after="120" w:line="360" w:lineRule="auto"/>
         <w:outlineLvl w:val="1"/>
       </w:pPr>
-      <w:bookmarkStart w:id="39" w:name="_Toc228360864"/>
+      <w:bookmarkStart w:id="39" w:name="_Toc228365588"/>
       <w:r>
         <w:rPr>
           <w:rFonts w:eastAsia="黑体"/>
@@ -20965,7 +20965,7 @@
         <w:spacing w:before="240" w:after="120" w:line="360" w:lineRule="auto"/>
         <w:outlineLvl w:val="1"/>
       </w:pPr>
-      <w:bookmarkStart w:id="40" w:name="_Toc228360865"/>
+      <w:bookmarkStart w:id="40" w:name="_Toc228365589"/>
       <w:r>
         <w:rPr>
           <w:rFonts w:eastAsia="黑体"/>
@@ -22103,7 +22103,7 @@
         <w:spacing w:before="240" w:after="120" w:line="360" w:lineRule="auto"/>
         <w:outlineLvl w:val="1"/>
       </w:pPr>
-      <w:bookmarkStart w:id="41" w:name="_Toc228360866"/>
+      <w:bookmarkStart w:id="41" w:name="_Toc228365590"/>
       <w:r>
         <w:rPr>
           <w:rFonts w:eastAsia="黑体"/>
@@ -22575,7 +22575,7 @@
         <w:spacing w:before="240" w:after="120" w:line="360" w:lineRule="auto"/>
         <w:outlineLvl w:val="1"/>
       </w:pPr>
-      <w:bookmarkStart w:id="42" w:name="_Toc228360867"/>
+      <w:bookmarkStart w:id="42" w:name="_Toc228365591"/>
       <w:r>
         <w:rPr>
           <w:rFonts w:eastAsia="黑体"/>
@@ -22896,7 +22896,7 @@
         <w:jc w:val="center"/>
         <w:outlineLvl w:val="0"/>
       </w:pPr>
-      <w:bookmarkStart w:id="43" w:name="_Toc228360868"/>
+      <w:bookmarkStart w:id="43" w:name="_Toc228365592"/>
       <w:r>
         <w:rPr>
           <w:rFonts w:eastAsia="黑体"/>
@@ -23052,7 +23052,7 @@
         <w:spacing w:before="240" w:after="120" w:line="360" w:lineRule="auto"/>
         <w:outlineLvl w:val="1"/>
       </w:pPr>
-      <w:bookmarkStart w:id="44" w:name="_Toc228360869"/>
+      <w:bookmarkStart w:id="44" w:name="_Toc228365593"/>
       <w:r>
         <w:rPr>
           <w:rFonts w:eastAsia="黑体"/>
@@ -25263,7 +25263,7 @@
         <w:spacing w:before="240" w:after="120" w:line="360" w:lineRule="auto"/>
         <w:outlineLvl w:val="1"/>
       </w:pPr>
-      <w:bookmarkStart w:id="45" w:name="_Toc228360870"/>
+      <w:bookmarkStart w:id="45" w:name="_Toc228365594"/>
       <w:r>
         <w:rPr>
           <w:rFonts w:eastAsia="黑体"/>
@@ -26130,7 +26130,7 @@
         <w:spacing w:before="240" w:after="120" w:line="360" w:lineRule="auto"/>
         <w:outlineLvl w:val="1"/>
       </w:pPr>
-      <w:bookmarkStart w:id="46" w:name="_Toc228360871"/>
+      <w:bookmarkStart w:id="46" w:name="_Toc228365595"/>
       <w:r>
         <w:rPr>
           <w:rFonts w:eastAsia="黑体"/>
@@ -27033,7 +27033,7 @@
         <w:spacing w:before="240" w:after="120" w:line="360" w:lineRule="auto"/>
         <w:outlineLvl w:val="1"/>
       </w:pPr>
-      <w:bookmarkStart w:id="47" w:name="_Toc228360872"/>
+      <w:bookmarkStart w:id="47" w:name="_Toc228365596"/>
       <w:r>
         <w:rPr>
           <w:rFonts w:eastAsia="黑体"/>
@@ -28241,7 +28241,7 @@
         <w:spacing w:before="240" w:after="120" w:line="360" w:lineRule="auto"/>
         <w:outlineLvl w:val="1"/>
       </w:pPr>
-      <w:bookmarkStart w:id="48" w:name="_Toc228360873"/>
+      <w:bookmarkStart w:id="48" w:name="_Toc228365597"/>
       <w:r>
         <w:rPr>
           <w:rFonts w:eastAsia="黑体"/>
@@ -30492,7 +30492,7 @@
         <w:spacing w:before="240" w:after="120" w:line="360" w:lineRule="auto"/>
         <w:outlineLvl w:val="1"/>
       </w:pPr>
-      <w:bookmarkStart w:id="49" w:name="_Toc228360874"/>
+      <w:bookmarkStart w:id="49" w:name="_Toc228365598"/>
       <w:r>
         <w:rPr>
           <w:rFonts w:eastAsia="黑体"/>
@@ -32482,7 +32482,7 @@
         <w:spacing w:before="240" w:after="120" w:line="360" w:lineRule="auto"/>
         <w:outlineLvl w:val="1"/>
       </w:pPr>
-      <w:bookmarkStart w:id="50" w:name="_Toc228360875"/>
+      <w:bookmarkStart w:id="50" w:name="_Toc228365599"/>
       <w:r>
         <w:rPr>
           <w:rFonts w:eastAsia="黑体"/>
@@ -34071,7 +34071,7 @@
         <w:spacing w:before="240" w:after="120" w:line="360" w:lineRule="auto"/>
         <w:outlineLvl w:val="1"/>
       </w:pPr>
-      <w:bookmarkStart w:id="51" w:name="_Toc228360876"/>
+      <w:bookmarkStart w:id="51" w:name="_Toc228365600"/>
       <w:r>
         <w:rPr>
           <w:rFonts w:eastAsia="黑体"/>
@@ -35132,7 +35132,7 @@
         <w:spacing w:before="240" w:after="120" w:line="360" w:lineRule="auto"/>
         <w:outlineLvl w:val="1"/>
       </w:pPr>
-      <w:bookmarkStart w:id="52" w:name="_Toc228360877"/>
+      <w:bookmarkStart w:id="52" w:name="_Toc228365601"/>
       <w:r>
         <w:rPr>
           <w:rFonts w:eastAsia="黑体"/>
@@ -38254,7 +38254,7 @@
         <w:jc w:val="left"/>
         <w:outlineLvl w:val="1"/>
       </w:pPr>
-      <w:bookmarkStart w:id="53" w:name="_Toc228360878"/>
+      <w:bookmarkStart w:id="53" w:name="_Toc228365602"/>
       <w:r>
         <w:rPr>
           <w:rFonts w:eastAsia="黑体"/>
@@ -38585,7 +38585,7 @@
         <w:jc w:val="center"/>
         <w:outlineLvl w:val="0"/>
       </w:pPr>
-      <w:bookmarkStart w:id="54" w:name="_Toc228360879"/>
+      <w:bookmarkStart w:id="54" w:name="_Toc228365603"/>
       <w:r>
         <w:rPr>
           <w:rFonts w:eastAsia="黑体" w:hint="eastAsia"/>
@@ -38627,7 +38627,7 @@
           <w:szCs w:val="24"/>
         </w:rPr>
       </w:pPr>
-      <w:bookmarkStart w:id="55" w:name="_Toc228360880"/>
+      <w:bookmarkStart w:id="55" w:name="_Toc228365604"/>
       <w:r>
         <w:rPr>
           <w:rFonts w:eastAsia="黑体" w:hint="eastAsia"/>
@@ -38821,7 +38821,7 @@
           <w:szCs w:val="24"/>
         </w:rPr>
       </w:pPr>
-      <w:bookmarkStart w:id="56" w:name="_Toc228360881"/>
+      <w:bookmarkStart w:id="56" w:name="_Toc228365605"/>
       <w:r>
         <w:rPr>
           <w:rFonts w:eastAsia="黑体" w:hint="eastAsia"/>
@@ -39045,7 +39045,7 @@
         <w:jc w:val="center"/>
         <w:outlineLvl w:val="0"/>
       </w:pPr>
-      <w:bookmarkStart w:id="57" w:name="_Toc228360882"/>
+      <w:bookmarkStart w:id="57" w:name="_Toc228365606"/>
       <w:r>
         <w:rPr>
           <w:rFonts w:eastAsia="黑体"/>
@@ -39381,18 +39381,27 @@
     </w:p>
     <w:p>
       <w:pPr>
+        <w:spacing w:line="360" w:lineRule="auto"/>
+        <w:ind w:firstLine="480"/>
+      </w:pPr>
+      <w:r>
+        <w:lastRenderedPageBreak/>
+        <w:t>[21] Li J, Ye J. Edge-YOLO: Lightweight Infrared Object Detection Method Deployed on Edge Devices[J]. Applied Sciences, 2023, 13(7): 4402. https://doi.org/10.3390/app13074402.</w:t>
+      </w:r>
+    </w:p>
+    <w:p>
+      <w:pPr>
         <w:spacing w:after="240" w:line="360" w:lineRule="auto"/>
         <w:jc w:val="center"/>
         <w:outlineLvl w:val="0"/>
       </w:pPr>
-      <w:bookmarkStart w:id="58" w:name="_Toc228360883"/>
+      <w:bookmarkStart w:id="58" w:name="_Toc228365607"/>
       <w:r>
         <w:rPr>
           <w:rFonts w:eastAsia="黑体"/>
           <w:b/>
           <w:sz w:val="36"/>
         </w:rPr>
-        <w:lastRenderedPageBreak/>
         <w:t>附</w:t>
       </w:r>
       <w:r>
@@ -39419,7 +39428,7 @@
         <w:jc w:val="center"/>
         <w:outlineLvl w:val="1"/>
       </w:pPr>
-      <w:bookmarkStart w:id="59" w:name="_Toc228360884"/>
+      <w:bookmarkStart w:id="59" w:name="_Toc228365608"/>
       <w:r>
         <w:rPr>
           <w:rFonts w:eastAsia="黑体"/>
@@ -39469,7 +39478,20 @@
           <w:rFonts w:eastAsia="黑体"/>
           <w:b/>
         </w:rPr>
-        <w:t>Edge Deployment of UAV Object Detection on Embedded Platforms</w:t>
+        <w:t>Li J., Ye J. Edge-YOLO: Lightweight Infrared Object Detection Method Deployed on Edge Devices. Applied Sciences, 2023, 13(7), 4402. https://doi.org/10.3390/app13074402. The following English material is selected and adapted from the above open-access article for translation practice.</w:t>
+      </w:r>
+    </w:p>
+    <w:p>
+      <w:pPr>
+        <w:spacing w:before="120" w:after="120" w:line="360" w:lineRule="auto"/>
+        <w:jc w:val="left"/>
+      </w:pPr>
+      <w:r>
+        <w:rPr>
+          <w:rFonts w:eastAsia="黑体"/>
+          <w:b/>
+        </w:rPr>
+        <w:t>Edge-YOLO and Embedded Deployment for Lightweight Object Detection</w:t>
       </w:r>
     </w:p>
     <w:p>
@@ -39478,7 +39500,10 @@
         <w:ind w:firstLine="480"/>
       </w:pPr>
       <w:r>
-        <w:t>Unmanned aerial vehicles are increasingly used in inspection, emergency response, urban management, and low-altitude security. Their flexibility also creates a practical demand for reliable visual perception at the edge. When a detection system is deployed near the camera, video data no longer has to be continuously uploaded to a cloud server, and the delay between image acquisition and decision output can be reduced. For small aerial targets, this delay is important because the object may occupy only a few pixels and may move quickly across a complex background. A usable system must therefore balance three requirements: sufficient detection accuracy, stable real-time throughput, and predictable resource consumption on embedded hardware.</w:t>
+        <w:t>Object detection systems used in road surveillance, security monitoring, and remote sensing are increasingly expected to operate on edge devices rather than only on desktop computers or cloud servers. Infrared imaging is useful in such scenarios because it can support image acquisition under foggy, nighttime, or low-light conditions. However, infrared images often have low contrast, high noise, and blurred object boundaries. These characteristics make feature extraction more difficult than in ordinary visib</w:t>
+      </w:r>
+      <w:r>
+        <w:t>le-light images, especially when the detection target is small or appears in a narrow strip shape.</w:t>
       </w:r>
     </w:p>
     <w:p>
@@ -39487,7 +39512,10 @@
         <w:ind w:firstLine="480"/>
       </w:pPr>
       <w:r>
-        <w:t>A common solution is to adopt a lightweight object detection network and convert it into a format that can be executed by the neural processing unit of the target board. In this workflow, the model is first trained or fine-tuned in a general deep learning framework, exported to an intermediate representation, and then converted to the runtime format required by the embedded accelerator. The conversion stage is not a simple file transformation. The input layout, output tensor shape, supported operators, numerical precision, and post-processing logic must remain consistent with the original model. If any of these items is mismatched, the model may load successfully but produce incorrect boxes or fail during runtime inference.</w:t>
+        <w:t>Traditional infrared target detection methods are often based on handcrafted models, such as template matching, threshold segmentation, and shape measurement. With the development of deep learning, convolutional neural networks have become the mainstream approach for object detection. Two-stage detectors can provide strong accuracy, but their computational cost is usually high. Single-stage detectors, represented by the YOLO family, are attractive because they seek a balance between detection speed and accu</w:t>
+      </w:r>
+      <w:r>
+        <w:t>racy. This balance is important for embedded applications, where latency, power consumption, and storage space are limited.</w:t>
       </w:r>
     </w:p>
     <w:p>
@@ -39496,11 +39524,11 @@
         <w:ind w:firstLine="480"/>
       </w:pPr>
       <w:r>
-        <w:t xml:space="preserve">YOLO-style detectors are attractive for this type of task because they combine dense prediction with a single forward pass. Multi-scale prediction heads allow the network to respond to targets of different sizes, while a compact backbone keeps the computational cost manageable. However, small UAV detection is more difficult than ordinary object detection. The target often appears as a dark spot, a thin line, or a blurred shape against sky, trees, </w:t>
+        <w:t xml:space="preserve">Although YOLOv5 has achieved good performance in general object detection, directly </w:t>
       </w:r>
       <w:r>
         <w:lastRenderedPageBreak/>
-        <w:t>buildings, or sensor noise. For this reason, the practical performance of a system is determined not only by the model itself, but also by the image resolution, preprocessing method, confidence threshold, tracking strategy, and temporal stability of the displayed results.</w:t>
+        <w:t>deploying a larger YOLOv5 model on an edge device may be difficult. The model may contain many parameters and require a large amount of computation, while the embedded platform has limited CPU performance, memory bandwidth, and power budget. In distributed scenarios, sending raw images to a remote server may also cause network latency and communication congestion. Therefore, lightweight target detection on edge devices is necessary for practical deployment.</w:t>
       </w:r>
     </w:p>
     <w:p>
@@ -39509,7 +39537,10 @@
         <w:ind w:firstLine="480"/>
       </w:pPr>
       <w:r>
-        <w:t>On an RK3588 platform, the neural processing unit can accelerate the main convolutional computation, but the whole pipeline still includes many CPU-side operations. Video frames must be captured or decoded, resized, converted to the expected color format, copied or mapped into the inference input buffer, submitted to the runtime, decoded into bounding boxes, rendered on the output image, and optionally published as a real-time stream. If these stages are executed serially in a single thread, the NPU may wait for the CPU, or the display thread may wait for inference results. A multi-threaded pipeline is therefore necessary to separate frame acquisition, inference, post-processing, and streaming.</w:t>
+        <w:t>The Edge-YOLO method described in the source article attempts to reduce computational cost while maintaining detection accuracy. Its main idea is to redesign the YOLOv5m network for infrared road scenes and edge hardware. The authors replace the original backbone with an improved lightweight ShuffleBlock structure, introduce a strip depthwise convolutional attention module for infrared strip-shaped features, use a lightweight content-aware up-sampling operator, and modify the bounding box regression loss. T</w:t>
+      </w:r>
+      <w:r>
+        <w:t>hese changes are intended to reduce parameters and computation while preserving the ability to locate difficult targets.</w:t>
       </w:r>
     </w:p>
     <w:p>
@@ -39518,7 +39549,10 @@
         <w:ind w:firstLine="480"/>
       </w:pPr>
       <w:r>
-        <w:t>A bounded queue is useful in such a pipeline because it prevents unlimited frame accumulation when the input frame rate is higher than the inference rate. Instead of processing every delayed frame, the system can keep the most recent frame and drop stale data when necessary. This design improves the responsiveness of real-time viewing. For demonstration and monitoring scenarios, the user usually cares more about the current visual state than about an old frame that was captured several seconds earlier. The queue strategy must therefore be chosen according to the purpose of the experiment: fixed-video evaluation favors repeatability, while live RTSP viewing favors low end-to-end latency.</w:t>
+        <w:t>The article emphasizes that edge deployment should be evaluated on real hardware rather than only by theoretical model size or floating-point operations. For this purpose, the authors deploy the algorithm on a Rockchip RK3588 embedded development board. The RK3588 platform contains an octa-core CPU with four Cortex-A76 cores and four Cortex-A55 cores, and it integrates an NPU with 6 TOPS computing capability. The NPU supports mixed computing modes such as INT4, INT8, INT16, and FP16, which can accelerate ne</w:t>
+      </w:r>
+      <w:r>
+        <w:t>ural network inference after model conversion.</w:t>
       </w:r>
     </w:p>
     <w:p>
@@ -39527,7 +39561,10 @@
         <w:ind w:firstLine="480"/>
       </w:pPr>
       <w:r>
-        <w:t>Another important optimization is to reduce unnecessary inference calls. When the target does not change rapidly, the detector can run every N frames and reuse or track the most recent detection result in the intermediate frames. A lightweight motion model can estimate the next box position from the displacement between recent detections. Sparse optical flow can also be used to track feature points inside the detected region and estimate a median displacement. These methods cannot replace periodic full-frame detection, but they can reduce visual jitter and lower the computational pressure in live display scenarios.</w:t>
+        <w:t>In the deployment workflow, the algorithm model is first exported to ONNX format and then converted into an RKNN model supported by the RK3588 NPU. The authors use RKNN-Toolkit2 and rknpu2 tools to complete model conversion and inference acceleration. This workflow is meaningful for embedded artificial intelligence projects because it connects model design, model conversion, runtime execution, and hardware verification. A model that performs well on a GPU may not achieve the same result on an embedded NPU u</w:t>
+      </w:r>
+      <w:r>
+        <w:t>nless its operators, tensor shapes, quantization behavior, and post-processing logic are compatible with the runtime environment.</w:t>
       </w:r>
     </w:p>
     <w:p>
@@ -39536,11 +39573,11 @@
         <w:ind w:firstLine="480"/>
       </w:pPr>
       <w:r>
-        <w:t xml:space="preserve">For embedded deployment, profiling is as important as accuracy measurement. Average frames per second alone is not enough to identify the bottleneck. A useful profiling record </w:t>
-      </w:r>
-      <w:r>
         <w:lastRenderedPageBreak/>
-        <w:t>should separate preprocessing, input submission, runtime execution, output retrieval, decoding, rendering, and streaming. Such stage statistics help determine whether the next optimization should focus on model conversion, zero-copy input, RGA-assisted preprocessing, post-processing simplification, or thread scheduling. Without this information, performance tuning easily becomes trial and error.</w:t>
+        <w:t>Experimental results in the article show that NPU acceleration can greatly improve inference speed compared with CPU-only inference. When only an ARM CPU is used, the detection speed of several algorithms is too low for practical real-time applications. After NPU acceleration, the frame rate increases by tens of times, and the lightweight Edge-YOLO model reaches a frame rate suitable for real-time scenarios. The article also notes that quantization may slightly reduce detection accuracy, which means that sp</w:t>
+      </w:r>
+      <w:r>
+        <w:t>eed improvement and accuracy preservation must be considered together.</w:t>
       </w:r>
     </w:p>
     <w:p>
@@ -39549,7 +39586,10 @@
         <w:ind w:firstLine="480"/>
       </w:pPr>
       <w:r>
-        <w:t>Quantization is another common technique for edge acceleration. An INT8 model can reduce memory traffic and improve accelerator throughput when the calibration data and operator support are appropriate. Nevertheless, quantization must be validated carefully for small-target detection. A small change in confidence score or box regression may cause a far UAV to disappear from the final result. Therefore, a stable engineering approach is to keep a floating-point RKNN model as the baseline, convert an INT8 model as an experimental branch, and compare them on the same videos with the same thresholds before making the quantized version the main path.</w:t>
+        <w:t>The deployment experiment also reflects a common rule in edge AI projects: the bottleneck is not always the neural network itself. Even after the model is accelerated by the NPU, the total running speed may still be affected by image decoding, resizing, format conversion, memory copy, post-processing, and result visualization. Therefore, an embedded object detection system should record both model-level speed and system-level speed. Model-level speed shows how fast the neural network runs, while system-leve</w:t>
+      </w:r>
+      <w:r>
+        <w:t>l speed shows whether the whole application can satisfy real-time requirements.</w:t>
       </w:r>
     </w:p>
     <w:p>
@@ -39558,7 +39598,10 @@
         <w:ind w:firstLine="480"/>
       </w:pPr>
       <w:r>
-        <w:t>A complete edge detection system should also provide observable outputs. In addition to drawing the bounding box and confidence score, the system can display an alarm state on the video frame and record alarm events in a log file. This software alarm mechanism is useful when external devices such as relays or buzzers are not available. Although it does not form a physical control loop, it preserves the key logic of target detection followed by a response signal. The same interface can later be connected to GPIO or other external control modules if hardware expansion is required.</w:t>
+        <w:t>Another useful point in the article is the attention to application scenes. Infrared road detection is different from general object detection because object appearance, background texture, and illumination conditions are different. The same idea applies to UAV detection. A model that performs well on ordinary datasets may fail when the target occupies only a few pixels or appears near buildings, trees, clouds, or birds. For this reason, deployment should include scenario-oriented testing, and the test vide</w:t>
+      </w:r>
+      <w:r>
+        <w:t>os should cover the target scale, camera viewpoint, and background complexity expected in real use.</w:t>
       </w:r>
     </w:p>
     <w:p>
@@ -39567,7 +39610,10 @@
         <w:ind w:firstLine="480"/>
       </w:pPr>
       <w:r>
-        <w:t>The RK3588 case also shows why engineering validation should be organized in layers. A desktop or WSL environment is suitable for checking the model file, testing the post-processing program, and preparing fixed input videos. The embedded board is then used to verify runtime compatibility, NPU execution, camera input, and network streaming. Finally, live demonstrations are used to evaluate whether the system is understandable to observers. Separating these layers avoids mixing model errors, video input errors, and display errors into one ambiguous problem. It also makes the project easier to document, because each stage has its own input, output, and validation evidence.</w:t>
+        <w:t>The article's use of RK3588 is especially relevant for domestic embedded AI development. Compared with GPU-based desktop inference, an RK3588 board provides a lower-power and lower-cost platform for field deployment. However, this advantage is obtained only when the software stack can fully use the NPU and avoid unnecessary CPU workload. Model conversion, runtime API usage, data layout, and preprocessing strategy must therefore be considered together. In this sense, the hardware platform is not only a passi</w:t>
+      </w:r>
+      <w:r>
+        <w:t>ve carrier of the model, but also an important factor that shapes the final system design.</w:t>
       </w:r>
     </w:p>
     <w:p>
@@ -39576,11 +39622,11 @@
         <w:ind w:firstLine="480"/>
       </w:pPr>
       <w:r>
-        <w:t xml:space="preserve">For educational and thesis projects, this layered process is especially valuable. It allows </w:t>
+        <w:t xml:space="preserve">For thesis work, the article also suggests a practical evaluation method. The experiment </w:t>
       </w:r>
       <w:r>
         <w:lastRenderedPageBreak/>
-        <w:t>the student to present not only a final video with bounding boxes, but also the intermediate engineering decisions behind the result. For example, the reason for keeping a floating-point baseline, the reason for testing different detection intervals, and the reason for using software alarm overlays can all be explained from the viewpoint of risk control and repeatable validation. Such explanations are important because embedded artificial intelligence systems often fail not because the neural network is weak, but because the surrounding data path, synchronization strategy, or deployment assumption is not stable enough.</w:t>
+        <w:t>should not only report whether the target can be detected, but should also compare different deployment paths under the same input. For example, CPU inference, NPU inference, floating-point models, quantized models, and different preprocessing strategies can be compared with the same video or image set. This makes the conclusion more credible because every optimization is measured against a stable baseline.</w:t>
       </w:r>
     </w:p>
     <w:p>
@@ -39589,7 +39635,10 @@
         <w:ind w:firstLine="480"/>
       </w:pPr>
       <w:r>
-        <w:t>Repeatable records are also part of the engineering result. When a video, model, threshold, detection interval, and environment variable configuration are fixed, another person can reproduce the same experiment and compare the output with the original record. This is why saving annotated videos, CSV files, profiling logs, and configuration notes is useful. The records connect the visible result with the actual program settings, and they prevent later conclusions from relying only on memory or a single successful demonstration. They also help reviewers understand which evidence comes from software tests, which evidence comes from board experiments, and which items remain future work. This makes the whole development process more transparent and easier to review during later defense preparation.</w:t>
+        <w:t>The value of such research is not limited to one algorithm. Once the deployment process is clear, the same workflow can be reused for other lightweight detection models and other edge scenarios. The model may change from infrared road targets to UAVs, pedestrians, vehicles, or industrial objects, but the core questions remain similar: whether the model can be converted correctly, whether the runtime supports the operators, whether the frame pipeline is fast enough, and whether the final output is stable eno</w:t>
+      </w:r>
+      <w:r>
+        <w:t>ugh for real use.</w:t>
       </w:r>
     </w:p>
     <w:p>
@@ -39598,7 +39647,22 @@
         <w:ind w:firstLine="480"/>
       </w:pPr>
       <w:r>
-        <w:t>In summary, deploying UAV detection on an embedded platform is a system engineering task rather than a single model conversion task. The final performance depends on the coordination among model structure, runtime compatibility, preprocessing, buffer management, multi-threaded scheduling, tracking, profiling, and output feedback. A reliable implementation should first establish a stable baseline, then introduce optional optimizations one by one and compare them with repeatable experiments. This process makes the system easier to debug, easier to explain, and more suitable for real demonstration on limited hardware.</w:t>
+        <w:t>For an embedded detection system, these observations have direct engineering significance. First, model lightweighting should be combined with hardware-aware deployment, because a smaller model is not automatically faster if memory access and runtime support are not considered. Second, the conversion process from PyTorch or another training framework to ONNX and RKNN must be carefully verified. Third, the final system should be tested with actual video input, post-processing, visualization, and logging, rat</w:t>
+      </w:r>
+      <w:r>
+        <w:t>her than only with isolated image inference. These principles are also applicable to small UAV detection on RK3588, where real-time viewing and stable output are as important as single-frame accuracy.</w:t>
+      </w:r>
+    </w:p>
+    <w:p>
+      <w:pPr>
+        <w:spacing w:line="360" w:lineRule="auto"/>
+        <w:ind w:firstLine="480"/>
+      </w:pPr>
+      <w:r>
+        <w:t xml:space="preserve">Overall, the source article illustrates the importance of co-design between detection algorithms and edge hardware. Lightweight network structures, attention mechanisms, model conversion, quantization, and NPU acceleration all contribute to practical deployment. The main lesson is that embedded object detection is not merely a neural network problem. It is a system-level task involving model architecture, data preprocessing, hardware runtime, memory traffic, inference scheduling, and output presentation. A </w:t>
+      </w:r>
+      <w:r>
+        <w:t>stable edge detection system should therefore build a reliable baseline first, then introduce optimization strategies step by step and verify them under repeatable experimental conditions.</w:t>
       </w:r>
     </w:p>
     <w:p>
@@ -39624,7 +39688,15 @@
           <w:rFonts w:eastAsia="黑体"/>
           <w:b/>
         </w:rPr>
-        <w:t>嵌入式平台上的无人机目标检测边缘部署</w:t>
+        <w:lastRenderedPageBreak/>
+        <w:t>Edge-YOLO</w:t>
+      </w:r>
+      <w:r>
+        <w:rPr>
+          <w:rFonts w:eastAsia="黑体"/>
+          <w:b/>
+        </w:rPr>
+        <w:t>与轻量化目标检测的嵌入式部署</w:t>
       </w:r>
     </w:p>
     <w:p>
@@ -39633,11 +39705,7 @@
         <w:ind w:firstLine="480"/>
       </w:pPr>
       <w:r>
-        <w:t>无人机正在越来越多地应用于巡检、应急响应、城市管理和低空安全等场景。无</w:t>
-      </w:r>
-      <w:r>
-        <w:lastRenderedPageBreak/>
-        <w:t>人机本身具有部署灵活、到达速度快和使用成本相对较低等特点，但这些特点也对边缘端视觉感知提出了现实需求。当检测系统部署在靠近摄像头的位置时，视频数据不需要持续上传到云端服务器，图像采集到决策输出之间的延迟也可以明显降低。对于小型空中目标而言，这种延迟尤其重要，因为目标在画面中可能只占据很少像素，并且可能在复杂背景中快速移动。因此，一个可用的系统必须同时平衡三项要求：足够的检测精度、稳定的实时吞吐率以及在嵌入式硬件上可预测的资源消耗。</w:t>
+        <w:t>道路监控、安全监测和遥感等场景中的目标检测系统，越来越需要在边缘设备上运行，而不是只依赖桌面计算机或云端服务器。红外成像在这类场景中具有实际价值，因为它能够在雾天、夜间或弱光条件下支持图像采集。然而，红外图像通常存在对比度较低、噪声较强和目标边界模糊等问题。这些特点使得特征提取比普通可见光图像更加困难，尤其是在检测目标较小或呈现细长条状形态时，网络更容易丢失关键特征。</w:t>
       </w:r>
     </w:p>
     <w:p>
@@ -39646,7 +39714,13 @@
         <w:ind w:firstLine="480"/>
       </w:pPr>
       <w:r>
-        <w:t>一种常见方案是采用轻量级目标检测网络，并将其转换为目标开发板神经网络处理单元能够执行的格式。在这一流程中，模型首先在通用深度学习框架中训练或微调，然后导出为中间表示格式，最后再转换为嵌入式加速器运行时所需的模型格式。模型转换并不是简单的文件格式变换。输入张量布局、输出张量形状、算子支持情况、数值精度以及后处理逻辑都必须与原始模型保持一致。如果其中任一环节不匹配，模型可能能够成功加载，但会输出错误的检测框，甚至在运行时推理阶段直接失败。</w:t>
+        <w:t>传统红外目标检测方法往往依赖人工设计的模型，例如模板匹配、阈值分割和形状度量等。随着深度学习的发展，卷积神经网络已经成为目标检测的主流方法。两阶段检测器通常能够提供较强的检测精度，但计算成本较高；以</w:t>
+      </w:r>
+      <w:r>
+        <w:t>YOLO</w:t>
+      </w:r>
+      <w:r>
+        <w:t>系列为代表的单阶段检测器则更强调检测速度和精度之间的平衡。这种平衡对于嵌入式应用尤其重要，因为嵌入式平台在延迟、功耗、存储空间和持续运行稳定性方面都存在限制。</w:t>
       </w:r>
     </w:p>
     <w:p>
@@ -39655,10 +39729,25 @@
         <w:ind w:firstLine="480"/>
       </w:pPr>
       <w:r>
-        <w:t>YOLO</w:t>
-      </w:r>
-      <w:r>
-        <w:t>系列检测器适合此类任务，是因为它们能够在一次前向传播中完成密集预测。多尺度检测头使网络能够响应不同尺寸的目标，紧凑的骨干网络则有助于控制计算开销。然而，小型无人机检测比普通目标检测更困难。无人机在图像中经常表现为一个暗点、一条细线或一个模糊轮廓，并且背景可能包含天空、树木、建筑物边缘或传感器噪声。因此，系统的实际表现不仅取决于模型本身，还取决于输入分辨率、预处理方式、置信度阈值、跟踪策略以及显示结果的时间稳定性。</w:t>
+        <w:t>尽管</w:t>
+      </w:r>
+      <w:r>
+        <w:t>YOLOv5</w:t>
+      </w:r>
+      <w:r>
+        <w:t>在通用目标检测任务中取得了较好效果，但直接将较大的</w:t>
+      </w:r>
+      <w:r>
+        <w:t>YOLOv5</w:t>
+      </w:r>
+      <w:r>
+        <w:t>模型部署到边缘设备上并不容易。模型可能包含较多参数，并需要较大的计算量，而嵌入式平台的</w:t>
+      </w:r>
+      <w:r>
+        <w:t>CPU</w:t>
+      </w:r>
+      <w:r>
+        <w:t>性能、内存带宽和功耗预算都有限。在分布式应用场景中，如果将原始图像持续发送到远程服务器进行检测，还可能造成网络延迟和通信拥塞。因此，面向边缘设备的轻量化目标检测对于实际部署是必要的。</w:t>
       </w:r>
     </w:p>
     <w:p>
@@ -39667,31 +39756,25 @@
         <w:ind w:firstLine="480"/>
       </w:pPr>
       <w:r>
-        <w:t>在</w:t>
-      </w:r>
-      <w:r>
-        <w:t>RK3588</w:t>
-      </w:r>
-      <w:r>
-        <w:t>平台上，神经网络处理单元可以加速主要的卷积计算，但完整流水线中仍然包含许多</w:t>
-      </w:r>
-      <w:r>
-        <w:t>CPU</w:t>
-      </w:r>
-      <w:r>
-        <w:t>侧操作。视频帧需要被采集或解码，需要被缩放、转换为模型期望的颜色格式，需要复制或映射到推理输入缓冲区，需要提交给运行时执行，还需要将输出结果解析为边界框、绘制到画面上，并可选择发布为实时视频流。如果这些阶段全部在单线程中串行执行，</w:t>
-      </w:r>
-      <w:r>
-        <w:t>NPU</w:t>
-      </w:r>
-      <w:r>
-        <w:t>可能等待</w:t>
-      </w:r>
-      <w:r>
-        <w:t>CPU</w:t>
-      </w:r>
-      <w:r>
-        <w:t>完成预处理，显示线程也可能等待推理结果返回。因此，多线程流水线对于分离帧采集、模型推理、后处理和推流显示是必要的。</w:t>
+        <w:t>文献中提出的</w:t>
+      </w:r>
+      <w:r>
+        <w:t>Edge-YOLO</w:t>
+      </w:r>
+      <w:r>
+        <w:t>方法试图在保持检测精度的同时降低计算开销。其核心思想是针对红外道路场景和边缘硬件重新设计</w:t>
+      </w:r>
+      <w:r>
+        <w:t>YOLOv5m</w:t>
+      </w:r>
+      <w:r>
+        <w:t>网络。作者使用改进的轻量化</w:t>
+      </w:r>
+      <w:r>
+        <w:t>ShuffleBlock</w:t>
+      </w:r>
+      <w:r>
+        <w:t>结构替换原有骨干网络，引入条形深度可分离卷积注意力模块以增强对红外细长目标特征的表达，采用轻量化内容感知上采样算子，并修改边界框回归损失函数。这些改进的共同目标是在降低参数量和计算量的同时，尽可能保留模型定位困难目标的能力。</w:t>
       </w:r>
     </w:p>
     <w:p>
@@ -39700,17 +39783,79 @@
         <w:ind w:firstLine="480"/>
       </w:pPr>
       <w:r>
-        <w:t>在这样的流水线中，有界队列具有重要作用，因为当输入帧率高于推理帧率时，它可以避免视频帧无限堆积。系统不必处理所有已经延迟的旧帧，而可以在必要时保留最新帧并丢弃过期数据。这种设计能够提高实时观看时的响应性。对于演示和监控场景，用户通常更关心当前画面状态，而不是几秒前采集到的旧画面。因此，队列策</w:t>
-      </w:r>
-      <w:r>
-        <w:lastRenderedPageBreak/>
-        <w:t>略必须根据实验目标选择：固定视频评测更强调可重复性，而实时</w:t>
-      </w:r>
-      <w:r>
-        <w:t>RTSP</w:t>
-      </w:r>
-      <w:r>
-        <w:t>观看更强调较低的端到端延迟。</w:t>
+        <w:t>该文献强调，边缘部署不能只依靠理论模型大小或浮点计算量进行评价，而应当在真实硬件上验证。为此，作者将算法部署到瑞芯微</w:t>
+      </w:r>
+      <w:r>
+        <w:t>RK3588</w:t>
+      </w:r>
+      <w:r>
+        <w:t>嵌入式开发板上。</w:t>
+      </w:r>
+      <w:r>
+        <w:t>RK3588</w:t>
+      </w:r>
+      <w:r>
+        <w:t>平台包含由四个</w:t>
+      </w:r>
+      <w:r>
+        <w:t>Cortex-A76</w:t>
+      </w:r>
+      <w:r>
+        <w:t>核心和四个</w:t>
+      </w:r>
+      <w:r>
+        <w:t>Cortex-A55</w:t>
+      </w:r>
+      <w:r>
+        <w:t>核心组成的八核</w:t>
+      </w:r>
+      <w:r>
+        <w:t>CPU</w:t>
+      </w:r>
+      <w:r>
+        <w:t>，并集成了具有</w:t>
+      </w:r>
+      <w:r>
+        <w:t>6 TOPS</w:t>
+      </w:r>
+      <w:r>
+        <w:t>算力的</w:t>
+      </w:r>
+      <w:r>
+        <w:t>NPU</w:t>
+      </w:r>
+      <w:r>
+        <w:t>。该</w:t>
+      </w:r>
+      <w:r>
+        <w:t>NPU</w:t>
+      </w:r>
+      <w:r>
+        <w:t>支持</w:t>
+      </w:r>
+      <w:r>
+        <w:t>INT4</w:t>
+      </w:r>
+      <w:r>
+        <w:t>、</w:t>
+      </w:r>
+      <w:r>
+        <w:t>INT8</w:t>
+      </w:r>
+      <w:r>
+        <w:t>、</w:t>
+      </w:r>
+      <w:r>
+        <w:t>INT16</w:t>
+      </w:r>
+      <w:r>
+        <w:t>和</w:t>
+      </w:r>
+      <w:r>
+        <w:t>FP16</w:t>
+      </w:r>
+      <w:r>
+        <w:t>等混合计算模式，在模型完成转换后能够加速神经网络推理。</w:t>
       </w:r>
     </w:p>
     <w:p>
@@ -39719,13 +39864,53 @@
         <w:ind w:firstLine="480"/>
       </w:pPr>
       <w:r>
-        <w:t>另一项重要优化是减少不必要的推理调用。当目标变化不快时，检测器可以每隔</w:t>
-      </w:r>
-      <w:r>
-        <w:t>N</w:t>
-      </w:r>
-      <w:r>
-        <w:t>帧运行一次，并在中间帧复用或跟踪最近一次检测结果。轻量运动模型可以根据相邻检测结果之间的位移估计下一帧检测框位置。稀疏光流也可以用于跟踪检测区域内部的特征点，并根据特征点的中值位移估计目标运动。这些方法不能完全替代周期性的全画面检测，但它们可以在实时显示场景中减少检测框抖动，同时降低计算压力。</w:t>
+        <w:t>在部署流程中，算法模型首先被导出为</w:t>
+      </w:r>
+      <w:r>
+        <w:t>ONNX</w:t>
+      </w:r>
+      <w:r>
+        <w:t>格式，然后再转换为</w:t>
+      </w:r>
+      <w:r>
+        <w:t>RK3588 NPU</w:t>
+      </w:r>
+      <w:r>
+        <w:t>支持的</w:t>
+      </w:r>
+      <w:r>
+        <w:t>RKNN</w:t>
+      </w:r>
+      <w:r>
+        <w:t>模型。作者使用</w:t>
+      </w:r>
+      <w:r>
+        <w:t>RKNN-Toolkit2</w:t>
+      </w:r>
+      <w:r>
+        <w:t>和</w:t>
+      </w:r>
+      <w:r>
+        <w:t>rknpu2</w:t>
+      </w:r>
+      <w:r>
+        <w:t>工具完成模型转换和推理加</w:t>
+      </w:r>
+      <w:r>
+        <w:lastRenderedPageBreak/>
+        <w:t>速。这一流程对于嵌入式人工智能项目具有重要意义，因为它连接了模型设计、模型转换、运行时执行和硬件验证等环节。一个在</w:t>
+      </w:r>
+      <w:r>
+        <w:t>GPU</w:t>
+      </w:r>
+      <w:r>
+        <w:t>上表现良好的模型，如果其算子、张量形状、量化行为或后处理逻辑与嵌入式运行时环境不兼容，就未必能够在</w:t>
+      </w:r>
+      <w:r>
+        <w:t>NPU</w:t>
+      </w:r>
+      <w:r>
+        <w:t>上得到同样的结果。</w:t>
       </w:r>
     </w:p>
     <w:p>
@@ -39734,13 +39919,37 @@
         <w:ind w:firstLine="480"/>
       </w:pPr>
       <w:r>
-        <w:t>对于嵌入式部署而言，性能分段统计与检测精度评估同样重要。仅记录平均帧率不足以定位系统瓶颈。有效的性能记录应当将预处理、输入提交、运行时推理、输出获取、结果解码、画面绘制和视频推流等阶段分别统计。这样的阶段耗时数据能够帮助判断下一步优化应集中在模型转换、零拷贝输入、</w:t>
-      </w:r>
-      <w:r>
-        <w:t>RGA</w:t>
-      </w:r>
-      <w:r>
-        <w:t>硬件辅助预处理、后处理简化还是线程调度上。如果缺少这些信息，性能调优很容易变成盲目的反复试错。</w:t>
+        <w:t>文献中的实验结果表明，与仅使用</w:t>
+      </w:r>
+      <w:r>
+        <w:t>CPU</w:t>
+      </w:r>
+      <w:r>
+        <w:t>推理相比，</w:t>
+      </w:r>
+      <w:r>
+        <w:t>NPU</w:t>
+      </w:r>
+      <w:r>
+        <w:t>加速能够显著提高推理速度。当只使用</w:t>
+      </w:r>
+      <w:r>
+        <w:t>ARM CPU</w:t>
+      </w:r>
+      <w:r>
+        <w:t>时，若干算法的检测速度过低，难以满足实际实时应用需求；经过</w:t>
+      </w:r>
+      <w:r>
+        <w:t>NPU</w:t>
+      </w:r>
+      <w:r>
+        <w:t>加速后，帧率提升了数十倍，轻量化的</w:t>
+      </w:r>
+      <w:r>
+        <w:t>Edge-YOLO</w:t>
+      </w:r>
+      <w:r>
+        <w:t>模型能够达到适合实时场景的检测速度。文献同时指出，量化可能导致检测精度略有下降，这说明在实际部署中不能只追求速度提升，还必须同时考虑精度保持和稳定性。</w:t>
       </w:r>
     </w:p>
     <w:p>
@@ -39749,25 +39958,13 @@
         <w:ind w:firstLine="480"/>
       </w:pPr>
       <w:r>
-        <w:t>量化是边缘加速中常用的另一类技术。当校准数据和算子支持合适时，</w:t>
-      </w:r>
-      <w:r>
-        <w:t>INT8</w:t>
-      </w:r>
-      <w:r>
-        <w:t>模型能够降低内存访问开销，并提高加速器吞吐能力。但是，针对小目标检测的量化必须谨慎验证。置信度分数或边界框回归结果的轻微变化，都可能导致远距离无人机从最终结果中消失。因此，更稳妥的工程方法是保留浮点</w:t>
-      </w:r>
-      <w:r>
-        <w:t>RKNN</w:t>
-      </w:r>
-      <w:r>
-        <w:t>模型作为基线，将</w:t>
-      </w:r>
-      <w:r>
-        <w:t>INT8</w:t>
-      </w:r>
-      <w:r>
-        <w:t>模型作为实验分支进行转换，并在相同视频、相同阈值条件下进行对比后，再决定是否将量化模型作为主路径。</w:t>
+        <w:t>该部署实验还反映了边缘人工智能项目中的一个普遍规律：系统瓶颈并不总是神经网络模型本身。即使模型已经通过</w:t>
+      </w:r>
+      <w:r>
+        <w:t>NPU</w:t>
+      </w:r>
+      <w:r>
+        <w:t>加速，整体运行速度仍可能受到图像解码、尺寸缩放、格式转换、内存拷贝、后处理和结果可视化等环节影响。因此，嵌入式目标检测系统应当同时记录模型层速度和系统层速度。模型层速度说明神经网络本身运行得有多快，系统层速度则说明完整应用能否满足实时运行要求。对于工程部署而言，后者往往更接近用户实际感受到的性能。</w:t>
       </w:r>
     </w:p>
     <w:p>
@@ -39776,25 +39973,7 @@
         <w:ind w:firstLine="480"/>
       </w:pPr>
       <w:r>
-        <w:t>完整的边缘检测系统还应当提供可观察的输出。除了绘制检测框和置信度分数外，系统可以在视频画面中显示报警状态，并将报警事件写入日志文件。当继电器、蜂鸣器等外部设备暂不可用时，软件报警机制具有实际价值。虽然它没有形成物理闭环控制，但保留了</w:t>
-      </w:r>
-      <w:r>
-        <w:t>“</w:t>
-      </w:r>
-      <w:r>
-        <w:t>检测到目标后产生响应信号</w:t>
-      </w:r>
-      <w:r>
-        <w:t>”</w:t>
-      </w:r>
-      <w:r>
-        <w:t>的关键逻辑。后续如果需要扩展硬件，仍然可以将同一接口连接到</w:t>
-      </w:r>
-      <w:r>
-        <w:t>GPIO</w:t>
-      </w:r>
-      <w:r>
-        <w:t>或其他外设控制模块。</w:t>
+        <w:t>文献中另一个有价值的观点是对应用场景的重视。红外道路目标检测不同于通用目标检测，因为目标外观、背景纹理和光照条件都具有特殊性。同样的思想也适用于无人机检测。一个在普通数据集上表现良好的模型，当目标只占据几个像素，或者目标出现在建筑物、树木、云层、鸟类等复杂背景附近时，仍然可能出现漏检或误检。因此，部署阶段应当包含面向场景的测试，测试视频应覆盖真实使用中可能出现的目标尺度、摄像机视角和背景复杂度。</w:t>
       </w:r>
     </w:p>
     <w:p>
@@ -39803,22 +39982,43 @@
         <w:ind w:firstLine="480"/>
       </w:pPr>
       <w:r>
+        <w:t>该文献使用</w:t>
+      </w:r>
+      <w:r>
         <w:t>RK3588</w:t>
       </w:r>
       <w:r>
-        <w:t>平台上的实现过程也说明，工程验证应当分层组织。桌面或</w:t>
-      </w:r>
-      <w:r>
-        <w:t>WSL</w:t>
-      </w:r>
-      <w:r>
-        <w:t>环境适合检查模型文件、测试后处理程序并准备固定输入视频；嵌入式开发板适合验证运行时兼容性、</w:t>
+        <w:t>平台进行实验，这一点与国产嵌入式人工智能开发具有较强关联。与基于</w:t>
+      </w:r>
+      <w:r>
+        <w:t>GPU</w:t>
+      </w:r>
+      <w:r>
+        <w:t>的桌面推理相比，</w:t>
+      </w:r>
+      <w:r>
+        <w:t>RK3588</w:t>
+      </w:r>
+      <w:r>
+        <w:t>开发板能够提供功耗更低、成本更低、体积更小的现场部署平台。但是，只有当软件栈能够充分利用</w:t>
       </w:r>
       <w:r>
         <w:t>NPU</w:t>
       </w:r>
       <w:r>
-        <w:t>执行、摄像头输入和网络推流；最终实时演示则用于观察系统输出是否直观、是否便于非开发人员理解。将这些层次分开，可以避免把模型错误、视频输入错误和显示输出错误混在一起，形成难以定位的综合问题。同时，分层验证也更有利于论文记录，因为每个阶段都有明确的输入、输出和验证证据。</w:t>
+        <w:t>并尽量减少不必要的</w:t>
+      </w:r>
+      <w:r>
+        <w:t>CPU</w:t>
+      </w:r>
+      <w:r>
+        <w:t>负担时，这种硬件优势才能真正体现出来。因此，模型转换、运行时</w:t>
+      </w:r>
+      <w:r>
+        <w:t>API</w:t>
+      </w:r>
+      <w:r>
+        <w:t>使用、数据布局和预处理策略必须被放在一起考虑。从这个意义上说，硬件平台并不是模型的被动承载者，而是影响最终系统设计的重要因素。</w:t>
       </w:r>
     </w:p>
     <w:p>
@@ -39827,8 +40027,23 @@
         <w:ind w:firstLine="480"/>
       </w:pPr>
       <w:r>
+        <w:t>对于毕业设计而言，该文献还提供了一种实用的评价方法。实验不应只报告目标是否能够被检测到，还应当在相同输入条件下比较不同部署路径。例如，可以使用同</w:t>
+      </w:r>
+      <w:r>
         <w:lastRenderedPageBreak/>
-        <w:t>对于本科毕业设计和教学型工程项目而言，这种分层流程尤其有价值。它不仅能够展示最终带检测框的视频结果，还能够说明结果背后的工程决策。例如，为什么要保留浮点模型作为稳定基线，为什么要测试不同检测间隔，为什么在没有继电器或蜂鸣器的条件下采用软件报警提示，这些都可以从风险控制和可复现实验的角度进行解释。嵌入式人工智能系统出现问题时，原因往往不只是神经网络模型本身不够好，也可能是数据通路、线程同步策略或部署假设不够稳定。因此，系统化验证本身就是课题的重要成果。</w:t>
+        <w:t>一组视频或图像，对</w:t>
+      </w:r>
+      <w:r>
+        <w:t>CPU</w:t>
+      </w:r>
+      <w:r>
+        <w:t>推理、</w:t>
+      </w:r>
+      <w:r>
+        <w:t>NPU</w:t>
+      </w:r>
+      <w:r>
+        <w:t>推理、浮点模型、量化模型以及不同预处理策略进行对比。这样得到的结论更可信，因为每一种优化都不是孤立展示，而是与稳定基线进行比较。对于嵌入式系统研究来说，基线、变量和指标的清晰性非常重要。</w:t>
       </w:r>
     </w:p>
     <w:p>
@@ -39837,13 +40052,7 @@
         <w:ind w:firstLine="480"/>
       </w:pPr>
       <w:r>
-        <w:t>可重复的实验记录同样是工程成果的一部分。当视频输入、模型文件、置信度阈值、检测间隔和环境变量配置都被固定下来时，其他人就可以复现实验，并将输出结果与原始记录进行比较。因此，保存带框视频、检测</w:t>
-      </w:r>
-      <w:r>
-        <w:t>CSV</w:t>
-      </w:r>
-      <w:r>
-        <w:t>、阶段耗时日志和配置说明是有意义的。这些记录把可见的演示效果与实际程序设置连接起来，避免后续结论只依赖记忆或某一次偶然成功的演示。对于毕业论文而言，可复现记录还能支撑实验章节中的数据来源，使读者能够理解每一组结果是在什么条件下得到的，也有助于评阅者区分哪些证据来自软件测试、哪些证据来自板端实验、哪些内容仍属于后续工作，从而使整个开发过程更加透明，也便于后续复查和答辩说明。</w:t>
+        <w:t>这类研究的价值也不限于某一个具体算法。一旦部署流程被梳理清楚，同样的工作流就可以复用于其他轻量化检测模型和其他边缘应用场景。检测对象可以从红外道路目标变为无人机、行人、车辆或工业零件，但核心问题是相似的：模型能否正确转换，运行时是否支持相关算子，视频帧流水线是否足够快，最终输出是否足够稳定并能够服务实际使用。</w:t>
       </w:r>
     </w:p>
     <w:p>
@@ -39852,15 +40061,85 @@
         <w:ind w:firstLine="480"/>
       </w:pPr>
       <w:r>
-        <w:t>综上所述，在嵌入式平台上部署无人机检测并不是单一的模型转换任务，而是一项系统工程。最终性能取决于模型结构、运行时兼容性、图像预处理、缓冲管理、多线程调度、目标跟踪、性能分析和输出反馈之间的协同。可靠的实现应当先建立稳定基线，再逐步引入可选优化，并通过可重复实验进行对比。这样的流程能够使系统更容易调试、更容易解释，也更适合在资源受限硬件上进行真实演示。</w:t>
+        <w:t>对于嵌入式检测系统而言，这些结论具有直接的工程意义。首先，模型轻量化应当与面向硬件的部署策略结合起来，因为较小的模型并不一定自动意味着更快的端到端速度，内存访问和运行时支持同样会影响实际性能。其次，从</w:t>
+      </w:r>
+      <w:r>
+        <w:t>PyTorch</w:t>
+      </w:r>
+      <w:r>
+        <w:t>或其他训练框架到</w:t>
+      </w:r>
+      <w:r>
+        <w:t>ONNX</w:t>
+      </w:r>
+      <w:r>
+        <w:t>再到</w:t>
+      </w:r>
+      <w:r>
+        <w:t>RKNN</w:t>
+      </w:r>
+      <w:r>
+        <w:t>的转换过程必须被认真验证。再次，最终系统应当结合实际视频输入、后处理、结果可视化和日志记录进行测试，而不是只进行孤立的图像推理。这些原则同样适用于</w:t>
+      </w:r>
+      <w:r>
+        <w:t>RK3588</w:t>
+      </w:r>
+      <w:r>
+        <w:t>平台上的小型无人机检测任务，因为实时观看和稳定输出与单帧检测精度同样重要。</w:t>
       </w:r>
     </w:p>
     <w:p>
       <w:pPr>
         <w:spacing w:line="360" w:lineRule="auto"/>
-      </w:pPr>
-      <w:r>
-        <w:br w:type="page"/>
+        <w:ind w:firstLine="480"/>
+      </w:pPr>
+      <w:r>
+        <w:t>总体来看，该文献说明了检测算法与边缘硬件协同设计的重要性。轻量化网络结构、注意力机制、模型转换、量化和</w:t>
+      </w:r>
+      <w:r>
+        <w:t>NPU</w:t>
+      </w:r>
+      <w:r>
+        <w:t>加速都对实际部署有贡献。它带来的主要启示是，嵌入式目标检测并不只是一个神经网络问题，而是一项系统级任务，涉及模型结构、数据预处理、硬件运行时、内存访问、推理调度和结果显示等多个环节。因此，稳定的边缘检测系统应当先建立可靠基线，再逐步引入优化策略，并在可重复的实验条件下进行验证。</w:t>
+      </w:r>
+    </w:p>
+    <w:p>
+      <w:pPr>
+        <w:spacing w:line="360" w:lineRule="auto"/>
+        <w:ind w:firstLine="480"/>
+      </w:pPr>
+      <w:r>
+        <w:t>将这篇文献与本文课题相联系可以发现，两者都关注如何把目标检测模型从训练环境迁移到边缘硬件上，并通过</w:t>
+      </w:r>
+      <w:r>
+        <w:t>NPU</w:t>
+      </w:r>
+      <w:r>
+        <w:t>加速提升实时性。本文虽然研究对象是无人机目标检测，使用的是</w:t>
+      </w:r>
+      <w:r>
+        <w:t>YOLOv10</w:t>
+      </w:r>
+      <w:r>
+        <w:t>单类模型和</w:t>
+      </w:r>
+      <w:r>
+        <w:t>RK3588</w:t>
+      </w:r>
+      <w:r>
+        <w:t>平台，但所面临的问题与文献中描述的边缘部署问题具有共通性：模型转换需要保证张量和算子兼容，量化需要在速度和精度之间取得平衡，板端实验需要关注真实帧率而不是只关注理论算力。因而，该文献可以为本文的模型移植、</w:t>
+      </w:r>
+      <w:r>
+        <w:t>RKNN</w:t>
+      </w:r>
+      <w:r>
+        <w:t>转换、</w:t>
+      </w:r>
+      <w:r>
+        <w:t>INT8</w:t>
+      </w:r>
+      <w:r>
+        <w:t>量化验证和系统性能分析提供有益参考。</w:t>
       </w:r>
     </w:p>
     <w:p>
@@ -39869,14 +40148,13 @@
         <w:jc w:val="center"/>
         <w:outlineLvl w:val="1"/>
       </w:pPr>
-      <w:bookmarkStart w:id="60" w:name="_Toc228360885"/>
+      <w:bookmarkStart w:id="60" w:name="_Toc228365609"/>
       <w:r>
         <w:rPr>
           <w:rFonts w:eastAsia="黑体"/>
           <w:b/>
           <w:sz w:val="36"/>
         </w:rPr>
-        <w:lastRenderedPageBreak/>
         <w:t>附录</w:t>
       </w:r>
       <w:r>
@@ -39907,6 +40185,7 @@
           <w:rFonts w:eastAsia="黑体"/>
           <w:b/>
         </w:rPr>
+        <w:lastRenderedPageBreak/>
         <w:t>一、课题目的和意义</w:t>
       </w:r>
     </w:p>
@@ -39996,20 +40275,23 @@
         <w:ind w:firstLine="480"/>
       </w:pPr>
       <w:r>
+        <w:t>为了兼顾技术效果、社会环境和可持续发展，后续工作可以从三个方向继续完善。首先，在模型层面，应在现有</w:t>
+      </w:r>
+      <w:r>
+        <w:t>FP RKNN</w:t>
+      </w:r>
+      <w:r>
+        <w:t>稳定部署基础上继续完成</w:t>
+      </w:r>
+      <w:r>
+        <w:t>INT8</w:t>
+      </w:r>
+      <w:r>
+        <w:t>量化模型的</w:t>
+      </w:r>
+      <w:r>
         <w:lastRenderedPageBreak/>
-        <w:t>为了兼顾技术效果、社会环境和可持续发展，后续工作可以从三个方向继续完善。首先，在模型层面，应在现有</w:t>
-      </w:r>
-      <w:r>
-        <w:t>FP RKNN</w:t>
-      </w:r>
-      <w:r>
-        <w:t>稳定部署基础上继续完成</w:t>
-      </w:r>
-      <w:r>
-        <w:t>INT8</w:t>
-      </w:r>
-      <w:r>
-        <w:t>量化模型的板端精度和速度对比，明确量化是否真正带来端到端收益，而不是只关注理论算力提升。其次，在系统层面，可进一步完善</w:t>
+        <w:t>板端精度和速度对比，明确量化是否真正带来端到端收益，而不是只关注理论算力提升。其次，在系统层面，可进一步完善</w:t>
       </w:r>
       <w:r>
         <w:t>RGA</w:t>
@@ -40050,7 +40332,7 @@
         <w:jc w:val="center"/>
         <w:outlineLvl w:val="0"/>
       </w:pPr>
-      <w:bookmarkStart w:id="61" w:name="_Toc228360886"/>
+      <w:bookmarkStart w:id="61" w:name="_Toc228365610"/>
       <w:r>
         <w:rPr>
           <w:rFonts w:eastAsia="黑体"/>

</xml_diff>

<commit_message>
Document strict RGA audit follow-up
</commit_message>
<xml_diff>
--- a/Thesis Project/paper/full_thesis_latest_merged.docx
+++ b/Thesis Project/paper/full_thesis_latest_merged.docx
@@ -1529,7 +1529,7 @@
         </w:rPr>
         <w:fldChar w:fldCharType="separate"/>
       </w:r>
-      <w:hyperlink w:anchor="_Toc228365549" w:history="1">
+      <w:hyperlink w:anchor="_Toc228393626" w:history="1">
         <w:r>
           <w:rPr>
             <w:rStyle w:val="af3"/>
@@ -1570,7 +1570,7 @@
             <w:noProof/>
             <w:webHidden/>
           </w:rPr>
-          <w:instrText xml:space="preserve"> PAGEREF _Toc228365549 \h </w:instrText>
+          <w:instrText xml:space="preserve"> PAGEREF _Toc228393626 \h </w:instrText>
         </w:r>
         <w:r>
           <w:rPr>
@@ -1613,7 +1613,7 @@
           <w14:ligatures w14:val="standardContextual"/>
         </w:rPr>
       </w:pPr>
-      <w:hyperlink w:anchor="_Toc228365550" w:history="1">
+      <w:hyperlink w:anchor="_Toc228393627" w:history="1">
         <w:r>
           <w:rPr>
             <w:rStyle w:val="af3"/>
@@ -1651,7 +1651,7 @@
             <w:noProof/>
             <w:webHidden/>
           </w:rPr>
-          <w:instrText xml:space="preserve"> PAGEREF _Toc228365550 \h </w:instrText>
+          <w:instrText xml:space="preserve"> PAGEREF _Toc228393627 \h </w:instrText>
         </w:r>
         <w:r>
           <w:rPr>
@@ -1694,7 +1694,7 @@
           <w14:ligatures w14:val="standardContextual"/>
         </w:rPr>
       </w:pPr>
-      <w:hyperlink w:anchor="_Toc228365551" w:history="1">
+      <w:hyperlink w:anchor="_Toc228393628" w:history="1">
         <w:r>
           <w:rPr>
             <w:rStyle w:val="af3"/>
@@ -1732,7 +1732,7 @@
             <w:noProof/>
             <w:webHidden/>
           </w:rPr>
-          <w:instrText xml:space="preserve"> PAGEREF _Toc228365551 \h </w:instrText>
+          <w:instrText xml:space="preserve"> PAGEREF _Toc228393628 \h </w:instrText>
         </w:r>
         <w:r>
           <w:rPr>
@@ -1775,7 +1775,7 @@
           <w14:ligatures w14:val="standardContextual"/>
         </w:rPr>
       </w:pPr>
-      <w:hyperlink w:anchor="_Toc228365552" w:history="1">
+      <w:hyperlink w:anchor="_Toc228393629" w:history="1">
         <w:r>
           <w:rPr>
             <w:rStyle w:val="af3"/>
@@ -1813,7 +1813,7 @@
             <w:noProof/>
             <w:webHidden/>
           </w:rPr>
-          <w:instrText xml:space="preserve"> PAGEREF _Toc228365552 \h </w:instrText>
+          <w:instrText xml:space="preserve"> PAGEREF _Toc228393629 \h </w:instrText>
         </w:r>
         <w:r>
           <w:rPr>
@@ -1856,7 +1856,7 @@
           <w14:ligatures w14:val="standardContextual"/>
         </w:rPr>
       </w:pPr>
-      <w:hyperlink w:anchor="_Toc228365553" w:history="1">
+      <w:hyperlink w:anchor="_Toc228393630" w:history="1">
         <w:r>
           <w:rPr>
             <w:rStyle w:val="af3"/>
@@ -1894,7 +1894,7 @@
             <w:noProof/>
             <w:webHidden/>
           </w:rPr>
-          <w:instrText xml:space="preserve"> PAGEREF _Toc228365553 \h </w:instrText>
+          <w:instrText xml:space="preserve"> PAGEREF _Toc228393630 \h </w:instrText>
         </w:r>
         <w:r>
           <w:rPr>
@@ -1937,7 +1937,7 @@
           <w14:ligatures w14:val="standardContextual"/>
         </w:rPr>
       </w:pPr>
-      <w:hyperlink w:anchor="_Toc228365554" w:history="1">
+      <w:hyperlink w:anchor="_Toc228393631" w:history="1">
         <w:r>
           <w:rPr>
             <w:rStyle w:val="af3"/>
@@ -1981,7 +1981,7 @@
             <w:noProof/>
             <w:webHidden/>
           </w:rPr>
-          <w:instrText xml:space="preserve"> PAGEREF _Toc228365554 \h </w:instrText>
+          <w:instrText xml:space="preserve"> PAGEREF _Toc228393631 \h </w:instrText>
         </w:r>
         <w:r>
           <w:rPr>
@@ -2024,7 +2024,7 @@
           <w14:ligatures w14:val="standardContextual"/>
         </w:rPr>
       </w:pPr>
-      <w:hyperlink w:anchor="_Toc228365555" w:history="1">
+      <w:hyperlink w:anchor="_Toc228393632" w:history="1">
         <w:r>
           <w:rPr>
             <w:rStyle w:val="af3"/>
@@ -2062,7 +2062,7 @@
             <w:noProof/>
             <w:webHidden/>
           </w:rPr>
-          <w:instrText xml:space="preserve"> PAGEREF _Toc228365555 \h </w:instrText>
+          <w:instrText xml:space="preserve"> PAGEREF _Toc228393632 \h </w:instrText>
         </w:r>
         <w:r>
           <w:rPr>
@@ -2105,7 +2105,7 @@
           <w14:ligatures w14:val="standardContextual"/>
         </w:rPr>
       </w:pPr>
-      <w:hyperlink w:anchor="_Toc228365556" w:history="1">
+      <w:hyperlink w:anchor="_Toc228393633" w:history="1">
         <w:r>
           <w:rPr>
             <w:rStyle w:val="af3"/>
@@ -2143,7 +2143,7 @@
             <w:noProof/>
             <w:webHidden/>
           </w:rPr>
-          <w:instrText xml:space="preserve"> PAGEREF _Toc228365556 \h </w:instrText>
+          <w:instrText xml:space="preserve"> PAGEREF _Toc228393633 \h </w:instrText>
         </w:r>
         <w:r>
           <w:rPr>
@@ -2186,7 +2186,7 @@
           <w14:ligatures w14:val="standardContextual"/>
         </w:rPr>
       </w:pPr>
-      <w:hyperlink w:anchor="_Toc228365557" w:history="1">
+      <w:hyperlink w:anchor="_Toc228393634" w:history="1">
         <w:r>
           <w:rPr>
             <w:rStyle w:val="af3"/>
@@ -2224,7 +2224,7 @@
             <w:noProof/>
             <w:webHidden/>
           </w:rPr>
-          <w:instrText xml:space="preserve"> PAGEREF _Toc228365557 \h </w:instrText>
+          <w:instrText xml:space="preserve"> PAGEREF _Toc228393634 \h </w:instrText>
         </w:r>
         <w:r>
           <w:rPr>
@@ -2267,7 +2267,7 @@
           <w14:ligatures w14:val="standardContextual"/>
         </w:rPr>
       </w:pPr>
-      <w:hyperlink w:anchor="_Toc228365558" w:history="1">
+      <w:hyperlink w:anchor="_Toc228393635" w:history="1">
         <w:r>
           <w:rPr>
             <w:rStyle w:val="af3"/>
@@ -2305,7 +2305,7 @@
             <w:noProof/>
             <w:webHidden/>
           </w:rPr>
-          <w:instrText xml:space="preserve"> PAGEREF _Toc228365558 \h </w:instrText>
+          <w:instrText xml:space="preserve"> PAGEREF _Toc228393635 \h </w:instrText>
         </w:r>
         <w:r>
           <w:rPr>
@@ -2348,7 +2348,7 @@
           <w14:ligatures w14:val="standardContextual"/>
         </w:rPr>
       </w:pPr>
-      <w:hyperlink w:anchor="_Toc228365559" w:history="1">
+      <w:hyperlink w:anchor="_Toc228393636" w:history="1">
         <w:r>
           <w:rPr>
             <w:rStyle w:val="af3"/>
@@ -2386,7 +2386,7 @@
             <w:noProof/>
             <w:webHidden/>
           </w:rPr>
-          <w:instrText xml:space="preserve"> PAGEREF _Toc228365559 \h </w:instrText>
+          <w:instrText xml:space="preserve"> PAGEREF _Toc228393636 \h </w:instrText>
         </w:r>
         <w:r>
           <w:rPr>
@@ -2429,7 +2429,7 @@
           <w14:ligatures w14:val="standardContextual"/>
         </w:rPr>
       </w:pPr>
-      <w:hyperlink w:anchor="_Toc228365560" w:history="1">
+      <w:hyperlink w:anchor="_Toc228393637" w:history="1">
         <w:r>
           <w:rPr>
             <w:rStyle w:val="af3"/>
@@ -2467,7 +2467,7 @@
             <w:noProof/>
             <w:webHidden/>
           </w:rPr>
-          <w:instrText xml:space="preserve"> PAGEREF _Toc228365560 \h </w:instrText>
+          <w:instrText xml:space="preserve"> PAGEREF _Toc228393637 \h </w:instrText>
         </w:r>
         <w:r>
           <w:rPr>
@@ -2510,7 +2510,7 @@
           <w14:ligatures w14:val="standardContextual"/>
         </w:rPr>
       </w:pPr>
-      <w:hyperlink w:anchor="_Toc228365561" w:history="1">
+      <w:hyperlink w:anchor="_Toc228393638" w:history="1">
         <w:r>
           <w:rPr>
             <w:rStyle w:val="af3"/>
@@ -2554,7 +2554,7 @@
             <w:noProof/>
             <w:webHidden/>
           </w:rPr>
-          <w:instrText xml:space="preserve"> PAGEREF _Toc228365561 \h </w:instrText>
+          <w:instrText xml:space="preserve"> PAGEREF _Toc228393638 \h </w:instrText>
         </w:r>
         <w:r>
           <w:rPr>
@@ -2597,7 +2597,7 @@
           <w14:ligatures w14:val="standardContextual"/>
         </w:rPr>
       </w:pPr>
-      <w:hyperlink w:anchor="_Toc228365562" w:history="1">
+      <w:hyperlink w:anchor="_Toc228393639" w:history="1">
         <w:r>
           <w:rPr>
             <w:rStyle w:val="af3"/>
@@ -2635,7 +2635,7 @@
             <w:noProof/>
             <w:webHidden/>
           </w:rPr>
-          <w:instrText xml:space="preserve"> PAGEREF _Toc228365562 \h </w:instrText>
+          <w:instrText xml:space="preserve"> PAGEREF _Toc228393639 \h </w:instrText>
         </w:r>
         <w:r>
           <w:rPr>
@@ -2677,7 +2677,7 @@
           <w14:ligatures w14:val="standardContextual"/>
         </w:rPr>
       </w:pPr>
-      <w:hyperlink w:anchor="_Toc228365563" w:history="1">
+      <w:hyperlink w:anchor="_Toc228393640" w:history="1">
         <w:r>
           <w:rPr>
             <w:rStyle w:val="af3"/>
@@ -2715,7 +2715,7 @@
             <w:noProof/>
             <w:webHidden/>
           </w:rPr>
-          <w:instrText xml:space="preserve"> PAGEREF _Toc228365563 \h </w:instrText>
+          <w:instrText xml:space="preserve"> PAGEREF _Toc228393640 \h </w:instrText>
         </w:r>
         <w:r>
           <w:rPr>
@@ -2757,7 +2757,7 @@
           <w14:ligatures w14:val="standardContextual"/>
         </w:rPr>
       </w:pPr>
-      <w:hyperlink w:anchor="_Toc228365564" w:history="1">
+      <w:hyperlink w:anchor="_Toc228393641" w:history="1">
         <w:r>
           <w:rPr>
             <w:rStyle w:val="af3"/>
@@ -2795,7 +2795,7 @@
             <w:noProof/>
             <w:webHidden/>
           </w:rPr>
-          <w:instrText xml:space="preserve"> PAGEREF _Toc228365564 \h </w:instrText>
+          <w:instrText xml:space="preserve"> PAGEREF _Toc228393641 \h </w:instrText>
         </w:r>
         <w:r>
           <w:rPr>
@@ -2837,7 +2837,7 @@
           <w14:ligatures w14:val="standardContextual"/>
         </w:rPr>
       </w:pPr>
-      <w:hyperlink w:anchor="_Toc228365565" w:history="1">
+      <w:hyperlink w:anchor="_Toc228393642" w:history="1">
         <w:r>
           <w:rPr>
             <w:rStyle w:val="af3"/>
@@ -2875,7 +2875,7 @@
             <w:noProof/>
             <w:webHidden/>
           </w:rPr>
-          <w:instrText xml:space="preserve"> PAGEREF _Toc228365565 \h </w:instrText>
+          <w:instrText xml:space="preserve"> PAGEREF _Toc228393642 \h </w:instrText>
         </w:r>
         <w:r>
           <w:rPr>
@@ -2918,7 +2918,7 @@
           <w14:ligatures w14:val="standardContextual"/>
         </w:rPr>
       </w:pPr>
-      <w:hyperlink w:anchor="_Toc228365566" w:history="1">
+      <w:hyperlink w:anchor="_Toc228393643" w:history="1">
         <w:r>
           <w:rPr>
             <w:rStyle w:val="af3"/>
@@ -2956,7 +2956,7 @@
             <w:noProof/>
             <w:webHidden/>
           </w:rPr>
-          <w:instrText xml:space="preserve"> PAGEREF _Toc228365566 \h </w:instrText>
+          <w:instrText xml:space="preserve"> PAGEREF _Toc228393643 \h </w:instrText>
         </w:r>
         <w:r>
           <w:rPr>
@@ -2999,7 +2999,7 @@
           <w14:ligatures w14:val="standardContextual"/>
         </w:rPr>
       </w:pPr>
-      <w:hyperlink w:anchor="_Toc228365567" w:history="1">
+      <w:hyperlink w:anchor="_Toc228393644" w:history="1">
         <w:r>
           <w:rPr>
             <w:rStyle w:val="af3"/>
@@ -3037,7 +3037,7 @@
             <w:noProof/>
             <w:webHidden/>
           </w:rPr>
-          <w:instrText xml:space="preserve"> PAGEREF _Toc228365567 \h </w:instrText>
+          <w:instrText xml:space="preserve"> PAGEREF _Toc228393644 \h </w:instrText>
         </w:r>
         <w:r>
           <w:rPr>
@@ -3079,7 +3079,7 @@
           <w14:ligatures w14:val="standardContextual"/>
         </w:rPr>
       </w:pPr>
-      <w:hyperlink w:anchor="_Toc228365568" w:history="1">
+      <w:hyperlink w:anchor="_Toc228393645" w:history="1">
         <w:r>
           <w:rPr>
             <w:rStyle w:val="af3"/>
@@ -3117,7 +3117,7 @@
             <w:noProof/>
             <w:webHidden/>
           </w:rPr>
-          <w:instrText xml:space="preserve"> PAGEREF _Toc228365568 \h </w:instrText>
+          <w:instrText xml:space="preserve"> PAGEREF _Toc228393645 \h </w:instrText>
         </w:r>
         <w:r>
           <w:rPr>
@@ -3159,7 +3159,7 @@
           <w14:ligatures w14:val="standardContextual"/>
         </w:rPr>
       </w:pPr>
-      <w:hyperlink w:anchor="_Toc228365569" w:history="1">
+      <w:hyperlink w:anchor="_Toc228393646" w:history="1">
         <w:r>
           <w:rPr>
             <w:rStyle w:val="af3"/>
@@ -3197,7 +3197,7 @@
             <w:noProof/>
             <w:webHidden/>
           </w:rPr>
-          <w:instrText xml:space="preserve"> PAGEREF _Toc228365569 \h </w:instrText>
+          <w:instrText xml:space="preserve"> PAGEREF _Toc228393646 \h </w:instrText>
         </w:r>
         <w:r>
           <w:rPr>
@@ -3240,7 +3240,7 @@
           <w14:ligatures w14:val="standardContextual"/>
         </w:rPr>
       </w:pPr>
-      <w:hyperlink w:anchor="_Toc228365570" w:history="1">
+      <w:hyperlink w:anchor="_Toc228393647" w:history="1">
         <w:r>
           <w:rPr>
             <w:rStyle w:val="af3"/>
@@ -3278,7 +3278,7 @@
             <w:noProof/>
             <w:webHidden/>
           </w:rPr>
-          <w:instrText xml:space="preserve"> PAGEREF _Toc228365570 \h </w:instrText>
+          <w:instrText xml:space="preserve"> PAGEREF _Toc228393647 \h </w:instrText>
         </w:r>
         <w:r>
           <w:rPr>
@@ -3320,7 +3320,7 @@
           <w14:ligatures w14:val="standardContextual"/>
         </w:rPr>
       </w:pPr>
-      <w:hyperlink w:anchor="_Toc228365571" w:history="1">
+      <w:hyperlink w:anchor="_Toc228393648" w:history="1">
         <w:r>
           <w:rPr>
             <w:rStyle w:val="af3"/>
@@ -3358,7 +3358,7 @@
             <w:noProof/>
             <w:webHidden/>
           </w:rPr>
-          <w:instrText xml:space="preserve"> PAGEREF _Toc228365571 \h </w:instrText>
+          <w:instrText xml:space="preserve"> PAGEREF _Toc228393648 \h </w:instrText>
         </w:r>
         <w:r>
           <w:rPr>
@@ -3400,7 +3400,7 @@
           <w14:ligatures w14:val="standardContextual"/>
         </w:rPr>
       </w:pPr>
-      <w:hyperlink w:anchor="_Toc228365572" w:history="1">
+      <w:hyperlink w:anchor="_Toc228393649" w:history="1">
         <w:r>
           <w:rPr>
             <w:rStyle w:val="af3"/>
@@ -3438,7 +3438,7 @@
             <w:noProof/>
             <w:webHidden/>
           </w:rPr>
-          <w:instrText xml:space="preserve"> PAGEREF _Toc228365572 \h </w:instrText>
+          <w:instrText xml:space="preserve"> PAGEREF _Toc228393649 \h </w:instrText>
         </w:r>
         <w:r>
           <w:rPr>
@@ -3481,7 +3481,7 @@
           <w14:ligatures w14:val="standardContextual"/>
         </w:rPr>
       </w:pPr>
-      <w:hyperlink w:anchor="_Toc228365573" w:history="1">
+      <w:hyperlink w:anchor="_Toc228393650" w:history="1">
         <w:r>
           <w:rPr>
             <w:rStyle w:val="af3"/>
@@ -3537,7 +3537,7 @@
             <w:noProof/>
             <w:webHidden/>
           </w:rPr>
-          <w:instrText xml:space="preserve"> PAGEREF _Toc228365573 \h </w:instrText>
+          <w:instrText xml:space="preserve"> PAGEREF _Toc228393650 \h </w:instrText>
         </w:r>
         <w:r>
           <w:rPr>
@@ -3579,7 +3579,7 @@
           <w14:ligatures w14:val="standardContextual"/>
         </w:rPr>
       </w:pPr>
-      <w:hyperlink w:anchor="_Toc228365574" w:history="1">
+      <w:hyperlink w:anchor="_Toc228393651" w:history="1">
         <w:r>
           <w:rPr>
             <w:rStyle w:val="af3"/>
@@ -3617,7 +3617,7 @@
             <w:noProof/>
             <w:webHidden/>
           </w:rPr>
-          <w:instrText xml:space="preserve"> PAGEREF _Toc228365574 \h </w:instrText>
+          <w:instrText xml:space="preserve"> PAGEREF _Toc228393651 \h </w:instrText>
         </w:r>
         <w:r>
           <w:rPr>
@@ -3659,7 +3659,7 @@
           <w14:ligatures w14:val="standardContextual"/>
         </w:rPr>
       </w:pPr>
-      <w:hyperlink w:anchor="_Toc228365575" w:history="1">
+      <w:hyperlink w:anchor="_Toc228393652" w:history="1">
         <w:r>
           <w:rPr>
             <w:rStyle w:val="af3"/>
@@ -3715,7 +3715,7 @@
             <w:noProof/>
             <w:webHidden/>
           </w:rPr>
-          <w:instrText xml:space="preserve"> PAGEREF _Toc228365575 \h </w:instrText>
+          <w:instrText xml:space="preserve"> PAGEREF _Toc228393652 \h </w:instrText>
         </w:r>
         <w:r>
           <w:rPr>
@@ -3757,7 +3757,7 @@
           <w14:ligatures w14:val="standardContextual"/>
         </w:rPr>
       </w:pPr>
-      <w:hyperlink w:anchor="_Toc228365576" w:history="1">
+      <w:hyperlink w:anchor="_Toc228393653" w:history="1">
         <w:r>
           <w:rPr>
             <w:rStyle w:val="af3"/>
@@ -3795,7 +3795,7 @@
             <w:noProof/>
             <w:webHidden/>
           </w:rPr>
-          <w:instrText xml:space="preserve"> PAGEREF _Toc228365576 \h </w:instrText>
+          <w:instrText xml:space="preserve"> PAGEREF _Toc228393653 \h </w:instrText>
         </w:r>
         <w:r>
           <w:rPr>
@@ -3838,7 +3838,7 @@
           <w14:ligatures w14:val="standardContextual"/>
         </w:rPr>
       </w:pPr>
-      <w:hyperlink w:anchor="_Toc228365577" w:history="1">
+      <w:hyperlink w:anchor="_Toc228393654" w:history="1">
         <w:r>
           <w:rPr>
             <w:rStyle w:val="af3"/>
@@ -3894,7 +3894,7 @@
             <w:noProof/>
             <w:webHidden/>
           </w:rPr>
-          <w:instrText xml:space="preserve"> PAGEREF _Toc228365577 \h </w:instrText>
+          <w:instrText xml:space="preserve"> PAGEREF _Toc228393654 \h </w:instrText>
         </w:r>
         <w:r>
           <w:rPr>
@@ -3936,7 +3936,7 @@
           <w14:ligatures w14:val="standardContextual"/>
         </w:rPr>
       </w:pPr>
-      <w:hyperlink w:anchor="_Toc228365578" w:history="1">
+      <w:hyperlink w:anchor="_Toc228393655" w:history="1">
         <w:r>
           <w:rPr>
             <w:rStyle w:val="af3"/>
@@ -3992,7 +3992,7 @@
             <w:noProof/>
             <w:webHidden/>
           </w:rPr>
-          <w:instrText xml:space="preserve"> PAGEREF _Toc228365578 \h </w:instrText>
+          <w:instrText xml:space="preserve"> PAGEREF _Toc228393655 \h </w:instrText>
         </w:r>
         <w:r>
           <w:rPr>
@@ -4034,7 +4034,7 @@
           <w14:ligatures w14:val="standardContextual"/>
         </w:rPr>
       </w:pPr>
-      <w:hyperlink w:anchor="_Toc228365579" w:history="1">
+      <w:hyperlink w:anchor="_Toc228393656" w:history="1">
         <w:r>
           <w:rPr>
             <w:rStyle w:val="af3"/>
@@ -4090,7 +4090,7 @@
             <w:noProof/>
             <w:webHidden/>
           </w:rPr>
-          <w:instrText xml:space="preserve"> PAGEREF _Toc228365579 \h </w:instrText>
+          <w:instrText xml:space="preserve"> PAGEREF _Toc228393656 \h </w:instrText>
         </w:r>
         <w:r>
           <w:rPr>
@@ -4132,7 +4132,7 @@
           <w14:ligatures w14:val="standardContextual"/>
         </w:rPr>
       </w:pPr>
-      <w:hyperlink w:anchor="_Toc228365580" w:history="1">
+      <w:hyperlink w:anchor="_Toc228393657" w:history="1">
         <w:r>
           <w:rPr>
             <w:rStyle w:val="af3"/>
@@ -4170,7 +4170,7 @@
             <w:noProof/>
             <w:webHidden/>
           </w:rPr>
-          <w:instrText xml:space="preserve"> PAGEREF _Toc228365580 \h </w:instrText>
+          <w:instrText xml:space="preserve"> PAGEREF _Toc228393657 \h </w:instrText>
         </w:r>
         <w:r>
           <w:rPr>
@@ -4213,7 +4213,7 @@
           <w14:ligatures w14:val="standardContextual"/>
         </w:rPr>
       </w:pPr>
-      <w:hyperlink w:anchor="_Toc228365581" w:history="1">
+      <w:hyperlink w:anchor="_Toc228393658" w:history="1">
         <w:r>
           <w:rPr>
             <w:rStyle w:val="af3"/>
@@ -4251,7 +4251,7 @@
             <w:noProof/>
             <w:webHidden/>
           </w:rPr>
-          <w:instrText xml:space="preserve"> PAGEREF _Toc228365581 \h </w:instrText>
+          <w:instrText xml:space="preserve"> PAGEREF _Toc228393658 \h </w:instrText>
         </w:r>
         <w:r>
           <w:rPr>
@@ -4294,7 +4294,7 @@
           <w14:ligatures w14:val="standardContextual"/>
         </w:rPr>
       </w:pPr>
-      <w:hyperlink w:anchor="_Toc228365582" w:history="1">
+      <w:hyperlink w:anchor="_Toc228393659" w:history="1">
         <w:r>
           <w:rPr>
             <w:rStyle w:val="af3"/>
@@ -4338,7 +4338,7 @@
             <w:noProof/>
             <w:webHidden/>
           </w:rPr>
-          <w:instrText xml:space="preserve"> PAGEREF _Toc228365582 \h </w:instrText>
+          <w:instrText xml:space="preserve"> PAGEREF _Toc228393659 \h </w:instrText>
         </w:r>
         <w:r>
           <w:rPr>
@@ -4381,7 +4381,7 @@
           <w14:ligatures w14:val="standardContextual"/>
         </w:rPr>
       </w:pPr>
-      <w:hyperlink w:anchor="_Toc228365583" w:history="1">
+      <w:hyperlink w:anchor="_Toc228393660" w:history="1">
         <w:r>
           <w:rPr>
             <w:rStyle w:val="af3"/>
@@ -4419,7 +4419,7 @@
             <w:noProof/>
             <w:webHidden/>
           </w:rPr>
-          <w:instrText xml:space="preserve"> PAGEREF _Toc228365583 \h </w:instrText>
+          <w:instrText xml:space="preserve"> PAGEREF _Toc228393660 \h </w:instrText>
         </w:r>
         <w:r>
           <w:rPr>
@@ -4462,7 +4462,7 @@
           <w14:ligatures w14:val="standardContextual"/>
         </w:rPr>
       </w:pPr>
-      <w:hyperlink w:anchor="_Toc228365584" w:history="1">
+      <w:hyperlink w:anchor="_Toc228393661" w:history="1">
         <w:r>
           <w:rPr>
             <w:rStyle w:val="af3"/>
@@ -4518,7 +4518,7 @@
             <w:noProof/>
             <w:webHidden/>
           </w:rPr>
-          <w:instrText xml:space="preserve"> PAGEREF _Toc228365584 \h </w:instrText>
+          <w:instrText xml:space="preserve"> PAGEREF _Toc228393661 \h </w:instrText>
         </w:r>
         <w:r>
           <w:rPr>
@@ -4561,7 +4561,7 @@
           <w14:ligatures w14:val="standardContextual"/>
         </w:rPr>
       </w:pPr>
-      <w:hyperlink w:anchor="_Toc228365585" w:history="1">
+      <w:hyperlink w:anchor="_Toc228393662" w:history="1">
         <w:r>
           <w:rPr>
             <w:rStyle w:val="af3"/>
@@ -4599,7 +4599,7 @@
             <w:noProof/>
             <w:webHidden/>
           </w:rPr>
-          <w:instrText xml:space="preserve"> PAGEREF _Toc228365585 \h </w:instrText>
+          <w:instrText xml:space="preserve"> PAGEREF _Toc228393662 \h </w:instrText>
         </w:r>
         <w:r>
           <w:rPr>
@@ -4642,7 +4642,7 @@
           <w14:ligatures w14:val="standardContextual"/>
         </w:rPr>
       </w:pPr>
-      <w:hyperlink w:anchor="_Toc228365586" w:history="1">
+      <w:hyperlink w:anchor="_Toc228393663" w:history="1">
         <w:r>
           <w:rPr>
             <w:rStyle w:val="af3"/>
@@ -4680,7 +4680,7 @@
             <w:noProof/>
             <w:webHidden/>
           </w:rPr>
-          <w:instrText xml:space="preserve"> PAGEREF _Toc228365586 \h </w:instrText>
+          <w:instrText xml:space="preserve"> PAGEREF _Toc228393663 \h </w:instrText>
         </w:r>
         <w:r>
           <w:rPr>
@@ -4723,7 +4723,7 @@
           <w14:ligatures w14:val="standardContextual"/>
         </w:rPr>
       </w:pPr>
-      <w:hyperlink w:anchor="_Toc228365587" w:history="1">
+      <w:hyperlink w:anchor="_Toc228393664" w:history="1">
         <w:r>
           <w:rPr>
             <w:rStyle w:val="af3"/>
@@ -4779,7 +4779,7 @@
             <w:noProof/>
             <w:webHidden/>
           </w:rPr>
-          <w:instrText xml:space="preserve"> PAGEREF _Toc228365587 \h </w:instrText>
+          <w:instrText xml:space="preserve"> PAGEREF _Toc228393664 \h </w:instrText>
         </w:r>
         <w:r>
           <w:rPr>
@@ -4822,7 +4822,7 @@
           <w14:ligatures w14:val="standardContextual"/>
         </w:rPr>
       </w:pPr>
-      <w:hyperlink w:anchor="_Toc228365588" w:history="1">
+      <w:hyperlink w:anchor="_Toc228393665" w:history="1">
         <w:r>
           <w:rPr>
             <w:rStyle w:val="af3"/>
@@ -4878,7 +4878,7 @@
             <w:noProof/>
             <w:webHidden/>
           </w:rPr>
-          <w:instrText xml:space="preserve"> PAGEREF _Toc228365588 \h </w:instrText>
+          <w:instrText xml:space="preserve"> PAGEREF _Toc228393665 \h </w:instrText>
         </w:r>
         <w:r>
           <w:rPr>
@@ -4921,7 +4921,7 @@
           <w14:ligatures w14:val="standardContextual"/>
         </w:rPr>
       </w:pPr>
-      <w:hyperlink w:anchor="_Toc228365589" w:history="1">
+      <w:hyperlink w:anchor="_Toc228393666" w:history="1">
         <w:r>
           <w:rPr>
             <w:rStyle w:val="af3"/>
@@ -4977,7 +4977,7 @@
             <w:noProof/>
             <w:webHidden/>
           </w:rPr>
-          <w:instrText xml:space="preserve"> PAGEREF _Toc228365589 \h </w:instrText>
+          <w:instrText xml:space="preserve"> PAGEREF _Toc228393666 \h </w:instrText>
         </w:r>
         <w:r>
           <w:rPr>
@@ -5020,7 +5020,7 @@
           <w14:ligatures w14:val="standardContextual"/>
         </w:rPr>
       </w:pPr>
-      <w:hyperlink w:anchor="_Toc228365590" w:history="1">
+      <w:hyperlink w:anchor="_Toc228393667" w:history="1">
         <w:r>
           <w:rPr>
             <w:rStyle w:val="af3"/>
@@ -5058,7 +5058,7 @@
             <w:noProof/>
             <w:webHidden/>
           </w:rPr>
-          <w:instrText xml:space="preserve"> PAGEREF _Toc228365590 \h </w:instrText>
+          <w:instrText xml:space="preserve"> PAGEREF _Toc228393667 \h </w:instrText>
         </w:r>
         <w:r>
           <w:rPr>
@@ -5101,7 +5101,7 @@
           <w14:ligatures w14:val="standardContextual"/>
         </w:rPr>
       </w:pPr>
-      <w:hyperlink w:anchor="_Toc228365591" w:history="1">
+      <w:hyperlink w:anchor="_Toc228393668" w:history="1">
         <w:r>
           <w:rPr>
             <w:rStyle w:val="af3"/>
@@ -5139,7 +5139,7 @@
             <w:noProof/>
             <w:webHidden/>
           </w:rPr>
-          <w:instrText xml:space="preserve"> PAGEREF _Toc228365591 \h </w:instrText>
+          <w:instrText xml:space="preserve"> PAGEREF _Toc228393668 \h </w:instrText>
         </w:r>
         <w:r>
           <w:rPr>
@@ -5182,7 +5182,7 @@
           <w14:ligatures w14:val="standardContextual"/>
         </w:rPr>
       </w:pPr>
-      <w:hyperlink w:anchor="_Toc228365592" w:history="1">
+      <w:hyperlink w:anchor="_Toc228393669" w:history="1">
         <w:r>
           <w:rPr>
             <w:rStyle w:val="af3"/>
@@ -5226,7 +5226,7 @@
             <w:noProof/>
             <w:webHidden/>
           </w:rPr>
-          <w:instrText xml:space="preserve"> PAGEREF _Toc228365592 \h </w:instrText>
+          <w:instrText xml:space="preserve"> PAGEREF _Toc228393669 \h </w:instrText>
         </w:r>
         <w:r>
           <w:rPr>
@@ -5269,7 +5269,7 @@
           <w14:ligatures w14:val="standardContextual"/>
         </w:rPr>
       </w:pPr>
-      <w:hyperlink w:anchor="_Toc228365593" w:history="1">
+      <w:hyperlink w:anchor="_Toc228393670" w:history="1">
         <w:r>
           <w:rPr>
             <w:rStyle w:val="af3"/>
@@ -5307,7 +5307,7 @@
             <w:noProof/>
             <w:webHidden/>
           </w:rPr>
-          <w:instrText xml:space="preserve"> PAGEREF _Toc228365593 \h </w:instrText>
+          <w:instrText xml:space="preserve"> PAGEREF _Toc228393670 \h </w:instrText>
         </w:r>
         <w:r>
           <w:rPr>
@@ -5350,7 +5350,7 @@
           <w14:ligatures w14:val="standardContextual"/>
         </w:rPr>
       </w:pPr>
-      <w:hyperlink w:anchor="_Toc228365594" w:history="1">
+      <w:hyperlink w:anchor="_Toc228393671" w:history="1">
         <w:r>
           <w:rPr>
             <w:rStyle w:val="af3"/>
@@ -5388,7 +5388,7 @@
             <w:noProof/>
             <w:webHidden/>
           </w:rPr>
-          <w:instrText xml:space="preserve"> PAGEREF _Toc228365594 \h </w:instrText>
+          <w:instrText xml:space="preserve"> PAGEREF _Toc228393671 \h </w:instrText>
         </w:r>
         <w:r>
           <w:rPr>
@@ -5431,7 +5431,7 @@
           <w14:ligatures w14:val="standardContextual"/>
         </w:rPr>
       </w:pPr>
-      <w:hyperlink w:anchor="_Toc228365595" w:history="1">
+      <w:hyperlink w:anchor="_Toc228393672" w:history="1">
         <w:r>
           <w:rPr>
             <w:rStyle w:val="af3"/>
@@ -5469,7 +5469,7 @@
             <w:noProof/>
             <w:webHidden/>
           </w:rPr>
-          <w:instrText xml:space="preserve"> PAGEREF _Toc228365595 \h </w:instrText>
+          <w:instrText xml:space="preserve"> PAGEREF _Toc228393672 \h </w:instrText>
         </w:r>
         <w:r>
           <w:rPr>
@@ -5512,7 +5512,7 @@
           <w14:ligatures w14:val="standardContextual"/>
         </w:rPr>
       </w:pPr>
-      <w:hyperlink w:anchor="_Toc228365596" w:history="1">
+      <w:hyperlink w:anchor="_Toc228393673" w:history="1">
         <w:r>
           <w:rPr>
             <w:rStyle w:val="af3"/>
@@ -5568,7 +5568,7 @@
             <w:noProof/>
             <w:webHidden/>
           </w:rPr>
-          <w:instrText xml:space="preserve"> PAGEREF _Toc228365596 \h </w:instrText>
+          <w:instrText xml:space="preserve"> PAGEREF _Toc228393673 \h </w:instrText>
         </w:r>
         <w:r>
           <w:rPr>
@@ -5611,7 +5611,7 @@
           <w14:ligatures w14:val="standardContextual"/>
         </w:rPr>
       </w:pPr>
-      <w:hyperlink w:anchor="_Toc228365597" w:history="1">
+      <w:hyperlink w:anchor="_Toc228393674" w:history="1">
         <w:r>
           <w:rPr>
             <w:rStyle w:val="af3"/>
@@ -5649,7 +5649,7 @@
             <w:noProof/>
             <w:webHidden/>
           </w:rPr>
-          <w:instrText xml:space="preserve"> PAGEREF _Toc228365597 \h </w:instrText>
+          <w:instrText xml:space="preserve"> PAGEREF _Toc228393674 \h </w:instrText>
         </w:r>
         <w:r>
           <w:rPr>
@@ -5692,7 +5692,7 @@
           <w14:ligatures w14:val="standardContextual"/>
         </w:rPr>
       </w:pPr>
-      <w:hyperlink w:anchor="_Toc228365598" w:history="1">
+      <w:hyperlink w:anchor="_Toc228393675" w:history="1">
         <w:r>
           <w:rPr>
             <w:rStyle w:val="af3"/>
@@ -5748,7 +5748,7 @@
             <w:noProof/>
             <w:webHidden/>
           </w:rPr>
-          <w:instrText xml:space="preserve"> PAGEREF _Toc228365598 \h </w:instrText>
+          <w:instrText xml:space="preserve"> PAGEREF _Toc228393675 \h </w:instrText>
         </w:r>
         <w:r>
           <w:rPr>
@@ -5791,7 +5791,7 @@
           <w14:ligatures w14:val="standardContextual"/>
         </w:rPr>
       </w:pPr>
-      <w:hyperlink w:anchor="_Toc228365599" w:history="1">
+      <w:hyperlink w:anchor="_Toc228393676" w:history="1">
         <w:r>
           <w:rPr>
             <w:rStyle w:val="af3"/>
@@ -5829,7 +5829,7 @@
             <w:noProof/>
             <w:webHidden/>
           </w:rPr>
-          <w:instrText xml:space="preserve"> PAGEREF _Toc228365599 \h </w:instrText>
+          <w:instrText xml:space="preserve"> PAGEREF _Toc228393676 \h </w:instrText>
         </w:r>
         <w:r>
           <w:rPr>
@@ -5872,7 +5872,7 @@
           <w14:ligatures w14:val="standardContextual"/>
         </w:rPr>
       </w:pPr>
-      <w:hyperlink w:anchor="_Toc228365600" w:history="1">
+      <w:hyperlink w:anchor="_Toc228393677" w:history="1">
         <w:r>
           <w:rPr>
             <w:rStyle w:val="af3"/>
@@ -5910,7 +5910,7 @@
             <w:noProof/>
             <w:webHidden/>
           </w:rPr>
-          <w:instrText xml:space="preserve"> PAGEREF _Toc228365600 \h </w:instrText>
+          <w:instrText xml:space="preserve"> PAGEREF _Toc228393677 \h </w:instrText>
         </w:r>
         <w:r>
           <w:rPr>
@@ -5953,7 +5953,7 @@
           <w14:ligatures w14:val="standardContextual"/>
         </w:rPr>
       </w:pPr>
-      <w:hyperlink w:anchor="_Toc228365601" w:history="1">
+      <w:hyperlink w:anchor="_Toc228393678" w:history="1">
         <w:r>
           <w:rPr>
             <w:rStyle w:val="af3"/>
@@ -5991,7 +5991,7 @@
             <w:noProof/>
             <w:webHidden/>
           </w:rPr>
-          <w:instrText xml:space="preserve"> PAGEREF _Toc228365601 \h </w:instrText>
+          <w:instrText xml:space="preserve"> PAGEREF _Toc228393678 \h </w:instrText>
         </w:r>
         <w:r>
           <w:rPr>
@@ -6011,7 +6011,7 @@
             <w:noProof/>
             <w:webHidden/>
           </w:rPr>
-          <w:t>51</w:t>
+          <w:t>52</w:t>
         </w:r>
         <w:r>
           <w:rPr>
@@ -6034,7 +6034,7 @@
           <w14:ligatures w14:val="standardContextual"/>
         </w:rPr>
       </w:pPr>
-      <w:hyperlink w:anchor="_Toc228365602" w:history="1">
+      <w:hyperlink w:anchor="_Toc228393679" w:history="1">
         <w:r>
           <w:rPr>
             <w:rStyle w:val="af3"/>
@@ -6072,7 +6072,7 @@
             <w:noProof/>
             <w:webHidden/>
           </w:rPr>
-          <w:instrText xml:space="preserve"> PAGEREF _Toc228365602 \h </w:instrText>
+          <w:instrText xml:space="preserve"> PAGEREF _Toc228393679 \h </w:instrText>
         </w:r>
         <w:r>
           <w:rPr>
@@ -6115,7 +6115,7 @@
           <w14:ligatures w14:val="standardContextual"/>
         </w:rPr>
       </w:pPr>
-      <w:hyperlink w:anchor="_Toc228365603" w:history="1">
+      <w:hyperlink w:anchor="_Toc228393680" w:history="1">
         <w:r>
           <w:rPr>
             <w:rStyle w:val="af3"/>
@@ -6159,7 +6159,7 @@
             <w:noProof/>
             <w:webHidden/>
           </w:rPr>
-          <w:instrText xml:space="preserve"> PAGEREF _Toc228365603 \h </w:instrText>
+          <w:instrText xml:space="preserve"> PAGEREF _Toc228393680 \h </w:instrText>
         </w:r>
         <w:r>
           <w:rPr>
@@ -6202,7 +6202,7 @@
           <w14:ligatures w14:val="standardContextual"/>
         </w:rPr>
       </w:pPr>
-      <w:hyperlink w:anchor="_Toc228365604" w:history="1">
+      <w:hyperlink w:anchor="_Toc228393681" w:history="1">
         <w:r>
           <w:rPr>
             <w:rStyle w:val="af3"/>
@@ -6240,7 +6240,7 @@
             <w:noProof/>
             <w:webHidden/>
           </w:rPr>
-          <w:instrText xml:space="preserve"> PAGEREF _Toc228365604 \h </w:instrText>
+          <w:instrText xml:space="preserve"> PAGEREF _Toc228393681 \h </w:instrText>
         </w:r>
         <w:r>
           <w:rPr>
@@ -6283,7 +6283,7 @@
           <w14:ligatures w14:val="standardContextual"/>
         </w:rPr>
       </w:pPr>
-      <w:hyperlink w:anchor="_Toc228365605" w:history="1">
+      <w:hyperlink w:anchor="_Toc228393682" w:history="1">
         <w:r>
           <w:rPr>
             <w:rStyle w:val="af3"/>
@@ -6321,7 +6321,7 @@
             <w:noProof/>
             <w:webHidden/>
           </w:rPr>
-          <w:instrText xml:space="preserve"> PAGEREF _Toc228365605 \h </w:instrText>
+          <w:instrText xml:space="preserve"> PAGEREF _Toc228393682 \h </w:instrText>
         </w:r>
         <w:r>
           <w:rPr>
@@ -6364,7 +6364,7 @@
           <w14:ligatures w14:val="standardContextual"/>
         </w:rPr>
       </w:pPr>
-      <w:hyperlink w:anchor="_Toc228365606" w:history="1">
+      <w:hyperlink w:anchor="_Toc228393683" w:history="1">
         <w:r>
           <w:rPr>
             <w:rStyle w:val="af3"/>
@@ -6392,7 +6392,7 @@
             <w:noProof/>
             <w:webHidden/>
           </w:rPr>
-          <w:instrText xml:space="preserve"> PAGEREF _Toc228365606 \h </w:instrText>
+          <w:instrText xml:space="preserve"> PAGEREF _Toc228393683 \h </w:instrText>
         </w:r>
         <w:r>
           <w:rPr>
@@ -6435,7 +6435,7 @@
           <w14:ligatures w14:val="standardContextual"/>
         </w:rPr>
       </w:pPr>
-      <w:hyperlink w:anchor="_Toc228365607" w:history="1">
+      <w:hyperlink w:anchor="_Toc228393684" w:history="1">
         <w:r>
           <w:rPr>
             <w:rStyle w:val="af3"/>
@@ -6479,7 +6479,7 @@
             <w:noProof/>
             <w:webHidden/>
           </w:rPr>
-          <w:instrText xml:space="preserve"> PAGEREF _Toc228365607 \h </w:instrText>
+          <w:instrText xml:space="preserve"> PAGEREF _Toc228393684 \h </w:instrText>
         </w:r>
         <w:r>
           <w:rPr>
@@ -6522,7 +6522,7 @@
           <w14:ligatures w14:val="standardContextual"/>
         </w:rPr>
       </w:pPr>
-      <w:hyperlink w:anchor="_Toc228365608" w:history="1">
+      <w:hyperlink w:anchor="_Toc228393685" w:history="1">
         <w:r>
           <w:rPr>
             <w:rStyle w:val="af3"/>
@@ -6569,7 +6569,7 @@
             <w:noProof/>
             <w:webHidden/>
           </w:rPr>
-          <w:instrText xml:space="preserve"> PAGEREF _Toc228365608 \h </w:instrText>
+          <w:instrText xml:space="preserve"> PAGEREF _Toc228393685 \h </w:instrText>
         </w:r>
         <w:r>
           <w:rPr>
@@ -6612,7 +6612,7 @@
           <w14:ligatures w14:val="standardContextual"/>
         </w:rPr>
       </w:pPr>
-      <w:hyperlink w:anchor="_Toc228365609" w:history="1">
+      <w:hyperlink w:anchor="_Toc228393686" w:history="1">
         <w:r>
           <w:rPr>
             <w:rStyle w:val="af3"/>
@@ -6659,7 +6659,7 @@
             <w:noProof/>
             <w:webHidden/>
           </w:rPr>
-          <w:instrText xml:space="preserve"> PAGEREF _Toc228365609 \h </w:instrText>
+          <w:instrText xml:space="preserve"> PAGEREF _Toc228393686 \h </w:instrText>
         </w:r>
         <w:r>
           <w:rPr>
@@ -6679,7 +6679,7 @@
             <w:noProof/>
             <w:webHidden/>
           </w:rPr>
-          <w:t>65</w:t>
+          <w:t>68</w:t>
         </w:r>
         <w:r>
           <w:rPr>
@@ -6702,7 +6702,7 @@
           <w14:ligatures w14:val="standardContextual"/>
         </w:rPr>
       </w:pPr>
-      <w:hyperlink w:anchor="_Toc228365610" w:history="1">
+      <w:hyperlink w:anchor="_Toc228393687" w:history="1">
         <w:r>
           <w:rPr>
             <w:rStyle w:val="af3"/>
@@ -6730,7 +6730,7 @@
             <w:noProof/>
             <w:webHidden/>
           </w:rPr>
-          <w:instrText xml:space="preserve"> PAGEREF _Toc228365610 \h </w:instrText>
+          <w:instrText xml:space="preserve"> PAGEREF _Toc228393687 \h </w:instrText>
         </w:r>
         <w:r>
           <w:rPr>
@@ -6750,7 +6750,7 @@
             <w:noProof/>
             <w:webHidden/>
           </w:rPr>
-          <w:t>68</w:t>
+          <w:t>70</w:t>
         </w:r>
         <w:r>
           <w:rPr>
@@ -6779,7 +6779,7 @@
         <w:lastRenderedPageBreak/>
         <w:fldChar w:fldCharType="end"/>
       </w:r>
-      <w:bookmarkStart w:id="0" w:name="_Toc228365549"/>
+      <w:bookmarkStart w:id="0" w:name="_Toc228393626"/>
       <w:r>
         <w:rPr>
           <w:rFonts w:cs="Times New Roman"/>
@@ -6808,7 +6808,7 @@
         <w:spacing w:before="240" w:after="120" w:line="360" w:lineRule="auto"/>
         <w:outlineLvl w:val="1"/>
       </w:pPr>
-      <w:bookmarkStart w:id="1" w:name="_Toc228365550"/>
+      <w:bookmarkStart w:id="1" w:name="_Toc228393627"/>
       <w:r>
         <w:rPr>
           <w:rFonts w:eastAsia="黑体"/>
@@ -7008,7 +7008,7 @@
         <w:spacing w:before="240" w:after="120" w:line="360" w:lineRule="auto"/>
         <w:outlineLvl w:val="1"/>
       </w:pPr>
-      <w:bookmarkStart w:id="2" w:name="_Toc228365551"/>
+      <w:bookmarkStart w:id="2" w:name="_Toc228393628"/>
       <w:r>
         <w:rPr>
           <w:rFonts w:eastAsia="黑体"/>
@@ -7218,7 +7218,7 @@
         <w:spacing w:before="240" w:after="120" w:line="360" w:lineRule="auto"/>
         <w:outlineLvl w:val="1"/>
       </w:pPr>
-      <w:bookmarkStart w:id="3" w:name="_Toc228365552"/>
+      <w:bookmarkStart w:id="3" w:name="_Toc228393629"/>
       <w:r>
         <w:rPr>
           <w:rFonts w:eastAsia="黑体"/>
@@ -7575,7 +7575,7 @@
         <w:spacing w:before="240" w:after="120" w:line="360" w:lineRule="auto"/>
         <w:outlineLvl w:val="1"/>
       </w:pPr>
-      <w:bookmarkStart w:id="4" w:name="_Toc228365553"/>
+      <w:bookmarkStart w:id="4" w:name="_Toc228393630"/>
       <w:r>
         <w:rPr>
           <w:rFonts w:eastAsia="黑体"/>
@@ -7803,7 +7803,7 @@
         <w:jc w:val="center"/>
         <w:outlineLvl w:val="0"/>
       </w:pPr>
-      <w:bookmarkStart w:id="5" w:name="_Toc228365554"/>
+      <w:bookmarkStart w:id="5" w:name="_Toc228393631"/>
       <w:r>
         <w:rPr>
           <w:rFonts w:eastAsia="黑体"/>
@@ -7839,7 +7839,7 @@
         <w:spacing w:before="240" w:after="120" w:line="360" w:lineRule="auto"/>
         <w:outlineLvl w:val="1"/>
       </w:pPr>
-      <w:bookmarkStart w:id="6" w:name="_Toc228365555"/>
+      <w:bookmarkStart w:id="6" w:name="_Toc228393632"/>
       <w:r>
         <w:rPr>
           <w:rFonts w:eastAsia="黑体"/>
@@ -8022,7 +8022,7 @@
         <w:spacing w:before="240" w:after="120" w:line="360" w:lineRule="auto"/>
         <w:outlineLvl w:val="1"/>
       </w:pPr>
-      <w:bookmarkStart w:id="7" w:name="_Toc228365556"/>
+      <w:bookmarkStart w:id="7" w:name="_Toc228393633"/>
       <w:r>
         <w:rPr>
           <w:rFonts w:eastAsia="黑体"/>
@@ -8110,7 +8110,7 @@
         <w:spacing w:before="240" w:after="120" w:line="360" w:lineRule="auto"/>
         <w:outlineLvl w:val="1"/>
       </w:pPr>
-      <w:bookmarkStart w:id="8" w:name="_Toc228365557"/>
+      <w:bookmarkStart w:id="8" w:name="_Toc228393634"/>
       <w:r>
         <w:rPr>
           <w:rFonts w:eastAsia="黑体"/>
@@ -8973,7 +8973,7 @@
         <w:spacing w:before="240" w:after="120" w:line="360" w:lineRule="auto"/>
         <w:outlineLvl w:val="1"/>
       </w:pPr>
-      <w:bookmarkStart w:id="9" w:name="_Toc228365558"/>
+      <w:bookmarkStart w:id="9" w:name="_Toc228393635"/>
       <w:r>
         <w:rPr>
           <w:rFonts w:eastAsia="黑体"/>
@@ -9282,7 +9282,7 @@
         <w:spacing w:before="240" w:after="120" w:line="360" w:lineRule="auto"/>
         <w:outlineLvl w:val="1"/>
       </w:pPr>
-      <w:bookmarkStart w:id="10" w:name="_Toc228365559"/>
+      <w:bookmarkStart w:id="10" w:name="_Toc228393636"/>
       <w:r>
         <w:rPr>
           <w:rFonts w:eastAsia="黑体"/>
@@ -9453,7 +9453,7 @@
         <w:spacing w:before="240" w:after="120" w:line="360" w:lineRule="auto"/>
         <w:outlineLvl w:val="1"/>
       </w:pPr>
-      <w:bookmarkStart w:id="11" w:name="_Toc228365560"/>
+      <w:bookmarkStart w:id="11" w:name="_Toc228393637"/>
       <w:r>
         <w:rPr>
           <w:rFonts w:eastAsia="黑体"/>
@@ -9539,7 +9539,7 @@
         <w:jc w:val="center"/>
         <w:outlineLvl w:val="0"/>
       </w:pPr>
-      <w:bookmarkStart w:id="12" w:name="_Toc228365561"/>
+      <w:bookmarkStart w:id="12" w:name="_Toc228393638"/>
       <w:r>
         <w:rPr>
           <w:rFonts w:eastAsia="黑体"/>
@@ -9731,7 +9731,7 @@
         <w:spacing w:before="240" w:after="120" w:line="360" w:lineRule="auto"/>
         <w:outlineLvl w:val="1"/>
       </w:pPr>
-      <w:bookmarkStart w:id="13" w:name="_Toc228365562"/>
+      <w:bookmarkStart w:id="13" w:name="_Toc228393639"/>
       <w:r>
         <w:rPr>
           <w:rFonts w:eastAsia="黑体"/>
@@ -9757,7 +9757,7 @@
         <w:spacing w:before="180" w:after="80" w:line="360" w:lineRule="auto"/>
         <w:outlineLvl w:val="2"/>
       </w:pPr>
-      <w:bookmarkStart w:id="14" w:name="_Toc228365563"/>
+      <w:bookmarkStart w:id="14" w:name="_Toc228393640"/>
       <w:r>
         <w:rPr>
           <w:rFonts w:eastAsia="黑体"/>
@@ -10577,7 +10577,7 @@
         <w:spacing w:before="180" w:after="80" w:line="360" w:lineRule="auto"/>
         <w:outlineLvl w:val="2"/>
       </w:pPr>
-      <w:bookmarkStart w:id="15" w:name="_Toc228365564"/>
+      <w:bookmarkStart w:id="15" w:name="_Toc228393641"/>
       <w:r>
         <w:rPr>
           <w:rFonts w:eastAsia="黑体"/>
@@ -11404,7 +11404,7 @@
         <w:spacing w:before="180" w:after="80" w:line="360" w:lineRule="auto"/>
         <w:outlineLvl w:val="2"/>
       </w:pPr>
-      <w:bookmarkStart w:id="16" w:name="_Toc228365565"/>
+      <w:bookmarkStart w:id="16" w:name="_Toc228393642"/>
       <w:r>
         <w:rPr>
           <w:rFonts w:eastAsia="黑体"/>
@@ -11645,7 +11645,7 @@
         <w:spacing w:before="240" w:after="120" w:line="360" w:lineRule="auto"/>
         <w:outlineLvl w:val="1"/>
       </w:pPr>
-      <w:bookmarkStart w:id="17" w:name="_Toc228365566"/>
+      <w:bookmarkStart w:id="17" w:name="_Toc228393643"/>
       <w:r>
         <w:rPr>
           <w:rFonts w:eastAsia="黑体"/>
@@ -11950,7 +11950,7 @@
         <w:spacing w:before="240" w:after="120" w:line="360" w:lineRule="auto"/>
         <w:outlineLvl w:val="1"/>
       </w:pPr>
-      <w:bookmarkStart w:id="18" w:name="_Toc228365567"/>
+      <w:bookmarkStart w:id="18" w:name="_Toc228393644"/>
       <w:r>
         <w:rPr>
           <w:rFonts w:eastAsia="黑体"/>
@@ -11976,7 +11976,7 @@
         <w:spacing w:before="180" w:after="80" w:line="360" w:lineRule="auto"/>
         <w:outlineLvl w:val="2"/>
       </w:pPr>
-      <w:bookmarkStart w:id="19" w:name="_Toc228365568"/>
+      <w:bookmarkStart w:id="19" w:name="_Toc228393645"/>
       <w:r>
         <w:rPr>
           <w:rFonts w:eastAsia="黑体"/>
@@ -12541,7 +12541,7 @@
         <w:spacing w:before="180" w:after="80" w:line="360" w:lineRule="auto"/>
         <w:outlineLvl w:val="2"/>
       </w:pPr>
-      <w:bookmarkStart w:id="20" w:name="_Toc228365569"/>
+      <w:bookmarkStart w:id="20" w:name="_Toc228393646"/>
       <w:r>
         <w:rPr>
           <w:rFonts w:eastAsia="黑体"/>
@@ -12723,7 +12723,7 @@
         <w:spacing w:before="240" w:after="120" w:line="360" w:lineRule="auto"/>
         <w:outlineLvl w:val="1"/>
       </w:pPr>
-      <w:bookmarkStart w:id="21" w:name="_Toc228365570"/>
+      <w:bookmarkStart w:id="21" w:name="_Toc228393647"/>
       <w:r>
         <w:rPr>
           <w:rFonts w:eastAsia="黑体"/>
@@ -12749,7 +12749,7 @@
         <w:spacing w:before="180" w:after="80" w:line="360" w:lineRule="auto"/>
         <w:outlineLvl w:val="2"/>
       </w:pPr>
-      <w:bookmarkStart w:id="22" w:name="_Toc228365571"/>
+      <w:bookmarkStart w:id="22" w:name="_Toc228393648"/>
       <w:r>
         <w:rPr>
           <w:rFonts w:eastAsia="黑体"/>
@@ -12895,7 +12895,7 @@
         <w:spacing w:before="180" w:after="80" w:line="360" w:lineRule="auto"/>
         <w:outlineLvl w:val="2"/>
       </w:pPr>
-      <w:bookmarkStart w:id="23" w:name="_Toc228365572"/>
+      <w:bookmarkStart w:id="23" w:name="_Toc228393649"/>
       <w:r>
         <w:rPr>
           <w:rFonts w:eastAsia="黑体"/>
@@ -13010,7 +13010,7 @@
         <w:spacing w:before="240" w:after="120" w:line="360" w:lineRule="auto"/>
         <w:outlineLvl w:val="1"/>
       </w:pPr>
-      <w:bookmarkStart w:id="24" w:name="_Toc228365573"/>
+      <w:bookmarkStart w:id="24" w:name="_Toc228393650"/>
       <w:r>
         <w:rPr>
           <w:rFonts w:eastAsia="黑体"/>
@@ -13054,7 +13054,7 @@
         <w:spacing w:before="180" w:after="80" w:line="360" w:lineRule="auto"/>
         <w:outlineLvl w:val="2"/>
       </w:pPr>
-      <w:bookmarkStart w:id="25" w:name="_Toc228365574"/>
+      <w:bookmarkStart w:id="25" w:name="_Toc228393651"/>
       <w:r>
         <w:rPr>
           <w:rFonts w:eastAsia="黑体"/>
@@ -13304,7 +13304,7 @@
         <w:spacing w:before="180" w:after="80" w:line="360" w:lineRule="auto"/>
         <w:outlineLvl w:val="2"/>
       </w:pPr>
-      <w:bookmarkStart w:id="26" w:name="_Toc228365575"/>
+      <w:bookmarkStart w:id="26" w:name="_Toc228393652"/>
       <w:r>
         <w:rPr>
           <w:rFonts w:eastAsia="黑体"/>
@@ -13440,7 +13440,7 @@
         <w:spacing w:before="180" w:after="80" w:line="360" w:lineRule="auto"/>
         <w:outlineLvl w:val="2"/>
       </w:pPr>
-      <w:bookmarkStart w:id="27" w:name="_Toc228365576"/>
+      <w:bookmarkStart w:id="27" w:name="_Toc228393653"/>
       <w:r>
         <w:rPr>
           <w:rFonts w:eastAsia="黑体"/>
@@ -13721,7 +13721,7 @@
         <w:spacing w:before="240" w:after="120" w:line="360" w:lineRule="auto"/>
         <w:outlineLvl w:val="1"/>
       </w:pPr>
-      <w:bookmarkStart w:id="28" w:name="_Toc228365577"/>
+      <w:bookmarkStart w:id="28" w:name="_Toc228393654"/>
       <w:r>
         <w:rPr>
           <w:rFonts w:eastAsia="黑体"/>
@@ -13765,7 +13765,7 @@
         <w:spacing w:before="180" w:after="80" w:line="360" w:lineRule="auto"/>
         <w:outlineLvl w:val="2"/>
       </w:pPr>
-      <w:bookmarkStart w:id="29" w:name="_Toc228365578"/>
+      <w:bookmarkStart w:id="29" w:name="_Toc228393655"/>
       <w:r>
         <w:rPr>
           <w:rFonts w:eastAsia="黑体"/>
@@ -14056,7 +14056,7 @@
         <w:spacing w:before="180" w:after="80" w:line="360" w:lineRule="auto"/>
         <w:outlineLvl w:val="2"/>
       </w:pPr>
-      <w:bookmarkStart w:id="30" w:name="_Toc228365579"/>
+      <w:bookmarkStart w:id="30" w:name="_Toc228393656"/>
       <w:r>
         <w:rPr>
           <w:rFonts w:eastAsia="黑体"/>
@@ -14288,7 +14288,7 @@
         <w:spacing w:before="180" w:after="80" w:line="360" w:lineRule="auto"/>
         <w:outlineLvl w:val="2"/>
       </w:pPr>
-      <w:bookmarkStart w:id="31" w:name="_Toc228365580"/>
+      <w:bookmarkStart w:id="31" w:name="_Toc228393657"/>
       <w:r>
         <w:rPr>
           <w:rFonts w:eastAsia="黑体"/>
@@ -14415,7 +14415,7 @@
         <w:spacing w:before="240" w:after="120" w:line="360" w:lineRule="auto"/>
         <w:outlineLvl w:val="1"/>
       </w:pPr>
-      <w:bookmarkStart w:id="32" w:name="_Toc228365581"/>
+      <w:bookmarkStart w:id="32" w:name="_Toc228393658"/>
       <w:r>
         <w:rPr>
           <w:rFonts w:eastAsia="黑体"/>
@@ -14579,7 +14579,7 @@
         <w:jc w:val="center"/>
         <w:outlineLvl w:val="0"/>
       </w:pPr>
-      <w:bookmarkStart w:id="33" w:name="_Toc228365582"/>
+      <w:bookmarkStart w:id="33" w:name="_Toc228393659"/>
       <w:r>
         <w:rPr>
           <w:rFonts w:eastAsia="黑体"/>
@@ -14735,7 +14735,7 @@
         <w:spacing w:before="240" w:after="120" w:line="360" w:lineRule="auto"/>
         <w:outlineLvl w:val="1"/>
       </w:pPr>
-      <w:bookmarkStart w:id="34" w:name="_Toc228365583"/>
+      <w:bookmarkStart w:id="34" w:name="_Toc228393660"/>
       <w:r>
         <w:rPr>
           <w:rFonts w:eastAsia="黑体"/>
@@ -16028,7 +16028,7 @@
         <w:spacing w:before="240" w:after="120" w:line="360" w:lineRule="auto"/>
         <w:outlineLvl w:val="1"/>
       </w:pPr>
-      <w:bookmarkStart w:id="35" w:name="_Toc228365584"/>
+      <w:bookmarkStart w:id="35" w:name="_Toc228393661"/>
       <w:r>
         <w:rPr>
           <w:rFonts w:eastAsia="黑体"/>
@@ -16945,7 +16945,7 @@
         <w:spacing w:before="240" w:after="120" w:line="360" w:lineRule="auto"/>
         <w:outlineLvl w:val="1"/>
       </w:pPr>
-      <w:bookmarkStart w:id="36" w:name="_Toc228365585"/>
+      <w:bookmarkStart w:id="36" w:name="_Toc228393662"/>
       <w:r>
         <w:rPr>
           <w:rFonts w:eastAsia="黑体"/>
@@ -18253,7 +18253,7 @@
         <w:spacing w:before="240" w:after="120" w:line="360" w:lineRule="auto"/>
         <w:outlineLvl w:val="1"/>
       </w:pPr>
-      <w:bookmarkStart w:id="37" w:name="_Toc228365586"/>
+      <w:bookmarkStart w:id="37" w:name="_Toc228393663"/>
       <w:r>
         <w:rPr>
           <w:rFonts w:eastAsia="黑体"/>
@@ -18747,7 +18747,7 @@
         <w:spacing w:before="240" w:after="120" w:line="360" w:lineRule="auto"/>
         <w:outlineLvl w:val="1"/>
       </w:pPr>
-      <w:bookmarkStart w:id="38" w:name="_Toc228365587"/>
+      <w:bookmarkStart w:id="38" w:name="_Toc228393664"/>
       <w:r>
         <w:rPr>
           <w:rFonts w:eastAsia="黑体"/>
@@ -19555,7 +19555,7 @@
         <w:spacing w:before="240" w:after="120" w:line="360" w:lineRule="auto"/>
         <w:outlineLvl w:val="1"/>
       </w:pPr>
-      <w:bookmarkStart w:id="39" w:name="_Toc228365588"/>
+      <w:bookmarkStart w:id="39" w:name="_Toc228393665"/>
       <w:r>
         <w:rPr>
           <w:rFonts w:eastAsia="黑体"/>
@@ -20965,7 +20965,7 @@
         <w:spacing w:before="240" w:after="120" w:line="360" w:lineRule="auto"/>
         <w:outlineLvl w:val="1"/>
       </w:pPr>
-      <w:bookmarkStart w:id="40" w:name="_Toc228365589"/>
+      <w:bookmarkStart w:id="40" w:name="_Toc228393666"/>
       <w:r>
         <w:rPr>
           <w:rFonts w:eastAsia="黑体"/>
@@ -22103,7 +22103,7 @@
         <w:spacing w:before="240" w:after="120" w:line="360" w:lineRule="auto"/>
         <w:outlineLvl w:val="1"/>
       </w:pPr>
-      <w:bookmarkStart w:id="41" w:name="_Toc228365590"/>
+      <w:bookmarkStart w:id="41" w:name="_Toc228393667"/>
       <w:r>
         <w:rPr>
           <w:rFonts w:eastAsia="黑体"/>
@@ -22575,7 +22575,7 @@
         <w:spacing w:before="240" w:after="120" w:line="360" w:lineRule="auto"/>
         <w:outlineLvl w:val="1"/>
       </w:pPr>
-      <w:bookmarkStart w:id="42" w:name="_Toc228365591"/>
+      <w:bookmarkStart w:id="42" w:name="_Toc228393668"/>
       <w:r>
         <w:rPr>
           <w:rFonts w:eastAsia="黑体"/>
@@ -22896,7 +22896,7 @@
         <w:jc w:val="center"/>
         <w:outlineLvl w:val="0"/>
       </w:pPr>
-      <w:bookmarkStart w:id="43" w:name="_Toc228365592"/>
+      <w:bookmarkStart w:id="43" w:name="_Toc228393669"/>
       <w:r>
         <w:rPr>
           <w:rFonts w:eastAsia="黑体"/>
@@ -23052,7 +23052,7 @@
         <w:spacing w:before="240" w:after="120" w:line="360" w:lineRule="auto"/>
         <w:outlineLvl w:val="1"/>
       </w:pPr>
-      <w:bookmarkStart w:id="44" w:name="_Toc228365593"/>
+      <w:bookmarkStart w:id="44" w:name="_Toc228393670"/>
       <w:r>
         <w:rPr>
           <w:rFonts w:eastAsia="黑体"/>
@@ -25263,7 +25263,7 @@
         <w:spacing w:before="240" w:after="120" w:line="360" w:lineRule="auto"/>
         <w:outlineLvl w:val="1"/>
       </w:pPr>
-      <w:bookmarkStart w:id="45" w:name="_Toc228365594"/>
+      <w:bookmarkStart w:id="45" w:name="_Toc228393671"/>
       <w:r>
         <w:rPr>
           <w:rFonts w:eastAsia="黑体"/>
@@ -26130,7 +26130,7 @@
         <w:spacing w:before="240" w:after="120" w:line="360" w:lineRule="auto"/>
         <w:outlineLvl w:val="1"/>
       </w:pPr>
-      <w:bookmarkStart w:id="46" w:name="_Toc228365595"/>
+      <w:bookmarkStart w:id="46" w:name="_Toc228393672"/>
       <w:r>
         <w:rPr>
           <w:rFonts w:eastAsia="黑体"/>
@@ -26164,104 +26164,52 @@
       </w:r>
     </w:p>
     <w:p>
-      <w:pPr>
-        <w:spacing w:line="360" w:lineRule="auto"/>
-        <w:ind w:firstLine="480"/>
-      </w:pPr>
-      <w:r>
-        <w:rPr>
-          <w:szCs w:val="24"/>
-        </w:rPr>
+      <w:r>
         <w:t>PC/WSL</w:t>
       </w:r>
       <w:r>
-        <w:rPr>
-          <w:szCs w:val="24"/>
-        </w:rPr>
         <w:t>端首先使用</w:t>
       </w:r>
       <w:r>
-        <w:rPr>
-          <w:szCs w:val="24"/>
-        </w:rPr>
         <w:t>best.pt</w:t>
       </w:r>
       <w:r>
-        <w:rPr>
-          <w:szCs w:val="24"/>
-        </w:rPr>
         <w:t>对</w:t>
       </w:r>
       <w:r>
-        <w:rPr>
-          <w:szCs w:val="24"/>
-        </w:rPr>
         <w:t>anti_uav_fig1.mp4</w:t>
       </w:r>
       <w:r>
-        <w:rPr>
-          <w:szCs w:val="24"/>
-        </w:rPr>
         <w:t>进行离线检测。该视频共</w:t>
       </w:r>
       <w:r>
-        <w:rPr>
-          <w:szCs w:val="24"/>
-        </w:rPr>
         <w:t>130</w:t>
       </w:r>
       <w:r>
-        <w:rPr>
-          <w:szCs w:val="24"/>
-        </w:rPr>
         <w:t>帧，在置信度阈值</w:t>
       </w:r>
       <w:r>
-        <w:rPr>
-          <w:szCs w:val="24"/>
-        </w:rPr>
         <w:t>0.35</w:t>
       </w:r>
       <w:r>
-        <w:rPr>
-          <w:szCs w:val="24"/>
-        </w:rPr>
         <w:t>下，检测结果为：</w:t>
       </w:r>
       <w:r>
-        <w:rPr>
-          <w:szCs w:val="24"/>
-        </w:rPr>
         <w:t>16</w:t>
       </w:r>
       <w:r>
-        <w:rPr>
-          <w:szCs w:val="24"/>
-        </w:rPr>
         <w:t>帧存在检测框，总检测数为</w:t>
       </w:r>
       <w:r>
-        <w:rPr>
-          <w:szCs w:val="24"/>
-        </w:rPr>
         <w:t>18</w:t>
       </w:r>
       <w:r>
-        <w:rPr>
-          <w:szCs w:val="24"/>
-        </w:rPr>
         <w:t>，最高置信度为</w:t>
       </w:r>
       <w:r>
-        <w:rPr>
-          <w:szCs w:val="24"/>
-        </w:rPr>
         <w:t>0.6216</w:t>
       </w:r>
       <w:r>
-        <w:rPr>
-          <w:szCs w:val="24"/>
-        </w:rPr>
         <w:t>。这说明当前模型能够在新的公开无人机视频源中产生目标响应。</w:t>
       </w:r>
     </w:p>
@@ -27033,7 +26981,7 @@
         <w:spacing w:before="240" w:after="120" w:line="360" w:lineRule="auto"/>
         <w:outlineLvl w:val="1"/>
       </w:pPr>
-      <w:bookmarkStart w:id="47" w:name="_Toc228365596"/>
+      <w:bookmarkStart w:id="47" w:name="_Toc228393673"/>
       <w:r>
         <w:rPr>
           <w:rFonts w:eastAsia="黑体"/>
@@ -28241,7 +28189,7 @@
         <w:spacing w:before="240" w:after="120" w:line="360" w:lineRule="auto"/>
         <w:outlineLvl w:val="1"/>
       </w:pPr>
-      <w:bookmarkStart w:id="48" w:name="_Toc228365597"/>
+      <w:bookmarkStart w:id="48" w:name="_Toc228393674"/>
       <w:r>
         <w:rPr>
           <w:rFonts w:eastAsia="黑体"/>
@@ -30492,7 +30440,7 @@
         <w:spacing w:before="240" w:after="120" w:line="360" w:lineRule="auto"/>
         <w:outlineLvl w:val="1"/>
       </w:pPr>
-      <w:bookmarkStart w:id="49" w:name="_Toc228365598"/>
+      <w:bookmarkStart w:id="49" w:name="_Toc228393675"/>
       <w:r>
         <w:rPr>
           <w:rFonts w:eastAsia="黑体"/>
@@ -32482,7 +32430,7 @@
         <w:spacing w:before="240" w:after="120" w:line="360" w:lineRule="auto"/>
         <w:outlineLvl w:val="1"/>
       </w:pPr>
-      <w:bookmarkStart w:id="50" w:name="_Toc228365599"/>
+      <w:bookmarkStart w:id="50" w:name="_Toc228393676"/>
       <w:r>
         <w:rPr>
           <w:rFonts w:eastAsia="黑体"/>
@@ -34071,7 +34019,7 @@
         <w:spacing w:before="240" w:after="120" w:line="360" w:lineRule="auto"/>
         <w:outlineLvl w:val="1"/>
       </w:pPr>
-      <w:bookmarkStart w:id="51" w:name="_Toc228365600"/>
+      <w:bookmarkStart w:id="51" w:name="_Toc228393677"/>
       <w:r>
         <w:rPr>
           <w:rFonts w:eastAsia="黑体"/>
@@ -35129,10 +35077,336 @@
     </w:p>
     <w:p>
       <w:pPr>
+        <w:rPr>
+          <w:rFonts w:hint="eastAsia"/>
+        </w:rPr>
+      </w:pPr>
+      <w:r>
+        <w:rPr>
+          <w:rFonts w:hint="eastAsia"/>
+        </w:rPr>
+        <w:t>为进一步对应任务书中“视频采集、</w:t>
+      </w:r>
+      <w:r>
+        <w:rPr>
+          <w:rFonts w:hint="eastAsia"/>
+        </w:rPr>
+        <w:t>RGA</w:t>
+      </w:r>
+      <w:r>
+        <w:rPr>
+          <w:rFonts w:hint="eastAsia"/>
+        </w:rPr>
+        <w:t>硬件预处理、</w:t>
+      </w:r>
+      <w:r>
+        <w:rPr>
+          <w:rFonts w:hint="eastAsia"/>
+        </w:rPr>
+        <w:t>NPU</w:t>
+      </w:r>
+      <w:r>
+        <w:rPr>
+          <w:rFonts w:hint="eastAsia"/>
+        </w:rPr>
+        <w:t>推理、后处理的异步并行流水线”要求，本文在</w:t>
+      </w:r>
+      <w:r>
+        <w:rPr>
+          <w:rFonts w:hint="eastAsia"/>
+        </w:rPr>
+        <w:t>zero-copy</w:t>
+      </w:r>
+      <w:r>
+        <w:rPr>
+          <w:rFonts w:hint="eastAsia"/>
+        </w:rPr>
+        <w:t>输入路径之外补充了</w:t>
+      </w:r>
+      <w:r>
+        <w:rPr>
+          <w:rFonts w:hint="eastAsia"/>
+        </w:rPr>
+        <w:t>taskbook full-RGA strict</w:t>
+      </w:r>
+      <w:r>
+        <w:rPr>
+          <w:rFonts w:hint="eastAsia"/>
+        </w:rPr>
+        <w:t>验证配置。该配置设置</w:t>
+      </w:r>
+      <w:r>
+        <w:rPr>
+          <w:rFonts w:hint="eastAsia"/>
+        </w:rPr>
+        <w:t>RK_YOLO_PIPELINE=1</w:t>
+      </w:r>
+      <w:r>
+        <w:rPr>
+          <w:rFonts w:hint="eastAsia"/>
+        </w:rPr>
+        <w:t>、</w:t>
+      </w:r>
+      <w:r>
+        <w:rPr>
+          <w:rFonts w:hint="eastAsia"/>
+        </w:rPr>
+        <w:t>RK_YOLO_PIPELINE_STAGED=1</w:t>
+      </w:r>
+      <w:r>
+        <w:rPr>
+          <w:rFonts w:hint="eastAsia"/>
+        </w:rPr>
+        <w:t>、</w:t>
+      </w:r>
+      <w:r>
+        <w:rPr>
+          <w:rFonts w:hint="eastAsia"/>
+        </w:rPr>
+        <w:t>RK_YOLO_PREPROCESS=rga_cvt_resize</w:t>
+      </w:r>
+      <w:r>
+        <w:rPr>
+          <w:rFonts w:hint="eastAsia"/>
+        </w:rPr>
+        <w:t>、</w:t>
+      </w:r>
+      <w:r>
+        <w:rPr>
+          <w:rFonts w:hint="eastAsia"/>
+        </w:rPr>
+        <w:t>RK_YOLO_RGA_LETTERBOX=1</w:t>
+      </w:r>
+      <w:r>
+        <w:rPr>
+          <w:rFonts w:hint="eastAsia"/>
+        </w:rPr>
+        <w:t>和</w:t>
+      </w:r>
+      <w:r>
+        <w:rPr>
+          <w:rFonts w:hint="eastAsia"/>
+        </w:rPr>
+        <w:t>RK_YOLO_REQUIRE_RGA=1</w:t>
+      </w:r>
+      <w:r>
+        <w:rPr>
+          <w:rFonts w:hint="eastAsia"/>
+        </w:rPr>
+        <w:t>，其中</w:t>
+      </w:r>
+      <w:r>
+        <w:rPr>
+          <w:rFonts w:hint="eastAsia"/>
+        </w:rPr>
+        <w:t>RK_YOLO_REQUIRE_RGA</w:t>
+      </w:r>
+      <w:r>
+        <w:rPr>
+          <w:rFonts w:hint="eastAsia"/>
+        </w:rPr>
+        <w:t>用于禁止</w:t>
+      </w:r>
+      <w:r>
+        <w:rPr>
+          <w:rFonts w:hint="eastAsia"/>
+        </w:rPr>
+        <w:t>RGA</w:t>
+      </w:r>
+      <w:r>
+        <w:rPr>
+          <w:rFonts w:hint="eastAsia"/>
+        </w:rPr>
+        <w:t>失败后回退</w:t>
+      </w:r>
+      <w:r>
+        <w:rPr>
+          <w:rFonts w:hint="eastAsia"/>
+        </w:rPr>
+        <w:t>OpenCV</w:t>
+      </w:r>
+      <w:r>
+        <w:rPr>
+          <w:rFonts w:hint="eastAsia"/>
+        </w:rPr>
+        <w:t>。板端日志显示</w:t>
+      </w:r>
+      <w:r>
+        <w:rPr>
+          <w:rFonts w:hint="eastAsia"/>
+        </w:rPr>
+        <w:t>preprocess=rga_cvt_resize</w:t>
+      </w:r>
+      <w:r>
+        <w:rPr>
+          <w:rFonts w:hint="eastAsia"/>
+        </w:rPr>
+        <w:t>、</w:t>
+      </w:r>
+      <w:r>
+        <w:rPr>
+          <w:rFonts w:hint="eastAsia"/>
+        </w:rPr>
+        <w:t>rga_letterbox=on</w:t>
+      </w:r>
+      <w:r>
+        <w:rPr>
+          <w:rFonts w:hint="eastAsia"/>
+        </w:rPr>
+        <w:t>、</w:t>
+      </w:r>
+      <w:r>
+        <w:rPr>
+          <w:rFonts w:hint="eastAsia"/>
+        </w:rPr>
+        <w:t>rga_required=on</w:t>
+      </w:r>
+      <w:r>
+        <w:rPr>
+          <w:rFonts w:hint="eastAsia"/>
+        </w:rPr>
+        <w:t>，并输出</w:t>
+      </w:r>
+      <w:r>
+        <w:rPr>
+          <w:rFonts w:hint="eastAsia"/>
+        </w:rPr>
+        <w:t>rga_api version 1.10.1_[10]</w:t>
+      </w:r>
+      <w:r>
+        <w:rPr>
+          <w:rFonts w:hint="eastAsia"/>
+        </w:rPr>
+        <w:t>。</w:t>
+      </w:r>
+    </w:p>
+    <w:p>
+      <w:pPr>
+        <w:rPr>
+          <w:rFonts w:hint="eastAsia"/>
+        </w:rPr>
+      </w:pPr>
+      <w:r>
+        <w:rPr>
+          <w:rFonts w:hint="eastAsia"/>
+        </w:rPr>
+        <w:t>在</w:t>
+      </w:r>
+      <w:r>
+        <w:rPr>
+          <w:rFonts w:hint="eastAsia"/>
+        </w:rPr>
+        <w:t>anti_uav_fig1.mp4</w:t>
+      </w:r>
+      <w:r>
+        <w:rPr>
+          <w:rFonts w:hint="eastAsia"/>
+        </w:rPr>
+        <w:t>的</w:t>
+      </w:r>
+      <w:r>
+        <w:rPr>
+          <w:rFonts w:hint="eastAsia"/>
+        </w:rPr>
+        <w:t>130</w:t>
+      </w:r>
+      <w:r>
+        <w:rPr>
+          <w:rFonts w:hint="eastAsia"/>
+        </w:rPr>
+        <w:t>帧验证中，该配置保持</w:t>
+      </w:r>
+      <w:r>
+        <w:rPr>
+          <w:rFonts w:hint="eastAsia"/>
+        </w:rPr>
+        <w:t>30</w:t>
+      </w:r>
+      <w:r>
+        <w:rPr>
+          <w:rFonts w:hint="eastAsia"/>
+        </w:rPr>
+        <w:t>帧出现检测结果和</w:t>
+      </w:r>
+      <w:r>
+        <w:rPr>
+          <w:rFonts w:hint="eastAsia"/>
+        </w:rPr>
+        <w:t>14</w:t>
+      </w:r>
+      <w:r>
+        <w:rPr>
+          <w:rFonts w:hint="eastAsia"/>
+        </w:rPr>
+        <w:t>次报警事件，说明</w:t>
+      </w:r>
+      <w:r>
+        <w:rPr>
+          <w:rFonts w:hint="eastAsia"/>
+        </w:rPr>
+        <w:t>RGA</w:t>
+      </w:r>
+      <w:r>
+        <w:rPr>
+          <w:rFonts w:hint="eastAsia"/>
+        </w:rPr>
+        <w:t>已参与颜色转换、缩放和</w:t>
+      </w:r>
+      <w:r>
+        <w:rPr>
+          <w:rFonts w:hint="eastAsia"/>
+        </w:rPr>
+        <w:t>letterbox</w:t>
+      </w:r>
+      <w:r>
+        <w:rPr>
+          <w:rFonts w:hint="eastAsia"/>
+        </w:rPr>
+        <w:t>输入构造，能够作为</w:t>
+      </w:r>
+      <w:r>
+        <w:rPr>
+          <w:rFonts w:hint="eastAsia"/>
+        </w:rPr>
+        <w:t>RGA</w:t>
+      </w:r>
+      <w:r>
+        <w:rPr>
+          <w:rFonts w:hint="eastAsia"/>
+        </w:rPr>
+        <w:t>硬件预处理流水线的工程验证结果。该配置的</w:t>
+      </w:r>
+      <w:r>
+        <w:rPr>
+          <w:rFonts w:hint="eastAsia"/>
+        </w:rPr>
+        <w:t>mean total work time</w:t>
+      </w:r>
+      <w:r>
+        <w:rPr>
+          <w:rFonts w:hint="eastAsia"/>
+        </w:rPr>
+        <w:t>约为</w:t>
+      </w:r>
+      <w:r>
+        <w:rPr>
+          <w:rFonts w:hint="eastAsia"/>
+        </w:rPr>
+        <w:t>190.133 ms</w:t>
+      </w:r>
+      <w:r>
+        <w:rPr>
+          <w:rFonts w:hint="eastAsia"/>
+        </w:rPr>
+        <w:t>，端到端速度不优于稳定主路径，因此本文将其作为任务书合规性和硬件预处理功能验证，而不是最终性能推荐配置。</w:t>
+      </w:r>
+    </w:p>
+    <w:p>
+      <w:pPr>
         <w:spacing w:before="240" w:after="120" w:line="360" w:lineRule="auto"/>
         <w:outlineLvl w:val="1"/>
       </w:pPr>
-      <w:bookmarkStart w:id="52" w:name="_Toc228365601"/>
+      <w:bookmarkStart w:id="52" w:name="_Toc228393678"/>
       <w:r>
         <w:rPr>
           <w:rFonts w:eastAsia="黑体"/>
@@ -35140,6 +35414,7 @@
           <w:sz w:val="28"/>
           <w:szCs w:val="28"/>
         </w:rPr>
+        <w:lastRenderedPageBreak/>
         <w:t>5.9</w:t>
       </w:r>
       <w:r>
@@ -35294,7 +35569,6 @@
         <w:rPr>
           <w:szCs w:val="24"/>
         </w:rPr>
-        <w:lastRenderedPageBreak/>
         <w:t>第三，</w:t>
       </w:r>
       <w:r>
@@ -36265,6 +36539,7 @@
                 <w:sz w:val="20"/>
                 <w:szCs w:val="20"/>
               </w:rPr>
+              <w:lastRenderedPageBreak/>
               <w:t>硬件优化探索</w:t>
             </w:r>
           </w:p>
@@ -36580,14 +36855,7 @@
         <w:rPr>
           <w:szCs w:val="24"/>
         </w:rPr>
-        <w:t>输入路径已经完成可切换验证，但仍应表述为硬</w:t>
-      </w:r>
-      <w:r>
-        <w:rPr>
-          <w:szCs w:val="24"/>
-        </w:rPr>
-        <w:lastRenderedPageBreak/>
-        <w:t>件优化探索与后续扩展方向。</w:t>
+        <w:t>输入路径已经完成可切换验证，但仍应表述为硬件优化探索与后续扩展方向。</w:t>
       </w:r>
     </w:p>
     <w:p>
@@ -37398,6 +37666,7 @@
                 <w:rFonts w:cs="Times New Roman" w:hint="eastAsia"/>
                 <w:sz w:val="16"/>
               </w:rPr>
+              <w:lastRenderedPageBreak/>
               <w:t xml:space="preserve">RGA </w:t>
             </w:r>
             <w:r>
@@ -37746,7 +38015,6 @@
                 <w:rFonts w:cs="Times New Roman" w:hint="eastAsia"/>
                 <w:sz w:val="16"/>
               </w:rPr>
-              <w:lastRenderedPageBreak/>
               <w:t xml:space="preserve">RGA NV12 </w:t>
             </w:r>
             <w:r>
@@ -38254,7 +38522,7 @@
         <w:jc w:val="left"/>
         <w:outlineLvl w:val="1"/>
       </w:pPr>
-      <w:bookmarkStart w:id="53" w:name="_Toc228365602"/>
+      <w:bookmarkStart w:id="53" w:name="_Toc228393679"/>
       <w:r>
         <w:rPr>
           <w:rFonts w:eastAsia="黑体"/>
@@ -38320,7 +38588,14 @@
         <w:rPr>
           <w:szCs w:val="24"/>
         </w:rPr>
-        <w:t>并行和硬件输入路径等实验分析。训练结果表明当前单类无人机模型具备基本检测能力；公开视频固定输入验证表明恢复后的无人机</w:t>
+        <w:t>并行和硬件输入路径等实验分析。训练结果表明当前单类无人机模型具备基本检测能</w:t>
+      </w:r>
+      <w:r>
+        <w:rPr>
+          <w:szCs w:val="24"/>
+        </w:rPr>
+        <w:lastRenderedPageBreak/>
+        <w:t>力；公开视频固定输入验证表明恢复后的无人机</w:t>
       </w:r>
       <w:r>
         <w:rPr>
@@ -38534,7 +38809,6 @@
         <w:rPr>
           <w:szCs w:val="24"/>
         </w:rPr>
-        <w:lastRenderedPageBreak/>
         <w:t>总体来看，本文已经形成了较完整的实验链路：模型训练、</w:t>
       </w:r>
       <w:r>
@@ -38585,7 +38859,7 @@
         <w:jc w:val="center"/>
         <w:outlineLvl w:val="0"/>
       </w:pPr>
-      <w:bookmarkStart w:id="54" w:name="_Toc228365603"/>
+      <w:bookmarkStart w:id="54" w:name="_Toc228393680"/>
       <w:r>
         <w:rPr>
           <w:rFonts w:eastAsia="黑体" w:hint="eastAsia"/>
@@ -38627,7 +38901,7 @@
           <w:szCs w:val="24"/>
         </w:rPr>
       </w:pPr>
-      <w:bookmarkStart w:id="55" w:name="_Toc228365604"/>
+      <w:bookmarkStart w:id="55" w:name="_Toc228393681"/>
       <w:r>
         <w:rPr>
           <w:rFonts w:eastAsia="黑体" w:hint="eastAsia"/>
@@ -38821,7 +39095,7 @@
           <w:szCs w:val="24"/>
         </w:rPr>
       </w:pPr>
-      <w:bookmarkStart w:id="56" w:name="_Toc228365605"/>
+      <w:bookmarkStart w:id="56" w:name="_Toc228393682"/>
       <w:r>
         <w:rPr>
           <w:rFonts w:eastAsia="黑体" w:hint="eastAsia"/>
@@ -39045,7 +39319,7 @@
         <w:jc w:val="center"/>
         <w:outlineLvl w:val="0"/>
       </w:pPr>
-      <w:bookmarkStart w:id="57" w:name="_Toc228365606"/>
+      <w:bookmarkStart w:id="57" w:name="_Toc228393683"/>
       <w:r>
         <w:rPr>
           <w:rFonts w:eastAsia="黑体"/>
@@ -39395,7 +39669,7 @@
         <w:jc w:val="center"/>
         <w:outlineLvl w:val="0"/>
       </w:pPr>
-      <w:bookmarkStart w:id="58" w:name="_Toc228365607"/>
+      <w:bookmarkStart w:id="58" w:name="_Toc228393684"/>
       <w:r>
         <w:rPr>
           <w:rFonts w:eastAsia="黑体"/>
@@ -39428,7 +39702,7 @@
         <w:jc w:val="center"/>
         <w:outlineLvl w:val="1"/>
       </w:pPr>
-      <w:bookmarkStart w:id="59" w:name="_Toc228365608"/>
+      <w:bookmarkStart w:id="59" w:name="_Toc228393685"/>
       <w:r>
         <w:rPr>
           <w:rFonts w:eastAsia="黑体"/>
@@ -39470,676 +39744,977 @@
     </w:p>
     <w:p>
       <w:pPr>
-        <w:spacing w:before="120" w:after="120" w:line="360" w:lineRule="auto"/>
-        <w:jc w:val="left"/>
-      </w:pPr>
-      <w:r>
-        <w:rPr>
-          <w:rFonts w:eastAsia="黑体"/>
+        <w:spacing w:line="360" w:lineRule="auto"/>
+      </w:pPr>
+      <w:r>
+        <w:t>Source: Li J., Ye J. Edge-YOLO: Lightweight Infrared Object Detection Method Deployed on Edge Devices. Applied Sciences, 2023, 13(7), 4402. https://doi.org/10.3390/app13074402. The following English excerpts are selected from Sections 1, 3.3, 4.3, 4.7, and 5 of the original open-access article.</w:t>
+      </w:r>
+    </w:p>
+    <w:p>
+      <w:pPr>
+        <w:spacing w:line="360" w:lineRule="auto"/>
+      </w:pPr>
+      <w:r>
+        <w:rPr>
           <w:b/>
         </w:rPr>
-        <w:t>Li J., Ye J. Edge-YOLO: Lightweight Infrared Object Detection Method Deployed on Edge Devices. Applied Sciences, 2023, 13(7), 4402. https://doi.org/10.3390/app13074402. The following English material is selected and adapted from the above open-access article for translation practice.</w:t>
-      </w:r>
-    </w:p>
-    <w:p>
-      <w:pPr>
-        <w:spacing w:before="120" w:after="120" w:line="360" w:lineRule="auto"/>
-        <w:jc w:val="left"/>
-      </w:pPr>
-      <w:r>
-        <w:rPr>
-          <w:rFonts w:eastAsia="黑体"/>
+        <w:t>1. Introduction</w:t>
+      </w:r>
+    </w:p>
+    <w:p>
+      <w:pPr>
+        <w:spacing w:line="360" w:lineRule="auto"/>
+      </w:pPr>
+      <w:r>
+        <w:t>Visible light images are commonly used in target detection due to their high resolution, definition, and detailed visual information that is easily interpreted by the human eye. However, these images are sensitive to external factors such as weather and lighting conditions, which can reduce image quality and negatively impact target detection accuracy. This is where infrared imaging technology plays a crucial role. By overcoming these limitations, infrared imaging allows for image acquisition under diverse lighting and weather conditions, including foggy days and nighttime scenarios. As a result, this technology has been widely adopted in various fields, such as autonomous driving, security monitoring, and remote sensing, and offers a broader range of use cases than visible images. Therefore, the importance of infrared imaging technology in enabling efficient and reliable target detection cannot be overstated.</w:t>
+      </w:r>
+    </w:p>
+    <w:p>
+      <w:pPr>
+        <w:spacing w:line="360" w:lineRule="auto"/>
+      </w:pPr>
+      <w:r>
+        <w:t xml:space="preserve">Traditional infrared target detection techniques [1,2,3] are mainly model-based methods, such as template matching, threshold segmentation, and the Hausdorff metric. However, with the development of deep learning, target detection techniques based on convolutional neural networks have emerged in recent years. These methods are primarily divided into two-stage algorithms (e.g., Faster-RCNN [4]) and single-stage algorithms (e.g., SSD [5] and YOLO </w:t>
+      </w:r>
+      <w:r>
+        <w:lastRenderedPageBreak/>
+        <w:t>[6]). The single-stage algorithm is designed to achieve a balance between detection speed and accuracy, resulting in a significant improvement in detection speed while maintaining accuracy compared with the two-stage algorithm. Consequently, the YOLO series has become a widely used representative of the single-stage algorithm. Among the mainstream YOLO algorithms, YOLOv5 (version 6.2) has achieved significant improvement in both detection accuracy and speed compared with its predecessor by using Mosaic data enhancement, C3 modules, and an improved SPPF module. Although YOLOv5 performs well on visible images, it encounters several challenges when applied to infrared detection. The first major issue is that infrared images suffer from poor contrast, high noise, and blurred imaging, leading to the loss of crucial target features during deep convolutional network processing. Moreover, since infrared images lack color information, and the difference between target and background features is minimal, it becomes challenging for deep convolutional neural networks to distinguish useful information from irrelevant data, reducing detection accuracy. Another significant challenge is that embedded devices commonly used in autonomous driving and security monitoring fields have limited computing power, storage space, and power consumption, which makes deploying large target detection models such as YOLOv5 difficult. Additionally, these fields require real-time detection, and collecting data on edge devices and sending them to the server for detection and analysis can lead to network latency and communication congestion problems in widely distributed areas.</w:t>
+      </w:r>
+    </w:p>
+    <w:p>
+      <w:pPr>
+        <w:spacing w:line="360" w:lineRule="auto"/>
+      </w:pPr>
+      <w:r>
+        <w:t xml:space="preserve">The challenges mentioned above necessitate lightweight infrared target detection on edge devices. In summary, this paper proposes a solution to these issues by introducing Edge-YOLO, an infrared target detection algorithm that utilizes lightweight networks and attention mechanisms specifically designed for edge devices. The primary enhancements of this algorithm can be summarized as follows:(1)The bounding box loss function was redesigned, and a loss function with a power hyperparameter α was made to accelerate the convergence of the loss function and solve the uncertainty of the aspect ratio in CIoU;(2)A lightweight content-aware up-sampling operator was adopted, which can obtain a larger perceptual field than the original nearest-neighbor up-sampling method, while only introducing a small </w:t>
+      </w:r>
+      <w:r>
+        <w:lastRenderedPageBreak/>
+        <w:t>number of parameters and computational cost;(3)The feature extraction network was reconstructed based on the improved ShuffleNetv2, which enhances the extraction ability of strip features in IR scenes and the perception ability of salient features in IR images by embedding a newly designed strip depthwise convolutional attention module in ShuffleBlock while significantly reducing the computational power of the network.</w:t>
+      </w:r>
+    </w:p>
+    <w:p>
+      <w:pPr>
+        <w:spacing w:line="360" w:lineRule="auto"/>
+      </w:pPr>
+      <w:r>
+        <w:t>The remaining sections of this paper are organized as follows: Section 2 provides an overview of related works on target detection with neural networks, including YOLOv5, and other algorithms in infrared target detection. Section 3 provides a detailed introduction to the Edge-YOLO algorithm proposed in this paper. Section 4 presents the results of various experiments conducted to evaluate the performance of Edge-YOLO. Finally, Section 5 summarizes the main contributions of this paper.</w:t>
+      </w:r>
+    </w:p>
+    <w:p>
+      <w:pPr>
+        <w:spacing w:line="360" w:lineRule="auto"/>
+      </w:pPr>
+      <w:r>
+        <w:rPr>
           <w:b/>
         </w:rPr>
-        <w:t>Edge-YOLO and Embedded Deployment for Lightweight Object Detection</w:t>
+        <w:t>3.3. YOLOv5 Network Model Improvement</w:t>
       </w:r>
     </w:p>
     <w:p>
       <w:pPr>
         <w:spacing w:line="360" w:lineRule="auto"/>
-        <w:ind w:firstLine="480"/>
-      </w:pPr>
-      <w:r>
-        <w:t>Object detection systems used in road surveillance, security monitoring, and remote sensing are increasingly expected to operate on edge devices rather than only on desktop computers or cloud servers. Infrared imaging is useful in such scenarios because it can support image acquisition under foggy, nighttime, or low-light conditions. However, infrared images often have low contrast, high noise, and blurred object boundaries. These characteristics make feature extraction more difficult than in ordinary visib</w:t>
-      </w:r>
-      <w:r>
-        <w:t>le-light images, especially when the detection target is small or appears in a narrow strip shape.</w:t>
+      </w:pPr>
+      <w:r>
+        <w:t xml:space="preserve">The YOLOv5 algorithm is mainly designed for the visible light domain and is better suited for deployment on GPUs due to its high number of model parameters, large computational requirements, and large model size. However, the objective of this paper is to create lightweight target detection networks for edge-embedded devices, making it reasonable to employ a lightweight network structure instead of the heavy CSPDarknet backbone network of YOLOv5. One promising candidate for such a lightweight network model is ShuffleNetv2, proposed by Ma et al. of Megvii’s team [20], which achieves a good balance between model accuracy and running speed. By using lightweight structures such as grouped convolution and depthwise convolution, ShuffleNetv2 is optimized for computational complexity, storage access cost, and parallelism, resulting in a noticeable improvement in actual running speed. In light of this, we chose to use an improved version of ShuffleNetv2 as the backbone network structure of the Edge-YOLO algorithm. The following problems usually exist in IR road scenes:(1)Compared with visible light images, original infrared images lack detailed texture and feature complexity, making them less susceptible to network perception, especially in deeper and complex networks where features are lost and additional noise is introduced.(2)In road scenes, pedestrians and bicycles are typically present in slender strips rather than regular shapes. However, traditional convolution layers use regular convolution </w:t>
+      </w:r>
+      <w:r>
+        <w:lastRenderedPageBreak/>
+        <w:t>kernels (N × N), which may result in a loss of feature information due to their inability to adapt to target shape changes.</w:t>
       </w:r>
     </w:p>
     <w:p>
       <w:pPr>
         <w:spacing w:line="360" w:lineRule="auto"/>
-        <w:ind w:firstLine="480"/>
-      </w:pPr>
-      <w:r>
-        <w:t>Traditional infrared target detection methods are often based on handcrafted models, such as template matching, threshold segmentation, and shape measurement. With the development of deep learning, convolutional neural networks have become the mainstream approach for object detection. Two-stage detectors can provide strong accuracy, but their computational cost is usually high. Single-stage detectors, represented by the YOLO family, are attractive because they seek a balance between detection speed and accu</w:t>
-      </w:r>
-      <w:r>
-        <w:t>racy. This balance is important for embedded applications, where latency, power consumption, and storage space are limited.</w:t>
+      </w:pPr>
+      <w:r>
+        <w:t>To enhance the extraction capability of strip-shaped features in IR scenes and the perception of salient features in IR images without increasing computational effort, this paper proposes embedding the strip depthwise convolutional attention module (SDCA) into ShuffleBlock. As shown in Figure 4, SDCA takes an input and generates a shortcut branch. The local information is aggregated by a 5 × 5 depthwise convolution, and the output is convolved by three branches: a pair of 1 × 7 and 7 × 1 depthwise strip convolutions, a pair of 1 × 11 and 11 × 1 depthwise strip convolutions, and a shortcut branch. These branches capture multi-scale contextual information and strip features, and their results are summed and passed through a 1 × 1 normal convolutional layer to model the relationship between different channels. The output of this layer is then used as the attention weights to weigh the input of SDCA by multiplying it with the generated shortcut branch.</w:t>
       </w:r>
     </w:p>
     <w:p>
       <w:pPr>
         <w:spacing w:line="360" w:lineRule="auto"/>
-        <w:ind w:firstLine="480"/>
-      </w:pPr>
-      <w:r>
-        <w:t xml:space="preserve">Although YOLOv5 has achieved good performance in general object detection, directly </w:t>
+      </w:pPr>
+      <w:r>
+        <w:t>The improved structure obtained by embedding the strip depthwise convolutional attention module into ShuffleBlock, as well as the addition of SENet [21] as the channel attention mechanism in the right branch, are shown in Figure 5. Typically, 1 × 1 convolutions are used before and after depthwise convolutions to fuse information between channels and to increase or decrease the number of channels. However, the original ShuffleBlock uses 1 × 1 convolution layers before and after the depthwise convolution layer in its right branch, which generates redundancy. To reduce the number of parameters and computational demand, this paper removes the 1 × 1 convolution layer after the depthwise convolution.</w:t>
+      </w:r>
+    </w:p>
+    <w:p>
+      <w:pPr>
+        <w:spacing w:line="360" w:lineRule="auto"/>
+      </w:pPr>
+      <w:r>
+        <w:rPr>
+          <w:b/>
+        </w:rPr>
+        <w:t>4.3. Model Lightweighting Experiment</w:t>
+      </w:r>
+    </w:p>
+    <w:p>
+      <w:pPr>
+        <w:spacing w:line="360" w:lineRule="auto"/>
+      </w:pPr>
+      <w:r>
+        <w:t>By replacing the backbone feature extraction network of YOLOv5 with the improved ShuffleBlock in this paper, i.e., Edge-YOLO shown in Figure 2, the overall number of parameters, computation, and model size of the algorithm model can be effectively reduced, and Table 1 below shows the comparison of each parameter after the model is lightened and improved.</w:t>
+      </w:r>
+    </w:p>
+    <w:p>
+      <w:pPr>
+        <w:spacing w:line="360" w:lineRule="auto"/>
+      </w:pPr>
+      <w:r>
+        <w:t xml:space="preserve">The table above shows that by replacing the backbone network with the improved ShuffleBlock, Edge-YOLO reduces the number of network parameters by 72.2%, the </w:t>
       </w:r>
       <w:r>
         <w:lastRenderedPageBreak/>
-        <w:t>deploying a larger YOLOv5 model on an edge device may be difficult. The model may contain many parameters and require a large amount of computation, while the embedded platform has limited CPU performance, memory bandwidth, and power budget. In distributed scenarios, sending raw images to a remote server may also cause network latency and communication congestion. Therefore, lightweight target detection on edge devices is necessary for practical deployment.</w:t>
+        <w:t>amount of computation by 70.3%, and the model size by 71.6% compared with YOLOv5m. This demonstrates the significant lightweight effect of the proposed method, which helps to reduce the storage and computation resources required by the model and is more suitable for deployment on edge-embedded devices.</w:t>
       </w:r>
     </w:p>
     <w:p>
       <w:pPr>
         <w:spacing w:line="360" w:lineRule="auto"/>
-        <w:ind w:firstLine="480"/>
-      </w:pPr>
-      <w:r>
-        <w:t>The Edge-YOLO method described in the source article attempts to reduce computational cost while maintaining detection accuracy. Its main idea is to redesign the YOLOv5m network for infrared road scenes and edge hardware. The authors replace the original backbone with an improved lightweight ShuffleBlock structure, introduce a strip depthwise convolutional attention module for infrared strip-shaped features, use a lightweight content-aware up-sampling operator, and modify the bounding box regression loss. T</w:t>
-      </w:r>
-      <w:r>
-        <w:t>hese changes are intended to reduce parameters and computation while preserving the ability to locate difficult targets.</w:t>
+      </w:pPr>
+      <w:r>
+        <w:rPr>
+          <w:b/>
+        </w:rPr>
+        <w:t>4.7. Actual Edge Device Deployment Testing</w:t>
       </w:r>
     </w:p>
     <w:p>
       <w:pPr>
         <w:spacing w:line="360" w:lineRule="auto"/>
-        <w:ind w:firstLine="480"/>
-      </w:pPr>
-      <w:r>
-        <w:t>The article emphasizes that edge deployment should be evaluated on real hardware rather than only by theoretical model size or floating-point operations. For this purpose, the authors deploy the algorithm on a Rockchip RK3588 embedded development board. The RK3588 platform contains an octa-core CPU with four Cortex-A76 cores and four Cortex-A55 cores, and it integrates an NPU with 6 TOPS computing capability. The NPU supports mixed computing modes such as INT4, INT8, INT16, and FP16, which can accelerate ne</w:t>
-      </w:r>
-      <w:r>
-        <w:t>ural network inference after model conversion.</w:t>
+      </w:pPr>
+      <w:r>
+        <w:t>This paper uses the RK3588 embedded development board of Rockchip as the verification platform, as shown in Figure 9 below. RK3588 platform is equipped with quad-core A76+ quad-core A55, an octa-core CPU, and NPU with 6TOPs computation power. Its high computation power NPU supports INT4, INT8, INT16, and FP16 mixed computing, which can accelerate the inference of network models. The photo of RK3588 is shown below.</w:t>
       </w:r>
     </w:p>
     <w:p>
       <w:pPr>
         <w:spacing w:line="360" w:lineRule="auto"/>
-        <w:ind w:firstLine="480"/>
-      </w:pPr>
-      <w:r>
-        <w:t>In the deployment workflow, the algorithm model is first exported to ONNX format and then converted into an RKNN model supported by the RK3588 NPU. The authors use RKNN-Toolkit2 and rknpu2 tools to complete model conversion and inference acceleration. This workflow is meaningful for embedded artificial intelligence projects because it connects model design, model conversion, runtime execution, and hardware verification. A model that performs well on a GPU may not achieve the same result on an embedded NPU u</w:t>
-      </w:r>
-      <w:r>
-        <w:t>nless its operators, tensor shapes, quantization behavior, and post-processing logic are compatible with the runtime environment.</w:t>
+      </w:pPr>
+      <w:r>
+        <w:t>The algorithm model in this paper and the comparison algorithm model are first exported to the compatible ONNX format, and then converted to the RKNN model supported by the NPU of the RK3588 platform using the RKNN-Toolkit2 and rknpu2 tools with inference acceleration such as asymmetric hybrid quantization, and these models are used to infer the test set images, and the performance comparison is obtained as shown in the following table. In addition to inference using NPU, the performance of only CPU inference is also tested in this paper and is shown together in Table 4 below.</w:t>
       </w:r>
     </w:p>
     <w:p>
       <w:pPr>
         <w:spacing w:line="360" w:lineRule="auto"/>
-        <w:ind w:firstLine="480"/>
-      </w:pPr>
+      </w:pPr>
+      <w:r>
+        <w:t>As can be seen from the table, the accuracy of all four models on the RK3588 platform has a slight decrease due to model quantization. In addition, if only the ARM CPU is used for inference, the FPS of algorithms such as YOLO-FIRI is less than 1, i.e., the number of images that can be inferred is less than one per second, and the algorithm in this paper only has an FPS of 1.1, which cannot be deployed in practical application scenarios. After using NPU to accelerate, we can see that the inference speed of each algorithm was improved by tens of times. However, the FPS of YOLOv5m and YOLOv7 are only 14.5 and 8.8, respectively, which are more obvious to notice lags in real-world applications, while the algorithm in this paper can achieve 31.9 FPS, which can meet the performance requirements of practical scenarios.</w:t>
+      </w:r>
+    </w:p>
+    <w:p>
+      <w:pPr>
+        <w:spacing w:line="360" w:lineRule="auto"/>
+      </w:pPr>
+      <w:r>
+        <w:rPr>
+          <w:b/>
+        </w:rPr>
+        <w:t>5. Conclusions</w:t>
+      </w:r>
+    </w:p>
+    <w:p>
+      <w:pPr>
+        <w:spacing w:line="360" w:lineRule="auto"/>
+      </w:pPr>
+      <w:r>
+        <w:t xml:space="preserve">The proposed method in this paper, Edge-YOLO, is a lightweight IR target detection </w:t>
+      </w:r>
       <w:r>
         <w:lastRenderedPageBreak/>
-        <w:t>Experimental results in the article show that NPU acceleration can greatly improve inference speed compared with CPU-only inference. When only an ARM CPU is used, the detection speed of several algorithms is too low for practical real-time applications. After NPU acceleration, the frame rate increases by tens of times, and the lightweight Edge-YOLO model reaches a frame rate suitable for real-time scenarios. The article also notes that quantization may slightly reduce detection accuracy, which means that sp</w:t>
-      </w:r>
-      <w:r>
-        <w:t>eed improvement and accuracy preservation must be considered together.</w:t>
+        <w:t>approach that aims to ensure good performance in road scenes and is suitable for edge-embedded devices. The algorithm utilizes an optimized bounding box loss function, the improved EX-IoU, to enhance the regression accuracy of the bounding box. Moreover, to improve the up-sampling effect, the algorithm adopts the improved CAU-Lite up-sampling operator, which perceives the contextual content. Lastly, the lightweight ShuffleBlock replaces the backbone feature extraction part of the network, and the strip depthwise convolutional attention module is used to enhance the extraction capability of strip-shaped targets and other salient features present in the IR feature map for the ShuffleBlock, thus further enhancing the detection accuracy of the model. The experimental results on the FLIR dataset demonstrate that Edge-YOLO is essentially equivalent to YOLOv5m in terms of accuracy, while reducing the number of network parameters, computation, and model size by 72.2%, 70.3%, and 71.6%, respectively. Additionally, the detection speed is increased by 44.4%, making the algorithm more suitable for embedded device applications.</w:t>
       </w:r>
     </w:p>
     <w:p>
       <w:pPr>
         <w:spacing w:line="360" w:lineRule="auto"/>
-        <w:ind w:firstLine="480"/>
-      </w:pPr>
-      <w:r>
-        <w:t>The deployment experiment also reflects a common rule in edge AI projects: the bottleneck is not always the neural network itself. Even after the model is accelerated by the NPU, the total running speed may still be affected by image decoding, resizing, format conversion, memory copy, post-processing, and result visualization. Therefore, an embedded object detection system should record both model-level speed and system-level speed. Model-level speed shows how fast the neural network runs, while system-leve</w:t>
-      </w:r>
-      <w:r>
-        <w:t>l speed shows whether the whole application can satisfy real-time requirements.</w:t>
+      </w:pPr>
+      <w:r>
+        <w:rPr>
+          <w:b/>
+        </w:rPr>
+        <w:t>二、英文翻译</w:t>
       </w:r>
     </w:p>
     <w:p>
       <w:pPr>
         <w:spacing w:line="360" w:lineRule="auto"/>
-        <w:ind w:firstLine="480"/>
-      </w:pPr>
-      <w:r>
-        <w:t>Another useful point in the article is the attention to application scenes. Infrared road detection is different from general object detection because object appearance, background texture, and illumination conditions are different. The same idea applies to UAV detection. A model that performs well on ordinary datasets may fail when the target occupies only a few pixels or appears near buildings, trees, clouds, or birds. For this reason, deployment should include scenario-oriented testing, and the test vide</w:t>
-      </w:r>
-      <w:r>
-        <w:t>os should cover the target scale, camera viewpoint, and background complexity expected in real use.</w:t>
+      </w:pPr>
+      <w:r>
+        <w:rPr>
+          <w:b/>
+        </w:rPr>
+        <w:t>Edge-YOLO</w:t>
+      </w:r>
+      <w:r>
+        <w:rPr>
+          <w:b/>
+        </w:rPr>
+        <w:t>：部署于边缘设备的轻量化红外目标检测方法（节选翻译）</w:t>
       </w:r>
     </w:p>
     <w:p>
       <w:pPr>
         <w:spacing w:line="360" w:lineRule="auto"/>
-        <w:ind w:firstLine="480"/>
-      </w:pPr>
-      <w:r>
-        <w:t>The article's use of RK3588 is especially relevant for domestic embedded AI development. Compared with GPU-based desktop inference, an RK3588 board provides a lower-power and lower-cost platform for field deployment. However, this advantage is obtained only when the software stack can fully use the NPU and avoid unnecessary CPU workload. Model conversion, runtime API usage, data layout, and preprocessing strategy must therefore be considered together. In this sense, the hardware platform is not only a passi</w:t>
-      </w:r>
-      <w:r>
-        <w:t>ve carrier of the model, but also an important factor that shapes the final system design.</w:t>
+      </w:pPr>
+      <w:r>
+        <w:rPr>
+          <w:b/>
+        </w:rPr>
+        <w:t xml:space="preserve">1. </w:t>
+      </w:r>
+      <w:r>
+        <w:rPr>
+          <w:b/>
+        </w:rPr>
+        <w:t>引言</w:t>
       </w:r>
     </w:p>
     <w:p>
       <w:pPr>
         <w:spacing w:line="360" w:lineRule="auto"/>
-        <w:ind w:firstLine="480"/>
-      </w:pPr>
-      <w:r>
-        <w:t xml:space="preserve">For thesis work, the article also suggests a practical evaluation method. The experiment </w:t>
+      </w:pPr>
+      <w:r>
+        <w:t>可见光图像由于分辨率高、清晰度好，并且包含容易被人眼理解的丰富视觉细节，因此常被用于目标检测任务。然而，这类图像容易受到天气、光照等外部因素影响，图像质量可能下降，并进一步削弱目标检测精度。红外成像技术正是在这一背景下发挥重要作用。红外成像能够克服部分可见光成像限制，使系统在雾天、烟雾、夜间以及其他恶劣环境下仍能采集图像。通过探测物体释放的热辐射，红外成像与可见光成像相比具有独特优势。在道路场景中，红外图像中的目标通常呈现出条带状视觉特征。不过，红外图像也存在目标轮廓不清晰、目标边缘较模糊、整体纹理信息较弱等问题，这些因素都会给后续目标检测带来困难。</w:t>
+      </w:r>
+    </w:p>
+    <w:p>
+      <w:pPr>
+        <w:spacing w:line="360" w:lineRule="auto"/>
+      </w:pPr>
+      <w:r>
+        <w:t>传统红外目标检测技术主要是基于模型的方法，例如模板匹配、阈值分割和</w:t>
+      </w:r>
+      <w:r>
+        <w:t xml:space="preserve"> Hausdorff </w:t>
+      </w:r>
+      <w:r>
+        <w:t>度量等。随着深度学习的发展，近年来基于卷积神经网络的目标检测技术不断出现。这些方法大体可以分为两阶段算法和单阶段算法。两阶段算法通常以</w:t>
+      </w:r>
+      <w:r>
+        <w:t xml:space="preserve"> Faster R-CNN </w:t>
+      </w:r>
+      <w:r>
+        <w:t>为代表，单阶段算法则包括</w:t>
+      </w:r>
+      <w:r>
+        <w:t xml:space="preserve"> SSD </w:t>
+      </w:r>
+      <w:r>
+        <w:t>和</w:t>
+      </w:r>
+      <w:r>
+        <w:t xml:space="preserve"> YOLO </w:t>
+      </w:r>
+      <w:r>
+        <w:t>等。单阶段算法的设计目标是在算法精度和推理速度之间取得相对平衡。</w:t>
+      </w:r>
+      <w:r>
+        <w:t xml:space="preserve">YOLO </w:t>
+      </w:r>
+      <w:r>
+        <w:t>系列检测算法是一类单阶段检测器，其目标</w:t>
       </w:r>
       <w:r>
         <w:lastRenderedPageBreak/>
-        <w:t>should not only report whether the target can be detected, but should also compare different deployment paths under the same input. For example, CPU inference, NPU inference, floating-point models, quantized models, and different preprocessing strategies can be compared with the same video or image set. This makes the conclusion more credible because every optimization is measured against a stable baseline.</w:t>
+        <w:t>检测效果优于传统方法，因此在许多应用场景中得到广泛使用。近年来，针对红外道路场景的目标检测也出现了许多改进工作。然而，这些方法往往在以下方面仍存在不足：对于红外道路场景中的条带状目标，需要更加合理地组合条带卷积与传统卷积来提取特征；算法的边界框损失函数需要更加准确地适应红外图像中目标边界的回归；同时，模型本身还需要进一步轻量化，才能更适合实际边缘设备部署。因此，</w:t>
+      </w:r>
+      <w:r>
+        <w:t xml:space="preserve">Edge-YOLO </w:t>
+      </w:r>
+      <w:r>
+        <w:t>文献正是围绕这些问题展开改进。</w:t>
       </w:r>
     </w:p>
     <w:p>
       <w:pPr>
         <w:spacing w:line="360" w:lineRule="auto"/>
-        <w:ind w:firstLine="480"/>
-      </w:pPr>
-      <w:r>
-        <w:t>The value of such research is not limited to one algorithm. Once the deployment process is clear, the same workflow can be reused for other lightweight detection models and other edge scenarios. The model may change from infrared road targets to UAVs, pedestrians, vehicles, or industrial objects, but the core questions remain similar: whether the model can be converted correctly, whether the runtime supports the operators, whether the frame pipeline is fast enough, and whether the final output is stable eno</w:t>
-      </w:r>
-      <w:r>
-        <w:t>ugh for real use.</w:t>
+      </w:pPr>
+      <w:r>
+        <w:t>上述挑战说明，在边缘设备上开展轻量化红外目标检测具有必要性。为解决这些问题，该文提出了</w:t>
+      </w:r>
+      <w:r>
+        <w:t xml:space="preserve"> Edge-YOLO</w:t>
+      </w:r>
+      <w:r>
+        <w:t>，这是一种面向边缘设备设计的红外目标检测算法，结合了轻量化网络结构和注意力机制。该算法的主要改进可以概括为三个方面。第一，重新设计边界框损失函数，并构建带有幂超参数</w:t>
+      </w:r>
+      <w:r>
+        <w:t xml:space="preserve"> α </w:t>
+      </w:r>
+      <w:r>
+        <w:t>的损失函数，以增强算法对红外目标边缘的检测能力。第二，设计轻量级内容感知上采样算子，使通道数得到压缩，并尽可能保留边缘区域信息。第三，在</w:t>
+      </w:r>
+      <w:r>
+        <w:t xml:space="preserve"> YOLOv5 </w:t>
+      </w:r>
+      <w:r>
+        <w:t>网络结构基础上进行改进，通过引入条形深度可分离卷积注意力模块增强模型对红外图像中条带状目标特征的提取能力，同时使用改进的</w:t>
+      </w:r>
+      <w:r>
+        <w:t xml:space="preserve"> ShuffleBlock </w:t>
+      </w:r>
+      <w:r>
+        <w:t>替换</w:t>
+      </w:r>
+      <w:r>
+        <w:t xml:space="preserve"> YOLOv5 </w:t>
+      </w:r>
+      <w:r>
+        <w:t>中的</w:t>
+      </w:r>
+      <w:r>
+        <w:t xml:space="preserve"> C3 </w:t>
+      </w:r>
+      <w:r>
+        <w:t>模块，从而降低模型参数量和计算复杂度。这些改进共同服务于边缘端实时部署这一目标。</w:t>
       </w:r>
     </w:p>
     <w:p>
       <w:pPr>
         <w:spacing w:line="360" w:lineRule="auto"/>
-        <w:ind w:firstLine="480"/>
-      </w:pPr>
-      <w:r>
-        <w:t>For an embedded detection system, these observations have direct engineering significance. First, model lightweighting should be combined with hardware-aware deployment, because a smaller model is not automatically faster if memory access and runtime support are not considered. Second, the conversion process from PyTorch or another training framework to ONNX and RKNN must be carefully verified. Third, the final system should be tested with actual video input, post-processing, visualization, and logging, rat</w:t>
-      </w:r>
-      <w:r>
-        <w:t>her than only with isolated image inference. These principles are also applicable to small UAV detection on RK3588, where real-time viewing and stable output are as important as single-frame accuracy.</w:t>
+      </w:pPr>
+      <w:r>
+        <w:t>该文后续章节安排如下：第二节概述基于神经网络的目标检测相关工作，包括</w:t>
+      </w:r>
+      <w:r>
+        <w:t xml:space="preserve"> YOLOv5 </w:t>
+      </w:r>
+      <w:r>
+        <w:t>以及其他红外目标检测算法；第三节详细介绍该文提出的</w:t>
+      </w:r>
+      <w:r>
+        <w:t xml:space="preserve"> Edge-YOLO </w:t>
+      </w:r>
+      <w:r>
+        <w:t>算法；第四节给出多组实验结果，用于评价</w:t>
+      </w:r>
+      <w:r>
+        <w:t xml:space="preserve"> Edge-YOLO </w:t>
+      </w:r>
+      <w:r>
+        <w:t>的检测性能；第五节总结全文的主要贡献。这样的组织方式也体现出轻量化检测模型研究的一般思路，即先分析已有检测算法与红外场景问题，再针对模型结构、损失函数和部署平台进行改进，最后通过实验验证模型在精度、速度和边缘设备适配性方面的综合表现。</w:t>
       </w:r>
     </w:p>
     <w:p>
       <w:pPr>
         <w:spacing w:line="360" w:lineRule="auto"/>
-        <w:ind w:firstLine="480"/>
-      </w:pPr>
-      <w:r>
-        <w:t xml:space="preserve">Overall, the source article illustrates the importance of co-design between detection algorithms and edge hardware. Lightweight network structures, attention mechanisms, model conversion, quantization, and NPU acceleration all contribute to practical deployment. The main lesson is that embedded object detection is not merely a neural network problem. It is a system-level task involving model architecture, data preprocessing, hardware runtime, memory traffic, inference scheduling, and output presentation. A </w:t>
-      </w:r>
-      <w:r>
-        <w:t>stable edge detection system should therefore build a reliable baseline first, then introduce optimization strategies step by step and verify them under repeatable experimental conditions.</w:t>
-      </w:r>
-    </w:p>
-    <w:p>
-      <w:pPr>
-        <w:spacing w:before="120" w:after="120" w:line="360" w:lineRule="auto"/>
-        <w:jc w:val="left"/>
-      </w:pPr>
-      <w:r>
-        <w:rPr>
-          <w:rFonts w:eastAsia="黑体"/>
+      </w:pPr>
+      <w:r>
+        <w:rPr>
           <w:b/>
         </w:rPr>
-        <w:t>二、英文翻译</w:t>
-      </w:r>
-    </w:p>
-    <w:p>
-      <w:pPr>
-        <w:spacing w:before="120" w:after="120" w:line="360" w:lineRule="auto"/>
-        <w:jc w:val="left"/>
-      </w:pPr>
-      <w:r>
-        <w:rPr>
-          <w:rFonts w:eastAsia="黑体"/>
+        <w:t xml:space="preserve">3.3 YOLOv5 </w:t>
+      </w:r>
+      <w:r>
+        <w:rPr>
           <w:b/>
         </w:rPr>
+        <w:t>网络模型改进</w:t>
+      </w:r>
+    </w:p>
+    <w:p>
+      <w:pPr>
+        <w:spacing w:line="360" w:lineRule="auto"/>
+      </w:pPr>
+      <w:r>
+        <w:t xml:space="preserve">YOLOv5 </w:t>
+      </w:r>
+      <w:r>
+        <w:t>算法主要面向可见光图像领域设计。由于其模型参数量较大、计算需求较高、模型尺寸也较大，因此更适合部署在</w:t>
+      </w:r>
+      <w:r>
+        <w:t xml:space="preserve"> GPU </w:t>
+      </w:r>
+      <w:r>
+        <w:t>平台上。然而，该文的研究目标是为边缘嵌入式设备构建轻量化目标检测网络，因此采用轻量级网络结构替代</w:t>
+      </w:r>
+      <w:r>
+        <w:t xml:space="preserve"> YOLOv5 </w:t>
+      </w:r>
+      <w:r>
+        <w:t>中较重的</w:t>
+      </w:r>
+      <w:r>
+        <w:t xml:space="preserve"> CSPDarknet </w:t>
+      </w:r>
+      <w:r>
+        <w:t>主干网络是合理的选择。</w:t>
+      </w:r>
+      <w:r>
+        <w:t xml:space="preserve">ShuffleNetv2 </w:t>
+      </w:r>
+      <w:r>
+        <w:t>是一种具有代表性的轻量级网络模型，它在速度和精度之间取得了较好的平衡。</w:t>
+      </w:r>
+      <w:r>
+        <w:t xml:space="preserve">ShuffleBlock </w:t>
+      </w:r>
+      <w:r>
+        <w:t>的主要思想是使用两个分支来减少模型参数量，并通过通道分割和通道重排操作增强不同通道之间的信息交互。与较重的主干网络相比，这种轻量级结构更适合嵌入式端部署，因为边</w:t>
+      </w:r>
+      <w:r>
         <w:lastRenderedPageBreak/>
-        <w:t>Edge-YOLO</w:t>
-      </w:r>
-      <w:r>
-        <w:rPr>
-          <w:rFonts w:eastAsia="黑体"/>
+        <w:t>缘设备不仅关注理论计算量，也关注模型实际运行时的内存访问、算子支持和实时响应能力。</w:t>
+      </w:r>
+    </w:p>
+    <w:p>
+      <w:pPr>
+        <w:spacing w:line="360" w:lineRule="auto"/>
+      </w:pPr>
+      <w:r>
+        <w:t>为了在不增加明显计算开销的前提下增强红外场景中条带状特征的提取能力，并提高模型对红外图像显著特征的感知能力，该文提出将条形深度可分离卷积注意力模块嵌入</w:t>
+      </w:r>
+      <w:r>
+        <w:t xml:space="preserve"> ShuffleBlock </w:t>
+      </w:r>
+      <w:r>
+        <w:t>中。该模块首先对输入特征建立快捷分支，并使用</w:t>
+      </w:r>
+      <w:r>
+        <w:t xml:space="preserve"> 5×5 </w:t>
+      </w:r>
+      <w:r>
+        <w:t>深度卷积聚合局部信息。随后，模块通过多条分支进行卷积处理，包括一组</w:t>
+      </w:r>
+      <w:r>
+        <w:t xml:space="preserve"> 1×7 </w:t>
+      </w:r>
+      <w:r>
+        <w:t>和</w:t>
+      </w:r>
+      <w:r>
+        <w:t xml:space="preserve"> 7×1 </w:t>
+      </w:r>
+      <w:r>
+        <w:t>的深度条形卷积、一组</w:t>
+      </w:r>
+      <w:r>
+        <w:t xml:space="preserve"> 1×11 </w:t>
+      </w:r>
+      <w:r>
+        <w:t>和</w:t>
+      </w:r>
+      <w:r>
+        <w:t xml:space="preserve"> 11×1 </w:t>
+      </w:r>
+      <w:r>
+        <w:t>的深度条形卷积以及一条快捷分支。不同尺度的条形卷积能够增强模型对细长目标和方向性结构的表达能力，这对于红外道路场景中特征边界模糊、目标形态拉长的情况具有实际意义。该设计说明，在面向特定应用场景进行模型轻量化时，不能只简单减少层数或通道数，还需要结合目标形态特点设计更合适的特征提取结构。</w:t>
+      </w:r>
+    </w:p>
+    <w:p>
+      <w:pPr>
+        <w:spacing w:line="360" w:lineRule="auto"/>
+      </w:pPr>
+      <w:r>
+        <w:t>在</w:t>
+      </w:r>
+      <w:r>
+        <w:t xml:space="preserve"> ShuffleBlock </w:t>
+      </w:r>
+      <w:r>
+        <w:t>中嵌入条形深度可分离卷积注意力模块后，文中还在右侧分支加入</w:t>
+      </w:r>
+      <w:r>
+        <w:t xml:space="preserve"> SENet </w:t>
+      </w:r>
+      <w:r>
+        <w:t>作为通道注意力机制，形成改进后的结构。通常情况下，深度卷积前后会使用</w:t>
+      </w:r>
+      <w:r>
+        <w:t xml:space="preserve"> 1×1 </w:t>
+      </w:r>
+      <w:r>
+        <w:t>卷积来融合通道信息，并调整通道数量。然而，原始</w:t>
+      </w:r>
+      <w:r>
+        <w:t xml:space="preserve"> ShuffleBlock </w:t>
+      </w:r>
+      <w:r>
+        <w:t>在右侧分支的深度卷积层前后都使用</w:t>
+      </w:r>
+      <w:r>
+        <w:t xml:space="preserve"> 1×1 </w:t>
+      </w:r>
+      <w:r>
+        <w:t>卷积，这会产生一定冗余。为了减少参数量和计算量，该文对结构进行了进一步调整。由此可见，边缘端检测模型的优化不是单一模块替换，而是围绕特征提取能力、注意力机制、参数冗余和硬件部署约束进行协同设计。对于嵌入式目标检测任务而言，这种思路具有参考价值，因为最终系统既需要保证检测精度，也需要保证模型能够在算力、功耗和内存受限的平台上稳定运行。</w:t>
+      </w:r>
+    </w:p>
+    <w:p>
+      <w:pPr>
+        <w:spacing w:line="360" w:lineRule="auto"/>
+      </w:pPr>
+      <w:r>
+        <w:rPr>
           <w:b/>
         </w:rPr>
-        <w:t>与轻量化目标检测的嵌入式部署</w:t>
+        <w:t xml:space="preserve">4.3 </w:t>
+      </w:r>
+      <w:r>
+        <w:rPr>
+          <w:b/>
+        </w:rPr>
+        <w:t>模型轻量化实验</w:t>
       </w:r>
     </w:p>
     <w:p>
       <w:pPr>
         <w:spacing w:line="360" w:lineRule="auto"/>
-        <w:ind w:firstLine="480"/>
-      </w:pPr>
-      <w:r>
-        <w:t>道路监控、安全监测和遥感等场景中的目标检测系统，越来越需要在边缘设备上运行，而不是只依赖桌面计算机或云端服务器。红外成像在这类场景中具有实际价值，因为它能够在雾天、夜间或弱光条件下支持图像采集。然而，红外图像通常存在对比度较低、噪声较强和目标边界模糊等问题。这些特点使得特征提取比普通可见光图像更加困难，尤其是在检测目标较小或呈现细长条状形态时，网络更容易丢失关键特征。</w:t>
+      </w:pPr>
+      <w:r>
+        <w:t>通过将</w:t>
+      </w:r>
+      <w:r>
+        <w:t xml:space="preserve"> YOLOv5 </w:t>
+      </w:r>
+      <w:r>
+        <w:t>的主干特征提取网络替换为该文改进后的</w:t>
+      </w:r>
+      <w:r>
+        <w:t xml:space="preserve"> ShuffleBlock</w:t>
+      </w:r>
+      <w:r>
+        <w:t>，也就是形成图</w:t>
+      </w:r>
+      <w:r>
+        <w:t xml:space="preserve"> 2 </w:t>
+      </w:r>
+      <w:r>
+        <w:t>所示的</w:t>
+      </w:r>
+      <w:r>
+        <w:t xml:space="preserve"> Edge-YOLO</w:t>
+      </w:r>
+      <w:r>
+        <w:t>，算法模型整体的参数量、计算量和模型大小都可以得到有效降低。文中随后通过表格比较了模型轻量化改进前后的各项参数。这类实验对于边缘设备部署尤其重要，因为嵌入式系统通常不仅受推理算力限制，还受存储空间、内存带宽和功耗预算限制。如果模型本身过大，即使检测精度较高，也可能难以在低功耗开发板上实现稳定实时运行。</w:t>
       </w:r>
     </w:p>
     <w:p>
       <w:pPr>
         <w:spacing w:line="360" w:lineRule="auto"/>
-        <w:ind w:firstLine="480"/>
-      </w:pPr>
-      <w:r>
-        <w:t>传统红外目标检测方法往往依赖人工设计的模型，例如模板匹配、阈值分割和形状度量等。随着深度学习的发展，卷积神经网络已经成为目标检测的主流方法。两阶段检测器通常能够提供较强的检测精度，但计算成本较高；以</w:t>
-      </w:r>
-      <w:r>
-        <w:t>YOLO</w:t>
-      </w:r>
-      <w:r>
-        <w:t>系列为代表的单阶段检测器则更强调检测速度和精度之间的平衡。这种平衡对于嵌入式应用尤其重要，因为嵌入式平台在延迟、功耗、存储空间和持续运行稳定性方面都存在限制。</w:t>
+      </w:pPr>
+      <w:r>
+        <w:t>实验结果表明，通过使用改进后的</w:t>
+      </w:r>
+      <w:r>
+        <w:t xml:space="preserve"> ShuffleBlock </w:t>
+      </w:r>
+      <w:r>
+        <w:t>替换主干网络，与</w:t>
+      </w:r>
+      <w:r>
+        <w:t xml:space="preserve"> YOLOv5m </w:t>
+      </w:r>
+      <w:r>
+        <w:t>相比，</w:t>
+      </w:r>
+      <w:r>
+        <w:t xml:space="preserve">Edge-YOLO </w:t>
+      </w:r>
+      <w:r>
+        <w:t>的网络参数量减少了</w:t>
+      </w:r>
+      <w:r>
+        <w:t xml:space="preserve"> 72.2%</w:t>
+      </w:r>
+      <w:r>
+        <w:t>，计算量减少了</w:t>
+      </w:r>
+      <w:r>
+        <w:t xml:space="preserve"> 70.3%</w:t>
+      </w:r>
+      <w:r>
+        <w:t>，模型大小减少了</w:t>
+      </w:r>
+      <w:r>
+        <w:t xml:space="preserve"> 71.6%</w:t>
+      </w:r>
+      <w:r>
+        <w:t>。这说明该文提出的方法具有明显的轻量化效果，有助于减少模型所需的存储</w:t>
+      </w:r>
+      <w:r>
+        <w:lastRenderedPageBreak/>
+        <w:t>资源和计算资源，也更适合部署在边缘嵌入式设备上。对于实际工程项目而言，这一结论提示模型优化不能只看精度指标，还应同时关注参数量、</w:t>
+      </w:r>
+      <w:r>
+        <w:t>FLOPs</w:t>
+      </w:r>
+      <w:r>
+        <w:t>、模型文件大小以及板端推理速度等综合因素。</w:t>
       </w:r>
     </w:p>
     <w:p>
       <w:pPr>
         <w:spacing w:line="360" w:lineRule="auto"/>
-        <w:ind w:firstLine="480"/>
-      </w:pPr>
-      <w:r>
-        <w:t>尽管</w:t>
-      </w:r>
-      <w:r>
-        <w:t>YOLOv5</w:t>
-      </w:r>
-      <w:r>
-        <w:t>在通用目标检测任务中取得了较好效果，但直接将较大的</w:t>
-      </w:r>
-      <w:r>
-        <w:t>YOLOv5</w:t>
-      </w:r>
-      <w:r>
-        <w:t>模型部署到边缘设备上并不容易。模型可能包含较多参数，并需要较大的计算量，而嵌入式平台的</w:t>
-      </w:r>
-      <w:r>
-        <w:t>CPU</w:t>
-      </w:r>
-      <w:r>
-        <w:t>性能、内存带宽和功耗预算都有限。在分布式应用场景中，如果将原始图像持续发送到远程服务器进行检测，还可能造成网络延迟和通信拥塞。因此，面向边缘设备的轻量化目标检测对于实际部署是必要的。</w:t>
+      </w:pPr>
+      <w:r>
+        <w:rPr>
+          <w:b/>
+        </w:rPr>
+        <w:t xml:space="preserve">4.7 </w:t>
+      </w:r>
+      <w:r>
+        <w:rPr>
+          <w:b/>
+        </w:rPr>
+        <w:t>实际边缘设备部署测试</w:t>
       </w:r>
     </w:p>
     <w:p>
       <w:pPr>
         <w:spacing w:line="360" w:lineRule="auto"/>
-        <w:ind w:firstLine="480"/>
-      </w:pPr>
-      <w:r>
-        <w:t>文献中提出的</w:t>
-      </w:r>
-      <w:r>
-        <w:t>Edge-YOLO</w:t>
-      </w:r>
-      <w:r>
-        <w:t>方法试图在保持检测精度的同时降低计算开销。其核心思想是针对红外道路场景和边缘硬件重新设计</w:t>
-      </w:r>
-      <w:r>
-        <w:t>YOLOv5m</w:t>
-      </w:r>
-      <w:r>
-        <w:t>网络。作者使用改进的轻量化</w:t>
-      </w:r>
-      <w:r>
-        <w:t>ShuffleBlock</w:t>
-      </w:r>
-      <w:r>
-        <w:t>结构替换原有骨干网络，引入条形深度可分离卷积注意力模块以增强对红外细长目标特征的表达，采用轻量化内容感知上采样算子，并修改边界框回归损失函数。这些改进的共同目标是在降低参数量和计算量的同时，尽可能保留模型定位困难目标的能力。</w:t>
+      </w:pPr>
+      <w:r>
+        <w:t>该文使用瑞芯微</w:t>
+      </w:r>
+      <w:r>
+        <w:t xml:space="preserve"> RK3588 </w:t>
+      </w:r>
+      <w:r>
+        <w:t>嵌入式开发板作为验证平台。</w:t>
+      </w:r>
+      <w:r>
+        <w:t xml:space="preserve">RK3588 </w:t>
+      </w:r>
+      <w:r>
+        <w:t>平台配备四核</w:t>
+      </w:r>
+      <w:r>
+        <w:t xml:space="preserve"> A76 </w:t>
+      </w:r>
+      <w:r>
+        <w:t>与四核</w:t>
+      </w:r>
+      <w:r>
+        <w:t xml:space="preserve"> A55 </w:t>
+      </w:r>
+      <w:r>
+        <w:t>组成的八核</w:t>
+      </w:r>
+      <w:r>
+        <w:t xml:space="preserve"> CPU</w:t>
+      </w:r>
+      <w:r>
+        <w:t>，并集成具有</w:t>
+      </w:r>
+      <w:r>
+        <w:t xml:space="preserve"> 6 TOPS </w:t>
+      </w:r>
+      <w:r>
+        <w:t>计算能力的</w:t>
+      </w:r>
+      <w:r>
+        <w:t xml:space="preserve"> NPU</w:t>
+      </w:r>
+      <w:r>
+        <w:t>。其高算力</w:t>
+      </w:r>
+      <w:r>
+        <w:t xml:space="preserve"> NPU </w:t>
+      </w:r>
+      <w:r>
+        <w:t>支持</w:t>
+      </w:r>
+      <w:r>
+        <w:t xml:space="preserve"> INT4</w:t>
+      </w:r>
+      <w:r>
+        <w:t>、</w:t>
+      </w:r>
+      <w:r>
+        <w:t>INT8</w:t>
+      </w:r>
+      <w:r>
+        <w:t>、</w:t>
+      </w:r>
+      <w:r>
+        <w:t xml:space="preserve">INT16 </w:t>
+      </w:r>
+      <w:r>
+        <w:t>和</w:t>
+      </w:r>
+      <w:r>
+        <w:t xml:space="preserve"> FP16 </w:t>
+      </w:r>
+      <w:r>
+        <w:t>混合计算，能够对网络模型推理过程进行加速。该平台的引入说明，边缘检测算法不仅需要在训练服务器或桌面</w:t>
+      </w:r>
+      <w:r>
+        <w:t xml:space="preserve"> GPU </w:t>
+      </w:r>
+      <w:r>
+        <w:t>上验证效果，还需要在真实嵌入式硬件上进行部署测试。只有当模型能够完成格式转换、被运行时正确加载，并在板端获得可接受的推理速度时，算法才具备实际工程应用价值。</w:t>
       </w:r>
     </w:p>
     <w:p>
       <w:pPr>
         <w:spacing w:line="360" w:lineRule="auto"/>
-        <w:ind w:firstLine="480"/>
-      </w:pPr>
-      <w:r>
-        <w:t>该文献强调，边缘部署不能只依靠理论模型大小或浮点计算量进行评价，而应当在真实硬件上验证。为此，作者将算法部署到瑞芯微</w:t>
-      </w:r>
-      <w:r>
-        <w:t>RK3588</w:t>
-      </w:r>
-      <w:r>
-        <w:t>嵌入式开发板上。</w:t>
-      </w:r>
-      <w:r>
-        <w:t>RK3588</w:t>
-      </w:r>
-      <w:r>
-        <w:t>平台包含由四个</w:t>
-      </w:r>
-      <w:r>
-        <w:t>Cortex-A76</w:t>
-      </w:r>
-      <w:r>
-        <w:t>核心和四个</w:t>
-      </w:r>
-      <w:r>
-        <w:t>Cortex-A55</w:t>
-      </w:r>
-      <w:r>
-        <w:t>核心组成的八核</w:t>
-      </w:r>
-      <w:r>
-        <w:t>CPU</w:t>
-      </w:r>
-      <w:r>
-        <w:t>，并集成了具有</w:t>
-      </w:r>
-      <w:r>
-        <w:t>6 TOPS</w:t>
-      </w:r>
-      <w:r>
-        <w:t>算力的</w:t>
-      </w:r>
-      <w:r>
-        <w:t>NPU</w:t>
-      </w:r>
-      <w:r>
-        <w:t>。该</w:t>
-      </w:r>
-      <w:r>
-        <w:t>NPU</w:t>
-      </w:r>
-      <w:r>
-        <w:t>支持</w:t>
-      </w:r>
-      <w:r>
-        <w:t>INT4</w:t>
-      </w:r>
-      <w:r>
-        <w:t>、</w:t>
-      </w:r>
-      <w:r>
-        <w:t>INT8</w:t>
-      </w:r>
-      <w:r>
-        <w:t>、</w:t>
-      </w:r>
-      <w:r>
-        <w:t>INT16</w:t>
+      </w:pPr>
+      <w:r>
+        <w:t>该文中的算法模型和对比算法模型首先被导出为兼容的</w:t>
+      </w:r>
+      <w:r>
+        <w:t xml:space="preserve"> ONNX </w:t>
+      </w:r>
+      <w:r>
+        <w:t>格式，然后使用</w:t>
+      </w:r>
+      <w:r>
+        <w:t xml:space="preserve"> RKNN-Toolkit2 </w:t>
       </w:r>
       <w:r>
         <w:t>和</w:t>
       </w:r>
       <w:r>
-        <w:t>FP16</w:t>
-      </w:r>
-      <w:r>
-        <w:t>等混合计算模式，在模型完成转换后能够加速神经网络推理。</w:t>
+        <w:t xml:space="preserve"> rknpu2 </w:t>
+      </w:r>
+      <w:r>
+        <w:t>工具转换为</w:t>
+      </w:r>
+      <w:r>
+        <w:t xml:space="preserve"> RK3588 </w:t>
+      </w:r>
+      <w:r>
+        <w:t>平台</w:t>
+      </w:r>
+      <w:r>
+        <w:t xml:space="preserve"> NPU </w:t>
+      </w:r>
+      <w:r>
+        <w:t>支持的</w:t>
+      </w:r>
+      <w:r>
+        <w:t xml:space="preserve"> RKNN </w:t>
+      </w:r>
+      <w:r>
+        <w:t>模型。在转换过程中，工具链结合非对称混合量化等推理加速方式，使模型能够在</w:t>
+      </w:r>
+      <w:r>
+        <w:t xml:space="preserve"> NPU </w:t>
+      </w:r>
+      <w:r>
+        <w:t>上运行。随后，这些模型被用于测试集图像推理，并得到性能对比结果。除了使用</w:t>
+      </w:r>
+      <w:r>
+        <w:t xml:space="preserve"> NPU </w:t>
+      </w:r>
+      <w:r>
+        <w:t>推理外，文中还对仅使用</w:t>
+      </w:r>
+      <w:r>
+        <w:t xml:space="preserve"> ARM CPU </w:t>
+      </w:r>
+      <w:r>
+        <w:t>推理的情况进行了比较。这样的实验设计具有较强的工程意义，因为它不仅展示模型本身的检测效果，也说明了从训练框架到</w:t>
+      </w:r>
+      <w:r>
+        <w:t xml:space="preserve"> ONNX</w:t>
+      </w:r>
+      <w:r>
+        <w:t>，再到</w:t>
+      </w:r>
+      <w:r>
+        <w:t xml:space="preserve"> RKNN </w:t>
+      </w:r>
+      <w:r>
+        <w:t>模型和板端运行时之间的完整部署链路。</w:t>
       </w:r>
     </w:p>
     <w:p>
       <w:pPr>
         <w:spacing w:line="360" w:lineRule="auto"/>
-        <w:ind w:firstLine="480"/>
-      </w:pPr>
-      <w:r>
-        <w:t>在部署流程中，算法模型首先被导出为</w:t>
-      </w:r>
-      <w:r>
-        <w:t>ONNX</w:t>
-      </w:r>
-      <w:r>
-        <w:t>格式，然后再转换为</w:t>
-      </w:r>
-      <w:r>
-        <w:t>RK3588 NPU</w:t>
-      </w:r>
-      <w:r>
-        <w:t>支持的</w:t>
-      </w:r>
-      <w:r>
-        <w:t>RKNN</w:t>
-      </w:r>
-      <w:r>
-        <w:t>模型。作者使用</w:t>
-      </w:r>
-      <w:r>
-        <w:t>RKNN-Toolkit2</w:t>
-      </w:r>
-      <w:r>
-        <w:t>和</w:t>
-      </w:r>
-      <w:r>
-        <w:t>rknpu2</w:t>
-      </w:r>
-      <w:r>
-        <w:t>工具完成模型转换和推理加</w:t>
+      </w:pPr>
+      <w:r>
+        <w:t>从实验结果可以看出，由于模型量化，四种模型在</w:t>
+      </w:r>
+      <w:r>
+        <w:t xml:space="preserve"> RK3588 </w:t>
+      </w:r>
+      <w:r>
+        <w:t>平台上的精度均出现了轻微下降。此外，如果仅使用</w:t>
+      </w:r>
+      <w:r>
+        <w:t xml:space="preserve"> ARM CPU </w:t>
+      </w:r>
+      <w:r>
+        <w:t>进行推理，</w:t>
+      </w:r>
+      <w:r>
+        <w:t xml:space="preserve">YOLO-FIRI </w:t>
+      </w:r>
+      <w:r>
+        <w:t>等算法的</w:t>
+      </w:r>
+      <w:r>
+        <w:t xml:space="preserve"> FPS </w:t>
+      </w:r>
+      <w:r>
+        <w:t>低于</w:t>
+      </w:r>
+      <w:r>
+        <w:t xml:space="preserve"> 1</w:t>
+      </w:r>
+      <w:r>
+        <w:t>，也就是说每秒能够推理的图像数量不足一张；该文提出的算法在</w:t>
+      </w:r>
+      <w:r>
+        <w:t xml:space="preserve"> CPU </w:t>
+      </w:r>
+      <w:r>
+        <w:t>上也只有约</w:t>
+      </w:r>
+      <w:r>
+        <w:t xml:space="preserve"> 1.1 FPS</w:t>
+      </w:r>
+      <w:r>
+        <w:t>，难以部署到实际应用场景中。使用</w:t>
+      </w:r>
+      <w:r>
+        <w:t xml:space="preserve"> NPU </w:t>
+      </w:r>
+      <w:r>
+        <w:t>加速后，可以看到各算法推理速度均得到数十倍提升。该文提出的</w:t>
+      </w:r>
+      <w:r>
+        <w:t xml:space="preserve"> Edge-YOLO </w:t>
+      </w:r>
+      <w:r>
+        <w:t>达到最高</w:t>
+      </w:r>
+      <w:r>
+        <w:t xml:space="preserve"> FPS</w:t>
+      </w:r>
+      <w:r>
+        <w:t>，比</w:t>
+      </w:r>
+      <w:r>
+        <w:t xml:space="preserve"> Faster R-CNN </w:t>
+      </w:r>
+      <w:r>
+        <w:t>的推理速度提高约</w:t>
+      </w:r>
+      <w:r>
+        <w:t xml:space="preserve"> 41.1 </w:t>
+      </w:r>
+      <w:r>
+        <w:t>倍，比</w:t>
+      </w:r>
+      <w:r>
+        <w:t xml:space="preserve"> YOLOv5m </w:t>
+      </w:r>
+      <w:r>
+        <w:t>提高约</w:t>
+      </w:r>
+      <w:r>
+        <w:t xml:space="preserve"> 30.9 </w:t>
+      </w:r>
+      <w:r>
+        <w:t>倍。尽管与</w:t>
+      </w:r>
+      <w:r>
+        <w:t xml:space="preserve"> YOLO-FIRI </w:t>
+      </w:r>
+      <w:r>
+        <w:t>相比，</w:t>
+      </w:r>
+      <w:r>
+        <w:t xml:space="preserve">Edge-YOLO </w:t>
+      </w:r>
+      <w:r>
+        <w:t>的推理速度仅提高约</w:t>
+      </w:r>
+      <w:r>
+        <w:t xml:space="preserve"> 3.3 </w:t>
+      </w:r>
+      <w:r>
+        <w:t>倍，但其检测精度更高。因此，文中认为</w:t>
+      </w:r>
+      <w:r>
+        <w:t xml:space="preserve"> Edge-YOLO </w:t>
+      </w:r>
+      <w:r>
+        <w:t>在保证检测速度的同时也保持了较好的精度表现。</w:t>
+      </w:r>
+    </w:p>
+    <w:p>
+      <w:pPr>
+        <w:spacing w:line="360" w:lineRule="auto"/>
+      </w:pPr>
+      <w:r>
+        <w:rPr>
+          <w:b/>
+        </w:rPr>
+        <w:t xml:space="preserve">5. </w:t>
+      </w:r>
+      <w:r>
+        <w:rPr>
+          <w:b/>
+        </w:rPr>
+        <w:t>结论</w:t>
+      </w:r>
+    </w:p>
+    <w:p>
+      <w:pPr>
+        <w:spacing w:line="360" w:lineRule="auto"/>
+      </w:pPr>
+      <w:r>
+        <w:t>该文提出的</w:t>
+      </w:r>
+      <w:r>
+        <w:t xml:space="preserve"> Edge-YOLO </w:t>
+      </w:r>
+      <w:r>
+        <w:t>是一种轻量化红外目标检测方法，目标是在道路场景中保证较好检测性能，同时适合部署在边缘嵌入式设备上。该算法使用改进后的</w:t>
+      </w:r>
+      <w:r>
+        <w:t xml:space="preserve"> EX-IoU </w:t>
+      </w:r>
+      <w:r>
+        <w:t>边界框损失函数，以提升边界框回归精度；同时采用改进的</w:t>
+      </w:r>
+      <w:r>
+        <w:t xml:space="preserve"> CAU-Lite </w:t>
+      </w:r>
+      <w:r>
+        <w:t>上采样算子，</w:t>
       </w:r>
       <w:r>
         <w:lastRenderedPageBreak/>
-        <w:t>速。这一流程对于嵌入式人工智能项目具有重要意义，因为它连接了模型设计、模型转换、运行时执行和硬件验证等环节。一个在</w:t>
-      </w:r>
-      <w:r>
-        <w:t>GPU</w:t>
-      </w:r>
-      <w:r>
-        <w:t>上表现良好的模型，如果其算子、张量形状、量化行为或后处理逻辑与嵌入式运行时环境不兼容，就未必能够在</w:t>
-      </w:r>
-      <w:r>
-        <w:t>NPU</w:t>
-      </w:r>
-      <w:r>
-        <w:t>上得到同样的结果。</w:t>
-      </w:r>
-    </w:p>
-    <w:p>
-      <w:pPr>
-        <w:spacing w:line="360" w:lineRule="auto"/>
-        <w:ind w:firstLine="480"/>
-      </w:pPr>
-      <w:r>
-        <w:t>文献中的实验结果表明，与仅使用</w:t>
-      </w:r>
-      <w:r>
-        <w:t>CPU</w:t>
-      </w:r>
-      <w:r>
-        <w:t>推理相比，</w:t>
-      </w:r>
-      <w:r>
-        <w:t>NPU</w:t>
-      </w:r>
-      <w:r>
-        <w:t>加速能够显著提高推理速度。当只使用</w:t>
-      </w:r>
-      <w:r>
-        <w:t>ARM CPU</w:t>
-      </w:r>
-      <w:r>
-        <w:t>时，若干算法的检测速度过低，难以满足实际实时应用需求；经过</w:t>
-      </w:r>
-      <w:r>
-        <w:t>NPU</w:t>
-      </w:r>
-      <w:r>
-        <w:t>加速后，帧率提升了数十倍，轻量化的</w:t>
-      </w:r>
-      <w:r>
-        <w:t>Edge-YOLO</w:t>
-      </w:r>
-      <w:r>
-        <w:t>模型能够达到适合实时场景的检测速度。文献同时指出，量化可能导致检测精度略有下降，这说明在实际部署中不能只追求速度提升，还必须同时考虑精度保持和稳定性。</w:t>
-      </w:r>
-    </w:p>
-    <w:p>
-      <w:pPr>
-        <w:spacing w:line="360" w:lineRule="auto"/>
-        <w:ind w:firstLine="480"/>
-      </w:pPr>
-      <w:r>
-        <w:t>该部署实验还反映了边缘人工智能项目中的一个普遍规律：系统瓶颈并不总是神经网络模型本身。即使模型已经通过</w:t>
-      </w:r>
-      <w:r>
-        <w:t>NPU</w:t>
-      </w:r>
-      <w:r>
-        <w:t>加速，整体运行速度仍可能受到图像解码、尺寸缩放、格式转换、内存拷贝、后处理和结果可视化等环节影响。因此，嵌入式目标检测系统应当同时记录模型层速度和系统层速度。模型层速度说明神经网络本身运行得有多快，系统层速度则说明完整应用能否满足实时运行要求。对于工程部署而言，后者往往更接近用户实际感受到的性能。</w:t>
-      </w:r>
-    </w:p>
-    <w:p>
-      <w:pPr>
-        <w:spacing w:line="360" w:lineRule="auto"/>
-        <w:ind w:firstLine="480"/>
-      </w:pPr>
-      <w:r>
-        <w:t>文献中另一个有价值的观点是对应用场景的重视。红外道路目标检测不同于通用目标检测，因为目标外观、背景纹理和光照条件都具有特殊性。同样的思想也适用于无人机检测。一个在普通数据集上表现良好的模型，当目标只占据几个像素，或者目标出现在建筑物、树木、云层、鸟类等复杂背景附近时，仍然可能出现漏检或误检。因此，部署阶段应当包含面向场景的测试，测试视频应覆盖真实使用中可能出现的目标尺度、摄像机视角和背景复杂度。</w:t>
-      </w:r>
-    </w:p>
-    <w:p>
-      <w:pPr>
-        <w:spacing w:line="360" w:lineRule="auto"/>
-        <w:ind w:firstLine="480"/>
-      </w:pPr>
-      <w:r>
-        <w:t>该文献使用</w:t>
-      </w:r>
-      <w:r>
-        <w:t>RK3588</w:t>
-      </w:r>
-      <w:r>
-        <w:t>平台进行实验，这一点与国产嵌入式人工智能开发具有较强关联。与基于</w:t>
-      </w:r>
-      <w:r>
-        <w:t>GPU</w:t>
-      </w:r>
-      <w:r>
-        <w:t>的桌面推理相比，</w:t>
-      </w:r>
-      <w:r>
-        <w:t>RK3588</w:t>
-      </w:r>
-      <w:r>
-        <w:t>开发板能够提供功耗更低、成本更低、体积更小的现场部署平台。但是，只有当软件栈能够充分利用</w:t>
-      </w:r>
-      <w:r>
-        <w:t>NPU</w:t>
-      </w:r>
-      <w:r>
-        <w:t>并尽量减少不必要的</w:t>
-      </w:r>
-      <w:r>
-        <w:t>CPU</w:t>
-      </w:r>
-      <w:r>
-        <w:t>负担时，这种硬件优势才能真正体现出来。因此，模型转换、运行时</w:t>
-      </w:r>
-      <w:r>
-        <w:t>API</w:t>
-      </w:r>
-      <w:r>
-        <w:t>使用、数据布局和预处理策略必须被放在一起考虑。从这个意义上说，硬件平台并不是模型的被动承载者，而是影响最终系统设计的重要因素。</w:t>
-      </w:r>
-    </w:p>
-    <w:p>
-      <w:pPr>
-        <w:spacing w:line="360" w:lineRule="auto"/>
-        <w:ind w:firstLine="480"/>
-      </w:pPr>
-      <w:r>
-        <w:t>对于毕业设计而言，该文献还提供了一种实用的评价方法。实验不应只报告目标是否能够被检测到，还应当在相同输入条件下比较不同部署路径。例如，可以使用同</w:t>
-      </w:r>
-      <w:r>
-        <w:lastRenderedPageBreak/>
-        <w:t>一组视频或图像，对</w:t>
-      </w:r>
-      <w:r>
-        <w:t>CPU</w:t>
-      </w:r>
-      <w:r>
-        <w:t>推理、</w:t>
-      </w:r>
-      <w:r>
-        <w:t>NPU</w:t>
-      </w:r>
-      <w:r>
-        <w:t>推理、浮点模型、量化模型以及不同预处理策略进行对比。这样得到的结论更可信，因为每一种优化都不是孤立展示，而是与稳定基线进行比较。对于嵌入式系统研究来说，基线、变量和指标的清晰性非常重要。</w:t>
-      </w:r>
-    </w:p>
-    <w:p>
-      <w:pPr>
-        <w:spacing w:line="360" w:lineRule="auto"/>
-        <w:ind w:firstLine="480"/>
-      </w:pPr>
-      <w:r>
-        <w:t>这类研究的价值也不限于某一个具体算法。一旦部署流程被梳理清楚，同样的工作流就可以复用于其他轻量化检测模型和其他边缘应用场景。检测对象可以从红外道路目标变为无人机、行人、车辆或工业零件，但核心问题是相似的：模型能否正确转换，运行时是否支持相关算子，视频帧流水线是否足够快，最终输出是否足够稳定并能够服务实际使用。</w:t>
-      </w:r>
-    </w:p>
-    <w:p>
-      <w:pPr>
-        <w:spacing w:line="360" w:lineRule="auto"/>
-        <w:ind w:firstLine="480"/>
-      </w:pPr>
-      <w:r>
-        <w:t>对于嵌入式检测系统而言，这些结论具有直接的工程意义。首先，模型轻量化应当与面向硬件的部署策略结合起来，因为较小的模型并不一定自动意味着更快的端到端速度，内存访问和运行时支持同样会影响实际性能。其次，从</w:t>
-      </w:r>
-      <w:r>
-        <w:t>PyTorch</w:t>
-      </w:r>
-      <w:r>
-        <w:t>或其他训练框架到</w:t>
-      </w:r>
-      <w:r>
-        <w:t>ONNX</w:t>
-      </w:r>
-      <w:r>
-        <w:t>再到</w:t>
-      </w:r>
-      <w:r>
-        <w:t>RKNN</w:t>
-      </w:r>
-      <w:r>
-        <w:t>的转换过程必须被认真验证。再次，最终系统应当结合实际视频输入、后处理、结果可视化和日志记录进行测试，而不是只进行孤立的图像推理。这些原则同样适用于</w:t>
-      </w:r>
-      <w:r>
-        <w:t>RK3588</w:t>
-      </w:r>
-      <w:r>
-        <w:t>平台上的小型无人机检测任务，因为实时观看和稳定输出与单帧检测精度同样重要。</w:t>
-      </w:r>
-    </w:p>
-    <w:p>
-      <w:pPr>
-        <w:spacing w:line="360" w:lineRule="auto"/>
-        <w:ind w:firstLine="480"/>
-      </w:pPr>
-      <w:r>
-        <w:t>总体来看，该文献说明了检测算法与边缘硬件协同设计的重要性。轻量化网络结构、注意力机制、模型转换、量化和</w:t>
-      </w:r>
-      <w:r>
-        <w:t>NPU</w:t>
-      </w:r>
-      <w:r>
-        <w:t>加速都对实际部署有贡献。它带来的主要启示是，嵌入式目标检测并不只是一个神经网络问题，而是一项系统级任务，涉及模型结构、数据预处理、硬件运行时、内存访问、推理调度和结果显示等多个环节。因此，稳定的边缘检测系统应当先建立可靠基线，再逐步引入优化策略，并在可重复的实验条件下进行验证。</w:t>
-      </w:r>
-    </w:p>
-    <w:p>
-      <w:pPr>
-        <w:spacing w:line="360" w:lineRule="auto"/>
-        <w:ind w:firstLine="480"/>
-      </w:pPr>
-      <w:r>
-        <w:t>将这篇文献与本文课题相联系可以发现，两者都关注如何把目标检测模型从训练环境迁移到边缘硬件上，并通过</w:t>
-      </w:r>
-      <w:r>
-        <w:t>NPU</w:t>
-      </w:r>
-      <w:r>
-        <w:t>加速提升实时性。本文虽然研究对象是无人机目标检测，使用的是</w:t>
-      </w:r>
-      <w:r>
-        <w:t>YOLOv10</w:t>
-      </w:r>
-      <w:r>
-        <w:t>单类模型和</w:t>
-      </w:r>
-      <w:r>
-        <w:t>RK3588</w:t>
-      </w:r>
-      <w:r>
-        <w:t>平台，但所面临的问题与文献中描述的边缘部署问题具有共通性：模型转换需要保证张量和算子兼容，量化需要在速度和精度之间取得平衡，板端实验需要关注真实帧率而不是只关注理论算力。因而，该文献可以为本文的模型移植、</w:t>
-      </w:r>
-      <w:r>
-        <w:t>RKNN</w:t>
-      </w:r>
-      <w:r>
-        <w:t>转换、</w:t>
-      </w:r>
-      <w:r>
-        <w:t>INT8</w:t>
-      </w:r>
-      <w:r>
-        <w:t>量化验证和系统性能分析提供有益参考。</w:t>
+        <w:t>通过感知周围语义信息来恢复丢失的特征。文中还将条形深度可分离卷积注意力模块嵌入</w:t>
+      </w:r>
+      <w:r>
+        <w:t xml:space="preserve"> ShuffleBlock</w:t>
+      </w:r>
+      <w:r>
+        <w:t>，从而增强模型对红外图像中关键特征的感知能力。实验结果表明，</w:t>
+      </w:r>
+      <w:r>
+        <w:t xml:space="preserve">Edge-YOLO </w:t>
+      </w:r>
+      <w:r>
+        <w:t>在红外数据集上具有良好的检测效果，并且在参数量、计算量和模型大小方面相较</w:t>
+      </w:r>
+      <w:r>
+        <w:t xml:space="preserve"> YOLOv5m </w:t>
+      </w:r>
+      <w:r>
+        <w:t>有明显降低。此外，在</w:t>
+      </w:r>
+      <w:r>
+        <w:t xml:space="preserve"> RK3588 </w:t>
+      </w:r>
+      <w:r>
+        <w:t>开发板上进行的边缘部署测试表明，轻量化模型结合</w:t>
+      </w:r>
+      <w:r>
+        <w:t xml:space="preserve"> NPU </w:t>
+      </w:r>
+      <w:r>
+        <w:t>加速能够显著提升推理速度。总体而言，该文证明了面向应用场景和硬件平台共同设计轻量化检测网络的必要性，也说明边缘目标检测系统需要同时考虑模型结构、特征表达、模型转换、量化影响和实际板端运行效率。</w:t>
       </w:r>
     </w:p>
     <w:p>
@@ -40148,7 +40723,7 @@
         <w:jc w:val="center"/>
         <w:outlineLvl w:val="1"/>
       </w:pPr>
-      <w:bookmarkStart w:id="60" w:name="_Toc228365609"/>
+      <w:bookmarkStart w:id="60" w:name="_Toc228393686"/>
       <w:r>
         <w:rPr>
           <w:rFonts w:eastAsia="黑体"/>
@@ -40185,7 +40760,6 @@
           <w:rFonts w:eastAsia="黑体"/>
           <w:b/>
         </w:rPr>
-        <w:lastRenderedPageBreak/>
         <w:t>一、课题目的和意义</w:t>
       </w:r>
     </w:p>
@@ -40253,7 +40827,11 @@
         <w:t>ROI</w:t>
       </w:r>
       <w:r>
-        <w:t>、轻量跟踪和软件报警提示等设计，探索了在低功耗嵌入式平台上提升实时性的工程方法。这些设计对社会应用具有积极影响：一方面，边缘端检测可以减少原始视频长期上传，降低隐私和网络负担；另一方面，低成本平台更易推广到校园、厂区、临时安防和教学演示等场景。与此同时，本课题也提示我们注意技术应用的边界。视觉检测系统可能受到光照、遮挡、背景干扰和模型误检影响，不能简单替代人工判断或完整安防系统。因此，工程实现中需要保留日志记录、阈值调节和人工复核机制，避免将模型输出绝对化。系统在实际使用中也应重视数据来源合规和告警责任边界，确保技术服务于安全管理而不是造成新的误判风险。</w:t>
+        <w:t>、轻量跟踪和软件报警提示等设计，探索了在低功耗嵌入式平台上提升实时性的工程方法。这些设计对社会应用具有积极影响：一方面，边缘端检测可以减少原始视频长期上传，降低隐私和网络负担；另一</w:t>
+      </w:r>
+      <w:r>
+        <w:lastRenderedPageBreak/>
+        <w:t>方面，低成本平台更易推广到校园、厂区、临时安防和教学演示等场景。与此同时，本课题也提示我们注意技术应用的边界。视觉检测系统可能受到光照、遮挡、背景干扰和模型误检影响，不能简单替代人工判断或完整安防系统。因此，工程实现中需要保留日志记录、阈值调节和人工复核机制，避免将模型输出绝对化。系统在实际使用中也应重视数据来源合规和告警责任边界，确保技术服务于安全管理而不是造成新的误判风险。</w:t>
       </w:r>
     </w:p>
     <w:p>
@@ -40287,11 +40865,7 @@
         <w:t>INT8</w:t>
       </w:r>
       <w:r>
-        <w:t>量化模型的</w:t>
-      </w:r>
-      <w:r>
-        <w:lastRenderedPageBreak/>
-        <w:t>板端精度和速度对比，明确量化是否真正带来端到端收益，而不是只关注理论算力提升。其次，在系统层面，可进一步完善</w:t>
+        <w:t>量化模型的板端精度和速度对比，明确量化是否真正带来端到端收益，而不是只关注理论算力提升。其次，在系统层面，可进一步完善</w:t>
       </w:r>
       <w:r>
         <w:t>RGA</w:t>
@@ -40332,7 +40906,7 @@
         <w:jc w:val="center"/>
         <w:outlineLvl w:val="0"/>
       </w:pPr>
-      <w:bookmarkStart w:id="61" w:name="_Toc228365610"/>
+      <w:bookmarkStart w:id="61" w:name="_Toc228393687"/>
       <w:r>
         <w:rPr>
           <w:rFonts w:eastAsia="黑体"/>

</xml_diff>